<commit_message>
inchi_db_eda small implementations and addition of new figure to memory
</commit_message>
<xml_diff>
--- a/Memorias/TFM Drug Metabolism - Gonzalo Robles.docx
+++ b/Memorias/TFM Drug Metabolism - Gonzalo Robles.docx
@@ -1109,7 +1109,7 @@
           <w:lang w:val="en-GB" w:eastAsia="en-GB"/>
         </w:rPr>
       </w:pPr>
-      <w:bookmarkStart w:id="1" w:name="_Toc225621956"/>
+      <w:bookmarkStart w:id="1" w:name="_Toc225628529"/>
       <w:r>
         <w:rPr>
           <w:lang w:val="en-GB" w:eastAsia="en-GB"/>
@@ -1143,7 +1143,7 @@
           <w:lang w:val="en-GB" w:eastAsia="en-GB"/>
         </w:rPr>
       </w:pPr>
-      <w:bookmarkStart w:id="2" w:name="_Toc225621957"/>
+      <w:bookmarkStart w:id="2" w:name="_Toc225628530"/>
       <w:proofErr w:type="spellStart"/>
       <w:r>
         <w:rPr>
@@ -1250,7 +1250,7 @@
           <w:r>
             <w:fldChar w:fldCharType="separate"/>
           </w:r>
-          <w:hyperlink w:anchor="_Toc225621956" w:history="1">
+          <w:hyperlink w:anchor="_Toc225628529" w:history="1">
             <w:r>
               <w:rPr>
                 <w:rStyle w:val="Hyperlink"/>
@@ -1297,7 +1297,7 @@
                 <w:noProof/>
                 <w:webHidden/>
               </w:rPr>
-              <w:instrText xml:space="preserve"> PAGEREF _Toc225621956 \h </w:instrText>
+              <w:instrText xml:space="preserve"> PAGEREF _Toc225628529 \h </w:instrText>
             </w:r>
             <w:r>
               <w:rPr>
@@ -1344,7 +1344,7 @@
               <w14:ligatures w14:val="standardContextual"/>
             </w:rPr>
           </w:pPr>
-          <w:hyperlink w:anchor="_Toc225621957" w:history="1">
+          <w:hyperlink w:anchor="_Toc225628530" w:history="1">
             <w:r>
               <w:rPr>
                 <w:rStyle w:val="Hyperlink"/>
@@ -1391,7 +1391,7 @@
                 <w:noProof/>
                 <w:webHidden/>
               </w:rPr>
-              <w:instrText xml:space="preserve"> PAGEREF _Toc225621957 \h </w:instrText>
+              <w:instrText xml:space="preserve"> PAGEREF _Toc225628530 \h </w:instrText>
             </w:r>
             <w:r>
               <w:rPr>
@@ -1438,7 +1438,7 @@
               <w14:ligatures w14:val="standardContextual"/>
             </w:rPr>
           </w:pPr>
-          <w:hyperlink w:anchor="_Toc225621958" w:history="1">
+          <w:hyperlink w:anchor="_Toc225628531" w:history="1">
             <w:r>
               <w:rPr>
                 <w:rStyle w:val="Hyperlink"/>
@@ -1485,7 +1485,7 @@
                 <w:noProof/>
                 <w:webHidden/>
               </w:rPr>
-              <w:instrText xml:space="preserve"> PAGEREF _Toc225621958 \h </w:instrText>
+              <w:instrText xml:space="preserve"> PAGEREF _Toc225628531 \h </w:instrText>
             </w:r>
             <w:r>
               <w:rPr>
@@ -1532,7 +1532,7 @@
               <w14:ligatures w14:val="standardContextual"/>
             </w:rPr>
           </w:pPr>
-          <w:hyperlink w:anchor="_Toc225621959" w:history="1">
+          <w:hyperlink w:anchor="_Toc225628532" w:history="1">
             <w:r>
               <w:rPr>
                 <w:rStyle w:val="Hyperlink"/>
@@ -1579,7 +1579,7 @@
                 <w:noProof/>
                 <w:webHidden/>
               </w:rPr>
-              <w:instrText xml:space="preserve"> PAGEREF _Toc225621959 \h </w:instrText>
+              <w:instrText xml:space="preserve"> PAGEREF _Toc225628532 \h </w:instrText>
             </w:r>
             <w:r>
               <w:rPr>
@@ -1599,7 +1599,7 @@
                 <w:noProof/>
                 <w:webHidden/>
               </w:rPr>
-              <w:t>4</w:t>
+              <w:t>5</w:t>
             </w:r>
             <w:r>
               <w:rPr>
@@ -1626,7 +1626,7 @@
               <w14:ligatures w14:val="standardContextual"/>
             </w:rPr>
           </w:pPr>
-          <w:hyperlink w:anchor="_Toc225621960" w:history="1">
+          <w:hyperlink w:anchor="_Toc225628533" w:history="1">
             <w:r>
               <w:rPr>
                 <w:rStyle w:val="Hyperlink"/>
@@ -1673,7 +1673,7 @@
                 <w:noProof/>
                 <w:webHidden/>
               </w:rPr>
-              <w:instrText xml:space="preserve"> PAGEREF _Toc225621960 \h </w:instrText>
+              <w:instrText xml:space="preserve"> PAGEREF _Toc225628533 \h </w:instrText>
             </w:r>
             <w:r>
               <w:rPr>
@@ -1693,7 +1693,7 @@
                 <w:noProof/>
                 <w:webHidden/>
               </w:rPr>
-              <w:t>5</w:t>
+              <w:t>6</w:t>
             </w:r>
             <w:r>
               <w:rPr>
@@ -1720,7 +1720,7 @@
               <w14:ligatures w14:val="standardContextual"/>
             </w:rPr>
           </w:pPr>
-          <w:hyperlink w:anchor="_Toc225621961" w:history="1">
+          <w:hyperlink w:anchor="_Toc225628534" w:history="1">
             <w:r>
               <w:rPr>
                 <w:rStyle w:val="Hyperlink"/>
@@ -1767,7 +1767,7 @@
                 <w:noProof/>
                 <w:webHidden/>
               </w:rPr>
-              <w:instrText xml:space="preserve"> PAGEREF _Toc225621961 \h </w:instrText>
+              <w:instrText xml:space="preserve"> PAGEREF _Toc225628534 \h </w:instrText>
             </w:r>
             <w:r>
               <w:rPr>
@@ -1787,7 +1787,7 @@
                 <w:noProof/>
                 <w:webHidden/>
               </w:rPr>
-              <w:t>5</w:t>
+              <w:t>6</w:t>
             </w:r>
             <w:r>
               <w:rPr>
@@ -1814,7 +1814,7 @@
               <w14:ligatures w14:val="standardContextual"/>
             </w:rPr>
           </w:pPr>
-          <w:hyperlink w:anchor="_Toc225621962" w:history="1">
+          <w:hyperlink w:anchor="_Toc225628535" w:history="1">
             <w:r>
               <w:rPr>
                 <w:rStyle w:val="Hyperlink"/>
@@ -1871,7 +1871,7 @@
                 <w:noProof/>
                 <w:webHidden/>
               </w:rPr>
-              <w:instrText xml:space="preserve"> PAGEREF _Toc225621962 \h </w:instrText>
+              <w:instrText xml:space="preserve"> PAGEREF _Toc225628535 \h </w:instrText>
             </w:r>
             <w:r>
               <w:rPr>
@@ -1891,7 +1891,7 @@
                 <w:noProof/>
                 <w:webHidden/>
               </w:rPr>
-              <w:t>7</w:t>
+              <w:t>8</w:t>
             </w:r>
             <w:r>
               <w:rPr>
@@ -1918,7 +1918,7 @@
               <w14:ligatures w14:val="standardContextual"/>
             </w:rPr>
           </w:pPr>
-          <w:hyperlink w:anchor="_Toc225621963" w:history="1">
+          <w:hyperlink w:anchor="_Toc225628536" w:history="1">
             <w:r>
               <w:rPr>
                 <w:rStyle w:val="Hyperlink"/>
@@ -1965,7 +1965,7 @@
                 <w:noProof/>
                 <w:webHidden/>
               </w:rPr>
-              <w:instrText xml:space="preserve"> PAGEREF _Toc225621963 \h </w:instrText>
+              <w:instrText xml:space="preserve"> PAGEREF _Toc225628536 \h </w:instrText>
             </w:r>
             <w:r>
               <w:rPr>
@@ -1985,7 +1985,7 @@
                 <w:noProof/>
                 <w:webHidden/>
               </w:rPr>
-              <w:t>8</w:t>
+              <w:t>9</w:t>
             </w:r>
             <w:r>
               <w:rPr>
@@ -2012,7 +2012,7 @@
               <w14:ligatures w14:val="standardContextual"/>
             </w:rPr>
           </w:pPr>
-          <w:hyperlink w:anchor="_Toc225621964" w:history="1">
+          <w:hyperlink w:anchor="_Toc225628537" w:history="1">
             <w:r>
               <w:rPr>
                 <w:rStyle w:val="Hyperlink"/>
@@ -2038,23 +2038,7 @@
                 <w:noProof/>
                 <w:lang w:val="en-GB" w:eastAsia="en-GB"/>
               </w:rPr>
-              <w:t>METHO</w:t>
-            </w:r>
-            <w:r>
-              <w:rPr>
-                <w:rStyle w:val="Hyperlink"/>
-                <w:noProof/>
-                <w:lang w:val="en-GB" w:eastAsia="en-GB"/>
-              </w:rPr>
-              <w:t>D</w:t>
-            </w:r>
-            <w:r>
-              <w:rPr>
-                <w:rStyle w:val="Hyperlink"/>
-                <w:noProof/>
-                <w:lang w:val="en-GB" w:eastAsia="en-GB"/>
-              </w:rPr>
-              <w:t>OLOGY</w:t>
+              <w:t>METHODOLOGY</w:t>
             </w:r>
             <w:r>
               <w:rPr>
@@ -2075,7 +2059,7 @@
                 <w:noProof/>
                 <w:webHidden/>
               </w:rPr>
-              <w:instrText xml:space="preserve"> PAGEREF _Toc225621964 \h </w:instrText>
+              <w:instrText xml:space="preserve"> PAGEREF _Toc225628537 \h </w:instrText>
             </w:r>
             <w:r>
               <w:rPr>
@@ -2095,7 +2079,7 @@
                 <w:noProof/>
                 <w:webHidden/>
               </w:rPr>
-              <w:t>9</w:t>
+              <w:t>10</w:t>
             </w:r>
             <w:r>
               <w:rPr>
@@ -2122,7 +2106,7 @@
               <w14:ligatures w14:val="standardContextual"/>
             </w:rPr>
           </w:pPr>
-          <w:hyperlink w:anchor="_Toc225621965" w:history="1">
+          <w:hyperlink w:anchor="_Toc225628538" w:history="1">
             <w:r>
               <w:rPr>
                 <w:rStyle w:val="Hyperlink"/>
@@ -2168,7 +2152,7 @@
                 <w:noProof/>
                 <w:webHidden/>
               </w:rPr>
-              <w:instrText xml:space="preserve"> PAGEREF _Toc225621965 \h </w:instrText>
+              <w:instrText xml:space="preserve"> PAGEREF _Toc225628538 \h </w:instrText>
             </w:r>
             <w:r>
               <w:rPr>
@@ -2188,7 +2172,7 @@
                 <w:noProof/>
                 <w:webHidden/>
               </w:rPr>
-              <w:t>9</w:t>
+              <w:t>10</w:t>
             </w:r>
             <w:r>
               <w:rPr>
@@ -2215,7 +2199,7 @@
               <w14:ligatures w14:val="standardContextual"/>
             </w:rPr>
           </w:pPr>
-          <w:hyperlink w:anchor="_Toc225621966" w:history="1">
+          <w:hyperlink w:anchor="_Toc225628539" w:history="1">
             <w:r>
               <w:rPr>
                 <w:rStyle w:val="Hyperlink"/>
@@ -2262,7 +2246,7 @@
                 <w:noProof/>
                 <w:webHidden/>
               </w:rPr>
-              <w:instrText xml:space="preserve"> PAGEREF _Toc225621966 \h </w:instrText>
+              <w:instrText xml:space="preserve"> PAGEREF _Toc225628539 \h </w:instrText>
             </w:r>
             <w:r>
               <w:rPr>
@@ -2309,7 +2293,7 @@
               <w14:ligatures w14:val="standardContextual"/>
             </w:rPr>
           </w:pPr>
-          <w:hyperlink w:anchor="_Toc225621967" w:history="1">
+          <w:hyperlink w:anchor="_Toc225628540" w:history="1">
             <w:r>
               <w:rPr>
                 <w:rStyle w:val="Hyperlink"/>
@@ -2355,7 +2339,7 @@
                 <w:noProof/>
                 <w:webHidden/>
               </w:rPr>
-              <w:instrText xml:space="preserve"> PAGEREF _Toc225621967 \h </w:instrText>
+              <w:instrText xml:space="preserve"> PAGEREF _Toc225628540 \h </w:instrText>
             </w:r>
             <w:r>
               <w:rPr>
@@ -2375,7 +2359,7 @@
                 <w:noProof/>
                 <w:webHidden/>
               </w:rPr>
-              <w:t>10</w:t>
+              <w:t>11</w:t>
             </w:r>
             <w:r>
               <w:rPr>
@@ -2402,7 +2386,7 @@
               <w14:ligatures w14:val="standardContextual"/>
             </w:rPr>
           </w:pPr>
-          <w:hyperlink w:anchor="_Toc225621968" w:history="1">
+          <w:hyperlink w:anchor="_Toc225628541" w:history="1">
             <w:r>
               <w:rPr>
                 <w:rStyle w:val="Hyperlink"/>
@@ -2449,7 +2433,7 @@
                 <w:noProof/>
                 <w:webHidden/>
               </w:rPr>
-              <w:instrText xml:space="preserve"> PAGEREF _Toc225621968 \h </w:instrText>
+              <w:instrText xml:space="preserve"> PAGEREF _Toc225628541 \h </w:instrText>
             </w:r>
             <w:r>
               <w:rPr>
@@ -2469,7 +2453,7 @@
                 <w:noProof/>
                 <w:webHidden/>
               </w:rPr>
-              <w:t>12</w:t>
+              <w:t>13</w:t>
             </w:r>
             <w:r>
               <w:rPr>
@@ -2496,7 +2480,7 @@
               <w14:ligatures w14:val="standardContextual"/>
             </w:rPr>
           </w:pPr>
-          <w:hyperlink w:anchor="_Toc225621969" w:history="1">
+          <w:hyperlink w:anchor="_Toc225628542" w:history="1">
             <w:r>
               <w:rPr>
                 <w:rStyle w:val="Hyperlink"/>
@@ -2542,7 +2526,7 @@
                 <w:noProof/>
                 <w:webHidden/>
               </w:rPr>
-              <w:instrText xml:space="preserve"> PAGEREF _Toc225621969 \h </w:instrText>
+              <w:instrText xml:space="preserve"> PAGEREF _Toc225628542 \h </w:instrText>
             </w:r>
             <w:r>
               <w:rPr>
@@ -2562,7 +2546,7 @@
                 <w:noProof/>
                 <w:webHidden/>
               </w:rPr>
-              <w:t>14</w:t>
+              <w:t>15</w:t>
             </w:r>
             <w:r>
               <w:rPr>
@@ -2589,7 +2573,7 @@
               <w14:ligatures w14:val="standardContextual"/>
             </w:rPr>
           </w:pPr>
-          <w:hyperlink w:anchor="_Toc225621970" w:history="1">
+          <w:hyperlink w:anchor="_Toc225628543" w:history="1">
             <w:r>
               <w:rPr>
                 <w:rStyle w:val="Hyperlink"/>
@@ -2636,7 +2620,7 @@
                 <w:noProof/>
                 <w:webHidden/>
               </w:rPr>
-              <w:instrText xml:space="preserve"> PAGEREF _Toc225621970 \h </w:instrText>
+              <w:instrText xml:space="preserve"> PAGEREF _Toc225628543 \h </w:instrText>
             </w:r>
             <w:r>
               <w:rPr>
@@ -2656,7 +2640,7 @@
                 <w:noProof/>
                 <w:webHidden/>
               </w:rPr>
-              <w:t>14</w:t>
+              <w:t>15</w:t>
             </w:r>
             <w:r>
               <w:rPr>
@@ -2683,7 +2667,7 @@
               <w14:ligatures w14:val="standardContextual"/>
             </w:rPr>
           </w:pPr>
-          <w:hyperlink w:anchor="_Toc225621971" w:history="1">
+          <w:hyperlink w:anchor="_Toc225628544" w:history="1">
             <w:r>
               <w:rPr>
                 <w:rStyle w:val="Hyperlink"/>
@@ -2730,7 +2714,7 @@
                 <w:noProof/>
                 <w:webHidden/>
               </w:rPr>
-              <w:instrText xml:space="preserve"> PAGEREF _Toc225621971 \h </w:instrText>
+              <w:instrText xml:space="preserve"> PAGEREF _Toc225628544 \h </w:instrText>
             </w:r>
             <w:r>
               <w:rPr>
@@ -2750,7 +2734,7 @@
                 <w:noProof/>
                 <w:webHidden/>
               </w:rPr>
-              <w:t>14</w:t>
+              <w:t>15</w:t>
             </w:r>
             <w:r>
               <w:rPr>
@@ -2777,7 +2761,7 @@
               <w14:ligatures w14:val="standardContextual"/>
             </w:rPr>
           </w:pPr>
-          <w:hyperlink w:anchor="_Toc225621972" w:history="1">
+          <w:hyperlink w:anchor="_Toc225628545" w:history="1">
             <w:r>
               <w:rPr>
                 <w:rStyle w:val="Hyperlink"/>
@@ -2824,7 +2808,7 @@
                 <w:noProof/>
                 <w:webHidden/>
               </w:rPr>
-              <w:instrText xml:space="preserve"> PAGEREF _Toc225621972 \h </w:instrText>
+              <w:instrText xml:space="preserve"> PAGEREF _Toc225628545 \h </w:instrText>
             </w:r>
             <w:r>
               <w:rPr>
@@ -2844,7 +2828,7 @@
                 <w:noProof/>
                 <w:webHidden/>
               </w:rPr>
-              <w:t>14</w:t>
+              <w:t>15</w:t>
             </w:r>
             <w:r>
               <w:rPr>
@@ -2871,7 +2855,7 @@
               <w14:ligatures w14:val="standardContextual"/>
             </w:rPr>
           </w:pPr>
-          <w:hyperlink w:anchor="_Toc225621973" w:history="1">
+          <w:hyperlink w:anchor="_Toc225628546" w:history="1">
             <w:r>
               <w:rPr>
                 <w:rStyle w:val="Hyperlink"/>
@@ -2918,7 +2902,7 @@
                 <w:noProof/>
                 <w:webHidden/>
               </w:rPr>
-              <w:instrText xml:space="preserve"> PAGEREF _Toc225621973 \h </w:instrText>
+              <w:instrText xml:space="preserve"> PAGEREF _Toc225628546 \h </w:instrText>
             </w:r>
             <w:r>
               <w:rPr>
@@ -2938,7 +2922,7 @@
                 <w:noProof/>
                 <w:webHidden/>
               </w:rPr>
-              <w:t>15</w:t>
+              <w:t>16</w:t>
             </w:r>
             <w:r>
               <w:rPr>
@@ -2965,7 +2949,7 @@
               <w14:ligatures w14:val="standardContextual"/>
             </w:rPr>
           </w:pPr>
-          <w:hyperlink w:anchor="_Toc225621974" w:history="1">
+          <w:hyperlink w:anchor="_Toc225628547" w:history="1">
             <w:r>
               <w:rPr>
                 <w:rStyle w:val="Hyperlink"/>
@@ -3012,7 +2996,7 @@
                 <w:noProof/>
                 <w:webHidden/>
               </w:rPr>
-              <w:instrText xml:space="preserve"> PAGEREF _Toc225621974 \h </w:instrText>
+              <w:instrText xml:space="preserve"> PAGEREF _Toc225628547 \h </w:instrText>
             </w:r>
             <w:r>
               <w:rPr>
@@ -3032,7 +3016,7 @@
                 <w:noProof/>
                 <w:webHidden/>
               </w:rPr>
-              <w:t>16</w:t>
+              <w:t>17</w:t>
             </w:r>
             <w:r>
               <w:rPr>
@@ -3059,7 +3043,7 @@
               <w14:ligatures w14:val="standardContextual"/>
             </w:rPr>
           </w:pPr>
-          <w:hyperlink w:anchor="_Toc225621975" w:history="1">
+          <w:hyperlink w:anchor="_Toc225628548" w:history="1">
             <w:r>
               <w:rPr>
                 <w:rStyle w:val="Hyperlink"/>
@@ -3106,7 +3090,7 @@
                 <w:noProof/>
                 <w:webHidden/>
               </w:rPr>
-              <w:instrText xml:space="preserve"> PAGEREF _Toc225621975 \h </w:instrText>
+              <w:instrText xml:space="preserve"> PAGEREF _Toc225628548 \h </w:instrText>
             </w:r>
             <w:r>
               <w:rPr>
@@ -3126,7 +3110,7 @@
                 <w:noProof/>
                 <w:webHidden/>
               </w:rPr>
-              <w:t>16</w:t>
+              <w:t>17</w:t>
             </w:r>
             <w:r>
               <w:rPr>
@@ -3153,7 +3137,7 @@
               <w14:ligatures w14:val="standardContextual"/>
             </w:rPr>
           </w:pPr>
-          <w:hyperlink w:anchor="_Toc225621976" w:history="1">
+          <w:hyperlink w:anchor="_Toc225628549" w:history="1">
             <w:r>
               <w:rPr>
                 <w:rStyle w:val="Hyperlink"/>
@@ -3200,7 +3184,7 @@
                 <w:noProof/>
                 <w:webHidden/>
               </w:rPr>
-              <w:instrText xml:space="preserve"> PAGEREF _Toc225621976 \h </w:instrText>
+              <w:instrText xml:space="preserve"> PAGEREF _Toc225628549 \h </w:instrText>
             </w:r>
             <w:r>
               <w:rPr>
@@ -3220,7 +3204,7 @@
                 <w:noProof/>
                 <w:webHidden/>
               </w:rPr>
-              <w:t>16</w:t>
+              <w:t>17</w:t>
             </w:r>
             <w:r>
               <w:rPr>
@@ -3247,7 +3231,7 @@
               <w14:ligatures w14:val="standardContextual"/>
             </w:rPr>
           </w:pPr>
-          <w:hyperlink w:anchor="_Toc225621977" w:history="1">
+          <w:hyperlink w:anchor="_Toc225628550" w:history="1">
             <w:r>
               <w:rPr>
                 <w:rStyle w:val="Hyperlink"/>
@@ -3294,7 +3278,7 @@
                 <w:noProof/>
                 <w:webHidden/>
               </w:rPr>
-              <w:instrText xml:space="preserve"> PAGEREF _Toc225621977 \h </w:instrText>
+              <w:instrText xml:space="preserve"> PAGEREF _Toc225628550 \h </w:instrText>
             </w:r>
             <w:r>
               <w:rPr>
@@ -3314,7 +3298,7 @@
                 <w:noProof/>
                 <w:webHidden/>
               </w:rPr>
-              <w:t>16</w:t>
+              <w:t>17</w:t>
             </w:r>
             <w:r>
               <w:rPr>
@@ -3341,7 +3325,7 @@
               <w14:ligatures w14:val="standardContextual"/>
             </w:rPr>
           </w:pPr>
-          <w:hyperlink w:anchor="_Toc225621978" w:history="1">
+          <w:hyperlink w:anchor="_Toc225628551" w:history="1">
             <w:r>
               <w:rPr>
                 <w:rStyle w:val="Hyperlink"/>
@@ -3388,7 +3372,7 @@
                 <w:noProof/>
                 <w:webHidden/>
               </w:rPr>
-              <w:instrText xml:space="preserve"> PAGEREF _Toc225621978 \h </w:instrText>
+              <w:instrText xml:space="preserve"> PAGEREF _Toc225628551 \h </w:instrText>
             </w:r>
             <w:r>
               <w:rPr>
@@ -3435,7 +3419,7 @@
               <w14:ligatures w14:val="standardContextual"/>
             </w:rPr>
           </w:pPr>
-          <w:hyperlink w:anchor="_Toc225621979" w:history="1">
+          <w:hyperlink w:anchor="_Toc225628552" w:history="1">
             <w:r>
               <w:rPr>
                 <w:rStyle w:val="Hyperlink"/>
@@ -3482,7 +3466,7 @@
                 <w:noProof/>
                 <w:webHidden/>
               </w:rPr>
-              <w:instrText xml:space="preserve"> PAGEREF _Toc225621979 \h </w:instrText>
+              <w:instrText xml:space="preserve"> PAGEREF _Toc225628552 \h </w:instrText>
             </w:r>
             <w:r>
               <w:rPr>
@@ -3502,7 +3486,7 @@
                 <w:noProof/>
                 <w:webHidden/>
               </w:rPr>
-              <w:t>17</w:t>
+              <w:t>18</w:t>
             </w:r>
             <w:r>
               <w:rPr>
@@ -3529,7 +3513,7 @@
               <w14:ligatures w14:val="standardContextual"/>
             </w:rPr>
           </w:pPr>
-          <w:hyperlink w:anchor="_Toc225621980" w:history="1">
+          <w:hyperlink w:anchor="_Toc225628553" w:history="1">
             <w:r>
               <w:rPr>
                 <w:rStyle w:val="Hyperlink"/>
@@ -3576,7 +3560,7 @@
                 <w:noProof/>
                 <w:webHidden/>
               </w:rPr>
-              <w:instrText xml:space="preserve"> PAGEREF _Toc225621980 \h </w:instrText>
+              <w:instrText xml:space="preserve"> PAGEREF _Toc225628553 \h </w:instrText>
             </w:r>
             <w:r>
               <w:rPr>
@@ -3596,7 +3580,7 @@
                 <w:noProof/>
                 <w:webHidden/>
               </w:rPr>
-              <w:t>17</w:t>
+              <w:t>18</w:t>
             </w:r>
             <w:r>
               <w:rPr>
@@ -3623,7 +3607,7 @@
               <w14:ligatures w14:val="standardContextual"/>
             </w:rPr>
           </w:pPr>
-          <w:hyperlink w:anchor="_Toc225621981" w:history="1">
+          <w:hyperlink w:anchor="_Toc225628554" w:history="1">
             <w:r>
               <w:rPr>
                 <w:rStyle w:val="Hyperlink"/>
@@ -3670,7 +3654,7 @@
                 <w:noProof/>
                 <w:webHidden/>
               </w:rPr>
-              <w:instrText xml:space="preserve"> PAGEREF _Toc225621981 \h </w:instrText>
+              <w:instrText xml:space="preserve"> PAGEREF _Toc225628554 \h </w:instrText>
             </w:r>
             <w:r>
               <w:rPr>
@@ -3690,7 +3674,7 @@
                 <w:noProof/>
                 <w:webHidden/>
               </w:rPr>
-              <w:t>18</w:t>
+              <w:t>19</w:t>
             </w:r>
             <w:r>
               <w:rPr>
@@ -3717,7 +3701,7 @@
               <w14:ligatures w14:val="standardContextual"/>
             </w:rPr>
           </w:pPr>
-          <w:hyperlink w:anchor="_Toc225621982" w:history="1">
+          <w:hyperlink w:anchor="_Toc225628555" w:history="1">
             <w:r>
               <w:rPr>
                 <w:rStyle w:val="Hyperlink"/>
@@ -3764,7 +3748,7 @@
                 <w:noProof/>
                 <w:webHidden/>
               </w:rPr>
-              <w:instrText xml:space="preserve"> PAGEREF _Toc225621982 \h </w:instrText>
+              <w:instrText xml:space="preserve"> PAGEREF _Toc225628555 \h </w:instrText>
             </w:r>
             <w:r>
               <w:rPr>
@@ -3784,7 +3768,7 @@
                 <w:noProof/>
                 <w:webHidden/>
               </w:rPr>
-              <w:t>19</w:t>
+              <w:t>20</w:t>
             </w:r>
             <w:r>
               <w:rPr>
@@ -3811,7 +3795,7 @@
               <w14:ligatures w14:val="standardContextual"/>
             </w:rPr>
           </w:pPr>
-          <w:hyperlink w:anchor="_Toc225621983" w:history="1">
+          <w:hyperlink w:anchor="_Toc225628556" w:history="1">
             <w:r>
               <w:rPr>
                 <w:rStyle w:val="Hyperlink"/>
@@ -3858,7 +3842,7 @@
                 <w:noProof/>
                 <w:webHidden/>
               </w:rPr>
-              <w:instrText xml:space="preserve"> PAGEREF _Toc225621983 \h </w:instrText>
+              <w:instrText xml:space="preserve"> PAGEREF _Toc225628556 \h </w:instrText>
             </w:r>
             <w:r>
               <w:rPr>
@@ -3878,7 +3862,7 @@
                 <w:noProof/>
                 <w:webHidden/>
               </w:rPr>
-              <w:t>20</w:t>
+              <w:t>22</w:t>
             </w:r>
             <w:r>
               <w:rPr>
@@ -3905,7 +3889,7 @@
               <w14:ligatures w14:val="standardContextual"/>
             </w:rPr>
           </w:pPr>
-          <w:hyperlink w:anchor="_Toc225621984" w:history="1">
+          <w:hyperlink w:anchor="_Toc225628557" w:history="1">
             <w:r>
               <w:rPr>
                 <w:rStyle w:val="Hyperlink"/>
@@ -3952,7 +3936,7 @@
                 <w:noProof/>
                 <w:webHidden/>
               </w:rPr>
-              <w:instrText xml:space="preserve"> PAGEREF _Toc225621984 \h </w:instrText>
+              <w:instrText xml:space="preserve"> PAGEREF _Toc225628557 \h </w:instrText>
             </w:r>
             <w:r>
               <w:rPr>
@@ -3972,7 +3956,7 @@
                 <w:noProof/>
                 <w:webHidden/>
               </w:rPr>
-              <w:t>20</w:t>
+              <w:t>22</w:t>
             </w:r>
             <w:r>
               <w:rPr>
@@ -3999,7 +3983,7 @@
               <w14:ligatures w14:val="standardContextual"/>
             </w:rPr>
           </w:pPr>
-          <w:hyperlink w:anchor="_Toc225621985" w:history="1">
+          <w:hyperlink w:anchor="_Toc225628558" w:history="1">
             <w:r>
               <w:rPr>
                 <w:rStyle w:val="Hyperlink"/>
@@ -4046,7 +4030,7 @@
                 <w:noProof/>
                 <w:webHidden/>
               </w:rPr>
-              <w:instrText xml:space="preserve"> PAGEREF _Toc225621985 \h </w:instrText>
+              <w:instrText xml:space="preserve"> PAGEREF _Toc225628558 \h </w:instrText>
             </w:r>
             <w:r>
               <w:rPr>
@@ -4066,7 +4050,7 @@
                 <w:noProof/>
                 <w:webHidden/>
               </w:rPr>
-              <w:t>20</w:t>
+              <w:t>22</w:t>
             </w:r>
             <w:r>
               <w:rPr>
@@ -4093,7 +4077,7 @@
               <w14:ligatures w14:val="standardContextual"/>
             </w:rPr>
           </w:pPr>
-          <w:hyperlink w:anchor="_Toc225621986" w:history="1">
+          <w:hyperlink w:anchor="_Toc225628559" w:history="1">
             <w:r>
               <w:rPr>
                 <w:rStyle w:val="Hyperlink"/>
@@ -4140,7 +4124,7 @@
                 <w:noProof/>
                 <w:webHidden/>
               </w:rPr>
-              <w:instrText xml:space="preserve"> PAGEREF _Toc225621986 \h </w:instrText>
+              <w:instrText xml:space="preserve"> PAGEREF _Toc225628559 \h </w:instrText>
             </w:r>
             <w:r>
               <w:rPr>
@@ -4160,7 +4144,7 @@
                 <w:noProof/>
                 <w:webHidden/>
               </w:rPr>
-              <w:t>20</w:t>
+              <w:t>22</w:t>
             </w:r>
             <w:r>
               <w:rPr>
@@ -4187,7 +4171,7 @@
               <w14:ligatures w14:val="standardContextual"/>
             </w:rPr>
           </w:pPr>
-          <w:hyperlink w:anchor="_Toc225621987" w:history="1">
+          <w:hyperlink w:anchor="_Toc225628560" w:history="1">
             <w:r>
               <w:rPr>
                 <w:rStyle w:val="Hyperlink"/>
@@ -4234,7 +4218,7 @@
                 <w:noProof/>
                 <w:webHidden/>
               </w:rPr>
-              <w:instrText xml:space="preserve"> PAGEREF _Toc225621987 \h </w:instrText>
+              <w:instrText xml:space="preserve"> PAGEREF _Toc225628560 \h </w:instrText>
             </w:r>
             <w:r>
               <w:rPr>
@@ -4254,7 +4238,7 @@
                 <w:noProof/>
                 <w:webHidden/>
               </w:rPr>
-              <w:t>20</w:t>
+              <w:t>22</w:t>
             </w:r>
             <w:r>
               <w:rPr>
@@ -4281,7 +4265,7 @@
               <w14:ligatures w14:val="standardContextual"/>
             </w:rPr>
           </w:pPr>
-          <w:hyperlink w:anchor="_Toc225621988" w:history="1">
+          <w:hyperlink w:anchor="_Toc225628561" w:history="1">
             <w:r>
               <w:rPr>
                 <w:rStyle w:val="Hyperlink"/>
@@ -4328,7 +4312,7 @@
                 <w:noProof/>
                 <w:webHidden/>
               </w:rPr>
-              <w:instrText xml:space="preserve"> PAGEREF _Toc225621988 \h </w:instrText>
+              <w:instrText xml:space="preserve"> PAGEREF _Toc225628561 \h </w:instrText>
             </w:r>
             <w:r>
               <w:rPr>
@@ -4348,7 +4332,7 @@
                 <w:noProof/>
                 <w:webHidden/>
               </w:rPr>
-              <w:t>20</w:t>
+              <w:t>22</w:t>
             </w:r>
             <w:r>
               <w:rPr>
@@ -4375,7 +4359,7 @@
               <w14:ligatures w14:val="standardContextual"/>
             </w:rPr>
           </w:pPr>
-          <w:hyperlink w:anchor="_Toc225621989" w:history="1">
+          <w:hyperlink w:anchor="_Toc225628562" w:history="1">
             <w:r>
               <w:rPr>
                 <w:rStyle w:val="Hyperlink"/>
@@ -4422,7 +4406,7 @@
                 <w:noProof/>
                 <w:webHidden/>
               </w:rPr>
-              <w:instrText xml:space="preserve"> PAGEREF _Toc225621989 \h </w:instrText>
+              <w:instrText xml:space="preserve"> PAGEREF _Toc225628562 \h </w:instrText>
             </w:r>
             <w:r>
               <w:rPr>
@@ -4442,7 +4426,7 @@
                 <w:noProof/>
                 <w:webHidden/>
               </w:rPr>
-              <w:t>20</w:t>
+              <w:t>22</w:t>
             </w:r>
             <w:r>
               <w:rPr>
@@ -4469,7 +4453,7 @@
               <w14:ligatures w14:val="standardContextual"/>
             </w:rPr>
           </w:pPr>
-          <w:hyperlink w:anchor="_Toc225621990" w:history="1">
+          <w:hyperlink w:anchor="_Toc225628563" w:history="1">
             <w:r>
               <w:rPr>
                 <w:rStyle w:val="Hyperlink"/>
@@ -4516,7 +4500,7 @@
                 <w:noProof/>
                 <w:webHidden/>
               </w:rPr>
-              <w:instrText xml:space="preserve"> PAGEREF _Toc225621990 \h </w:instrText>
+              <w:instrText xml:space="preserve"> PAGEREF _Toc225628563 \h </w:instrText>
             </w:r>
             <w:r>
               <w:rPr>
@@ -4536,7 +4520,7 @@
                 <w:noProof/>
                 <w:webHidden/>
               </w:rPr>
-              <w:t>22</w:t>
+              <w:t>23</w:t>
             </w:r>
             <w:r>
               <w:rPr>
@@ -4572,7 +4556,7 @@
           <w:lang w:val="en-GB" w:eastAsia="en-GB"/>
         </w:rPr>
       </w:pPr>
-      <w:bookmarkStart w:id="3" w:name="_Toc225621958"/>
+      <w:bookmarkStart w:id="3" w:name="_Toc225628531"/>
       <w:r>
         <w:rPr>
           <w:lang w:val="en-GB" w:eastAsia="en-GB"/>
@@ -4589,6 +4573,11 @@
         </w:tabs>
         <w:rPr>
           <w:noProof/>
+          <w:kern w:val="2"/>
+          <w:sz w:val="24"/>
+          <w:szCs w:val="24"/>
+          <w:lang w:val="en-GB" w:eastAsia="en-GB"/>
+          <w14:ligatures w14:val="standardContextual"/>
         </w:rPr>
       </w:pPr>
       <w:r>
@@ -4609,7 +4598,7 @@
         </w:rPr>
         <w:fldChar w:fldCharType="separate"/>
       </w:r>
-      <w:hyperlink w:anchor="_Toc222319991" w:history="1">
+      <w:hyperlink w:anchor="_Toc225628514" w:history="1">
         <w:r>
           <w:rPr>
             <w:rStyle w:val="Hyperlink"/>
@@ -4624,7 +4613,7 @@
             <w:noProof/>
             <w:lang w:val="en-GB" w:eastAsia="en-GB"/>
           </w:rPr>
-          <w:t xml:space="preserve"> A simplified overview of hepatic drug metabolism.</w:t>
+          <w:t xml:space="preserve"> A simplified overview of hepatic drug metabolism. Phase I reactions introduce or reveal polar functional groups via processes such as oxidation, reduction, and hydrolysis. *The resulting Phase I metabolites may be directly excreted or can proceed to a subsequent conjugation step with hydrophilic molecules (Phase II reactions). Source: Original artwork by the author.</w:t>
         </w:r>
         <w:r>
           <w:rPr>
@@ -4645,7 +4634,7 @@
             <w:noProof/>
             <w:webHidden/>
           </w:rPr>
-          <w:instrText xml:space="preserve"> PAGEREF _Toc222319991 \h </w:instrText>
+          <w:instrText xml:space="preserve"> PAGEREF _Toc225628514 \h </w:instrText>
         </w:r>
         <w:r>
           <w:rPr>
@@ -4665,7 +4654,7 @@
             <w:noProof/>
             <w:webHidden/>
           </w:rPr>
-          <w:t>6</w:t>
+          <w:t>7</w:t>
         </w:r>
         <w:r>
           <w:rPr>
@@ -4684,16 +4673,21 @@
         </w:tabs>
         <w:rPr>
           <w:noProof/>
-        </w:rPr>
-      </w:pPr>
-      <w:hyperlink w:anchor="_Toc222319992" w:history="1">
+          <w:kern w:val="2"/>
+          <w:sz w:val="24"/>
+          <w:szCs w:val="24"/>
+          <w:lang w:val="en-GB" w:eastAsia="en-GB"/>
+          <w14:ligatures w14:val="standardContextual"/>
+        </w:rPr>
+      </w:pPr>
+      <w:hyperlink w:anchor="_Toc225628515" w:history="1">
         <w:r>
           <w:rPr>
             <w:rStyle w:val="Hyperlink"/>
             <w:noProof/>
             <w:lang w:val="en-GB"/>
           </w:rPr>
-          <w:t>Figure 2 CYP450 ‘dict’ descriptors</w:t>
+          <w:t>Figure 2 Summary statistics of the SMILES-to-InChI conversion process, including total processed molecules, number of successful and failed conversions, overall success rate, and execution time.</w:t>
         </w:r>
         <w:r>
           <w:rPr>
@@ -4714,7 +4708,7 @@
             <w:noProof/>
             <w:webHidden/>
           </w:rPr>
-          <w:instrText xml:space="preserve"> PAGEREF _Toc222319992 \h </w:instrText>
+          <w:instrText xml:space="preserve"> PAGEREF _Toc225628515 \h </w:instrText>
         </w:r>
         <w:r>
           <w:rPr>
@@ -4734,7 +4728,7 @@
             <w:noProof/>
             <w:webHidden/>
           </w:rPr>
-          <w:t>12</w:t>
+          <w:t>16</w:t>
         </w:r>
         <w:r>
           <w:rPr>
@@ -4753,16 +4747,39 @@
         </w:tabs>
         <w:rPr>
           <w:noProof/>
-        </w:rPr>
-      </w:pPr>
-      <w:hyperlink w:anchor="_Toc222319993" w:history="1">
+          <w:kern w:val="2"/>
+          <w:sz w:val="24"/>
+          <w:szCs w:val="24"/>
+          <w:lang w:val="en-GB" w:eastAsia="en-GB"/>
+          <w14:ligatures w14:val="standardContextual"/>
+        </w:rPr>
+      </w:pPr>
+      <w:hyperlink w:anchor="_Toc225628516" w:history="1">
         <w:r>
           <w:rPr>
             <w:rStyle w:val="Hyperlink"/>
             <w:noProof/>
             <w:lang w:val="en-GB"/>
           </w:rPr>
-          <w:t>Figure 3 Morgan fingerprint matrix</w:t>
+          <w:t xml:space="preserve">Figure 3 CYP450 ‘dict’ descriptors for full db (A) and curated db with threshold = 10 (B).  Dict( </w:t>
+        </w:r>
+        <w:r>
+          <w:rPr>
+            <w:rStyle w:val="Hyperlink"/>
+            <w:b/>
+            <w:bCs/>
+            <w:noProof/>
+            <w:lang w:val="en-GB"/>
+          </w:rPr>
+          <w:t xml:space="preserve">CYP name </w:t>
+        </w:r>
+        <w:r>
+          <w:rPr>
+            <w:rStyle w:val="Hyperlink"/>
+            <w:noProof/>
+            <w:lang w:val="en-GB"/>
+          </w:rPr>
+          <w:t>: Nº of appearances )</w:t>
         </w:r>
         <w:r>
           <w:rPr>
@@ -4783,7 +4800,7 @@
             <w:noProof/>
             <w:webHidden/>
           </w:rPr>
-          <w:instrText xml:space="preserve"> PAGEREF _Toc222319993 \h </w:instrText>
+          <w:instrText xml:space="preserve"> PAGEREF _Toc225628516 \h </w:instrText>
         </w:r>
         <w:r>
           <w:rPr>
@@ -4803,7 +4820,7 @@
             <w:noProof/>
             <w:webHidden/>
           </w:rPr>
-          <w:t>14</w:t>
+          <w:t>17</w:t>
         </w:r>
         <w:r>
           <w:rPr>
@@ -4822,16 +4839,21 @@
         </w:tabs>
         <w:rPr>
           <w:noProof/>
-        </w:rPr>
-      </w:pPr>
-      <w:hyperlink w:anchor="_Toc222319994" w:history="1">
+          <w:kern w:val="2"/>
+          <w:sz w:val="24"/>
+          <w:szCs w:val="24"/>
+          <w:lang w:val="en-GB" w:eastAsia="en-GB"/>
+          <w14:ligatures w14:val="standardContextual"/>
+        </w:rPr>
+      </w:pPr>
+      <w:hyperlink w:anchor="_Toc225628517" w:history="1">
         <w:r>
           <w:rPr>
             <w:rStyle w:val="Hyperlink"/>
             <w:noProof/>
             <w:lang w:val="en-GB"/>
           </w:rPr>
-          <w:t>Figure 4 MolE embedding matrix</w:t>
+          <w:t>Figure 4 Morgan fingerprint feature matrix (ECFP6, radius = 3) for the curated dataset. Rows correspond to DrugBank IDs; columns represent hashed substructure counts. The resulting matrix has dimensions 1368 × 2048 and contains integer count values.</w:t>
         </w:r>
         <w:r>
           <w:rPr>
@@ -4852,7 +4874,7 @@
             <w:noProof/>
             <w:webHidden/>
           </w:rPr>
-          <w:instrText xml:space="preserve"> PAGEREF _Toc222319994 \h </w:instrText>
+          <w:instrText xml:space="preserve"> PAGEREF _Toc225628517 \h </w:instrText>
         </w:r>
         <w:r>
           <w:rPr>
@@ -4872,7 +4894,7 @@
             <w:noProof/>
             <w:webHidden/>
           </w:rPr>
-          <w:t>14</w:t>
+          <w:t>18</w:t>
         </w:r>
         <w:r>
           <w:rPr>
@@ -4891,16 +4913,21 @@
         </w:tabs>
         <w:rPr>
           <w:noProof/>
-        </w:rPr>
-      </w:pPr>
-      <w:hyperlink w:anchor="_Toc222319995" w:history="1">
+          <w:kern w:val="2"/>
+          <w:sz w:val="24"/>
+          <w:szCs w:val="24"/>
+          <w:lang w:val="en-GB" w:eastAsia="en-GB"/>
+          <w14:ligatures w14:val="standardContextual"/>
+        </w:rPr>
+      </w:pPr>
+      <w:hyperlink w:anchor="_Toc225628518" w:history="1">
         <w:r>
           <w:rPr>
             <w:rStyle w:val="Hyperlink"/>
             <w:noProof/>
             <w:lang w:val="en-GB"/>
           </w:rPr>
-          <w:t>Figure 5 ChemBERTa embedding matrix</w:t>
+          <w:t>Figure 5 MolE embedding matrix for the curated dataset. Rows correspond to DrugBank IDs; columns represent pretrained embedding dimensions from the MolE transformer. The resulting matrix has dimensions 1368 × 1000 and contains continuous-valued vectors.</w:t>
         </w:r>
         <w:r>
           <w:rPr>
@@ -4921,7 +4948,7 @@
             <w:noProof/>
             <w:webHidden/>
           </w:rPr>
-          <w:instrText xml:space="preserve"> PAGEREF _Toc222319995 \h </w:instrText>
+          <w:instrText xml:space="preserve"> PAGEREF _Toc225628518 \h </w:instrText>
         </w:r>
         <w:r>
           <w:rPr>
@@ -4941,7 +4968,7 @@
             <w:noProof/>
             <w:webHidden/>
           </w:rPr>
-          <w:t>15</w:t>
+          <w:t>19</w:t>
         </w:r>
         <w:r>
           <w:rPr>
@@ -4954,6 +4981,188 @@
     </w:p>
     <w:p>
       <w:pPr>
+        <w:pStyle w:val="TableofFigures"/>
+        <w:tabs>
+          <w:tab w:val="right" w:leader="dot" w:pos="8919"/>
+        </w:tabs>
+        <w:rPr>
+          <w:noProof/>
+          <w:kern w:val="2"/>
+          <w:sz w:val="24"/>
+          <w:szCs w:val="24"/>
+          <w:lang w:val="en-GB" w:eastAsia="en-GB"/>
+          <w14:ligatures w14:val="standardContextual"/>
+        </w:rPr>
+      </w:pPr>
+      <w:hyperlink w:anchor="_Toc225628519" w:history="1">
+        <w:r>
+          <w:rPr>
+            <w:rStyle w:val="Hyperlink"/>
+            <w:noProof/>
+            <w:lang w:val="en-GB"/>
+          </w:rPr>
+          <w:t>Figure 6 ChemBERTa embedding matrix for the curated dataset. Rows correspond to DrugBank IDs; columns represent pretrained embedding dimensions from the ChemBERTa transformer. The resulting matrix has dimensions 1368 × 768 and contains continuous-valued vectors.</w:t>
+        </w:r>
+        <w:r>
+          <w:rPr>
+            <w:noProof/>
+            <w:webHidden/>
+          </w:rPr>
+          <w:tab/>
+        </w:r>
+        <w:r>
+          <w:rPr>
+            <w:noProof/>
+            <w:webHidden/>
+          </w:rPr>
+          <w:fldChar w:fldCharType="begin"/>
+        </w:r>
+        <w:r>
+          <w:rPr>
+            <w:noProof/>
+            <w:webHidden/>
+          </w:rPr>
+          <w:instrText xml:space="preserve"> PAGEREF _Toc225628519 \h </w:instrText>
+        </w:r>
+        <w:r>
+          <w:rPr>
+            <w:noProof/>
+            <w:webHidden/>
+          </w:rPr>
+        </w:r>
+        <w:r>
+          <w:rPr>
+            <w:noProof/>
+            <w:webHidden/>
+          </w:rPr>
+          <w:fldChar w:fldCharType="separate"/>
+        </w:r>
+        <w:r>
+          <w:rPr>
+            <w:noProof/>
+            <w:webHidden/>
+          </w:rPr>
+          <w:t>20</w:t>
+        </w:r>
+        <w:r>
+          <w:rPr>
+            <w:noProof/>
+            <w:webHidden/>
+          </w:rPr>
+          <w:fldChar w:fldCharType="end"/>
+        </w:r>
+      </w:hyperlink>
+    </w:p>
+    <w:p>
+      <w:pPr>
+        <w:pStyle w:val="TableofFigures"/>
+        <w:tabs>
+          <w:tab w:val="right" w:leader="dot" w:pos="8919"/>
+        </w:tabs>
+        <w:rPr>
+          <w:noProof/>
+          <w:kern w:val="2"/>
+          <w:sz w:val="24"/>
+          <w:szCs w:val="24"/>
+          <w:lang w:val="en-GB" w:eastAsia="en-GB"/>
+          <w14:ligatures w14:val="standardContextual"/>
+        </w:rPr>
+      </w:pPr>
+      <w:hyperlink w:anchor="_Toc225628520" w:history="1">
+        <w:r>
+          <w:rPr>
+            <w:rStyle w:val="Hyperlink"/>
+            <w:noProof/>
+            <w:lang w:val="en-GB"/>
+          </w:rPr>
+          <w:t>Figure 7 InChI-based embedding matrix for the curated dataset. Rows correspond to DrugBank IDs; columns represent embedding dimensions from the author</w:t>
+        </w:r>
+        <w:r>
+          <w:rPr>
+            <w:rStyle w:val="Hyperlink"/>
+            <w:rFonts w:ascii="Cambria Math" w:hAnsi="Cambria Math" w:cs="Cambria Math"/>
+            <w:noProof/>
+            <w:lang w:val="en-GB"/>
+          </w:rPr>
+          <w:t>‑</w:t>
+        </w:r>
+        <w:r>
+          <w:rPr>
+            <w:rStyle w:val="Hyperlink"/>
+            <w:noProof/>
+            <w:lang w:val="en-GB"/>
+          </w:rPr>
+          <w:t xml:space="preserve">trained InChI transformer. The resulting matrix has dimensions 1368 </w:t>
+        </w:r>
+        <w:r>
+          <w:rPr>
+            <w:rStyle w:val="Hyperlink"/>
+            <w:rFonts w:ascii="Calibri" w:hAnsi="Calibri" w:cs="Calibri"/>
+            <w:noProof/>
+            <w:lang w:val="en-GB"/>
+          </w:rPr>
+          <w:t>×</w:t>
+        </w:r>
+        <w:r>
+          <w:rPr>
+            <w:rStyle w:val="Hyperlink"/>
+            <w:noProof/>
+            <w:lang w:val="en-GB"/>
+          </w:rPr>
+          <w:t xml:space="preserve"> 384 and contains continuous-valued vectors.</w:t>
+        </w:r>
+        <w:r>
+          <w:rPr>
+            <w:noProof/>
+            <w:webHidden/>
+          </w:rPr>
+          <w:tab/>
+        </w:r>
+        <w:r>
+          <w:rPr>
+            <w:noProof/>
+            <w:webHidden/>
+          </w:rPr>
+          <w:fldChar w:fldCharType="begin"/>
+        </w:r>
+        <w:r>
+          <w:rPr>
+            <w:noProof/>
+            <w:webHidden/>
+          </w:rPr>
+          <w:instrText xml:space="preserve"> PAGEREF _Toc225628520 \h </w:instrText>
+        </w:r>
+        <w:r>
+          <w:rPr>
+            <w:noProof/>
+            <w:webHidden/>
+          </w:rPr>
+        </w:r>
+        <w:r>
+          <w:rPr>
+            <w:noProof/>
+            <w:webHidden/>
+          </w:rPr>
+          <w:fldChar w:fldCharType="separate"/>
+        </w:r>
+        <w:r>
+          <w:rPr>
+            <w:noProof/>
+            <w:webHidden/>
+          </w:rPr>
+          <w:t>21</w:t>
+        </w:r>
+        <w:r>
+          <w:rPr>
+            <w:noProof/>
+            <w:webHidden/>
+          </w:rPr>
+          <w:fldChar w:fldCharType="end"/>
+        </w:r>
+      </w:hyperlink>
+    </w:p>
+    <w:p>
+      <w:pPr>
         <w:rPr>
           <w:lang w:val="en-GB" w:eastAsia="en-GB"/>
         </w:rPr>
@@ -5048,6 +5257,7 @@
         <w:rPr>
           <w:lang w:val="en-GB" w:eastAsia="en-GB"/>
         </w:rPr>
+        <w:lastRenderedPageBreak/>
         <w:t>SMILES (Simplified Molecular Input Line Entry System)</w:t>
       </w:r>
     </w:p>
@@ -5061,7 +5271,25 @@
         <w:rPr>
           <w:lang w:val="en-GB" w:eastAsia="en-GB"/>
         </w:rPr>
-        <w:t>IUPAC International Chemical Identifier (InChI)</w:t>
+        <w:t xml:space="preserve">InChI </w:t>
+      </w:r>
+      <w:r>
+        <w:rPr>
+          <w:lang w:val="en-GB" w:eastAsia="en-GB"/>
+        </w:rPr>
+        <w:t xml:space="preserve"> (</w:t>
+      </w:r>
+      <w:r>
+        <w:rPr>
+          <w:lang w:val="en-GB" w:eastAsia="en-GB"/>
+        </w:rPr>
+        <w:t>IUPAC International Chemical Identifier</w:t>
+      </w:r>
+      <w:r>
+        <w:rPr>
+          <w:lang w:val="en-GB" w:eastAsia="en-GB"/>
+        </w:rPr>
+        <w:t>)</w:t>
       </w:r>
     </w:p>
     <w:p>
@@ -5114,37 +5342,33 @@
         <w:rPr>
           <w:lang w:val="en-GB" w:eastAsia="en-GB"/>
         </w:rPr>
+        <w:t>.</w:t>
+      </w:r>
+      <w:proofErr w:type="spellStart"/>
+      <w:r>
+        <w:rPr>
+          <w:lang w:val="en-GB" w:eastAsia="en-GB"/>
+        </w:rPr>
+        <w:t>tsv</w:t>
+      </w:r>
+      <w:proofErr w:type="spellEnd"/>
+      <w:r>
+        <w:rPr>
+          <w:lang w:val="en-GB" w:eastAsia="en-GB"/>
+        </w:rPr>
+        <w:t xml:space="preserve"> (</w:t>
+      </w:r>
+      <w:r>
+        <w:rPr>
+          <w:lang w:val="en-GB" w:eastAsia="en-GB"/>
+        </w:rPr>
         <w:t>t</w:t>
       </w:r>
       <w:r>
         <w:rPr>
           <w:lang w:val="en-GB" w:eastAsia="en-GB"/>
         </w:rPr>
-        <w:t>ab-separated values (</w:t>
-      </w:r>
-      <w:r>
-        <w:rPr>
-          <w:b/>
-          <w:bCs/>
-          <w:lang w:val="en-GB" w:eastAsia="en-GB"/>
-        </w:rPr>
-        <w:t>.</w:t>
-      </w:r>
-      <w:proofErr w:type="spellStart"/>
-      <w:r>
-        <w:rPr>
-          <w:b/>
-          <w:bCs/>
-          <w:lang w:val="en-GB" w:eastAsia="en-GB"/>
-        </w:rPr>
-        <w:t>tsv</w:t>
-      </w:r>
-      <w:proofErr w:type="spellEnd"/>
-      <w:r>
-        <w:rPr>
-          <w:lang w:val="en-GB" w:eastAsia="en-GB"/>
-        </w:rPr>
-        <w:t>)</w:t>
+        <w:t>ab-separated values)</w:t>
       </w:r>
     </w:p>
     <w:p>
@@ -5157,7 +5381,49 @@
         <w:rPr>
           <w:lang w:val="en-GB"/>
         </w:rPr>
-        <w:t>masked language model (MLM)</w:t>
+        <w:t>MLM</w:t>
+      </w:r>
+      <w:r>
+        <w:rPr>
+          <w:lang w:val="en-GB"/>
+        </w:rPr>
+        <w:t xml:space="preserve"> (M</w:t>
+      </w:r>
+      <w:r>
+        <w:rPr>
+          <w:lang w:val="en-GB"/>
+        </w:rPr>
+        <w:t xml:space="preserve">asked </w:t>
+      </w:r>
+      <w:r>
+        <w:rPr>
+          <w:lang w:val="en-GB"/>
+        </w:rPr>
+        <w:t>L</w:t>
+      </w:r>
+      <w:r>
+        <w:rPr>
+          <w:lang w:val="en-GB"/>
+        </w:rPr>
+        <w:t xml:space="preserve">anguage </w:t>
+      </w:r>
+      <w:r>
+        <w:rPr>
+          <w:lang w:val="en-GB"/>
+        </w:rPr>
+        <w:t>M</w:t>
+      </w:r>
+      <w:r>
+        <w:rPr>
+          <w:lang w:val="en-GB"/>
+        </w:rPr>
+        <w:t>odel</w:t>
+      </w:r>
+      <w:r>
+        <w:rPr>
+          <w:lang w:val="en-GB"/>
+        </w:rPr>
+        <w:t>)</w:t>
       </w:r>
     </w:p>
     <w:p>
@@ -5170,7 +5436,25 @@
         <w:rPr>
           <w:lang w:val="en-GB"/>
         </w:rPr>
-        <w:t>Byte-Pair Encoding (BPE)</w:t>
+        <w:t>BPE</w:t>
+      </w:r>
+      <w:r>
+        <w:rPr>
+          <w:lang w:val="en-GB"/>
+        </w:rPr>
+        <w:t xml:space="preserve"> (</w:t>
+      </w:r>
+      <w:r>
+        <w:rPr>
+          <w:lang w:val="en-GB"/>
+        </w:rPr>
+        <w:t>Byte-Pair Encoding</w:t>
+      </w:r>
+      <w:r>
+        <w:rPr>
+          <w:lang w:val="en-GB"/>
+        </w:rPr>
+        <w:t>)</w:t>
       </w:r>
     </w:p>
     <w:p>
@@ -5181,7 +5465,7 @@
           <w:lang w:val="en-GB" w:eastAsia="en-GB"/>
         </w:rPr>
       </w:pPr>
-      <w:bookmarkStart w:id="4" w:name="_Toc225621959"/>
+      <w:bookmarkStart w:id="4" w:name="_Toc225628532"/>
       <w:r>
         <w:rPr>
           <w:lang w:val="en-GB" w:eastAsia="en-GB"/>
@@ -5219,14 +5503,7 @@
         <w:rPr>
           <w:lang w:val="en-GB" w:eastAsia="en-GB"/>
         </w:rPr>
-        <w:t xml:space="preserve">, complex, and costly process requiring rigorous evaluation of safety and efficacy before clinical use. Notably, nearly 40% of drug candidates fail during clinical </w:t>
-      </w:r>
-      <w:r>
-        <w:rPr>
-          <w:lang w:val="en-GB" w:eastAsia="en-GB"/>
-        </w:rPr>
-        <w:lastRenderedPageBreak/>
-        <w:t>trials due to inadequate pharmacokinetic properties</w:t>
+        <w:t>, complex, and costly process requiring rigorous evaluation of safety and efficacy before clinical use. Notably, nearly 40% of drug candidates fail during clinical trials due to inadequate pharmacokinetic properties</w:t>
       </w:r>
       <w:r>
         <w:rPr>
@@ -5408,7 +5685,14 @@
         <w:rPr>
           <w:lang w:val="en-GB" w:eastAsia="en-GB"/>
         </w:rPr>
-        <w:t>, is helping to bridge this gap. These resources compile extensive information on molecular structures and their known metabolic properties, providing a valuable foundation for predictive modelling. By leveraging this data, machine-learning algorithms can anticipate metabolic behaviour much earlier in the discovery process, offering insights that would otherwise require time-intensive and costly experiments.</w:t>
+        <w:t xml:space="preserve">, is helping to bridge this gap. These resources compile extensive information on molecular structures and their known metabolic properties, providing a valuable foundation for predictive modelling. By leveraging this data, machine-learning algorithms can anticipate metabolic behaviour much earlier </w:t>
+      </w:r>
+      <w:r>
+        <w:rPr>
+          <w:lang w:val="en-GB" w:eastAsia="en-GB"/>
+        </w:rPr>
+        <w:lastRenderedPageBreak/>
+        <w:t>in the discovery process, offering insights that would otherwise require time-intensive and costly experiments.</w:t>
       </w:r>
     </w:p>
     <w:p>
@@ -5433,7 +5717,7 @@
           <w:lang w:val="en-GB" w:eastAsia="en-GB"/>
         </w:rPr>
       </w:pPr>
-      <w:bookmarkStart w:id="5" w:name="_Toc225621960"/>
+      <w:bookmarkStart w:id="5" w:name="_Toc225628533"/>
       <w:r>
         <w:rPr>
           <w:lang w:val="en-GB" w:eastAsia="en-GB"/>
@@ -5449,7 +5733,7 @@
           <w:lang w:val="en-GB" w:eastAsia="en-GB"/>
         </w:rPr>
       </w:pPr>
-      <w:bookmarkStart w:id="6" w:name="_Toc225621961"/>
+      <w:bookmarkStart w:id="6" w:name="_Toc225628534"/>
       <w:r>
         <w:rPr>
           <w:lang w:val="en-GB" w:eastAsia="en-GB"/>
@@ -5494,14 +5778,19 @@
         <w:rPr>
           <w:lang w:val="en-GB" w:eastAsia="en-GB"/>
         </w:rPr>
-        <w:t xml:space="preserve">he most physiologically relevant system available for </w:t>
-      </w:r>
-      <w:r>
-        <w:rPr>
-          <w:lang w:val="en-GB" w:eastAsia="en-GB"/>
-        </w:rPr>
-        <w:lastRenderedPageBreak/>
-        <w:t>studying human drug metabolism is the use of primary hepatocytes—liver cells that retain the full complement of metabolic enzymes and cofactors found in vivo. These cells allow researchers to observe both major classes of metabolic reactions: Phase I, which generally involves functionalization of the drug (e.g., oxidation, reduction, or hydrolysis), and Phase II, which involves conjugation reactions that increase the molecule’s solubility</w:t>
+        <w:t>he most physiologically relevant system available for studying human drug metabolism is the use of primary hepatocytes—liver cells that retain the full complement of metabolic enzymes and cofactors found in vivo. These cells allow researchers to observe both major classes of metabolic reactions:</w:t>
+      </w:r>
+      <w:r>
+        <w:rPr>
+          <w:lang w:val="en-GB" w:eastAsia="en-GB"/>
+        </w:rPr>
+        <w:t xml:space="preserve"> </w:t>
+      </w:r>
+      <w:r>
+        <w:rPr>
+          <w:lang w:val="en-GB" w:eastAsia="en-GB"/>
+        </w:rPr>
+        <w:t>Phase I, which generally involves functionalization of the drug (e.g., oxidation, reduction, or hydrolysis), and Phase II, which involves conjugation reactions that increase the molecule’s solubility</w:t>
       </w:r>
       <w:r>
         <w:rPr>
@@ -5539,6 +5828,7 @@
         <w:rPr>
           <w:noProof/>
         </w:rPr>
+        <w:lastRenderedPageBreak/>
         <w:drawing>
           <wp:inline distT="0" distB="0" distL="0" distR="0" wp14:anchorId="0581CD12" wp14:editId="11B0B868">
             <wp:extent cx="5622202" cy="3949835"/>
@@ -5583,7 +5873,7 @@
           <w:lang w:val="en-GB"/>
         </w:rPr>
       </w:pPr>
-      <w:bookmarkStart w:id="7" w:name="_Toc222319991"/>
+      <w:bookmarkStart w:id="7" w:name="_Toc225628514"/>
       <w:r>
         <w:rPr>
           <w:lang w:val="en-GB"/>
@@ -5611,6 +5901,9 @@
       </w:r>
       <w:r>
         <w:fldChar w:fldCharType="end"/>
+      </w:r>
+      <w:r>
+        <w:t>.</w:t>
       </w:r>
       <w:r>
         <w:rPr>
@@ -5687,14 +5980,7 @@
         <w:rPr>
           <w:lang w:val="en-GB" w:eastAsia="en-GB"/>
         </w:rPr>
-        <w:t xml:space="preserve">To address the need for faster and more cost-effective metabolism screening, liver microsomes have become a widely used alternative. Microsomes are subcellular fractions derived from the endoplasmic reticulum of hepatocytes, containing a concentrated pool of Phase I enzymes, </w:t>
-      </w:r>
-      <w:r>
-        <w:rPr>
-          <w:lang w:val="en-GB" w:eastAsia="en-GB"/>
-        </w:rPr>
-        <w:lastRenderedPageBreak/>
-        <w:t xml:space="preserve">particularly the </w:t>
+        <w:t xml:space="preserve">To address the need for faster and more cost-effective metabolism screening, liver microsomes have become a widely used alternative. Microsomes are subcellular fractions derived from the endoplasmic reticulum of hepatocytes, containing a concentrated pool of Phase I enzymes, particularly the </w:t>
       </w:r>
       <w:r>
         <w:rPr>
@@ -5732,7 +6018,14 @@
         <w:rPr>
           <w:lang w:val="en-GB" w:eastAsia="en-GB"/>
         </w:rPr>
-        <w:t>One important consideration in early drug metabolism studies is that Phase I reactions, which are largely mediated by CYP450 enzymes, tend to be more unpredictable and clinically significant than Phase II reactions. Phase I often introduces functional groups to a molecule, creating reactive intermediates or metabolites that can lead to drug–drug interactions or unexpected toxicity. In contrast, Phase II reactions</w:t>
+        <w:t xml:space="preserve">One important consideration in early drug metabolism studies is that Phase I reactions, which are largely mediated by CYP450 enzymes, tend to be more unpredictable and clinically significant than </w:t>
+      </w:r>
+      <w:r>
+        <w:rPr>
+          <w:lang w:val="en-GB" w:eastAsia="en-GB"/>
+        </w:rPr>
+        <w:lastRenderedPageBreak/>
+        <w:t>Phase II reactions. Phase I often introduces functional groups to a molecule, creating reactive intermediates or metabolites that can lead to drug–drug interactions or unexpected toxicity. In contrast, Phase II reactions</w:t>
       </w:r>
       <w:r>
         <w:rPr>
@@ -5766,7 +6059,7 @@
           <w:lang w:val="en-GB" w:eastAsia="en-GB"/>
         </w:rPr>
       </w:pPr>
-      <w:bookmarkStart w:id="8" w:name="_Toc225621962"/>
+      <w:bookmarkStart w:id="8" w:name="_Toc225628535"/>
       <w:r>
         <w:rPr>
           <w:i/>
@@ -6140,7 +6433,6 @@
         <w:rPr>
           <w:lang w:val="en-GB" w:eastAsia="en-GB"/>
         </w:rPr>
-        <w:lastRenderedPageBreak/>
         <w:t xml:space="preserve">Academic platforms such as </w:t>
       </w:r>
       <w:proofErr w:type="spellStart"/>
@@ -6326,11 +6618,12 @@
           <w:lang w:val="en-GB" w:eastAsia="en-GB"/>
         </w:rPr>
       </w:pPr>
-      <w:bookmarkStart w:id="9" w:name="_Toc225621963"/>
-      <w:r>
-        <w:rPr>
-          <w:lang w:val="en-GB" w:eastAsia="en-GB"/>
-        </w:rPr>
+      <w:bookmarkStart w:id="9" w:name="_Toc225628536"/>
+      <w:r>
+        <w:rPr>
+          <w:lang w:val="en-GB" w:eastAsia="en-GB"/>
+        </w:rPr>
+        <w:lastRenderedPageBreak/>
         <w:t>Molecular representations</w:t>
       </w:r>
       <w:bookmarkEnd w:id="9"/>
@@ -6668,63 +6961,71 @@
         <w:rPr>
           <w:lang w:val="en-GB" w:eastAsia="en-GB"/>
         </w:rPr>
-        <w:t xml:space="preserve">The field has </w:t>
+        <w:t>The field has implicitly adopted SMILES syntax as the de facto language of chemical structure</w:t>
+      </w:r>
+      <w:r>
+        <w:rPr>
+          <w:lang w:val="en-GB" w:eastAsia="en-GB"/>
+        </w:rPr>
+        <w:t xml:space="preserve">. By contrast, the IUPAC International Chemical Identifier (InChI) was specifically designed to provide a canonical and standardized encoding of molecular connectivity and stereochemistry, yet it remains comparatively underexplored in representation learning frameworks. </w:t>
+      </w:r>
+      <w:r>
+        <w:rPr>
+          <w:lang w:val="en-GB" w:eastAsia="en-GB"/>
+        </w:rPr>
+        <w:t>This imbalance raises a question: does SMILES dominate because it is representationally superior, or merely because it arrived first and gathered momentum?</w:t>
+      </w:r>
+      <w:r>
+        <w:rPr>
+          <w:lang w:val="en-GB" w:eastAsia="en-GB"/>
+        </w:rPr>
+        <w:t xml:space="preserve"> While SMILES offers flexibility and broad software support, its non-unique nature requires canonicalizatio</w:t>
+      </w:r>
+      <w:r>
+        <w:rPr>
+          <w:lang w:val="en-GB" w:eastAsia="en-GB"/>
+        </w:rPr>
+        <w:t>n</w:t>
+      </w:r>
+      <w:r>
+        <w:rPr>
+          <w:lang w:val="en-GB" w:eastAsia="en-GB"/>
+        </w:rPr>
+        <w:t xml:space="preserve">, as multiple valid strings may correspond to the same molecule. InChI, in principle, reduces such ambiguity through deterministic encoding, but its layered and highly structured format may present different </w:t>
+      </w:r>
+      <w:r>
+        <w:rPr>
+          <w:lang w:val="en-GB" w:eastAsia="en-GB"/>
+        </w:rPr>
+        <w:t>modelling</w:t>
+      </w:r>
+      <w:r>
+        <w:rPr>
+          <w:lang w:val="en-GB" w:eastAsia="en-GB"/>
+        </w:rPr>
+        <w:t xml:space="preserve"> challenges. </w:t>
+      </w:r>
+      <w:r>
+        <w:rPr>
+          <w:lang w:val="en-GB" w:eastAsia="en-GB"/>
+        </w:rPr>
+        <w:t xml:space="preserve">The limited adoption of InChI in machine learning is therefore not a settled conclusion but an open design choice. As a </w:t>
       </w:r>
       <w:r>
         <w:rPr>
           <w:lang w:val="en-GB" w:eastAsia="en-GB"/>
         </w:rPr>
         <w:lastRenderedPageBreak/>
-        <w:t>implicitly adopted SMILES syntax as the de facto language of chemical structure</w:t>
-      </w:r>
-      <w:r>
-        <w:rPr>
-          <w:lang w:val="en-GB" w:eastAsia="en-GB"/>
-        </w:rPr>
-        <w:t xml:space="preserve">. By contrast, the IUPAC International Chemical Identifier (InChI) was specifically designed to provide a canonical and standardized encoding of molecular connectivity and stereochemistry, yet it remains comparatively underexplored in representation learning frameworks. </w:t>
-      </w:r>
-      <w:r>
-        <w:rPr>
-          <w:lang w:val="en-GB" w:eastAsia="en-GB"/>
-        </w:rPr>
-        <w:t>This imbalance raises a question: does SMILES dominate because it is representationally superior, or merely because it arrived first and gathered momentum?</w:t>
-      </w:r>
-      <w:r>
-        <w:rPr>
-          <w:lang w:val="en-GB" w:eastAsia="en-GB"/>
-        </w:rPr>
-        <w:t xml:space="preserve"> While SMILES offers flexibility and broad software support, its non-unique nature requires canonicalizatio</w:t>
-      </w:r>
-      <w:r>
-        <w:rPr>
-          <w:lang w:val="en-GB" w:eastAsia="en-GB"/>
-        </w:rPr>
-        <w:t>n</w:t>
-      </w:r>
-      <w:r>
-        <w:rPr>
-          <w:lang w:val="en-GB" w:eastAsia="en-GB"/>
-        </w:rPr>
-        <w:t xml:space="preserve">, as multiple valid strings may correspond to the same molecule. InChI, in principle, reduces such ambiguity through deterministic encoding, but its layered and highly structured format may present different </w:t>
-      </w:r>
-      <w:r>
-        <w:rPr>
-          <w:lang w:val="en-GB" w:eastAsia="en-GB"/>
-        </w:rPr>
-        <w:t>modelling</w:t>
-      </w:r>
-      <w:r>
-        <w:rPr>
-          <w:lang w:val="en-GB" w:eastAsia="en-GB"/>
-        </w:rPr>
-        <w:t xml:space="preserve"> challenges. </w:t>
-      </w:r>
-      <w:r>
-        <w:rPr>
-          <w:lang w:val="en-GB" w:eastAsia="en-GB"/>
-        </w:rPr>
-        <w:t>The limited adoption of InChI in machine learning is therefore not a settled conclusion but an open design choice. As a complementary line of inquiry, this thesis explores whether an InChI-native encoder can learn representations that complement or challenge those derived from SMILES.</w:t>
-      </w:r>
+        <w:t>complementary line of inquiry, this thesis explores whether an InChI-native encoder can learn representations that complement or challenge those derived from SMILES.</w:t>
+      </w:r>
+    </w:p>
+    <w:p>
+      <w:pPr>
+        <w:pStyle w:val="Heading1"/>
+        <w:rPr>
+          <w:lang w:val="en-GB" w:eastAsia="en-GB"/>
+        </w:rPr>
+      </w:pPr>
       <w:r>
         <w:rPr>
           <w:lang w:val="en-GB" w:eastAsia="en-GB"/>
@@ -6792,22 +7093,16 @@
         </w:numPr>
         <w:jc w:val="both"/>
         <w:rPr>
-          <w:color w:val="FF0000"/>
-          <w:lang w:val="en-GB" w:eastAsia="en-GB"/>
-        </w:rPr>
-      </w:pPr>
-      <w:r>
-        <w:rPr>
-          <w:lang w:val="en-GB" w:eastAsia="en-GB"/>
-        </w:rPr>
-        <w:t xml:space="preserve">Apply ETL (Extract, Transform, Load) techniques to collect, clean, and preprocess molecular </w:t>
-      </w:r>
-      <w:r>
-        <w:rPr>
           <w:color w:val="000000" w:themeColor="text1"/>
           <w:lang w:val="en-GB" w:eastAsia="en-GB"/>
         </w:rPr>
-        <w:t xml:space="preserve">structure datasets and metabolic annotations from public sources such as </w:t>
+      </w:pPr>
+      <w:r>
+        <w:rPr>
+          <w:color w:val="000000" w:themeColor="text1"/>
+          <w:lang w:val="en-GB" w:eastAsia="en-GB"/>
+        </w:rPr>
+        <w:t xml:space="preserve">Apply ETL (Extract, Transform, Load) techniques to collect, clean, and preprocess molecular structure datasets and metabolic annotations from public sources such as </w:t>
       </w:r>
       <w:proofErr w:type="spellStart"/>
       <w:r>
@@ -6992,7 +7287,7 @@
           <w:lang w:val="en-GB" w:eastAsia="en-GB"/>
         </w:rPr>
       </w:pPr>
-      <w:bookmarkStart w:id="10" w:name="_Toc225621964"/>
+      <w:bookmarkStart w:id="10" w:name="_Toc225628537"/>
       <w:r>
         <w:rPr>
           <w:lang w:val="en-GB" w:eastAsia="en-GB"/>
@@ -7009,7 +7304,7 @@
           <w:lang w:val="en-GB"/>
         </w:rPr>
       </w:pPr>
-      <w:bookmarkStart w:id="11" w:name="_Toc225621965"/>
+      <w:bookmarkStart w:id="11" w:name="_Toc225628538"/>
       <w:proofErr w:type="spellStart"/>
       <w:r>
         <w:t>Reproducibility</w:t>
@@ -7094,14 +7389,12 @@
         </w:rPr>
         <w:t xml:space="preserve">All </w:t>
       </w:r>
-      <w:proofErr w:type="spellStart"/>
-      <w:r>
-        <w:rPr>
-          <w:lang w:val="en-GB"/>
-        </w:rPr>
-        <w:t>modeling</w:t>
-      </w:r>
-      <w:proofErr w:type="spellEnd"/>
+      <w:r>
+        <w:rPr>
+          <w:lang w:val="en-GB"/>
+        </w:rPr>
+        <w:t>modelling</w:t>
+      </w:r>
       <w:r>
         <w:rPr>
           <w:lang w:val="en-GB"/>
@@ -7126,7 +7419,6 @@
         <w:rPr>
           <w:lang w:val="en-GB"/>
         </w:rPr>
-        <w:lastRenderedPageBreak/>
         <w:t>All computational work was performed on local hardware</w:t>
       </w:r>
       <w:r>
@@ -7150,11 +7442,12 @@
           <w:lang w:val="en-GB" w:eastAsia="en-GB"/>
         </w:rPr>
       </w:pPr>
-      <w:bookmarkStart w:id="12" w:name="_Toc225621966"/>
-      <w:r>
-        <w:rPr>
-          <w:lang w:val="en-GB" w:eastAsia="en-GB"/>
-        </w:rPr>
+      <w:bookmarkStart w:id="12" w:name="_Toc225628539"/>
+      <w:r>
+        <w:rPr>
+          <w:lang w:val="en-GB" w:eastAsia="en-GB"/>
+        </w:rPr>
+        <w:lastRenderedPageBreak/>
         <w:t>Data Acquisition &amp; Management</w:t>
       </w:r>
       <w:bookmarkEnd w:id="12"/>
@@ -7417,7 +7710,7 @@
           <w:lang w:val="en-GB"/>
         </w:rPr>
       </w:pPr>
-      <w:bookmarkStart w:id="13" w:name="_Toc225621967"/>
+      <w:bookmarkStart w:id="13" w:name="_Toc225628540"/>
       <w:r>
         <w:t xml:space="preserve">Molecular </w:t>
       </w:r>
@@ -7829,14 +8122,20 @@
         <w:rPr>
           <w:lang w:val="en-GB"/>
         </w:rPr>
+        <w:t>Beyond traditional handcrafted fingerprints, recent advances in molecular machine learning have introduced embedding-based representations, in which molecules are mapped to continuous latent vectors learned from large chemical corpora.</w:t>
+      </w:r>
+      <w:r>
+        <w:rPr>
+          <w:lang w:val="en-GB"/>
+        </w:rPr>
+        <w:t xml:space="preserve"> Whereas Morgan fingerprints deterministically encode predefined substructural patterns through hashing, learned embeddings aim to capture higher-order </w:t>
+      </w:r>
+      <w:r>
+        <w:rPr>
+          <w:lang w:val="en-GB"/>
+        </w:rPr>
         <w:lastRenderedPageBreak/>
-        <w:t>Beyond traditional handcrafted fingerprints, recent advances in molecular machine learning have introduced embedding-based representations, in which molecules are mapped to continuous latent vectors learned from large chemical corpora.</w:t>
-      </w:r>
-      <w:r>
-        <w:rPr>
-          <w:lang w:val="en-GB"/>
-        </w:rPr>
-        <w:t xml:space="preserve"> Whereas Morgan fingerprints deterministically encode predefined substructural patterns through hashing, learned embeddings aim to capture higher-order chemical relationships, potentially reflecting subtle electronic, steric, or contextual dependencies that are not explicitly enumerated by fragment-based descriptors </w:t>
+        <w:t xml:space="preserve">chemical relationships, potentially reflecting subtle electronic, steric, or contextual dependencies that are not explicitly enumerated by fragment-based descriptors </w:t>
       </w:r>
       <w:sdt>
         <w:sdtPr>
@@ -8674,72 +8973,125 @@
     </w:p>
     <w:p>
       <w:pPr>
+        <w:keepNext/>
         <w:jc w:val="both"/>
-        <w:rPr>
-          <w:color w:val="EE0000"/>
-          <w:lang w:val="en-GB" w:eastAsia="en-GB"/>
+      </w:pPr>
+      <w:r>
+        <w:drawing>
+          <wp:inline distT="0" distB="0" distL="0" distR="0" wp14:anchorId="67CABC7F" wp14:editId="0F691490">
+            <wp:extent cx="5669915" cy="3187700"/>
+            <wp:effectExtent l="0" t="0" r="6985" b="0"/>
+            <wp:docPr id="524568271" name="Picture 1"/>
+            <wp:cNvGraphicFramePr>
+              <a:graphicFrameLocks xmlns:a="http://schemas.openxmlformats.org/drawingml/2006/main" noChangeAspect="1"/>
+            </wp:cNvGraphicFramePr>
+            <a:graphic xmlns:a="http://schemas.openxmlformats.org/drawingml/2006/main">
+              <a:graphicData uri="http://schemas.openxmlformats.org/drawingml/2006/picture">
+                <pic:pic xmlns:pic="http://schemas.openxmlformats.org/drawingml/2006/picture">
+                  <pic:nvPicPr>
+                    <pic:cNvPr id="524568271" name=""/>
+                    <pic:cNvPicPr/>
+                  </pic:nvPicPr>
+                  <pic:blipFill>
+                    <a:blip r:embed="rId19"/>
+                    <a:stretch>
+                      <a:fillRect/>
+                    </a:stretch>
+                  </pic:blipFill>
+                  <pic:spPr>
+                    <a:xfrm>
+                      <a:off x="0" y="0"/>
+                      <a:ext cx="5669915" cy="3187700"/>
+                    </a:xfrm>
+                    <a:prstGeom prst="rect">
+                      <a:avLst/>
+                    </a:prstGeom>
+                  </pic:spPr>
+                </pic:pic>
+              </a:graphicData>
+            </a:graphic>
+          </wp:inline>
+        </w:drawing>
+      </w:r>
+    </w:p>
+    <w:p>
+      <w:pPr>
+        <w:pStyle w:val="Caption"/>
+        <w:jc w:val="both"/>
+        <w:rPr>
+          <w:lang w:val="en-GB"/>
+        </w:rPr>
+      </w:pPr>
+      <w:r>
+        <w:rPr>
+          <w:lang w:val="en-GB"/>
+        </w:rPr>
+        <w:t xml:space="preserve">Figure </w:t>
+      </w:r>
+      <w:r>
+        <w:fldChar w:fldCharType="begin"/>
+      </w:r>
+      <w:r>
+        <w:rPr>
+          <w:lang w:val="en-GB"/>
+        </w:rPr>
+        <w:instrText xml:space="preserve"> SEQ Figure \* ARABIC </w:instrText>
+      </w:r>
+      <w:r>
+        <w:fldChar w:fldCharType="separate"/>
+      </w:r>
+      <w:r>
+        <w:rPr>
+          <w:noProof/>
+          <w:lang w:val="en-GB"/>
+        </w:rPr>
+        <w:t>2</w:t>
+      </w:r>
+      <w:r>
+        <w:fldChar w:fldCharType="end"/>
+      </w:r>
+      <w:r>
+        <w:t>.</w:t>
+      </w:r>
+      <w:r>
+        <w:rPr>
+          <w:lang w:val="en-GB"/>
+        </w:rPr>
+        <w:t xml:space="preserve"> </w:t>
+      </w:r>
+      <w:r>
+        <w:rPr>
+          <w:lang w:val="en-GB"/>
+        </w:rPr>
+        <w:t>Simplified schematic of molecular representation pipelines.</w:t>
+      </w:r>
+    </w:p>
+    <w:p>
+      <w:pPr>
+        <w:pStyle w:val="Caption"/>
+        <w:jc w:val="both"/>
+        <w:rPr>
+          <w:lang w:val="en-GB"/>
         </w:rPr>
       </w:pPr>
       <w:r>
         <w:rPr>
           <w:b/>
           <w:bCs/>
-          <w:color w:val="EE0000"/>
-          <w:lang w:val="en-GB" w:eastAsia="en-GB"/>
-        </w:rPr>
-        <w:t>Figure X.</w:t>
-      </w:r>
-      <w:r>
-        <w:rPr>
-          <w:color w:val="EE0000"/>
-          <w:lang w:val="en-GB" w:eastAsia="en-GB"/>
-        </w:rPr>
-        <w:t xml:space="preserve"> Schematic representation of Morgan fingerprint generation from a SMILES string vs embedding? U </w:t>
-      </w:r>
-      <w:proofErr w:type="spellStart"/>
-      <w:r>
-        <w:rPr>
-          <w:color w:val="EE0000"/>
-          <w:lang w:val="en-GB" w:eastAsia="en-GB"/>
-        </w:rPr>
-        <w:t>otra</w:t>
-      </w:r>
-      <w:proofErr w:type="spellEnd"/>
-      <w:r>
-        <w:rPr>
-          <w:color w:val="EE0000"/>
-          <w:lang w:val="en-GB" w:eastAsia="en-GB"/>
-        </w:rPr>
-        <w:t xml:space="preserve"> </w:t>
-      </w:r>
-      <w:proofErr w:type="spellStart"/>
-      <w:r>
-        <w:rPr>
-          <w:color w:val="EE0000"/>
-          <w:lang w:val="en-GB" w:eastAsia="en-GB"/>
-        </w:rPr>
-        <w:t>figura</w:t>
-      </w:r>
-      <w:proofErr w:type="spellEnd"/>
-      <w:r>
-        <w:rPr>
-          <w:color w:val="EE0000"/>
-          <w:lang w:val="en-GB" w:eastAsia="en-GB"/>
-        </w:rPr>
-        <w:t xml:space="preserve"> </w:t>
-      </w:r>
-      <w:proofErr w:type="spellStart"/>
-      <w:r>
-        <w:rPr>
-          <w:color w:val="EE0000"/>
-          <w:lang w:val="en-GB" w:eastAsia="en-GB"/>
-        </w:rPr>
-        <w:t>acorde</w:t>
-      </w:r>
-      <w:proofErr w:type="spellEnd"/>
+          <w:lang w:val="en-GB"/>
+        </w:rPr>
+        <w:t>(A)</w:t>
+      </w:r>
+      <w:r>
+        <w:rPr>
+          <w:lang w:val="en-GB"/>
+        </w:rPr>
+        <w:t xml:space="preserve"> Example molecule (ibuprofen) and its SMILES encoding.</w:t>
+      </w:r>
     </w:p>
     <w:p>
       <w:pPr>
+        <w:pStyle w:val="Caption"/>
         <w:jc w:val="both"/>
         <w:rPr>
           <w:lang w:val="en-GB"/>
@@ -8747,23 +9099,378 @@
       </w:pPr>
       <w:r>
         <w:rPr>
-          <w:lang w:val="en-GB"/>
-        </w:rPr>
-        <w:t>Binary fingerprints, and to a lesser extent count-based variants, represent molecules as collections of predefined substructures. While this strategy has proven highly effective in many QSAR applications, it ultimately reduces chemical space to a catalogue of fragments, potentially overlooking more subtle steric, electronic, or conformational effects that may influence enzymatic recognition. In the context of CYP450 metabolism, where substrate specificity depends not only on the presence of functional groups but also on their accessibility and surrounding environment, such simplification may limit the expressiveness of purely fragment-based descriptors.</w:t>
+          <w:b/>
+          <w:bCs/>
+          <w:lang w:val="en-GB"/>
+        </w:rPr>
+        <w:t>(B)</w:t>
+      </w:r>
+      <w:r>
+        <w:rPr>
+          <w:lang w:val="en-GB"/>
+        </w:rPr>
+        <w:t xml:space="preserve"> Illustration of ECFP6 generation, where circular substructures (radius = 3) are enumerated and hashed into a fixed-length vector</w:t>
+      </w:r>
+      <w:r>
+        <w:rPr>
+          <w:lang w:val="en-GB"/>
+        </w:rPr>
+        <w:t xml:space="preserve">. </w:t>
+      </w:r>
+      <w:r>
+        <w:rPr>
+          <w:lang w:val="en-GB"/>
+        </w:rPr>
+        <w:t>This results in a sparse, discrete representation capturing predefined molecular fragments.</w:t>
       </w:r>
     </w:p>
     <w:p>
       <w:pPr>
+        <w:pStyle w:val="Caption"/>
         <w:jc w:val="both"/>
         <w:rPr>
-          <w:lang w:val="en-GB"/>
-        </w:rPr>
-      </w:pPr>
-      <w:r>
-        <w:rPr>
-          <w:lang w:val="en-GB"/>
-        </w:rPr>
-        <w:t>Learned embeddings attempt to address this limitation by mapping molecules into dense continuous vector spaces, where structural similarity is inferred from patterns learned across large chemical corpora rather than from explicit substructure overlap. In principle, this allows chemically related molecules to occupy nearby regions in embedding space even when they do not share identical hashed fragments. However, the advantages of this approach are closely tied to data scale and model capacity; without sufficient training data, high-dimensional embeddings may fail to generalize and can underperform simpler, handcrafted representations.</w:t>
+          <w:rFonts w:ascii="Cambria Math" w:hAnsi="Cambria Math"/>
+          <w:lang w:val="en-GB"/>
+        </w:rPr>
+      </w:pPr>
+      <w:r>
+        <w:rPr>
+          <w:b/>
+          <w:bCs/>
+          <w:lang w:val="en-GB"/>
+        </w:rPr>
+        <w:lastRenderedPageBreak/>
+        <w:t>(C)</w:t>
+      </w:r>
+      <w:r>
+        <w:rPr>
+          <w:lang w:val="en-GB"/>
+        </w:rPr>
+        <w:t xml:space="preserve"> </w:t>
+      </w:r>
+      <w:r>
+        <w:rPr>
+          <w:lang w:val="en-GB"/>
+        </w:rPr>
+        <w:t>Learned molecular embedding approach</w:t>
+      </w:r>
+      <w:r>
+        <w:rPr>
+          <w:lang w:val="en-GB"/>
+        </w:rPr>
+        <w:t xml:space="preserve">. </w:t>
+      </w:r>
+      <w:r>
+        <w:rPr>
+          <w:lang w:val="en-GB"/>
+        </w:rPr>
+        <w:t xml:space="preserve">A molecular encoder </w:t>
+      </w:r>
+      <m:oMath>
+        <m:sSub>
+          <m:sSubPr>
+            <m:ctrlPr>
+              <w:rPr>
+                <w:rFonts w:ascii="Cambria Math" w:hAnsi="Cambria Math"/>
+              </w:rPr>
+            </m:ctrlPr>
+          </m:sSubPr>
+          <m:e>
+            <m:r>
+              <w:rPr>
+                <w:rFonts w:ascii="Cambria Math" w:hAnsi="Cambria Math"/>
+              </w:rPr>
+              <m:t>f</m:t>
+            </m:r>
+          </m:e>
+          <m:sub>
+            <m:r>
+              <w:rPr>
+                <w:rFonts w:ascii="Cambria Math" w:hAnsi="Cambria Math"/>
+              </w:rPr>
+              <m:t>θ</m:t>
+            </m:r>
+          </m:sub>
+        </m:sSub>
+      </m:oMath>
+      <w:r>
+        <w:rPr>
+          <w:lang w:val="en-GB"/>
+        </w:rPr>
+        <w:t xml:space="preserve"> </w:t>
+      </w:r>
+      <w:r>
+        <w:rPr>
+          <w:lang w:val="en-GB"/>
+        </w:rPr>
+        <w:t xml:space="preserve">is trained on a large chemical database through a general representation learning process. Given a new molecule (e.g., ibuprofen), its SMILES string is tokenized and converted into a sequence of embeddings </w:t>
+      </w:r>
+      <m:oMath>
+        <m:r>
+          <w:rPr>
+            <w:rFonts w:ascii="Cambria Math" w:hAnsi="Cambria Math"/>
+          </w:rPr>
+          <m:t>x</m:t>
+        </m:r>
+        <m:r>
+          <w:rPr>
+            <w:rFonts w:ascii="Cambria Math" w:hAnsi="Cambria Math"/>
+            <w:lang w:val="en-GB"/>
+          </w:rPr>
+          <m:t>=(</m:t>
+        </m:r>
+        <m:r>
+          <w:rPr>
+            <w:rFonts w:ascii="Cambria Math" w:hAnsi="Cambria Math"/>
+          </w:rPr>
+          <m:t>e</m:t>
+        </m:r>
+        <m:r>
+          <w:rPr>
+            <w:rFonts w:ascii="Cambria Math" w:hAnsi="Cambria Math"/>
+            <w:lang w:val="en-GB"/>
+          </w:rPr>
+          <m:t>(</m:t>
+        </m:r>
+        <m:sSub>
+          <m:sSubPr>
+            <m:ctrlPr>
+              <w:rPr>
+                <w:rFonts w:ascii="Cambria Math" w:hAnsi="Cambria Math"/>
+              </w:rPr>
+            </m:ctrlPr>
+          </m:sSubPr>
+          <m:e>
+            <m:r>
+              <w:rPr>
+                <w:rFonts w:ascii="Cambria Math" w:hAnsi="Cambria Math"/>
+              </w:rPr>
+              <m:t>t</m:t>
+            </m:r>
+          </m:e>
+          <m:sub>
+            <m:r>
+              <w:rPr>
+                <w:rFonts w:ascii="Cambria Math" w:hAnsi="Cambria Math"/>
+                <w:lang w:val="en-GB"/>
+              </w:rPr>
+              <m:t>1</m:t>
+            </m:r>
+          </m:sub>
+        </m:sSub>
+        <m:r>
+          <w:rPr>
+            <w:rFonts w:ascii="Cambria Math" w:hAnsi="Cambria Math"/>
+            <w:lang w:val="en-GB"/>
+          </w:rPr>
+          <m:t>),</m:t>
+        </m:r>
+        <m:r>
+          <w:rPr>
+            <w:rFonts w:ascii="Cambria Math" w:hAnsi="Cambria Math"/>
+          </w:rPr>
+          <m:t>e</m:t>
+        </m:r>
+        <m:r>
+          <w:rPr>
+            <w:rFonts w:ascii="Cambria Math" w:hAnsi="Cambria Math"/>
+            <w:lang w:val="en-GB"/>
+          </w:rPr>
+          <m:t>(</m:t>
+        </m:r>
+        <m:sSub>
+          <m:sSubPr>
+            <m:ctrlPr>
+              <w:rPr>
+                <w:rFonts w:ascii="Cambria Math" w:hAnsi="Cambria Math"/>
+              </w:rPr>
+            </m:ctrlPr>
+          </m:sSubPr>
+          <m:e>
+            <m:r>
+              <w:rPr>
+                <w:rFonts w:ascii="Cambria Math" w:hAnsi="Cambria Math"/>
+              </w:rPr>
+              <m:t>t</m:t>
+            </m:r>
+          </m:e>
+          <m:sub>
+            <m:r>
+              <w:rPr>
+                <w:rFonts w:ascii="Cambria Math" w:hAnsi="Cambria Math"/>
+                <w:lang w:val="en-GB"/>
+              </w:rPr>
+              <m:t>2</m:t>
+            </m:r>
+          </m:sub>
+        </m:sSub>
+        <m:r>
+          <w:rPr>
+            <w:rFonts w:ascii="Cambria Math" w:hAnsi="Cambria Math"/>
+            <w:lang w:val="en-GB"/>
+          </w:rPr>
+          <m:t>),…,</m:t>
+        </m:r>
+        <m:r>
+          <w:rPr>
+            <w:rFonts w:ascii="Cambria Math" w:hAnsi="Cambria Math"/>
+          </w:rPr>
+          <m:t>e</m:t>
+        </m:r>
+        <m:r>
+          <w:rPr>
+            <w:rFonts w:ascii="Cambria Math" w:hAnsi="Cambria Math"/>
+            <w:lang w:val="en-GB"/>
+          </w:rPr>
+          <m:t>(</m:t>
+        </m:r>
+        <m:sSub>
+          <m:sSubPr>
+            <m:ctrlPr>
+              <w:rPr>
+                <w:rFonts w:ascii="Cambria Math" w:hAnsi="Cambria Math"/>
+              </w:rPr>
+            </m:ctrlPr>
+          </m:sSubPr>
+          <m:e>
+            <m:r>
+              <w:rPr>
+                <w:rFonts w:ascii="Cambria Math" w:hAnsi="Cambria Math"/>
+              </w:rPr>
+              <m:t>t</m:t>
+            </m:r>
+          </m:e>
+          <m:sub>
+            <m:r>
+              <w:rPr>
+                <w:rFonts w:ascii="Cambria Math" w:hAnsi="Cambria Math"/>
+              </w:rPr>
+              <m:t>n</m:t>
+            </m:r>
+          </m:sub>
+        </m:sSub>
+        <m:r>
+          <w:rPr>
+            <w:rFonts w:ascii="Cambria Math" w:hAnsi="Cambria Math"/>
+            <w:lang w:val="en-GB"/>
+          </w:rPr>
+          <m:t>))</m:t>
+        </m:r>
+      </m:oMath>
+      <w:r>
+        <w:rPr>
+          <w:lang w:val="en-GB"/>
+        </w:rPr>
+        <w:t xml:space="preserve">, which is then processed by the encoder to produce a continuous vector </w:t>
+      </w:r>
+      <m:oMath>
+        <m:r>
+          <w:rPr>
+            <w:rFonts w:ascii="Cambria Math" w:hAnsi="Cambria Math"/>
+          </w:rPr>
+          <m:t>z</m:t>
+        </m:r>
+        <m:r>
+          <w:rPr>
+            <w:rFonts w:ascii="Cambria Math" w:hAnsi="Cambria Math"/>
+            <w:lang w:val="en-GB"/>
+          </w:rPr>
+          <m:t>=</m:t>
+        </m:r>
+        <m:sSub>
+          <m:sSubPr>
+            <m:ctrlPr>
+              <w:rPr>
+                <w:rFonts w:ascii="Cambria Math" w:hAnsi="Cambria Math"/>
+              </w:rPr>
+            </m:ctrlPr>
+          </m:sSubPr>
+          <m:e>
+            <m:r>
+              <w:rPr>
+                <w:rFonts w:ascii="Cambria Math" w:hAnsi="Cambria Math"/>
+              </w:rPr>
+              <m:t>f</m:t>
+            </m:r>
+          </m:e>
+          <m:sub>
+            <m:r>
+              <w:rPr>
+                <w:rFonts w:ascii="Cambria Math" w:hAnsi="Cambria Math"/>
+              </w:rPr>
+              <m:t>θ</m:t>
+            </m:r>
+          </m:sub>
+        </m:sSub>
+        <m:r>
+          <w:rPr>
+            <w:rFonts w:ascii="Cambria Math" w:hAnsi="Cambria Math"/>
+            <w:lang w:val="en-GB"/>
+          </w:rPr>
+          <m:t>(</m:t>
+        </m:r>
+        <m:r>
+          <w:rPr>
+            <w:rFonts w:ascii="Cambria Math" w:hAnsi="Cambria Math"/>
+          </w:rPr>
+          <m:t>x</m:t>
+        </m:r>
+        <m:r>
+          <w:rPr>
+            <w:rFonts w:ascii="Cambria Math" w:hAnsi="Cambria Math"/>
+            <w:lang w:val="en-GB"/>
+          </w:rPr>
+          <m:t>)∈</m:t>
+        </m:r>
+        <m:sSup>
+          <m:sSupPr>
+            <m:ctrlPr>
+              <w:rPr>
+                <w:rFonts w:ascii="Cambria Math" w:hAnsi="Cambria Math"/>
+              </w:rPr>
+            </m:ctrlPr>
+          </m:sSupPr>
+          <m:e>
+            <m:r>
+              <m:rPr>
+                <m:scr m:val="double-struck"/>
+              </m:rPr>
+              <w:rPr>
+                <w:rFonts w:ascii="Cambria Math" w:hAnsi="Cambria Math"/>
+                <w:lang w:val="en-GB"/>
+              </w:rPr>
+              <m:t>R</m:t>
+            </m:r>
+          </m:e>
+          <m:sup>
+            <m:r>
+              <w:rPr>
+                <w:rFonts w:ascii="Cambria Math" w:hAnsi="Cambria Math"/>
+              </w:rPr>
+              <m:t>k</m:t>
+            </m:r>
+          </m:sup>
+        </m:sSup>
+      </m:oMath>
+      <w:r>
+        <w:rPr>
+          <w:lang w:val="en-GB"/>
+        </w:rPr>
+        <w:t xml:space="preserve">. This vector defines the position of the molecule within a learned </w:t>
+      </w:r>
+      <m:oMath>
+        <m:r>
+          <w:rPr>
+            <w:rFonts w:ascii="Cambria Math" w:hAnsi="Cambria Math"/>
+          </w:rPr>
+          <m:t>k</m:t>
+        </m:r>
+      </m:oMath>
+      <w:r>
+        <w:rPr>
+          <w:lang w:val="en-GB"/>
+        </w:rPr>
+        <w:t>-dimensional latent space, where proximity between points reflects similarity in the encoded molecular features.</w:t>
       </w:r>
     </w:p>
     <w:p>
@@ -8777,7 +9484,34 @@
         <w:rPr>
           <w:lang w:val="en-GB"/>
         </w:rPr>
-        <w:lastRenderedPageBreak/>
+        <w:t>Binary fingerprints, and to a lesser extent count-based variants, represent molecules as collections of predefined substructures. While this strategy has proven highly effective in many QSAR applications, it ultimately reduces chemical space to a catalogue of fragments, potentially overlooking more subtle steric, electronic, or conformational effects that may influence enzymatic recognition. In the context of CYP450 metabolism, where substrate specificity depends not only on the presence of functional groups but also on their accessibility and surrounding environment, such simplification may limit the expressiveness of purely fragment-based descriptors.</w:t>
+      </w:r>
+    </w:p>
+    <w:p>
+      <w:pPr>
+        <w:jc w:val="both"/>
+        <w:rPr>
+          <w:lang w:val="en-GB"/>
+        </w:rPr>
+      </w:pPr>
+      <w:r>
+        <w:rPr>
+          <w:lang w:val="en-GB"/>
+        </w:rPr>
+        <w:t>Learned embeddings attempt to address this limitation by mapping molecules into dense continuous vector spaces, where structural similarity is inferred from patterns learned across large chemical corpora rather than from explicit substructure overlap. In principle, this allows chemically related molecules to occupy nearby regions in embedding space even when they do not share identical hashed fragments. However, the advantages of this approach are closely tied to data scale and model capacity; without sufficient training data, high-dimensional embeddings may fail to generalize and can underperform simpler, handcrafted representations.</w:t>
+      </w:r>
+    </w:p>
+    <w:p>
+      <w:pPr>
+        <w:jc w:val="both"/>
+        <w:rPr>
+          <w:lang w:val="en-GB"/>
+        </w:rPr>
+      </w:pPr>
+      <w:r>
+        <w:rPr>
+          <w:lang w:val="en-GB"/>
+        </w:rPr>
         <w:t xml:space="preserve">Within embedding methodologies, an important distinction arises between static and contextualized representations. Static embeddings assign a fixed vector to each molecular fragment or token, meaning that a given substructure is represented identically regardless of its chemical environment. </w:t>
       </w:r>
       <w:r>
@@ -8927,7 +9661,7 @@
       <w:bookmarkStart w:id="15" w:name="_Ref225619424"/>
       <w:bookmarkStart w:id="16" w:name="_Ref225619429"/>
       <w:bookmarkStart w:id="17" w:name="_Ref225619445"/>
-      <w:bookmarkStart w:id="18" w:name="_Toc225621968"/>
+      <w:bookmarkStart w:id="18" w:name="_Toc225628541"/>
       <w:r>
         <w:rPr>
           <w:lang w:val="en-GB"/>
@@ -9060,7 +9794,14 @@
         <w:rPr>
           <w:lang w:val="en-GB"/>
         </w:rPr>
-        <w:t>e SMILES is practical and widely adopted, it is not a canonical encoding by default and can admit multiple valid strings for the same molecule. In contrast, InChI provides a standardized, hierarchical, and deterministic representation designed to uniquely describe molecular connectivity an</w:t>
+        <w:t xml:space="preserve">e SMILES is practical and widely adopted, it is not a canonical encoding by default and can admit multiple valid strings for the same molecule. In contrast, InChI provides a standardized, hierarchical, </w:t>
+      </w:r>
+      <w:r>
+        <w:rPr>
+          <w:lang w:val="en-GB"/>
+        </w:rPr>
+        <w:lastRenderedPageBreak/>
+        <w:t>and deterministic representation designed to uniquely describe molecular connectivity an</w:t>
       </w:r>
       <w:r>
         <w:rPr>
@@ -9343,14 +10084,7 @@
         <w:rPr>
           <w:lang w:val="en-GB"/>
         </w:rPr>
-        <w:t xml:space="preserve">No metabolic annotations or downstream labels were used at </w:t>
-      </w:r>
-      <w:r>
-        <w:rPr>
-          <w:lang w:val="en-GB"/>
-        </w:rPr>
-        <w:lastRenderedPageBreak/>
-        <w:t>this stage.</w:t>
+        <w:t>No metabolic annotations or downstream labels were used at this stage.</w:t>
       </w:r>
       <w:r>
         <w:rPr>
@@ -9700,7 +10434,14 @@
         <w:rPr>
           <w:lang w:val="en-GB"/>
         </w:rPr>
-        <w:t xml:space="preserve"> performance, but to obtain a structurally meaningful encoder within the practical time and hardware constraints of the project. Consequently, this model should be interpreted as a lightweight, domain-specific pretraining experiment rather than a large-scale foundation model comparable to industrial pretrained systems.</w:t>
+        <w:t xml:space="preserve"> performance, but to obtain a structurally meaningful encoder within the practical time and </w:t>
+      </w:r>
+      <w:r>
+        <w:rPr>
+          <w:lang w:val="en-GB"/>
+        </w:rPr>
+        <w:lastRenderedPageBreak/>
+        <w:t>hardware constraints of the project. Consequently, this model should be interpreted as a lightweight, domain-specific pretraining experiment rather than a large-scale foundation model comparable to industrial pretrained systems.</w:t>
       </w:r>
     </w:p>
     <w:p>
@@ -9913,14 +10654,7 @@
         <w:rPr>
           <w:lang w:val="en-GB"/>
         </w:rPr>
-        <w:t xml:space="preserve">Although </w:t>
-      </w:r>
-      <w:r>
-        <w:rPr>
-          <w:lang w:val="en-GB"/>
-        </w:rPr>
-        <w:lastRenderedPageBreak/>
-        <w:t>widely adopted in transformer training, reduced-precision arithmetic introduces minor numerical approximations compared to full 32-bit computation.</w:t>
+        <w:t>Although widely adopted in transformer training, reduced-precision arithmetic introduces minor numerical approximations compared to full 32-bit computation.</w:t>
       </w:r>
     </w:p>
     <w:p>
@@ -10044,7 +10778,7 @@
           <w:lang w:val="en-GB"/>
         </w:rPr>
       </w:pPr>
-      <w:bookmarkStart w:id="19" w:name="_Toc225621969"/>
+      <w:bookmarkStart w:id="19" w:name="_Toc225628542"/>
       <w:r>
         <w:t xml:space="preserve">Predictive </w:t>
       </w:r>
@@ -10100,6 +10834,7 @@
         <w:rPr>
           <w:lang w:val="en-GB"/>
         </w:rPr>
+        <w:lastRenderedPageBreak/>
         <w:t>Metrics</w:t>
       </w:r>
     </w:p>
@@ -10126,7 +10861,7 @@
           <w:lang w:val="en-GB" w:eastAsia="en-GB"/>
         </w:rPr>
       </w:pPr>
-      <w:bookmarkStart w:id="20" w:name="_Toc225621970"/>
+      <w:bookmarkStart w:id="20" w:name="_Toc225628543"/>
       <w:r>
         <w:rPr>
           <w:lang w:val="en-GB" w:eastAsia="en-GB"/>
@@ -10143,7 +10878,7 @@
           <w:lang w:val="en-GB" w:eastAsia="en-GB"/>
         </w:rPr>
       </w:pPr>
-      <w:bookmarkStart w:id="21" w:name="_Toc225621971"/>
+      <w:bookmarkStart w:id="21" w:name="_Toc225628544"/>
       <w:r>
         <w:rPr>
           <w:lang w:val="en-GB" w:eastAsia="en-GB"/>
@@ -10171,7 +10906,7 @@
           <w:lang w:val="en-GB" w:eastAsia="en-GB"/>
         </w:rPr>
       </w:pPr>
-      <w:bookmarkStart w:id="22" w:name="_Toc225621972"/>
+      <w:bookmarkStart w:id="22" w:name="_Toc225628545"/>
       <w:r>
         <w:rPr>
           <w:lang w:val="en-GB" w:eastAsia="en-GB"/>
@@ -10392,7 +11127,6 @@
           <w:noProof/>
           <w:lang w:val="en-GB" w:eastAsia="en-GB"/>
         </w:rPr>
-        <w:lastRenderedPageBreak/>
         <w:drawing>
           <wp:inline distT="0" distB="0" distL="0" distR="0" wp14:anchorId="4D630101" wp14:editId="2740E485">
             <wp:extent cx="5669915" cy="2606040"/>
@@ -10409,7 +11143,7 @@
                     <pic:cNvPicPr/>
                   </pic:nvPicPr>
                   <pic:blipFill>
-                    <a:blip r:embed="rId19"/>
+                    <a:blip r:embed="rId20"/>
                     <a:stretch>
                       <a:fillRect/>
                     </a:stretch>
@@ -10439,6 +11173,7 @@
         </w:rPr>
       </w:pPr>
       <w:bookmarkStart w:id="23" w:name="_Ref225621380"/>
+      <w:bookmarkStart w:id="24" w:name="_Toc225628515"/>
       <w:r>
         <w:rPr>
           <w:lang w:val="en-GB"/>
@@ -10462,13 +11197,16 @@
           <w:noProof/>
           <w:lang w:val="en-GB"/>
         </w:rPr>
-        <w:t>2</w:t>
+        <w:t>3</w:t>
       </w:r>
       <w:r>
         <w:fldChar w:fldCharType="end"/>
       </w:r>
       <w:bookmarkEnd w:id="23"/>
       <w:r>
+        <w:t>.</w:t>
+      </w:r>
+      <w:r>
         <w:rPr>
           <w:lang w:val="en-GB"/>
         </w:rPr>
@@ -10480,6 +11218,7 @@
         </w:rPr>
         <w:t>Summary statistics of the SMILES-to-InChI conversion process, including total processed molecules, number of successful and failed conversions, overall success rate, and execution time.</w:t>
       </w:r>
+      <w:bookmarkEnd w:id="24"/>
     </w:p>
     <w:p>
       <w:pPr>
@@ -10488,14 +11227,14 @@
           <w:lang w:val="en-GB" w:eastAsia="en-GB"/>
         </w:rPr>
       </w:pPr>
-      <w:bookmarkStart w:id="24" w:name="_Toc225621973"/>
+      <w:bookmarkStart w:id="25" w:name="_Toc225628546"/>
       <w:r>
         <w:rPr>
           <w:lang w:val="en-GB" w:eastAsia="en-GB"/>
         </w:rPr>
         <w:t>Metabolism-related Database</w:t>
       </w:r>
-      <w:bookmarkEnd w:id="24"/>
+      <w:bookmarkEnd w:id="25"/>
     </w:p>
     <w:p>
       <w:pPr>
@@ -10643,6 +11382,7 @@
         <w:rPr>
           <w:lang w:val="en-GB" w:eastAsia="en-GB"/>
         </w:rPr>
+        <w:lastRenderedPageBreak/>
         <w:t>“CYPs”: List of all the cytochromes that metabolize it.</w:t>
       </w:r>
     </w:p>
@@ -10824,7 +11564,6 @@
           <w:noProof/>
           <w:lang w:val="en-GB" w:eastAsia="en-GB"/>
         </w:rPr>
-        <w:lastRenderedPageBreak/>
         <mc:AlternateContent>
           <mc:Choice Requires="wpg">
             <w:drawing>
@@ -10999,7 +11738,7 @@
                           </pic:cNvPicPr>
                         </pic:nvPicPr>
                         <pic:blipFill rotWithShape="1">
-                          <a:blip r:embed="rId20">
+                          <a:blip r:embed="rId21">
                             <a:extLst>
                               <a:ext uri="{28A0092B-C50C-407E-A947-70E740481C1C}">
                                 <a14:useLocalDpi xmlns:a14="http://schemas.microsoft.com/office/drawing/2010/main" val="0"/>
@@ -11037,7 +11776,7 @@
                           </pic:cNvPicPr>
                         </pic:nvPicPr>
                         <pic:blipFill rotWithShape="1">
-                          <a:blip r:embed="rId21">
+                          <a:blip r:embed="rId22">
                             <a:extLst>
                               <a:ext uri="{28A0092B-C50C-407E-A947-70E740481C1C}">
                                 <a14:useLocalDpi xmlns:a14="http://schemas.microsoft.com/office/drawing/2010/main" val="0"/>
@@ -11201,10 +11940,10 @@
                   </v:textbox>
                 </v:shape>
                 <v:shape id="Picture 1" o:spid="_x0000_s1028" type="#_x0000_t75" alt="A screenshot of a computer screen&#10;&#10;AI-generated content may be incorrect." style="position:absolute;top:2459;width:16446;height:14478;visibility:visible;mso-wrap-style:square" o:gfxdata="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">
-                  <v:imagedata r:id="rId22" o:title="A screenshot of a computer screen&#10;&#10;AI-generated content may be incorrect" croptop="-1f" cropbottom="2168f" cropright="4014f"/>
+                  <v:imagedata r:id="rId23" o:title="A screenshot of a computer screen&#10;&#10;AI-generated content may be incorrect" croptop="-1f" cropbottom="2168f" cropright="4014f"/>
                 </v:shape>
                 <v:shape id="Picture 1" o:spid="_x0000_s1029" type="#_x0000_t75" alt="A screen shot of a number&#10;&#10;AI-generated content may be incorrect." style="position:absolute;left:17897;top:2459;width:9014;height:14478;visibility:visible;mso-wrap-style:square" o:gfxdata="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">
-                  <v:imagedata r:id="rId23" o:title="A screen shot of a number&#10;&#10;AI-generated content may be incorrect" cropleft="29127f"/>
+                  <v:imagedata r:id="rId24" o:title="A screen shot of a number&#10;&#10;AI-generated content may be incorrect" cropleft="29127f"/>
                 </v:shape>
                 <w10:wrap type="square"/>
               </v:group>
@@ -11263,9 +12002,9 @@
                                 <w:lang w:val="en-GB"/>
                               </w:rPr>
                             </w:pPr>
-                            <w:bookmarkStart w:id="25" w:name="_Ref223455572"/>
-                            <w:bookmarkStart w:id="26" w:name="_Toc222319992"/>
+                            <w:bookmarkStart w:id="26" w:name="_Ref223455572"/>
                             <w:bookmarkStart w:id="27" w:name="_Ref223455489"/>
+                            <w:bookmarkStart w:id="28" w:name="_Toc225628516"/>
                             <w:r>
                               <w:rPr>
                                 <w:lang w:val="en-GB"/>
@@ -11289,12 +12028,15 @@
                                 <w:noProof/>
                                 <w:lang w:val="en-GB"/>
                               </w:rPr>
-                              <w:t>3</w:t>
+                              <w:t>4</w:t>
                             </w:r>
                             <w:r>
                               <w:fldChar w:fldCharType="end"/>
                             </w:r>
-                            <w:bookmarkEnd w:id="25"/>
+                            <w:bookmarkEnd w:id="26"/>
+                            <w:r>
+                              <w:t>.</w:t>
+                            </w:r>
                             <w:r>
                               <w:rPr>
                                 <w:lang w:val="en-GB"/>
@@ -11383,8 +12125,8 @@
                               </w:rPr>
                               <w:t>: Nº of appearances )</w:t>
                             </w:r>
-                            <w:bookmarkEnd w:id="26"/>
                             <w:bookmarkEnd w:id="27"/>
+                            <w:bookmarkEnd w:id="28"/>
                           </w:p>
                         </w:txbxContent>
                       </wps:txbx>
@@ -11418,9 +12160,9 @@
                           <w:lang w:val="en-GB"/>
                         </w:rPr>
                       </w:pPr>
-                      <w:bookmarkStart w:id="28" w:name="_Ref223455572"/>
-                      <w:bookmarkStart w:id="29" w:name="_Toc222319992"/>
+                      <w:bookmarkStart w:id="29" w:name="_Ref223455572"/>
                       <w:bookmarkStart w:id="30" w:name="_Ref223455489"/>
+                      <w:bookmarkStart w:id="31" w:name="_Toc225628516"/>
                       <w:r>
                         <w:rPr>
                           <w:lang w:val="en-GB"/>
@@ -11444,12 +12186,15 @@
                           <w:noProof/>
                           <w:lang w:val="en-GB"/>
                         </w:rPr>
-                        <w:t>3</w:t>
+                        <w:t>4</w:t>
                       </w:r>
                       <w:r>
                         <w:fldChar w:fldCharType="end"/>
                       </w:r>
-                      <w:bookmarkEnd w:id="28"/>
+                      <w:bookmarkEnd w:id="29"/>
+                      <w:r>
+                        <w:t>.</w:t>
+                      </w:r>
                       <w:r>
                         <w:rPr>
                           <w:lang w:val="en-GB"/>
@@ -11538,8 +12283,8 @@
                         </w:rPr>
                         <w:t>: Nº of appearances )</w:t>
                       </w:r>
-                      <w:bookmarkEnd w:id="29"/>
                       <w:bookmarkEnd w:id="30"/>
+                      <w:bookmarkEnd w:id="31"/>
                     </w:p>
                   </w:txbxContent>
                 </v:textbox>
@@ -11858,14 +12603,14 @@
           <w:lang w:val="en-GB" w:eastAsia="en-GB"/>
         </w:rPr>
       </w:pPr>
-      <w:bookmarkStart w:id="31" w:name="_Toc225621974"/>
+      <w:bookmarkStart w:id="32" w:name="_Toc225628547"/>
       <w:r>
         <w:rPr>
           <w:lang w:val="en-GB" w:eastAsia="en-GB"/>
         </w:rPr>
         <w:t>Data source description</w:t>
       </w:r>
-      <w:bookmarkEnd w:id="31"/>
+      <w:bookmarkEnd w:id="32"/>
     </w:p>
     <w:p>
       <w:pPr>
@@ -12106,7 +12851,14 @@
         <w:rPr>
           <w:lang w:val="en-GB" w:eastAsia="en-GB"/>
         </w:rPr>
-        <w:t xml:space="preserve"> It is a manually curated, freely accessible database that provides comprehensive bioactivity data for drug-like compounds. It integrates chemical, biological, and pharmacological information, covering from compound structures to bioactivity measurements against biological targets. The data is primarily extracted from the primary medicinal chemistry literature.</w:t>
+        <w:t xml:space="preserve"> It is a manually curated, freely accessible database that provides comprehensive bioactivity data for drug-like compounds. It integrates chemical, biological, </w:t>
+      </w:r>
+      <w:r>
+        <w:rPr>
+          <w:lang w:val="en-GB" w:eastAsia="en-GB"/>
+        </w:rPr>
+        <w:lastRenderedPageBreak/>
+        <w:t>and pharmacological information, covering from compound structures to bioactivity measurements against biological targets. The data is primarily extracted from the primary medicinal chemistry literature.</w:t>
       </w:r>
       <w:r>
         <w:rPr>
@@ -12143,28 +12895,12 @@
           <w:lang w:val="en-GB" w:eastAsia="en-GB"/>
         </w:rPr>
       </w:pPr>
-      <w:bookmarkStart w:id="32" w:name="_Toc225621975"/>
+      <w:bookmarkStart w:id="33" w:name="_Toc225628548"/>
       <w:r>
         <w:rPr>
           <w:lang w:val="en-GB" w:eastAsia="en-GB"/>
         </w:rPr>
         <w:t>Exploratory data analysis (EDA)</w:t>
-      </w:r>
-      <w:bookmarkEnd w:id="32"/>
-    </w:p>
-    <w:p>
-      <w:pPr>
-        <w:pStyle w:val="Heading3"/>
-        <w:rPr>
-          <w:lang w:val="en-GB" w:eastAsia="en-GB"/>
-        </w:rPr>
-      </w:pPr>
-      <w:bookmarkStart w:id="33" w:name="_Toc225621976"/>
-      <w:r>
-        <w:rPr>
-          <w:lang w:val="en-GB" w:eastAsia="en-GB"/>
-        </w:rPr>
-        <w:t>InChI Database EDA</w:t>
       </w:r>
       <w:bookmarkEnd w:id="33"/>
     </w:p>
@@ -12175,17 +12911,33 @@
           <w:lang w:val="en-GB" w:eastAsia="en-GB"/>
         </w:rPr>
       </w:pPr>
-      <w:bookmarkStart w:id="34" w:name="_Toc225621977"/>
-      <w:r>
-        <w:rPr>
-          <w:lang w:val="en-GB" w:eastAsia="en-GB"/>
-        </w:rPr>
-        <w:t>Metabolism-related Database EDA</w:t>
+      <w:bookmarkStart w:id="34" w:name="_Toc225628549"/>
+      <w:r>
+        <w:rPr>
+          <w:lang w:val="en-GB" w:eastAsia="en-GB"/>
+        </w:rPr>
+        <w:t>InChI Database EDA</w:t>
       </w:r>
       <w:bookmarkEnd w:id="34"/>
     </w:p>
     <w:p>
       <w:pPr>
+        <w:pStyle w:val="Heading3"/>
+        <w:rPr>
+          <w:lang w:val="en-GB" w:eastAsia="en-GB"/>
+        </w:rPr>
+      </w:pPr>
+      <w:bookmarkStart w:id="35" w:name="_Toc225628550"/>
+      <w:r>
+        <w:rPr>
+          <w:lang w:val="en-GB" w:eastAsia="en-GB"/>
+        </w:rPr>
+        <w:t>Metabolism-related Database EDA</w:t>
+      </w:r>
+      <w:bookmarkEnd w:id="35"/>
+    </w:p>
+    <w:p>
+      <w:pPr>
         <w:jc w:val="both"/>
         <w:rPr>
           <w:lang w:val="en-GB" w:eastAsia="en-GB"/>
@@ -12197,7 +12949,7 @@
         </w:rPr>
         <w:t xml:space="preserve">Benchmark predictor: </w:t>
       </w:r>
-      <w:hyperlink r:id="rId24" w:history="1">
+      <w:hyperlink r:id="rId25" w:history="1">
         <w:r>
           <w:rPr>
             <w:rStyle w:val="Hyperlink"/>
@@ -12214,14 +12966,14 @@
           <w:lang w:val="en-GB" w:eastAsia="en-GB"/>
         </w:rPr>
       </w:pPr>
-      <w:bookmarkStart w:id="35" w:name="_Toc225621978"/>
+      <w:bookmarkStart w:id="36" w:name="_Toc225628551"/>
       <w:r>
         <w:rPr>
           <w:lang w:val="en-GB" w:eastAsia="en-GB"/>
         </w:rPr>
         <w:t>Data Preprocessing</w:t>
       </w:r>
-      <w:bookmarkEnd w:id="35"/>
+      <w:bookmarkEnd w:id="36"/>
       <w:r>
         <w:rPr>
           <w:lang w:val="en-GB" w:eastAsia="en-GB"/>
@@ -12259,14 +13011,7 @@
         <w:rPr>
           <w:lang w:val="en-GB" w:eastAsia="en-GB"/>
         </w:rPr>
-        <w:t xml:space="preserve"> metabolism dataset (1,368 compounds), where molecular structures are encoded into numerical representations for machine </w:t>
-      </w:r>
-      <w:r>
-        <w:rPr>
-          <w:lang w:val="en-GB" w:eastAsia="en-GB"/>
-        </w:rPr>
-        <w:lastRenderedPageBreak/>
-        <w:t>learning. All feature matrices generated in the following subsections are derived from this same set of compounds.</w:t>
+        <w:t xml:space="preserve"> metabolism dataset (1,368 compounds), where molecular structures are encoded into numerical representations for machine learning. All feature matrices generated in the following subsections are derived from this same set of compounds.</w:t>
       </w:r>
     </w:p>
     <w:p>
@@ -12276,14 +13021,14 @@
           <w:lang w:val="en-GB" w:eastAsia="en-GB"/>
         </w:rPr>
       </w:pPr>
-      <w:bookmarkStart w:id="36" w:name="_Toc225621979"/>
+      <w:bookmarkStart w:id="37" w:name="_Toc225628552"/>
       <w:r>
         <w:rPr>
           <w:lang w:val="en-GB" w:eastAsia="en-GB"/>
         </w:rPr>
         <w:t>Molecular Fingerprint Generation Using Morgan Algorithm</w:t>
       </w:r>
-      <w:bookmarkEnd w:id="36"/>
+      <w:bookmarkEnd w:id="37"/>
     </w:p>
     <w:p>
       <w:pPr>
@@ -12595,6 +13340,7 @@
           <w:noProof/>
           <w:lang w:eastAsia="en-GB"/>
         </w:rPr>
+        <w:lastRenderedPageBreak/>
         <w:drawing>
           <wp:inline distT="0" distB="0" distL="0" distR="0" wp14:anchorId="4FABEC5C" wp14:editId="032BD9BD">
             <wp:extent cx="5669915" cy="1516380"/>
@@ -12611,7 +13357,7 @@
                     <pic:cNvPicPr/>
                   </pic:nvPicPr>
                   <pic:blipFill>
-                    <a:blip r:embed="rId25"/>
+                    <a:blip r:embed="rId26"/>
                     <a:stretch>
                       <a:fillRect/>
                     </a:stretch>
@@ -12642,7 +13388,7 @@
           <w:lang w:val="en-GB" w:eastAsia="en-GB"/>
         </w:rPr>
       </w:pPr>
-      <w:bookmarkStart w:id="37" w:name="_Toc222319993"/>
+      <w:bookmarkStart w:id="38" w:name="_Toc225628517"/>
       <w:r>
         <w:rPr>
           <w:lang w:val="en-GB"/>
@@ -12666,12 +13412,15 @@
           <w:noProof/>
           <w:lang w:val="en-GB"/>
         </w:rPr>
-        <w:t>4</w:t>
+        <w:t>5</w:t>
       </w:r>
       <w:r>
         <w:fldChar w:fldCharType="end"/>
       </w:r>
       <w:r>
+        <w:t>.</w:t>
+      </w:r>
+      <w:r>
         <w:rPr>
           <w:lang w:val="en-GB"/>
         </w:rPr>
@@ -12727,7 +13476,6 @@
         </w:rPr>
         <w:t>columns represent hashed substructure counts</w:t>
       </w:r>
-      <w:bookmarkEnd w:id="37"/>
       <w:r>
         <w:rPr>
           <w:lang w:val="en-GB"/>
@@ -12740,6 +13488,7 @@
         </w:rPr>
         <w:t>The resulting matrix has dimensions 1368 × 2048 and contains integer count values.</w:t>
       </w:r>
+      <w:bookmarkEnd w:id="38"/>
     </w:p>
     <w:p>
       <w:pPr>
@@ -12748,7 +13497,7 @@
           <w:lang w:val="en-GB" w:eastAsia="en-GB"/>
         </w:rPr>
       </w:pPr>
-      <w:bookmarkStart w:id="38" w:name="_Toc225621980"/>
+      <w:bookmarkStart w:id="39" w:name="_Toc225628553"/>
       <w:r>
         <w:rPr>
           <w:lang w:val="en-GB" w:eastAsia="en-GB"/>
@@ -12762,7 +13511,7 @@
         </w:rPr>
         <w:t>MolE</w:t>
       </w:r>
-      <w:bookmarkEnd w:id="38"/>
+      <w:bookmarkEnd w:id="39"/>
       <w:proofErr w:type="spellEnd"/>
     </w:p>
     <w:p>
@@ -12849,7 +13598,6 @@
         <w:rPr>
           <w:lang w:val="en-GB"/>
         </w:rPr>
-        <w:lastRenderedPageBreak/>
         <w:t>MolE</w:t>
       </w:r>
       <w:proofErr w:type="spellEnd"/>
@@ -13165,7 +13913,7 @@
                     <pic:cNvPicPr/>
                   </pic:nvPicPr>
                   <pic:blipFill>
-                    <a:blip r:embed="rId26"/>
+                    <a:blip r:embed="rId27"/>
                     <a:stretch>
                       <a:fillRect/>
                     </a:stretch>
@@ -13193,7 +13941,7 @@
           <w:lang w:val="en-GB"/>
         </w:rPr>
       </w:pPr>
-      <w:bookmarkStart w:id="39" w:name="_Toc222319994"/>
+      <w:bookmarkStart w:id="40" w:name="_Toc225628518"/>
       <w:r>
         <w:rPr>
           <w:lang w:val="en-GB"/>
@@ -13217,18 +13965,20 @@
           <w:noProof/>
           <w:lang w:val="en-GB"/>
         </w:rPr>
-        <w:t>5</w:t>
+        <w:t>6</w:t>
       </w:r>
       <w:r>
         <w:fldChar w:fldCharType="end"/>
       </w:r>
       <w:r>
+        <w:t>.</w:t>
+      </w:r>
+      <w:r>
         <w:rPr>
           <w:lang w:val="en-GB"/>
         </w:rPr>
         <w:t xml:space="preserve"> </w:t>
       </w:r>
-      <w:bookmarkEnd w:id="39"/>
       <w:proofErr w:type="spellStart"/>
       <w:r>
         <w:rPr>
@@ -13289,6 +14039,7 @@
         </w:rPr>
         <w:t>.</w:t>
       </w:r>
+      <w:bookmarkEnd w:id="40"/>
     </w:p>
     <w:p>
       <w:pPr>
@@ -13297,7 +14048,7 @@
           <w:lang w:val="en-GB" w:eastAsia="en-GB"/>
         </w:rPr>
       </w:pPr>
-      <w:bookmarkStart w:id="40" w:name="_Toc225621981"/>
+      <w:bookmarkStart w:id="41" w:name="_Toc225628554"/>
       <w:r>
         <w:rPr>
           <w:lang w:val="en-GB" w:eastAsia="en-GB"/>
@@ -13311,7 +14062,7 @@
         </w:rPr>
         <w:t>ChemBERTa</w:t>
       </w:r>
-      <w:bookmarkEnd w:id="40"/>
+      <w:bookmarkEnd w:id="41"/>
       <w:proofErr w:type="spellEnd"/>
     </w:p>
     <w:p>
@@ -13344,7 +14095,14 @@
         <w:rPr>
           <w:lang w:val="en-GB"/>
         </w:rPr>
-        <w:t xml:space="preserve">, a transformer-based language model pretrained on large corpora of SMILES strings. Unlike static fragment-based embeddings, </w:t>
+        <w:t xml:space="preserve">, a transformer-based language model pretrained on large corpora of SMILES strings. Unlike static fragment-based </w:t>
+      </w:r>
+      <w:r>
+        <w:rPr>
+          <w:lang w:val="en-GB"/>
+        </w:rPr>
+        <w:lastRenderedPageBreak/>
+        <w:t xml:space="preserve">embeddings, </w:t>
       </w:r>
       <w:proofErr w:type="spellStart"/>
       <w:r>
@@ -13524,7 +14282,6 @@
         <w:rPr>
           <w:lang w:val="en-GB"/>
         </w:rPr>
-        <w:lastRenderedPageBreak/>
         <w:t xml:space="preserve">where 1,368 corresponds to the number of compounds in the final dataset and 768 represents the hidden dimensionality of the </w:t>
       </w:r>
       <w:proofErr w:type="spellStart"/>
@@ -13647,7 +14404,7 @@
                     <pic:cNvPicPr/>
                   </pic:nvPicPr>
                   <pic:blipFill rotWithShape="1">
-                    <a:blip r:embed="rId27"/>
+                    <a:blip r:embed="rId28"/>
                     <a:srcRect l="353" t="1091"/>
                     <a:stretch>
                       <a:fillRect/>
@@ -13684,6 +14441,7 @@
           <w:lang w:val="en-GB"/>
         </w:rPr>
       </w:pPr>
+      <w:bookmarkStart w:id="42" w:name="_Toc225628519"/>
       <w:r>
         <w:rPr>
           <w:lang w:val="en-GB"/>
@@ -13707,12 +14465,15 @@
           <w:noProof/>
           <w:lang w:val="en-GB"/>
         </w:rPr>
-        <w:t>6</w:t>
+        <w:t>7</w:t>
       </w:r>
       <w:r>
         <w:fldChar w:fldCharType="end"/>
       </w:r>
       <w:r>
+        <w:t>.</w:t>
+      </w:r>
+      <w:r>
         <w:rPr>
           <w:lang w:val="en-GB"/>
         </w:rPr>
@@ -13772,6 +14533,7 @@
         </w:rPr>
         <w:t xml:space="preserve"> transformer. The resulting matrix has dimensions 1368 × 768 and contains continuous-valued vectors.</w:t>
       </w:r>
+      <w:bookmarkEnd w:id="42"/>
     </w:p>
     <w:p>
       <w:pPr>
@@ -13780,7 +14542,7 @@
           <w:lang w:val="en-GB" w:eastAsia="en-GB"/>
         </w:rPr>
       </w:pPr>
-      <w:bookmarkStart w:id="41" w:name="_Toc225621982"/>
+      <w:bookmarkStart w:id="43" w:name="_Toc225628555"/>
       <w:r>
         <w:rPr>
           <w:lang w:val="en-GB" w:eastAsia="en-GB"/>
@@ -13799,7 +14561,7 @@
         </w:rPr>
         <w:t>-Trained InChI embedder</w:t>
       </w:r>
-      <w:bookmarkEnd w:id="41"/>
+      <w:bookmarkEnd w:id="43"/>
     </w:p>
     <w:p>
       <w:pPr>
@@ -13895,7 +14657,14 @@
         <w:rPr>
           <w:lang w:val="en-GB" w:eastAsia="en-GB"/>
         </w:rPr>
-        <w:t>local GPU with 4GB of VRAM, which imposed strict constraints on batch size, sequence length, and overall architectural scale. Techniques such as mixed-precision training and gradient accumulation were necessary to make the process feasible, effectively trading off training speed for memory efficiency. Despite these optimizations, training remained time-consuming, requiring several hours per epoch and careful monitoring to avoid memory overflows.</w:t>
+        <w:t xml:space="preserve">local GPU with 4GB of VRAM, which </w:t>
+      </w:r>
+      <w:r>
+        <w:rPr>
+          <w:lang w:val="en-GB" w:eastAsia="en-GB"/>
+        </w:rPr>
+        <w:lastRenderedPageBreak/>
+        <w:t>imposed strict constraints on batch size, sequence length, and overall architectural scale. Techniques such as mixed-precision training and gradient accumulation were necessary to make the process feasible, effectively trading off training speed for memory efficiency. Despite these optimizations, training remained time-consuming, requiring several hours per epoch and careful monitoring to avoid memory overflows.</w:t>
       </w:r>
     </w:p>
     <w:p>
@@ -13991,7 +14760,6 @@
         <w:rPr>
           <w:lang w:val="en-GB"/>
         </w:rPr>
-        <w:lastRenderedPageBreak/>
         <w:t xml:space="preserve">The model produces a sequence of token-level embeddings of dimension 384 for each InChI string. To obtain a single representation per molecule, these token embeddings are averaged using mean pooling, considering only valid (non-padding) tokens. </w:t>
       </w:r>
       <w:proofErr w:type="spellStart"/>
@@ -14473,13 +15241,6 @@
     </w:p>
     <w:p>
       <w:pPr>
-        <w:rPr>
-          <w:lang w:val="en-GB" w:eastAsia="en-GB"/>
-        </w:rPr>
-      </w:pPr>
-    </w:p>
-    <w:p>
-      <w:pPr>
         <w:keepNext/>
       </w:pPr>
       <w:r>
@@ -14503,7 +15264,7 @@
                     <pic:cNvPicPr/>
                   </pic:nvPicPr>
                   <pic:blipFill rotWithShape="1">
-                    <a:blip r:embed="rId28"/>
+                    <a:blip r:embed="rId29"/>
                     <a:srcRect l="373" t="1988" r="1"/>
                     <a:stretch>
                       <a:fillRect/>
@@ -14540,6 +15301,7 @@
           <w:lang w:val="en-GB" w:eastAsia="en-GB"/>
         </w:rPr>
       </w:pPr>
+      <w:bookmarkStart w:id="44" w:name="_Toc225628520"/>
       <w:r>
         <w:rPr>
           <w:lang w:val="en-GB"/>
@@ -14563,13 +15325,19 @@
           <w:noProof/>
           <w:lang w:val="en-GB"/>
         </w:rPr>
-        <w:t>7</w:t>
+        <w:t>8</w:t>
       </w:r>
       <w:r>
         <w:rPr>
           <w:noProof/>
         </w:rPr>
         <w:fldChar w:fldCharType="end"/>
+      </w:r>
+      <w:r>
+        <w:rPr>
+          <w:noProof/>
+        </w:rPr>
+        <w:t>.</w:t>
       </w:r>
       <w:r>
         <w:rPr>
@@ -14635,66 +15403,6 @@
           <w:lang w:val="en-GB"/>
         </w:rPr>
         <w:t>.</w:t>
-      </w:r>
-    </w:p>
-    <w:p>
-      <w:pPr>
-        <w:pStyle w:val="Heading2"/>
-        <w:rPr>
-          <w:lang w:val="en-GB" w:eastAsia="en-GB"/>
-        </w:rPr>
-      </w:pPr>
-      <w:bookmarkStart w:id="42" w:name="_Toc225621983"/>
-      <w:r>
-        <w:rPr>
-          <w:lang w:val="en-GB" w:eastAsia="en-GB"/>
-        </w:rPr>
-        <w:lastRenderedPageBreak/>
-        <w:t>Feature</w:t>
-      </w:r>
-      <w:r>
-        <w:rPr>
-          <w:lang w:val="en-GB" w:eastAsia="en-GB"/>
-        </w:rPr>
-        <w:t xml:space="preserve"> Selection</w:t>
-      </w:r>
-      <w:bookmarkEnd w:id="42"/>
-    </w:p>
-    <w:p>
-      <w:pPr>
-        <w:pStyle w:val="Heading2"/>
-        <w:rPr>
-          <w:lang w:val="en-GB" w:eastAsia="en-GB"/>
-        </w:rPr>
-      </w:pPr>
-      <w:bookmarkStart w:id="43" w:name="_Toc225621984"/>
-      <w:r>
-        <w:rPr>
-          <w:lang w:val="en-GB" w:eastAsia="en-GB"/>
-        </w:rPr>
-        <w:t>Data</w:t>
-      </w:r>
-      <w:r>
-        <w:rPr>
-          <w:lang w:val="en-GB" w:eastAsia="en-GB"/>
-        </w:rPr>
-        <w:t xml:space="preserve"> Splitting</w:t>
-      </w:r>
-      <w:bookmarkEnd w:id="43"/>
-    </w:p>
-    <w:p>
-      <w:pPr>
-        <w:pStyle w:val="Heading2"/>
-        <w:rPr>
-          <w:lang w:val="en-GB" w:eastAsia="en-GB"/>
-        </w:rPr>
-      </w:pPr>
-      <w:bookmarkStart w:id="44" w:name="_Toc225621985"/>
-      <w:r>
-        <w:rPr>
-          <w:lang w:val="en-GB" w:eastAsia="en-GB"/>
-        </w:rPr>
-        <w:t>Model Training</w:t>
       </w:r>
       <w:bookmarkEnd w:id="44"/>
     </w:p>
@@ -14705,20 +15413,21 @@
           <w:lang w:val="en-GB" w:eastAsia="en-GB"/>
         </w:rPr>
       </w:pPr>
-      <w:bookmarkStart w:id="45" w:name="_Toc225621986"/>
-      <w:r>
-        <w:rPr>
-          <w:lang w:val="en-GB" w:eastAsia="en-GB"/>
-        </w:rPr>
-        <w:t>Model Evaluation and Validation</w:t>
+      <w:bookmarkStart w:id="45" w:name="_Toc225628556"/>
+      <w:r>
+        <w:rPr>
+          <w:lang w:val="en-GB" w:eastAsia="en-GB"/>
+        </w:rPr>
+        <w:lastRenderedPageBreak/>
+        <w:t>Feature</w:t>
+      </w:r>
+      <w:r>
+        <w:rPr>
+          <w:lang w:val="en-GB" w:eastAsia="en-GB"/>
+        </w:rPr>
+        <w:t xml:space="preserve"> Selection</w:t>
       </w:r>
       <w:bookmarkEnd w:id="45"/>
-      <w:r>
-        <w:rPr>
-          <w:lang w:val="en-GB" w:eastAsia="en-GB"/>
-        </w:rPr>
-        <w:t xml:space="preserve"> </w:t>
-      </w:r>
     </w:p>
     <w:p>
       <w:pPr>
@@ -14727,47 +15436,107 @@
           <w:lang w:val="en-GB" w:eastAsia="en-GB"/>
         </w:rPr>
       </w:pPr>
-      <w:bookmarkStart w:id="46" w:name="_Toc225621987"/>
-      <w:r>
-        <w:rPr>
-          <w:lang w:val="en-GB" w:eastAsia="en-GB"/>
-        </w:rPr>
-        <w:t>Comparative Analysis</w:t>
+      <w:bookmarkStart w:id="46" w:name="_Toc225628557"/>
+      <w:r>
+        <w:rPr>
+          <w:lang w:val="en-GB" w:eastAsia="en-GB"/>
+        </w:rPr>
+        <w:t>Data</w:t>
+      </w:r>
+      <w:r>
+        <w:rPr>
+          <w:lang w:val="en-GB" w:eastAsia="en-GB"/>
+        </w:rPr>
+        <w:t xml:space="preserve"> Splitting</w:t>
       </w:r>
       <w:bookmarkEnd w:id="46"/>
     </w:p>
     <w:p>
       <w:pPr>
-        <w:pStyle w:val="Heading1"/>
-        <w:rPr>
-          <w:lang w:val="en-GB" w:eastAsia="en-GB"/>
-        </w:rPr>
-      </w:pPr>
-      <w:bookmarkStart w:id="47" w:name="_Toc225621988"/>
-      <w:r>
-        <w:rPr>
-          <w:lang w:val="en-GB" w:eastAsia="en-GB"/>
-        </w:rPr>
-        <w:t>Conclusions</w:t>
+        <w:pStyle w:val="Heading2"/>
+        <w:rPr>
+          <w:lang w:val="en-GB" w:eastAsia="en-GB"/>
+        </w:rPr>
+      </w:pPr>
+      <w:bookmarkStart w:id="47" w:name="_Toc225628558"/>
+      <w:r>
+        <w:rPr>
+          <w:lang w:val="en-GB" w:eastAsia="en-GB"/>
+        </w:rPr>
+        <w:t>Model Training</w:t>
       </w:r>
       <w:bookmarkEnd w:id="47"/>
     </w:p>
     <w:p>
       <w:pPr>
+        <w:pStyle w:val="Heading2"/>
+        <w:rPr>
+          <w:lang w:val="en-GB" w:eastAsia="en-GB"/>
+        </w:rPr>
+      </w:pPr>
+      <w:bookmarkStart w:id="48" w:name="_Toc225628559"/>
+      <w:r>
+        <w:rPr>
+          <w:lang w:val="en-GB" w:eastAsia="en-GB"/>
+        </w:rPr>
+        <w:t>Model Evaluation and Validation</w:t>
+      </w:r>
+      <w:bookmarkEnd w:id="48"/>
+      <w:r>
+        <w:rPr>
+          <w:lang w:val="en-GB" w:eastAsia="en-GB"/>
+        </w:rPr>
+        <w:t xml:space="preserve"> </w:t>
+      </w:r>
+    </w:p>
+    <w:p>
+      <w:pPr>
+        <w:pStyle w:val="Heading2"/>
+        <w:rPr>
+          <w:lang w:val="en-GB" w:eastAsia="en-GB"/>
+        </w:rPr>
+      </w:pPr>
+      <w:bookmarkStart w:id="49" w:name="_Toc225628560"/>
+      <w:r>
+        <w:rPr>
+          <w:lang w:val="en-GB" w:eastAsia="en-GB"/>
+        </w:rPr>
+        <w:t>Comparative Analysis</w:t>
+      </w:r>
+      <w:bookmarkEnd w:id="49"/>
+    </w:p>
+    <w:p>
+      <w:pPr>
+        <w:pStyle w:val="Heading1"/>
+        <w:rPr>
+          <w:lang w:val="en-GB" w:eastAsia="en-GB"/>
+        </w:rPr>
+      </w:pPr>
+      <w:bookmarkStart w:id="50" w:name="_Toc225628561"/>
+      <w:r>
+        <w:rPr>
+          <w:lang w:val="en-GB" w:eastAsia="en-GB"/>
+        </w:rPr>
+        <w:t>Conclusions</w:t>
+      </w:r>
+      <w:bookmarkEnd w:id="50"/>
+    </w:p>
+    <w:p>
+      <w:pPr>
         <w:pStyle w:val="Heading1"/>
         <w:jc w:val="both"/>
         <w:rPr>
           <w:lang w:val="en-GB" w:eastAsia="en-GB"/>
         </w:rPr>
       </w:pPr>
-      <w:bookmarkStart w:id="48" w:name="_Toc225621989"/>
+      <w:bookmarkStart w:id="51" w:name="_Toc225628562"/>
       <w:r>
         <w:rPr>
           <w:lang w:val="en-GB" w:eastAsia="en-GB"/>
         </w:rPr>
         <w:t>REFERENCES</w:t>
       </w:r>
-      <w:bookmarkEnd w:id="48"/>
+      <w:bookmarkEnd w:id="51"/>
     </w:p>
     <w:sdt>
       <w:sdtPr>
@@ -16592,7 +17361,7 @@
           <w:lang w:val="en-GB"/>
         </w:rPr>
       </w:pPr>
-      <w:bookmarkStart w:id="49" w:name="_Toc225621990"/>
+      <w:bookmarkStart w:id="52" w:name="_Toc225628563"/>
       <w:proofErr w:type="spellStart"/>
       <w:r>
         <w:rPr>
@@ -16600,7 +17369,7 @@
         </w:rPr>
         <w:t>Anexos</w:t>
       </w:r>
-      <w:bookmarkEnd w:id="49"/>
+      <w:bookmarkEnd w:id="52"/>
       <w:proofErr w:type="spellEnd"/>
     </w:p>
     <w:p>
@@ -18830,6 +19599,119 @@
     </w:lvl>
   </w:abstractNum>
   <w:abstractNum w:abstractNumId="17" w15:restartNumberingAfterBreak="0">
+    <w:nsid w:val="44FE0385"/>
+    <w:multiLevelType w:val="hybridMultilevel"/>
+    <w:tmpl w:val="577E14F0"/>
+    <w:lvl w:ilvl="0" w:tplc="08090001">
+      <w:start w:val="1"/>
+      <w:numFmt w:val="bullet"/>
+      <w:lvlText w:val=""/>
+      <w:lvlJc w:val="left"/>
+      <w:pPr>
+        <w:ind w:left="720" w:hanging="360"/>
+      </w:pPr>
+      <w:rPr>
+        <w:rFonts w:ascii="Symbol" w:hAnsi="Symbol" w:hint="default"/>
+      </w:rPr>
+    </w:lvl>
+    <w:lvl w:ilvl="1" w:tplc="08090003" w:tentative="1">
+      <w:start w:val="1"/>
+      <w:numFmt w:val="bullet"/>
+      <w:lvlText w:val="o"/>
+      <w:lvlJc w:val="left"/>
+      <w:pPr>
+        <w:ind w:left="1440" w:hanging="360"/>
+      </w:pPr>
+      <w:rPr>
+        <w:rFonts w:ascii="Courier New" w:hAnsi="Courier New" w:cs="Courier New" w:hint="default"/>
+      </w:rPr>
+    </w:lvl>
+    <w:lvl w:ilvl="2" w:tplc="08090005" w:tentative="1">
+      <w:start w:val="1"/>
+      <w:numFmt w:val="bullet"/>
+      <w:lvlText w:val=""/>
+      <w:lvlJc w:val="left"/>
+      <w:pPr>
+        <w:ind w:left="2160" w:hanging="360"/>
+      </w:pPr>
+      <w:rPr>
+        <w:rFonts w:ascii="Wingdings" w:hAnsi="Wingdings" w:hint="default"/>
+      </w:rPr>
+    </w:lvl>
+    <w:lvl w:ilvl="3" w:tplc="08090001" w:tentative="1">
+      <w:start w:val="1"/>
+      <w:numFmt w:val="bullet"/>
+      <w:lvlText w:val=""/>
+      <w:lvlJc w:val="left"/>
+      <w:pPr>
+        <w:ind w:left="2880" w:hanging="360"/>
+      </w:pPr>
+      <w:rPr>
+        <w:rFonts w:ascii="Symbol" w:hAnsi="Symbol" w:hint="default"/>
+      </w:rPr>
+    </w:lvl>
+    <w:lvl w:ilvl="4" w:tplc="08090003" w:tentative="1">
+      <w:start w:val="1"/>
+      <w:numFmt w:val="bullet"/>
+      <w:lvlText w:val="o"/>
+      <w:lvlJc w:val="left"/>
+      <w:pPr>
+        <w:ind w:left="3600" w:hanging="360"/>
+      </w:pPr>
+      <w:rPr>
+        <w:rFonts w:ascii="Courier New" w:hAnsi="Courier New" w:cs="Courier New" w:hint="default"/>
+      </w:rPr>
+    </w:lvl>
+    <w:lvl w:ilvl="5" w:tplc="08090005" w:tentative="1">
+      <w:start w:val="1"/>
+      <w:numFmt w:val="bullet"/>
+      <w:lvlText w:val=""/>
+      <w:lvlJc w:val="left"/>
+      <w:pPr>
+        <w:ind w:left="4320" w:hanging="360"/>
+      </w:pPr>
+      <w:rPr>
+        <w:rFonts w:ascii="Wingdings" w:hAnsi="Wingdings" w:hint="default"/>
+      </w:rPr>
+    </w:lvl>
+    <w:lvl w:ilvl="6" w:tplc="08090001" w:tentative="1">
+      <w:start w:val="1"/>
+      <w:numFmt w:val="bullet"/>
+      <w:lvlText w:val=""/>
+      <w:lvlJc w:val="left"/>
+      <w:pPr>
+        <w:ind w:left="5040" w:hanging="360"/>
+      </w:pPr>
+      <w:rPr>
+        <w:rFonts w:ascii="Symbol" w:hAnsi="Symbol" w:hint="default"/>
+      </w:rPr>
+    </w:lvl>
+    <w:lvl w:ilvl="7" w:tplc="08090003" w:tentative="1">
+      <w:start w:val="1"/>
+      <w:numFmt w:val="bullet"/>
+      <w:lvlText w:val="o"/>
+      <w:lvlJc w:val="left"/>
+      <w:pPr>
+        <w:ind w:left="5760" w:hanging="360"/>
+      </w:pPr>
+      <w:rPr>
+        <w:rFonts w:ascii="Courier New" w:hAnsi="Courier New" w:cs="Courier New" w:hint="default"/>
+      </w:rPr>
+    </w:lvl>
+    <w:lvl w:ilvl="8" w:tplc="08090005" w:tentative="1">
+      <w:start w:val="1"/>
+      <w:numFmt w:val="bullet"/>
+      <w:lvlText w:val=""/>
+      <w:lvlJc w:val="left"/>
+      <w:pPr>
+        <w:ind w:left="6480" w:hanging="360"/>
+      </w:pPr>
+      <w:rPr>
+        <w:rFonts w:ascii="Wingdings" w:hAnsi="Wingdings" w:hint="default"/>
+      </w:rPr>
+    </w:lvl>
+  </w:abstractNum>
+  <w:abstractNum w:abstractNumId="18" w15:restartNumberingAfterBreak="0">
     <w:nsid w:val="4A84774A"/>
     <w:multiLevelType w:val="hybridMultilevel"/>
     <w:tmpl w:val="5A86519E"/>
@@ -18915,7 +19797,7 @@
       </w:pPr>
     </w:lvl>
   </w:abstractNum>
-  <w:abstractNum w:abstractNumId="18" w15:restartNumberingAfterBreak="0">
+  <w:abstractNum w:abstractNumId="19" w15:restartNumberingAfterBreak="0">
     <w:nsid w:val="5DF00C50"/>
     <w:multiLevelType w:val="multilevel"/>
     <w:tmpl w:val="0A9E9B5C"/>
@@ -19028,7 +19910,7 @@
       </w:rPr>
     </w:lvl>
   </w:abstractNum>
-  <w:abstractNum w:abstractNumId="19" w15:restartNumberingAfterBreak="0">
+  <w:abstractNum w:abstractNumId="20" w15:restartNumberingAfterBreak="0">
     <w:nsid w:val="66644B8F"/>
     <w:multiLevelType w:val="multilevel"/>
     <w:tmpl w:val="1DC09544"/>
@@ -19146,7 +20028,7 @@
       </w:rPr>
     </w:lvl>
   </w:abstractNum>
-  <w:abstractNum w:abstractNumId="20" w15:restartNumberingAfterBreak="0">
+  <w:abstractNum w:abstractNumId="21" w15:restartNumberingAfterBreak="0">
     <w:nsid w:val="69151B1F"/>
     <w:multiLevelType w:val="hybridMultilevel"/>
     <w:tmpl w:val="7002848A"/>
@@ -19259,7 +20141,7 @@
       </w:rPr>
     </w:lvl>
   </w:abstractNum>
-  <w:abstractNum w:abstractNumId="21" w15:restartNumberingAfterBreak="0">
+  <w:abstractNum w:abstractNumId="22" w15:restartNumberingAfterBreak="0">
     <w:nsid w:val="734A397D"/>
     <w:multiLevelType w:val="multilevel"/>
     <w:tmpl w:val="4EE2C4CC"/>
@@ -19372,7 +20254,7 @@
       </w:rPr>
     </w:lvl>
   </w:abstractNum>
-  <w:abstractNum w:abstractNumId="22" w15:restartNumberingAfterBreak="0">
+  <w:abstractNum w:abstractNumId="23" w15:restartNumberingAfterBreak="0">
     <w:nsid w:val="79CA1227"/>
     <w:multiLevelType w:val="hybridMultilevel"/>
     <w:tmpl w:val="55540D28"/>
@@ -19478,6 +20360,119 @@
       <w:lvlJc w:val="left"/>
       <w:pPr>
         <w:ind w:left="6404" w:hanging="360"/>
+      </w:pPr>
+      <w:rPr>
+        <w:rFonts w:ascii="Wingdings" w:hAnsi="Wingdings" w:hint="default"/>
+      </w:rPr>
+    </w:lvl>
+  </w:abstractNum>
+  <w:abstractNum w:abstractNumId="24" w15:restartNumberingAfterBreak="0">
+    <w:nsid w:val="7A7B099C"/>
+    <w:multiLevelType w:val="hybridMultilevel"/>
+    <w:tmpl w:val="B8369274"/>
+    <w:lvl w:ilvl="0" w:tplc="08090001">
+      <w:start w:val="1"/>
+      <w:numFmt w:val="bullet"/>
+      <w:lvlText w:val=""/>
+      <w:lvlJc w:val="left"/>
+      <w:pPr>
+        <w:ind w:left="1440" w:hanging="360"/>
+      </w:pPr>
+      <w:rPr>
+        <w:rFonts w:ascii="Symbol" w:hAnsi="Symbol" w:hint="default"/>
+      </w:rPr>
+    </w:lvl>
+    <w:lvl w:ilvl="1" w:tplc="08090003" w:tentative="1">
+      <w:start w:val="1"/>
+      <w:numFmt w:val="bullet"/>
+      <w:lvlText w:val="o"/>
+      <w:lvlJc w:val="left"/>
+      <w:pPr>
+        <w:ind w:left="2160" w:hanging="360"/>
+      </w:pPr>
+      <w:rPr>
+        <w:rFonts w:ascii="Courier New" w:hAnsi="Courier New" w:cs="Courier New" w:hint="default"/>
+      </w:rPr>
+    </w:lvl>
+    <w:lvl w:ilvl="2" w:tplc="08090005" w:tentative="1">
+      <w:start w:val="1"/>
+      <w:numFmt w:val="bullet"/>
+      <w:lvlText w:val=""/>
+      <w:lvlJc w:val="left"/>
+      <w:pPr>
+        <w:ind w:left="2880" w:hanging="360"/>
+      </w:pPr>
+      <w:rPr>
+        <w:rFonts w:ascii="Wingdings" w:hAnsi="Wingdings" w:hint="default"/>
+      </w:rPr>
+    </w:lvl>
+    <w:lvl w:ilvl="3" w:tplc="08090001" w:tentative="1">
+      <w:start w:val="1"/>
+      <w:numFmt w:val="bullet"/>
+      <w:lvlText w:val=""/>
+      <w:lvlJc w:val="left"/>
+      <w:pPr>
+        <w:ind w:left="3600" w:hanging="360"/>
+      </w:pPr>
+      <w:rPr>
+        <w:rFonts w:ascii="Symbol" w:hAnsi="Symbol" w:hint="default"/>
+      </w:rPr>
+    </w:lvl>
+    <w:lvl w:ilvl="4" w:tplc="08090003" w:tentative="1">
+      <w:start w:val="1"/>
+      <w:numFmt w:val="bullet"/>
+      <w:lvlText w:val="o"/>
+      <w:lvlJc w:val="left"/>
+      <w:pPr>
+        <w:ind w:left="4320" w:hanging="360"/>
+      </w:pPr>
+      <w:rPr>
+        <w:rFonts w:ascii="Courier New" w:hAnsi="Courier New" w:cs="Courier New" w:hint="default"/>
+      </w:rPr>
+    </w:lvl>
+    <w:lvl w:ilvl="5" w:tplc="08090005" w:tentative="1">
+      <w:start w:val="1"/>
+      <w:numFmt w:val="bullet"/>
+      <w:lvlText w:val=""/>
+      <w:lvlJc w:val="left"/>
+      <w:pPr>
+        <w:ind w:left="5040" w:hanging="360"/>
+      </w:pPr>
+      <w:rPr>
+        <w:rFonts w:ascii="Wingdings" w:hAnsi="Wingdings" w:hint="default"/>
+      </w:rPr>
+    </w:lvl>
+    <w:lvl w:ilvl="6" w:tplc="08090001" w:tentative="1">
+      <w:start w:val="1"/>
+      <w:numFmt w:val="bullet"/>
+      <w:lvlText w:val=""/>
+      <w:lvlJc w:val="left"/>
+      <w:pPr>
+        <w:ind w:left="5760" w:hanging="360"/>
+      </w:pPr>
+      <w:rPr>
+        <w:rFonts w:ascii="Symbol" w:hAnsi="Symbol" w:hint="default"/>
+      </w:rPr>
+    </w:lvl>
+    <w:lvl w:ilvl="7" w:tplc="08090003" w:tentative="1">
+      <w:start w:val="1"/>
+      <w:numFmt w:val="bullet"/>
+      <w:lvlText w:val="o"/>
+      <w:lvlJc w:val="left"/>
+      <w:pPr>
+        <w:ind w:left="6480" w:hanging="360"/>
+      </w:pPr>
+      <w:rPr>
+        <w:rFonts w:ascii="Courier New" w:hAnsi="Courier New" w:cs="Courier New" w:hint="default"/>
+      </w:rPr>
+    </w:lvl>
+    <w:lvl w:ilvl="8" w:tplc="08090005" w:tentative="1">
+      <w:start w:val="1"/>
+      <w:numFmt w:val="bullet"/>
+      <w:lvlText w:val=""/>
+      <w:lvlJc w:val="left"/>
+      <w:pPr>
+        <w:ind w:left="7200" w:hanging="360"/>
       </w:pPr>
       <w:rPr>
         <w:rFonts w:ascii="Wingdings" w:hAnsi="Wingdings" w:hint="default"/>
@@ -19500,25 +20495,25 @@
     <w:abstractNumId w:val="2"/>
   </w:num>
   <w:num w:numId="6" w16cid:durableId="1781874687">
-    <w:abstractNumId w:val="22"/>
+    <w:abstractNumId w:val="23"/>
   </w:num>
   <w:num w:numId="7" w16cid:durableId="1930696681">
-    <w:abstractNumId w:val="19"/>
+    <w:abstractNumId w:val="20"/>
   </w:num>
   <w:num w:numId="8" w16cid:durableId="288122373">
-    <w:abstractNumId w:val="17"/>
+    <w:abstractNumId w:val="18"/>
   </w:num>
   <w:num w:numId="9" w16cid:durableId="1384670221">
     <w:abstractNumId w:val="5"/>
   </w:num>
   <w:num w:numId="10" w16cid:durableId="1919559332">
-    <w:abstractNumId w:val="18"/>
+    <w:abstractNumId w:val="19"/>
   </w:num>
   <w:num w:numId="11" w16cid:durableId="913514872">
     <w:abstractNumId w:val="12"/>
   </w:num>
   <w:num w:numId="12" w16cid:durableId="2093774704">
-    <w:abstractNumId w:val="21"/>
+    <w:abstractNumId w:val="22"/>
   </w:num>
   <w:num w:numId="13" w16cid:durableId="1656835221">
     <w:abstractNumId w:val="16"/>
@@ -19569,7 +20564,7 @@
     <w:abstractNumId w:val="3"/>
   </w:num>
   <w:num w:numId="29" w16cid:durableId="1650590971">
-    <w:abstractNumId w:val="20"/>
+    <w:abstractNumId w:val="21"/>
   </w:num>
   <w:num w:numId="30" w16cid:durableId="1272929739">
     <w:abstractNumId w:val="6"/>
@@ -19585,6 +20580,12 @@
   </w:num>
   <w:num w:numId="34" w16cid:durableId="69162411">
     <w:abstractNumId w:val="10"/>
+  </w:num>
+  <w:num w:numId="35" w16cid:durableId="1154561930">
+    <w:abstractNumId w:val="24"/>
+  </w:num>
+  <w:num w:numId="36" w16cid:durableId="818957205">
+    <w:abstractNumId w:val="17"/>
   </w:num>
 </w:numbering>
 </file>
@@ -20240,7 +21241,6 @@
   <w:style w:type="character" w:default="1" w:styleId="DefaultParagraphFont">
     <w:name w:val="Default Paragraph Font"/>
     <w:uiPriority w:val="1"/>
-    <w:semiHidden/>
     <w:unhideWhenUsed/>
   </w:style>
   <w:style w:type="table" w:default="1" w:styleId="TableNormal">
@@ -21173,11 +22173,13 @@
   </w:compat>
   <w:rsids>
     <w:rsidRoot w:val="00C74BBF"/>
+    <w:rsid w:val="00053E7E"/>
     <w:rsid w:val="00055CD9"/>
     <w:rsid w:val="001715BC"/>
     <w:rsid w:val="001751C5"/>
     <w:rsid w:val="00182198"/>
     <w:rsid w:val="0019422B"/>
+    <w:rsid w:val="00203B50"/>
     <w:rsid w:val="00222139"/>
     <w:rsid w:val="00334480"/>
     <w:rsid w:val="004026C8"/>
@@ -21188,6 +22190,7 @@
     <w:rsid w:val="005523F1"/>
     <w:rsid w:val="00627190"/>
     <w:rsid w:val="00696189"/>
+    <w:rsid w:val="006C0ACC"/>
     <w:rsid w:val="006D1C56"/>
     <w:rsid w:val="00787247"/>
     <w:rsid w:val="00790467"/>
@@ -21198,7 +22201,9 @@
     <w:rsid w:val="00981D56"/>
     <w:rsid w:val="009E184F"/>
     <w:rsid w:val="00A3335C"/>
+    <w:rsid w:val="00A72DA5"/>
     <w:rsid w:val="00AE4F19"/>
+    <w:rsid w:val="00BE65ED"/>
     <w:rsid w:val="00C74BBF"/>
     <w:rsid w:val="00CE7C62"/>
     <w:rsid w:val="00E54388"/>
@@ -21659,7 +22664,7 @@
     <w:basedOn w:val="DefaultParagraphFont"/>
     <w:uiPriority w:val="99"/>
     <w:semiHidden/>
-    <w:rsid w:val="00FF0BFB"/>
+    <w:rsid w:val="00053E7E"/>
     <w:rPr>
       <w:color w:val="666666"/>
     </w:rPr>

</xml_diff>

<commit_message>
Finished inchi db eda discussionin memory and fixed minor notebook issues.
</commit_message>
<xml_diff>
--- a/Memorias/TFM Drug Metabolism - Gonzalo Robles.docx
+++ b/Memorias/TFM Drug Metabolism - Gonzalo Robles.docx
@@ -4490,7 +4490,7 @@
         </w:rPr>
         <w:fldChar w:fldCharType="separate"/>
       </w:r>
-      <w:hyperlink w:anchor="_Toc227189017" w:history="1">
+      <w:hyperlink w:anchor="_Toc228295394" w:history="1">
         <w:r>
           <w:rPr>
             <w:rStyle w:val="Hyperlink"/>
@@ -4526,7 +4526,7 @@
             <w:noProof/>
             <w:webHidden/>
           </w:rPr>
-          <w:instrText xml:space="preserve"> PAGEREF _Toc227189017 \h </w:instrText>
+          <w:instrText xml:space="preserve"> PAGEREF _Toc228295394 \h </w:instrText>
         </w:r>
         <w:r>
           <w:rPr>
@@ -4546,7 +4546,7 @@
             <w:noProof/>
             <w:webHidden/>
           </w:rPr>
-          <w:t>6</w:t>
+          <w:t>7</w:t>
         </w:r>
         <w:r>
           <w:rPr>
@@ -4572,7 +4572,7 @@
           <w14:ligatures w14:val="standardContextual"/>
         </w:rPr>
       </w:pPr>
-      <w:hyperlink w:anchor="_Toc227189018" w:history="1">
+      <w:hyperlink w:anchor="_Toc228295395" w:history="1">
         <w:r>
           <w:rPr>
             <w:rStyle w:val="Hyperlink"/>
@@ -4580,6 +4580,14 @@
             <w:lang w:val="en-GB"/>
           </w:rPr>
           <w:t>Figure 2. Simplified schematic of molecular representation pipelines.</w:t>
+        </w:r>
+        <w:r>
+          <w:rPr>
+            <w:rStyle w:val="Hyperlink"/>
+            <w:noProof/>
+            <w:lang w:val="en-GB" w:eastAsia="en-GB"/>
+          </w:rPr>
+          <w:t xml:space="preserve"> Source: Original artwork by the author.</w:t>
         </w:r>
         <w:r>
           <w:rPr>
@@ -4600,7 +4608,7 @@
             <w:noProof/>
             <w:webHidden/>
           </w:rPr>
-          <w:instrText xml:space="preserve"> PAGEREF _Toc227189018 \h </w:instrText>
+          <w:instrText xml:space="preserve"> PAGEREF _Toc228295395 \h </w:instrText>
         </w:r>
         <w:r>
           <w:rPr>
@@ -4646,7 +4654,7 @@
           <w14:ligatures w14:val="standardContextual"/>
         </w:rPr>
       </w:pPr>
-      <w:hyperlink w:anchor="_Toc227189019" w:history="1">
+      <w:hyperlink w:anchor="_Toc228295396" w:history="1">
         <w:r>
           <w:rPr>
             <w:rStyle w:val="Hyperlink"/>
@@ -4674,7 +4682,7 @@
             <w:noProof/>
             <w:webHidden/>
           </w:rPr>
-          <w:instrText xml:space="preserve"> PAGEREF _Toc227189019 \h </w:instrText>
+          <w:instrText xml:space="preserve"> PAGEREF _Toc228295396 \h </w:instrText>
         </w:r>
         <w:r>
           <w:rPr>
@@ -4720,14 +4728,30 @@
           <w14:ligatures w14:val="standardContextual"/>
         </w:rPr>
       </w:pPr>
-      <w:hyperlink w:anchor="_Toc227189020" w:history="1">
+      <w:hyperlink w:anchor="_Toc228295397" w:history="1">
         <w:r>
           <w:rPr>
             <w:rStyle w:val="Hyperlink"/>
             <w:noProof/>
             <w:lang w:val="en-GB"/>
           </w:rPr>
-          <w:t xml:space="preserve">Figure 4. CYP450 ‘dict’ descriptors for full db (A) and curated db with threshold = 10 (B).  Dict( </w:t>
+          <w:t>Figure 4. CYP450 ‘dict’ descr</w:t>
+        </w:r>
+        <w:r>
+          <w:rPr>
+            <w:rStyle w:val="Hyperlink"/>
+            <w:noProof/>
+            <w:lang w:val="en-GB"/>
+          </w:rPr>
+          <w:t>i</w:t>
+        </w:r>
+        <w:r>
+          <w:rPr>
+            <w:rStyle w:val="Hyperlink"/>
+            <w:noProof/>
+            <w:lang w:val="en-GB"/>
+          </w:rPr>
+          <w:t xml:space="preserve">ptors for full db (A) and curated db with threshold = 10 (B).  Dict( </w:t>
         </w:r>
         <w:r>
           <w:rPr>
@@ -4766,7 +4790,7 @@
             <w:noProof/>
             <w:webHidden/>
           </w:rPr>
-          <w:instrText xml:space="preserve"> PAGEREF _Toc227189020 \h </w:instrText>
+          <w:instrText xml:space="preserve"> PAGEREF _Toc228295397 \h </w:instrText>
         </w:r>
         <w:r>
           <w:rPr>
@@ -4812,14 +4836,14 @@
           <w14:ligatures w14:val="standardContextual"/>
         </w:rPr>
       </w:pPr>
-      <w:hyperlink w:anchor="_Toc227189021" w:history="1">
+      <w:hyperlink w:anchor="_Toc228295398" w:history="1">
         <w:r>
           <w:rPr>
             <w:rStyle w:val="Hyperlink"/>
             <w:noProof/>
             <w:lang w:val="en-GB"/>
           </w:rPr>
-          <w:t>Figure 5. Morgan fingerprint feature matrix (ECFP6, radius = 3) for the curated dataset. Rows correspond to DrugBank IDs; columns represent hashed substructure counts. The resulting matrix has dimensions 1368 × 2048 and contains integer count values.</w:t>
+          <w:t>Figure 5 Distribution of InChI string lengths with fitted log-normal distribution. The histogram represents the empirical distribution, with the x-axis truncated at the 99th percentile to improve visual clarity by excluding extreme outliers. The dashed red line corresponds to a fitted log-normal distribution, shown for reference to illustrate the overall shape of the data.</w:t>
         </w:r>
         <w:r>
           <w:rPr>
@@ -4840,81 +4864,7 @@
             <w:noProof/>
             <w:webHidden/>
           </w:rPr>
-          <w:instrText xml:space="preserve"> PAGEREF _Toc227189021 \h </w:instrText>
-        </w:r>
-        <w:r>
-          <w:rPr>
-            <w:noProof/>
-            <w:webHidden/>
-          </w:rPr>
-        </w:r>
-        <w:r>
-          <w:rPr>
-            <w:noProof/>
-            <w:webHidden/>
-          </w:rPr>
-          <w:fldChar w:fldCharType="separate"/>
-        </w:r>
-        <w:r>
-          <w:rPr>
-            <w:noProof/>
-            <w:webHidden/>
-          </w:rPr>
-          <w:t>18</w:t>
-        </w:r>
-        <w:r>
-          <w:rPr>
-            <w:noProof/>
-            <w:webHidden/>
-          </w:rPr>
-          <w:fldChar w:fldCharType="end"/>
-        </w:r>
-      </w:hyperlink>
-    </w:p>
-    <w:p>
-      <w:pPr>
-        <w:pStyle w:val="TableofFigures"/>
-        <w:tabs>
-          <w:tab w:val="right" w:leader="dot" w:pos="8919"/>
-        </w:tabs>
-        <w:rPr>
-          <w:noProof/>
-          <w:kern w:val="2"/>
-          <w:sz w:val="24"/>
-          <w:szCs w:val="24"/>
-          <w:lang w:val="en-GB" w:eastAsia="en-GB"/>
-          <w14:ligatures w14:val="standardContextual"/>
-        </w:rPr>
-      </w:pPr>
-      <w:hyperlink w:anchor="_Toc227189022" w:history="1">
-        <w:r>
-          <w:rPr>
-            <w:rStyle w:val="Hyperlink"/>
-            <w:noProof/>
-            <w:lang w:val="en-GB"/>
-          </w:rPr>
-          <w:t>Figure 6. MolE embedding matrix for the curated dataset. Rows correspond to DrugBank IDs; columns represent pretrained embedding dimensions from the MolE transformer. The resulting matrix has dimensions 1368 × 1000 and contains continuous-valued vectors.</w:t>
-        </w:r>
-        <w:r>
-          <w:rPr>
-            <w:noProof/>
-            <w:webHidden/>
-          </w:rPr>
-          <w:tab/>
-        </w:r>
-        <w:r>
-          <w:rPr>
-            <w:noProof/>
-            <w:webHidden/>
-          </w:rPr>
-          <w:fldChar w:fldCharType="begin"/>
-        </w:r>
-        <w:r>
-          <w:rPr>
-            <w:noProof/>
-            <w:webHidden/>
-          </w:rPr>
-          <w:instrText xml:space="preserve"> PAGEREF _Toc227189022 \h </w:instrText>
+          <w:instrText xml:space="preserve"> PAGEREF _Toc228295398 \h </w:instrText>
         </w:r>
         <w:r>
           <w:rPr>
@@ -4960,14 +4910,14 @@
           <w14:ligatures w14:val="standardContextual"/>
         </w:rPr>
       </w:pPr>
-      <w:hyperlink w:anchor="_Toc227189023" w:history="1">
+      <w:hyperlink w:anchor="_Toc228295399" w:history="1">
         <w:r>
           <w:rPr>
             <w:rStyle w:val="Hyperlink"/>
             <w:noProof/>
             <w:lang w:val="en-GB"/>
           </w:rPr>
-          <w:t>Figure 7. ChemBERTa embedding matrix for the curated dataset. Rows correspond to DrugBank IDs; columns represent pretrained embedding dimensions from the ChemBERTa transformer. The resulting matrix has dimensions 1368 × 768 and contains continuous-valued vectors.</w:t>
+          <w:t>Figure 6 Distribution of tokenized InChI sequence lengths with fitted log-normal distribution. The x-axis is truncated at the 99th percentile for visual clarity. The fitted log-normal curve is shown for reference.</w:t>
         </w:r>
         <w:r>
           <w:rPr>
@@ -4988,7 +4938,7 @@
             <w:noProof/>
             <w:webHidden/>
           </w:rPr>
-          <w:instrText xml:space="preserve"> PAGEREF _Toc227189023 \h </w:instrText>
+          <w:instrText xml:space="preserve"> PAGEREF _Toc228295399 \h </w:instrText>
         </w:r>
         <w:r>
           <w:rPr>
@@ -5034,14 +4984,236 @@
           <w14:ligatures w14:val="standardContextual"/>
         </w:rPr>
       </w:pPr>
-      <w:hyperlink w:anchor="_Toc227189024" w:history="1">
+      <w:hyperlink w:anchor="_Toc228295400" w:history="1">
         <w:r>
           <w:rPr>
             <w:rStyle w:val="Hyperlink"/>
             <w:noProof/>
             <w:lang w:val="en-GB"/>
           </w:rPr>
-          <w:t>Figure 8. InChI-based embedding matrix for the curated dataset. Rows correspond to DrugBank IDs; columns represent embedding dimensions from the author</w:t>
+          <w:t>Figure 7. Morgan fingerprint feature matrix (ECFP6, radius = 3) for the curated dataset. Rows correspond to DrugBank IDs; columns represent hashed substructure counts. The resulting matrix has dimensions 1368 × 2048 and contains integer count values.</w:t>
+        </w:r>
+        <w:r>
+          <w:rPr>
+            <w:noProof/>
+            <w:webHidden/>
+          </w:rPr>
+          <w:tab/>
+        </w:r>
+        <w:r>
+          <w:rPr>
+            <w:noProof/>
+            <w:webHidden/>
+          </w:rPr>
+          <w:fldChar w:fldCharType="begin"/>
+        </w:r>
+        <w:r>
+          <w:rPr>
+            <w:noProof/>
+            <w:webHidden/>
+          </w:rPr>
+          <w:instrText xml:space="preserve"> PAGEREF _Toc228295400 \h </w:instrText>
+        </w:r>
+        <w:r>
+          <w:rPr>
+            <w:noProof/>
+            <w:webHidden/>
+          </w:rPr>
+        </w:r>
+        <w:r>
+          <w:rPr>
+            <w:noProof/>
+            <w:webHidden/>
+          </w:rPr>
+          <w:fldChar w:fldCharType="separate"/>
+        </w:r>
+        <w:r>
+          <w:rPr>
+            <w:noProof/>
+            <w:webHidden/>
+          </w:rPr>
+          <w:t>22</w:t>
+        </w:r>
+        <w:r>
+          <w:rPr>
+            <w:noProof/>
+            <w:webHidden/>
+          </w:rPr>
+          <w:fldChar w:fldCharType="end"/>
+        </w:r>
+      </w:hyperlink>
+    </w:p>
+    <w:p>
+      <w:pPr>
+        <w:pStyle w:val="TableofFigures"/>
+        <w:tabs>
+          <w:tab w:val="right" w:leader="dot" w:pos="8919"/>
+        </w:tabs>
+        <w:rPr>
+          <w:noProof/>
+          <w:kern w:val="2"/>
+          <w:sz w:val="24"/>
+          <w:szCs w:val="24"/>
+          <w:lang w:val="en-GB" w:eastAsia="en-GB"/>
+          <w14:ligatures w14:val="standardContextual"/>
+        </w:rPr>
+      </w:pPr>
+      <w:hyperlink w:anchor="_Toc228295401" w:history="1">
+        <w:r>
+          <w:rPr>
+            <w:rStyle w:val="Hyperlink"/>
+            <w:noProof/>
+            <w:lang w:val="en-GB"/>
+          </w:rPr>
+          <w:t>Figure 8. MolE embedding matrix for the curated dataset. Rows correspond to DrugBank IDs; columns represent pretrained embedding dimensions from the MolE transformer. The resulting matrix has dimensions 1368 × 1000 and contains continuous-valued vectors.</w:t>
+        </w:r>
+        <w:r>
+          <w:rPr>
+            <w:noProof/>
+            <w:webHidden/>
+          </w:rPr>
+          <w:tab/>
+        </w:r>
+        <w:r>
+          <w:rPr>
+            <w:noProof/>
+            <w:webHidden/>
+          </w:rPr>
+          <w:fldChar w:fldCharType="begin"/>
+        </w:r>
+        <w:r>
+          <w:rPr>
+            <w:noProof/>
+            <w:webHidden/>
+          </w:rPr>
+          <w:instrText xml:space="preserve"> PAGEREF _Toc228295401 \h </w:instrText>
+        </w:r>
+        <w:r>
+          <w:rPr>
+            <w:noProof/>
+            <w:webHidden/>
+          </w:rPr>
+        </w:r>
+        <w:r>
+          <w:rPr>
+            <w:noProof/>
+            <w:webHidden/>
+          </w:rPr>
+          <w:fldChar w:fldCharType="separate"/>
+        </w:r>
+        <w:r>
+          <w:rPr>
+            <w:noProof/>
+            <w:webHidden/>
+          </w:rPr>
+          <w:t>22</w:t>
+        </w:r>
+        <w:r>
+          <w:rPr>
+            <w:noProof/>
+            <w:webHidden/>
+          </w:rPr>
+          <w:fldChar w:fldCharType="end"/>
+        </w:r>
+      </w:hyperlink>
+    </w:p>
+    <w:p>
+      <w:pPr>
+        <w:pStyle w:val="TableofFigures"/>
+        <w:tabs>
+          <w:tab w:val="right" w:leader="dot" w:pos="8919"/>
+        </w:tabs>
+        <w:rPr>
+          <w:noProof/>
+          <w:kern w:val="2"/>
+          <w:sz w:val="24"/>
+          <w:szCs w:val="24"/>
+          <w:lang w:val="en-GB" w:eastAsia="en-GB"/>
+          <w14:ligatures w14:val="standardContextual"/>
+        </w:rPr>
+      </w:pPr>
+      <w:hyperlink w:anchor="_Toc228295402" w:history="1">
+        <w:r>
+          <w:rPr>
+            <w:rStyle w:val="Hyperlink"/>
+            <w:noProof/>
+            <w:lang w:val="en-GB"/>
+          </w:rPr>
+          <w:t>Figure 9. ChemBERTa embedding matrix for the curated dataset. Rows correspond to DrugBank IDs; columns represent pretrained embedding dimensions from the ChemBERTa transformer. The resulting matrix has dimensions 1368 × 768 and contains continuous-valued vectors.</w:t>
+        </w:r>
+        <w:r>
+          <w:rPr>
+            <w:noProof/>
+            <w:webHidden/>
+          </w:rPr>
+          <w:tab/>
+        </w:r>
+        <w:r>
+          <w:rPr>
+            <w:noProof/>
+            <w:webHidden/>
+          </w:rPr>
+          <w:fldChar w:fldCharType="begin"/>
+        </w:r>
+        <w:r>
+          <w:rPr>
+            <w:noProof/>
+            <w:webHidden/>
+          </w:rPr>
+          <w:instrText xml:space="preserve"> PAGEREF _Toc228295402 \h </w:instrText>
+        </w:r>
+        <w:r>
+          <w:rPr>
+            <w:noProof/>
+            <w:webHidden/>
+          </w:rPr>
+        </w:r>
+        <w:r>
+          <w:rPr>
+            <w:noProof/>
+            <w:webHidden/>
+          </w:rPr>
+          <w:fldChar w:fldCharType="separate"/>
+        </w:r>
+        <w:r>
+          <w:rPr>
+            <w:noProof/>
+            <w:webHidden/>
+          </w:rPr>
+          <w:t>23</w:t>
+        </w:r>
+        <w:r>
+          <w:rPr>
+            <w:noProof/>
+            <w:webHidden/>
+          </w:rPr>
+          <w:fldChar w:fldCharType="end"/>
+        </w:r>
+      </w:hyperlink>
+    </w:p>
+    <w:p>
+      <w:pPr>
+        <w:pStyle w:val="TableofFigures"/>
+        <w:tabs>
+          <w:tab w:val="right" w:leader="dot" w:pos="8919"/>
+        </w:tabs>
+        <w:rPr>
+          <w:noProof/>
+          <w:kern w:val="2"/>
+          <w:sz w:val="24"/>
+          <w:szCs w:val="24"/>
+          <w:lang w:val="en-GB" w:eastAsia="en-GB"/>
+          <w14:ligatures w14:val="standardContextual"/>
+        </w:rPr>
+      </w:pPr>
+      <w:hyperlink w:anchor="_Toc228295403" w:history="1">
+        <w:r>
+          <w:rPr>
+            <w:rStyle w:val="Hyperlink"/>
+            <w:noProof/>
+            <w:lang w:val="en-GB"/>
+          </w:rPr>
+          <w:t>Figure 10. InChI-based embedding matrix for the curated dataset. Rows correspond to DrugBank IDs; columns represent embedding dimensions from the author</w:t>
         </w:r>
         <w:r>
           <w:rPr>
@@ -5096,7 +5268,7 @@
             <w:noProof/>
             <w:webHidden/>
           </w:rPr>
-          <w:instrText xml:space="preserve"> PAGEREF _Toc227189024 \h </w:instrText>
+          <w:instrText xml:space="preserve"> PAGEREF _Toc228295403 \h </w:instrText>
         </w:r>
         <w:r>
           <w:rPr>
@@ -5116,7 +5288,7 @@
             <w:noProof/>
             <w:webHidden/>
           </w:rPr>
-          <w:t>21</w:t>
+          <w:t>24</w:t>
         </w:r>
         <w:r>
           <w:rPr>
@@ -5151,7 +5323,6 @@
         <w:rPr>
           <w:lang w:val="en-GB" w:eastAsia="en-GB"/>
         </w:rPr>
-        <w:lastRenderedPageBreak/>
         <w:t>Abbreviations</w:t>
       </w:r>
     </w:p>
@@ -5644,7 +5815,14 @@
         <w:rPr>
           <w:lang w:val="en-GB" w:eastAsia="en-GB"/>
         </w:rPr>
-        <w:t>. However, this characterization is typically performed only in late preclinical or even clinical stages, when laboratory assays and in vivo studies become feasible. At these advanced stages, uncovering metabolism-related issues can lead to costly setbacks or even termination of a drug candidate, as redesigning its structure is often no longer practical. In early discovery, where many compounds are screened, routine experimental testing of CYP450 metabolism is rarely performed due to high costs, leaving potential issues undetected until very late in development.</w:t>
+        <w:t xml:space="preserve">. However, this characterization is typically performed only in late preclinical or even clinical stages, when laboratory assays and in vivo studies become feasible. At these advanced stages, uncovering metabolism-related issues can lead to costly setbacks or even termination of a drug candidate, as redesigning its structure is often no longer practical. In early discovery, where many compounds are screened, routine experimental testing of CYP450 </w:t>
+      </w:r>
+      <w:r>
+        <w:rPr>
+          <w:lang w:val="en-GB" w:eastAsia="en-GB"/>
+        </w:rPr>
+        <w:lastRenderedPageBreak/>
+        <w:t>metabolism is rarely performed due to high costs, leaving potential issues undetected until very late in development.</w:t>
       </w:r>
     </w:p>
     <w:p>
@@ -5658,14 +5836,7 @@
         <w:rPr>
           <w:lang w:val="en-GB" w:eastAsia="en-GB"/>
         </w:rPr>
-        <w:t xml:space="preserve">Experimental systems such as liver microsomes and primary hepatocytes are widely used to study drug metabolism, yet each has significant trade-offs. Microsomes enable relatively inexpensive, high-throughput testing, but offer only partial insights into a molecule’s metabolic profile. In contrast, primary hepatocytes provide a more complete and physiologically relevant picture, but they are far more expensive, challenging to handle, and unsuitable for testing large libraries of early candidates. As a result, detailed metabolic studies are often delayed. This challenge highlights the need for </w:t>
-      </w:r>
-      <w:r>
-        <w:rPr>
-          <w:lang w:val="en-GB" w:eastAsia="en-GB"/>
-        </w:rPr>
-        <w:lastRenderedPageBreak/>
-        <w:t>computational tools capable of predicting key metabolic behaviours early, complementing traditional experiments while reducing risk and cost</w:t>
+        <w:t>Experimental systems such as liver microsomes and primary hepatocytes are widely used to study drug metabolism, yet each has significant trade-offs. Microsomes enable relatively inexpensive, high-throughput testing, but offer only partial insights into a molecule’s metabolic profile. In contrast, primary hepatocytes provide a more complete and physiologically relevant picture, but they are far more expensive, challenging to handle, and unsuitable for testing large libraries of early candidates. As a result, detailed metabolic studies are often delayed. This challenge highlights the need for computational tools capable of predicting key metabolic behaviours early, complementing traditional experiments while reducing risk and cost</w:t>
       </w:r>
       <w:r>
         <w:rPr>
@@ -5896,7 +6067,7 @@
           <w:lang w:val="en-GB"/>
         </w:rPr>
       </w:pPr>
-      <w:bookmarkStart w:id="7" w:name="_Toc227189017"/>
+      <w:bookmarkStart w:id="7" w:name="_Toc228295394"/>
       <w:r>
         <w:rPr>
           <w:lang w:val="en-GB"/>
@@ -8716,7 +8887,7 @@
           <w:lang w:val="en-GB"/>
         </w:rPr>
       </w:pPr>
-      <w:bookmarkStart w:id="15" w:name="_Toc227189018"/>
+      <w:bookmarkStart w:id="15" w:name="_Toc228295395"/>
       <w:r>
         <w:rPr>
           <w:lang w:val="en-GB"/>
@@ -8763,25 +8934,25 @@
         </w:rPr>
         <w:t>Simplified schematic of molecular representation pipelines.</w:t>
       </w:r>
+      <w:r>
+        <w:rPr>
+          <w:lang w:val="en-GB" w:eastAsia="en-GB"/>
+        </w:rPr>
+        <w:t xml:space="preserve"> </w:t>
+      </w:r>
+      <w:r>
+        <w:rPr>
+          <w:lang w:val="en-GB" w:eastAsia="en-GB"/>
+        </w:rPr>
+        <w:t xml:space="preserve">Source: </w:t>
+      </w:r>
+      <w:r>
+        <w:rPr>
+          <w:lang w:val="en-GB" w:eastAsia="en-GB"/>
+        </w:rPr>
+        <w:t>Original artwork by the author.</w:t>
+      </w:r>
       <w:bookmarkEnd w:id="15"/>
-      <w:r>
-        <w:rPr>
-          <w:lang w:val="en-GB" w:eastAsia="en-GB"/>
-        </w:rPr>
-        <w:t xml:space="preserve"> </w:t>
-      </w:r>
-      <w:r>
-        <w:rPr>
-          <w:lang w:val="en-GB" w:eastAsia="en-GB"/>
-        </w:rPr>
-        <w:t xml:space="preserve">Source: </w:t>
-      </w:r>
-      <w:r>
-        <w:rPr>
-          <w:lang w:val="en-GB" w:eastAsia="en-GB"/>
-        </w:rPr>
-        <w:t>Original artwork by the author.</w:t>
-      </w:r>
     </w:p>
     <w:p>
       <w:pPr>
@@ -10625,7 +10796,7 @@
           <w:noProof/>
           <w:lang w:val="en-GB"/>
         </w:rPr>
-        <w:t>2</w:t>
+        <w:t>3</w:t>
       </w:r>
       <w:r>
         <w:rPr>
@@ -10696,7 +10867,7 @@
         </w:rPr>
       </w:pPr>
       <w:bookmarkStart w:id="25" w:name="_Ref225621380"/>
-      <w:bookmarkStart w:id="26" w:name="_Toc227189019"/>
+      <w:bookmarkStart w:id="26" w:name="_Toc228295396"/>
       <w:r>
         <w:rPr>
           <w:lang w:val="en-GB"/>
@@ -11082,6 +11253,7 @@
                                 </w:rPr>
                                 <w:tab/>
                               </w:r>
+                              <w:proofErr w:type="gramStart"/>
                               <w:r>
                                 <w:rPr>
                                   <w:color w:val="000000" w:themeColor="text1"/>
@@ -11136,6 +11308,7 @@
                                 </w:rPr>
                                 <w:t>B</w:t>
                               </w:r>
+                              <w:proofErr w:type="gramEnd"/>
                             </w:p>
                           </w:txbxContent>
                         </wps:txbx>
@@ -11297,6 +11470,7 @@
                           </w:rPr>
                           <w:tab/>
                         </w:r>
+                        <w:proofErr w:type="gramStart"/>
                         <w:r>
                           <w:rPr>
                             <w:color w:val="000000" w:themeColor="text1"/>
@@ -11351,6 +11525,7 @@
                           </w:rPr>
                           <w:t>B</w:t>
                         </w:r>
+                        <w:proofErr w:type="gramEnd"/>
                       </w:p>
                     </w:txbxContent>
                   </v:textbox>
@@ -11420,7 +11595,7 @@
                             </w:pPr>
                             <w:bookmarkStart w:id="28" w:name="_Ref223455572"/>
                             <w:bookmarkStart w:id="29" w:name="_Ref223455489"/>
-                            <w:bookmarkStart w:id="30" w:name="_Toc227189020"/>
+                            <w:bookmarkStart w:id="30" w:name="_Toc228295397"/>
                             <w:r>
                               <w:rPr>
                                 <w:lang w:val="en-GB"/>
@@ -11474,12 +11649,14 @@
                               </w:rPr>
                               <w:t>‘</w:t>
                             </w:r>
+                            <w:proofErr w:type="spellStart"/>
                             <w:r>
                               <w:rPr>
                                 <w:lang w:val="en-GB"/>
                               </w:rPr>
                               <w:t>dict</w:t>
                             </w:r>
+                            <w:proofErr w:type="spellEnd"/>
                             <w:r>
                               <w:rPr>
                                 <w:lang w:val="en-GB"/>
@@ -11496,7 +11673,35 @@
                               <w:rPr>
                                 <w:lang w:val="en-GB"/>
                               </w:rPr>
-                              <w:t xml:space="preserve"> for full db (A) and curated db with threshold = 10 (B)</w:t>
+                              <w:t xml:space="preserve"> for full </w:t>
+                            </w:r>
+                            <w:proofErr w:type="spellStart"/>
+                            <w:r>
+                              <w:rPr>
+                                <w:lang w:val="en-GB"/>
+                              </w:rPr>
+                              <w:t>db</w:t>
+                            </w:r>
+                            <w:proofErr w:type="spellEnd"/>
+                            <w:r>
+                              <w:rPr>
+                                <w:lang w:val="en-GB"/>
+                              </w:rPr>
+                              <w:t xml:space="preserve"> (A) and curated </w:t>
+                            </w:r>
+                            <w:proofErr w:type="spellStart"/>
+                            <w:r>
+                              <w:rPr>
+                                <w:lang w:val="en-GB"/>
+                              </w:rPr>
+                              <w:t>db</w:t>
+                            </w:r>
+                            <w:proofErr w:type="spellEnd"/>
+                            <w:r>
+                              <w:rPr>
+                                <w:lang w:val="en-GB"/>
+                              </w:rPr>
+                              <w:t xml:space="preserve"> with threshold = 10 (B)</w:t>
                             </w:r>
                             <w:r>
                               <w:rPr>
@@ -11510,11 +11715,20 @@
                               </w:rPr>
                               <w:t xml:space="preserve">  </w:t>
                             </w:r>
+                            <w:proofErr w:type="spellStart"/>
+                            <w:proofErr w:type="gramStart"/>
                             <w:r>
                               <w:rPr>
                                 <w:lang w:val="en-GB"/>
                               </w:rPr>
-                              <w:t>Dict(</w:t>
+                              <w:t>Dict</w:t>
+                            </w:r>
+                            <w:proofErr w:type="spellEnd"/>
+                            <w:r>
+                              <w:rPr>
+                                <w:lang w:val="en-GB"/>
+                              </w:rPr>
+                              <w:t>(</w:t>
                             </w:r>
                             <w:r>
                               <w:rPr>
@@ -11528,7 +11742,25 @@
                                 <w:bCs/>
                                 <w:lang w:val="en-GB"/>
                               </w:rPr>
-                              <w:t>CYP name</w:t>
+                              <w:t>CYP</w:t>
+                            </w:r>
+                            <w:proofErr w:type="gramEnd"/>
+                            <w:r>
+                              <w:rPr>
+                                <w:b/>
+                                <w:bCs/>
+                                <w:lang w:val="en-GB"/>
+                              </w:rPr>
+                              <w:t xml:space="preserve"> </w:t>
+                            </w:r>
+                            <w:proofErr w:type="gramStart"/>
+                            <w:r>
+                              <w:rPr>
+                                <w:b/>
+                                <w:bCs/>
+                                <w:lang w:val="en-GB"/>
+                              </w:rPr>
+                              <w:t>name</w:t>
                             </w:r>
                             <w:r>
                               <w:rPr>
@@ -11542,10 +11774,25 @@
                               <w:rPr>
                                 <w:lang w:val="en-GB"/>
                               </w:rPr>
-                              <w:t>: Nº of appearances )</w:t>
+                              <w:t>:</w:t>
+                            </w:r>
+                            <w:proofErr w:type="gramEnd"/>
+                            <w:r>
+                              <w:rPr>
+                                <w:lang w:val="en-GB"/>
+                              </w:rPr>
+                              <w:t xml:space="preserve"> Nº of </w:t>
+                            </w:r>
+                            <w:proofErr w:type="gramStart"/>
+                            <w:r>
+                              <w:rPr>
+                                <w:lang w:val="en-GB"/>
+                              </w:rPr>
+                              <w:t>appearances )</w:t>
                             </w:r>
                             <w:bookmarkEnd w:id="29"/>
                             <w:bookmarkEnd w:id="30"/>
+                            <w:proofErr w:type="gramEnd"/>
                           </w:p>
                         </w:txbxContent>
                       </wps:txbx>
@@ -11581,7 +11828,7 @@
                       </w:pPr>
                       <w:bookmarkStart w:id="31" w:name="_Ref223455572"/>
                       <w:bookmarkStart w:id="32" w:name="_Ref223455489"/>
-                      <w:bookmarkStart w:id="33" w:name="_Toc227189020"/>
+                      <w:bookmarkStart w:id="33" w:name="_Toc228295397"/>
                       <w:r>
                         <w:rPr>
                           <w:lang w:val="en-GB"/>
@@ -11635,12 +11882,14 @@
                         </w:rPr>
                         <w:t>‘</w:t>
                       </w:r>
+                      <w:proofErr w:type="spellStart"/>
                       <w:r>
                         <w:rPr>
                           <w:lang w:val="en-GB"/>
                         </w:rPr>
                         <w:t>dict</w:t>
                       </w:r>
+                      <w:proofErr w:type="spellEnd"/>
                       <w:r>
                         <w:rPr>
                           <w:lang w:val="en-GB"/>
@@ -11657,7 +11906,35 @@
                         <w:rPr>
                           <w:lang w:val="en-GB"/>
                         </w:rPr>
-                        <w:t xml:space="preserve"> for full db (A) and curated db with threshold = 10 (B)</w:t>
+                        <w:t xml:space="preserve"> for full </w:t>
+                      </w:r>
+                      <w:proofErr w:type="spellStart"/>
+                      <w:r>
+                        <w:rPr>
+                          <w:lang w:val="en-GB"/>
+                        </w:rPr>
+                        <w:t>db</w:t>
+                      </w:r>
+                      <w:proofErr w:type="spellEnd"/>
+                      <w:r>
+                        <w:rPr>
+                          <w:lang w:val="en-GB"/>
+                        </w:rPr>
+                        <w:t xml:space="preserve"> (A) and curated </w:t>
+                      </w:r>
+                      <w:proofErr w:type="spellStart"/>
+                      <w:r>
+                        <w:rPr>
+                          <w:lang w:val="en-GB"/>
+                        </w:rPr>
+                        <w:t>db</w:t>
+                      </w:r>
+                      <w:proofErr w:type="spellEnd"/>
+                      <w:r>
+                        <w:rPr>
+                          <w:lang w:val="en-GB"/>
+                        </w:rPr>
+                        <w:t xml:space="preserve"> with threshold = 10 (B)</w:t>
                       </w:r>
                       <w:r>
                         <w:rPr>
@@ -11671,11 +11948,20 @@
                         </w:rPr>
                         <w:t xml:space="preserve">  </w:t>
                       </w:r>
+                      <w:proofErr w:type="spellStart"/>
+                      <w:proofErr w:type="gramStart"/>
                       <w:r>
                         <w:rPr>
                           <w:lang w:val="en-GB"/>
                         </w:rPr>
-                        <w:t>Dict(</w:t>
+                        <w:t>Dict</w:t>
+                      </w:r>
+                      <w:proofErr w:type="spellEnd"/>
+                      <w:r>
+                        <w:rPr>
+                          <w:lang w:val="en-GB"/>
+                        </w:rPr>
+                        <w:t>(</w:t>
                       </w:r>
                       <w:r>
                         <w:rPr>
@@ -11689,7 +11975,25 @@
                           <w:bCs/>
                           <w:lang w:val="en-GB"/>
                         </w:rPr>
-                        <w:t>CYP name</w:t>
+                        <w:t>CYP</w:t>
+                      </w:r>
+                      <w:proofErr w:type="gramEnd"/>
+                      <w:r>
+                        <w:rPr>
+                          <w:b/>
+                          <w:bCs/>
+                          <w:lang w:val="en-GB"/>
+                        </w:rPr>
+                        <w:t xml:space="preserve"> </w:t>
+                      </w:r>
+                      <w:proofErr w:type="gramStart"/>
+                      <w:r>
+                        <w:rPr>
+                          <w:b/>
+                          <w:bCs/>
+                          <w:lang w:val="en-GB"/>
+                        </w:rPr>
+                        <w:t>name</w:t>
                       </w:r>
                       <w:r>
                         <w:rPr>
@@ -11703,10 +12007,25 @@
                         <w:rPr>
                           <w:lang w:val="en-GB"/>
                         </w:rPr>
-                        <w:t>: Nº of appearances )</w:t>
+                        <w:t>:</w:t>
+                      </w:r>
+                      <w:proofErr w:type="gramEnd"/>
+                      <w:r>
+                        <w:rPr>
+                          <w:lang w:val="en-GB"/>
+                        </w:rPr>
+                        <w:t xml:space="preserve"> Nº of </w:t>
+                      </w:r>
+                      <w:proofErr w:type="gramStart"/>
+                      <w:r>
+                        <w:rPr>
+                          <w:lang w:val="en-GB"/>
+                        </w:rPr>
+                        <w:t>appearances )</w:t>
                       </w:r>
                       <w:bookmarkEnd w:id="32"/>
                       <w:bookmarkEnd w:id="33"/>
+                      <w:proofErr w:type="gramEnd"/>
                     </w:p>
                   </w:txbxContent>
                 </v:textbox>
@@ -11856,7 +12175,7 @@
           <w:noProof/>
           <w:lang w:val="en-GB"/>
         </w:rPr>
-        <w:t>3</w:t>
+        <w:t>4</w:t>
       </w:r>
       <w:r>
         <w:rPr>
@@ -11952,7 +12271,7 @@
           <w:noProof/>
           <w:lang w:val="en-GB"/>
         </w:rPr>
-        <w:t>3</w:t>
+        <w:t>4</w:t>
       </w:r>
       <w:r>
         <w:rPr>
@@ -12236,72 +12555,847 @@
         <w:pStyle w:val="Heading2"/>
         <w:jc w:val="both"/>
         <w:rPr>
+          <w:color w:val="auto"/>
+          <w:lang w:val="en-GB" w:eastAsia="en-GB"/>
+        </w:rPr>
+      </w:pPr>
+      <w:bookmarkStart w:id="35" w:name="_Toc227189001"/>
+      <w:r>
+        <w:rPr>
+          <w:color w:val="auto"/>
+          <w:lang w:val="en-GB" w:eastAsia="en-GB"/>
+        </w:rPr>
+        <w:t>Exploratory data analysis (EDA)</w:t>
+      </w:r>
+      <w:bookmarkEnd w:id="35"/>
+    </w:p>
+    <w:p>
+      <w:pPr>
+        <w:rPr>
+          <w:lang w:val="en-GB" w:eastAsia="en-GB"/>
+        </w:rPr>
+      </w:pPr>
+      <w:r>
+        <w:rPr>
+          <w:lang w:val="en-GB" w:eastAsia="en-GB"/>
+        </w:rPr>
+        <w:t>This section provides a structured overview of the data used throughout the project, focusing on its composition, underlying patterns, and potential limitations. The objective is to characterise both the molecular representations and the associated annotations in a way that supports informed decisions in the modelling pipeline, particularly in terms of representation choices, preprocessing steps, and evaluation design.</w:t>
+      </w:r>
+    </w:p>
+    <w:p>
+      <w:pPr>
+        <w:pStyle w:val="Heading3"/>
+        <w:rPr>
+          <w:color w:val="auto"/>
+          <w:lang w:val="en-GB" w:eastAsia="en-GB"/>
+        </w:rPr>
+      </w:pPr>
+      <w:bookmarkStart w:id="36" w:name="_Toc227189002"/>
+      <w:r>
+        <w:rPr>
+          <w:color w:val="auto"/>
+          <w:lang w:val="en-GB" w:eastAsia="en-GB"/>
+        </w:rPr>
+        <w:t>InChI Database EDA</w:t>
+      </w:r>
+      <w:bookmarkEnd w:id="36"/>
+    </w:p>
+    <w:p>
+      <w:pPr>
+        <w:rPr>
+          <w:lang w:val="en-GB" w:eastAsia="en-GB"/>
+        </w:rPr>
+      </w:pPr>
+      <w:r>
+        <w:rPr>
+          <w:lang w:val="en-GB" w:eastAsia="en-GB"/>
+        </w:rPr>
+        <w:t>The analysis of the InChI-based representation reveals several limitations that are important to contextualize the expected performance of the downstream models. These arise primarily from the characteristics of the source data and the constraints of the</w:t>
+      </w:r>
+      <w:r>
+        <w:rPr>
+          <w:lang w:val="en-GB" w:eastAsia="en-GB"/>
+        </w:rPr>
+        <w:t xml:space="preserve"> InChI</w:t>
+      </w:r>
+      <w:r>
+        <w:rPr>
+          <w:lang w:val="en-GB" w:eastAsia="en-GB"/>
+        </w:rPr>
+        <w:t xml:space="preserve"> representation </w:t>
+      </w:r>
+      <w:proofErr w:type="gramStart"/>
+      <w:r>
+        <w:rPr>
+          <w:lang w:val="en-GB" w:eastAsia="en-GB"/>
+        </w:rPr>
+        <w:t>itself, and</w:t>
+      </w:r>
+      <w:proofErr w:type="gramEnd"/>
+      <w:r>
+        <w:rPr>
+          <w:lang w:val="en-GB" w:eastAsia="en-GB"/>
+        </w:rPr>
+        <w:t xml:space="preserve"> are discussed here in terms of their practical implications.</w:t>
+      </w:r>
+    </w:p>
+    <w:p>
+      <w:pPr>
+        <w:rPr>
+          <w:lang w:val="en-GB" w:eastAsia="en-GB"/>
+        </w:rPr>
+      </w:pPr>
+      <w:r>
+        <w:rPr>
+          <w:lang w:val="en-GB" w:eastAsia="en-GB"/>
+        </w:rPr>
+        <w:t>A central limitation is the near-complete absence of stereochemical information in the dataset. Only 0.01% of the entries (93 molecules)</w:t>
+      </w:r>
+      <w:r>
+        <w:rPr>
+          <w:lang w:val="en-GB" w:eastAsia="en-GB"/>
+        </w:rPr>
+        <w:t xml:space="preserve"> </w:t>
+      </w:r>
+      <w:r>
+        <w:rPr>
+          <w:lang w:val="en-GB" w:eastAsia="en-GB"/>
+        </w:rPr>
+        <w:t>contain stereochemical annotations in their InChI strings. This can be partially explained by the behaviour of the SMILES</w:t>
+      </w:r>
+      <w:r>
+        <w:rPr>
+          <w:lang w:val="en-GB" w:eastAsia="en-GB"/>
+        </w:rPr>
+        <w:t>-</w:t>
+      </w:r>
+      <w:r>
+        <w:rPr>
+          <w:lang w:val="en-GB" w:eastAsia="en-GB"/>
+        </w:rPr>
+        <w:t>to</w:t>
+      </w:r>
+      <w:r>
+        <w:rPr>
+          <w:lang w:val="en-GB" w:eastAsia="en-GB"/>
+        </w:rPr>
+        <w:t>-</w:t>
+      </w:r>
+      <w:r>
+        <w:rPr>
+          <w:lang w:val="en-GB" w:eastAsia="en-GB"/>
+        </w:rPr>
+        <w:t xml:space="preserve">InChI conversion process: the use of the </w:t>
+      </w:r>
+      <w:r>
+        <w:rPr>
+          <w:lang w:val="en-GB" w:eastAsia="en-GB"/>
+        </w:rPr>
+        <w:t>\</w:t>
+      </w:r>
+      <w:r>
+        <w:rPr>
+          <w:lang w:val="en-GB" w:eastAsia="en-GB"/>
+        </w:rPr>
+        <w:t xml:space="preserve"> character, required to encode trans (E) stereochemistry, leads to parsing issues and results in the loss of this information, while the absence of the </w:t>
+      </w:r>
+      <w:r>
+        <w:rPr>
+          <w:lang w:val="en-GB" w:eastAsia="en-GB"/>
+        </w:rPr>
+        <w:t>@</w:t>
+      </w:r>
+      <w:r>
+        <w:rPr>
+          <w:lang w:val="en-GB" w:eastAsia="en-GB"/>
+        </w:rPr>
+        <w:t xml:space="preserve"> symbol in the original SMILES dataset indicates that chiral centres (R/S stereochemistry) were not </w:t>
+      </w:r>
+      <w:r>
+        <w:rPr>
+          <w:lang w:val="en-GB" w:eastAsia="en-GB"/>
+        </w:rPr>
+        <w:t>present in the original dataset</w:t>
+      </w:r>
+      <w:r>
+        <w:rPr>
+          <w:lang w:val="en-GB" w:eastAsia="en-GB"/>
+        </w:rPr>
+        <w:t xml:space="preserve"> in the first place. Even when considering the 0.07% of SMILES that failed conversion (1177 strings), and assuming in a worst-case scenario that all of them contained stereochemical information, the overall proportion would remain very low. This suggests that the scarcity of stereochemistry is largely a property of the source dataset rather than an artefact introduced during preprocessing. Nevertheless, this remains a relevant limitation, as CYP450</w:t>
+      </w:r>
+      <w:r>
+        <w:rPr>
+          <w:lang w:val="en-GB" w:eastAsia="en-GB"/>
+        </w:rPr>
+        <w:t>-</w:t>
+      </w:r>
+      <w:r>
+        <w:rPr>
+          <w:lang w:val="en-GB" w:eastAsia="en-GB"/>
+        </w:rPr>
+        <w:t>mediated metabolism can be stereoselective, and the model will not be able to</w:t>
+      </w:r>
+      <w:r>
+        <w:rPr>
+          <w:lang w:val="en-GB" w:eastAsia="en-GB"/>
+        </w:rPr>
+        <w:t xml:space="preserve"> accurately</w:t>
+      </w:r>
+      <w:r>
+        <w:rPr>
+          <w:lang w:val="en-GB" w:eastAsia="en-GB"/>
+        </w:rPr>
+        <w:t xml:space="preserve"> capture such effects.</w:t>
+      </w:r>
+    </w:p>
+    <w:p>
+      <w:pPr>
+        <w:rPr>
+          <w:lang w:val="en-GB" w:eastAsia="en-GB"/>
+        </w:rPr>
+      </w:pPr>
+      <w:r>
+        <w:rPr>
+          <w:lang w:val="en-GB" w:eastAsia="en-GB"/>
+        </w:rPr>
+        <w:t>The dataset also exhibits a moderate level of duplication, with approximately 4.7% of entries repeated</w:t>
+      </w:r>
+      <w:r>
+        <w:rPr>
+          <w:lang w:val="en-GB" w:eastAsia="en-GB"/>
+        </w:rPr>
+        <w:t>. Nearly</w:t>
+      </w:r>
+      <w:r>
+        <w:rPr>
+          <w:lang w:val="en-GB" w:eastAsia="en-GB"/>
+        </w:rPr>
+        <w:t xml:space="preserve"> identical duplication rates </w:t>
+      </w:r>
+      <w:r>
+        <w:rPr>
+          <w:lang w:val="en-GB" w:eastAsia="en-GB"/>
+        </w:rPr>
+        <w:t xml:space="preserve">were </w:t>
+      </w:r>
+      <w:r>
+        <w:rPr>
+          <w:lang w:val="en-GB" w:eastAsia="en-GB"/>
+        </w:rPr>
+        <w:t>observed in</w:t>
+      </w:r>
+      <w:r>
+        <w:rPr>
+          <w:lang w:val="en-GB" w:eastAsia="en-GB"/>
+        </w:rPr>
+        <w:t xml:space="preserve"> the</w:t>
+      </w:r>
+      <w:r>
+        <w:rPr>
+          <w:lang w:val="en-GB" w:eastAsia="en-GB"/>
+        </w:rPr>
+        <w:t xml:space="preserve"> SMILES and InChI</w:t>
+      </w:r>
+      <w:r>
+        <w:rPr>
+          <w:lang w:val="en-GB" w:eastAsia="en-GB"/>
+        </w:rPr>
+        <w:t xml:space="preserve"> db</w:t>
+      </w:r>
+      <w:r>
+        <w:rPr>
+          <w:lang w:val="en-GB" w:eastAsia="en-GB"/>
+        </w:rPr>
+        <w:t xml:space="preserve">. This indicates that redundancy is primarily inherited from the original database, with only a minor contribution from InChI canonicalization, where different but equivalent SMILES map to the same representation. Some of the most frequently repeated entries correspond to large, peptide-like structures, which likely arise from repeated records in the source data. </w:t>
+      </w:r>
+      <w:r>
+        <w:rPr>
+          <w:lang w:val="en-GB" w:eastAsia="en-GB"/>
+        </w:rPr>
+        <w:t xml:space="preserve">However, </w:t>
+      </w:r>
+      <w:proofErr w:type="gramStart"/>
+      <w:r>
+        <w:rPr>
+          <w:lang w:val="en-GB" w:eastAsia="en-GB"/>
+        </w:rPr>
+        <w:t xml:space="preserve">these </w:t>
+      </w:r>
+      <w:r>
+        <w:rPr>
+          <w:lang w:val="en-GB" w:eastAsia="en-GB"/>
+        </w:rPr>
+        <w:t xml:space="preserve">type of </w:t>
+      </w:r>
+      <w:r>
+        <w:rPr>
+          <w:lang w:val="en-GB" w:eastAsia="en-GB"/>
+        </w:rPr>
+        <w:t>structures</w:t>
+      </w:r>
+      <w:proofErr w:type="gramEnd"/>
+      <w:r>
+        <w:rPr>
+          <w:lang w:val="en-GB" w:eastAsia="en-GB"/>
+        </w:rPr>
+        <w:t xml:space="preserve"> represent only a small fraction of the overall dataset. </w:t>
+      </w:r>
+      <w:r>
+        <w:rPr>
+          <w:lang w:val="en-GB" w:eastAsia="en-GB"/>
+        </w:rPr>
+        <w:t>They are therefore</w:t>
+      </w:r>
+      <w:r>
+        <w:rPr>
+          <w:lang w:val="en-GB" w:eastAsia="en-GB"/>
+        </w:rPr>
+        <w:t xml:space="preserve"> unlikely to significantly influence or bias the model’s performance in a meaningful way.</w:t>
+      </w:r>
+      <w:r>
+        <w:rPr>
+          <w:lang w:val="en-GB" w:eastAsia="en-GB"/>
+        </w:rPr>
+        <w:t xml:space="preserve"> </w:t>
+      </w:r>
+      <w:r>
+        <w:rPr>
+          <w:lang w:val="en-GB" w:eastAsia="en-GB"/>
+        </w:rPr>
+        <w:t xml:space="preserve">While duplication introduces a degree of frequency bias, where certain molecules are overrepresented, the magnitude of this effect is </w:t>
+      </w:r>
+      <w:r>
+        <w:rPr>
+          <w:lang w:val="en-GB" w:eastAsia="en-GB"/>
+        </w:rPr>
+        <w:t xml:space="preserve">overall </w:t>
+      </w:r>
+      <w:r>
+        <w:rPr>
+          <w:lang w:val="en-GB" w:eastAsia="en-GB"/>
+        </w:rPr>
+        <w:t>moderate and consistent with typical large</w:t>
+      </w:r>
+      <w:r>
+        <w:rPr>
+          <w:lang w:val="en-GB" w:eastAsia="en-GB"/>
+        </w:rPr>
+        <w:t>-</w:t>
+      </w:r>
+      <w:r>
+        <w:rPr>
+          <w:lang w:val="en-GB" w:eastAsia="en-GB"/>
+        </w:rPr>
+        <w:t>scale chemical databases.</w:t>
+      </w:r>
+    </w:p>
+    <w:p>
+      <w:pPr>
+        <w:rPr>
+          <w:lang w:val="en-GB" w:eastAsia="en-GB"/>
+        </w:rPr>
+      </w:pPr>
+      <w:r>
+        <w:rPr>
+          <w:lang w:val="en-GB" w:eastAsia="en-GB"/>
+        </w:rPr>
+        <w:t>T</w:t>
+      </w:r>
+      <w:r>
+        <w:rPr>
+          <w:lang w:val="en-GB" w:eastAsia="en-GB"/>
+        </w:rPr>
+        <w:t>he distribution of sequence lengths in the raw InChI representation shows a clear right-skew, with most molecules concentrated within a relatively narrow range and a long tail corresponding to increasingly complex structures</w:t>
+      </w:r>
+      <w:r>
+        <w:rPr>
+          <w:lang w:val="en-GB" w:eastAsia="en-GB"/>
+        </w:rPr>
+        <w:t xml:space="preserve"> (</w:t>
+      </w:r>
+      <w:r>
+        <w:rPr>
+          <w:lang w:val="en-GB" w:eastAsia="en-GB"/>
+        </w:rPr>
+        <w:fldChar w:fldCharType="begin"/>
+      </w:r>
+      <w:r>
+        <w:rPr>
+          <w:lang w:val="en-GB" w:eastAsia="en-GB"/>
+        </w:rPr>
+        <w:instrText xml:space="preserve"> REF _Ref228294871 \h </w:instrText>
+      </w:r>
+      <w:r>
+        <w:rPr>
+          <w:lang w:val="en-GB" w:eastAsia="en-GB"/>
+        </w:rPr>
+      </w:r>
+      <w:r>
+        <w:rPr>
+          <w:lang w:val="en-GB" w:eastAsia="en-GB"/>
+        </w:rPr>
+        <w:fldChar w:fldCharType="separate"/>
+      </w:r>
+      <w:r>
+        <w:rPr>
+          <w:lang w:val="en-GB"/>
+        </w:rPr>
+        <w:t xml:space="preserve">Figure </w:t>
+      </w:r>
+      <w:r>
+        <w:rPr>
+          <w:noProof/>
+          <w:lang w:val="en-GB"/>
+        </w:rPr>
+        <w:t>5</w:t>
+      </w:r>
+      <w:r>
+        <w:rPr>
+          <w:lang w:val="en-GB" w:eastAsia="en-GB"/>
+        </w:rPr>
+        <w:fldChar w:fldCharType="end"/>
+      </w:r>
+      <w:r>
+        <w:rPr>
+          <w:lang w:val="en-GB" w:eastAsia="en-GB"/>
+        </w:rPr>
+        <w:t>)</w:t>
+      </w:r>
+      <w:r>
+        <w:rPr>
+          <w:lang w:val="en-GB" w:eastAsia="en-GB"/>
+        </w:rPr>
+        <w:t>.</w:t>
+      </w:r>
+    </w:p>
+    <w:p>
+      <w:pPr>
+        <w:keepNext/>
+      </w:pPr>
+      <w:r>
+        <w:rPr>
+          <w:lang w:val="en-GB" w:eastAsia="en-GB"/>
+        </w:rPr>
+        <w:lastRenderedPageBreak/>
+        <w:drawing>
+          <wp:inline distT="0" distB="0" distL="0" distR="0" wp14:anchorId="6C13B289" wp14:editId="78A49606">
+            <wp:extent cx="5669915" cy="3071495"/>
+            <wp:effectExtent l="0" t="0" r="6985" b="0"/>
+            <wp:docPr id="474500583" name="Picture 1"/>
+            <wp:cNvGraphicFramePr>
+              <a:graphicFrameLocks xmlns:a="http://schemas.openxmlformats.org/drawingml/2006/main" noChangeAspect="1"/>
+            </wp:cNvGraphicFramePr>
+            <a:graphic xmlns:a="http://schemas.openxmlformats.org/drawingml/2006/main">
+              <a:graphicData uri="http://schemas.openxmlformats.org/drawingml/2006/picture">
+                <pic:pic xmlns:pic="http://schemas.openxmlformats.org/drawingml/2006/picture">
+                  <pic:nvPicPr>
+                    <pic:cNvPr id="474500583" name=""/>
+                    <pic:cNvPicPr/>
+                  </pic:nvPicPr>
+                  <pic:blipFill>
+                    <a:blip r:embed="rId25"/>
+                    <a:stretch>
+                      <a:fillRect/>
+                    </a:stretch>
+                  </pic:blipFill>
+                  <pic:spPr>
+                    <a:xfrm>
+                      <a:off x="0" y="0"/>
+                      <a:ext cx="5669915" cy="3071495"/>
+                    </a:xfrm>
+                    <a:prstGeom prst="rect">
+                      <a:avLst/>
+                    </a:prstGeom>
+                  </pic:spPr>
+                </pic:pic>
+              </a:graphicData>
+            </a:graphic>
+          </wp:inline>
+        </w:drawing>
+      </w:r>
+    </w:p>
+    <w:p>
+      <w:pPr>
+        <w:pStyle w:val="Caption"/>
+        <w:rPr>
+          <w:lang w:val="en-GB" w:eastAsia="en-GB"/>
+        </w:rPr>
+      </w:pPr>
+      <w:bookmarkStart w:id="37" w:name="_Ref228294871"/>
+      <w:bookmarkStart w:id="38" w:name="_Toc228295398"/>
+      <w:r>
+        <w:rPr>
+          <w:lang w:val="en-GB"/>
+        </w:rPr>
+        <w:t xml:space="preserve">Figure </w:t>
+      </w:r>
+      <w:r>
+        <w:fldChar w:fldCharType="begin"/>
+      </w:r>
+      <w:r>
+        <w:rPr>
+          <w:lang w:val="en-GB"/>
+        </w:rPr>
+        <w:instrText xml:space="preserve"> SEQ Figure \* ARABIC </w:instrText>
+      </w:r>
+      <w:r>
+        <w:fldChar w:fldCharType="separate"/>
+      </w:r>
+      <w:r>
+        <w:rPr>
+          <w:noProof/>
+          <w:lang w:val="en-GB"/>
+        </w:rPr>
+        <w:t>5</w:t>
+      </w:r>
+      <w:r>
+        <w:fldChar w:fldCharType="end"/>
+      </w:r>
+      <w:bookmarkEnd w:id="37"/>
+      <w:r>
+        <w:rPr>
+          <w:lang w:val="en-GB"/>
+        </w:rPr>
+        <w:t xml:space="preserve"> </w:t>
+      </w:r>
+      <w:r>
+        <w:rPr>
+          <w:lang w:val="en-GB"/>
+        </w:rPr>
+        <w:t>Distribution of InChI string lengths with fitted log-normal distribution. The histogram represents the empirical distribution, with the x-axis truncated at the 99th percentile to improve visual clarity by excluding extreme outliers. The dashed red line corresponds to a fitted log-normal distribution, shown for reference to illustrate the overall shape of the data.</w:t>
+      </w:r>
+      <w:bookmarkEnd w:id="38"/>
+    </w:p>
+    <w:p>
+      <w:pPr>
+        <w:rPr>
+          <w:lang w:val="en-GB" w:eastAsia="en-GB"/>
+        </w:rPr>
+      </w:pPr>
+      <w:r>
+        <w:rPr>
+          <w:lang w:val="en-GB" w:eastAsia="en-GB"/>
+        </w:rPr>
+        <w:t>A log-normal distribution provides a reasonable visual approximation of this behaviour, capturing the asymmetry and extended tail observed in the data. This is consistent with the progressive increase in structural complexity as molecules grow.</w:t>
+      </w:r>
+    </w:p>
+    <w:p>
+      <w:pPr>
+        <w:rPr>
+          <w:lang w:val="en-GB" w:eastAsia="en-GB"/>
+        </w:rPr>
+      </w:pPr>
+      <w:r>
+        <w:rPr>
+          <w:lang w:val="en-GB" w:eastAsia="en-GB"/>
+        </w:rPr>
+        <w:t>When applying tokenization, the same overall pattern is preserved, with the distribution maintaining its shape while being rescaled to shorter sequence lengths</w:t>
+      </w:r>
+      <w:r>
+        <w:rPr>
+          <w:lang w:val="en-GB" w:eastAsia="en-GB"/>
+        </w:rPr>
+        <w:t xml:space="preserve"> (</w:t>
+      </w:r>
+      <w:r>
+        <w:rPr>
+          <w:lang w:val="en-GB" w:eastAsia="en-GB"/>
+        </w:rPr>
+        <w:fldChar w:fldCharType="begin"/>
+      </w:r>
+      <w:r>
+        <w:rPr>
+          <w:lang w:val="en-GB" w:eastAsia="en-GB"/>
+        </w:rPr>
+        <w:instrText xml:space="preserve"> REF _Ref228294830 \h </w:instrText>
+      </w:r>
+      <w:r>
+        <w:rPr>
+          <w:lang w:val="en-GB" w:eastAsia="en-GB"/>
+        </w:rPr>
+      </w:r>
+      <w:r>
+        <w:rPr>
+          <w:lang w:val="en-GB" w:eastAsia="en-GB"/>
+        </w:rPr>
+        <w:fldChar w:fldCharType="separate"/>
+      </w:r>
+      <w:r>
+        <w:rPr>
+          <w:lang w:val="en-GB"/>
+        </w:rPr>
+        <w:t xml:space="preserve">Figure </w:t>
+      </w:r>
+      <w:r>
+        <w:rPr>
+          <w:noProof/>
+          <w:lang w:val="en-GB"/>
+        </w:rPr>
+        <w:t>6</w:t>
+      </w:r>
+      <w:r>
+        <w:rPr>
+          <w:lang w:val="en-GB" w:eastAsia="en-GB"/>
+        </w:rPr>
+        <w:fldChar w:fldCharType="end"/>
+      </w:r>
+      <w:r>
+        <w:rPr>
+          <w:lang w:val="en-GB" w:eastAsia="en-GB"/>
+        </w:rPr>
+        <w:t>)</w:t>
+      </w:r>
+      <w:r>
+        <w:rPr>
+          <w:lang w:val="en-GB" w:eastAsia="en-GB"/>
+        </w:rPr>
+        <w:t>. This indicates that the transformation does not distort the underlying structural characteristics of the dataset.</w:t>
+      </w:r>
+    </w:p>
+    <w:p>
+      <w:pPr>
+        <w:keepNext/>
+      </w:pPr>
+      <w:r>
+        <w:rPr>
+          <w:lang w:val="en-GB" w:eastAsia="en-GB"/>
+        </w:rPr>
+        <w:lastRenderedPageBreak/>
+        <w:drawing>
+          <wp:inline distT="0" distB="0" distL="0" distR="0" wp14:anchorId="53392B9B" wp14:editId="75A27E82">
+            <wp:extent cx="5669915" cy="3039745"/>
+            <wp:effectExtent l="0" t="0" r="6985" b="8255"/>
+            <wp:docPr id="489494989" name="Picture 1"/>
+            <wp:cNvGraphicFramePr>
+              <a:graphicFrameLocks xmlns:a="http://schemas.openxmlformats.org/drawingml/2006/main" noChangeAspect="1"/>
+            </wp:cNvGraphicFramePr>
+            <a:graphic xmlns:a="http://schemas.openxmlformats.org/drawingml/2006/main">
+              <a:graphicData uri="http://schemas.openxmlformats.org/drawingml/2006/picture">
+                <pic:pic xmlns:pic="http://schemas.openxmlformats.org/drawingml/2006/picture">
+                  <pic:nvPicPr>
+                    <pic:cNvPr id="489494989" name=""/>
+                    <pic:cNvPicPr/>
+                  </pic:nvPicPr>
+                  <pic:blipFill>
+                    <a:blip r:embed="rId26"/>
+                    <a:stretch>
+                      <a:fillRect/>
+                    </a:stretch>
+                  </pic:blipFill>
+                  <pic:spPr>
+                    <a:xfrm>
+                      <a:off x="0" y="0"/>
+                      <a:ext cx="5669915" cy="3039745"/>
+                    </a:xfrm>
+                    <a:prstGeom prst="rect">
+                      <a:avLst/>
+                    </a:prstGeom>
+                  </pic:spPr>
+                </pic:pic>
+              </a:graphicData>
+            </a:graphic>
+          </wp:inline>
+        </w:drawing>
+      </w:r>
+    </w:p>
+    <w:p>
+      <w:pPr>
+        <w:pStyle w:val="Caption"/>
+        <w:tabs>
+          <w:tab w:val="left" w:pos="1478"/>
+        </w:tabs>
+        <w:rPr>
+          <w:lang w:val="en-GB" w:eastAsia="en-GB"/>
+        </w:rPr>
+      </w:pPr>
+      <w:bookmarkStart w:id="39" w:name="_Ref228294830"/>
+      <w:bookmarkStart w:id="40" w:name="_Toc228295399"/>
+      <w:r>
+        <w:rPr>
+          <w:lang w:val="en-GB"/>
+        </w:rPr>
+        <w:t xml:space="preserve">Figure </w:t>
+      </w:r>
+      <w:r>
+        <w:fldChar w:fldCharType="begin"/>
+      </w:r>
+      <w:r>
+        <w:rPr>
+          <w:lang w:val="en-GB"/>
+        </w:rPr>
+        <w:instrText xml:space="preserve"> SEQ Figure \* ARABIC </w:instrText>
+      </w:r>
+      <w:r>
+        <w:fldChar w:fldCharType="separate"/>
+      </w:r>
+      <w:r>
+        <w:rPr>
+          <w:noProof/>
+          <w:lang w:val="en-GB"/>
+        </w:rPr>
+        <w:t>6</w:t>
+      </w:r>
+      <w:r>
+        <w:fldChar w:fldCharType="end"/>
+      </w:r>
+      <w:bookmarkEnd w:id="39"/>
+      <w:r>
+        <w:rPr>
+          <w:lang w:val="en-GB"/>
+        </w:rPr>
+        <w:t xml:space="preserve"> </w:t>
+      </w:r>
+      <w:r>
+        <w:rPr>
+          <w:lang w:val="en-GB"/>
+        </w:rPr>
+        <w:t>Distribution of tokenized InChI sequence lengths</w:t>
+      </w:r>
+      <w:r>
+        <w:rPr>
+          <w:lang w:val="en-GB"/>
+        </w:rPr>
+        <w:t xml:space="preserve"> </w:t>
+      </w:r>
+      <w:r>
+        <w:rPr>
+          <w:lang w:val="en-GB"/>
+        </w:rPr>
+        <w:t xml:space="preserve">with fitted log-normal distribution. </w:t>
+      </w:r>
+      <w:r>
+        <w:rPr>
+          <w:lang w:val="en-GB"/>
+        </w:rPr>
+        <w:t>The x-axis is truncated at the 99th percentile for visual clarity. The fitted log-normal curve is shown for reference.</w:t>
+      </w:r>
+      <w:bookmarkEnd w:id="40"/>
+    </w:p>
+    <w:p>
+      <w:pPr>
+        <w:rPr>
+          <w:lang w:val="en-GB" w:eastAsia="en-GB"/>
+        </w:rPr>
+      </w:pPr>
+      <w:r>
+        <w:rPr>
+          <w:lang w:val="en-GB" w:eastAsia="en-GB"/>
+        </w:rPr>
+        <w:t xml:space="preserve">Based on the tokenized sequences, a maximum length of 512 tokens covers more than 99% of the dataset without truncation. The sequences exceeding this threshold correspond predominantly to very large, peptide-like molecules, which are less likely to be primarily metabolized by CYP450 enzymes and instead tend to undergo degradation via proteolytic pathways. As such, the truncation strategy represents a practical trade-off, preserving </w:t>
+      </w:r>
+      <w:proofErr w:type="gramStart"/>
+      <w:r>
+        <w:rPr>
+          <w:lang w:val="en-GB" w:eastAsia="en-GB"/>
+        </w:rPr>
+        <w:t>the vast majority of</w:t>
+      </w:r>
+      <w:proofErr w:type="gramEnd"/>
+      <w:r>
+        <w:rPr>
+          <w:lang w:val="en-GB" w:eastAsia="en-GB"/>
+        </w:rPr>
+        <w:t xml:space="preserve"> relevant small-molecule information while maintaining computational efficiency.</w:t>
+      </w:r>
+    </w:p>
+    <w:p>
+      <w:pPr>
+        <w:rPr>
+          <w:lang w:val="en-GB" w:eastAsia="en-GB"/>
+        </w:rPr>
+      </w:pPr>
+      <w:r>
+        <w:rPr>
+          <w:lang w:val="en-GB" w:eastAsia="en-GB"/>
+        </w:rPr>
+        <w:t>With respect to the tokenization process, it is important to note that the Byte-Pair Encoding (BPE) tokenizer learns statistical substructures rather than chemically meaningful units. As a result, individual tokens do not have a direct chemical interpretation. This is an inherent characteristic of data-driven representation learning approaches and is consistent with the broader use of such methods in machine learning, where predictive performance is typically prioritised over interpretability.</w:t>
+      </w:r>
+    </w:p>
+    <w:p>
+      <w:pPr>
+        <w:rPr>
+          <w:lang w:val="en-GB" w:eastAsia="en-GB"/>
+        </w:rPr>
+      </w:pPr>
+      <w:r>
+        <w:rPr>
+          <w:lang w:val="en-GB" w:eastAsia="en-GB"/>
+        </w:rPr>
+        <w:t>Finally, the scope of the representation is limited to molecules that can be reliably encoded as SMILES and converted into InChI format. Certain classes of compounds, such as metal complexes, are not well supported by this pipeline and are therefore not represented in the dataset. This work is intentionally focused on organic small molecules, which are the primary domain of CYP450</w:t>
+      </w:r>
+      <w:r>
+        <w:rPr>
+          <w:lang w:val="en-GB" w:eastAsia="en-GB"/>
+        </w:rPr>
+        <w:t>-</w:t>
+      </w:r>
+      <w:r>
+        <w:rPr>
+          <w:lang w:val="en-GB" w:eastAsia="en-GB"/>
+        </w:rPr>
+        <w:t>mediated metabolism, and thus this limitation does not significantly affect the applicability of the results within the intended scope.</w:t>
+      </w:r>
+    </w:p>
+    <w:p>
+      <w:pPr>
+        <w:rPr>
+          <w:lang w:val="en-GB" w:eastAsia="en-GB"/>
+        </w:rPr>
+      </w:pPr>
+      <w:r>
+        <w:rPr>
+          <w:lang w:val="en-GB" w:eastAsia="en-GB"/>
+        </w:rPr>
+        <w:t xml:space="preserve">Overall, the InChI representation is structurally consistent and efficiently tokenized, enabling its use in a machine learning context. The most relevant limitation is the lack of stereochemical information, which may restrict the model’s ability to capture certain metabolic effects. The dataset also contains moderate duplication and exhibits a long-tail distribution of molecular complexity, both of which are characteristic of real-world chemical databases and are appropriately managed within the pipeline. These factors are well understood and provide a clear context for interpreting the results of the </w:t>
+      </w:r>
+      <w:r>
+        <w:rPr>
+          <w:lang w:val="en-GB" w:eastAsia="en-GB"/>
+        </w:rPr>
+        <w:t>modelling</w:t>
+      </w:r>
+      <w:r>
+        <w:rPr>
+          <w:lang w:val="en-GB" w:eastAsia="en-GB"/>
+        </w:rPr>
+        <w:t xml:space="preserve"> stage.</w:t>
+      </w:r>
+    </w:p>
+    <w:p>
+      <w:pPr>
+        <w:pStyle w:val="Heading3"/>
+        <w:rPr>
           <w:color w:val="EE0000"/>
           <w:lang w:val="en-GB" w:eastAsia="en-GB"/>
         </w:rPr>
       </w:pPr>
-      <w:bookmarkStart w:id="35" w:name="_Toc227189001"/>
+      <w:bookmarkStart w:id="41" w:name="_Toc227189003"/>
       <w:r>
         <w:rPr>
           <w:color w:val="EE0000"/>
           <w:lang w:val="en-GB" w:eastAsia="en-GB"/>
         </w:rPr>
-        <w:t>Exploratory data analysis (EDA)</w:t>
-      </w:r>
-      <w:bookmarkEnd w:id="35"/>
-    </w:p>
-    <w:p>
-      <w:pPr>
-        <w:pStyle w:val="Heading3"/>
+        <w:lastRenderedPageBreak/>
+        <w:t>Metabolism-related Database EDA</w:t>
+      </w:r>
+      <w:bookmarkEnd w:id="41"/>
+    </w:p>
+    <w:p>
+      <w:pPr>
+        <w:jc w:val="both"/>
         <w:rPr>
           <w:color w:val="EE0000"/>
           <w:lang w:val="en-GB" w:eastAsia="en-GB"/>
         </w:rPr>
       </w:pPr>
-      <w:bookmarkStart w:id="36" w:name="_Toc227189002"/>
       <w:r>
         <w:rPr>
           <w:color w:val="EE0000"/>
           <w:lang w:val="en-GB" w:eastAsia="en-GB"/>
         </w:rPr>
-        <w:t>InChI Database EDA</w:t>
-      </w:r>
-      <w:bookmarkEnd w:id="36"/>
-    </w:p>
-    <w:p>
-      <w:pPr>
-        <w:pStyle w:val="Heading3"/>
-        <w:rPr>
-          <w:color w:val="EE0000"/>
-          <w:lang w:val="en-GB" w:eastAsia="en-GB"/>
-        </w:rPr>
-      </w:pPr>
-      <w:bookmarkStart w:id="37" w:name="_Toc227189003"/>
-      <w:r>
-        <w:rPr>
-          <w:color w:val="EE0000"/>
-          <w:lang w:val="en-GB" w:eastAsia="en-GB"/>
-        </w:rPr>
-        <w:t>Metabolism-related Database EDA</w:t>
-      </w:r>
-      <w:bookmarkEnd w:id="37"/>
-    </w:p>
-    <w:p>
-      <w:pPr>
-        <w:jc w:val="both"/>
-        <w:rPr>
-          <w:color w:val="EE0000"/>
-          <w:lang w:val="en-GB" w:eastAsia="en-GB"/>
-        </w:rPr>
-      </w:pPr>
-      <w:r>
-        <w:rPr>
-          <w:color w:val="EE0000"/>
-          <w:lang w:val="en-GB" w:eastAsia="en-GB"/>
-        </w:rPr>
         <w:t xml:space="preserve">Benchmark predictor: </w:t>
       </w:r>
-      <w:hyperlink r:id="rId25" w:history="1">
+      <w:hyperlink r:id="rId27" w:history="1">
         <w:r>
           <w:rPr>
             <w:rStyle w:val="Hyperlink"/>
@@ -12319,14 +13413,14 @@
           <w:lang w:val="en-GB" w:eastAsia="en-GB"/>
         </w:rPr>
       </w:pPr>
-      <w:bookmarkStart w:id="38" w:name="_Toc227189004"/>
+      <w:bookmarkStart w:id="42" w:name="_Toc227189004"/>
       <w:r>
         <w:rPr>
           <w:lang w:val="en-GB" w:eastAsia="en-GB"/>
         </w:rPr>
         <w:t>Data Preprocessing</w:t>
       </w:r>
-      <w:bookmarkEnd w:id="38"/>
+      <w:bookmarkEnd w:id="42"/>
       <w:r>
         <w:rPr>
           <w:lang w:val="en-GB" w:eastAsia="en-GB"/>
@@ -12360,14 +13454,14 @@
           <w:lang w:val="en-GB" w:eastAsia="en-GB"/>
         </w:rPr>
       </w:pPr>
-      <w:bookmarkStart w:id="39" w:name="_Toc227189005"/>
+      <w:bookmarkStart w:id="43" w:name="_Toc227189005"/>
       <w:r>
         <w:rPr>
           <w:lang w:val="en-GB" w:eastAsia="en-GB"/>
         </w:rPr>
         <w:t>Molecular Fingerprint Generation Using Morgan Algorithm</w:t>
       </w:r>
-      <w:bookmarkEnd w:id="39"/>
+      <w:bookmarkEnd w:id="43"/>
     </w:p>
     <w:p>
       <w:pPr>
@@ -12640,7 +13734,7 @@
                     <pic:cNvPicPr/>
                   </pic:nvPicPr>
                   <pic:blipFill>
-                    <a:blip r:embed="rId26"/>
+                    <a:blip r:embed="rId28"/>
                     <a:stretch>
                       <a:fillRect/>
                     </a:stretch>
@@ -12671,7 +13765,7 @@
           <w:lang w:val="en-GB" w:eastAsia="en-GB"/>
         </w:rPr>
       </w:pPr>
-      <w:bookmarkStart w:id="40" w:name="_Toc227189021"/>
+      <w:bookmarkStart w:id="44" w:name="_Toc228295400"/>
       <w:r>
         <w:rPr>
           <w:lang w:val="en-GB"/>
@@ -12695,7 +13789,7 @@
           <w:noProof/>
           <w:lang w:val="en-GB"/>
         </w:rPr>
-        <w:t>5</w:t>
+        <w:t>7</w:t>
       </w:r>
       <w:r>
         <w:fldChar w:fldCharType="end"/>
@@ -12760,7 +13854,7 @@
         </w:rPr>
         <w:t>The resulting matrix has dimensions 1368 × 2048 and contains integer count values.</w:t>
       </w:r>
-      <w:bookmarkEnd w:id="40"/>
+      <w:bookmarkEnd w:id="44"/>
     </w:p>
     <w:p>
       <w:pPr>
@@ -12769,14 +13863,14 @@
           <w:lang w:val="en-GB" w:eastAsia="en-GB"/>
         </w:rPr>
       </w:pPr>
-      <w:bookmarkStart w:id="41" w:name="_Toc227189006"/>
+      <w:bookmarkStart w:id="45" w:name="_Toc227189006"/>
       <w:r>
         <w:rPr>
           <w:lang w:val="en-GB" w:eastAsia="en-GB"/>
         </w:rPr>
         <w:t>Molecular Embedding Extraction Using MolE</w:t>
       </w:r>
-      <w:bookmarkEnd w:id="41"/>
+      <w:bookmarkEnd w:id="45"/>
     </w:p>
     <w:p>
       <w:pPr>
@@ -13109,7 +14203,7 @@
                     <pic:cNvPicPr/>
                   </pic:nvPicPr>
                   <pic:blipFill>
-                    <a:blip r:embed="rId27"/>
+                    <a:blip r:embed="rId29"/>
                     <a:stretch>
                       <a:fillRect/>
                     </a:stretch>
@@ -13137,7 +14231,7 @@
           <w:lang w:val="en-GB"/>
         </w:rPr>
       </w:pPr>
-      <w:bookmarkStart w:id="42" w:name="_Toc227189022"/>
+      <w:bookmarkStart w:id="46" w:name="_Toc228295401"/>
       <w:r>
         <w:rPr>
           <w:lang w:val="en-GB"/>
@@ -13161,7 +14255,7 @@
           <w:noProof/>
           <w:lang w:val="en-GB"/>
         </w:rPr>
-        <w:t>6</w:t>
+        <w:t>8</w:t>
       </w:r>
       <w:r>
         <w:fldChar w:fldCharType="end"/>
@@ -13202,7 +14296,7 @@
         </w:rPr>
         <w:t>.</w:t>
       </w:r>
-      <w:bookmarkEnd w:id="42"/>
+      <w:bookmarkEnd w:id="46"/>
     </w:p>
     <w:p>
       <w:pPr>
@@ -13211,7 +14305,7 @@
           <w:lang w:val="en-GB" w:eastAsia="en-GB"/>
         </w:rPr>
       </w:pPr>
-      <w:bookmarkStart w:id="43" w:name="_Toc227189007"/>
+      <w:bookmarkStart w:id="47" w:name="_Toc227189007"/>
       <w:r>
         <w:rPr>
           <w:lang w:val="en-GB" w:eastAsia="en-GB"/>
@@ -13224,7 +14318,7 @@
         </w:rPr>
         <w:t>ChemBERTa</w:t>
       </w:r>
-      <w:bookmarkEnd w:id="43"/>
+      <w:bookmarkEnd w:id="47"/>
     </w:p>
     <w:p>
       <w:pPr>
@@ -13351,15 +14445,6 @@
               </m:r>
             </m:sup>
           </m:sSup>
-          <m:r>
-            <m:rPr>
-              <m:sty m:val="p"/>
-            </m:rPr>
-            <w:rPr>
-              <w:lang w:val="en-GB"/>
-            </w:rPr>
-            <w:br/>
-          </m:r>
         </m:oMath>
       </m:oMathPara>
     </w:p>
@@ -13425,7 +14510,7 @@
                     <pic:cNvPicPr/>
                   </pic:nvPicPr>
                   <pic:blipFill rotWithShape="1">
-                    <a:blip r:embed="rId28"/>
+                    <a:blip r:embed="rId30"/>
                     <a:srcRect l="353" t="1091"/>
                     <a:stretch>
                       <a:fillRect/>
@@ -13462,7 +14547,7 @@
           <w:lang w:val="en-GB"/>
         </w:rPr>
       </w:pPr>
-      <w:bookmarkStart w:id="44" w:name="_Toc227189023"/>
+      <w:bookmarkStart w:id="48" w:name="_Toc228295402"/>
       <w:r>
         <w:rPr>
           <w:lang w:val="en-GB"/>
@@ -13486,7 +14571,7 @@
           <w:noProof/>
           <w:lang w:val="en-GB"/>
         </w:rPr>
-        <w:t>7</w:t>
+        <w:t>9</w:t>
       </w:r>
       <w:r>
         <w:fldChar w:fldCharType="end"/>
@@ -13521,7 +14606,7 @@
         </w:rPr>
         <w:t>Rows correspond to DrugBank IDs; columns represent pretrained embedding dimensions from the ChemBERTa transformer. The resulting matrix has dimensions 1368 × 768 and contains continuous-valued vectors.</w:t>
       </w:r>
-      <w:bookmarkEnd w:id="44"/>
+      <w:bookmarkEnd w:id="48"/>
     </w:p>
     <w:p>
       <w:pPr>
@@ -13530,7 +14615,7 @@
           <w:lang w:val="en-GB" w:eastAsia="en-GB"/>
         </w:rPr>
       </w:pPr>
-      <w:bookmarkStart w:id="45" w:name="_Toc227189008"/>
+      <w:bookmarkStart w:id="49" w:name="_Toc227189008"/>
       <w:r>
         <w:rPr>
           <w:lang w:val="en-GB" w:eastAsia="en-GB"/>
@@ -13549,7 +14634,7 @@
         </w:rPr>
         <w:t>-Trained InChI embedder</w:t>
       </w:r>
-      <w:bookmarkEnd w:id="45"/>
+      <w:bookmarkEnd w:id="49"/>
     </w:p>
     <w:p>
       <w:pPr>
@@ -13645,14 +14730,14 @@
         <w:rPr>
           <w:lang w:val="en-GB" w:eastAsia="en-GB"/>
         </w:rPr>
-        <w:t xml:space="preserve">local GPU with 4GB of VRAM, which </w:t>
+        <w:t xml:space="preserve">local GPU with 4GB of VRAM, which imposed strict constraints on batch size, sequence length, and overall architectural scale. </w:t>
       </w:r>
       <w:r>
         <w:rPr>
           <w:lang w:val="en-GB" w:eastAsia="en-GB"/>
         </w:rPr>
         <w:lastRenderedPageBreak/>
-        <w:t>imposed strict constraints on batch size, sequence length, and overall architectural scale. Techniques such as mixed-precision training and gradient accumulation were necessary to make the process feasible, effectively trading off training speed for memory efficiency. Despite these optimizations, training remained time-consuming, requiring several hours per epoch and careful monitoring to avoid memory overflows.</w:t>
+        <w:t>Techniques such as mixed-precision training and gradient accumulation were necessary to make the process feasible, effectively trading off training speed for memory efficiency. Despite these optimizations, training remained time-consuming, requiring several hours per epoch and careful monitoring to avoid memory overflows.</w:t>
       </w:r>
     </w:p>
     <w:p>
@@ -14191,7 +15276,7 @@
                     <pic:cNvPicPr/>
                   </pic:nvPicPr>
                   <pic:blipFill rotWithShape="1">
-                    <a:blip r:embed="rId29"/>
+                    <a:blip r:embed="rId31"/>
                     <a:srcRect l="373" t="1988" r="1"/>
                     <a:stretch>
                       <a:fillRect/>
@@ -14228,7 +15313,7 @@
           <w:lang w:val="en-GB" w:eastAsia="en-GB"/>
         </w:rPr>
       </w:pPr>
-      <w:bookmarkStart w:id="46" w:name="_Toc227189024"/>
+      <w:bookmarkStart w:id="50" w:name="_Toc228295403"/>
       <w:r>
         <w:rPr>
           <w:lang w:val="en-GB"/>
@@ -14252,7 +15337,7 @@
           <w:noProof/>
           <w:lang w:val="en-GB"/>
         </w:rPr>
-        <w:t>8</w:t>
+        <w:t>10</w:t>
       </w:r>
       <w:r>
         <w:rPr>
@@ -14332,7 +15417,7 @@
         </w:rPr>
         <w:t>.</w:t>
       </w:r>
-      <w:bookmarkEnd w:id="46"/>
+      <w:bookmarkEnd w:id="50"/>
     </w:p>
     <w:p>
       <w:pPr>
@@ -14341,7 +15426,7 @@
           <w:lang w:val="en-GB" w:eastAsia="en-GB"/>
         </w:rPr>
       </w:pPr>
-      <w:bookmarkStart w:id="47" w:name="_Toc227189009"/>
+      <w:bookmarkStart w:id="51" w:name="_Toc227189009"/>
       <w:r>
         <w:rPr>
           <w:lang w:val="en-GB" w:eastAsia="en-GB"/>
@@ -14355,7 +15440,7 @@
         </w:rPr>
         <w:t xml:space="preserve"> Selection</w:t>
       </w:r>
-      <w:bookmarkEnd w:id="47"/>
+      <w:bookmarkEnd w:id="51"/>
     </w:p>
     <w:p>
       <w:pPr>
@@ -14364,7 +15449,7 @@
           <w:lang w:val="en-GB" w:eastAsia="en-GB"/>
         </w:rPr>
       </w:pPr>
-      <w:bookmarkStart w:id="48" w:name="_Toc227189010"/>
+      <w:bookmarkStart w:id="52" w:name="_Toc227189010"/>
       <w:r>
         <w:rPr>
           <w:lang w:val="en-GB" w:eastAsia="en-GB"/>
@@ -14377,7 +15462,7 @@
         </w:rPr>
         <w:t xml:space="preserve"> Splitting</w:t>
       </w:r>
-      <w:bookmarkEnd w:id="48"/>
+      <w:bookmarkEnd w:id="52"/>
     </w:p>
     <w:p>
       <w:pPr>
@@ -14386,14 +15471,14 @@
           <w:lang w:val="en-GB" w:eastAsia="en-GB"/>
         </w:rPr>
       </w:pPr>
-      <w:bookmarkStart w:id="49" w:name="_Toc227189011"/>
+      <w:bookmarkStart w:id="53" w:name="_Toc227189011"/>
       <w:r>
         <w:rPr>
           <w:lang w:val="en-GB" w:eastAsia="en-GB"/>
         </w:rPr>
         <w:t>Model Training</w:t>
       </w:r>
-      <w:bookmarkEnd w:id="49"/>
+      <w:bookmarkEnd w:id="53"/>
     </w:p>
     <w:p>
       <w:pPr>
@@ -14402,14 +15487,14 @@
           <w:lang w:val="en-GB" w:eastAsia="en-GB"/>
         </w:rPr>
       </w:pPr>
-      <w:bookmarkStart w:id="50" w:name="_Toc227189012"/>
+      <w:bookmarkStart w:id="54" w:name="_Toc227189012"/>
       <w:r>
         <w:rPr>
           <w:lang w:val="en-GB" w:eastAsia="en-GB"/>
         </w:rPr>
         <w:t>Model Evaluation and Validation</w:t>
       </w:r>
-      <w:bookmarkEnd w:id="50"/>
+      <w:bookmarkEnd w:id="54"/>
       <w:r>
         <w:rPr>
           <w:lang w:val="en-GB" w:eastAsia="en-GB"/>
@@ -14424,14 +15509,14 @@
           <w:lang w:val="en-GB" w:eastAsia="en-GB"/>
         </w:rPr>
       </w:pPr>
-      <w:bookmarkStart w:id="51" w:name="_Toc227189013"/>
+      <w:bookmarkStart w:id="55" w:name="_Toc227189013"/>
       <w:r>
         <w:rPr>
           <w:lang w:val="en-GB" w:eastAsia="en-GB"/>
         </w:rPr>
         <w:t>Comparative Analysis</w:t>
       </w:r>
-      <w:bookmarkEnd w:id="51"/>
+      <w:bookmarkEnd w:id="55"/>
     </w:p>
     <w:p>
       <w:pPr>
@@ -14440,14 +15525,14 @@
           <w:lang w:val="en-GB" w:eastAsia="en-GB"/>
         </w:rPr>
       </w:pPr>
-      <w:bookmarkStart w:id="52" w:name="_Toc227189014"/>
+      <w:bookmarkStart w:id="56" w:name="_Toc227189014"/>
       <w:r>
         <w:rPr>
           <w:lang w:val="en-GB" w:eastAsia="en-GB"/>
         </w:rPr>
         <w:t>Conclusions</w:t>
       </w:r>
-      <w:bookmarkEnd w:id="52"/>
+      <w:bookmarkEnd w:id="56"/>
     </w:p>
     <w:p>
       <w:pPr>
@@ -14457,14 +15542,14 @@
           <w:lang w:val="en-GB" w:eastAsia="en-GB"/>
         </w:rPr>
       </w:pPr>
-      <w:bookmarkStart w:id="53" w:name="_Toc227189015"/>
+      <w:bookmarkStart w:id="57" w:name="_Toc227189015"/>
       <w:r>
         <w:rPr>
           <w:lang w:val="en-GB" w:eastAsia="en-GB"/>
         </w:rPr>
         <w:t>REFERENCES</w:t>
       </w:r>
-      <w:bookmarkEnd w:id="53"/>
+      <w:bookmarkEnd w:id="57"/>
     </w:p>
     <w:sdt>
       <w:sdtPr>
@@ -15818,14 +16903,14 @@
           <w:lang w:val="en-GB"/>
         </w:rPr>
       </w:pPr>
-      <w:bookmarkStart w:id="54" w:name="_Toc227189016"/>
+      <w:bookmarkStart w:id="58" w:name="_Toc227189016"/>
       <w:r>
         <w:rPr>
           <w:lang w:val="en-GB"/>
         </w:rPr>
         <w:t>Anexos</w:t>
       </w:r>
-      <w:bookmarkEnd w:id="54"/>
+      <w:bookmarkEnd w:id="58"/>
     </w:p>
     <w:p>
       <w:pPr>
@@ -15972,8 +17057,8 @@
       </w:r>
     </w:p>
     <w:sectPr>
-      <w:footerReference w:type="default" r:id="rId30"/>
-      <w:footerReference w:type="first" r:id="rId31"/>
+      <w:footerReference w:type="default" r:id="rId32"/>
+      <w:footerReference w:type="first" r:id="rId33"/>
       <w:pgSz w:w="11906" w:h="16838" w:code="9"/>
       <w:pgMar w:top="-1985" w:right="1276" w:bottom="993" w:left="1701" w:header="709" w:footer="439" w:gutter="0"/>
       <w:pgNumType w:start="3"/>
@@ -20640,9 +21725,12 @@
     <w:rsid w:val="00203B50"/>
     <w:rsid w:val="00222139"/>
     <w:rsid w:val="002F3C94"/>
+    <w:rsid w:val="003012D3"/>
     <w:rsid w:val="00334480"/>
+    <w:rsid w:val="003D7E12"/>
     <w:rsid w:val="004026C8"/>
     <w:rsid w:val="004206C1"/>
+    <w:rsid w:val="0048101E"/>
     <w:rsid w:val="0049572F"/>
     <w:rsid w:val="004B78DD"/>
     <w:rsid w:val="004D7667"/>
@@ -20656,6 +21744,7 @@
     <w:rsid w:val="00790467"/>
     <w:rsid w:val="007C3DC9"/>
     <w:rsid w:val="00842924"/>
+    <w:rsid w:val="008B4090"/>
     <w:rsid w:val="008D558E"/>
     <w:rsid w:val="00912A44"/>
     <w:rsid w:val="00981D56"/>
@@ -21428,15 +22517,6 @@
 </file>
 
 <file path=customXml/item1.xml><?xml version="1.0" encoding="utf-8"?>
-<?mso-contentType ?>
-<FormTemplates xmlns="http://schemas.microsoft.com/sharepoint/v3/contenttype/forms">
-  <Display>DocumentLibraryForm</Display>
-  <Edit>DocumentLibraryForm</Edit>
-  <New>DocumentLibraryForm</New>
-</FormTemplates>
-</file>
-
-<file path=customXml/item2.xml><?xml version="1.0" encoding="utf-8"?>
 <p:properties xmlns:p="http://schemas.microsoft.com/office/2006/metadata/properties" xmlns:xsi="http://www.w3.org/2001/XMLSchema-instance" xmlns:pc="http://schemas.microsoft.com/office/infopath/2007/PartnerControls">
   <documentManagement>
     <lcf76f155ced4ddcb4097134ff3c332f xmlns="9d7b9a5c-6b4f-4ca1-bb03-c38cacb734bc">
@@ -21447,11 +22527,16 @@
 </p:properties>
 </file>
 
-<file path=customXml/item3.xml><?xml version="1.0" encoding="utf-8"?>
-<b:Sources xmlns:b="http://schemas.openxmlformats.org/officeDocument/2006/bibliography" xmlns="http://schemas.openxmlformats.org/officeDocument/2006/bibliography" SelectedStyle="\APASixthEditionOfficeOnline.xsl" StyleName="APA" Version="6"/>
+<file path=customXml/item2.xml><?xml version="1.0" encoding="utf-8"?>
+<?mso-contentType ?>
+<FormTemplates xmlns="http://schemas.microsoft.com/sharepoint/v3/contenttype/forms">
+  <Display>DocumentLibraryForm</Display>
+  <Edit>DocumentLibraryForm</Edit>
+  <New>DocumentLibraryForm</New>
+</FormTemplates>
 </file>
 
-<file path=customXml/item4.xml><?xml version="1.0" encoding="utf-8"?>
+<file path=customXml/item3.xml><?xml version="1.0" encoding="utf-8"?>
 <ct:contentTypeSchema xmlns:ct="http://schemas.microsoft.com/office/2006/metadata/contentType" xmlns:ma="http://schemas.microsoft.com/office/2006/metadata/properties/metaAttributes" ct:_="" ma:_="" ma:contentTypeName="Documento" ma:contentTypeID="0x01010019FAAD7208B57F46B26AFFED99BCE0D3" ma:contentTypeVersion="16" ma:contentTypeDescription="Crear nuevo documento." ma:contentTypeScope="" ma:versionID="ad25a40a439e4eb6a750a8b6ae1789f7">
   <xsd:schema xmlns:xsd="http://www.w3.org/2001/XMLSchema" xmlns:xs="http://www.w3.org/2001/XMLSchema" xmlns:p="http://schemas.microsoft.com/office/2006/metadata/properties" xmlns:ns2="9d7b9a5c-6b4f-4ca1-bb03-c38cacb734bc" xmlns:ns3="7d80c08f-e909-465c-8aa4-0e649fbe85d0" xmlns:ns4="7302fe9c-5e91-4977-8271-167378b25bd2" targetNamespace="http://schemas.microsoft.com/office/2006/metadata/properties" ma:root="true" ma:fieldsID="113d448336e841d5d8efd4b9e74490d6" ns2:_="" ns3:_="" ns4:_="">
     <xsd:import namespace="9d7b9a5c-6b4f-4ca1-bb03-c38cacb734bc"/>
@@ -21699,15 +22784,11 @@
 </ct:contentTypeSchema>
 </file>
 
-<file path=customXml/itemProps1.xml><?xml version="1.0" encoding="utf-8"?>
-<ds:datastoreItem xmlns:ds="http://schemas.openxmlformats.org/officeDocument/2006/customXml" ds:itemID="{E5FD6A2B-9479-4129-9D84-6C858DBE1A90}">
-  <ds:schemaRefs>
-    <ds:schemaRef ds:uri="http://schemas.microsoft.com/sharepoint/v3/contenttype/forms"/>
-  </ds:schemaRefs>
-</ds:datastoreItem>
+<file path=customXml/item4.xml><?xml version="1.0" encoding="utf-8"?>
+<b:Sources xmlns:b="http://schemas.openxmlformats.org/officeDocument/2006/bibliography" xmlns="http://schemas.openxmlformats.org/officeDocument/2006/bibliography" SelectedStyle="\APASixthEditionOfficeOnline.xsl" StyleName="APA" Version="6"/>
 </file>
 
-<file path=customXml/itemProps2.xml><?xml version="1.0" encoding="utf-8"?>
+<file path=customXml/itemProps1.xml><?xml version="1.0" encoding="utf-8"?>
 <ds:datastoreItem xmlns:ds="http://schemas.openxmlformats.org/officeDocument/2006/customXml" ds:itemID="{261B0A37-6C6C-45CF-A5C4-83D994BC3980}">
   <ds:schemaRefs>
     <ds:schemaRef ds:uri="http://schemas.microsoft.com/office/2006/metadata/properties"/>
@@ -21718,15 +22799,15 @@
 </ds:datastoreItem>
 </file>
 
-<file path=customXml/itemProps3.xml><?xml version="1.0" encoding="utf-8"?>
-<ds:datastoreItem xmlns:ds="http://schemas.openxmlformats.org/officeDocument/2006/customXml" ds:itemID="{5157238F-F555-4D04-860C-F98429B609BD}">
+<file path=customXml/itemProps2.xml><?xml version="1.0" encoding="utf-8"?>
+<ds:datastoreItem xmlns:ds="http://schemas.openxmlformats.org/officeDocument/2006/customXml" ds:itemID="{E5FD6A2B-9479-4129-9D84-6C858DBE1A90}">
   <ds:schemaRefs>
-    <ds:schemaRef ds:uri="http://schemas.openxmlformats.org/officeDocument/2006/bibliography"/>
+    <ds:schemaRef ds:uri="http://schemas.microsoft.com/sharepoint/v3/contenttype/forms"/>
   </ds:schemaRefs>
 </ds:datastoreItem>
 </file>
 
-<file path=customXml/itemProps4.xml><?xml version="1.0" encoding="utf-8"?>
+<file path=customXml/itemProps3.xml><?xml version="1.0" encoding="utf-8"?>
 <ds:datastoreItem xmlns:ds="http://schemas.openxmlformats.org/officeDocument/2006/customXml" ds:itemID="{BC4311AC-D0D5-4AE9-8386-76BDCE1C82F3}">
   <ds:schemaRefs>
     <ds:schemaRef ds:uri="http://schemas.microsoft.com/office/2006/metadata/contentType"/>
@@ -21744,4 +22825,12 @@
     <ds:schemaRef ds:uri="http://schemas.microsoft.com/internal/obd"/>
   </ds:schemaRefs>
 </ds:datastoreItem>
+</file>
+
+<file path=customXml/itemProps4.xml><?xml version="1.0" encoding="utf-8"?>
+<ds:datastoreItem xmlns:ds="http://schemas.openxmlformats.org/officeDocument/2006/customXml" ds:itemID="{5157238F-F555-4D04-860C-F98429B609BD}">
+  <ds:schemaRefs>
+    <ds:schemaRef ds:uri="http://schemas.openxmlformats.org/officeDocument/2006/bibliography"/>
+  </ds:schemaRefs>
+</ds:datastoreItem>
 </file>
</xml_diff>

<commit_message>
Metric and validation discussion in memory and preliminary changes to xgboost python file to align to plan
</commit_message>
<xml_diff>
--- a/Memorias/TFM Drug Metabolism - Gonzalo Robles.docx
+++ b/Memorias/TFM Drug Metabolism - Gonzalo Robles.docx
@@ -4735,23 +4735,7 @@
             <w:noProof/>
             <w:lang w:val="en-GB"/>
           </w:rPr>
-          <w:t>Figure 4. CYP450 ‘dict’ descr</w:t>
-        </w:r>
-        <w:r>
-          <w:rPr>
-            <w:rStyle w:val="Hyperlink"/>
-            <w:noProof/>
-            <w:lang w:val="en-GB"/>
-          </w:rPr>
-          <w:t>i</w:t>
-        </w:r>
-        <w:r>
-          <w:rPr>
-            <w:rStyle w:val="Hyperlink"/>
-            <w:noProof/>
-            <w:lang w:val="en-GB"/>
-          </w:rPr>
-          <w:t xml:space="preserve">ptors for full db (A) and curated db with threshold = 10 (B).  Dict( </w:t>
+          <w:t xml:space="preserve">Figure 4. CYP450 ‘dict’ descriptors for full db (A) and curated db with threshold = 10 (B).  Dict( </w:t>
         </w:r>
         <w:r>
           <w:rPr>
@@ -5222,7 +5206,7 @@
             <w:noProof/>
             <w:lang w:val="en-GB"/>
           </w:rPr>
-          <w:t>‑</w:t>
+          <w:t>-</w:t>
         </w:r>
         <w:r>
           <w:rPr>
@@ -5652,6 +5636,12 @@
                 <w:lang w:val="en-GB" w:eastAsia="en-GB"/>
               </w:rPr>
             </w:pPr>
+            <w:r>
+              <w:rPr>
+                <w:lang w:val="en-GB" w:eastAsia="en-GB"/>
+              </w:rPr>
+              <w:t>MCC</w:t>
+            </w:r>
           </w:p>
         </w:tc>
         <w:tc>
@@ -5665,6 +5655,12 @@
                 <w:lang w:val="en-GB" w:eastAsia="en-GB"/>
               </w:rPr>
             </w:pPr>
+            <w:r>
+              <w:rPr>
+                <w:lang w:val="en-GB"/>
+              </w:rPr>
+              <w:t>Matthews Correlation Coefficient (MCC)</w:t>
+            </w:r>
           </w:p>
         </w:tc>
       </w:tr>
@@ -5683,6 +5679,12 @@
                 <w:lang w:val="en-GB" w:eastAsia="en-GB"/>
               </w:rPr>
             </w:pPr>
+            <w:r>
+              <w:rPr>
+                <w:lang w:val="en-GB" w:eastAsia="en-GB"/>
+              </w:rPr>
+              <w:t>CV</w:t>
+            </w:r>
           </w:p>
         </w:tc>
         <w:tc>
@@ -5696,6 +5698,229 @@
                 <w:lang w:val="en-GB" w:eastAsia="en-GB"/>
               </w:rPr>
             </w:pPr>
+            <w:r>
+              <w:rPr>
+                <w:lang w:val="en-GB" w:eastAsia="en-GB"/>
+              </w:rPr>
+              <w:t>Cross-Validation</w:t>
+            </w:r>
+          </w:p>
+        </w:tc>
+      </w:tr>
+      <w:tr>
+        <w:trPr>
+          <w:trHeight w:val="454"/>
+        </w:trPr>
+        <w:tc>
+          <w:tcPr>
+            <w:tcW w:w="4459" w:type="dxa"/>
+            <w:vAlign w:val="center"/>
+          </w:tcPr>
+          <w:p>
+            <w:pPr>
+              <w:rPr>
+                <w:lang w:val="en-GB" w:eastAsia="en-GB"/>
+              </w:rPr>
+            </w:pPr>
+            <w:r>
+              <w:rPr>
+                <w:lang w:val="en-GB" w:eastAsia="en-GB"/>
+              </w:rPr>
+              <w:t>TP</w:t>
+            </w:r>
+          </w:p>
+        </w:tc>
+        <w:tc>
+          <w:tcPr>
+            <w:tcW w:w="4460" w:type="dxa"/>
+            <w:vAlign w:val="center"/>
+          </w:tcPr>
+          <w:p>
+            <w:pPr>
+              <w:rPr>
+                <w:lang w:val="en-GB" w:eastAsia="en-GB"/>
+              </w:rPr>
+            </w:pPr>
+            <w:r>
+              <w:rPr>
+                <w:lang w:val="en-GB" w:eastAsia="en-GB"/>
+              </w:rPr>
+              <w:t>True Positives</w:t>
+            </w:r>
+          </w:p>
+        </w:tc>
+      </w:tr>
+      <w:tr>
+        <w:trPr>
+          <w:trHeight w:val="454"/>
+        </w:trPr>
+        <w:tc>
+          <w:tcPr>
+            <w:tcW w:w="4459" w:type="dxa"/>
+            <w:vAlign w:val="center"/>
+          </w:tcPr>
+          <w:p>
+            <w:pPr>
+              <w:rPr>
+                <w:lang w:val="en-GB" w:eastAsia="en-GB"/>
+              </w:rPr>
+            </w:pPr>
+            <w:r>
+              <w:rPr>
+                <w:lang w:val="en-GB" w:eastAsia="en-GB"/>
+              </w:rPr>
+              <w:t>TN</w:t>
+            </w:r>
+          </w:p>
+        </w:tc>
+        <w:tc>
+          <w:tcPr>
+            <w:tcW w:w="4460" w:type="dxa"/>
+            <w:vAlign w:val="center"/>
+          </w:tcPr>
+          <w:p>
+            <w:pPr>
+              <w:rPr>
+                <w:lang w:val="en-GB" w:eastAsia="en-GB"/>
+              </w:rPr>
+            </w:pPr>
+            <w:r>
+              <w:rPr>
+                <w:lang w:val="en-GB" w:eastAsia="en-GB"/>
+              </w:rPr>
+              <w:t>True Negatives</w:t>
+            </w:r>
+          </w:p>
+        </w:tc>
+      </w:tr>
+      <w:tr>
+        <w:trPr>
+          <w:trHeight w:val="454"/>
+        </w:trPr>
+        <w:tc>
+          <w:tcPr>
+            <w:tcW w:w="4459" w:type="dxa"/>
+            <w:vAlign w:val="center"/>
+          </w:tcPr>
+          <w:p>
+            <w:pPr>
+              <w:rPr>
+                <w:lang w:val="en-GB" w:eastAsia="en-GB"/>
+              </w:rPr>
+            </w:pPr>
+            <w:r>
+              <w:rPr>
+                <w:lang w:val="en-GB" w:eastAsia="en-GB"/>
+              </w:rPr>
+              <w:t>FP</w:t>
+            </w:r>
+          </w:p>
+        </w:tc>
+        <w:tc>
+          <w:tcPr>
+            <w:tcW w:w="4460" w:type="dxa"/>
+            <w:vAlign w:val="center"/>
+          </w:tcPr>
+          <w:p>
+            <w:pPr>
+              <w:rPr>
+                <w:lang w:val="en-GB" w:eastAsia="en-GB"/>
+              </w:rPr>
+            </w:pPr>
+            <w:r>
+              <w:rPr>
+                <w:lang w:val="en-GB" w:eastAsia="en-GB"/>
+              </w:rPr>
+              <w:t>False Positives</w:t>
+            </w:r>
+          </w:p>
+        </w:tc>
+      </w:tr>
+      <w:tr>
+        <w:trPr>
+          <w:trHeight w:val="454"/>
+        </w:trPr>
+        <w:tc>
+          <w:tcPr>
+            <w:tcW w:w="4459" w:type="dxa"/>
+            <w:vAlign w:val="center"/>
+          </w:tcPr>
+          <w:p>
+            <w:pPr>
+              <w:rPr>
+                <w:lang w:val="en-GB" w:eastAsia="en-GB"/>
+              </w:rPr>
+            </w:pPr>
+            <w:r>
+              <w:rPr>
+                <w:lang w:val="en-GB" w:eastAsia="en-GB"/>
+              </w:rPr>
+              <w:t>FN</w:t>
+            </w:r>
+          </w:p>
+        </w:tc>
+        <w:tc>
+          <w:tcPr>
+            <w:tcW w:w="4460" w:type="dxa"/>
+            <w:vAlign w:val="center"/>
+          </w:tcPr>
+          <w:p>
+            <w:pPr>
+              <w:rPr>
+                <w:lang w:val="en-GB" w:eastAsia="en-GB"/>
+              </w:rPr>
+            </w:pPr>
+            <w:r>
+              <w:rPr>
+                <w:lang w:val="en-GB" w:eastAsia="en-GB"/>
+              </w:rPr>
+              <w:t>False Negatives</w:t>
+            </w:r>
+          </w:p>
+        </w:tc>
+      </w:tr>
+      <w:tr>
+        <w:trPr>
+          <w:trHeight w:val="454"/>
+        </w:trPr>
+        <w:tc>
+          <w:tcPr>
+            <w:tcW w:w="4459" w:type="dxa"/>
+            <w:vAlign w:val="center"/>
+          </w:tcPr>
+          <w:p>
+            <w:pPr>
+              <w:rPr>
+                <w:lang w:val="en-GB" w:eastAsia="en-GB"/>
+              </w:rPr>
+            </w:pPr>
+            <w:r>
+              <w:rPr>
+                <w:lang w:val="en-GB" w:eastAsia="en-GB"/>
+              </w:rPr>
+              <w:t>HL</w:t>
+            </w:r>
+          </w:p>
+        </w:tc>
+        <w:tc>
+          <w:tcPr>
+            <w:tcW w:w="4460" w:type="dxa"/>
+            <w:vAlign w:val="center"/>
+          </w:tcPr>
+          <w:p>
+            <w:pPr>
+              <w:rPr>
+                <w:b/>
+                <w:bCs/>
+                <w:lang w:val="en-GB" w:eastAsia="en-GB"/>
+              </w:rPr>
+            </w:pPr>
+            <w:r>
+              <w:rPr>
+                <w:lang w:val="en-GB" w:eastAsia="en-GB"/>
+              </w:rPr>
+              <w:t>Hamming Loss</w:t>
+            </w:r>
           </w:p>
         </w:tc>
       </w:tr>
@@ -5803,6 +6028,7 @@
         <w:rPr>
           <w:lang w:val="en-GB" w:eastAsia="en-GB"/>
         </w:rPr>
+        <w:lastRenderedPageBreak/>
         <w:t xml:space="preserve">A key family of enzymes responsible for drug metabolism is the cytochrome P450 (CYP450) superfamily, which processes the majority of marketed drugs. Identifying which CYP450 isoenzymes (i.e., subtypes) are involved in the metabolism of a new molecule is critical, as it can reveal potential </w:t>
       </w:r>
       <w:r>
@@ -5815,14 +6041,7 @@
         <w:rPr>
           <w:lang w:val="en-GB" w:eastAsia="en-GB"/>
         </w:rPr>
-        <w:t xml:space="preserve">. However, this characterization is typically performed only in late preclinical or even clinical stages, when laboratory assays and in vivo studies become feasible. At these advanced stages, uncovering metabolism-related issues can lead to costly setbacks or even termination of a drug candidate, as redesigning its structure is often no longer practical. In early discovery, where many compounds are screened, routine experimental testing of CYP450 </w:t>
-      </w:r>
-      <w:r>
-        <w:rPr>
-          <w:lang w:val="en-GB" w:eastAsia="en-GB"/>
-        </w:rPr>
-        <w:lastRenderedPageBreak/>
-        <w:t>metabolism is rarely performed due to high costs, leaving potential issues undetected until very late in development.</w:t>
+        <w:t>. However, this characterization is typically performed only in late preclinical or even clinical stages, when laboratory assays and in vivo studies become feasible. At these advanced stages, uncovering metabolism-related issues can lead to costly setbacks or even termination of a drug candidate, as redesigning its structure is often no longer practical. In early discovery, where many compounds are screened, routine experimental testing of CYP450 metabolism is rarely performed due to high costs, leaving potential issues undetected until very late in development.</w:t>
       </w:r>
     </w:p>
     <w:p>
@@ -6510,8 +6729,16 @@
         <w:rPr>
           <w:lang w:val="en-GB" w:eastAsia="en-GB"/>
         </w:rPr>
-        <w:t>Academic platforms such as CYPstrate</w:t>
-      </w:r>
+        <w:t xml:space="preserve">Academic platforms such as </w:t>
+      </w:r>
+      <w:proofErr w:type="spellStart"/>
+      <w:r>
+        <w:rPr>
+          <w:lang w:val="en-GB" w:eastAsia="en-GB"/>
+        </w:rPr>
+        <w:t>CYPstrate</w:t>
+      </w:r>
+      <w:proofErr w:type="spellEnd"/>
       <w:r>
         <w:rPr>
           <w:lang w:val="en-GB" w:eastAsia="en-GB"/>
@@ -6546,8 +6773,16 @@
         <w:rPr>
           <w:lang w:val="en-GB" w:eastAsia="en-GB"/>
         </w:rPr>
-        <w:t>, CYPReact</w:t>
-      </w:r>
+        <w:t xml:space="preserve">, </w:t>
+      </w:r>
+      <w:proofErr w:type="spellStart"/>
+      <w:r>
+        <w:rPr>
+          <w:lang w:val="en-GB" w:eastAsia="en-GB"/>
+        </w:rPr>
+        <w:t>CYPReact</w:t>
+      </w:r>
+      <w:proofErr w:type="spellEnd"/>
       <w:r>
         <w:rPr>
           <w:lang w:val="en-GB" w:eastAsia="en-GB"/>
@@ -6618,7 +6853,21 @@
         <w:rPr>
           <w:lang w:val="en-GB" w:eastAsia="en-GB"/>
         </w:rPr>
-        <w:t xml:space="preserve">, and the metabolism modules of ADMETlab 3.0 </w:t>
+        <w:t xml:space="preserve">, and the metabolism modules of </w:t>
+      </w:r>
+      <w:proofErr w:type="spellStart"/>
+      <w:r>
+        <w:rPr>
+          <w:lang w:val="en-GB" w:eastAsia="en-GB"/>
+        </w:rPr>
+        <w:t>ADMETlab</w:t>
+      </w:r>
+      <w:proofErr w:type="spellEnd"/>
+      <w:r>
+        <w:rPr>
+          <w:lang w:val="en-GB" w:eastAsia="en-GB"/>
+        </w:rPr>
+        <w:t xml:space="preserve"> 3.0 </w:t>
       </w:r>
       <w:sdt>
         <w:sdtPr>
@@ -6852,8 +7101,16 @@
         <w:rPr>
           <w:lang w:val="en-GB" w:eastAsia="en-GB"/>
         </w:rPr>
-        <w:t>, proposed in 2018, which adapts natural language processing techniques to chemistry by treating molecular substructures as “words” and learning continuous vector representations using a Word2Vec-style framework. Mol2Vec demonstrated that unsupervised embeddings derived from molecular fragments could capture chemical similarity and improve performance over traditional fingerprints in some predictive tasks. More recently, advances in deep learning have led to transformer-based language models for chemistry, such as ChemBERTa</w:t>
-      </w:r>
+        <w:t xml:space="preserve">, proposed in 2018, which adapts natural language processing techniques to chemistry by treating molecular substructures as “words” and learning continuous vector representations using a Word2Vec-style framework. Mol2Vec demonstrated that unsupervised embeddings derived from molecular fragments could capture chemical similarity and improve performance over traditional fingerprints in some predictive tasks. More recently, advances in deep learning have led to transformer-based language models for chemistry, such as </w:t>
+      </w:r>
+      <w:proofErr w:type="spellStart"/>
+      <w:r>
+        <w:rPr>
+          <w:lang w:val="en-GB" w:eastAsia="en-GB"/>
+        </w:rPr>
+        <w:t>ChemBERTa</w:t>
+      </w:r>
+      <w:proofErr w:type="spellEnd"/>
       <w:r>
         <w:rPr>
           <w:lang w:val="en-GB" w:eastAsia="en-GB"/>
@@ -6888,8 +7145,16 @@
         <w:rPr>
           <w:lang w:val="en-GB" w:eastAsia="en-GB"/>
         </w:rPr>
-        <w:t>, which learn contextualized embeddings directly from SMILES strings and offer substantially higher representational capacity. In parallel, large-scale industrial efforts have produced highly optimized pretrained models such as MolE</w:t>
-      </w:r>
+        <w:t xml:space="preserve">, which learn contextualized embeddings directly from SMILES strings and offer substantially higher representational capacity. In parallel, large-scale industrial efforts have produced highly optimized pretrained models such as </w:t>
+      </w:r>
+      <w:proofErr w:type="spellStart"/>
+      <w:r>
+        <w:rPr>
+          <w:lang w:val="en-GB" w:eastAsia="en-GB"/>
+        </w:rPr>
+        <w:t>MolE</w:t>
+      </w:r>
+      <w:proofErr w:type="spellEnd"/>
       <w:r>
         <w:rPr>
           <w:lang w:val="en-GB" w:eastAsia="en-GB"/>
@@ -7680,6 +7945,7 @@
         </w:rPr>
         <w:t xml:space="preserve">For the broader cheminformatics workflow, </w:t>
       </w:r>
+      <w:proofErr w:type="spellStart"/>
       <w:r>
         <w:rPr>
           <w:b/>
@@ -7688,6 +7954,7 @@
         </w:rPr>
         <w:t>RDKit</w:t>
       </w:r>
+      <w:proofErr w:type="spellEnd"/>
       <w:r>
         <w:rPr>
           <w:b/>
@@ -8837,16 +9104,19 @@
       <w:pPr>
         <w:keepNext/>
         <w:jc w:val="both"/>
-      </w:pPr>
-      <w:r>
-        <w:rPr>
-          <w:noProof/>
+        <w:rPr>
+          <w:lang w:val="en-GB"/>
+        </w:rPr>
+      </w:pPr>
+      <w:r>
+        <w:rPr>
+          <w:lang w:val="en-GB"/>
         </w:rPr>
         <w:drawing>
-          <wp:inline distT="0" distB="0" distL="0" distR="0" wp14:anchorId="67CABC7F" wp14:editId="0F691490">
+          <wp:inline distT="0" distB="0" distL="0" distR="0" wp14:anchorId="6ED2540E" wp14:editId="79313FFB">
             <wp:extent cx="5669915" cy="3187700"/>
             <wp:effectExtent l="0" t="0" r="6985" b="0"/>
-            <wp:docPr id="524568271" name="Picture 1"/>
+            <wp:docPr id="751945961" name="Picture 1"/>
             <wp:cNvGraphicFramePr>
               <a:graphicFrameLocks xmlns:a="http://schemas.openxmlformats.org/drawingml/2006/main" noChangeAspect="1"/>
             </wp:cNvGraphicFramePr>
@@ -8854,7 +9124,7 @@
               <a:graphicData uri="http://schemas.openxmlformats.org/drawingml/2006/picture">
                 <pic:pic xmlns:pic="http://schemas.openxmlformats.org/drawingml/2006/picture">
                   <pic:nvPicPr>
-                    <pic:cNvPr id="524568271" name=""/>
+                    <pic:cNvPr id="751945961" name=""/>
                     <pic:cNvPicPr/>
                   </pic:nvPicPr>
                   <pic:blipFill>
@@ -9387,6 +9657,7 @@
       <w:pPr>
         <w:jc w:val="both"/>
         <w:rPr>
+          <w:color w:val="EE0000"/>
           <w:lang w:val="en-GB"/>
         </w:rPr>
       </w:pPr>
@@ -9470,11 +9741,47 @@
         </w:rPr>
         <w:t xml:space="preserve">Performance was assessed through… </w:t>
       </w:r>
-      <w:r>
-        <w:rPr>
-          <w:lang w:val="en-GB"/>
-        </w:rPr>
-        <w:t>By evaluating both MolE and ChemBERTa alongside Morgan fingerprints, this work attempts to assess whether increasingly expressive representation strategies translate into improved predictive performance for CYP450 metabolism.</w:t>
+    </w:p>
+    <w:p>
+      <w:pPr>
+        <w:jc w:val="both"/>
+        <w:rPr>
+          <w:lang w:val="en-GB"/>
+        </w:rPr>
+      </w:pPr>
+      <w:r>
+        <w:rPr>
+          <w:lang w:val="en-GB"/>
+        </w:rPr>
+        <w:t xml:space="preserve">By evaluating both </w:t>
+      </w:r>
+      <w:proofErr w:type="spellStart"/>
+      <w:r>
+        <w:rPr>
+          <w:lang w:val="en-GB"/>
+        </w:rPr>
+        <w:t>MolE</w:t>
+      </w:r>
+      <w:proofErr w:type="spellEnd"/>
+      <w:r>
+        <w:rPr>
+          <w:lang w:val="en-GB"/>
+        </w:rPr>
+        <w:t xml:space="preserve"> and </w:t>
+      </w:r>
+      <w:proofErr w:type="spellStart"/>
+      <w:r>
+        <w:rPr>
+          <w:lang w:val="en-GB"/>
+        </w:rPr>
+        <w:t>ChemBERTa</w:t>
+      </w:r>
+      <w:proofErr w:type="spellEnd"/>
+      <w:r>
+        <w:rPr>
+          <w:lang w:val="en-GB"/>
+        </w:rPr>
+        <w:t xml:space="preserve"> alongside Morgan fingerprints, this work attempts to assess whether increasingly expressive representation strategies translate into improved predictive performance for CYP450 metabolism.</w:t>
       </w:r>
     </w:p>
     <w:p>
@@ -9566,14 +9873,14 @@
         <w:rPr>
           <w:lang w:val="en-GB"/>
         </w:rPr>
-        <w:t xml:space="preserve">e SMILES is practical and widely adopted, it is not a canonical encoding by default and can admit multiple valid strings for the same molecule. In contrast, InChI provides a standardized, hierarchical, </w:t>
+        <w:t xml:space="preserve">e SMILES is practical and widely adopted, it is not a canonical encoding by default and can admit </w:t>
       </w:r>
       <w:r>
         <w:rPr>
           <w:lang w:val="en-GB"/>
         </w:rPr>
         <w:lastRenderedPageBreak/>
-        <w:t>and deterministic representation designed to uniquely describe molecular connectivity an</w:t>
+        <w:t>multiple valid strings for the same molecule. In contrast, InChI provides a standardized, hierarchical, and deterministic representation designed to uniquely describe molecular connectivity an</w:t>
       </w:r>
       <w:r>
         <w:rPr>
@@ -9756,7 +10063,21 @@
         <w:rPr>
           <w:lang w:val="en-GB"/>
         </w:rPr>
-        <w:t xml:space="preserve"> a RoBERTa-style architecture</w:t>
+        <w:t xml:space="preserve"> a </w:t>
+      </w:r>
+      <w:proofErr w:type="spellStart"/>
+      <w:r>
+        <w:rPr>
+          <w:lang w:val="en-GB"/>
+        </w:rPr>
+        <w:t>RoBERTa</w:t>
+      </w:r>
+      <w:proofErr w:type="spellEnd"/>
+      <w:r>
+        <w:rPr>
+          <w:lang w:val="en-GB"/>
+        </w:rPr>
+        <w:t>-style architecture</w:t>
       </w:r>
       <w:r>
         <w:rPr>
@@ -10166,6 +10487,7 @@
         <w:rPr>
           <w:lang w:val="en-GB"/>
         </w:rPr>
+        <w:lastRenderedPageBreak/>
         <w:t xml:space="preserve">The architectural scale and number of training epochs were not selected to maximize language </w:t>
       </w:r>
       <w:r>
@@ -10178,14 +10500,7 @@
         <w:rPr>
           <w:lang w:val="en-GB"/>
         </w:rPr>
-        <w:t xml:space="preserve"> performance, but to obtain a structurally meaningful encoder within the practical time and </w:t>
-      </w:r>
-      <w:r>
-        <w:rPr>
-          <w:lang w:val="en-GB"/>
-        </w:rPr>
-        <w:lastRenderedPageBreak/>
-        <w:t>hardware constraints of the project. Consequently, this model should be interpreted as a lightweight, domain-specific pretraining experiment rather than a large-scale foundation model comparable to industrial pretrained systems.</w:t>
+        <w:t xml:space="preserve"> performance, but to obtain a structurally meaningful encoder within the practical time and hardware constraints of the project. Consequently, this model should be interpreted as a lightweight, domain-specific pretraining experiment rather than a large-scale foundation model comparable to industrial pretrained systems.</w:t>
       </w:r>
     </w:p>
     <w:p>
@@ -10537,11 +10852,19 @@
           <w:lang w:val="en-GB"/>
         </w:rPr>
       </w:pPr>
+      <w:bookmarkStart w:id="22" w:name="_Toc227188996"/>
       <w:r>
         <w:rPr>
           <w:color w:val="EE0000"/>
           <w:lang w:val="en-GB"/>
         </w:rPr>
+        <w:t xml:space="preserve">Problem definition: </w:t>
+      </w:r>
+      <w:r>
+        <w:rPr>
+          <w:color w:val="EE0000"/>
+          <w:lang w:val="en-GB"/>
+        </w:rPr>
         <w:t>Multi-label classification</w:t>
       </w:r>
     </w:p>
@@ -10557,11 +10880,204 @@
           <w:color w:val="EE0000"/>
           <w:lang w:val="en-GB"/>
         </w:rPr>
+        <w:lastRenderedPageBreak/>
         <w:t>Algorithms evaluated</w:t>
       </w:r>
     </w:p>
     <w:p>
       <w:pPr>
+        <w:pStyle w:val="Heading3"/>
+        <w:jc w:val="both"/>
+        <w:rPr>
+          <w:lang w:val="en-GB"/>
+        </w:rPr>
+      </w:pPr>
+      <w:r>
+        <w:rPr>
+          <w:lang w:val="en-GB"/>
+        </w:rPr>
+        <w:t>Model evaluation</w:t>
+      </w:r>
+    </w:p>
+    <w:p>
+      <w:pPr>
+        <w:jc w:val="both"/>
+        <w:rPr>
+          <w:lang w:val="en-GB"/>
+        </w:rPr>
+      </w:pPr>
+      <w:r>
+        <w:rPr>
+          <w:lang w:val="en-GB"/>
+        </w:rPr>
+        <w:t>A rigorous evaluation framework is essential for comparing molecular representations and for diagnosing model behaviour across CYP isoforms with widely different frequencies. Given the multi</w:t>
+      </w:r>
+      <w:r>
+        <w:rPr>
+          <w:rFonts w:ascii="Cambria Math" w:hAnsi="Cambria Math" w:cs="Cambria Math"/>
+          <w:lang w:val="en-GB"/>
+        </w:rPr>
+        <w:t>-</w:t>
+      </w:r>
+      <w:r>
+        <w:rPr>
+          <w:lang w:val="en-GB"/>
+        </w:rPr>
+        <w:t>label nature of the task and the severe imbalance between common and rare enzymes, standard classification metrics such as accuracy or per</w:t>
+      </w:r>
+      <w:r>
+        <w:rPr>
+          <w:rFonts w:ascii="Cambria Math" w:hAnsi="Cambria Math" w:cs="Cambria Math"/>
+          <w:lang w:val="en-GB"/>
+        </w:rPr>
+        <w:t>-</w:t>
+      </w:r>
+      <w:r>
+        <w:rPr>
+          <w:lang w:val="en-GB"/>
+        </w:rPr>
+        <w:t xml:space="preserve">class precision are insufficient. </w:t>
+      </w:r>
+      <w:r>
+        <w:rPr>
+          <w:lang w:val="en-GB"/>
+        </w:rPr>
+        <w:t>For this reason, other more complete metrics were selected to evaluate and allow model comparability.</w:t>
+      </w:r>
+    </w:p>
+    <w:p>
+      <w:pPr>
+        <w:pStyle w:val="Heading4"/>
+        <w:jc w:val="both"/>
+        <w:rPr>
+          <w:lang w:val="en-GB"/>
+        </w:rPr>
+      </w:pPr>
+      <w:r>
+        <w:rPr>
+          <w:lang w:val="en-GB"/>
+        </w:rPr>
+        <w:t>Primary Metric: Mean Matthews Correlation Coefficient (mean MCC)</w:t>
+      </w:r>
+    </w:p>
+    <w:p>
+      <w:pPr>
+        <w:jc w:val="both"/>
+        <w:rPr>
+          <w:lang w:val="en-GB"/>
+        </w:rPr>
+      </w:pPr>
+      <w:r>
+        <w:rPr>
+          <w:lang w:val="en-GB"/>
+        </w:rPr>
+        <w:t xml:space="preserve">The Matthews Correlation Coefficient (MCC) measures the quality of binary classifications by </w:t>
+      </w:r>
+      <w:proofErr w:type="gramStart"/>
+      <w:r>
+        <w:rPr>
+          <w:lang w:val="en-GB"/>
+        </w:rPr>
+        <w:t>taking into account</w:t>
+      </w:r>
+      <w:proofErr w:type="gramEnd"/>
+      <w:r>
+        <w:rPr>
+          <w:lang w:val="en-GB"/>
+        </w:rPr>
+        <w:t xml:space="preserve"> all four entries of the confusion matrix: true positives (TP), true negatives (TN), false positives (FP) and false negatives (FN). For a single CYP isoform, MCC is defined as</w:t>
+      </w:r>
+    </w:p>
+    <w:p>
+      <w:pPr>
+        <w:jc w:val="center"/>
+        <w:rPr>
+          <w:lang w:val="en-GB"/>
+        </w:rPr>
+      </w:pPr>
+      <w:r>
+        <w:rPr>
+          <w:lang w:val="en-GB"/>
+        </w:rPr>
+        <w:t>​</w:t>
+      </w:r>
+      <m:oMath>
+        <m:r>
+          <w:rPr>
+            <w:rFonts w:ascii="Cambria Math" w:hAnsi="Cambria Math"/>
+            <w:lang w:val="en-GB"/>
+          </w:rPr>
+          <m:t xml:space="preserve">MCC= </m:t>
+        </m:r>
+        <m:f>
+          <m:fPr>
+            <m:ctrlPr>
+              <w:rPr>
+                <w:rFonts w:ascii="Cambria Math" w:hAnsi="Cambria Math"/>
+                <w:i/>
+                <w:lang w:val="en-GB"/>
+              </w:rPr>
+            </m:ctrlPr>
+          </m:fPr>
+          <m:num>
+            <m:r>
+              <w:rPr>
+                <w:rFonts w:ascii="Cambria Math" w:hAnsi="Cambria Math"/>
+                <w:lang w:val="en-GB"/>
+              </w:rPr>
+              <m:t>TP × TN - FP × FN</m:t>
+            </m:r>
+          </m:num>
+          <m:den>
+            <m:rad>
+              <m:radPr>
+                <m:degHide m:val="1"/>
+                <m:ctrlPr>
+                  <w:rPr>
+                    <w:rFonts w:ascii="Cambria Math" w:hAnsi="Cambria Math"/>
+                    <w:i/>
+                    <w:lang w:val="en-GB"/>
+                  </w:rPr>
+                </m:ctrlPr>
+              </m:radPr>
+              <m:deg/>
+              <m:e>
+                <m:d>
+                  <m:dPr>
+                    <m:ctrlPr>
+                      <w:rPr>
+                        <w:rFonts w:ascii="Cambria Math" w:hAnsi="Cambria Math"/>
+                        <w:i/>
+                        <w:lang w:val="en-GB"/>
+                      </w:rPr>
+                    </m:ctrlPr>
+                  </m:dPr>
+                  <m:e>
+                    <m:r>
+                      <w:rPr>
+                        <w:rFonts w:ascii="Cambria Math" w:hAnsi="Cambria Math"/>
+                        <w:lang w:val="en-GB"/>
+                      </w:rPr>
+                      <m:t>TP+TN</m:t>
+                    </m:r>
+                  </m:e>
+                </m:d>
+                <m:r>
+                  <w:rPr>
+                    <w:rFonts w:ascii="Cambria Math" w:hAnsi="Cambria Math"/>
+                    <w:lang w:val="en-GB"/>
+                  </w:rPr>
+                  <m:t>(TP+FN)(TN+FP)(TN+FN)</m:t>
+                </m:r>
+              </m:e>
+            </m:rad>
+          </m:den>
+        </m:f>
+      </m:oMath>
+    </w:p>
+    <w:p>
+      <w:pPr>
+        <w:jc w:val="both"/>
         <w:rPr>
           <w:color w:val="EE0000"/>
           <w:lang w:val="en-GB"/>
@@ -10569,24 +11085,1356 @@
       </w:pPr>
       <w:r>
         <w:rPr>
+          <w:lang w:val="en-GB"/>
+        </w:rPr>
+        <w:t>and ranges from –1 (complete disagreement) through 0 (no better than random) to +1 (perfect prediction). Because MCC incorporates true negatives, it remains informative even when the positive class is rare, a regime where metrics based solely on precision and recall</w:t>
+      </w:r>
+      <w:r>
+        <w:rPr>
+          <w:lang w:val="en-GB"/>
+        </w:rPr>
+        <w:t xml:space="preserve"> (like F1)</w:t>
+      </w:r>
+      <w:r>
+        <w:rPr>
+          <w:lang w:val="en-GB"/>
+        </w:rPr>
+        <w:t xml:space="preserve"> can become unstable or misleading.</w:t>
+      </w:r>
+      <w:r>
+        <w:rPr>
+          <w:lang w:val="en-GB"/>
+        </w:rPr>
+        <w:t xml:space="preserve"> </w:t>
+      </w:r>
+      <w:sdt>
+        <w:sdtPr>
+          <w:rPr>
+            <w:rFonts w:ascii="Calibri" w:hAnsi="Calibri" w:cs="Calibri"/>
+            <w:color w:val="000000"/>
+            <w:lang w:val="en-GB"/>
+          </w:rPr>
+          <w:tag w:val="MENDELEY_CITATION_v3_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"/>
+          <w:id w:val="-1454706480"/>
+          <w:placeholder>
+            <w:docPart w:val="DefaultPlaceholder_-1854013440"/>
+          </w:placeholder>
+        </w:sdtPr>
+        <w:sdtContent>
+          <w:r>
+            <w:rPr>
+              <w:rFonts w:ascii="Calibri" w:hAnsi="Calibri" w:cs="Calibri"/>
+              <w:color w:val="000000"/>
+              <w:lang w:val="en-GB"/>
+            </w:rPr>
+            <w:t>[23]</w:t>
+          </w:r>
+        </w:sdtContent>
+      </w:sdt>
+    </w:p>
+    <w:p>
+      <w:pPr>
+        <w:jc w:val="both"/>
+        <w:rPr>
+          <w:lang w:val="en-GB"/>
+        </w:rPr>
+      </w:pPr>
+      <w:r>
+        <w:rPr>
+          <w:lang w:val="en-GB"/>
+        </w:rPr>
+        <w:t>To obtain a single performance score across all CYP isoforms, the per</w:t>
+      </w:r>
+      <w:r>
+        <w:rPr>
+          <w:lang w:val="en-GB"/>
+        </w:rPr>
+        <w:t>-</w:t>
+      </w:r>
+      <w:r>
+        <w:rPr>
+          <w:lang w:val="en-GB"/>
+        </w:rPr>
+        <w:t xml:space="preserve">enzyme MCC values are averaged. The resulting quantity, referred to as the </w:t>
+      </w:r>
+      <w:r>
+        <w:rPr>
+          <w:lang w:val="en-GB"/>
+        </w:rPr>
+        <w:t>macro</w:t>
+      </w:r>
+      <w:r>
+        <w:rPr>
+          <w:lang w:val="en-GB"/>
+        </w:rPr>
+        <w:t xml:space="preserve"> MCC treats each CYP enzyme equally regardless of how many molecules are substrates of that enzyme. This ensures that excellent performance on a highly frequent isoform such as CYP3A4 does not mask poor performance on a rarer isoform such as </w:t>
+      </w:r>
+      <w:r>
+        <w:rPr>
           <w:color w:val="EE0000"/>
           <w:lang w:val="en-GB"/>
         </w:rPr>
+        <w:t>CYP2B6</w:t>
+      </w:r>
+      <w:r>
+        <w:rPr>
+          <w:lang w:val="en-GB"/>
+        </w:rPr>
+        <w:t>. M</w:t>
+      </w:r>
+      <w:r>
+        <w:rPr>
+          <w:lang w:val="en-GB"/>
+        </w:rPr>
+        <w:t>acro</w:t>
+      </w:r>
+      <w:r>
+        <w:rPr>
+          <w:lang w:val="en-GB"/>
+        </w:rPr>
+        <w:t xml:space="preserve"> MCC serves as the primary metric for two critical tasks: comparing molecular representations (ECFP6, </w:t>
+      </w:r>
+      <w:proofErr w:type="spellStart"/>
+      <w:r>
+        <w:rPr>
+          <w:lang w:val="en-GB"/>
+        </w:rPr>
+        <w:t>MolE</w:t>
+      </w:r>
+      <w:proofErr w:type="spellEnd"/>
+      <w:r>
+        <w:rPr>
+          <w:lang w:val="en-GB"/>
+        </w:rPr>
+        <w:t xml:space="preserve">, </w:t>
+      </w:r>
+      <w:proofErr w:type="spellStart"/>
+      <w:r>
+        <w:rPr>
+          <w:lang w:val="en-GB"/>
+        </w:rPr>
+        <w:t>ChemBERTa</w:t>
+      </w:r>
+      <w:proofErr w:type="spellEnd"/>
+      <w:r>
+        <w:rPr>
+          <w:lang w:val="en-GB"/>
+        </w:rPr>
+        <w:t>, and the exploratory InChI encoder) and selecting hyperparameters. During cross</w:t>
+      </w:r>
+      <w:r>
+        <w:rPr>
+          <w:rFonts w:ascii="Cambria Math" w:hAnsi="Cambria Math" w:cs="Cambria Math"/>
+          <w:lang w:val="en-GB"/>
+        </w:rPr>
+        <w:t>-</w:t>
+      </w:r>
+      <w:r>
+        <w:rPr>
+          <w:lang w:val="en-GB"/>
+        </w:rPr>
+        <w:t>validation</w:t>
+      </w:r>
+      <w:r>
+        <w:rPr>
+          <w:lang w:val="en-GB"/>
+        </w:rPr>
+        <w:t xml:space="preserve"> (CV)</w:t>
+      </w:r>
+      <w:r>
+        <w:rPr>
+          <w:lang w:val="en-GB"/>
+        </w:rPr>
+        <w:t xml:space="preserve"> on the development set, hyperparameter configurations are chosen based on the m</w:t>
+      </w:r>
+      <w:r>
+        <w:rPr>
+          <w:lang w:val="en-GB"/>
+        </w:rPr>
+        <w:t>acro</w:t>
+      </w:r>
+      <w:r>
+        <w:rPr>
+          <w:lang w:val="en-GB"/>
+        </w:rPr>
+        <w:t xml:space="preserve"> MCC averaged over validation folds, guaranteeing that tuning benefits all CYP isoforms jointly rather than favouring majority classes.</w:t>
+      </w:r>
+      <w:r>
+        <w:rPr>
+          <w:lang w:val="en-GB"/>
+        </w:rPr>
+        <w:t xml:space="preserve"> </w:t>
+      </w:r>
+    </w:p>
+    <w:p>
+      <w:pPr>
+        <w:pStyle w:val="Heading4"/>
+        <w:rPr>
+          <w:lang w:val="en-GB"/>
+        </w:rPr>
+      </w:pPr>
+      <w:r>
+        <w:rPr>
+          <w:lang w:val="en-GB"/>
+        </w:rPr>
+        <w:t>Secondary Metric: Micro</w:t>
+      </w:r>
+      <w:r>
+        <w:rPr>
+          <w:lang w:val="en-GB"/>
+        </w:rPr>
+        <w:t>-</w:t>
+      </w:r>
+      <w:r>
+        <w:rPr>
+          <w:lang w:val="en-GB"/>
+        </w:rPr>
+        <w:t>F1</w:t>
+      </w:r>
+    </w:p>
+    <w:p>
+      <w:pPr>
+        <w:jc w:val="both"/>
+        <w:rPr>
+          <w:lang w:val="en-GB"/>
+        </w:rPr>
+      </w:pPr>
+      <w:r>
+        <w:rPr>
+          <w:lang w:val="en-GB"/>
+        </w:rPr>
+        <w:t>While mean MCC provides a balanced view across enzymes, it is also useful to assess performance at the level of individual predictions. Micro</w:t>
+      </w:r>
+      <w:r>
+        <w:rPr>
+          <w:rFonts w:ascii="Cambria Math" w:hAnsi="Cambria Math" w:cs="Cambria Math"/>
+          <w:lang w:val="en-GB"/>
+        </w:rPr>
+        <w:t>-</w:t>
+      </w:r>
+      <w:r>
+        <w:rPr>
+          <w:lang w:val="en-GB"/>
+        </w:rPr>
+        <w:t>F1 aggregates all TP, FP and FN across all CYP isoforms and all test molecules before computing a single F1 score:</w:t>
+      </w:r>
+    </w:p>
+    <w:p>
+      <w:pPr>
+        <w:jc w:val="both"/>
+        <w:rPr>
+          <w:lang w:val="en-GB"/>
+        </w:rPr>
+      </w:pPr>
+      <m:oMathPara>
+        <m:oMath>
+          <m:r>
+            <w:rPr>
+              <w:rFonts w:ascii="Cambria Math" w:hAnsi="Cambria Math"/>
+              <w:lang w:val="en-GB"/>
+            </w:rPr>
+            <m:t>Micro</m:t>
+          </m:r>
+          <m:r>
+            <w:rPr>
+              <w:rFonts w:ascii="Cambria Math" w:hAnsi="Cambria Math"/>
+              <w:lang w:val="en-GB"/>
+            </w:rPr>
+            <m:t xml:space="preserve"> </m:t>
+          </m:r>
+          <m:r>
+            <w:rPr>
+              <w:rFonts w:ascii="Cambria Math" w:hAnsi="Cambria Math"/>
+              <w:lang w:val="en-GB"/>
+            </w:rPr>
+            <m:t>F1=</m:t>
+          </m:r>
+          <m:f>
+            <m:fPr>
+              <m:ctrlPr>
+                <w:rPr>
+                  <w:rFonts w:ascii="Cambria Math" w:hAnsi="Cambria Math"/>
+                  <w:i/>
+                  <w:lang w:val="en-GB"/>
+                </w:rPr>
+              </m:ctrlPr>
+            </m:fPr>
+            <m:num>
+              <m:r>
+                <w:rPr>
+                  <w:rFonts w:ascii="Cambria Math" w:hAnsi="Cambria Math"/>
+                  <w:lang w:val="en-GB"/>
+                </w:rPr>
+                <m:t xml:space="preserve">2 × </m:t>
+              </m:r>
+              <m:nary>
+                <m:naryPr>
+                  <m:chr m:val="∑"/>
+                  <m:limLoc m:val="undOvr"/>
+                  <m:subHide m:val="1"/>
+                  <m:supHide m:val="1"/>
+                  <m:ctrlPr>
+                    <w:rPr>
+                      <w:rFonts w:ascii="Cambria Math" w:hAnsi="Cambria Math"/>
+                      <w:i/>
+                      <w:lang w:val="en-GB"/>
+                    </w:rPr>
+                  </m:ctrlPr>
+                </m:naryPr>
+                <m:sub/>
+                <m:sup/>
+                <m:e>
+                  <m:r>
+                    <w:rPr>
+                      <w:rFonts w:ascii="Cambria Math" w:hAnsi="Cambria Math"/>
+                      <w:lang w:val="en-GB"/>
+                    </w:rPr>
+                    <m:t>TP</m:t>
+                  </m:r>
+                </m:e>
+              </m:nary>
+            </m:num>
+            <m:den>
+              <m:r>
+                <w:rPr>
+                  <w:rFonts w:ascii="Cambria Math" w:hAnsi="Cambria Math"/>
+                  <w:lang w:val="en-GB"/>
+                </w:rPr>
+                <m:t xml:space="preserve">2 × </m:t>
+              </m:r>
+              <m:nary>
+                <m:naryPr>
+                  <m:chr m:val="∑"/>
+                  <m:limLoc m:val="undOvr"/>
+                  <m:subHide m:val="1"/>
+                  <m:supHide m:val="1"/>
+                  <m:ctrlPr>
+                    <w:rPr>
+                      <w:rFonts w:ascii="Cambria Math" w:hAnsi="Cambria Math"/>
+                      <w:i/>
+                      <w:lang w:val="en-GB"/>
+                    </w:rPr>
+                  </m:ctrlPr>
+                </m:naryPr>
+                <m:sub/>
+                <m:sup/>
+                <m:e>
+                  <m:r>
+                    <w:rPr>
+                      <w:rFonts w:ascii="Cambria Math" w:hAnsi="Cambria Math"/>
+                      <w:lang w:val="en-GB"/>
+                    </w:rPr>
+                    <m:t>TP</m:t>
+                  </m:r>
+                </m:e>
+              </m:nary>
+              <m:r>
+                <w:rPr>
+                  <w:rFonts w:ascii="Cambria Math" w:hAnsi="Cambria Math"/>
+                  <w:lang w:val="en-GB"/>
+                </w:rPr>
+                <m:t xml:space="preserve">+ </m:t>
+              </m:r>
+              <m:nary>
+                <m:naryPr>
+                  <m:chr m:val="∑"/>
+                  <m:limLoc m:val="undOvr"/>
+                  <m:subHide m:val="1"/>
+                  <m:supHide m:val="1"/>
+                  <m:ctrlPr>
+                    <w:rPr>
+                      <w:rFonts w:ascii="Cambria Math" w:hAnsi="Cambria Math"/>
+                      <w:i/>
+                      <w:lang w:val="en-GB"/>
+                    </w:rPr>
+                  </m:ctrlPr>
+                </m:naryPr>
+                <m:sub/>
+                <m:sup/>
+                <m:e>
+                  <m:r>
+                    <w:rPr>
+                      <w:rFonts w:ascii="Cambria Math" w:hAnsi="Cambria Math"/>
+                      <w:lang w:val="en-GB"/>
+                    </w:rPr>
+                    <m:t>FP</m:t>
+                  </m:r>
+                </m:e>
+              </m:nary>
+              <m:r>
+                <w:rPr>
+                  <w:rFonts w:ascii="Cambria Math" w:hAnsi="Cambria Math"/>
+                  <w:lang w:val="en-GB"/>
+                </w:rPr>
+                <m:t xml:space="preserve">+ </m:t>
+              </m:r>
+              <m:nary>
+                <m:naryPr>
+                  <m:chr m:val="∑"/>
+                  <m:limLoc m:val="undOvr"/>
+                  <m:subHide m:val="1"/>
+                  <m:supHide m:val="1"/>
+                  <m:ctrlPr>
+                    <w:rPr>
+                      <w:rFonts w:ascii="Cambria Math" w:hAnsi="Cambria Math"/>
+                      <w:i/>
+                      <w:lang w:val="en-GB"/>
+                    </w:rPr>
+                  </m:ctrlPr>
+                </m:naryPr>
+                <m:sub/>
+                <m:sup/>
+                <m:e>
+                  <m:r>
+                    <w:rPr>
+                      <w:rFonts w:ascii="Cambria Math" w:hAnsi="Cambria Math"/>
+                      <w:lang w:val="en-GB"/>
+                    </w:rPr>
+                    <m:t>FN</m:t>
+                  </m:r>
+                </m:e>
+              </m:nary>
+              <m:r>
+                <w:rPr>
+                  <w:rFonts w:ascii="Cambria Math" w:hAnsi="Cambria Math"/>
+                  <w:lang w:val="en-GB"/>
+                </w:rPr>
+                <m:t xml:space="preserve"> </m:t>
+              </m:r>
+            </m:den>
+          </m:f>
+        </m:oMath>
+      </m:oMathPara>
+    </w:p>
+    <w:p>
+      <w:pPr>
+        <w:jc w:val="both"/>
+        <w:rPr>
+          <w:lang w:val="en-GB"/>
+        </w:rPr>
+      </w:pPr>
+      <w:r>
+        <w:rPr>
+          <w:lang w:val="en-GB"/>
+        </w:rPr>
+        <w:t>Micro</w:t>
+      </w:r>
+      <w:r>
+        <w:rPr>
+          <w:lang w:val="en-GB"/>
+        </w:rPr>
+        <w:noBreakHyphen/>
+        <w:t>F1 is dominated by the most frequent enzymes because they contribute the largest number of predictions. It answers a complementary question to mean MCC, namely how well the model performs on the typical prediction task weighted by how often each CYP appears. Micro</w:t>
+      </w:r>
+      <w:r>
+        <w:rPr>
+          <w:lang w:val="en-GB"/>
+        </w:rPr>
+        <w:noBreakHyphen/>
+        <w:t>F1 is reported as a secondary metric in the main comparison table. It is not used for hyperparameter optimisation or for ranking representations, but it helps characterise model behaviour from a per</w:t>
+      </w:r>
+      <w:r>
+        <w:rPr>
+          <w:lang w:val="en-GB"/>
+        </w:rPr>
+        <w:t>-</w:t>
+      </w:r>
+      <w:r>
+        <w:rPr>
+          <w:lang w:val="en-GB"/>
+        </w:rPr>
+        <w:t>prediction perspective.</w:t>
+      </w:r>
+    </w:p>
+    <w:p>
+      <w:pPr>
+        <w:pStyle w:val="Heading4"/>
+        <w:rPr>
+          <w:lang w:val="en-GB"/>
+        </w:rPr>
+      </w:pPr>
+      <w:r>
+        <w:rPr>
+          <w:lang w:val="en-GB"/>
+        </w:rPr>
+        <w:t>Complementary Metric: Hamming Loss</w:t>
+      </w:r>
+    </w:p>
+    <w:p>
+      <w:pPr>
+        <w:jc w:val="both"/>
+        <w:rPr>
+          <w:lang w:val="en-GB"/>
+        </w:rPr>
+      </w:pPr>
+      <w:r>
+        <w:rPr>
+          <w:lang w:val="en-GB"/>
+        </w:rPr>
+        <w:t>Hamming Loss</w:t>
+      </w:r>
+      <w:r>
+        <w:rPr>
+          <w:lang w:val="en-GB"/>
+        </w:rPr>
+        <w:t xml:space="preserve"> (HL)</w:t>
+      </w:r>
+      <w:r>
+        <w:rPr>
+          <w:lang w:val="en-GB"/>
+        </w:rPr>
+        <w:t xml:space="preserve"> measures the fraction of incorrect predictions out of the total number of molecule</w:t>
+      </w:r>
+      <w:r>
+        <w:rPr>
+          <w:rFonts w:ascii="Cambria Math" w:hAnsi="Cambria Math" w:cs="Cambria Math"/>
+          <w:lang w:val="en-GB"/>
+        </w:rPr>
+        <w:t>-</w:t>
+      </w:r>
+      <w:r>
+        <w:rPr>
+          <w:lang w:val="en-GB"/>
+        </w:rPr>
+        <w:t>CYP pairs:</w:t>
+      </w:r>
+    </w:p>
+    <w:p>
+      <w:pPr>
+        <w:jc w:val="both"/>
+        <w:rPr>
+          <w:lang w:val="en-GB"/>
+        </w:rPr>
+      </w:pPr>
+      <m:oMathPara>
+        <m:oMath>
+          <m:r>
+            <w:rPr>
+              <w:rFonts w:ascii="Cambria Math" w:hAnsi="Cambria Math"/>
+              <w:lang w:val="en-GB"/>
+            </w:rPr>
+            <w:lastRenderedPageBreak/>
+            <m:t xml:space="preserve">Hamming Loss= </m:t>
+          </m:r>
+          <m:f>
+            <m:fPr>
+              <m:ctrlPr>
+                <w:rPr>
+                  <w:rFonts w:ascii="Cambria Math" w:hAnsi="Cambria Math"/>
+                  <w:i/>
+                  <w:lang w:val="en-GB"/>
+                </w:rPr>
+              </m:ctrlPr>
+            </m:fPr>
+            <m:num>
+              <m:r>
+                <w:rPr>
+                  <w:rFonts w:ascii="Cambria Math" w:hAnsi="Cambria Math"/>
+                  <w:lang w:val="en-GB"/>
+                </w:rPr>
+                <m:t>1</m:t>
+              </m:r>
+            </m:num>
+            <m:den>
+              <m:r>
+                <w:rPr>
+                  <w:rFonts w:ascii="Cambria Math" w:hAnsi="Cambria Math"/>
+                  <w:lang w:val="en-GB"/>
+                </w:rPr>
+                <m:t>N×L</m:t>
+              </m:r>
+            </m:den>
+          </m:f>
+          <m:nary>
+            <m:naryPr>
+              <m:chr m:val="∑"/>
+              <m:limLoc m:val="undOvr"/>
+              <m:ctrlPr>
+                <w:rPr>
+                  <w:rFonts w:ascii="Cambria Math" w:hAnsi="Cambria Math"/>
+                  <w:i/>
+                  <w:lang w:val="en-GB"/>
+                </w:rPr>
+              </m:ctrlPr>
+            </m:naryPr>
+            <m:sub>
+              <m:r>
+                <w:rPr>
+                  <w:rFonts w:ascii="Cambria Math" w:hAnsi="Cambria Math"/>
+                  <w:lang w:val="en-GB"/>
+                </w:rPr>
+                <m:t>j=1</m:t>
+              </m:r>
+            </m:sub>
+            <m:sup>
+              <m:r>
+                <w:rPr>
+                  <w:rFonts w:ascii="Cambria Math" w:hAnsi="Cambria Math"/>
+                  <w:lang w:val="en-GB"/>
+                </w:rPr>
+                <m:t>N</m:t>
+              </m:r>
+            </m:sup>
+            <m:e>
+              <m:nary>
+                <m:naryPr>
+                  <m:chr m:val="∑"/>
+                  <m:limLoc m:val="undOvr"/>
+                  <m:ctrlPr>
+                    <w:rPr>
+                      <w:rFonts w:ascii="Cambria Math" w:hAnsi="Cambria Math"/>
+                      <w:i/>
+                      <w:lang w:val="en-GB"/>
+                    </w:rPr>
+                  </m:ctrlPr>
+                </m:naryPr>
+                <m:sub>
+                  <m:r>
+                    <w:rPr>
+                      <w:rFonts w:ascii="Cambria Math" w:hAnsi="Cambria Math"/>
+                      <w:lang w:val="en-GB"/>
+                    </w:rPr>
+                    <m:t>k=1</m:t>
+                  </m:r>
+                </m:sub>
+                <m:sup>
+                  <m:r>
+                    <w:rPr>
+                      <w:rFonts w:ascii="Cambria Math" w:hAnsi="Cambria Math"/>
+                      <w:lang w:val="en-GB"/>
+                    </w:rPr>
+                    <m:t>L</m:t>
+                  </m:r>
+                </m:sup>
+                <m:e>
+                  <m:r>
+                    <w:rPr>
+                      <w:rFonts w:ascii="Cambria Math" w:hAnsi="Cambria Math"/>
+                      <w:lang w:val="en-GB"/>
+                    </w:rPr>
+                    <m:t>[</m:t>
+                  </m:r>
+                  <m:sSub>
+                    <m:sSubPr>
+                      <m:ctrlPr>
+                        <w:rPr>
+                          <w:rFonts w:ascii="Cambria Math" w:hAnsi="Cambria Math"/>
+                          <w:i/>
+                          <w:lang w:val="en-GB"/>
+                        </w:rPr>
+                      </m:ctrlPr>
+                    </m:sSubPr>
+                    <m:e>
+                      <m:r>
+                        <w:rPr>
+                          <w:rFonts w:ascii="Cambria Math" w:hAnsi="Cambria Math"/>
+                          <w:lang w:val="en-GB"/>
+                        </w:rPr>
+                        <m:t>y</m:t>
+                      </m:r>
+                    </m:e>
+                    <m:sub>
+                      <m:r>
+                        <w:rPr>
+                          <w:rFonts w:ascii="Cambria Math" w:hAnsi="Cambria Math"/>
+                          <w:lang w:val="en-GB"/>
+                        </w:rPr>
+                        <m:t>jk</m:t>
+                      </m:r>
+                    </m:sub>
+                  </m:sSub>
+                  <m:r>
+                    <w:rPr>
+                      <w:rFonts w:ascii="Cambria Math" w:hAnsi="Cambria Math"/>
+                      <w:lang w:val="en-GB"/>
+                    </w:rPr>
+                    <m:t>≠</m:t>
+                  </m:r>
+                  <m:sSub>
+                    <m:sSubPr>
+                      <m:ctrlPr>
+                        <w:rPr>
+                          <w:rFonts w:ascii="Cambria Math" w:hAnsi="Cambria Math"/>
+                          <w:i/>
+                          <w:lang w:val="en-GB"/>
+                        </w:rPr>
+                      </m:ctrlPr>
+                    </m:sSubPr>
+                    <m:e>
+                      <m:acc>
+                        <m:accPr>
+                          <m:ctrlPr>
+                            <w:rPr>
+                              <w:rFonts w:ascii="Cambria Math" w:hAnsi="Cambria Math"/>
+                              <w:i/>
+                              <w:iCs/>
+                            </w:rPr>
+                          </m:ctrlPr>
+                        </m:accPr>
+                        <m:e>
+                          <m:r>
+                            <w:rPr>
+                              <w:rFonts w:ascii="Cambria Math" w:hAnsi="Cambria Math"/>
+                            </w:rPr>
+                            <m:t>y</m:t>
+                          </m:r>
+                        </m:e>
+                      </m:acc>
+                    </m:e>
+                    <m:sub>
+                      <m:r>
+                        <w:rPr>
+                          <w:rFonts w:ascii="Cambria Math" w:hAnsi="Cambria Math"/>
+                          <w:lang w:val="en-GB"/>
+                        </w:rPr>
+                        <m:t>jk</m:t>
+                      </m:r>
+                    </m:sub>
+                  </m:sSub>
+                  <m:r>
+                    <w:rPr>
+                      <w:rFonts w:ascii="Cambria Math" w:hAnsi="Cambria Math"/>
+                      <w:lang w:val="en-GB"/>
+                    </w:rPr>
+                    <m:t>]</m:t>
+                  </m:r>
+                </m:e>
+              </m:nary>
+            </m:e>
+          </m:nary>
+        </m:oMath>
+      </m:oMathPara>
+    </w:p>
+    <w:p>
+      <w:pPr>
+        <w:jc w:val="both"/>
+        <w:rPr>
+          <w:lang w:val="en-GB"/>
+        </w:rPr>
+      </w:pPr>
+      <w:r>
+        <w:rPr>
+          <w:lang w:val="en-GB"/>
+        </w:rPr>
+        <w:t xml:space="preserve">where </w:t>
+      </w:r>
+      <w:r>
+        <w:rPr>
+          <w:rFonts w:ascii="Cambria Math" w:hAnsi="Cambria Math"/>
+          <w:lang w:val="en-GB"/>
+        </w:rPr>
+        <w:t>N</w:t>
+      </w:r>
+      <w:r>
+        <w:rPr>
+          <w:lang w:val="en-GB"/>
+        </w:rPr>
+        <w:t xml:space="preserve"> is the number of test molecules, </w:t>
+      </w:r>
+      <w:r>
+        <w:rPr>
+          <w:rFonts w:ascii="Cambria Math" w:hAnsi="Cambria Math"/>
+          <w:lang w:val="en-GB"/>
+        </w:rPr>
+        <w:t>L</w:t>
+      </w:r>
+      <w:r>
+        <w:rPr>
+          <w:lang w:val="en-GB"/>
+        </w:rPr>
+        <w:t xml:space="preserve"> the number of CYP isoforms, and </w:t>
+      </w:r>
+      <w:r>
+        <w:rPr>
+          <w:lang w:val="en-GB"/>
+        </w:rPr>
+        <w:t>the Iverson brackets</w:t>
+      </w:r>
+      <w:r>
+        <w:rPr>
+          <w:lang w:val="en-GB"/>
+        </w:rPr>
+        <w:t xml:space="preserve">, </w:t>
+      </w:r>
+      <w:r>
+        <w:rPr>
+          <w:lang w:val="en-GB"/>
+        </w:rPr>
+        <w:t>count</w:t>
+      </w:r>
+      <w:r>
+        <w:rPr>
+          <w:lang w:val="en-GB"/>
+        </w:rPr>
+        <w:t>s</w:t>
+      </w:r>
+      <w:r>
+        <w:rPr>
+          <w:lang w:val="en-GB"/>
+        </w:rPr>
+        <w:t xml:space="preserve"> the number of positions where the true label</w:t>
+      </w:r>
+      <w:r>
+        <w:rPr>
+          <w:lang w:val="en-GB"/>
+        </w:rPr>
+        <w:t xml:space="preserve"> </w:t>
+      </w:r>
+      <m:oMath>
+        <m:sSub>
+          <m:sSubPr>
+            <m:ctrlPr>
+              <w:rPr>
+                <w:rFonts w:ascii="Cambria Math" w:hAnsi="Cambria Math"/>
+                <w:i/>
+                <w:lang w:val="en-GB"/>
+              </w:rPr>
+            </m:ctrlPr>
+          </m:sSubPr>
+          <m:e>
+            <m:r>
+              <w:rPr>
+                <w:rFonts w:ascii="Cambria Math" w:hAnsi="Cambria Math"/>
+                <w:lang w:val="en-GB"/>
+              </w:rPr>
+              <m:t>y</m:t>
+            </m:r>
+          </m:e>
+          <m:sub>
+            <m:r>
+              <w:rPr>
+                <w:rFonts w:ascii="Cambria Math" w:hAnsi="Cambria Math"/>
+                <w:lang w:val="en-GB"/>
+              </w:rPr>
+              <m:t>jk</m:t>
+            </m:r>
+          </m:sub>
+        </m:sSub>
+      </m:oMath>
+      <w:r>
+        <w:rPr>
+          <w:lang w:val="en-GB"/>
+        </w:rPr>
+        <w:t xml:space="preserve"> differs from the predicted label</w:t>
+      </w:r>
+      <w:r>
+        <w:rPr>
+          <w:lang w:val="en-GB"/>
+        </w:rPr>
+        <w:t xml:space="preserve"> </w:t>
+      </w:r>
+      <m:oMath>
+        <m:sSub>
+          <m:sSubPr>
+            <m:ctrlPr>
+              <w:rPr>
+                <w:rFonts w:ascii="Cambria Math" w:hAnsi="Cambria Math"/>
+                <w:i/>
+                <w:lang w:val="en-GB"/>
+              </w:rPr>
+            </m:ctrlPr>
+          </m:sSubPr>
+          <m:e>
+            <m:acc>
+              <m:accPr>
+                <m:ctrlPr>
+                  <w:rPr>
+                    <w:rFonts w:ascii="Cambria Math" w:hAnsi="Cambria Math"/>
+                    <w:i/>
+                    <w:iCs/>
+                  </w:rPr>
+                </m:ctrlPr>
+              </m:accPr>
+              <m:e>
+                <m:r>
+                  <w:rPr>
+                    <w:rFonts w:ascii="Cambria Math" w:hAnsi="Cambria Math"/>
+                  </w:rPr>
+                  <m:t>y</m:t>
+                </m:r>
+              </m:e>
+            </m:acc>
+          </m:e>
+          <m:sub>
+            <m:r>
+              <w:rPr>
+                <w:rFonts w:ascii="Cambria Math" w:hAnsi="Cambria Math"/>
+                <w:lang w:val="en-GB"/>
+              </w:rPr>
+              <m:t>jk</m:t>
+            </m:r>
+          </m:sub>
+        </m:sSub>
+      </m:oMath>
+      <w:r>
+        <w:rPr>
+          <w:lang w:val="en-GB"/>
+        </w:rPr>
+        <w:t xml:space="preserve">. </w:t>
+      </w:r>
+      <w:r>
+        <w:rPr>
+          <w:lang w:val="en-GB"/>
+        </w:rPr>
+        <w:t>HL</w:t>
+      </w:r>
+      <w:r>
+        <w:rPr>
+          <w:lang w:val="en-GB"/>
+        </w:rPr>
+        <w:t xml:space="preserve"> ranges from 0 (perfect) to 1 (completely wrong) and is straightforward to interpret. It is included as an informative metric only, providing a high</w:t>
+      </w:r>
+      <w:r>
+        <w:rPr>
+          <w:rFonts w:ascii="Cambria Math" w:hAnsi="Cambria Math" w:cs="Cambria Math"/>
+          <w:lang w:val="en-GB"/>
+        </w:rPr>
+        <w:t>-</w:t>
+      </w:r>
+      <w:r>
+        <w:rPr>
+          <w:lang w:val="en-GB"/>
+        </w:rPr>
+        <w:t xml:space="preserve">level summary of overall prediction quality. Because </w:t>
+      </w:r>
+      <w:r>
+        <w:rPr>
+          <w:lang w:val="en-GB"/>
+        </w:rPr>
+        <w:t xml:space="preserve">HL </w:t>
+      </w:r>
+      <w:r>
+        <w:rPr>
+          <w:lang w:val="en-GB"/>
+        </w:rPr>
+        <w:t>does not distinguish between false positives and false negatives nor account for class imbalance, it is not used for model comparison or hyperparameter tuning. Instead, it appears alongside the primary and secondary metrics to offer a complete yet concise picture of model performance.</w:t>
+      </w:r>
+      <w:r>
+        <w:rPr>
+          <w:lang w:val="en-GB"/>
+        </w:rPr>
+        <w:t xml:space="preserve"> </w:t>
+      </w:r>
+      <w:sdt>
+        <w:sdtPr>
+          <w:rPr>
+            <w:rFonts w:ascii="Calibri" w:hAnsi="Calibri" w:cs="Calibri"/>
+            <w:color w:val="000000"/>
+            <w:lang w:val="en-GB"/>
+          </w:rPr>
+          <w:tag w:val="MENDELEY_CITATION_v3_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"/>
+          <w:id w:val="-305792809"/>
+          <w:placeholder>
+            <w:docPart w:val="DefaultPlaceholder_-1854013440"/>
+          </w:placeholder>
+        </w:sdtPr>
+        <w:sdtContent>
+          <w:r>
+            <w:rPr>
+              <w:rFonts w:ascii="Calibri" w:hAnsi="Calibri" w:cs="Calibri"/>
+              <w:color w:val="000000"/>
+              <w:lang w:val="en-GB"/>
+            </w:rPr>
+            <w:t>[24]</w:t>
+          </w:r>
+        </w:sdtContent>
+      </w:sdt>
+    </w:p>
+    <w:p>
+      <w:pPr>
+        <w:pStyle w:val="Heading4"/>
+        <w:rPr>
+          <w:lang w:val="en-GB"/>
+        </w:rPr>
+      </w:pPr>
+      <w:r>
+        <w:rPr>
+          <w:lang w:val="en-GB"/>
+        </w:rPr>
+        <w:t>Diagnostic Metric: Variance of MCC Across CYP Isoforms</w:t>
+      </w:r>
+    </w:p>
+    <w:p>
+      <w:pPr>
+        <w:jc w:val="both"/>
+        <w:rPr>
+          <w:lang w:val="en-GB"/>
+        </w:rPr>
+      </w:pPr>
+      <w:r>
+        <w:rPr>
+          <w:lang w:val="en-GB"/>
+        </w:rPr>
+        <w:t>Beyond comparing representations, it is valuable to understand whether a model performs consistently across common and rare enzymes. For each representation, the variance (or standard deviation) of per</w:t>
+      </w:r>
+      <w:r>
+        <w:rPr>
+          <w:rFonts w:ascii="Cambria Math" w:hAnsi="Cambria Math" w:cs="Cambria Math"/>
+          <w:lang w:val="en-GB"/>
+        </w:rPr>
+        <w:t>-</w:t>
+      </w:r>
+      <w:r>
+        <w:rPr>
+          <w:lang w:val="en-GB"/>
+        </w:rPr>
+        <w:t xml:space="preserve">CYP MCC values is computed. Low variance indicates that the model achieves similar predictive quality regardless of CYP frequency, implying that data scarcity is not the sole limiting factor. High variance, by contrast, suggests that performance is uneven, with excellent predictions on </w:t>
+      </w:r>
+      <w:r>
+        <w:rPr>
+          <w:lang w:val="en-GB"/>
+        </w:rPr>
+        <w:t>some</w:t>
+      </w:r>
+      <w:r>
+        <w:rPr>
+          <w:lang w:val="en-GB"/>
+        </w:rPr>
+        <w:t xml:space="preserve"> CYPs but poor predictions on </w:t>
+      </w:r>
+      <w:r>
+        <w:rPr>
+          <w:lang w:val="en-GB"/>
+        </w:rPr>
+        <w:t>others</w:t>
+      </w:r>
+      <w:r>
+        <w:rPr>
+          <w:lang w:val="en-GB"/>
+        </w:rPr>
+        <w:t xml:space="preserve">, pointing to a need for more balanced training data or specialised techniques. MCC variance is used as a diagnostic metric exclusively in the discussion section, helping to interpret why certain representations may appear superior in mean MCC while failing on </w:t>
+      </w:r>
+      <w:r>
+        <w:rPr>
+          <w:lang w:val="en-GB"/>
+        </w:rPr>
+        <w:t>specific</w:t>
+      </w:r>
+      <w:r>
+        <w:rPr>
+          <w:lang w:val="en-GB"/>
+        </w:rPr>
+        <w:t xml:space="preserve"> isoforms and informing the final conclusions about the practical utility of each representation for early drug discovery.</w:t>
+      </w:r>
+    </w:p>
+    <w:p>
+      <w:pPr>
+        <w:pStyle w:val="Heading4"/>
+        <w:rPr>
+          <w:lang w:val="en-GB"/>
+        </w:rPr>
+      </w:pPr>
+      <w:r>
+        <w:rPr>
+          <w:lang w:val="en-GB"/>
+        </w:rPr>
+        <w:t>Behaviour Under Extreme Imbalance</w:t>
+      </w:r>
+    </w:p>
+    <w:p>
+      <w:pPr>
+        <w:jc w:val="both"/>
+        <w:rPr>
+          <w:lang w:val="en-GB"/>
+        </w:rPr>
+      </w:pPr>
+      <w:r>
+        <w:rPr>
+          <w:lang w:val="en-GB"/>
+        </w:rPr>
+        <w:t>When a CYP isoform has very few positive samples in the test set, metrics that ignore true negatives, such as F1 or precision, can become highly unstable, varying drastically with a handful of correct or incorrect predictions. M</w:t>
+      </w:r>
+      <w:r>
+        <w:rPr>
+          <w:lang w:val="en-GB"/>
+        </w:rPr>
+        <w:t>acro</w:t>
+      </w:r>
+      <w:r>
+        <w:rPr>
+          <w:lang w:val="en-GB"/>
+        </w:rPr>
+        <w:t xml:space="preserve"> MCC, by incorporating true negatives, remains mathematically well</w:t>
+      </w:r>
+      <w:r>
+        <w:rPr>
+          <w:rFonts w:ascii="Cambria Math" w:hAnsi="Cambria Math" w:cs="Cambria Math"/>
+          <w:lang w:val="en-GB"/>
+        </w:rPr>
+        <w:t>-</w:t>
+      </w:r>
+      <w:r>
+        <w:rPr>
+          <w:lang w:val="en-GB"/>
+        </w:rPr>
+        <w:t>defined and provides a more stable estimate of true predictive quality. Micro</w:t>
+      </w:r>
+      <w:r>
+        <w:rPr>
+          <w:rFonts w:ascii="Cambria Math" w:hAnsi="Cambria Math" w:cs="Cambria Math"/>
+          <w:lang w:val="en-GB"/>
+        </w:rPr>
+        <w:t>-</w:t>
+      </w:r>
+      <w:r>
+        <w:rPr>
+          <w:lang w:val="en-GB"/>
+        </w:rPr>
+        <w:t>F1, being dominated by frequent classes, is largely unaffected by the performance on rare CYPs, which is simultaneously its strength, providing a stable global estimate, and its limitation, being insensitive to rare</w:t>
+      </w:r>
+      <w:r>
+        <w:rPr>
+          <w:rFonts w:ascii="Cambria Math" w:hAnsi="Cambria Math" w:cs="Cambria Math"/>
+          <w:lang w:val="en-GB"/>
+        </w:rPr>
+        <w:t>-</w:t>
+      </w:r>
+      <w:r>
+        <w:rPr>
+          <w:lang w:val="en-GB"/>
+        </w:rPr>
+        <w:t xml:space="preserve">class failures. </w:t>
+      </w:r>
+      <w:r>
+        <w:rPr>
+          <w:lang w:val="en-GB"/>
+        </w:rPr>
+        <w:t>HL</w:t>
+      </w:r>
+      <w:r>
+        <w:rPr>
+          <w:lang w:val="en-GB"/>
+        </w:rPr>
+        <w:t xml:space="preserve"> also remains stable, but because it aggregates all errors, it cannot reveal whether poor performance originates on rare or common enzymes. The combination of mean MCC for overall balanced performance and MCC variance for consistency across frequencies therefore offers the most informative and robust evaluation framework for this imbalanced multi</w:t>
+      </w:r>
+      <w:r>
+        <w:rPr>
+          <w:rFonts w:ascii="Cambria Math" w:hAnsi="Cambria Math" w:cs="Cambria Math"/>
+          <w:lang w:val="en-GB"/>
+        </w:rPr>
+        <w:t>-</w:t>
+      </w:r>
+      <w:r>
+        <w:rPr>
+          <w:lang w:val="en-GB"/>
+        </w:rPr>
+        <w:t>label task.</w:t>
+      </w:r>
+    </w:p>
+    <w:p>
+      <w:pPr>
+        <w:pStyle w:val="Heading3"/>
+        <w:rPr>
+          <w:lang w:val="en-GB"/>
+        </w:rPr>
+      </w:pPr>
+      <w:r>
+        <w:rPr>
+          <w:lang w:val="en-GB"/>
+        </w:rPr>
+        <w:t>Model Selection and Cross-Validation</w:t>
+      </w:r>
+    </w:p>
+    <w:p>
+      <w:pPr>
+        <w:rPr>
+          <w:lang w:val="en-GB"/>
+        </w:rPr>
+      </w:pPr>
+      <w:r>
+        <w:rPr>
+          <w:lang w:val="en-GB"/>
+        </w:rPr>
+        <w:t>To maximise the amount of data available for training while preserving an unbiased estimate of generalisation performance, an 80/20 stratified split is applied to the curated dataset. The larger portion, comprising 80% of the compounds, serves as the development set. The remaining 20% is held out as a test set and is used only once, after all model selection and hyperparameter tuning is complete, to report final performance. This strict separation prevents information leakage from the test set into the model development process.</w:t>
+      </w:r>
+    </w:p>
+    <w:p>
+      <w:pPr>
+        <w:rPr>
+          <w:lang w:val="en-GB"/>
+        </w:rPr>
+      </w:pPr>
+      <w:r>
+        <w:rPr>
+          <w:lang w:val="en-GB"/>
+        </w:rPr>
+        <w:t>Hyperparameter optimisation is conducted exclusively on the development set using three</w:t>
+      </w:r>
+      <w:r>
+        <w:rPr>
+          <w:rFonts w:ascii="Cambria Math" w:hAnsi="Cambria Math" w:cs="Cambria Math"/>
+          <w:lang w:val="en-GB"/>
+        </w:rPr>
+        <w:t>-</w:t>
+      </w:r>
+      <w:r>
+        <w:rPr>
+          <w:lang w:val="en-GB"/>
+        </w:rPr>
+        <w:t xml:space="preserve">fold </w:t>
+      </w:r>
+      <w:r>
+        <w:rPr>
+          <w:lang w:val="en-GB"/>
+        </w:rPr>
+        <w:t>CV</w:t>
+      </w:r>
+      <w:r>
+        <w:rPr>
+          <w:lang w:val="en-GB"/>
+        </w:rPr>
+        <w:t xml:space="preserve"> The development set is partitioned into three disjoint folds of approximately equal size. For each hyperparameter configuration under consideration, a model is trained on two of the three folds and evaluated on the remaining fold. This process is repeated three times, rotating which fold </w:t>
+      </w:r>
+      <w:r>
+        <w:rPr>
+          <w:lang w:val="en-GB"/>
+        </w:rPr>
         <w:lastRenderedPageBreak/>
-        <w:t>Metrics</w:t>
-      </w:r>
-    </w:p>
-    <w:p>
-      <w:pPr>
-        <w:rPr>
-          <w:color w:val="EE0000"/>
-        </w:rPr>
-      </w:pPr>
-      <w:r>
-        <w:rPr>
-          <w:color w:val="EE0000"/>
-        </w:rPr>
-        <w:t>Validation strategy</w:t>
+        <w:t xml:space="preserve">serves as the validation set. The performance scores obtained from the three validation folds are averaged to produce a single </w:t>
+      </w:r>
+      <w:r>
+        <w:rPr>
+          <w:lang w:val="en-GB"/>
+        </w:rPr>
+        <w:t>CV</w:t>
+      </w:r>
+      <w:r>
+        <w:rPr>
+          <w:lang w:val="en-GB"/>
+        </w:rPr>
+        <w:t xml:space="preserve"> score for that configuration. The hyperparameter combination that yields the highest mean MCC across the three folds is selected as optimal. This procedure is applied </w:t>
+      </w:r>
+      <w:r>
+        <w:rPr>
+          <w:lang w:val="en-GB"/>
+        </w:rPr>
+        <w:t>identically to each molecular representation and to each learning algorithm evaluated in the study.</w:t>
+      </w:r>
+    </w:p>
+    <w:p>
+      <w:pPr>
+        <w:rPr>
+          <w:lang w:val="en-GB"/>
+        </w:rPr>
+      </w:pPr>
+      <w:r>
+        <w:rPr>
+          <w:lang w:val="en-GB"/>
+        </w:rPr>
+        <w:t>CV</w:t>
+      </w:r>
+      <w:r>
+        <w:rPr>
+          <w:lang w:val="en-GB"/>
+        </w:rPr>
+        <w:t xml:space="preserve"> is performed using the same development set splits across all hyperparameter configurations to ensure comparability. The selected hyperparameters are then used to retrain a final model on the full development set, from scratch and without any memory of the </w:t>
+      </w:r>
+      <w:r>
+        <w:rPr>
+          <w:lang w:val="en-GB"/>
+        </w:rPr>
+        <w:t>CV</w:t>
+      </w:r>
+      <w:r>
+        <w:rPr>
+          <w:lang w:val="en-GB"/>
+        </w:rPr>
+        <w:t xml:space="preserve"> training cycles. This final model is subsequently evaluated once on the held</w:t>
+      </w:r>
+      <w:r>
+        <w:rPr>
+          <w:rFonts w:ascii="Cambria Math" w:hAnsi="Cambria Math" w:cs="Cambria Math"/>
+          <w:lang w:val="en-GB"/>
+        </w:rPr>
+        <w:t>-</w:t>
+      </w:r>
+      <w:r>
+        <w:rPr>
+          <w:lang w:val="en-GB"/>
+        </w:rPr>
+        <w:t>out test set using the metrics defined in the previous section.</w:t>
+      </w:r>
+    </w:p>
+    <w:p>
+      <w:pPr>
+        <w:rPr>
+          <w:lang w:val="en-GB"/>
+        </w:rPr>
+      </w:pPr>
+      <w:r>
+        <w:rPr>
+          <w:lang w:val="en-GB"/>
+        </w:rPr>
+        <w:t xml:space="preserve">This design offers several advantages given the limited size of the curated dataset. The 80/20 split reserves </w:t>
+      </w:r>
+      <w:proofErr w:type="gramStart"/>
+      <w:r>
+        <w:rPr>
+          <w:lang w:val="en-GB"/>
+        </w:rPr>
+        <w:t>the majority of</w:t>
+      </w:r>
+      <w:proofErr w:type="gramEnd"/>
+      <w:r>
+        <w:rPr>
+          <w:lang w:val="en-GB"/>
+        </w:rPr>
+        <w:t xml:space="preserve"> data for training and validation, which is particularly beneficial when the total number of labelled compounds is approximately 1,300. The use of </w:t>
+      </w:r>
+      <w:r>
+        <w:rPr>
+          <w:lang w:val="en-GB"/>
+        </w:rPr>
+        <w:t>three</w:t>
+      </w:r>
+      <w:r>
+        <w:rPr>
+          <w:rFonts w:ascii="Cambria Math" w:hAnsi="Cambria Math" w:cs="Cambria Math"/>
+          <w:lang w:val="en-GB"/>
+        </w:rPr>
+        <w:t>-</w:t>
+      </w:r>
+      <w:r>
+        <w:rPr>
+          <w:lang w:val="en-GB"/>
+        </w:rPr>
+        <w:t xml:space="preserve">fold </w:t>
+      </w:r>
+      <w:r>
+        <w:rPr>
+          <w:lang w:val="en-GB"/>
+        </w:rPr>
+        <w:t>CV</w:t>
+      </w:r>
+      <w:r>
+        <w:rPr>
+          <w:lang w:val="en-GB"/>
+        </w:rPr>
+        <w:t xml:space="preserve"> on the development set reduces the variance of performance estimates compared to a single validation split, leading to </w:t>
+      </w:r>
+      <w:r>
+        <w:rPr>
+          <w:lang w:val="en-GB"/>
+        </w:rPr>
+        <w:t>more robust</w:t>
+      </w:r>
+      <w:r>
+        <w:rPr>
+          <w:lang w:val="en-GB"/>
+        </w:rPr>
+        <w:t xml:space="preserve"> hyperparameter selection. At the same time, the strict separation of the test set guarantees that the reported final performance reflects true generalisation to unseen molecules, free from any </w:t>
+      </w:r>
+      <w:r>
+        <w:rPr>
+          <w:lang w:val="en-GB"/>
+        </w:rPr>
+        <w:t>data leakage</w:t>
+      </w:r>
+      <w:r>
+        <w:rPr>
+          <w:lang w:val="en-GB"/>
+        </w:rPr>
+        <w:t>.</w:t>
       </w:r>
     </w:p>
     <w:p>
@@ -10597,7 +12445,6 @@
           <w:lang w:val="en-GB" w:eastAsia="en-GB"/>
         </w:rPr>
       </w:pPr>
-      <w:bookmarkStart w:id="22" w:name="_Toc227188996"/>
       <w:r>
         <w:rPr>
           <w:lang w:val="en-GB" w:eastAsia="en-GB"/>
@@ -10674,7 +12521,21 @@
         <w:rPr>
           <w:lang w:val="en-GB" w:eastAsia="en-GB"/>
         </w:rPr>
-        <w:t xml:space="preserve">, a set of verified SMILES strings was obtained from a Kaggle dataset derived from ChEMBL </w:t>
+        <w:t xml:space="preserve">, a set of verified SMILES strings was obtained from a Kaggle dataset derived from </w:t>
+      </w:r>
+      <w:proofErr w:type="spellStart"/>
+      <w:r>
+        <w:rPr>
+          <w:lang w:val="en-GB" w:eastAsia="en-GB"/>
+        </w:rPr>
+        <w:t>ChEMBL</w:t>
+      </w:r>
+      <w:proofErr w:type="spellEnd"/>
+      <w:r>
+        <w:rPr>
+          <w:lang w:val="en-GB" w:eastAsia="en-GB"/>
+        </w:rPr>
+        <w:t xml:space="preserve"> </w:t>
       </w:r>
       <w:sdt>
         <w:sdtPr>
@@ -10683,7 +12544,7 @@
             <w:color w:val="000000"/>
             <w:lang w:val="en-GB" w:eastAsia="en-GB"/>
           </w:rPr>
-          <w:tag w:val="MENDELEY_CITATION_v3_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"/>
+          <w:tag w:val="MENDELEY_CITATION_v3_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"/>
           <w:id w:val="966242119"/>
           <w:placeholder>
             <w:docPart w:val="DefaultPlaceholder_-1854013440"/>
@@ -10696,7 +12557,7 @@
               <w:color w:val="000000"/>
               <w:lang w:val="en-GB" w:eastAsia="en-GB"/>
             </w:rPr>
-            <w:t>[23]</w:t>
+            <w:t>[25]</w:t>
           </w:r>
         </w:sdtContent>
       </w:sdt>
@@ -10704,7 +12565,33 @@
         <w:rPr>
           <w:lang w:val="en-GB" w:eastAsia="en-GB"/>
         </w:rPr>
-        <w:t>. The dataset contains approximately 1.5 million entries, each consisting of a SMILES string in the first column and a reference to the corresponding ChEMBL entry in the second.</w:t>
+        <w:t xml:space="preserve">. The dataset contains approximately </w:t>
+      </w:r>
+      <w:r>
+        <w:rPr>
+          <w:lang w:val="en-GB" w:eastAsia="en-GB"/>
+        </w:rPr>
+        <w:t>~</w:t>
+      </w:r>
+      <w:r>
+        <w:rPr>
+          <w:lang w:val="en-GB" w:eastAsia="en-GB"/>
+        </w:rPr>
+        <w:t xml:space="preserve">1.5 million entries, each consisting of a </w:t>
+      </w:r>
+      <w:proofErr w:type="gramStart"/>
+      <w:r>
+        <w:rPr>
+          <w:lang w:val="en-GB" w:eastAsia="en-GB"/>
+        </w:rPr>
+        <w:t>SMILES</w:t>
+      </w:r>
+      <w:proofErr w:type="gramEnd"/>
+      <w:r>
+        <w:rPr>
+          <w:lang w:val="en-GB" w:eastAsia="en-GB"/>
+        </w:rPr>
+        <w:t xml:space="preserve"> string in the first column and a reference to the corresponding ChEMBL entry in the second.</w:t>
       </w:r>
       <w:r>
         <w:rPr>
@@ -10814,17 +12701,95 @@
     <w:p>
       <w:pPr>
         <w:keepNext/>
-        <w:jc w:val="both"/>
+        <w:jc w:val="center"/>
       </w:pPr>
       <w:r>
         <w:rPr>
           <w:noProof/>
           <w:lang w:val="en-GB" w:eastAsia="en-GB"/>
         </w:rPr>
+        <w:lastRenderedPageBreak/>
+        <mc:AlternateContent>
+          <mc:Choice Requires="wps">
+            <w:drawing>
+              <wp:anchor distT="0" distB="0" distL="114300" distR="114300" simplePos="0" relativeHeight="251664383" behindDoc="1" locked="0" layoutInCell="1" allowOverlap="1" wp14:anchorId="34D39857" wp14:editId="5EEE7395">
+                <wp:simplePos x="0" y="0"/>
+                <wp:positionH relativeFrom="column">
+                  <wp:posOffset>-15240</wp:posOffset>
+                </wp:positionH>
+                <wp:positionV relativeFrom="paragraph">
+                  <wp:posOffset>0</wp:posOffset>
+                </wp:positionV>
+                <wp:extent cx="5703388" cy="2155825"/>
+                <wp:effectExtent l="0" t="0" r="12065" b="15875"/>
+                <wp:wrapNone/>
+                <wp:docPr id="65719325" name="Rectangle 3"/>
+                <wp:cNvGraphicFramePr/>
+                <a:graphic xmlns:a="http://schemas.openxmlformats.org/drawingml/2006/main">
+                  <a:graphicData uri="http://schemas.microsoft.com/office/word/2010/wordprocessingShape">
+                    <wps:wsp>
+                      <wps:cNvSpPr/>
+                      <wps:spPr>
+                        <a:xfrm>
+                          <a:off x="0" y="0"/>
+                          <a:ext cx="5703388" cy="2155825"/>
+                        </a:xfrm>
+                        <a:prstGeom prst="rect">
+                          <a:avLst/>
+                        </a:prstGeom>
+                        <a:solidFill>
+                          <a:schemeClr val="bg2">
+                            <a:lumMod val="10000"/>
+                          </a:schemeClr>
+                        </a:solidFill>
+                      </wps:spPr>
+                      <wps:style>
+                        <a:lnRef idx="2">
+                          <a:schemeClr val="accent1">
+                            <a:shade val="15000"/>
+                          </a:schemeClr>
+                        </a:lnRef>
+                        <a:fillRef idx="1">
+                          <a:schemeClr val="accent1"/>
+                        </a:fillRef>
+                        <a:effectRef idx="0">
+                          <a:schemeClr val="accent1"/>
+                        </a:effectRef>
+                        <a:fontRef idx="minor">
+                          <a:schemeClr val="lt1"/>
+                        </a:fontRef>
+                      </wps:style>
+                      <wps:bodyPr rot="0" spcFirstLastPara="0" vertOverflow="overflow" horzOverflow="overflow" vert="horz" wrap="square" lIns="91440" tIns="45720" rIns="91440" bIns="45720" numCol="1" spcCol="0" rtlCol="0" fromWordArt="0" anchor="ctr" anchorCtr="0" forceAA="0" compatLnSpc="1">
+                        <a:prstTxWarp prst="textNoShape">
+                          <a:avLst/>
+                        </a:prstTxWarp>
+                        <a:noAutofit/>
+                      </wps:bodyPr>
+                    </wps:wsp>
+                  </a:graphicData>
+                </a:graphic>
+                <wp14:sizeRelH relativeFrom="margin">
+                  <wp14:pctWidth>0</wp14:pctWidth>
+                </wp14:sizeRelH>
+              </wp:anchor>
+            </w:drawing>
+          </mc:Choice>
+          <mc:Fallback>
+            <w:pict>
+              <v:rect w14:anchorId="446117B2" id="Rectangle 3" o:spid="_x0000_s1026" style="position:absolute;margin-left:-1.2pt;margin-top:0;width:449.1pt;height:169.75pt;z-index:-251652097;visibility:visible;mso-wrap-style:square;mso-width-percent:0;mso-wrap-distance-left:9pt;mso-wrap-distance-top:0;mso-wrap-distance-right:9pt;mso-wrap-distance-bottom:0;mso-position-horizontal:absolute;mso-position-horizontal-relative:text;mso-position-vertical:absolute;mso-position-vertical-relative:text;mso-width-percent:0;mso-width-relative:margin;v-text-anchor:middle" o:gfxdata="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" fillcolor="#161616 [334]" strokecolor="#091723 [484]" strokeweight="1pt"/>
+            </w:pict>
+          </mc:Fallback>
+        </mc:AlternateContent>
+      </w:r>
+      <w:r>
+        <w:rPr>
+          <w:noProof/>
+          <w:lang w:val="en-GB" w:eastAsia="en-GB"/>
+        </w:rPr>
         <w:drawing>
-          <wp:inline distT="0" distB="0" distL="0" distR="0" wp14:anchorId="4D630101" wp14:editId="2740E485">
-            <wp:extent cx="5669915" cy="2606040"/>
-            <wp:effectExtent l="0" t="0" r="6985" b="3810"/>
+          <wp:inline distT="0" distB="0" distL="0" distR="0" wp14:anchorId="4D630101" wp14:editId="14F3EFA9">
+            <wp:extent cx="4691269" cy="2156229"/>
+            <wp:effectExtent l="0" t="0" r="0" b="0"/>
             <wp:docPr id="992652706" name="Picture 1" descr="A screen shot of a computer&#10;&#10;AI-generated content may be incorrect."/>
             <wp:cNvGraphicFramePr>
               <a:graphicFrameLocks xmlns:a="http://schemas.openxmlformats.org/drawingml/2006/main" noChangeAspect="1"/>
@@ -10845,7 +12810,7 @@
                   <pic:spPr>
                     <a:xfrm>
                       <a:off x="0" y="0"/>
-                      <a:ext cx="5669915" cy="2606040"/>
+                      <a:ext cx="4709341" cy="2164536"/>
                     </a:xfrm>
                     <a:prstGeom prst="rect">
                       <a:avLst/>
@@ -11039,7 +13004,6 @@
         <w:rPr>
           <w:lang w:val="en-GB" w:eastAsia="en-GB"/>
         </w:rPr>
-        <w:lastRenderedPageBreak/>
         <w:t>“CYPs”: List of all the cytochromes that metabolize it.</w:t>
       </w:r>
     </w:p>
@@ -11151,6 +13115,7 @@
           <w:noProof/>
           <w:lang w:val="en-GB" w:eastAsia="en-GB"/>
         </w:rPr>
+        <w:lastRenderedPageBreak/>
         <mc:AlternateContent>
           <mc:Choice Requires="wpg">
             <w:drawing>
@@ -11253,7 +13218,6 @@
                                 </w:rPr>
                                 <w:tab/>
                               </w:r>
-                              <w:proofErr w:type="gramStart"/>
                               <w:r>
                                 <w:rPr>
                                   <w:color w:val="000000" w:themeColor="text1"/>
@@ -11308,7 +13272,6 @@
                                 </w:rPr>
                                 <w:t>B</w:t>
                               </w:r>
-                              <w:proofErr w:type="gramEnd"/>
                             </w:p>
                           </w:txbxContent>
                         </wps:txbx>
@@ -11470,7 +13433,6 @@
                           </w:rPr>
                           <w:tab/>
                         </w:r>
-                        <w:proofErr w:type="gramStart"/>
                         <w:r>
                           <w:rPr>
                             <w:color w:val="000000" w:themeColor="text1"/>
@@ -11525,7 +13487,6 @@
                           </w:rPr>
                           <w:t>B</w:t>
                         </w:r>
-                        <w:proofErr w:type="gramEnd"/>
                       </w:p>
                     </w:txbxContent>
                   </v:textbox>
@@ -11649,14 +13610,12 @@
                               </w:rPr>
                               <w:t>‘</w:t>
                             </w:r>
-                            <w:proofErr w:type="spellStart"/>
                             <w:r>
                               <w:rPr>
                                 <w:lang w:val="en-GB"/>
                               </w:rPr>
                               <w:t>dict</w:t>
                             </w:r>
-                            <w:proofErr w:type="spellEnd"/>
                             <w:r>
                               <w:rPr>
                                 <w:lang w:val="en-GB"/>
@@ -11673,35 +13632,7 @@
                               <w:rPr>
                                 <w:lang w:val="en-GB"/>
                               </w:rPr>
-                              <w:t xml:space="preserve"> for full </w:t>
-                            </w:r>
-                            <w:proofErr w:type="spellStart"/>
-                            <w:r>
-                              <w:rPr>
-                                <w:lang w:val="en-GB"/>
-                              </w:rPr>
-                              <w:t>db</w:t>
-                            </w:r>
-                            <w:proofErr w:type="spellEnd"/>
-                            <w:r>
-                              <w:rPr>
-                                <w:lang w:val="en-GB"/>
-                              </w:rPr>
-                              <w:t xml:space="preserve"> (A) and curated </w:t>
-                            </w:r>
-                            <w:proofErr w:type="spellStart"/>
-                            <w:r>
-                              <w:rPr>
-                                <w:lang w:val="en-GB"/>
-                              </w:rPr>
-                              <w:t>db</w:t>
-                            </w:r>
-                            <w:proofErr w:type="spellEnd"/>
-                            <w:r>
-                              <w:rPr>
-                                <w:lang w:val="en-GB"/>
-                              </w:rPr>
-                              <w:t xml:space="preserve"> with threshold = 10 (B)</w:t>
+                              <w:t xml:space="preserve"> for full db (A) and curated db with threshold = 10 (B)</w:t>
                             </w:r>
                             <w:r>
                               <w:rPr>
@@ -11715,84 +13646,20 @@
                               </w:rPr>
                               <w:t xml:space="preserve">  </w:t>
                             </w:r>
-                            <w:proofErr w:type="spellStart"/>
-                            <w:proofErr w:type="gramStart"/>
                             <w:r>
                               <w:rPr>
                                 <w:lang w:val="en-GB"/>
                               </w:rPr>
-                              <w:t>Dict</w:t>
-                            </w:r>
-                            <w:proofErr w:type="spellEnd"/>
-                            <w:r>
-                              <w:rPr>
-                                <w:lang w:val="en-GB"/>
-                              </w:rPr>
-                              <w:t>(</w:t>
+                              <w:t>Dic</w:t>
                             </w:r>
                             <w:r>
                               <w:rPr>
                                 <w:lang w:val="en-GB"/>
                               </w:rPr>
-                              <w:t xml:space="preserve"> </w:t>
-                            </w:r>
-                            <w:r>
-                              <w:rPr>
-                                <w:b/>
-                                <w:bCs/>
-                                <w:lang w:val="en-GB"/>
-                              </w:rPr>
-                              <w:t>CYP</w:t>
-                            </w:r>
-                            <w:proofErr w:type="gramEnd"/>
-                            <w:r>
-                              <w:rPr>
-                                <w:b/>
-                                <w:bCs/>
-                                <w:lang w:val="en-GB"/>
-                              </w:rPr>
-                              <w:t xml:space="preserve"> </w:t>
-                            </w:r>
-                            <w:proofErr w:type="gramStart"/>
-                            <w:r>
-                              <w:rPr>
-                                <w:b/>
-                                <w:bCs/>
-                                <w:lang w:val="en-GB"/>
-                              </w:rPr>
-                              <w:t>name</w:t>
-                            </w:r>
-                            <w:r>
-                              <w:rPr>
-                                <w:b/>
-                                <w:bCs/>
-                                <w:lang w:val="en-GB"/>
-                              </w:rPr>
-                              <w:t xml:space="preserve"> </w:t>
-                            </w:r>
-                            <w:r>
-                              <w:rPr>
-                                <w:lang w:val="en-GB"/>
-                              </w:rPr>
-                              <w:t>:</w:t>
-                            </w:r>
-                            <w:proofErr w:type="gramEnd"/>
-                            <w:r>
-                              <w:rPr>
-                                <w:lang w:val="en-GB"/>
-                              </w:rPr>
-                              <w:t xml:space="preserve"> Nº of </w:t>
-                            </w:r>
-                            <w:proofErr w:type="gramStart"/>
-                            <w:r>
-                              <w:rPr>
-                                <w:lang w:val="en-GB"/>
-                              </w:rPr>
-                              <w:t>appearances )</w:t>
+                              <w:t>t( CYP name : Nº of appearances )</w:t>
                             </w:r>
                             <w:bookmarkEnd w:id="29"/>
                             <w:bookmarkEnd w:id="30"/>
-                            <w:proofErr w:type="gramEnd"/>
                           </w:p>
                         </w:txbxContent>
                       </wps:txbx>
@@ -11882,14 +13749,12 @@
                         </w:rPr>
                         <w:t>‘</w:t>
                       </w:r>
-                      <w:proofErr w:type="spellStart"/>
                       <w:r>
                         <w:rPr>
                           <w:lang w:val="en-GB"/>
                         </w:rPr>
                         <w:t>dict</w:t>
                       </w:r>
-                      <w:proofErr w:type="spellEnd"/>
                       <w:r>
                         <w:rPr>
                           <w:lang w:val="en-GB"/>
@@ -11906,35 +13771,7 @@
                         <w:rPr>
                           <w:lang w:val="en-GB"/>
                         </w:rPr>
-                        <w:t xml:space="preserve"> for full </w:t>
-                      </w:r>
-                      <w:proofErr w:type="spellStart"/>
-                      <w:r>
-                        <w:rPr>
-                          <w:lang w:val="en-GB"/>
-                        </w:rPr>
-                        <w:t>db</w:t>
-                      </w:r>
-                      <w:proofErr w:type="spellEnd"/>
-                      <w:r>
-                        <w:rPr>
-                          <w:lang w:val="en-GB"/>
-                        </w:rPr>
-                        <w:t xml:space="preserve"> (A) and curated </w:t>
-                      </w:r>
-                      <w:proofErr w:type="spellStart"/>
-                      <w:r>
-                        <w:rPr>
-                          <w:lang w:val="en-GB"/>
-                        </w:rPr>
-                        <w:t>db</w:t>
-                      </w:r>
-                      <w:proofErr w:type="spellEnd"/>
-                      <w:r>
-                        <w:rPr>
-                          <w:lang w:val="en-GB"/>
-                        </w:rPr>
-                        <w:t xml:space="preserve"> with threshold = 10 (B)</w:t>
+                        <w:t xml:space="preserve"> for full db (A) and curated db with threshold = 10 (B)</w:t>
                       </w:r>
                       <w:r>
                         <w:rPr>
@@ -11948,84 +13785,20 @@
                         </w:rPr>
                         <w:t xml:space="preserve">  </w:t>
                       </w:r>
-                      <w:proofErr w:type="spellStart"/>
-                      <w:proofErr w:type="gramStart"/>
                       <w:r>
                         <w:rPr>
                           <w:lang w:val="en-GB"/>
                         </w:rPr>
-                        <w:t>Dict</w:t>
-                      </w:r>
-                      <w:proofErr w:type="spellEnd"/>
-                      <w:r>
-                        <w:rPr>
-                          <w:lang w:val="en-GB"/>
-                        </w:rPr>
-                        <w:t>(</w:t>
+                        <w:t>Dic</w:t>
                       </w:r>
                       <w:r>
                         <w:rPr>
                           <w:lang w:val="en-GB"/>
                         </w:rPr>
-                        <w:t xml:space="preserve"> </w:t>
-                      </w:r>
-                      <w:r>
-                        <w:rPr>
-                          <w:b/>
-                          <w:bCs/>
-                          <w:lang w:val="en-GB"/>
-                        </w:rPr>
-                        <w:t>CYP</w:t>
-                      </w:r>
-                      <w:proofErr w:type="gramEnd"/>
-                      <w:r>
-                        <w:rPr>
-                          <w:b/>
-                          <w:bCs/>
-                          <w:lang w:val="en-GB"/>
-                        </w:rPr>
-                        <w:t xml:space="preserve"> </w:t>
-                      </w:r>
-                      <w:proofErr w:type="gramStart"/>
-                      <w:r>
-                        <w:rPr>
-                          <w:b/>
-                          <w:bCs/>
-                          <w:lang w:val="en-GB"/>
-                        </w:rPr>
-                        <w:t>name</w:t>
-                      </w:r>
-                      <w:r>
-                        <w:rPr>
-                          <w:b/>
-                          <w:bCs/>
-                          <w:lang w:val="en-GB"/>
-                        </w:rPr>
-                        <w:t xml:space="preserve"> </w:t>
-                      </w:r>
-                      <w:r>
-                        <w:rPr>
-                          <w:lang w:val="en-GB"/>
-                        </w:rPr>
-                        <w:t>:</w:t>
-                      </w:r>
-                      <w:proofErr w:type="gramEnd"/>
-                      <w:r>
-                        <w:rPr>
-                          <w:lang w:val="en-GB"/>
-                        </w:rPr>
-                        <w:t xml:space="preserve"> Nº of </w:t>
-                      </w:r>
-                      <w:proofErr w:type="gramStart"/>
-                      <w:r>
-                        <w:rPr>
-                          <w:lang w:val="en-GB"/>
-                        </w:rPr>
-                        <w:t>appearances )</w:t>
+                        <w:t>t( CYP name : Nº of appearances )</w:t>
                       </w:r>
                       <w:bookmarkEnd w:id="32"/>
                       <w:bookmarkEnd w:id="33"/>
-                      <w:proofErr w:type="gramEnd"/>
                     </w:p>
                   </w:txbxContent>
                 </v:textbox>
@@ -12321,6 +14094,7 @@
           <w:lang w:val="en-GB" w:eastAsia="en-GB"/>
         </w:rPr>
       </w:pPr>
+      <w:proofErr w:type="spellStart"/>
       <w:r>
         <w:rPr>
           <w:b/>
@@ -12329,6 +14103,7 @@
         </w:rPr>
         <w:t>DrugBank</w:t>
       </w:r>
+      <w:proofErr w:type="spellEnd"/>
       <w:r>
         <w:rPr>
           <w:b/>
@@ -12346,7 +14121,7 @@
             <w:color w:val="000000"/>
             <w:lang w:val="en-GB" w:eastAsia="en-GB"/>
           </w:rPr>
-          <w:tag w:val="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"/>
+          <w:tag w:val="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"/>
           <w:id w:val="-1174185752"/>
           <w:placeholder>
             <w:docPart w:val="DefaultPlaceholder_-1854013440"/>
@@ -12361,7 +14136,7 @@
               <w:color w:val="000000"/>
               <w:lang w:val="en-GB" w:eastAsia="en-GB"/>
             </w:rPr>
-            <w:t>[24]</w:t>
+            <w:t>[26]</w:t>
           </w:r>
         </w:sdtContent>
       </w:sdt>
@@ -12479,13 +14254,23 @@
           <w:lang w:val="en-GB" w:eastAsia="en-GB"/>
         </w:rPr>
       </w:pPr>
+      <w:proofErr w:type="spellStart"/>
       <w:r>
         <w:rPr>
           <w:b/>
           <w:bCs/>
           <w:lang w:val="en-GB" w:eastAsia="en-GB"/>
         </w:rPr>
-        <w:t xml:space="preserve">ChEMBL </w:t>
+        <w:t>ChEMBL</w:t>
+      </w:r>
+      <w:proofErr w:type="spellEnd"/>
+      <w:r>
+        <w:rPr>
+          <w:b/>
+          <w:bCs/>
+          <w:lang w:val="en-GB" w:eastAsia="en-GB"/>
+        </w:rPr>
+        <w:t xml:space="preserve"> </w:t>
       </w:r>
       <w:sdt>
         <w:sdtPr>
@@ -12496,7 +14281,7 @@
             <w:color w:val="000000"/>
             <w:lang w:val="en-GB" w:eastAsia="en-GB"/>
           </w:rPr>
-          <w:tag w:val="MENDELEY_CITATION_v3_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"/>
+          <w:tag w:val="MENDELEY_CITATION_v3_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"/>
           <w:id w:val="-1193225435"/>
           <w:placeholder>
             <w:docPart w:val="DefaultPlaceholder_-1854013440"/>
@@ -12511,7 +14296,7 @@
               <w:color w:val="000000"/>
               <w:lang w:val="en-GB" w:eastAsia="en-GB"/>
             </w:rPr>
-            <w:t>[25]</w:t>
+            <w:t>[27]</w:t>
           </w:r>
         </w:sdtContent>
       </w:sdt>
@@ -12528,14 +14313,7 @@
         <w:rPr>
           <w:lang w:val="en-GB" w:eastAsia="en-GB"/>
         </w:rPr>
-        <w:t xml:space="preserve"> It is a manually curated, freely accessible database that provides comprehensive bioactivity data for drug-like compounds. It integrates chemical, biological, </w:t>
-      </w:r>
-      <w:r>
-        <w:rPr>
-          <w:lang w:val="en-GB" w:eastAsia="en-GB"/>
-        </w:rPr>
-        <w:lastRenderedPageBreak/>
-        <w:t>and pharmacological information, covering from compound structures to bioactivity measurements against biological targets. The data is primarily extracted from the primary medicinal chemistry literature.</w:t>
+        <w:t xml:space="preserve"> It is a manually curated, freely accessible database that provides comprehensive bioactivity data for drug-like compounds. It integrates chemical, biological, and pharmacological information, covering from compound structures to bioactivity measurements against biological targets. The data is primarily extracted from the primary medicinal chemistry literature.</w:t>
       </w:r>
       <w:r>
         <w:rPr>
@@ -12610,7 +14388,14 @@
         <w:rPr>
           <w:lang w:val="en-GB" w:eastAsia="en-GB"/>
         </w:rPr>
-        <w:t>The analysis of the InChI-based representation reveals several limitations that are important to contextualize the expected performance of the downstream models. These arise primarily from the characteristics of the source data and the constraints of the</w:t>
+        <w:t xml:space="preserve">The analysis of the InChI-based representation reveals several limitations that are important to contextualize the expected performance of the downstream models. These arise primarily from the </w:t>
+      </w:r>
+      <w:r>
+        <w:rPr>
+          <w:lang w:val="en-GB" w:eastAsia="en-GB"/>
+        </w:rPr>
+        <w:lastRenderedPageBreak/>
+        <w:t>characteristics of the source data and the constraints of the</w:t>
       </w:r>
       <w:r>
         <w:rPr>
@@ -12812,9 +14597,14 @@
         <w:rPr>
           <w:lang w:val="en-GB" w:eastAsia="en-GB"/>
         </w:rPr>
+        <w:t xml:space="preserve">Unfortunately, these repeated entries were not eliminated in what could have been an improvement of the workflow. </w:t>
+      </w:r>
+      <w:r>
+        <w:rPr>
+          <w:lang w:val="en-GB" w:eastAsia="en-GB"/>
+        </w:rPr>
         <w:t xml:space="preserve">However, </w:t>
       </w:r>
-      <w:proofErr w:type="gramStart"/>
       <w:r>
         <w:rPr>
           <w:lang w:val="en-GB" w:eastAsia="en-GB"/>
@@ -12825,15 +14615,8 @@
         <w:rPr>
           <w:lang w:val="en-GB" w:eastAsia="en-GB"/>
         </w:rPr>
-        <w:t xml:space="preserve">type of </w:t>
-      </w:r>
-      <w:r>
-        <w:rPr>
-          <w:lang w:val="en-GB" w:eastAsia="en-GB"/>
-        </w:rPr>
-        <w:t>structures</w:t>
-      </w:r>
-      <w:proofErr w:type="gramEnd"/>
+        <w:t>types of structures</w:t>
+      </w:r>
       <w:r>
         <w:rPr>
           <w:lang w:val="en-GB" w:eastAsia="en-GB"/>
@@ -12888,6 +14671,12 @@
         </w:rPr>
         <w:t>scale chemical databases.</w:t>
       </w:r>
+      <w:r>
+        <w:rPr>
+          <w:lang w:val="en-GB" w:eastAsia="en-GB"/>
+        </w:rPr>
+        <w:t xml:space="preserve"> </w:t>
+      </w:r>
     </w:p>
     <w:p>
       <w:pPr>
@@ -12974,6 +14763,7 @@
       </w:pPr>
       <w:r>
         <w:rPr>
+          <w:noProof/>
           <w:lang w:val="en-GB" w:eastAsia="en-GB"/>
         </w:rPr>
         <w:lastRenderedPageBreak/>
@@ -13056,13 +14846,7 @@
         <w:rPr>
           <w:lang w:val="en-GB"/>
         </w:rPr>
-        <w:t xml:space="preserve"> </w:t>
-      </w:r>
-      <w:r>
-        <w:rPr>
-          <w:lang w:val="en-GB"/>
-        </w:rPr>
-        <w:t>Distribution of InChI string lengths with fitted log-normal distribution. The histogram represents the empirical distribution, with the x-axis truncated at the 99th percentile to improve visual clarity by excluding extreme outliers. The dashed red line corresponds to a fitted log-normal distribution, shown for reference to illustrate the overall shape of the data.</w:t>
+        <w:t xml:space="preserve"> Distribution of InChI string lengths with fitted log-normal distribution. The histogram represents the empirical distribution, with the x-axis truncated at the 99th percentile to improve visual clarity by excluding extreme outliers. The dashed red line corresponds to a fitted log-normal distribution, shown for reference to illustrate the overall shape of the data.</w:t>
       </w:r>
       <w:bookmarkEnd w:id="38"/>
     </w:p>
@@ -13158,6 +14942,7 @@
       </w:pPr>
       <w:r>
         <w:rPr>
+          <w:noProof/>
           <w:lang w:val="en-GB" w:eastAsia="en-GB"/>
         </w:rPr>
         <w:lastRenderedPageBreak/>
@@ -13243,24 +15028,18 @@
         <w:rPr>
           <w:lang w:val="en-GB"/>
         </w:rPr>
+        <w:t xml:space="preserve"> Distribution of tokenized InChI sequence lengths</w:t>
+      </w:r>
+      <w:r>
+        <w:rPr>
+          <w:lang w:val="en-GB"/>
+        </w:rPr>
         <w:t xml:space="preserve"> </w:t>
       </w:r>
       <w:r>
         <w:rPr>
           <w:lang w:val="en-GB"/>
         </w:rPr>
-        <w:t>Distribution of tokenized InChI sequence lengths</w:t>
-      </w:r>
-      <w:r>
-        <w:rPr>
-          <w:lang w:val="en-GB"/>
-        </w:rPr>
-        <w:t xml:space="preserve"> </w:t>
-      </w:r>
-      <w:r>
-        <w:rPr>
-          <w:lang w:val="en-GB"/>
-        </w:rPr>
         <w:t xml:space="preserve">with fitted log-normal distribution. </w:t>
       </w:r>
       <w:r>
@@ -13346,19 +15125,7 @@
         <w:rPr>
           <w:lang w:val="en-GB" w:eastAsia="en-GB"/>
         </w:rPr>
-        <w:t xml:space="preserve">Overall, the InChI representation is structurally consistent and efficiently tokenized, enabling its use in a machine learning context. The most relevant limitation is the lack of stereochemical information, which may restrict the model’s ability to capture certain metabolic effects. The dataset also contains moderate duplication and exhibits a long-tail distribution of molecular complexity, both of which are characteristic of real-world chemical databases and are appropriately managed within the pipeline. These factors are well understood and provide a clear context for interpreting the results of the </w:t>
-      </w:r>
-      <w:r>
-        <w:rPr>
-          <w:lang w:val="en-GB" w:eastAsia="en-GB"/>
-        </w:rPr>
-        <w:t>modelling</w:t>
-      </w:r>
-      <w:r>
-        <w:rPr>
-          <w:lang w:val="en-GB" w:eastAsia="en-GB"/>
-        </w:rPr>
-        <w:t xml:space="preserve"> stage.</w:t>
+        <w:t>Overall, the InChI representation is structurally consistent and efficiently tokenized, enabling its use in a machine learning context. The most relevant limitation is the lack of stereochemical information, which may restrict the model’s ability to capture certain metabolic effects. The dataset also contains moderate duplication and exhibits a long-tail distribution of molecular complexity, both of which are characteristic of real-world chemical databases and are appropriately managed within the pipeline. These factors are well understood and provide a clear context for interpreting the results of the modelling stage.</w:t>
       </w:r>
     </w:p>
     <w:p>
@@ -13884,13 +15651,23 @@
         </w:rPr>
         <w:t xml:space="preserve">To complement the fingerprint-based molecular representation, pretrained molecular embeddings were generated using </w:t>
       </w:r>
+      <w:proofErr w:type="spellStart"/>
       <w:r>
         <w:rPr>
           <w:b/>
           <w:bCs/>
           <w:lang w:val="en-GB"/>
         </w:rPr>
-        <w:t>MolE (Molecular Embeddings)</w:t>
+        <w:t>MolE</w:t>
+      </w:r>
+      <w:proofErr w:type="spellEnd"/>
+      <w:r>
+        <w:rPr>
+          <w:b/>
+          <w:bCs/>
+          <w:lang w:val="en-GB"/>
+        </w:rPr>
+        <w:t xml:space="preserve"> (Molecular Embeddings)</w:t>
       </w:r>
       <w:r>
         <w:rPr>
@@ -13909,7 +15686,7 @@
             <w:color w:val="000000"/>
             <w:lang w:val="en-GB"/>
           </w:rPr>
-          <w:tag w:val="MENDELEY_CITATION_v3_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"/>
+          <w:tag w:val="MENDELEY_CITATION_v3_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"/>
           <w:id w:val="56376127"/>
           <w:placeholder>
             <w:docPart w:val="DefaultPlaceholder_-1854013440"/>
@@ -13924,7 +15701,7 @@
               <w:color w:val="000000"/>
               <w:lang w:val="en-GB"/>
             </w:rPr>
-            <w:t>[26]</w:t>
+            <w:t>[28]</w:t>
           </w:r>
         </w:sdtContent>
       </w:sdt>
@@ -15386,7 +17163,7 @@
           <w:noProof/>
           <w:lang w:val="en-GB"/>
         </w:rPr>
-        <w:t>‑</w:t>
+        <w:t>-</w:t>
       </w:r>
       <w:r>
         <w:rPr>
@@ -21717,6 +23494,7 @@
     <w:rsid w:val="000477E6"/>
     <w:rsid w:val="00053E7E"/>
     <w:rsid w:val="00055CD9"/>
+    <w:rsid w:val="000E611C"/>
     <w:rsid w:val="001715BC"/>
     <w:rsid w:val="001751C5"/>
     <w:rsid w:val="00182198"/>
@@ -21724,6 +23502,7 @@
     <w:rsid w:val="001D5659"/>
     <w:rsid w:val="00203B50"/>
     <w:rsid w:val="00222139"/>
+    <w:rsid w:val="00253AC9"/>
     <w:rsid w:val="002F3C94"/>
     <w:rsid w:val="003012D3"/>
     <w:rsid w:val="00334480"/>
@@ -21734,6 +23513,7 @@
     <w:rsid w:val="0049572F"/>
     <w:rsid w:val="004B78DD"/>
     <w:rsid w:val="004D7667"/>
+    <w:rsid w:val="004F35EA"/>
     <w:rsid w:val="00501E40"/>
     <w:rsid w:val="005523F1"/>
     <w:rsid w:val="00627190"/>
@@ -21746,8 +23526,10 @@
     <w:rsid w:val="00842924"/>
     <w:rsid w:val="008B4090"/>
     <w:rsid w:val="008D558E"/>
+    <w:rsid w:val="008F4171"/>
     <w:rsid w:val="00912A44"/>
     <w:rsid w:val="00981D56"/>
+    <w:rsid w:val="009A1350"/>
     <w:rsid w:val="009E184F"/>
     <w:rsid w:val="00A3335C"/>
     <w:rsid w:val="00A72DA5"/>
@@ -22215,7 +23997,7 @@
     <w:basedOn w:val="DefaultParagraphFont"/>
     <w:uiPriority w:val="99"/>
     <w:semiHidden/>
-    <w:rsid w:val="00053E7E"/>
+    <w:rsid w:val="008F4171"/>
     <w:rPr>
       <w:color w:val="666666"/>
     </w:rPr>
@@ -22506,9 +24288,9 @@
     <we:reference id="WA104382081" version="1.35.0.0" store="" storeType="OMEX"/>
   </we:alternateReferences>
   <we:properties>
-    <we:property name="MENDELEY_BIBLIOGRAPHY_IS_DIRTY" value="false"/>
+    <we:property name="MENDELEY_BIBLIOGRAPHY_IS_DIRTY" value="true"/>
     <we:property name="MENDELEY_BIBLIOGRAPHY_LAST_MODIFIED" value="1776289339762"/>
-    <we:property name="MENDELEY_CITATIONS" value="[{&quot;citationID&quot;:&quot;MENDELEY_CITATION_917e5d1d-8132-466d-b0a6-a0da3177f8a4&quot;,&quot;properties&quot;:{&quot;noteIndex&quot;:0},&quot;isEdited&quot;:false,&quot;manualOverride&quot;:{&quot;isManuallyOverridden&quot;:false,&quot;citeprocText&quot;:&quot;[1]&quot;,&quot;manualOverrideText&quot;:&quot;&quot;},&quot;citationTag&quot;:&quot;MENDELEY_CITATION_v3_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&quot;,&quot;citationItems&quot;:[{&quot;id&quot;:&quot;bf4b9b8e-8cd4-3267-8fea-3e05e74bdeb9&quot;,&quot;itemData&quot;:{&quot;type&quot;:&quot;chapter&quot;,&quot;id&quot;:&quot;bf4b9b8e-8cd4-3267-8fea-3e05e74bdeb9&quot;,&quot;title&quot;:&quot;Drug Metabolism: Phase I and Phase II Metabolic Pathways&quot;,&quot;author&quot;:[{&quot;family&quot;:&quot;ul Amin Mohsin&quot;,&quot;given&quot;:&quot;Noor&quot;,&quot;parse-names&quot;:false,&quot;dropping-particle&quot;:&quot;&quot;,&quot;non-dropping-particle&quot;:&quot;&quot;},{&quot;family&quot;:&quot;Farrukh&quot;,&quot;given&quot;:&quot;Maryam&quot;,&quot;parse-names&quot;:false,&quot;dropping-particle&quot;:&quot;&quot;,&quot;non-dropping-particle&quot;:&quot;&quot;},{&quot;family&quot;:&quot;Shahzadi&quot;,&quot;given&quot;:&quot;Saba&quot;,&quot;parse-names&quot;:false,&quot;dropping-particle&quot;:&quot;&quot;,&quot;non-dropping-particle&quot;:&quot;&quot;},{&quot;family&quot;:&quot;Irfan&quot;,&quot;given&quot;:&quot;Muhammad&quot;,&quot;parse-names&quot;:false,&quot;dropping-particle&quot;:&quot;&quot;,&quot;non-dropping-particle&quot;:&quot;&quot;}],&quot;DOI&quot;:&quot;10.5772/intechopen.112854&quot;,&quot;issued&quot;:{&quot;date-parts&quot;:[[2024,2,14]]},&quot;container-title-short&quot;:&quot;&quot;},&quot;isTemporary&quot;:false}]},{&quot;citationID&quot;:&quot;MENDELEY_CITATION_4c61a503-9278-499d-9d99-f0a543c311cd&quot;,&quot;properties&quot;:{&quot;noteIndex&quot;:0},&quot;isEdited&quot;:false,&quot;manualOverride&quot;:{&quot;isManuallyOverridden&quot;:false,&quot;citeprocText&quot;:&quot;[2]&quot;,&quot;manualOverrideText&quot;:&quot;&quot;},&quot;citationTag&quot;:&quot;MENDELEY_CITATION_v3_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&quot;,&quot;citationItems&quot;:[{&quot;id&quot;:&quot;a7499272-8f2c-3731-b644-7b0aae951850&quot;,&quot;itemData&quot;:{&quot;type&quot;:&quot;article-journal&quot;,&quot;id&quot;:&quot;a7499272-8f2c-3731-b644-7b0aae951850&quot;,&quot;title&quot;:&quot;In silico ADME-Tox modeling: progress and prospects&quot;,&quot;author&quot;:[{&quot;family&quot;:&quot;Alqahtani&quot;,&quot;given&quot;:&quot;Saeed&quot;,&quot;parse-names&quot;:false,&quot;dropping-particle&quot;:&quot;&quot;,&quot;non-dropping-particle&quot;:&quot;&quot;}],&quot;container-title&quot;:&quot;Expert Opinion on Drug Metabolism &amp; Toxicology&quot;,&quot;DOI&quot;:&quot;10.1080/17425255.2017.1389897&quot;,&quot;ISSN&quot;:&quot;1742-5255&quot;,&quot;issued&quot;:{&quot;date-parts&quot;:[[2017,11,2]]},&quot;page&quot;:&quot;1147-1158&quot;,&quot;issue&quot;:&quot;11&quot;,&quot;volume&quot;:&quot;13&quot;,&quot;container-title-short&quot;:&quot;Expert Opin. Drug Metab. Toxicol.&quot;},&quot;isTemporary&quot;:false}]},{&quot;citationID&quot;:&quot;MENDELEY_CITATION_f9163c9d-db05-495c-82ad-845f41c010e3&quot;,&quot;properties&quot;:{&quot;noteIndex&quot;:0},&quot;isEdited&quot;:false,&quot;manualOverride&quot;:{&quot;isManuallyOverridden&quot;:false,&quot;citeprocText&quot;:&quot;[3]&quot;,&quot;manualOverrideText&quot;:&quot;&quot;},&quot;citationTag&quot;:&quot;MENDELEY_CITATION_v3_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&quot;,&quot;citationItems&quot;:[{&quot;id&quot;:&quot;41dab8de-eca9-3196-8661-835a96a3207d&quot;,&quot;itemData&quot;:{&quot;type&quot;:&quot;article-journal&quot;,&quot;id&quot;:&quot;41dab8de-eca9-3196-8661-835a96a3207d&quot;,&quot;title&quot;:&quot;Predicting routes of phase I and II metabolism based on quantum mechanics and machine learning&quot;,&quot;author&quot;:[{&quot;family&quot;:&quot;Öeren&quot;,&quot;given&quot;:&quot;Mario&quot;,&quot;parse-names&quot;:false,&quot;dropping-particle&quot;:&quot;&quot;,&quot;non-dropping-particle&quot;:&quot;&quot;},{&quot;family&quot;:&quot;Hunt&quot;,&quot;given&quot;:&quot;Peter A.&quot;,&quot;parse-names&quot;:false,&quot;dropping-particle&quot;:&quot;&quot;,&quot;non-dropping-particle&quot;:&quot;&quot;},{&quot;family&quot;:&quot;Wharrick&quot;,&quot;given&quot;:&quot;Charlotte E.&quot;,&quot;parse-names&quot;:false,&quot;dropping-particle&quot;:&quot;&quot;,&quot;non-dropping-particle&quot;:&quot;&quot;},{&quot;family&quot;:&quot;Tabatabaei Ghomi&quot;,&quot;given&quot;:&quot;Hamed&quot;,&quot;parse-names&quot;:false,&quot;dropping-particle&quot;:&quot;&quot;,&quot;non-dropping-particle&quot;:&quot;&quot;},{&quot;family&quot;:&quot;Segall&quot;,&quot;given&quot;:&quot;Matthew D.&quot;,&quot;parse-names&quot;:false,&quot;dropping-particle&quot;:&quot;&quot;,&quot;non-dropping-particle&quot;:&quot;&quot;}],&quot;container-title&quot;:&quot;Xenobiotica&quot;,&quot;DOI&quot;:&quot;10.1080/00498254.2023.2284251&quot;,&quot;ISSN&quot;:&quot;0049-8254&quot;,&quot;issued&quot;:{&quot;date-parts&quot;:[[2024,8,8]]},&quot;page&quot;:&quot;379-393&quot;,&quot;issue&quot;:&quot;7&quot;,&quot;volume&quot;:&quot;54&quot;,&quot;container-title-short&quot;:&quot;&quot;},&quot;isTemporary&quot;:false}]},{&quot;citationID&quot;:&quot;MENDELEY_CITATION_b3a78241-26d9-4c0f-a776-f58d6393a7c1&quot;,&quot;properties&quot;:{&quot;noteIndex&quot;:0},&quot;isEdited&quot;:false,&quot;manualOverride&quot;:{&quot;isManuallyOverridden&quot;:false,&quot;citeprocText&quot;:&quot;[4]&quot;,&quot;manualOverrideText&quot;:&quot;&quot;},&quot;citationTag&quot;:&quot;MENDELEY_CITATION_v3_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&quot;,&quot;citationItems&quot;:[{&quot;id&quot;:&quot;13bc8314-57b6-3cd6-845d-b642b9f122d5&quot;,&quot;itemData&quot;:{&quot;type&quot;:&quot;webpage&quot;,&quot;id&quot;:&quot;13bc8314-57b6-3cd6-845d-b642b9f122d5&quot;,&quot;title&quot;:&quot;Decoding phase I &amp; II human drug metabolism using the prediction tool MetaSite for chemists, medicinal chemists, and metID experts.&quot;,&quot;author&quot;:[{&quot;family&quot;:&quot;Cruciani&quot;,&quot;given&quot;:&quot;Gabriele&quot;,&quot;parse-names&quot;:false,&quot;dropping-particle&quot;:&quot;&quot;,&quot;non-dropping-particle&quot;:&quot;&quot;},{&quot;family&quot;:&quot;Desantis&quot;,&quot;given&quot;:&quot;Jenny&quot;,&quot;parse-names&quot;:false,&quot;dropping-particle&quot;:&quot;&quot;,&quot;non-dropping-particle&quot;:&quot;&quot;},{&quot;family&quot;:&quot;Palomba&quot;,&quot;given&quot;:&quot;Tommaso&quot;,&quot;parse-names&quot;:false,&quot;dropping-particle&quot;:&quot;&quot;,&quot;non-dropping-particle&quot;:&quot;&quot;},{&quot;family&quot;:&quot;Baroni&quot;,&quot;given&quot;:&quot;Massimo&quot;,&quot;parse-names&quot;:false,&quot;dropping-particle&quot;:&quot;&quot;,&quot;non-dropping-particle&quot;:&quot;&quot;},{&quot;family&quot;:&quot;Valeri&quot;,&quot;given&quot;:&quot;Aurora&quot;,&quot;parse-names&quot;:false,&quot;dropping-particle&quot;:&quot;&quot;,&quot;non-dropping-particle&quot;:&quot;&quot;},{&quot;family&quot;:&quot;Siragusa&quot;,&quot;given&quot;:&quot;Lydia&quot;,&quot;parse-names&quot;:false,&quot;dropping-particle&quot;:&quot;&quot;,&quot;non-dropping-particle&quot;:&quot;&quot;},{&quot;family&quot;:&quot;Venturi&quot;,&quot;given&quot;:&quot;Ludovico&quot;,&quot;parse-names&quot;:false,&quot;dropping-particle&quot;:&quot;&quot;,&quot;non-dropping-particle&quot;:&quot;&quot;},{&quot;family&quot;:&quot;Zamora&quot;,&quot;given&quot;:&quot;Ismael&quot;,&quot;parse-names&quot;:false,&quot;dropping-particle&quot;:&quot;&quot;,&quot;non-dropping-particle&quot;:&quot;&quot;},{&quot;family&quot;:&quot;Meyer&quot;,&quot;given&quot;:&quot;Christophe&quot;,&quot;parse-names&quot;:false,&quot;dropping-particle&quot;:&quot;&quot;,&quot;non-dropping-particle&quot;:&quot;&quot;},{&quot;family&quot;:&quot;Laboureur&quot;,&quot;given&quot;:&quot;Laurent&quot;,&quot;parse-names&quot;:false,&quot;dropping-particle&quot;:&quot;&quot;,&quot;non-dropping-particle&quot;:&quot;&quot;},{&quot;family&quot;:&quot;Emre&quot;,&quot;given&quot;:&quot;Isin&quot;,&quot;parse-names&quot;:false,&quot;dropping-particle&quot;:&quot;&quot;,&quot;non-dropping-particle&quot;:&quot;&quot;},{&quot;family&quot;:&quot;Goracci&quot;,&quot;given&quot;:&quot;Laura&quot;,&quot;parse-names&quot;:false,&quot;dropping-particle&quot;:&quot;&quot;,&quot;non-dropping-particle&quot;:&quot;&quot;}],&quot;issued&quot;:{&quot;date-parts&quot;:[[2024]]},&quot;container-title-short&quot;:&quot;&quot;},&quot;isTemporary&quot;:false}]},{&quot;citationID&quot;:&quot;MENDELEY_CITATION_a090304e-5ae5-4071-9395-15b690c02537&quot;,&quot;properties&quot;:{&quot;noteIndex&quot;:0},&quot;isEdited&quot;:false,&quot;manualOverride&quot;:{&quot;isManuallyOverridden&quot;:false,&quot;citeprocText&quot;:&quot;[5]&quot;,&quot;manualOverrideText&quot;:&quot;&quot;},&quot;citationTag&quot;:&quot;MENDELEY_CITATION_v3_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&quot;,&quot;citationItems&quot;:[{&quot;id&quot;:&quot;30167f7e-6772-397c-8d9b-7e31dc75bdc6&quot;,&quot;itemData&quot;:{&quot;type&quot;:&quot;article-journal&quot;,&quot;id&quot;:&quot;30167f7e-6772-397c-8d9b-7e31dc75bdc6&quot;,&quot;title&quot;:&quot;CYPstrate: A Set of Machine Learning Models for the Accurate Classification of Cytochrome P450 Enzyme Substrates and Non-Substrates&quot;,&quot;author&quot;:[{&quot;family&quot;:&quot;Holmer&quot;,&quot;given&quot;:&quot;Malte&quot;,&quot;parse-names&quot;:false,&quot;dropping-particle&quot;:&quot;&quot;,&quot;non-dropping-particle&quot;:&quot;&quot;},{&quot;family&quot;:&quot;Bruyn Kops&quot;,&quot;given&quot;:&quot;Christina&quot;,&quot;parse-names&quot;:false,&quot;dropping-particle&quot;:&quot;&quot;,&quot;non-dropping-particle&quot;:&quot;de&quot;},{&quot;family&quot;:&quot;Stork&quot;,&quot;given&quot;:&quot;Conrad&quot;,&quot;parse-names&quot;:false,&quot;dropping-particle&quot;:&quot;&quot;,&quot;non-dropping-particle&quot;:&quot;&quot;},{&quot;family&quot;:&quot;Kirchmair&quot;,&quot;given&quot;:&quot;Johannes&quot;,&quot;parse-names&quot;:false,&quot;dropping-particle&quot;:&quot;&quot;,&quot;non-dropping-particle&quot;:&quot;&quot;}],&quot;container-title&quot;:&quot;Molecules&quot;,&quot;DOI&quot;:&quot;10.3390/molecules26154678&quot;,&quot;ISSN&quot;:&quot;1420-3049&quot;,&quot;issued&quot;:{&quot;date-parts&quot;:[[2021,8,2]]},&quot;page&quot;:&quot;4678&quot;,&quot;abstract&quot;:&quot;&lt;p&gt;The interaction of small organic molecules such as drugs, agrochemicals, and cosmetics with cytochrome P450 enzymes (CYPs) can lead to substantial changes in the bioavailability of active substances and hence consequences with respect to pharmacological efficacy and toxicity. Therefore, efficient means of predicting the interactions of small organic molecules with CYPs are of high importance to a host of different industries. In this work, we present a new set of machine learning models for the classification of xenobiotics into substrates and non-substrates of nine human CYP isozymes: CYPs 1A2, 2A6, 2B6, 2C8, 2C9, 2C19, 2D6, 2E1, and 3A4. The models are trained on an extended, high-quality collection of known substrates and non-substrates and have been subjected to thorough validation. Our results show that the models yield competitive performance and are favorable for the detection of CYP substrates. In particular, a new consensus model reached high performance, with Matthews correlation coefficients (MCCs) between 0.45 (CYP2C8) and 0.85 (CYP3A4), although at the cost of coverage. The best models presented in this work are accessible free of charge via the “CYPstrate” module of the New E-Resource for Drug Discovery (NERDD).&lt;/p&gt;&quot;,&quot;issue&quot;:&quot;15&quot;,&quot;volume&quot;:&quot;26&quot;,&quot;container-title-short&quot;:&quot;&quot;},&quot;isTemporary&quot;:false}]},{&quot;citationID&quot;:&quot;MENDELEY_CITATION_b88c5398-356c-4dd6-910a-1154fc2a2abe&quot;,&quot;properties&quot;:{&quot;noteIndex&quot;:0},&quot;isEdited&quot;:false,&quot;manualOverride&quot;:{&quot;isManuallyOverridden&quot;:false,&quot;citeprocText&quot;:&quot;[6]&quot;,&quot;manualOverrideText&quot;:&quot;&quot;},&quot;citationTag&quot;:&quot;MENDELEY_CITATION_v3_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&quot;,&quot;citationItems&quot;:[{&quot;id&quot;:&quot;fa11ca6b-cdbb-3046-b0fc-8f028817e99c&quot;,&quot;itemData&quot;:{&quot;type&quot;:&quot;article-journal&quot;,&quot;id&quot;:&quot;fa11ca6b-cdbb-3046-b0fc-8f028817e99c&quot;,&quot;title&quot;:&quot;CypReact: A Software Tool for in Silico Reactant Prediction for Human Cytochrome P450 Enzymes&quot;,&quot;author&quot;:[{&quot;family&quot;:&quot;Tian&quot;,&quot;given&quot;:&quot;Siyang&quot;,&quot;parse-names&quot;:false,&quot;dropping-particle&quot;:&quot;&quot;,&quot;non-dropping-particle&quot;:&quot;&quot;},{&quot;family&quot;:&quot;Djoumbou-Feunang&quot;,&quot;given&quot;:&quot;Yannick&quot;,&quot;parse-names&quot;:false,&quot;dropping-particle&quot;:&quot;&quot;,&quot;non-dropping-particle&quot;:&quot;&quot;},{&quot;family&quot;:&quot;Greiner&quot;,&quot;given&quot;:&quot;Russell&quot;,&quot;parse-names&quot;:false,&quot;dropping-particle&quot;:&quot;&quot;,&quot;non-dropping-particle&quot;:&quot;&quot;},{&quot;family&quot;:&quot;Wishart&quot;,&quot;given&quot;:&quot;David S&quot;,&quot;parse-names&quot;:false,&quot;dropping-particle&quot;:&quot;&quot;,&quot;non-dropping-particle&quot;:&quot;&quot;}],&quot;container-title&quot;:&quot;Journal of Chemical Information and Modeling&quot;,&quot;DOI&quot;:&quot;10.1021/acs.jcim.8b00035&quot;,&quot;URL&quot;:&quot;https://doi.org/10.1021/acs.jcim.8b00035&quot;,&quot;issued&quot;:{&quot;date-parts&quot;:[[2018]]},&quot;page&quot;:&quot;1282-1291&quot;,&quot;issue&quot;:&quot;6&quot;,&quot;volume&quot;:&quot;58&quot;,&quot;container-title-short&quot;:&quot;J. Chem. Inf. Model.&quot;},&quot;isTemporary&quot;:false}]},{&quot;citationID&quot;:&quot;MENDELEY_CITATION_9e00beb5-b823-441f-bd21-5c0245227aff&quot;,&quot;properties&quot;:{&quot;noteIndex&quot;:0},&quot;isEdited&quot;:false,&quot;manualOverride&quot;:{&quot;isManuallyOverridden&quot;:false,&quot;citeprocText&quot;:&quot;[7]&quot;,&quot;manualOverrideText&quot;:&quot;&quot;},&quot;citationTag&quot;:&quot;MENDELEY_CITATION_v3_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&quot;,&quot;citationItems&quot;:[{&quot;id&quot;:&quot;5396d9c6-cb3b-363a-9678-0b3b627a7437&quot;,&quot;itemData&quot;:{&quot;type&quot;:&quot;article-journal&quot;,&quot;id&quot;:&quot;5396d9c6-cb3b-363a-9678-0b3b627a7437&quot;,&quot;title&quot;:&quot;DeepP450: Predicting Human P450 Activities of Small Molecules by Integrating Pretrained Protein Language Model and Molecular Representation&quot;,&quot;author&quot;:[{&quot;family&quot;:&quot;Chang&quot;,&quot;given&quot;:&quot;Jiamin&quot;,&quot;parse-names&quot;:false,&quot;dropping-particle&quot;:&quot;&quot;,&quot;non-dropping-particle&quot;:&quot;&quot;},{&quot;family&quot;:&quot;Fan&quot;,&quot;given&quot;:&quot;Xiaoyu&quot;,&quot;parse-names&quot;:false,&quot;dropping-particle&quot;:&quot;&quot;,&quot;non-dropping-particle&quot;:&quot;&quot;},{&quot;family&quot;:&quot;Tian&quot;,&quot;given&quot;:&quot;Boxue&quot;,&quot;parse-names&quot;:false,&quot;dropping-particle&quot;:&quot;&quot;,&quot;non-dropping-particle&quot;:&quot;&quot;}],&quot;container-title&quot;:&quot;Journal of Chemical Information and Modeling&quot;,&quot;DOI&quot;:&quot;10.1021/acs.jcim.4c00115&quot;,&quot;URL&quot;:&quot;https://doi.org/10.1021/acs.jcim.4c00115&quot;,&quot;issued&quot;:{&quot;date-parts&quot;:[[2024]]},&quot;page&quot;:&quot;3149-3160&quot;,&quot;issue&quot;:&quot;8&quot;,&quot;volume&quot;:&quot;64&quot;,&quot;container-title-short&quot;:&quot;J. Chem. Inf. Model.&quot;},&quot;isTemporary&quot;:false}]},{&quot;citationID&quot;:&quot;MENDELEY_CITATION_5dca3d77-b598-4d67-9225-e52ba676341f&quot;,&quot;properties&quot;:{&quot;noteIndex&quot;:0},&quot;isEdited&quot;:false,&quot;manualOverride&quot;:{&quot;isManuallyOverridden&quot;:false,&quot;citeprocText&quot;:&quot;[8]&quot;,&quot;manualOverrideText&quot;:&quot;&quot;},&quot;citationTag&quot;:&quot;MENDELEY_CITATION_v3_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&quot;,&quot;citationItems&quot;:[{&quot;id&quot;:&quot;43b0d024-e9b9-3059-b9bc-07339751aa6d&quot;,&quot;itemData&quot;:{&quot;type&quot;:&quot;article-journal&quot;,&quot;id&quot;:&quot;43b0d024-e9b9-3059-b9bc-07339751aa6d&quot;,&quot;title&quot;:&quot;ADMETlab 3.0: an updated comprehensive online ADMET prediction platform enhanced with broader coverage, improved performance, API functionality and decision support&quot;,&quot;author&quot;:[{&quot;family&quot;:&quot;Fu&quot;,&quot;given&quot;:&quot;Li&quot;,&quot;parse-names&quot;:false,&quot;dropping-particle&quot;:&quot;&quot;,&quot;non-dropping-particle&quot;:&quot;&quot;},{&quot;family&quot;:&quot;Shi&quot;,&quot;given&quot;:&quot;Shaohua&quot;,&quot;parse-names&quot;:false,&quot;dropping-particle&quot;:&quot;&quot;,&quot;non-dropping-particle&quot;:&quot;&quot;},{&quot;family&quot;:&quot;Yi&quot;,&quot;given&quot;:&quot;Jiacai&quot;,&quot;parse-names&quot;:false,&quot;dropping-particle&quot;:&quot;&quot;,&quot;non-dropping-particle&quot;:&quot;&quot;},{&quot;family&quot;:&quot;Wang&quot;,&quot;given&quot;:&quot;Ningning&quot;,&quot;parse-names&quot;:false,&quot;dropping-particle&quot;:&quot;&quot;,&quot;non-dropping-particle&quot;:&quot;&quot;},{&quot;family&quot;:&quot;He&quot;,&quot;given&quot;:&quot;Yuanhang&quot;,&quot;parse-names&quot;:false,&quot;dropping-particle&quot;:&quot;&quot;,&quot;non-dropping-particle&quot;:&quot;&quot;},{&quot;family&quot;:&quot;Wu&quot;,&quot;given&quot;:&quot;Zhenxing&quot;,&quot;parse-names&quot;:false,&quot;dropping-particle&quot;:&quot;&quot;,&quot;non-dropping-particle&quot;:&quot;&quot;},{&quot;family&quot;:&quot;Peng&quot;,&quot;given&quot;:&quot;Jinfu&quot;,&quot;parse-names&quot;:false,&quot;dropping-particle&quot;:&quot;&quot;,&quot;non-dropping-particle&quot;:&quot;&quot;},{&quot;family&quot;:&quot;Deng&quot;,&quot;given&quot;:&quot;Youchao&quot;,&quot;parse-names&quot;:false,&quot;dropping-particle&quot;:&quot;&quot;,&quot;non-dropping-particle&quot;:&quot;&quot;},{&quot;family&quot;:&quot;Wang&quot;,&quot;given&quot;:&quot;Wenxuan&quot;,&quot;parse-names&quot;:false,&quot;dropping-particle&quot;:&quot;&quot;,&quot;non-dropping-particle&quot;:&quot;&quot;},{&quot;family&quot;:&quot;Wu&quot;,&quot;given&quot;:&quot;Chengkun&quot;,&quot;parse-names&quot;:false,&quot;dropping-particle&quot;:&quot;&quot;,&quot;non-dropping-particle&quot;:&quot;&quot;},{&quot;family&quot;:&quot;Lyu&quot;,&quot;given&quot;:&quot;Aiping&quot;,&quot;parse-names&quot;:false,&quot;dropping-particle&quot;:&quot;&quot;,&quot;non-dropping-particle&quot;:&quot;&quot;},{&quot;family&quot;:&quot;Zeng&quot;,&quot;given&quot;:&quot;Xiangxiang&quot;,&quot;parse-names&quot;:false,&quot;dropping-particle&quot;:&quot;&quot;,&quot;non-dropping-particle&quot;:&quot;&quot;},{&quot;family&quot;:&quot;Zhao&quot;,&quot;given&quot;:&quot;Wentao&quot;,&quot;parse-names&quot;:false,&quot;dropping-particle&quot;:&quot;&quot;,&quot;non-dropping-particle&quot;:&quot;&quot;},{&quot;family&quot;:&quot;Hou&quot;,&quot;given&quot;:&quot;Tingjun&quot;,&quot;parse-names&quot;:false,&quot;dropping-particle&quot;:&quot;&quot;,&quot;non-dropping-particle&quot;:&quot;&quot;},{&quot;family&quot;:&quot;Cao&quot;,&quot;given&quot;:&quot;Dongsheng&quot;,&quot;parse-names&quot;:false,&quot;dropping-particle&quot;:&quot;&quot;,&quot;non-dropping-particle&quot;:&quot;&quot;}],&quot;container-title&quot;:&quot;Nucleic Acids Research&quot;,&quot;DOI&quot;:&quot;10.1093/nar/gkae236&quot;,&quot;ISSN&quot;:&quot;0305-1048&quot;,&quot;issued&quot;:{&quot;date-parts&quot;:[[2024,7,5]]},&quot;page&quot;:&quot;W422-W431&quot;,&quot;abstract&quot;:&quot;&lt;p&gt;ADMETlab 3.0 is the second updated version of the web server that provides a comprehensive and efficient platform for evaluating ADMET-related parameters as well as physicochemical properties and medicinal chemistry characteristics involved in the drug discovery process. This new release addresses the limitations of the previous version and offers broader coverage, improved performance, API functionality, and decision support. For supporting data and endpoints, this version includes 119 features, an increase of 31 compared to the previous version. The updated number of entries is 1.5 times larger than the previous version with over 400 000 entries. ADMETlab 3.0 incorporates a multi-task DMPNN architecture coupled with molecular descriptors, a method that not only guaranteed calculation speed for each endpoint simultaneously, but also achieved a superior performance in terms of accuracy and robustness. In addition, an API has been introduced to meet the growing demand for programmatic access to large amounts of data in ADMETlab 3.0. Moreover, this version includes uncertainty estimates in the prediction results, aiding in the confident selection of candidate compounds for further studies and experiments. ADMETlab 3.0 is publicly for access without the need for registration at: https://admetlab3.scbdd.com.&lt;/p&gt;&quot;,&quot;issue&quot;:&quot;W1&quot;,&quot;volume&quot;:&quot;52&quot;,&quot;container-title-short&quot;:&quot;Nucleic Acids Res.&quot;},&quot;isTemporary&quot;:false}]},{&quot;citationID&quot;:&quot;MENDELEY_CITATION_0e2af13d-1186-46c8-b802-9fb14303c0dc&quot;,&quot;properties&quot;:{&quot;noteIndex&quot;:0},&quot;isEdited&quot;:false,&quot;manualOverride&quot;:{&quot;isManuallyOverridden&quot;:false,&quot;citeprocText&quot;:&quot;[9]&quot;,&quot;manualOverrideText&quot;:&quot;&quot;},&quot;citationTag&quot;:&quot;MENDELEY_CITATION_v3_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&quot;,&quot;citationItems&quot;:[{&quot;id&quot;:&quot;23927d7f-21a8-33f9-bc4d-62bd50964d5d&quot;,&quot;itemData&quot;:{&quot;type&quot;:&quot;article-journal&quot;,&quot;id&quot;:&quot;23927d7f-21a8-33f9-bc4d-62bd50964d5d&quot;,&quot;title&quot;:&quot;The Generation of a Unique Machine Description for Chemical Structures-A Technique Developed at Chemical Abstracts Service.&quot;,&quot;author&quot;:[{&quot;family&quot;:&quot;Morgan&quot;,&quot;given&quot;:&quot;H. L.&quot;,&quot;parse-names&quot;:false,&quot;dropping-particle&quot;:&quot;&quot;,&quot;non-dropping-particle&quot;:&quot;&quot;}],&quot;container-title&quot;:&quot;Journal of Chemical Documentation&quot;,&quot;DOI&quot;:&quot;10.1021/c160017a018&quot;,&quot;ISSN&quot;:&quot;0021-9576&quot;,&quot;issued&quot;:{&quot;date-parts&quot;:[[1965,5,1]]},&quot;page&quot;:&quot;107-113&quot;,&quot;issue&quot;:&quot;2&quot;,&quot;volume&quot;:&quot;5&quot;,&quot;container-title-short&quot;:&quot;J. Chem. Doc.&quot;},&quot;isTemporary&quot;:false}]},{&quot;citationID&quot;:&quot;MENDELEY_CITATION_7594bf8b-015d-49aa-b108-510a5eae62b9&quot;,&quot;properties&quot;:{&quot;noteIndex&quot;:0},&quot;isEdited&quot;:false,&quot;manualOverride&quot;:{&quot;isManuallyOverridden&quot;:false,&quot;citeprocText&quot;:&quot;[10]&quot;,&quot;manualOverrideText&quot;:&quot;&quot;},&quot;citationTag&quot;:&quot;MENDELEY_CITATION_v3_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&quot;,&quot;citationItems&quot;:[{&quot;id&quot;:&quot;80c5781c-7e86-33cf-b75b-5ab47acd2884&quot;,&quot;itemData&quot;:{&quot;type&quot;:&quot;article-journal&quot;,&quot;id&quot;:&quot;80c5781c-7e86-33cf-b75b-5ab47acd2884&quot;,&quot;title&quot;:&quot;Mol2vec: Unsupervised Machine Learning Approach with Chemical Intuition&quot;,&quot;author&quot;:[{&quot;family&quot;:&quot;Jaeger&quot;,&quot;given&quot;:&quot;Sabrina&quot;,&quot;parse-names&quot;:false,&quot;dropping-particle&quot;:&quot;&quot;,&quot;non-dropping-particle&quot;:&quot;&quot;},{&quot;family&quot;:&quot;Fulle&quot;,&quot;given&quot;:&quot;Simone&quot;,&quot;parse-names&quot;:false,&quot;dropping-particle&quot;:&quot;&quot;,&quot;non-dropping-particle&quot;:&quot;&quot;},{&quot;family&quot;:&quot;Turk&quot;,&quot;given&quot;:&quot;Samo&quot;,&quot;parse-names&quot;:false,&quot;dropping-particle&quot;:&quot;&quot;,&quot;non-dropping-particle&quot;:&quot;&quot;}],&quot;container-title&quot;:&quot;Journal of Chemical Information and Modeling&quot;,&quot;DOI&quot;:&quot;10.1021/acs.jcim.7b00616&quot;,&quot;ISSN&quot;:&quot;1549-9596&quot;,&quot;issued&quot;:{&quot;date-parts&quot;:[[2018,1,22]]},&quot;page&quot;:&quot;27-35&quot;,&quot;issue&quot;:&quot;1&quot;,&quot;volume&quot;:&quot;58&quot;,&quot;container-title-short&quot;:&quot;J. Chem. Inf. Model.&quot;},&quot;isTemporary&quot;:false}]},{&quot;citationID&quot;:&quot;MENDELEY_CITATION_70668c7c-96e7-42e2-8067-7b3fa3e95455&quot;,&quot;properties&quot;:{&quot;noteIndex&quot;:0},&quot;isEdited&quot;:false,&quot;manualOverride&quot;:{&quot;isManuallyOverridden&quot;:false,&quot;citeprocText&quot;:&quot;[11]&quot;,&quot;manualOverrideText&quot;:&quot;&quot;},&quot;citationTag&quot;:&quot;MENDELEY_CITATION_v3_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&quot;,&quot;citationItems&quot;:[{&quot;id&quot;:&quot;27f87688-13d2-35cf-b3cc-69d56bb2def3&quot;,&quot;itemData&quot;:{&quot;type&quot;:&quot;article-journal&quot;,&quot;id&quot;:&quot;27f87688-13d2-35cf-b3cc-69d56bb2def3&quot;,&quot;title&quot;:&quot;ChemBERTa: Large-Scale Self-Supervised Pretraining for Molecular Property Prediction&quot;,&quot;author&quot;:[{&quot;family&quot;:&quot;Chithrananda&quot;,&quot;given&quot;:&quot;Seyone&quot;,&quot;parse-names&quot;:false,&quot;dropping-particle&quot;:&quot;&quot;,&quot;non-dropping-particle&quot;:&quot;&quot;},{&quot;family&quot;:&quot;Grand&quot;,&quot;given&quot;:&quot;Gabriel&quot;,&quot;parse-names&quot;:false,&quot;dropping-particle&quot;:&quot;&quot;,&quot;non-dropping-particle&quot;:&quot;&quot;},{&quot;family&quot;:&quot;Ramsundar&quot;,&quot;given&quot;:&quot;Bharath&quot;,&quot;parse-names&quot;:false,&quot;dropping-particle&quot;:&quot;&quot;,&quot;non-dropping-particle&quot;:&quot;&quot;}],&quot;container-title&quot;:&quot;arXiv e-prints&quot;,&quot;DOI&quot;:&quot;10.48550/arXiv.2010.09885&quot;,&quot;issued&quot;:{&quot;date-parts&quot;:[[2020,10]]},&quot;page&quot;:&quot;arXiv:2010.09885&quot;,&quot;container-title-short&quot;:&quot;&quot;},&quot;isTemporary&quot;:false}]},{&quot;citationID&quot;:&quot;MENDELEY_CITATION_eed2f2c2-9fb7-481f-9847-505a31c7df76&quot;,&quot;properties&quot;:{&quot;noteIndex&quot;:0},&quot;isEdited&quot;:false,&quot;manualOverride&quot;:{&quot;isManuallyOverridden&quot;:false,&quot;citeprocText&quot;:&quot;[12]&quot;,&quot;manualOverrideText&quot;:&quot;&quot;},&quot;citationTag&quot;:&quot;MENDELEY_CITATION_v3_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&quot;,&quot;citationItems&quot;:[{&quot;id&quot;:&quot;6b3c2795-b358-3d30-b69e-b2ad6a5195ff&quot;,&quot;itemData&quot;:{&quot;type&quot;:&quot;article-journal&quot;,&quot;id&quot;:&quot;6b3c2795-b358-3d30-b69e-b2ad6a5195ff&quot;,&quot;title&quot;:&quot;MOLE: Modular Learning FramEwork via Mutual Information Maximization&quot;,&quot;author&quot;:[{&quot;family&quot;:&quot;Li&quot;,&quot;given&quot;:&quot;Tianchao&quot;,&quot;parse-names&quot;:false,&quot;dropping-particle&quot;:&quot;&quot;,&quot;non-dropping-particle&quot;:&quot;&quot;},{&quot;family&quot;:&quot;Pei&quot;,&quot;given&quot;:&quot;Yulong&quot;,&quot;parse-names&quot;:false,&quot;dropping-particle&quot;:&quot;&quot;,&quot;non-dropping-particle&quot;:&quot;&quot;}],&quot;container-title&quot;:&quot;ArXiv&quot;,&quot;URL&quot;:&quot;https://api.semanticscholar.org/CorpusID:260899882&quot;,&quot;issued&quot;:{&quot;date-parts&quot;:[[2023]]},&quot;volume&quot;:&quot;abs/2308.07772&quot;,&quot;container-title-short&quot;:&quot;ArXiv&quot;},&quot;isTemporary&quot;:false}]},{&quot;citationID&quot;:&quot;MENDELEY_CITATION_6911c6cb-3ce9-4960-b0ab-f73003ee0ccc&quot;,&quot;properties&quot;:{&quot;noteIndex&quot;:0},&quot;isEdited&quot;:false,&quot;manualOverride&quot;:{&quot;isManuallyOverridden&quot;:false,&quot;citeprocText&quot;:&quot;[13]&quot;,&quot;manualOverrideText&quot;:&quot;&quot;},&quot;citationTag&quot;:&quot;MENDELEY_CITATION_v3_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&quot;,&quot;citationItems&quot;:[{&quot;id&quot;:&quot;91bc1232-bb46-3423-9b4f-a14d74fb3264&quot;,&quot;itemData&quot;:{&quot;type&quot;:&quot;webpage&quot;,&quot;id&quot;:&quot;91bc1232-bb46-3423-9b4f-a14d74fb3264&quot;,&quot;title&quot;:&quot;RDKit: Open-source cheminformatics.&quot;,&quot;container-title&quot;:&quot;https://www.rdkit.org&quot;,&quot;container-title-short&quot;:&quot;&quot;},&quot;isTemporary&quot;:false}]},{&quot;citationID&quot;:&quot;MENDELEY_CITATION_091adfc3-c72b-452f-a882-3f98e173bfcc&quot;,&quot;properties&quot;:{&quot;noteIndex&quot;:0},&quot;isEdited&quot;:false,&quot;manualOverride&quot;:{&quot;isManuallyOverridden&quot;:false,&quot;citeprocText&quot;:&quot;[14]&quot;,&quot;manualOverrideText&quot;:&quot;&quot;},&quot;citationTag&quot;:&quot;MENDELEY_CITATION_v3_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&quot;,&quot;citationItems&quot;:[{&quot;id&quot;:&quot;1fdf973c-15b9-3df1-916b-2aad974dea3b&quot;,&quot;itemData&quot;:{&quot;type&quot;:&quot;article-journal&quot;,&quot;id&quot;:&quot;1fdf973c-15b9-3df1-916b-2aad974dea3b&quot;,&quot;title&quot;:&quot;Extended-Connectivity Fingerprints&quot;,&quot;author&quot;:[{&quot;family&quot;:&quot;Rogers&quot;,&quot;given&quot;:&quot;David&quot;,&quot;parse-names&quot;:false,&quot;dropping-particle&quot;:&quot;&quot;,&quot;non-dropping-particle&quot;:&quot;&quot;},{&quot;family&quot;:&quot;Hahn&quot;,&quot;given&quot;:&quot;Mathew&quot;,&quot;parse-names&quot;:false,&quot;dropping-particle&quot;:&quot;&quot;,&quot;non-dropping-particle&quot;:&quot;&quot;}],&quot;container-title&quot;:&quot;Journal of Chemical Information and Modeling&quot;,&quot;DOI&quot;:&quot;10.1021/ci100050t&quot;,&quot;URL&quot;:&quot;https://doi.org/10.1021/ci100050t&quot;,&quot;issued&quot;:{&quot;date-parts&quot;:[[2010]]},&quot;page&quot;:&quot;742-754&quot;,&quot;issue&quot;:&quot;5&quot;,&quot;volume&quot;:&quot;50&quot;,&quot;container-title-short&quot;:&quot;J. Chem. Inf. Model.&quot;},&quot;isTemporary&quot;:false}]},{&quot;citationID&quot;:&quot;MENDELEY_CITATION_05c57d48-f1ba-49fd-a3fb-d7b08348c075&quot;,&quot;properties&quot;:{&quot;noteIndex&quot;:0},&quot;isEdited&quot;:false,&quot;manualOverride&quot;:{&quot;isManuallyOverridden&quot;:false,&quot;citeprocText&quot;:&quot;[15]&quot;,&quot;manualOverrideText&quot;:&quot;&quot;},&quot;citationTag&quot;:&quot;MENDELEY_CITATION_v3_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&quot;,&quot;citationItems&quot;:[{&quot;id&quot;:&quot;16657982-092a-3db6-97ef-8ee47347c62e&quot;,&quot;itemData&quot;:{&quot;type&quot;:&quot;article-journal&quot;,&quot;id&quot;:&quot;16657982-092a-3db6-97ef-8ee47347c62e&quot;,&quot;title&quot;:&quot;Low-Compute repurposing of an English transformer into a molecular encoder: A two-stage SELFIES adaptation of RoBERTa&quot;,&quot;author&quot;:[{&quot;family&quot;:&quot;Alhmoudi&quot;,&quot;given&quot;:&quot;Obaid Khaleifah&quot;,&quot;parse-names&quot;:false,&quot;dropping-particle&quot;:&quot;&quot;,&quot;non-dropping-particle&quot;:&quot;&quot;},{&quot;family&quot;:&quot;Thameem&quot;,&quot;given&quot;:&quot;Muhammed&quot;,&quot;parse-names&quot;:false,&quot;dropping-particle&quot;:&quot;&quot;,&quot;non-dropping-particle&quot;:&quot;&quot;},{&quot;family&quot;:&quot;Elkamel&quot;,&quot;given&quot;:&quot;Ali&quot;,&quot;parse-names&quot;:false,&quot;dropping-particle&quot;:&quot;&quot;,&quot;non-dropping-particle&quot;:&quot;&quot;},{&quot;family&quot;:&quot;AlHammadi&quot;,&quot;given&quot;:&quot;Ali A.&quot;,&quot;parse-names&quot;:false,&quot;dropping-particle&quot;:&quot;&quot;,&quot;non-dropping-particle&quot;:&quot;&quot;}],&quot;container-title&quot;:&quot;Results in Engineering&quot;,&quot;DOI&quot;:&quot;10.1016/j.rineng.2025.108390&quot;,&quot;ISSN&quot;:&quot;25901230&quot;,&quot;issued&quot;:{&quot;date-parts&quot;:[[2025,12]]},&quot;page&quot;:&quot;108390&quot;,&quot;volume&quot;:&quot;28&quot;,&quot;container-title-short&quot;:&quot;&quot;},&quot;isTemporary&quot;:false}]},{&quot;citationID&quot;:&quot;MENDELEY_CITATION_61882ab6-be78-4074-86b7-8a58822453b0&quot;,&quot;properties&quot;:{&quot;noteIndex&quot;:0},&quot;isEdited&quot;:false,&quot;manualOverride&quot;:{&quot;isManuallyOverridden&quot;:false,&quot;citeprocText&quot;:&quot;[16], [17]&quot;,&quot;manualOverrideText&quot;:&quot;&quot;},&quot;citationTag&quot;:&quot;MENDELEY_CITATION_v3_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&quot;,&quot;citationItems&quot;:[{&quot;id&quot;:&quot;4b7e155f-c785-39de-bd3f-62287a2822db&quot;,&quot;itemData&quot;:{&quot;type&quot;:&quot;paper-conference&quot;,&quot;id&quot;:&quot;4b7e155f-c785-39de-bd3f-62287a2822db&quot;,&quot;title&quot;:&quot;BERT: Pre-training of Deep Bidirectional Transformers for Language Understanding&quot;,&quot;author&quot;:[{&quot;family&quot;:&quot;Devlin&quot;,&quot;given&quot;:&quot;Jacob&quot;,&quot;parse-names&quot;:false,&quot;dropping-particle&quot;:&quot;&quot;,&quot;non-dropping-particle&quot;:&quot;&quot;},{&quot;family&quot;:&quot;Chang&quot;,&quot;given&quot;:&quot;Ming-Wei&quot;,&quot;parse-names&quot;:false,&quot;dropping-particle&quot;:&quot;&quot;,&quot;non-dropping-particle&quot;:&quot;&quot;},{&quot;family&quot;:&quot;Lee&quot;,&quot;given&quot;:&quot;Kenton&quot;,&quot;parse-names&quot;:false,&quot;dropping-particle&quot;:&quot;&quot;,&quot;non-dropping-particle&quot;:&quot;&quot;},{&quot;family&quot;:&quot;Toutanova&quot;,&quot;given&quot;:&quot;Kristina&quot;,&quot;parse-names&quot;:false,&quot;dropping-particle&quot;:&quot;&quot;,&quot;non-dropping-particle&quot;:&quot;&quot;}],&quot;container-title&quot;:&quot;North American Chapter of the Association for Computational Linguistics&quot;,&quot;URL&quot;:&quot;https://api.semanticscholar.org/CorpusID:52967399&quot;,&quot;issued&quot;:{&quot;date-parts&quot;:[[2019]]},&quot;container-title-short&quot;:&quot;&quot;},&quot;isTemporary&quot;:false},{&quot;id&quot;:&quot;d6b0ebc7-a9eb-3e05-9f44-6d798a458d6c&quot;,&quot;itemData&quot;:{&quot;type&quot;:&quot;article-journal&quot;,&quot;id&quot;:&quot;d6b0ebc7-a9eb-3e05-9f44-6d798a458d6c&quot;,&quot;title&quot;:&quot;RoBERTa: A Robustly Optimized BERT Pretraining Approach&quot;,&quot;author&quot;:[{&quot;family&quot;:&quot;Liu&quot;,&quot;given&quot;:&quot;Yinhan&quot;,&quot;parse-names&quot;:false,&quot;dropping-particle&quot;:&quot;&quot;,&quot;non-dropping-particle&quot;:&quot;&quot;},{&quot;family&quot;:&quot;Ott&quot;,&quot;given&quot;:&quot;Myle&quot;,&quot;parse-names&quot;:false,&quot;dropping-particle&quot;:&quot;&quot;,&quot;non-dropping-particle&quot;:&quot;&quot;},{&quot;family&quot;:&quot;Goyal&quot;,&quot;given&quot;:&quot;Naman&quot;,&quot;parse-names&quot;:false,&quot;dropping-particle&quot;:&quot;&quot;,&quot;non-dropping-particle&quot;:&quot;&quot;},{&quot;family&quot;:&quot;Du&quot;,&quot;given&quot;:&quot;Jingfei&quot;,&quot;parse-names&quot;:false,&quot;dropping-particle&quot;:&quot;&quot;,&quot;non-dropping-particle&quot;:&quot;&quot;},{&quot;family&quot;:&quot;Joshi&quot;,&quot;given&quot;:&quot;Mandar&quot;,&quot;parse-names&quot;:false,&quot;dropping-particle&quot;:&quot;&quot;,&quot;non-dropping-particle&quot;:&quot;&quot;},{&quot;family&quot;:&quot;Chen&quot;,&quot;given&quot;:&quot;Danqi&quot;,&quot;parse-names&quot;:false,&quot;dropping-particle&quot;:&quot;&quot;,&quot;non-dropping-particle&quot;:&quot;&quot;},{&quot;family&quot;:&quot;Levy&quot;,&quot;given&quot;:&quot;Omer&quot;,&quot;parse-names&quot;:false,&quot;dropping-particle&quot;:&quot;&quot;,&quot;non-dropping-particle&quot;:&quot;&quot;},{&quot;family&quot;:&quot;Lewis&quot;,&quot;given&quot;:&quot;Mike&quot;,&quot;parse-names&quot;:false,&quot;dropping-particle&quot;:&quot;&quot;,&quot;non-dropping-particle&quot;:&quot;&quot;},{&quot;family&quot;:&quot;Zettlemoyer&quot;,&quot;given&quot;:&quot;Luke&quot;,&quot;parse-names&quot;:false,&quot;dropping-particle&quot;:&quot;&quot;,&quot;non-dropping-particle&quot;:&quot;&quot;},{&quot;family&quot;:&quot;Stoyanov&quot;,&quot;given&quot;:&quot;Veselin&quot;,&quot;parse-names&quot;:false,&quot;dropping-particle&quot;:&quot;&quot;,&quot;non-dropping-particle&quot;:&quot;&quot;}],&quot;container-title&quot;:&quot;ArXiv&quot;,&quot;URL&quot;:&quot;https://api.semanticscholar.org/CorpusID:198953378&quot;,&quot;issued&quot;:{&quot;date-parts&quot;:[[2019]]},&quot;volume&quot;:&quot;abs/1907.11692&quot;,&quot;container-title-short&quot;:&quot;ArXiv&quot;},&quot;isTemporary&quot;:false}]},{&quot;citationID&quot;:&quot;MENDELEY_CITATION_7f594b16-8ad5-4013-aee5-cc9efd81053f&quot;,&quot;properties&quot;:{&quot;noteIndex&quot;:0},&quot;isEdited&quot;:false,&quot;manualOverride&quot;:{&quot;isManuallyOverridden&quot;:false,&quot;citeprocText&quot;:&quot;[18]&quot;,&quot;manualOverrideText&quot;:&quot;&quot;},&quot;citationTag&quot;:&quot;MENDELEY_CITATION_v3_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&quot;,&quot;citationItems&quot;:[{&quot;id&quot;:&quot;528eede6-a120-383e-9473-16c5f897d2c4&quot;,&quot;itemData&quot;:{&quot;type&quot;:&quot;article-journal&quot;,&quot;id&quot;:&quot;528eede6-a120-383e-9473-16c5f897d2c4&quot;,&quot;title&quot;:&quot;Neural Machine Translation of Rare Words with Subword Units&quot;,&quot;author&quot;:[{&quot;family&quot;:&quot;Sennrich&quot;,&quot;given&quot;:&quot;Rico&quot;,&quot;parse-names&quot;:false,&quot;dropping-particle&quot;:&quot;&quot;,&quot;non-dropping-particle&quot;:&quot;&quot;},{&quot;family&quot;:&quot;Haddow&quot;,&quot;given&quot;:&quot;Barry&quot;,&quot;parse-names&quot;:false,&quot;dropping-particle&quot;:&quot;&quot;,&quot;non-dropping-particle&quot;:&quot;&quot;},{&quot;family&quot;:&quot;Birch&quot;,&quot;given&quot;:&quot;Alexandra&quot;,&quot;parse-names&quot;:false,&quot;dropping-particle&quot;:&quot;&quot;,&quot;non-dropping-particle&quot;:&quot;&quot;}],&quot;container-title&quot;:&quot;ArXiv&quot;,&quot;URL&quot;:&quot;https://api.semanticscholar.org/CorpusID:1114678&quot;,&quot;issued&quot;:{&quot;date-parts&quot;:[[2015]]},&quot;volume&quot;:&quot;abs/1508.07909&quot;,&quot;container-title-short&quot;:&quot;ArXiv&quot;},&quot;isTemporary&quot;:false}]},{&quot;citationID&quot;:&quot;MENDELEY_CITATION_800b8284-81e8-409a-a9d8-f65b34f75303&quot;,&quot;properties&quot;:{&quot;noteIndex&quot;:0},&quot;isEdited&quot;:false,&quot;manualOverride&quot;:{&quot;isManuallyOverridden&quot;:false,&quot;citeprocText&quot;:&quot;[19]&quot;,&quot;manualOverrideText&quot;:&quot;&quot;},&quot;citationTag&quot;:&quot;MENDELEY_CITATION_v3_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&quot;,&quot;citationItems&quot;:[{&quot;id&quot;:&quot;038f20e1-2011-366e-8442-37bf6e4fda69&quot;,&quot;itemData&quot;:{&quot;type&quot;:&quot;article-journal&quot;,&quot;id&quot;:&quot;038f20e1-2011-366e-8442-37bf6e4fda69&quot;,&quot;title&quot;:&quot;InChI, the IUPAC International Chemical Identifier&quot;,&quot;author&quot;:[{&quot;family&quot;:&quot;Heller&quot;,&quot;given&quot;:&quot;Stephen R&quot;,&quot;parse-names&quot;:false,&quot;dropping-particle&quot;:&quot;&quot;,&quot;non-dropping-particle&quot;:&quot;&quot;},{&quot;family&quot;:&quot;McNaught&quot;,&quot;given&quot;:&quot;Alan&quot;,&quot;parse-names&quot;:false,&quot;dropping-particle&quot;:&quot;&quot;,&quot;non-dropping-particle&quot;:&quot;&quot;},{&quot;family&quot;:&quot;Pletnev&quot;,&quot;given&quot;:&quot;Igor&quot;,&quot;parse-names&quot;:false,&quot;dropping-particle&quot;:&quot;&quot;,&quot;non-dropping-particle&quot;:&quot;&quot;},{&quot;family&quot;:&quot;Stein&quot;,&quot;given&quot;:&quot;Stephen&quot;,&quot;parse-names&quot;:false,&quot;dropping-particle&quot;:&quot;&quot;,&quot;non-dropping-particle&quot;:&quot;&quot;},{&quot;family&quot;:&quot;Tchekhovskoi&quot;,&quot;given&quot;:&quot;Dmitrii&quot;,&quot;parse-names&quot;:false,&quot;dropping-particle&quot;:&quot;&quot;,&quot;non-dropping-particle&quot;:&quot;&quot;}],&quot;container-title&quot;:&quot;Journal of Cheminformatics&quot;,&quot;DOI&quot;:&quot;10.1186/s13321-015-0068-4&quot;,&quot;ISSN&quot;:&quot;1758-2946&quot;,&quot;issued&quot;:{&quot;date-parts&quot;:[[2015,12,30]]},&quot;page&quot;:&quot;23&quot;,&quot;issue&quot;:&quot;1&quot;,&quot;volume&quot;:&quot;7&quot;,&quot;container-title-short&quot;:&quot;J. Cheminform.&quot;},&quot;isTemporary&quot;:false}]},{&quot;citationID&quot;:&quot;MENDELEY_CITATION_df1d1646-57ca-4a3f-825a-d5645cb9ad91&quot;,&quot;properties&quot;:{&quot;noteIndex&quot;:0},&quot;isEdited&quot;:false,&quot;manualOverride&quot;:{&quot;isManuallyOverridden&quot;:false,&quot;citeprocText&quot;:&quot;[16]&quot;,&quot;manualOverrideText&quot;:&quot;&quot;},&quot;citationTag&quot;:&quot;MENDELEY_CITATION_v3_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&quot;,&quot;citationItems&quot;:[{&quot;id&quot;:&quot;4b7e155f-c785-39de-bd3f-62287a2822db&quot;,&quot;itemData&quot;:{&quot;type&quot;:&quot;paper-conference&quot;,&quot;id&quot;:&quot;4b7e155f-c785-39de-bd3f-62287a2822db&quot;,&quot;title&quot;:&quot;BERT: Pre-training of Deep Bidirectional Transformers for Language Understanding&quot;,&quot;author&quot;:[{&quot;family&quot;:&quot;Devlin&quot;,&quot;given&quot;:&quot;Jacob&quot;,&quot;parse-names&quot;:false,&quot;dropping-particle&quot;:&quot;&quot;,&quot;non-dropping-particle&quot;:&quot;&quot;},{&quot;family&quot;:&quot;Chang&quot;,&quot;given&quot;:&quot;Ming-Wei&quot;,&quot;parse-names&quot;:false,&quot;dropping-particle&quot;:&quot;&quot;,&quot;non-dropping-particle&quot;:&quot;&quot;},{&quot;family&quot;:&quot;Lee&quot;,&quot;given&quot;:&quot;Kenton&quot;,&quot;parse-names&quot;:false,&quot;dropping-particle&quot;:&quot;&quot;,&quot;non-dropping-particle&quot;:&quot;&quot;},{&quot;family&quot;:&quot;Toutanova&quot;,&quot;given&quot;:&quot;Kristina&quot;,&quot;parse-names&quot;:false,&quot;dropping-particle&quot;:&quot;&quot;,&quot;non-dropping-particle&quot;:&quot;&quot;}],&quot;container-title&quot;:&quot;North American Chapter of the Association for Computational Linguistics&quot;,&quot;URL&quot;:&quot;https://api.semanticscholar.org/CorpusID:52967399&quot;,&quot;issued&quot;:{&quot;date-parts&quot;:[[2019]]},&quot;container-title-short&quot;:&quot;&quot;},&quot;isTemporary&quot;:false}]},{&quot;citationID&quot;:&quot;MENDELEY_CITATION_0856a272-5a9c-4c62-8ea9-15c71a2f59c4&quot;,&quot;properties&quot;:{&quot;noteIndex&quot;:0},&quot;isEdited&quot;:false,&quot;manualOverride&quot;:{&quot;isManuallyOverridden&quot;:false,&quot;citeprocText&quot;:&quot;[20]&quot;,&quot;manualOverrideText&quot;:&quot;&quot;},&quot;citationTag&quot;:&quot;MENDELEY_CITATION_v3_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&quot;,&quot;citationItems&quot;:[{&quot;id&quot;:&quot;e9063351-84e5-35cf-9e83-b8bba0913bac&quot;,&quot;itemData&quot;:{&quot;type&quot;:&quot;article-journal&quot;,&quot;id&quot;:&quot;e9063351-84e5-35cf-9e83-b8bba0913bac&quot;,&quot;title&quot;:&quot;SGDR: Stochastic Gradient Descent with Warm Restarts&quot;,&quot;author&quot;:[{&quot;family&quot;:&quot;Loshchilov&quot;,&quot;given&quot;:&quot;Ilya&quot;,&quot;parse-names&quot;:false,&quot;dropping-particle&quot;:&quot;&quot;,&quot;non-dropping-particle&quot;:&quot;&quot;},{&quot;family&quot;:&quot;Hutter&quot;,&quot;given&quot;:&quot;Frank&quot;,&quot;parse-names&quot;:false,&quot;dropping-particle&quot;:&quot;&quot;,&quot;non-dropping-particle&quot;:&quot;&quot;}],&quot;container-title&quot;:&quot;arXiv: Learning&quot;,&quot;URL&quot;:&quot;https://api.semanticscholar.org/CorpusID:14337532&quot;,&quot;issued&quot;:{&quot;date-parts&quot;:[[2016]]},&quot;container-title-short&quot;:&quot;&quot;},&quot;isTemporary&quot;:false}]},{&quot;citationID&quot;:&quot;MENDELEY_CITATION_111eba3f-785c-4b4c-b6e6-fc4bf548cbdf&quot;,&quot;properties&quot;:{&quot;noteIndex&quot;:0},&quot;isEdited&quot;:false,&quot;manualOverride&quot;:{&quot;isManuallyOverridden&quot;:false,&quot;citeprocText&quot;:&quot;[11]&quot;,&quot;manualOverrideText&quot;:&quot;&quot;},&quot;citationTag&quot;:&quot;MENDELEY_CITATION_v3_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&quot;,&quot;citationItems&quot;:[{&quot;id&quot;:&quot;27f87688-13d2-35cf-b3cc-69d56bb2def3&quot;,&quot;itemData&quot;:{&quot;type&quot;:&quot;article-journal&quot;,&quot;id&quot;:&quot;27f87688-13d2-35cf-b3cc-69d56bb2def3&quot;,&quot;title&quot;:&quot;ChemBERTa: Large-Scale Self-Supervised Pretraining for Molecular Property Prediction&quot;,&quot;author&quot;:[{&quot;family&quot;:&quot;Chithrananda&quot;,&quot;given&quot;:&quot;Seyone&quot;,&quot;parse-names&quot;:false,&quot;dropping-particle&quot;:&quot;&quot;,&quot;non-dropping-particle&quot;:&quot;&quot;},{&quot;family&quot;:&quot;Grand&quot;,&quot;given&quot;:&quot;Gabriel&quot;,&quot;parse-names&quot;:false,&quot;dropping-particle&quot;:&quot;&quot;,&quot;non-dropping-particle&quot;:&quot;&quot;},{&quot;family&quot;:&quot;Ramsundar&quot;,&quot;given&quot;:&quot;Bharath&quot;,&quot;parse-names&quot;:false,&quot;dropping-particle&quot;:&quot;&quot;,&quot;non-dropping-particle&quot;:&quot;&quot;}],&quot;container-title&quot;:&quot;arXiv e-prints&quot;,&quot;DOI&quot;:&quot;10.48550/arXiv.2010.09885&quot;,&quot;issued&quot;:{&quot;date-parts&quot;:[[2020,10]]},&quot;page&quot;:&quot;arXiv:2010.09885&quot;,&quot;container-title-short&quot;:&quot;&quot;},&quot;isTemporary&quot;:false}]},{&quot;citationID&quot;:&quot;MENDELEY_CITATION_b0839fb6-ce26-4a25-ba91-51b39a67b272&quot;,&quot;properties&quot;:{&quot;noteIndex&quot;:0},&quot;isEdited&quot;:false,&quot;manualOverride&quot;:{&quot;isManuallyOverridden&quot;:false,&quot;citeprocText&quot;:&quot;[21]&quot;,&quot;manualOverrideText&quot;:&quot;&quot;},&quot;citationTag&quot;:&quot;MENDELEY_CITATION_v3_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&quot;,&quot;citationItems&quot;:[{&quot;id&quot;:&quot;4706f37f-66a5-3d27-a50b-d3f6c14a0549&quot;,&quot;itemData&quot;:{&quot;type&quot;:&quot;article-journal&quot;,&quot;id&quot;:&quot;4706f37f-66a5-3d27-a50b-d3f6c14a0549&quot;,&quot;title&quot;:&quot;On Large-Batch Training for Deep Learning: Generalization Gap and Sharp Minima&quot;,&quot;author&quot;:[{&quot;family&quot;:&quot;Keskar&quot;,&quot;given&quot;:&quot;Nitish Shirish&quot;,&quot;parse-names&quot;:false,&quot;dropping-particle&quot;:&quot;&quot;,&quot;non-dropping-particle&quot;:&quot;&quot;},{&quot;family&quot;:&quot;Mudigere&quot;,&quot;given&quot;:&quot;Dheevatsa&quot;,&quot;parse-names&quot;:false,&quot;dropping-particle&quot;:&quot;&quot;,&quot;non-dropping-particle&quot;:&quot;&quot;},{&quot;family&quot;:&quot;Nocedal&quot;,&quot;given&quot;:&quot;Jorge&quot;,&quot;parse-names&quot;:false,&quot;dropping-particle&quot;:&quot;&quot;,&quot;non-dropping-particle&quot;:&quot;&quot;},{&quot;family&quot;:&quot;Smelyanskiy&quot;,&quot;given&quot;:&quot;Mikhail&quot;,&quot;parse-names&quot;:false,&quot;dropping-particle&quot;:&quot;&quot;,&quot;non-dropping-particle&quot;:&quot;&quot;},{&quot;family&quot;:&quot;Tang&quot;,&quot;given&quot;:&quot;Ping Tak Peter&quot;,&quot;parse-names&quot;:false,&quot;dropping-particle&quot;:&quot;&quot;,&quot;non-dropping-particle&quot;:&quot;&quot;}],&quot;container-title&quot;:&quot;ArXiv&quot;,&quot;URL&quot;:&quot;https://api.semanticscholar.org/CorpusID:5834589&quot;,&quot;issued&quot;:{&quot;date-parts&quot;:[[2016]]},&quot;volume&quot;:&quot;abs/1609.04836&quot;,&quot;container-title-short&quot;:&quot;ArXiv&quot;},&quot;isTemporary&quot;:false}]},{&quot;citationID&quot;:&quot;MENDELEY_CITATION_983539a7-adc7-42fd-83b2-3ac25b495a30&quot;,&quot;properties&quot;:{&quot;noteIndex&quot;:0},&quot;isEdited&quot;:false,&quot;manualOverride&quot;:{&quot;isManuallyOverridden&quot;:false,&quot;citeprocText&quot;:&quot;[22]&quot;,&quot;manualOverrideText&quot;:&quot;&quot;},&quot;citationTag&quot;:&quot;MENDELEY_CITATION_v3_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&quot;,&quot;citationItems&quot;:[{&quot;id&quot;:&quot;7fc7ea6b-1629-3058-829b-cae1a8149255&quot;,&quot;itemData&quot;:{&quot;type&quot;:&quot;article-journal&quot;,&quot;id&quot;:&quot;7fc7ea6b-1629-3058-829b-cae1a8149255&quot;,&quot;title&quot;:&quot;Mixed Precision Training&quot;,&quot;author&quot;:[{&quot;family&quot;:&quot;Micikevicius&quot;,&quot;given&quot;:&quot;Paulius&quot;,&quot;parse-names&quot;:false,&quot;dropping-particle&quot;:&quot;&quot;,&quot;non-dropping-particle&quot;:&quot;&quot;},{&quot;family&quot;:&quot;Narang&quot;,&quot;given&quot;:&quot;Sharan&quot;,&quot;parse-names&quot;:false,&quot;dropping-particle&quot;:&quot;&quot;,&quot;non-dropping-particle&quot;:&quot;&quot;},{&quot;family&quot;:&quot;Alben&quot;,&quot;given&quot;:&quot;Jonah&quot;,&quot;parse-names&quot;:false,&quot;dropping-particle&quot;:&quot;&quot;,&quot;non-dropping-particle&quot;:&quot;&quot;},{&quot;family&quot;:&quot;Diamos&quot;,&quot;given&quot;:&quot;Gregory Frederick&quot;,&quot;parse-names&quot;:false,&quot;dropping-particle&quot;:&quot;&quot;,&quot;non-dropping-particle&quot;:&quot;&quot;},{&quot;family&quot;:&quot;Elsen&quot;,&quot;given&quot;:&quot;Erich&quot;,&quot;parse-names&quot;:false,&quot;dropping-particle&quot;:&quot;&quot;,&quot;non-dropping-particle&quot;:&quot;&quot;},{&quot;family&quot;:&quot;García&quot;,&quot;given&quot;:&quot;David&quot;,&quot;parse-names&quot;:false,&quot;dropping-particle&quot;:&quot;&quot;,&quot;non-dropping-particle&quot;:&quot;&quot;},{&quot;family&quot;:&quot;Ginsburg&quot;,&quot;given&quot;:&quot;Boris&quot;,&quot;parse-names&quot;:false,&quot;dropping-particle&quot;:&quot;&quot;,&quot;non-dropping-particle&quot;:&quot;&quot;},{&quot;family&quot;:&quot;Houston&quot;,&quot;given&quot;:&quot;Michael&quot;,&quot;parse-names&quot;:false,&quot;dropping-particle&quot;:&quot;&quot;,&quot;non-dropping-particle&quot;:&quot;&quot;},{&quot;family&quot;:&quot;Kuchaiev&quot;,&quot;given&quot;:&quot;Oleksii&quot;,&quot;parse-names&quot;:false,&quot;dropping-particle&quot;:&quot;&quot;,&quot;non-dropping-particle&quot;:&quot;&quot;},{&quot;family&quot;:&quot;Venkatesh&quot;,&quot;given&quot;:&quot;Ganesh&quot;,&quot;parse-names&quot;:false,&quot;dropping-particle&quot;:&quot;&quot;,&quot;non-dropping-particle&quot;:&quot;&quot;},{&quot;family&quot;:&quot;Wu&quot;,&quot;given&quot;:&quot;Hao&quot;,&quot;parse-names&quot;:false,&quot;dropping-particle&quot;:&quot;&quot;,&quot;non-dropping-particle&quot;:&quot;&quot;}],&quot;container-title&quot;:&quot;ArXiv&quot;,&quot;URL&quot;:&quot;https://api.semanticscholar.org/CorpusID:3297437&quot;,&quot;issued&quot;:{&quot;date-parts&quot;:[[2017]]},&quot;volume&quot;:&quot;abs/1710.03740&quot;,&quot;container-title-short&quot;:&quot;ArXiv&quot;},&quot;isTemporary&quot;:false}]},{&quot;citationID&quot;:&quot;MENDELEY_CITATION_8dfa40a6-a289-45fd-9b21-d69412ff3133&quot;,&quot;properties&quot;:{&quot;noteIndex&quot;:0},&quot;isEdited&quot;:false,&quot;manualOverride&quot;:{&quot;isManuallyOverridden&quot;:false,&quot;citeprocText&quot;:&quot;[23]&quot;,&quot;manualOverrideText&quot;:&quot;&quot;},&quot;citationTag&quot;:&quot;MENDELEY_CITATION_v3_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&quot;,&quot;citationItems&quot;:[{&quot;id&quot;:&quot;e3596f90-1edb-3ff4-924b-ac9e46a7c8d5&quot;,&quot;itemData&quot;:{&quot;type&quot;:&quot;webpage&quot;,&quot;id&quot;:&quot;e3596f90-1edb-3ff4-924b-ac9e46a7c8d5&quot;,&quot;title&quot;:&quot;Drug Design with Small Molecule SMILES&quot;,&quot;author&quot;:[{&quot;family&quot;:&quot;Sgt. Peppers&quot;,&quot;given&quot;:&quot;&quot;,&quot;parse-names&quot;:false,&quot;dropping-particle&quot;:&quot;&quot;,&quot;non-dropping-particle&quot;:&quot;&quot;}],&quot;container-title&quot;:&quot;https://www.kaggle.com/datasets/art3mis/chembl22&quot;,&quot;issued&quot;:{&quot;date-parts&quot;:[[2025]]},&quot;container-title-short&quot;:&quot;&quot;},&quot;isTemporary&quot;:false}]},{&quot;citationID&quot;:&quot;MENDELEY_CITATION_c25554b6-155e-4912-80c0-3bf7fbbf1da3&quot;,&quot;properties&quot;:{&quot;noteIndex&quot;:0},&quot;isEdited&quot;:false,&quot;manualOverride&quot;:{&quot;isManuallyOverridden&quot;:false,&quot;citeprocText&quot;:&quot;[24]&quot;,&quot;manualOverrideText&quot;:&quot;&quot;},&quot;citationTag&quot;:&quot;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&quot;,&quot;citationItems&quot;:[{&quot;id&quot;:&quot;05dc4768-a214-33fc-85e4-fc8c5d25d6d2&quot;,&quot;itemData&quot;:{&quot;type&quot;:&quot;article-journal&quot;,&quot;id&quot;:&quot;05dc4768-a214-33fc-85e4-fc8c5d25d6d2&quot;,&quot;title&quot;:&quot;DrugBank 6.0: the DrugBank Knowledgebase for 2024&quot;,&quot;author&quot;:[{&quot;family&quot;:&quot;Knox&quot;,&quot;given&quot;:&quot;Craig&quot;,&quot;parse-names&quot;:false,&quot;dropping-particle&quot;:&quot;&quot;,&quot;non-dropping-particle&quot;:&quot;&quot;},{&quot;family&quot;:&quot;Wilson&quot;,&quot;given&quot;:&quot;Mike&quot;,&quot;parse-names&quot;:false,&quot;dropping-particle&quot;:&quot;&quot;,&quot;non-dropping-particle&quot;:&quot;&quot;},{&quot;family&quot;:&quot;Klinger&quot;,&quot;given&quot;:&quot;Christen M&quot;,&quot;parse-names&quot;:false,&quot;dropping-particle&quot;:&quot;&quot;,&quot;non-dropping-particle&quot;:&quot;&quot;},{&quot;family&quot;:&quot;Franklin&quot;,&quot;given&quot;:&quot;Mark&quot;,&quot;parse-names&quot;:false,&quot;dropping-particle&quot;:&quot;&quot;,&quot;non-dropping-particle&quot;:&quot;&quot;},{&quot;family&quot;:&quot;Oler&quot;,&quot;given&quot;:&quot;Eponine&quot;,&quot;parse-names&quot;:false,&quot;dropping-particle&quot;:&quot;&quot;,&quot;non-dropping-particle&quot;:&quot;&quot;},{&quot;family&quot;:&quot;Wilson&quot;,&quot;given&quot;:&quot;Alex&quot;,&quot;parse-names&quot;:false,&quot;dropping-particle&quot;:&quot;&quot;,&quot;non-dropping-particle&quot;:&quot;&quot;},{&quot;family&quot;:&quot;Pon&quot;,&quot;given&quot;:&quot;Allison&quot;,&quot;parse-names&quot;:false,&quot;dropping-particle&quot;:&quot;&quot;,&quot;non-dropping-particle&quot;:&quot;&quot;},{&quot;family&quot;:&quot;Cox&quot;,&quot;given&quot;:&quot;Jordan&quot;,&quot;parse-names&quot;:false,&quot;dropping-particle&quot;:&quot;&quot;,&quot;non-dropping-particle&quot;:&quot;&quot;},{&quot;family&quot;:&quot;Chin&quot;,&quot;given&quot;:&quot;Na Eun (Lucy)&quot;,&quot;parse-names&quot;:false,&quot;dropping-particle&quot;:&quot;&quot;,&quot;non-dropping-particle&quot;:&quot;&quot;},{&quot;family&quot;:&quot;Strawbridge&quot;,&quot;given&quot;:&quot;Seth A&quot;,&quot;parse-names&quot;:false,&quot;dropping-particle&quot;:&quot;&quot;,&quot;non-dropping-particle&quot;:&quot;&quot;},{&quot;family&quot;:&quot;Garcia-Patino&quot;,&quot;given&quot;:&quot;Marysol&quot;,&quot;parse-names&quot;:false,&quot;dropping-particle&quot;:&quot;&quot;,&quot;non-dropping-particle&quot;:&quot;&quot;},{&quot;family&quot;:&quot;Kruger&quot;,&quot;given&quot;:&quot;Ray&quot;,&quot;parse-names&quot;:false,&quot;dropping-particle&quot;:&quot;&quot;,&quot;non-dropping-particle&quot;:&quot;&quot;},{&quot;family&quot;:&quot;Sivakumaran&quot;,&quot;given&quot;:&quot;Aadhavya&quot;,&quot;parse-names&quot;:false,&quot;dropping-particle&quot;:&quot;&quot;,&quot;non-dropping-particle&quot;:&quot;&quot;},{&quot;family&quot;:&quot;Sanford&quot;,&quot;given&quot;:&quot;Selena&quot;,&quot;parse-names&quot;:false,&quot;dropping-particle&quot;:&quot;&quot;,&quot;non-dropping-particle&quot;:&quot;&quot;},{&quot;family&quot;:&quot;Doshi&quot;,&quot;given&quot;:&quot;Rahil&quot;,&quot;parse-names&quot;:false,&quot;dropping-particle&quot;:&quot;&quot;,&quot;non-dropping-particle&quot;:&quot;&quot;},{&quot;family&quot;:&quot;Khetarpal&quot;,&quot;given&quot;:&quot;Nitya&quot;,&quot;parse-names&quot;:false,&quot;dropping-particle&quot;:&quot;&quot;,&quot;non-dropping-particle&quot;:&quot;&quot;},{&quot;family&quot;:&quot;Fatokun&quot;,&quot;given&quot;:&quot;Omolola&quot;,&quot;parse-names&quot;:false,&quot;dropping-particle&quot;:&quot;&quot;,&quot;non-dropping-particle&quot;:&quot;&quot;},{&quot;family&quot;:&quot;Doucet&quot;,&quot;given&quot;:&quot;Daphnee&quot;,&quot;parse-names&quot;:false,&quot;dropping-particle&quot;:&quot;&quot;,&quot;non-dropping-particle&quot;:&quot;&quot;},{&quot;family&quot;:&quot;Zubkowski&quot;,&quot;given&quot;:&quot;Ashley&quot;,&quot;parse-names&quot;:false,&quot;dropping-particle&quot;:&quot;&quot;,&quot;non-dropping-particle&quot;:&quot;&quot;},{&quot;family&quot;:&quot;Rayat&quot;,&quot;given&quot;:&quot;Dorsa Yahya&quot;,&quot;parse-names&quot;:false,&quot;dropping-particle&quot;:&quot;&quot;,&quot;non-dropping-particle&quot;:&quot;&quot;},{&quot;family&quot;:&quot;Jackson&quot;,&quot;given&quot;:&quot;Hayley&quot;,&quot;parse-names&quot;:false,&quot;dropping-particle&quot;:&quot;&quot;,&quot;non-dropping-particle&quot;:&quot;&quot;},{&quot;family&quot;:&quot;Harford&quot;,&quot;given&quot;:&quot;Karxena&quot;,&quot;parse-names&quot;:false,&quot;dropping-particle&quot;:&quot;&quot;,&quot;non-dropping-particle&quot;:&quot;&quot;},{&quot;family&quot;:&quot;Anjum&quot;,&quot;given&quot;:&quot;Afia&quot;,&quot;parse-names&quot;:false,&quot;dropping-particle&quot;:&quot;&quot;,&quot;non-dropping-particle&quot;:&quot;&quot;},{&quot;family&quot;:&quot;Zakir&quot;,&quot;given&quot;:&quot;Mahi&quot;,&quot;parse-names&quot;:false,&quot;dropping-particle&quot;:&quot;&quot;,&quot;non-dropping-particle&quot;:&quot;&quot;},{&quot;family&quot;:&quot;Wang&quot;,&quot;given&quot;:&quot;Fei&quot;,&quot;parse-names&quot;:false,&quot;dropping-particle&quot;:&quot;&quot;,&quot;non-dropping-particle&quot;:&quot;&quot;},{&quot;family&quot;:&quot;Tian&quot;,&quot;given&quot;:&quot;Siyang&quot;,&quot;parse-names&quot;:false,&quot;dropping-particle&quot;:&quot;&quot;,&quot;non-dropping-particle&quot;:&quot;&quot;},{&quot;family&quot;:&quot;Lee&quot;,&quot;given&quot;:&quot;Brian&quot;,&quot;parse-names&quot;:false,&quot;dropping-particle&quot;:&quot;&quot;,&quot;non-dropping-particle&quot;:&quot;&quot;},{&quot;family&quot;:&quot;Liigand&quot;,&quot;given&quot;:&quot;Jaanus&quot;,&quot;parse-names&quot;:false,&quot;dropping-particle&quot;:&quot;&quot;,&quot;non-dropping-particle&quot;:&quot;&quot;},{&quot;family&quot;:&quot;Peters&quot;,&quot;given&quot;:&quot;Harrison&quot;,&quot;parse-names&quot;:false,&quot;dropping-particle&quot;:&quot;&quot;,&quot;non-dropping-particle&quot;:&quot;&quot;},{&quot;family&quot;:&quot;Wang&quot;,&quot;given&quot;:&quot;Ruo Qi (Rachel)&quot;,&quot;parse-names&quot;:false,&quot;dropping-particle&quot;:&quot;&quot;,&quot;non-dropping-particle&quot;:&quot;&quot;},{&quot;family&quot;:&quot;Nguyen&quot;,&quot;given&quot;:&quot;Tue&quot;,&quot;parse-names&quot;:false,&quot;dropping-particle&quot;:&quot;&quot;,&quot;non-dropping-particle&quot;:&quot;&quot;},{&quot;family&quot;:&quot;So&quot;,&quot;given&quot;:&quot;Denise&quot;,&quot;parse-names&quot;:false,&quot;dropping-particle&quot;:&quot;&quot;,&quot;non-dropping-particle&quot;:&quot;&quot;},{&quot;family&quot;:&quot;Sharp&quot;,&quot;given&quot;:&quot;Matthew&quot;,&quot;parse-names&quot;:false,&quot;dropping-particle&quot;:&quot;&quot;,&quot;non-dropping-particle&quot;:&quot;&quot;},{&quot;family&quot;:&quot;da Silva&quot;,&quot;given&quot;:&quot;Rodolfo&quot;,&quot;parse-names&quot;:false,&quot;dropping-particle&quot;:&quot;&quot;,&quot;non-dropping-particle&quot;:&quot;&quot;},{&quot;family&quot;:&quot;Gabriel&quot;,&quot;given&quot;:&quot;Cyrella&quot;,&quot;parse-names&quot;:false,&quot;dropping-particle&quot;:&quot;&quot;,&quot;non-dropping-particle&quot;:&quot;&quot;},{&quot;family&quot;:&quot;Scantlebury&quot;,&quot;given&quot;:&quot;Joshua&quot;,&quot;parse-names&quot;:false,&quot;dropping-particle&quot;:&quot;&quot;,&quot;non-dropping-particle&quot;:&quot;&quot;},{&quot;family&quot;:&quot;Jasinski&quot;,&quot;given&quot;:&quot;Marissa&quot;,&quot;parse-names&quot;:false,&quot;dropping-particle&quot;:&quot;&quot;,&quot;non-dropping-particle&quot;:&quot;&quot;},{&quot;family&quot;:&quot;Ackerman&quot;,&quot;given&quot;:&quot;David&quot;,&quot;parse-names&quot;:false,&quot;dropping-particle&quot;:&quot;&quot;,&quot;non-dropping-particle&quot;:&quot;&quot;},{&quot;family&quot;:&quot;Jewison&quot;,&quot;given&quot;:&quot;Timothy&quot;,&quot;parse-names&quot;:false,&quot;dropping-particle&quot;:&quot;&quot;,&quot;non-dropping-particle&quot;:&quot;&quot;},{&quot;family&quot;:&quot;Sajed&quot;,&quot;given&quot;:&quot;Tanvir&quot;,&quot;parse-names&quot;:false,&quot;dropping-particle&quot;:&quot;&quot;,&quot;non-dropping-particle&quot;:&quot;&quot;},{&quot;family&quot;:&quot;Gautam&quot;,&quot;given&quot;:&quot;Vasuk&quot;,&quot;parse-names&quot;:false,&quot;dropping-particle&quot;:&quot;&quot;,&quot;non-dropping-particle&quot;:&quot;&quot;},{&quot;family&quot;:&quot;Wishart&quot;,&quot;given&quot;:&quot;David S&quot;,&quot;parse-names&quot;:false,&quot;dropping-particle&quot;:&quot;&quot;,&quot;non-dropping-particle&quot;:&quot;&quot;}],&quot;container-title&quot;:&quot;Nucleic Acids Research&quot;,&quot;DOI&quot;:&quot;10.1093/nar/gkad976&quot;,&quot;ISSN&quot;:&quot;0305-1048&quot;,&quot;issued&quot;:{&quot;date-parts&quot;:[[2024,1,5]]},&quot;page&quot;:&quot;D1265-D1275&quot;,&quot;abstract&quot;:&quot;&lt;p&gt;First released in 2006, DrugBank (https://go.drugbank.com) has grown to become the ‘gold standard’ knowledge resource for drug, drug–target and related pharmaceutical information. DrugBank is widely used across many diverse biomedical research and clinical applications, and averages more than 30 million views/year. Since its last update in 2018, we have been actively enhancing the quantity and quality of the drug data in this knowledgebase. In this latest release (DrugBank 6.0), the number of FDA approved drugs has grown from 2646 to 4563 (a 72% increase), the number of investigational drugs has grown from 3394 to 6231 (a 38% increase), the number of drug–drug interactions increased from 365 984 to 1 413 413 (a 300% increase), and the number of drug–food interactions expanded from 1195 to 2475 (a 200% increase). In addition to this notable expansion in database size, we have added thousands of new, colorful, richly annotated pathways depicting drug mechanisms and drug metabolism. Likewise, existing datasets have been significantly improved and expanded, by adding more information on drug indications, drug–drug interactions, drug–food interactions and many other relevant data types for 11 891 drugs. We have also added experimental and predicted MS/MS spectra, 1D/2D-NMR spectra, CCS (collision cross section), RT (retention time) and RI (retention index) data for 9464 of DrugBank's 11 710 small molecule drugs. These and other improvements should make DrugBank 6.0 even more useful to a much wider research audience ranging from medicinal chemists to metabolomics specialists to pharmacologists.&lt;/p&gt;&quot;,&quot;issue&quot;:&quot;D1&quot;,&quot;volume&quot;:&quot;52&quot;,&quot;container-title-short&quot;:&quot;Nucleic Acids Res.&quot;},&quot;isTemporary&quot;:false}]},{&quot;citationID&quot;:&quot;MENDELEY_CITATION_842c6097-cdb7-4d69-9e19-e0a99dfba80a&quot;,&quot;properties&quot;:{&quot;noteIndex&quot;:0},&quot;isEdited&quot;:false,&quot;manualOverride&quot;:{&quot;isManuallyOverridden&quot;:false,&quot;citeprocText&quot;:&quot;[25]&quot;,&quot;manualOverrideText&quot;:&quot;&quot;},&quot;citationTag&quot;:&quot;MENDELEY_CITATION_v3_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&quot;,&quot;citationItems&quot;:[{&quot;id&quot;:&quot;2360cf28-52dd-3e44-85a2-08be789b8022&quot;,&quot;itemData&quot;:{&quot;type&quot;:&quot;article-journal&quot;,&quot;id&quot;:&quot;2360cf28-52dd-3e44-85a2-08be789b8022&quot;,&quot;title&quot;:&quot;The ChEMBL database in 2017&quot;,&quot;author&quot;:[{&quot;family&quot;:&quot;Gaulton&quot;,&quot;given&quot;:&quot;Anna&quot;,&quot;parse-names&quot;:false,&quot;dropping-particle&quot;:&quot;&quot;,&quot;non-dropping-particle&quot;:&quot;&quot;},{&quot;family&quot;:&quot;Hersey&quot;,&quot;given&quot;:&quot;Anne&quot;,&quot;parse-names&quot;:false,&quot;dropping-particle&quot;:&quot;&quot;,&quot;non-dropping-particle&quot;:&quot;&quot;},{&quot;family&quot;:&quot;Nowotka&quot;,&quot;given&quot;:&quot;Michał&quot;,&quot;parse-names&quot;:false,&quot;dropping-particle&quot;:&quot;&quot;,&quot;non-dropping-particle&quot;:&quot;&quot;},{&quot;family&quot;:&quot;Bento&quot;,&quot;given&quot;:&quot;A. Patrícia&quot;,&quot;parse-names&quot;:false,&quot;dropping-particle&quot;:&quot;&quot;,&quot;non-dropping-particle&quot;:&quot;&quot;},{&quot;family&quot;:&quot;Chambers&quot;,&quot;given&quot;:&quot;Jon&quot;,&quot;parse-names&quot;:false,&quot;dropping-particle&quot;:&quot;&quot;,&quot;non-dropping-particle&quot;:&quot;&quot;},{&quot;family&quot;:&quot;Mendez&quot;,&quot;given&quot;:&quot;David&quot;,&quot;parse-names&quot;:false,&quot;dropping-particle&quot;:&quot;&quot;,&quot;non-dropping-particle&quot;:&quot;&quot;},{&quot;family&quot;:&quot;Mutowo&quot;,&quot;given&quot;:&quot;Prudence&quot;,&quot;parse-names&quot;:false,&quot;dropping-particle&quot;:&quot;&quot;,&quot;non-dropping-particle&quot;:&quot;&quot;},{&quot;family&quot;:&quot;Atkinson&quot;,&quot;given&quot;:&quot;Francis&quot;,&quot;parse-names&quot;:false,&quot;dropping-particle&quot;:&quot;&quot;,&quot;non-dropping-particle&quot;:&quot;&quot;},{&quot;family&quot;:&quot;Bellis&quot;,&quot;given&quot;:&quot;Louisa J.&quot;,&quot;parse-names&quot;:false,&quot;dropping-particle&quot;:&quot;&quot;,&quot;non-dropping-particle&quot;:&quot;&quot;},{&quot;family&quot;:&quot;Cibrián-Uhalte&quot;,&quot;given&quot;:&quot;Elena&quot;,&quot;parse-names&quot;:false,&quot;dropping-particle&quot;:&quot;&quot;,&quot;non-dropping-particle&quot;:&quot;&quot;},{&quot;family&quot;:&quot;Davies&quot;,&quot;given&quot;:&quot;Mark&quot;,&quot;parse-names&quot;:false,&quot;dropping-particle&quot;:&quot;&quot;,&quot;non-dropping-particle&quot;:&quot;&quot;},{&quot;family&quot;:&quot;Dedman&quot;,&quot;given&quot;:&quot;Nathan&quot;,&quot;parse-names&quot;:false,&quot;dropping-particle&quot;:&quot;&quot;,&quot;non-dropping-particle&quot;:&quot;&quot;},{&quot;family&quot;:&quot;Karlsson&quot;,&quot;given&quot;:&quot;Anneli&quot;,&quot;parse-names&quot;:false,&quot;dropping-particle&quot;:&quot;&quot;,&quot;non-dropping-particle&quot;:&quot;&quot;},{&quot;family&quot;:&quot;Magariños&quot;,&quot;given&quot;:&quot;María Paula&quot;,&quot;parse-names&quot;:false,&quot;dropping-particle&quot;:&quot;&quot;,&quot;non-dropping-particle&quot;:&quot;&quot;},{&quot;family&quot;:&quot;Overington&quot;,&quot;given&quot;:&quot;John P.&quot;,&quot;parse-names&quot;:false,&quot;dropping-particle&quot;:&quot;&quot;,&quot;non-dropping-particle&quot;:&quot;&quot;},{&quot;family&quot;:&quot;Papadatos&quot;,&quot;given&quot;:&quot;George&quot;,&quot;parse-names&quot;:false,&quot;dropping-particle&quot;:&quot;&quot;,&quot;non-dropping-particle&quot;:&quot;&quot;},{&quot;family&quot;:&quot;Smit&quot;,&quot;given&quot;:&quot;Ines&quot;,&quot;parse-names&quot;:false,&quot;dropping-particle&quot;:&quot;&quot;,&quot;non-dropping-particle&quot;:&quot;&quot;},{&quot;family&quot;:&quot;Leach&quot;,&quot;given&quot;:&quot;Andrew R.&quot;,&quot;parse-names&quot;:false,&quot;dropping-particle&quot;:&quot;&quot;,&quot;non-dropping-particle&quot;:&quot;&quot;}],&quot;container-title&quot;:&quot;Nucleic Acids Research&quot;,&quot;DOI&quot;:&quot;10.1093/nar/gkw1074&quot;,&quot;ISSN&quot;:&quot;0305-1048&quot;,&quot;issued&quot;:{&quot;date-parts&quot;:[[2017,1,4]]},&quot;page&quot;:&quot;D945-D954&quot;,&quot;issue&quot;:&quot;D1&quot;,&quot;volume&quot;:&quot;45&quot;,&quot;container-title-short&quot;:&quot;Nucleic Acids Res.&quot;},&quot;isTemporary&quot;:false}]},{&quot;citationID&quot;:&quot;MENDELEY_CITATION_f7c666f5-11ce-4466-a5b6-1fb7e14e1fb6&quot;,&quot;properties&quot;:{&quot;noteIndex&quot;:0},&quot;isEdited&quot;:false,&quot;manualOverride&quot;:{&quot;isManuallyOverridden&quot;:false,&quot;citeprocText&quot;:&quot;[26]&quot;,&quot;manualOverrideText&quot;:&quot;&quot;},&quot;citationTag&quot;:&quot;MENDELEY_CITATION_v3_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&quot;,&quot;citationItems&quot;:[{&quot;id&quot;:&quot;894bf710-3c9a-38d7-a687-6a8f8d072ef0&quot;,&quot;itemData&quot;:{&quot;type&quot;:&quot;article-journal&quot;,&quot;id&quot;:&quot;894bf710-3c9a-38d7-a687-6a8f8d072ef0&quot;,&quot;title&quot;:&quot;Pre-trained molecular representations enable antimicrobial discovery&quot;,&quot;author&quot;:[{&quot;family&quot;:&quot;Olayo-Alarcon&quot;,&quot;given&quot;:&quot;Roberto&quot;,&quot;parse-names&quot;:false,&quot;dropping-particle&quot;:&quot;&quot;,&quot;non-dropping-particle&quot;:&quot;&quot;},{&quot;family&quot;:&quot;Amstalden&quot;,&quot;given&quot;:&quot;Martin K.&quot;,&quot;parse-names&quot;:false,&quot;dropping-particle&quot;:&quot;&quot;,&quot;non-dropping-particle&quot;:&quot;&quot;},{&quot;family&quot;:&quot;Zannoni&quot;,&quot;given&quot;:&quot;Annamaria&quot;,&quot;parse-names&quot;:false,&quot;dropping-particle&quot;:&quot;&quot;,&quot;non-dropping-particle&quot;:&quot;&quot;},{&quot;family&quot;:&quot;Bajramovic&quot;,&quot;given&quot;:&quot;Medina&quot;,&quot;parse-names&quot;:false,&quot;dropping-particle&quot;:&quot;&quot;,&quot;non-dropping-particle&quot;:&quot;&quot;},{&quot;family&quot;:&quot;Sharma&quot;,&quot;given&quot;:&quot;Cynthia M.&quot;,&quot;parse-names&quot;:false,&quot;dropping-particle&quot;:&quot;&quot;,&quot;non-dropping-particle&quot;:&quot;&quot;},{&quot;family&quot;:&quot;Brochado&quot;,&quot;given&quot;:&quot;Ana Rita&quot;,&quot;parse-names&quot;:false,&quot;dropping-particle&quot;:&quot;&quot;,&quot;non-dropping-particle&quot;:&quot;&quot;},{&quot;family&quot;:&quot;Rezaei&quot;,&quot;given&quot;:&quot;Mina&quot;,&quot;parse-names&quot;:false,&quot;dropping-particle&quot;:&quot;&quot;,&quot;non-dropping-particle&quot;:&quot;&quot;},{&quot;family&quot;:&quot;Müller&quot;,&quot;given&quot;:&quot;Christian L.&quot;,&quot;parse-names&quot;:false,&quot;dropping-particle&quot;:&quot;&quot;,&quot;non-dropping-particle&quot;:&quot;&quot;}],&quot;container-title&quot;:&quot;Nature Communications&quot;,&quot;DOI&quot;:&quot;10.1038/s41467-025-58804-4&quot;,&quot;ISSN&quot;:&quot;2041-1723&quot;,&quot;issued&quot;:{&quot;date-parts&quot;:[[2025,4,10]]},&quot;page&quot;:&quot;3420&quot;,&quot;abstract&quot;:&quot;&lt;p&gt; The rise in antimicrobial resistance poses a worldwide threat, reducing the efficacy of common antibiotics. Determining the antimicrobial activity of new chemical compounds through experimental methods remains time-consuming and costly. While compound-centric deep learning models promise to accelerate this search and prioritization process, current strategies require large amounts of custom training data. Here, we introduce a lightweight computational strategy for antimicrobial discovery that builds on MolE (Molecular representation through redundancy reduced Embedding), a self-supervised deep learning framework that leverages unlabeled chemical structures to learn task-independent molecular representations. By combining MolE representation learning with available, experimentally validated compound-bacteria activity data, we design a general predictive model that enables assessing compounds with respect to their antimicrobial potential. Our model correctly identifies recent growth-inhibitory compounds that are structurally distinct from current antibiotics. Using this approach, we discover de novo, and experimentally confirm, three human-targeted drugs as growth inhibitors of &lt;italic&gt;Staphylococcus aureus&lt;/italic&gt; . This framework offers a viable, cost-effective strategy to accelerate antibiotic discovery. &lt;/p&gt;&quot;,&quot;issue&quot;:&quot;1&quot;,&quot;volume&quot;:&quot;16&quot;,&quot;container-title-short&quot;:&quot;Nat. Commun.&quot;},&quot;isTemporary&quot;:false}]}]"/>
+    <we:property name="MENDELEY_CITATIONS" value="[{&quot;citationID&quot;:&quot;MENDELEY_CITATION_917e5d1d-8132-466d-b0a6-a0da3177f8a4&quot;,&quot;properties&quot;:{&quot;noteIndex&quot;:0},&quot;isEdited&quot;:false,&quot;manualOverride&quot;:{&quot;isManuallyOverridden&quot;:false,&quot;citeprocText&quot;:&quot;[1]&quot;,&quot;manualOverrideText&quot;:&quot;&quot;},&quot;citationTag&quot;:&quot;MENDELEY_CITATION_v3_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&quot;,&quot;citationItems&quot;:[{&quot;id&quot;:&quot;bf4b9b8e-8cd4-3267-8fea-3e05e74bdeb9&quot;,&quot;itemData&quot;:{&quot;type&quot;:&quot;chapter&quot;,&quot;id&quot;:&quot;bf4b9b8e-8cd4-3267-8fea-3e05e74bdeb9&quot;,&quot;title&quot;:&quot;Drug Metabolism: Phase I and Phase II Metabolic Pathways&quot;,&quot;author&quot;:[{&quot;family&quot;:&quot;ul Amin Mohsin&quot;,&quot;given&quot;:&quot;Noor&quot;,&quot;parse-names&quot;:false,&quot;dropping-particle&quot;:&quot;&quot;,&quot;non-dropping-particle&quot;:&quot;&quot;},{&quot;family&quot;:&quot;Farrukh&quot;,&quot;given&quot;:&quot;Maryam&quot;,&quot;parse-names&quot;:false,&quot;dropping-particle&quot;:&quot;&quot;,&quot;non-dropping-particle&quot;:&quot;&quot;},{&quot;family&quot;:&quot;Shahzadi&quot;,&quot;given&quot;:&quot;Saba&quot;,&quot;parse-names&quot;:false,&quot;dropping-particle&quot;:&quot;&quot;,&quot;non-dropping-particle&quot;:&quot;&quot;},{&quot;family&quot;:&quot;Irfan&quot;,&quot;given&quot;:&quot;Muhammad&quot;,&quot;parse-names&quot;:false,&quot;dropping-particle&quot;:&quot;&quot;,&quot;non-dropping-particle&quot;:&quot;&quot;}],&quot;DOI&quot;:&quot;10.5772/intechopen.112854&quot;,&quot;issued&quot;:{&quot;date-parts&quot;:[[2024,2,14]]},&quot;container-title-short&quot;:&quot;&quot;},&quot;isTemporary&quot;:false}]},{&quot;citationID&quot;:&quot;MENDELEY_CITATION_4c61a503-9278-499d-9d99-f0a543c311cd&quot;,&quot;properties&quot;:{&quot;noteIndex&quot;:0},&quot;isEdited&quot;:false,&quot;manualOverride&quot;:{&quot;isManuallyOverridden&quot;:false,&quot;citeprocText&quot;:&quot;[2]&quot;,&quot;manualOverrideText&quot;:&quot;&quot;},&quot;citationTag&quot;:&quot;MENDELEY_CITATION_v3_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&quot;,&quot;citationItems&quot;:[{&quot;id&quot;:&quot;a7499272-8f2c-3731-b644-7b0aae951850&quot;,&quot;itemData&quot;:{&quot;type&quot;:&quot;article-journal&quot;,&quot;id&quot;:&quot;a7499272-8f2c-3731-b644-7b0aae951850&quot;,&quot;title&quot;:&quot;In silico ADME-Tox modeling: progress and prospects&quot;,&quot;author&quot;:[{&quot;family&quot;:&quot;Alqahtani&quot;,&quot;given&quot;:&quot;Saeed&quot;,&quot;parse-names&quot;:false,&quot;dropping-particle&quot;:&quot;&quot;,&quot;non-dropping-particle&quot;:&quot;&quot;}],&quot;container-title&quot;:&quot;Expert Opinion on Drug Metabolism &amp; Toxicology&quot;,&quot;DOI&quot;:&quot;10.1080/17425255.2017.1389897&quot;,&quot;ISSN&quot;:&quot;1742-5255&quot;,&quot;issued&quot;:{&quot;date-parts&quot;:[[2017,11,2]]},&quot;page&quot;:&quot;1147-1158&quot;,&quot;issue&quot;:&quot;11&quot;,&quot;volume&quot;:&quot;13&quot;,&quot;container-title-short&quot;:&quot;Expert Opin. Drug Metab. Toxicol.&quot;},&quot;isTemporary&quot;:false}]},{&quot;citationID&quot;:&quot;MENDELEY_CITATION_f9163c9d-db05-495c-82ad-845f41c010e3&quot;,&quot;properties&quot;:{&quot;noteIndex&quot;:0},&quot;isEdited&quot;:false,&quot;manualOverride&quot;:{&quot;isManuallyOverridden&quot;:false,&quot;citeprocText&quot;:&quot;[3]&quot;,&quot;manualOverrideText&quot;:&quot;&quot;},&quot;citationTag&quot;:&quot;MENDELEY_CITATION_v3_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&quot;,&quot;citationItems&quot;:[{&quot;id&quot;:&quot;41dab8de-eca9-3196-8661-835a96a3207d&quot;,&quot;itemData&quot;:{&quot;type&quot;:&quot;article-journal&quot;,&quot;id&quot;:&quot;41dab8de-eca9-3196-8661-835a96a3207d&quot;,&quot;title&quot;:&quot;Predicting routes of phase I and II metabolism based on quantum mechanics and machine learning&quot;,&quot;author&quot;:[{&quot;family&quot;:&quot;Öeren&quot;,&quot;given&quot;:&quot;Mario&quot;,&quot;parse-names&quot;:false,&quot;dropping-particle&quot;:&quot;&quot;,&quot;non-dropping-particle&quot;:&quot;&quot;},{&quot;family&quot;:&quot;Hunt&quot;,&quot;given&quot;:&quot;Peter A.&quot;,&quot;parse-names&quot;:false,&quot;dropping-particle&quot;:&quot;&quot;,&quot;non-dropping-particle&quot;:&quot;&quot;},{&quot;family&quot;:&quot;Wharrick&quot;,&quot;given&quot;:&quot;Charlotte E.&quot;,&quot;parse-names&quot;:false,&quot;dropping-particle&quot;:&quot;&quot;,&quot;non-dropping-particle&quot;:&quot;&quot;},{&quot;family&quot;:&quot;Tabatabaei Ghomi&quot;,&quot;given&quot;:&quot;Hamed&quot;,&quot;parse-names&quot;:false,&quot;dropping-particle&quot;:&quot;&quot;,&quot;non-dropping-particle&quot;:&quot;&quot;},{&quot;family&quot;:&quot;Segall&quot;,&quot;given&quot;:&quot;Matthew D.&quot;,&quot;parse-names&quot;:false,&quot;dropping-particle&quot;:&quot;&quot;,&quot;non-dropping-particle&quot;:&quot;&quot;}],&quot;container-title&quot;:&quot;Xenobiotica&quot;,&quot;DOI&quot;:&quot;10.1080/00498254.2023.2284251&quot;,&quot;ISSN&quot;:&quot;0049-8254&quot;,&quot;issued&quot;:{&quot;date-parts&quot;:[[2024,8,8]]},&quot;page&quot;:&quot;379-393&quot;,&quot;issue&quot;:&quot;7&quot;,&quot;volume&quot;:&quot;54&quot;,&quot;container-title-short&quot;:&quot;&quot;},&quot;isTemporary&quot;:false}]},{&quot;citationID&quot;:&quot;MENDELEY_CITATION_b3a78241-26d9-4c0f-a776-f58d6393a7c1&quot;,&quot;properties&quot;:{&quot;noteIndex&quot;:0},&quot;isEdited&quot;:false,&quot;manualOverride&quot;:{&quot;isManuallyOverridden&quot;:false,&quot;citeprocText&quot;:&quot;[4]&quot;,&quot;manualOverrideText&quot;:&quot;&quot;},&quot;citationTag&quot;:&quot;MENDELEY_CITATION_v3_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&quot;,&quot;citationItems&quot;:[{&quot;id&quot;:&quot;13bc8314-57b6-3cd6-845d-b642b9f122d5&quot;,&quot;itemData&quot;:{&quot;type&quot;:&quot;webpage&quot;,&quot;id&quot;:&quot;13bc8314-57b6-3cd6-845d-b642b9f122d5&quot;,&quot;title&quot;:&quot;Decoding phase I &amp; II human drug metabolism using the prediction tool MetaSite for chemists, medicinal chemists, and metID experts.&quot;,&quot;author&quot;:[{&quot;family&quot;:&quot;Cruciani&quot;,&quot;given&quot;:&quot;Gabriele&quot;,&quot;parse-names&quot;:false,&quot;dropping-particle&quot;:&quot;&quot;,&quot;non-dropping-particle&quot;:&quot;&quot;},{&quot;family&quot;:&quot;Desantis&quot;,&quot;given&quot;:&quot;Jenny&quot;,&quot;parse-names&quot;:false,&quot;dropping-particle&quot;:&quot;&quot;,&quot;non-dropping-particle&quot;:&quot;&quot;},{&quot;family&quot;:&quot;Palomba&quot;,&quot;given&quot;:&quot;Tommaso&quot;,&quot;parse-names&quot;:false,&quot;dropping-particle&quot;:&quot;&quot;,&quot;non-dropping-particle&quot;:&quot;&quot;},{&quot;family&quot;:&quot;Baroni&quot;,&quot;given&quot;:&quot;Massimo&quot;,&quot;parse-names&quot;:false,&quot;dropping-particle&quot;:&quot;&quot;,&quot;non-dropping-particle&quot;:&quot;&quot;},{&quot;family&quot;:&quot;Valeri&quot;,&quot;given&quot;:&quot;Aurora&quot;,&quot;parse-names&quot;:false,&quot;dropping-particle&quot;:&quot;&quot;,&quot;non-dropping-particle&quot;:&quot;&quot;},{&quot;family&quot;:&quot;Siragusa&quot;,&quot;given&quot;:&quot;Lydia&quot;,&quot;parse-names&quot;:false,&quot;dropping-particle&quot;:&quot;&quot;,&quot;non-dropping-particle&quot;:&quot;&quot;},{&quot;family&quot;:&quot;Venturi&quot;,&quot;given&quot;:&quot;Ludovico&quot;,&quot;parse-names&quot;:false,&quot;dropping-particle&quot;:&quot;&quot;,&quot;non-dropping-particle&quot;:&quot;&quot;},{&quot;family&quot;:&quot;Zamora&quot;,&quot;given&quot;:&quot;Ismael&quot;,&quot;parse-names&quot;:false,&quot;dropping-particle&quot;:&quot;&quot;,&quot;non-dropping-particle&quot;:&quot;&quot;},{&quot;family&quot;:&quot;Meyer&quot;,&quot;given&quot;:&quot;Christophe&quot;,&quot;parse-names&quot;:false,&quot;dropping-particle&quot;:&quot;&quot;,&quot;non-dropping-particle&quot;:&quot;&quot;},{&quot;family&quot;:&quot;Laboureur&quot;,&quot;given&quot;:&quot;Laurent&quot;,&quot;parse-names&quot;:false,&quot;dropping-particle&quot;:&quot;&quot;,&quot;non-dropping-particle&quot;:&quot;&quot;},{&quot;family&quot;:&quot;Emre&quot;,&quot;given&quot;:&quot;Isin&quot;,&quot;parse-names&quot;:false,&quot;dropping-particle&quot;:&quot;&quot;,&quot;non-dropping-particle&quot;:&quot;&quot;},{&quot;family&quot;:&quot;Goracci&quot;,&quot;given&quot;:&quot;Laura&quot;,&quot;parse-names&quot;:false,&quot;dropping-particle&quot;:&quot;&quot;,&quot;non-dropping-particle&quot;:&quot;&quot;}],&quot;issued&quot;:{&quot;date-parts&quot;:[[2024]]},&quot;container-title-short&quot;:&quot;&quot;},&quot;isTemporary&quot;:false}]},{&quot;citationID&quot;:&quot;MENDELEY_CITATION_a090304e-5ae5-4071-9395-15b690c02537&quot;,&quot;properties&quot;:{&quot;noteIndex&quot;:0},&quot;isEdited&quot;:false,&quot;manualOverride&quot;:{&quot;isManuallyOverridden&quot;:false,&quot;citeprocText&quot;:&quot;[5]&quot;,&quot;manualOverrideText&quot;:&quot;&quot;},&quot;citationTag&quot;:&quot;MENDELEY_CITATION_v3_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&quot;,&quot;citationItems&quot;:[{&quot;id&quot;:&quot;30167f7e-6772-397c-8d9b-7e31dc75bdc6&quot;,&quot;itemData&quot;:{&quot;type&quot;:&quot;article-journal&quot;,&quot;id&quot;:&quot;30167f7e-6772-397c-8d9b-7e31dc75bdc6&quot;,&quot;title&quot;:&quot;CYPstrate: A Set of Machine Learning Models for the Accurate Classification of Cytochrome P450 Enzyme Substrates and Non-Substrates&quot;,&quot;author&quot;:[{&quot;family&quot;:&quot;Holmer&quot;,&quot;given&quot;:&quot;Malte&quot;,&quot;parse-names&quot;:false,&quot;dropping-particle&quot;:&quot;&quot;,&quot;non-dropping-particle&quot;:&quot;&quot;},{&quot;family&quot;:&quot;Bruyn Kops&quot;,&quot;given&quot;:&quot;Christina&quot;,&quot;parse-names&quot;:false,&quot;dropping-particle&quot;:&quot;&quot;,&quot;non-dropping-particle&quot;:&quot;de&quot;},{&quot;family&quot;:&quot;Stork&quot;,&quot;given&quot;:&quot;Conrad&quot;,&quot;parse-names&quot;:false,&quot;dropping-particle&quot;:&quot;&quot;,&quot;non-dropping-particle&quot;:&quot;&quot;},{&quot;family&quot;:&quot;Kirchmair&quot;,&quot;given&quot;:&quot;Johannes&quot;,&quot;parse-names&quot;:false,&quot;dropping-particle&quot;:&quot;&quot;,&quot;non-dropping-particle&quot;:&quot;&quot;}],&quot;container-title&quot;:&quot;Molecules&quot;,&quot;DOI&quot;:&quot;10.3390/molecules26154678&quot;,&quot;ISSN&quot;:&quot;1420-3049&quot;,&quot;issued&quot;:{&quot;date-parts&quot;:[[2021,8,2]]},&quot;page&quot;:&quot;4678&quot;,&quot;abstract&quot;:&quot;&lt;p&gt;The interaction of small organic molecules such as drugs, agrochemicals, and cosmetics with cytochrome P450 enzymes (CYPs) can lead to substantial changes in the bioavailability of active substances and hence consequences with respect to pharmacological efficacy and toxicity. Therefore, efficient means of predicting the interactions of small organic molecules with CYPs are of high importance to a host of different industries. In this work, we present a new set of machine learning models for the classification of xenobiotics into substrates and non-substrates of nine human CYP isozymes: CYPs 1A2, 2A6, 2B6, 2C8, 2C9, 2C19, 2D6, 2E1, and 3A4. The models are trained on an extended, high-quality collection of known substrates and non-substrates and have been subjected to thorough validation. Our results show that the models yield competitive performance and are favorable for the detection of CYP substrates. In particular, a new consensus model reached high performance, with Matthews correlation coefficients (MCCs) between 0.45 (CYP2C8) and 0.85 (CYP3A4), although at the cost of coverage. The best models presented in this work are accessible free of charge via the “CYPstrate” module of the New E-Resource for Drug Discovery (NERDD).&lt;/p&gt;&quot;,&quot;issue&quot;:&quot;15&quot;,&quot;volume&quot;:&quot;26&quot;,&quot;container-title-short&quot;:&quot;&quot;},&quot;isTemporary&quot;:false}]},{&quot;citationID&quot;:&quot;MENDELEY_CITATION_b88c5398-356c-4dd6-910a-1154fc2a2abe&quot;,&quot;properties&quot;:{&quot;noteIndex&quot;:0},&quot;isEdited&quot;:false,&quot;manualOverride&quot;:{&quot;isManuallyOverridden&quot;:false,&quot;citeprocText&quot;:&quot;[6]&quot;,&quot;manualOverrideText&quot;:&quot;&quot;},&quot;citationTag&quot;:&quot;MENDELEY_CITATION_v3_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&quot;,&quot;citationItems&quot;:[{&quot;id&quot;:&quot;fa11ca6b-cdbb-3046-b0fc-8f028817e99c&quot;,&quot;itemData&quot;:{&quot;type&quot;:&quot;article-journal&quot;,&quot;id&quot;:&quot;fa11ca6b-cdbb-3046-b0fc-8f028817e99c&quot;,&quot;title&quot;:&quot;CypReact: A Software Tool for in Silico Reactant Prediction for Human Cytochrome P450 Enzymes&quot;,&quot;author&quot;:[{&quot;family&quot;:&quot;Tian&quot;,&quot;given&quot;:&quot;Siyang&quot;,&quot;parse-names&quot;:false,&quot;dropping-particle&quot;:&quot;&quot;,&quot;non-dropping-particle&quot;:&quot;&quot;},{&quot;family&quot;:&quot;Djoumbou-Feunang&quot;,&quot;given&quot;:&quot;Yannick&quot;,&quot;parse-names&quot;:false,&quot;dropping-particle&quot;:&quot;&quot;,&quot;non-dropping-particle&quot;:&quot;&quot;},{&quot;family&quot;:&quot;Greiner&quot;,&quot;given&quot;:&quot;Russell&quot;,&quot;parse-names&quot;:false,&quot;dropping-particle&quot;:&quot;&quot;,&quot;non-dropping-particle&quot;:&quot;&quot;},{&quot;family&quot;:&quot;Wishart&quot;,&quot;given&quot;:&quot;David S&quot;,&quot;parse-names&quot;:false,&quot;dropping-particle&quot;:&quot;&quot;,&quot;non-dropping-particle&quot;:&quot;&quot;}],&quot;container-title&quot;:&quot;Journal of Chemical Information and Modeling&quot;,&quot;DOI&quot;:&quot;10.1021/acs.jcim.8b00035&quot;,&quot;URL&quot;:&quot;https://doi.org/10.1021/acs.jcim.8b00035&quot;,&quot;issued&quot;:{&quot;date-parts&quot;:[[2018]]},&quot;page&quot;:&quot;1282-1291&quot;,&quot;issue&quot;:&quot;6&quot;,&quot;volume&quot;:&quot;58&quot;,&quot;container-title-short&quot;:&quot;J. Chem. Inf. Model.&quot;},&quot;isTemporary&quot;:false}]},{&quot;citationID&quot;:&quot;MENDELEY_CITATION_9e00beb5-b823-441f-bd21-5c0245227aff&quot;,&quot;properties&quot;:{&quot;noteIndex&quot;:0},&quot;isEdited&quot;:false,&quot;manualOverride&quot;:{&quot;isManuallyOverridden&quot;:false,&quot;citeprocText&quot;:&quot;[7]&quot;,&quot;manualOverrideText&quot;:&quot;&quot;},&quot;citationTag&quot;:&quot;MENDELEY_CITATION_v3_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&quot;,&quot;citationItems&quot;:[{&quot;id&quot;:&quot;5396d9c6-cb3b-363a-9678-0b3b627a7437&quot;,&quot;itemData&quot;:{&quot;type&quot;:&quot;article-journal&quot;,&quot;id&quot;:&quot;5396d9c6-cb3b-363a-9678-0b3b627a7437&quot;,&quot;title&quot;:&quot;DeepP450: Predicting Human P450 Activities of Small Molecules by Integrating Pretrained Protein Language Model and Molecular Representation&quot;,&quot;author&quot;:[{&quot;family&quot;:&quot;Chang&quot;,&quot;given&quot;:&quot;Jiamin&quot;,&quot;parse-names&quot;:false,&quot;dropping-particle&quot;:&quot;&quot;,&quot;non-dropping-particle&quot;:&quot;&quot;},{&quot;family&quot;:&quot;Fan&quot;,&quot;given&quot;:&quot;Xiaoyu&quot;,&quot;parse-names&quot;:false,&quot;dropping-particle&quot;:&quot;&quot;,&quot;non-dropping-particle&quot;:&quot;&quot;},{&quot;family&quot;:&quot;Tian&quot;,&quot;given&quot;:&quot;Boxue&quot;,&quot;parse-names&quot;:false,&quot;dropping-particle&quot;:&quot;&quot;,&quot;non-dropping-particle&quot;:&quot;&quot;}],&quot;container-title&quot;:&quot;Journal of Chemical Information and Modeling&quot;,&quot;DOI&quot;:&quot;10.1021/acs.jcim.4c00115&quot;,&quot;URL&quot;:&quot;https://doi.org/10.1021/acs.jcim.4c00115&quot;,&quot;issued&quot;:{&quot;date-parts&quot;:[[2024]]},&quot;page&quot;:&quot;3149-3160&quot;,&quot;issue&quot;:&quot;8&quot;,&quot;volume&quot;:&quot;64&quot;,&quot;container-title-short&quot;:&quot;J. Chem. Inf. Model.&quot;},&quot;isTemporary&quot;:false}]},{&quot;citationID&quot;:&quot;MENDELEY_CITATION_5dca3d77-b598-4d67-9225-e52ba676341f&quot;,&quot;properties&quot;:{&quot;noteIndex&quot;:0},&quot;isEdited&quot;:false,&quot;manualOverride&quot;:{&quot;isManuallyOverridden&quot;:false,&quot;citeprocText&quot;:&quot;[8]&quot;,&quot;manualOverrideText&quot;:&quot;&quot;},&quot;citationTag&quot;:&quot;MENDELEY_CITATION_v3_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&quot;,&quot;citationItems&quot;:[{&quot;id&quot;:&quot;43b0d024-e9b9-3059-b9bc-07339751aa6d&quot;,&quot;itemData&quot;:{&quot;type&quot;:&quot;article-journal&quot;,&quot;id&quot;:&quot;43b0d024-e9b9-3059-b9bc-07339751aa6d&quot;,&quot;title&quot;:&quot;ADMETlab 3.0: an updated comprehensive online ADMET prediction platform enhanced with broader coverage, improved performance, API functionality and decision support&quot;,&quot;author&quot;:[{&quot;family&quot;:&quot;Fu&quot;,&quot;given&quot;:&quot;Li&quot;,&quot;parse-names&quot;:false,&quot;dropping-particle&quot;:&quot;&quot;,&quot;non-dropping-particle&quot;:&quot;&quot;},{&quot;family&quot;:&quot;Shi&quot;,&quot;given&quot;:&quot;Shaohua&quot;,&quot;parse-names&quot;:false,&quot;dropping-particle&quot;:&quot;&quot;,&quot;non-dropping-particle&quot;:&quot;&quot;},{&quot;family&quot;:&quot;Yi&quot;,&quot;given&quot;:&quot;Jiacai&quot;,&quot;parse-names&quot;:false,&quot;dropping-particle&quot;:&quot;&quot;,&quot;non-dropping-particle&quot;:&quot;&quot;},{&quot;family&quot;:&quot;Wang&quot;,&quot;given&quot;:&quot;Ningning&quot;,&quot;parse-names&quot;:false,&quot;dropping-particle&quot;:&quot;&quot;,&quot;non-dropping-particle&quot;:&quot;&quot;},{&quot;family&quot;:&quot;He&quot;,&quot;given&quot;:&quot;Yuanhang&quot;,&quot;parse-names&quot;:false,&quot;dropping-particle&quot;:&quot;&quot;,&quot;non-dropping-particle&quot;:&quot;&quot;},{&quot;family&quot;:&quot;Wu&quot;,&quot;given&quot;:&quot;Zhenxing&quot;,&quot;parse-names&quot;:false,&quot;dropping-particle&quot;:&quot;&quot;,&quot;non-dropping-particle&quot;:&quot;&quot;},{&quot;family&quot;:&quot;Peng&quot;,&quot;given&quot;:&quot;Jinfu&quot;,&quot;parse-names&quot;:false,&quot;dropping-particle&quot;:&quot;&quot;,&quot;non-dropping-particle&quot;:&quot;&quot;},{&quot;family&quot;:&quot;Deng&quot;,&quot;given&quot;:&quot;Youchao&quot;,&quot;parse-names&quot;:false,&quot;dropping-particle&quot;:&quot;&quot;,&quot;non-dropping-particle&quot;:&quot;&quot;},{&quot;family&quot;:&quot;Wang&quot;,&quot;given&quot;:&quot;Wenxuan&quot;,&quot;parse-names&quot;:false,&quot;dropping-particle&quot;:&quot;&quot;,&quot;non-dropping-particle&quot;:&quot;&quot;},{&quot;family&quot;:&quot;Wu&quot;,&quot;given&quot;:&quot;Chengkun&quot;,&quot;parse-names&quot;:false,&quot;dropping-particle&quot;:&quot;&quot;,&quot;non-dropping-particle&quot;:&quot;&quot;},{&quot;family&quot;:&quot;Lyu&quot;,&quot;given&quot;:&quot;Aiping&quot;,&quot;parse-names&quot;:false,&quot;dropping-particle&quot;:&quot;&quot;,&quot;non-dropping-particle&quot;:&quot;&quot;},{&quot;family&quot;:&quot;Zeng&quot;,&quot;given&quot;:&quot;Xiangxiang&quot;,&quot;parse-names&quot;:false,&quot;dropping-particle&quot;:&quot;&quot;,&quot;non-dropping-particle&quot;:&quot;&quot;},{&quot;family&quot;:&quot;Zhao&quot;,&quot;given&quot;:&quot;Wentao&quot;,&quot;parse-names&quot;:false,&quot;dropping-particle&quot;:&quot;&quot;,&quot;non-dropping-particle&quot;:&quot;&quot;},{&quot;family&quot;:&quot;Hou&quot;,&quot;given&quot;:&quot;Tingjun&quot;,&quot;parse-names&quot;:false,&quot;dropping-particle&quot;:&quot;&quot;,&quot;non-dropping-particle&quot;:&quot;&quot;},{&quot;family&quot;:&quot;Cao&quot;,&quot;given&quot;:&quot;Dongsheng&quot;,&quot;parse-names&quot;:false,&quot;dropping-particle&quot;:&quot;&quot;,&quot;non-dropping-particle&quot;:&quot;&quot;}],&quot;container-title&quot;:&quot;Nucleic Acids Research&quot;,&quot;DOI&quot;:&quot;10.1093/nar/gkae236&quot;,&quot;ISSN&quot;:&quot;0305-1048&quot;,&quot;issued&quot;:{&quot;date-parts&quot;:[[2024,7,5]]},&quot;page&quot;:&quot;W422-W431&quot;,&quot;abstract&quot;:&quot;&lt;p&gt;ADMETlab 3.0 is the second updated version of the web server that provides a comprehensive and efficient platform for evaluating ADMET-related parameters as well as physicochemical properties and medicinal chemistry characteristics involved in the drug discovery process. This new release addresses the limitations of the previous version and offers broader coverage, improved performance, API functionality, and decision support. For supporting data and endpoints, this version includes 119 features, an increase of 31 compared to the previous version. The updated number of entries is 1.5 times larger than the previous version with over 400 000 entries. ADMETlab 3.0 incorporates a multi-task DMPNN architecture coupled with molecular descriptors, a method that not only guaranteed calculation speed for each endpoint simultaneously, but also achieved a superior performance in terms of accuracy and robustness. In addition, an API has been introduced to meet the growing demand for programmatic access to large amounts of data in ADMETlab 3.0. Moreover, this version includes uncertainty estimates in the prediction results, aiding in the confident selection of candidate compounds for further studies and experiments. ADMETlab 3.0 is publicly for access without the need for registration at: https://admetlab3.scbdd.com.&lt;/p&gt;&quot;,&quot;issue&quot;:&quot;W1&quot;,&quot;volume&quot;:&quot;52&quot;,&quot;container-title-short&quot;:&quot;Nucleic Acids Res.&quot;},&quot;isTemporary&quot;:false}]},{&quot;citationID&quot;:&quot;MENDELEY_CITATION_0e2af13d-1186-46c8-b802-9fb14303c0dc&quot;,&quot;properties&quot;:{&quot;noteIndex&quot;:0},&quot;isEdited&quot;:false,&quot;manualOverride&quot;:{&quot;isManuallyOverridden&quot;:false,&quot;citeprocText&quot;:&quot;[9]&quot;,&quot;manualOverrideText&quot;:&quot;&quot;},&quot;citationTag&quot;:&quot;MENDELEY_CITATION_v3_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&quot;,&quot;citationItems&quot;:[{&quot;id&quot;:&quot;23927d7f-21a8-33f9-bc4d-62bd50964d5d&quot;,&quot;itemData&quot;:{&quot;type&quot;:&quot;article-journal&quot;,&quot;id&quot;:&quot;23927d7f-21a8-33f9-bc4d-62bd50964d5d&quot;,&quot;title&quot;:&quot;The Generation of a Unique Machine Description for Chemical Structures-A Technique Developed at Chemical Abstracts Service.&quot;,&quot;author&quot;:[{&quot;family&quot;:&quot;Morgan&quot;,&quot;given&quot;:&quot;H. L.&quot;,&quot;parse-names&quot;:false,&quot;dropping-particle&quot;:&quot;&quot;,&quot;non-dropping-particle&quot;:&quot;&quot;}],&quot;container-title&quot;:&quot;Journal of Chemical Documentation&quot;,&quot;DOI&quot;:&quot;10.1021/c160017a018&quot;,&quot;ISSN&quot;:&quot;0021-9576&quot;,&quot;issued&quot;:{&quot;date-parts&quot;:[[1965,5,1]]},&quot;page&quot;:&quot;107-113&quot;,&quot;issue&quot;:&quot;2&quot;,&quot;volume&quot;:&quot;5&quot;,&quot;container-title-short&quot;:&quot;J. Chem. Doc.&quot;},&quot;isTemporary&quot;:false}]},{&quot;citationID&quot;:&quot;MENDELEY_CITATION_7594bf8b-015d-49aa-b108-510a5eae62b9&quot;,&quot;properties&quot;:{&quot;noteIndex&quot;:0},&quot;isEdited&quot;:false,&quot;manualOverride&quot;:{&quot;isManuallyOverridden&quot;:false,&quot;citeprocText&quot;:&quot;[10]&quot;,&quot;manualOverrideText&quot;:&quot;&quot;},&quot;citationTag&quot;:&quot;MENDELEY_CITATION_v3_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&quot;,&quot;citationItems&quot;:[{&quot;id&quot;:&quot;80c5781c-7e86-33cf-b75b-5ab47acd2884&quot;,&quot;itemData&quot;:{&quot;type&quot;:&quot;article-journal&quot;,&quot;id&quot;:&quot;80c5781c-7e86-33cf-b75b-5ab47acd2884&quot;,&quot;title&quot;:&quot;Mol2vec: Unsupervised Machine Learning Approach with Chemical Intuition&quot;,&quot;author&quot;:[{&quot;family&quot;:&quot;Jaeger&quot;,&quot;given&quot;:&quot;Sabrina&quot;,&quot;parse-names&quot;:false,&quot;dropping-particle&quot;:&quot;&quot;,&quot;non-dropping-particle&quot;:&quot;&quot;},{&quot;family&quot;:&quot;Fulle&quot;,&quot;given&quot;:&quot;Simone&quot;,&quot;parse-names&quot;:false,&quot;dropping-particle&quot;:&quot;&quot;,&quot;non-dropping-particle&quot;:&quot;&quot;},{&quot;family&quot;:&quot;Turk&quot;,&quot;given&quot;:&quot;Samo&quot;,&quot;parse-names&quot;:false,&quot;dropping-particle&quot;:&quot;&quot;,&quot;non-dropping-particle&quot;:&quot;&quot;}],&quot;container-title&quot;:&quot;Journal of Chemical Information and Modeling&quot;,&quot;DOI&quot;:&quot;10.1021/acs.jcim.7b00616&quot;,&quot;ISSN&quot;:&quot;1549-9596&quot;,&quot;issued&quot;:{&quot;date-parts&quot;:[[2018,1,22]]},&quot;page&quot;:&quot;27-35&quot;,&quot;issue&quot;:&quot;1&quot;,&quot;volume&quot;:&quot;58&quot;,&quot;container-title-short&quot;:&quot;J. Chem. Inf. Model.&quot;},&quot;isTemporary&quot;:false}]},{&quot;citationID&quot;:&quot;MENDELEY_CITATION_70668c7c-96e7-42e2-8067-7b3fa3e95455&quot;,&quot;properties&quot;:{&quot;noteIndex&quot;:0},&quot;isEdited&quot;:false,&quot;manualOverride&quot;:{&quot;isManuallyOverridden&quot;:false,&quot;citeprocText&quot;:&quot;[11]&quot;,&quot;manualOverrideText&quot;:&quot;&quot;},&quot;citationTag&quot;:&quot;MENDELEY_CITATION_v3_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&quot;,&quot;citationItems&quot;:[{&quot;id&quot;:&quot;27f87688-13d2-35cf-b3cc-69d56bb2def3&quot;,&quot;itemData&quot;:{&quot;type&quot;:&quot;article-journal&quot;,&quot;id&quot;:&quot;27f87688-13d2-35cf-b3cc-69d56bb2def3&quot;,&quot;title&quot;:&quot;ChemBERTa: Large-Scale Self-Supervised Pretraining for Molecular Property Prediction&quot;,&quot;author&quot;:[{&quot;family&quot;:&quot;Chithrananda&quot;,&quot;given&quot;:&quot;Seyone&quot;,&quot;parse-names&quot;:false,&quot;dropping-particle&quot;:&quot;&quot;,&quot;non-dropping-particle&quot;:&quot;&quot;},{&quot;family&quot;:&quot;Grand&quot;,&quot;given&quot;:&quot;Gabriel&quot;,&quot;parse-names&quot;:false,&quot;dropping-particle&quot;:&quot;&quot;,&quot;non-dropping-particle&quot;:&quot;&quot;},{&quot;family&quot;:&quot;Ramsundar&quot;,&quot;given&quot;:&quot;Bharath&quot;,&quot;parse-names&quot;:false,&quot;dropping-particle&quot;:&quot;&quot;,&quot;non-dropping-particle&quot;:&quot;&quot;}],&quot;container-title&quot;:&quot;arXiv e-prints&quot;,&quot;DOI&quot;:&quot;10.48550/arXiv.2010.09885&quot;,&quot;issued&quot;:{&quot;date-parts&quot;:[[2020,10]]},&quot;page&quot;:&quot;arXiv:2010.09885&quot;,&quot;container-title-short&quot;:&quot;&quot;},&quot;isTemporary&quot;:false}]},{&quot;citationID&quot;:&quot;MENDELEY_CITATION_eed2f2c2-9fb7-481f-9847-505a31c7df76&quot;,&quot;properties&quot;:{&quot;noteIndex&quot;:0},&quot;isEdited&quot;:false,&quot;manualOverride&quot;:{&quot;isManuallyOverridden&quot;:false,&quot;citeprocText&quot;:&quot;[12]&quot;,&quot;manualOverrideText&quot;:&quot;&quot;},&quot;citationTag&quot;:&quot;MENDELEY_CITATION_v3_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&quot;,&quot;citationItems&quot;:[{&quot;id&quot;:&quot;6b3c2795-b358-3d30-b69e-b2ad6a5195ff&quot;,&quot;itemData&quot;:{&quot;type&quot;:&quot;article-journal&quot;,&quot;id&quot;:&quot;6b3c2795-b358-3d30-b69e-b2ad6a5195ff&quot;,&quot;title&quot;:&quot;MOLE: Modular Learning FramEwork via Mutual Information Maximization&quot;,&quot;author&quot;:[{&quot;family&quot;:&quot;Li&quot;,&quot;given&quot;:&quot;Tianchao&quot;,&quot;parse-names&quot;:false,&quot;dropping-particle&quot;:&quot;&quot;,&quot;non-dropping-particle&quot;:&quot;&quot;},{&quot;family&quot;:&quot;Pei&quot;,&quot;given&quot;:&quot;Yulong&quot;,&quot;parse-names&quot;:false,&quot;dropping-particle&quot;:&quot;&quot;,&quot;non-dropping-particle&quot;:&quot;&quot;}],&quot;container-title&quot;:&quot;ArXiv&quot;,&quot;URL&quot;:&quot;https://api.semanticscholar.org/CorpusID:260899882&quot;,&quot;issued&quot;:{&quot;date-parts&quot;:[[2023]]},&quot;volume&quot;:&quot;abs/2308.07772&quot;,&quot;container-title-short&quot;:&quot;ArXiv&quot;},&quot;isTemporary&quot;:false}]},{&quot;citationID&quot;:&quot;MENDELEY_CITATION_6911c6cb-3ce9-4960-b0ab-f73003ee0ccc&quot;,&quot;properties&quot;:{&quot;noteIndex&quot;:0},&quot;isEdited&quot;:false,&quot;manualOverride&quot;:{&quot;isManuallyOverridden&quot;:false,&quot;citeprocText&quot;:&quot;[13]&quot;,&quot;manualOverrideText&quot;:&quot;&quot;},&quot;citationTag&quot;:&quot;MENDELEY_CITATION_v3_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&quot;,&quot;citationItems&quot;:[{&quot;id&quot;:&quot;91bc1232-bb46-3423-9b4f-a14d74fb3264&quot;,&quot;itemData&quot;:{&quot;type&quot;:&quot;webpage&quot;,&quot;id&quot;:&quot;91bc1232-bb46-3423-9b4f-a14d74fb3264&quot;,&quot;title&quot;:&quot;RDKit: Open-source cheminformatics.&quot;,&quot;container-title&quot;:&quot;https://www.rdkit.org&quot;,&quot;container-title-short&quot;:&quot;&quot;},&quot;isTemporary&quot;:false}]},{&quot;citationID&quot;:&quot;MENDELEY_CITATION_091adfc3-c72b-452f-a882-3f98e173bfcc&quot;,&quot;properties&quot;:{&quot;noteIndex&quot;:0},&quot;isEdited&quot;:false,&quot;manualOverride&quot;:{&quot;isManuallyOverridden&quot;:false,&quot;citeprocText&quot;:&quot;[14]&quot;,&quot;manualOverrideText&quot;:&quot;&quot;},&quot;citationTag&quot;:&quot;MENDELEY_CITATION_v3_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&quot;,&quot;citationItems&quot;:[{&quot;id&quot;:&quot;1fdf973c-15b9-3df1-916b-2aad974dea3b&quot;,&quot;itemData&quot;:{&quot;type&quot;:&quot;article-journal&quot;,&quot;id&quot;:&quot;1fdf973c-15b9-3df1-916b-2aad974dea3b&quot;,&quot;title&quot;:&quot;Extended-Connectivity Fingerprints&quot;,&quot;author&quot;:[{&quot;family&quot;:&quot;Rogers&quot;,&quot;given&quot;:&quot;David&quot;,&quot;parse-names&quot;:false,&quot;dropping-particle&quot;:&quot;&quot;,&quot;non-dropping-particle&quot;:&quot;&quot;},{&quot;family&quot;:&quot;Hahn&quot;,&quot;given&quot;:&quot;Mathew&quot;,&quot;parse-names&quot;:false,&quot;dropping-particle&quot;:&quot;&quot;,&quot;non-dropping-particle&quot;:&quot;&quot;}],&quot;container-title&quot;:&quot;Journal of Chemical Information and Modeling&quot;,&quot;DOI&quot;:&quot;10.1021/ci100050t&quot;,&quot;URL&quot;:&quot;https://doi.org/10.1021/ci100050t&quot;,&quot;issued&quot;:{&quot;date-parts&quot;:[[2010]]},&quot;page&quot;:&quot;742-754&quot;,&quot;issue&quot;:&quot;5&quot;,&quot;volume&quot;:&quot;50&quot;,&quot;container-title-short&quot;:&quot;J. Chem. Inf. Model.&quot;},&quot;isTemporary&quot;:false}]},{&quot;citationID&quot;:&quot;MENDELEY_CITATION_05c57d48-f1ba-49fd-a3fb-d7b08348c075&quot;,&quot;properties&quot;:{&quot;noteIndex&quot;:0},&quot;isEdited&quot;:false,&quot;manualOverride&quot;:{&quot;isManuallyOverridden&quot;:false,&quot;citeprocText&quot;:&quot;[15]&quot;,&quot;manualOverrideText&quot;:&quot;&quot;},&quot;citationTag&quot;:&quot;MENDELEY_CITATION_v3_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&quot;,&quot;citationItems&quot;:[{&quot;id&quot;:&quot;16657982-092a-3db6-97ef-8ee47347c62e&quot;,&quot;itemData&quot;:{&quot;type&quot;:&quot;article-journal&quot;,&quot;id&quot;:&quot;16657982-092a-3db6-97ef-8ee47347c62e&quot;,&quot;title&quot;:&quot;Low-Compute repurposing of an English transformer into a molecular encoder: A two-stage SELFIES adaptation of RoBERTa&quot;,&quot;author&quot;:[{&quot;family&quot;:&quot;Alhmoudi&quot;,&quot;given&quot;:&quot;Obaid Khaleifah&quot;,&quot;parse-names&quot;:false,&quot;dropping-particle&quot;:&quot;&quot;,&quot;non-dropping-particle&quot;:&quot;&quot;},{&quot;family&quot;:&quot;Thameem&quot;,&quot;given&quot;:&quot;Muhammed&quot;,&quot;parse-names&quot;:false,&quot;dropping-particle&quot;:&quot;&quot;,&quot;non-dropping-particle&quot;:&quot;&quot;},{&quot;family&quot;:&quot;Elkamel&quot;,&quot;given&quot;:&quot;Ali&quot;,&quot;parse-names&quot;:false,&quot;dropping-particle&quot;:&quot;&quot;,&quot;non-dropping-particle&quot;:&quot;&quot;},{&quot;family&quot;:&quot;AlHammadi&quot;,&quot;given&quot;:&quot;Ali A.&quot;,&quot;parse-names&quot;:false,&quot;dropping-particle&quot;:&quot;&quot;,&quot;non-dropping-particle&quot;:&quot;&quot;}],&quot;container-title&quot;:&quot;Results in Engineering&quot;,&quot;DOI&quot;:&quot;10.1016/j.rineng.2025.108390&quot;,&quot;ISSN&quot;:&quot;25901230&quot;,&quot;issued&quot;:{&quot;date-parts&quot;:[[2025,12]]},&quot;page&quot;:&quot;108390&quot;,&quot;volume&quot;:&quot;28&quot;,&quot;container-title-short&quot;:&quot;&quot;},&quot;isTemporary&quot;:false}]},{&quot;citationID&quot;:&quot;MENDELEY_CITATION_61882ab6-be78-4074-86b7-8a58822453b0&quot;,&quot;properties&quot;:{&quot;noteIndex&quot;:0},&quot;isEdited&quot;:false,&quot;manualOverride&quot;:{&quot;isManuallyOverridden&quot;:false,&quot;citeprocText&quot;:&quot;[16], [17]&quot;,&quot;manualOverrideText&quot;:&quot;&quot;},&quot;citationTag&quot;:&quot;MENDELEY_CITATION_v3_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&quot;,&quot;citationItems&quot;:[{&quot;id&quot;:&quot;4b7e155f-c785-39de-bd3f-62287a2822db&quot;,&quot;itemData&quot;:{&quot;type&quot;:&quot;paper-conference&quot;,&quot;id&quot;:&quot;4b7e155f-c785-39de-bd3f-62287a2822db&quot;,&quot;title&quot;:&quot;BERT: Pre-training of Deep Bidirectional Transformers for Language Understanding&quot;,&quot;author&quot;:[{&quot;family&quot;:&quot;Devlin&quot;,&quot;given&quot;:&quot;Jacob&quot;,&quot;parse-names&quot;:false,&quot;dropping-particle&quot;:&quot;&quot;,&quot;non-dropping-particle&quot;:&quot;&quot;},{&quot;family&quot;:&quot;Chang&quot;,&quot;given&quot;:&quot;Ming-Wei&quot;,&quot;parse-names&quot;:false,&quot;dropping-particle&quot;:&quot;&quot;,&quot;non-dropping-particle&quot;:&quot;&quot;},{&quot;family&quot;:&quot;Lee&quot;,&quot;given&quot;:&quot;Kenton&quot;,&quot;parse-names&quot;:false,&quot;dropping-particle&quot;:&quot;&quot;,&quot;non-dropping-particle&quot;:&quot;&quot;},{&quot;family&quot;:&quot;Toutanova&quot;,&quot;given&quot;:&quot;Kristina&quot;,&quot;parse-names&quot;:false,&quot;dropping-particle&quot;:&quot;&quot;,&quot;non-dropping-particle&quot;:&quot;&quot;}],&quot;container-title&quot;:&quot;North American Chapter of the Association for Computational Linguistics&quot;,&quot;URL&quot;:&quot;https://api.semanticscholar.org/CorpusID:52967399&quot;,&quot;issued&quot;:{&quot;date-parts&quot;:[[2019]]},&quot;container-title-short&quot;:&quot;&quot;},&quot;isTemporary&quot;:false},{&quot;id&quot;:&quot;d6b0ebc7-a9eb-3e05-9f44-6d798a458d6c&quot;,&quot;itemData&quot;:{&quot;type&quot;:&quot;article-journal&quot;,&quot;id&quot;:&quot;d6b0ebc7-a9eb-3e05-9f44-6d798a458d6c&quot;,&quot;title&quot;:&quot;RoBERTa: A Robustly Optimized BERT Pretraining Approach&quot;,&quot;author&quot;:[{&quot;family&quot;:&quot;Liu&quot;,&quot;given&quot;:&quot;Yinhan&quot;,&quot;parse-names&quot;:false,&quot;dropping-particle&quot;:&quot;&quot;,&quot;non-dropping-particle&quot;:&quot;&quot;},{&quot;family&quot;:&quot;Ott&quot;,&quot;given&quot;:&quot;Myle&quot;,&quot;parse-names&quot;:false,&quot;dropping-particle&quot;:&quot;&quot;,&quot;non-dropping-particle&quot;:&quot;&quot;},{&quot;family&quot;:&quot;Goyal&quot;,&quot;given&quot;:&quot;Naman&quot;,&quot;parse-names&quot;:false,&quot;dropping-particle&quot;:&quot;&quot;,&quot;non-dropping-particle&quot;:&quot;&quot;},{&quot;family&quot;:&quot;Du&quot;,&quot;given&quot;:&quot;Jingfei&quot;,&quot;parse-names&quot;:false,&quot;dropping-particle&quot;:&quot;&quot;,&quot;non-dropping-particle&quot;:&quot;&quot;},{&quot;family&quot;:&quot;Joshi&quot;,&quot;given&quot;:&quot;Mandar&quot;,&quot;parse-names&quot;:false,&quot;dropping-particle&quot;:&quot;&quot;,&quot;non-dropping-particle&quot;:&quot;&quot;},{&quot;family&quot;:&quot;Chen&quot;,&quot;given&quot;:&quot;Danqi&quot;,&quot;parse-names&quot;:false,&quot;dropping-particle&quot;:&quot;&quot;,&quot;non-dropping-particle&quot;:&quot;&quot;},{&quot;family&quot;:&quot;Levy&quot;,&quot;given&quot;:&quot;Omer&quot;,&quot;parse-names&quot;:false,&quot;dropping-particle&quot;:&quot;&quot;,&quot;non-dropping-particle&quot;:&quot;&quot;},{&quot;family&quot;:&quot;Lewis&quot;,&quot;given&quot;:&quot;Mike&quot;,&quot;parse-names&quot;:false,&quot;dropping-particle&quot;:&quot;&quot;,&quot;non-dropping-particle&quot;:&quot;&quot;},{&quot;family&quot;:&quot;Zettlemoyer&quot;,&quot;given&quot;:&quot;Luke&quot;,&quot;parse-names&quot;:false,&quot;dropping-particle&quot;:&quot;&quot;,&quot;non-dropping-particle&quot;:&quot;&quot;},{&quot;family&quot;:&quot;Stoyanov&quot;,&quot;given&quot;:&quot;Veselin&quot;,&quot;parse-names&quot;:false,&quot;dropping-particle&quot;:&quot;&quot;,&quot;non-dropping-particle&quot;:&quot;&quot;}],&quot;container-title&quot;:&quot;ArXiv&quot;,&quot;URL&quot;:&quot;https://api.semanticscholar.org/CorpusID:198953378&quot;,&quot;issued&quot;:{&quot;date-parts&quot;:[[2019]]},&quot;volume&quot;:&quot;abs/1907.11692&quot;,&quot;container-title-short&quot;:&quot;ArXiv&quot;},&quot;isTemporary&quot;:false}]},{&quot;citationID&quot;:&quot;MENDELEY_CITATION_7f594b16-8ad5-4013-aee5-cc9efd81053f&quot;,&quot;properties&quot;:{&quot;noteIndex&quot;:0},&quot;isEdited&quot;:false,&quot;manualOverride&quot;:{&quot;isManuallyOverridden&quot;:false,&quot;citeprocText&quot;:&quot;[18]&quot;,&quot;manualOverrideText&quot;:&quot;&quot;},&quot;citationTag&quot;:&quot;MENDELEY_CITATION_v3_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&quot;,&quot;citationItems&quot;:[{&quot;id&quot;:&quot;528eede6-a120-383e-9473-16c5f897d2c4&quot;,&quot;itemData&quot;:{&quot;type&quot;:&quot;article-journal&quot;,&quot;id&quot;:&quot;528eede6-a120-383e-9473-16c5f897d2c4&quot;,&quot;title&quot;:&quot;Neural Machine Translation of Rare Words with Subword Units&quot;,&quot;author&quot;:[{&quot;family&quot;:&quot;Sennrich&quot;,&quot;given&quot;:&quot;Rico&quot;,&quot;parse-names&quot;:false,&quot;dropping-particle&quot;:&quot;&quot;,&quot;non-dropping-particle&quot;:&quot;&quot;},{&quot;family&quot;:&quot;Haddow&quot;,&quot;given&quot;:&quot;Barry&quot;,&quot;parse-names&quot;:false,&quot;dropping-particle&quot;:&quot;&quot;,&quot;non-dropping-particle&quot;:&quot;&quot;},{&quot;family&quot;:&quot;Birch&quot;,&quot;given&quot;:&quot;Alexandra&quot;,&quot;parse-names&quot;:false,&quot;dropping-particle&quot;:&quot;&quot;,&quot;non-dropping-particle&quot;:&quot;&quot;}],&quot;container-title&quot;:&quot;ArXiv&quot;,&quot;URL&quot;:&quot;https://api.semanticscholar.org/CorpusID:1114678&quot;,&quot;issued&quot;:{&quot;date-parts&quot;:[[2015]]},&quot;volume&quot;:&quot;abs/1508.07909&quot;,&quot;container-title-short&quot;:&quot;ArXiv&quot;},&quot;isTemporary&quot;:false}]},{&quot;citationID&quot;:&quot;MENDELEY_CITATION_800b8284-81e8-409a-a9d8-f65b34f75303&quot;,&quot;properties&quot;:{&quot;noteIndex&quot;:0},&quot;isEdited&quot;:false,&quot;manualOverride&quot;:{&quot;isManuallyOverridden&quot;:false,&quot;citeprocText&quot;:&quot;[19]&quot;,&quot;manualOverrideText&quot;:&quot;&quot;},&quot;citationTag&quot;:&quot;MENDELEY_CITATION_v3_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&quot;,&quot;citationItems&quot;:[{&quot;id&quot;:&quot;038f20e1-2011-366e-8442-37bf6e4fda69&quot;,&quot;itemData&quot;:{&quot;type&quot;:&quot;article-journal&quot;,&quot;id&quot;:&quot;038f20e1-2011-366e-8442-37bf6e4fda69&quot;,&quot;title&quot;:&quot;InChI, the IUPAC International Chemical Identifier&quot;,&quot;author&quot;:[{&quot;family&quot;:&quot;Heller&quot;,&quot;given&quot;:&quot;Stephen R&quot;,&quot;parse-names&quot;:false,&quot;dropping-particle&quot;:&quot;&quot;,&quot;non-dropping-particle&quot;:&quot;&quot;},{&quot;family&quot;:&quot;McNaught&quot;,&quot;given&quot;:&quot;Alan&quot;,&quot;parse-names&quot;:false,&quot;dropping-particle&quot;:&quot;&quot;,&quot;non-dropping-particle&quot;:&quot;&quot;},{&quot;family&quot;:&quot;Pletnev&quot;,&quot;given&quot;:&quot;Igor&quot;,&quot;parse-names&quot;:false,&quot;dropping-particle&quot;:&quot;&quot;,&quot;non-dropping-particle&quot;:&quot;&quot;},{&quot;family&quot;:&quot;Stein&quot;,&quot;given&quot;:&quot;Stephen&quot;,&quot;parse-names&quot;:false,&quot;dropping-particle&quot;:&quot;&quot;,&quot;non-dropping-particle&quot;:&quot;&quot;},{&quot;family&quot;:&quot;Tchekhovskoi&quot;,&quot;given&quot;:&quot;Dmitrii&quot;,&quot;parse-names&quot;:false,&quot;dropping-particle&quot;:&quot;&quot;,&quot;non-dropping-particle&quot;:&quot;&quot;}],&quot;container-title&quot;:&quot;Journal of Cheminformatics&quot;,&quot;DOI&quot;:&quot;10.1186/s13321-015-0068-4&quot;,&quot;ISSN&quot;:&quot;1758-2946&quot;,&quot;issued&quot;:{&quot;date-parts&quot;:[[2015,12,30]]},&quot;page&quot;:&quot;23&quot;,&quot;issue&quot;:&quot;1&quot;,&quot;volume&quot;:&quot;7&quot;,&quot;container-title-short&quot;:&quot;J. Cheminform.&quot;},&quot;isTemporary&quot;:false}]},{&quot;citationID&quot;:&quot;MENDELEY_CITATION_df1d1646-57ca-4a3f-825a-d5645cb9ad91&quot;,&quot;properties&quot;:{&quot;noteIndex&quot;:0},&quot;isEdited&quot;:false,&quot;manualOverride&quot;:{&quot;isManuallyOverridden&quot;:false,&quot;citeprocText&quot;:&quot;[16]&quot;,&quot;manualOverrideText&quot;:&quot;&quot;},&quot;citationTag&quot;:&quot;MENDELEY_CITATION_v3_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&quot;,&quot;citationItems&quot;:[{&quot;id&quot;:&quot;4b7e155f-c785-39de-bd3f-62287a2822db&quot;,&quot;itemData&quot;:{&quot;type&quot;:&quot;paper-conference&quot;,&quot;id&quot;:&quot;4b7e155f-c785-39de-bd3f-62287a2822db&quot;,&quot;title&quot;:&quot;BERT: Pre-training of Deep Bidirectional Transformers for Language Understanding&quot;,&quot;author&quot;:[{&quot;family&quot;:&quot;Devlin&quot;,&quot;given&quot;:&quot;Jacob&quot;,&quot;parse-names&quot;:false,&quot;dropping-particle&quot;:&quot;&quot;,&quot;non-dropping-particle&quot;:&quot;&quot;},{&quot;family&quot;:&quot;Chang&quot;,&quot;given&quot;:&quot;Ming-Wei&quot;,&quot;parse-names&quot;:false,&quot;dropping-particle&quot;:&quot;&quot;,&quot;non-dropping-particle&quot;:&quot;&quot;},{&quot;family&quot;:&quot;Lee&quot;,&quot;given&quot;:&quot;Kenton&quot;,&quot;parse-names&quot;:false,&quot;dropping-particle&quot;:&quot;&quot;,&quot;non-dropping-particle&quot;:&quot;&quot;},{&quot;family&quot;:&quot;Toutanova&quot;,&quot;given&quot;:&quot;Kristina&quot;,&quot;parse-names&quot;:false,&quot;dropping-particle&quot;:&quot;&quot;,&quot;non-dropping-particle&quot;:&quot;&quot;}],&quot;container-title&quot;:&quot;North American Chapter of the Association for Computational Linguistics&quot;,&quot;URL&quot;:&quot;https://api.semanticscholar.org/CorpusID:52967399&quot;,&quot;issued&quot;:{&quot;date-parts&quot;:[[2019]]},&quot;container-title-short&quot;:&quot;&quot;},&quot;isTemporary&quot;:false}]},{&quot;citationID&quot;:&quot;MENDELEY_CITATION_0856a272-5a9c-4c62-8ea9-15c71a2f59c4&quot;,&quot;properties&quot;:{&quot;noteIndex&quot;:0},&quot;isEdited&quot;:false,&quot;manualOverride&quot;:{&quot;isManuallyOverridden&quot;:false,&quot;citeprocText&quot;:&quot;[20]&quot;,&quot;manualOverrideText&quot;:&quot;&quot;},&quot;citationTag&quot;:&quot;MENDELEY_CITATION_v3_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&quot;,&quot;citationItems&quot;:[{&quot;id&quot;:&quot;e9063351-84e5-35cf-9e83-b8bba0913bac&quot;,&quot;itemData&quot;:{&quot;type&quot;:&quot;article-journal&quot;,&quot;id&quot;:&quot;e9063351-84e5-35cf-9e83-b8bba0913bac&quot;,&quot;title&quot;:&quot;SGDR: Stochastic Gradient Descent with Warm Restarts&quot;,&quot;author&quot;:[{&quot;family&quot;:&quot;Loshchilov&quot;,&quot;given&quot;:&quot;Ilya&quot;,&quot;parse-names&quot;:false,&quot;dropping-particle&quot;:&quot;&quot;,&quot;non-dropping-particle&quot;:&quot;&quot;},{&quot;family&quot;:&quot;Hutter&quot;,&quot;given&quot;:&quot;Frank&quot;,&quot;parse-names&quot;:false,&quot;dropping-particle&quot;:&quot;&quot;,&quot;non-dropping-particle&quot;:&quot;&quot;}],&quot;container-title&quot;:&quot;arXiv: Learning&quot;,&quot;URL&quot;:&quot;https://api.semanticscholar.org/CorpusID:14337532&quot;,&quot;issued&quot;:{&quot;date-parts&quot;:[[2016]]},&quot;container-title-short&quot;:&quot;&quot;},&quot;isTemporary&quot;:false}]},{&quot;citationID&quot;:&quot;MENDELEY_CITATION_111eba3f-785c-4b4c-b6e6-fc4bf548cbdf&quot;,&quot;properties&quot;:{&quot;noteIndex&quot;:0},&quot;isEdited&quot;:false,&quot;manualOverride&quot;:{&quot;isManuallyOverridden&quot;:false,&quot;citeprocText&quot;:&quot;[11]&quot;,&quot;manualOverrideText&quot;:&quot;&quot;},&quot;citationTag&quot;:&quot;MENDELEY_CITATION_v3_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&quot;,&quot;citationItems&quot;:[{&quot;id&quot;:&quot;27f87688-13d2-35cf-b3cc-69d56bb2def3&quot;,&quot;itemData&quot;:{&quot;type&quot;:&quot;article-journal&quot;,&quot;id&quot;:&quot;27f87688-13d2-35cf-b3cc-69d56bb2def3&quot;,&quot;title&quot;:&quot;ChemBERTa: Large-Scale Self-Supervised Pretraining for Molecular Property Prediction&quot;,&quot;author&quot;:[{&quot;family&quot;:&quot;Chithrananda&quot;,&quot;given&quot;:&quot;Seyone&quot;,&quot;parse-names&quot;:false,&quot;dropping-particle&quot;:&quot;&quot;,&quot;non-dropping-particle&quot;:&quot;&quot;},{&quot;family&quot;:&quot;Grand&quot;,&quot;given&quot;:&quot;Gabriel&quot;,&quot;parse-names&quot;:false,&quot;dropping-particle&quot;:&quot;&quot;,&quot;non-dropping-particle&quot;:&quot;&quot;},{&quot;family&quot;:&quot;Ramsundar&quot;,&quot;given&quot;:&quot;Bharath&quot;,&quot;parse-names&quot;:false,&quot;dropping-particle&quot;:&quot;&quot;,&quot;non-dropping-particle&quot;:&quot;&quot;}],&quot;container-title&quot;:&quot;arXiv e-prints&quot;,&quot;DOI&quot;:&quot;10.48550/arXiv.2010.09885&quot;,&quot;issued&quot;:{&quot;date-parts&quot;:[[2020,10]]},&quot;page&quot;:&quot;arXiv:2010.09885&quot;,&quot;container-title-short&quot;:&quot;&quot;},&quot;isTemporary&quot;:false}]},{&quot;citationID&quot;:&quot;MENDELEY_CITATION_b0839fb6-ce26-4a25-ba91-51b39a67b272&quot;,&quot;properties&quot;:{&quot;noteIndex&quot;:0},&quot;isEdited&quot;:false,&quot;manualOverride&quot;:{&quot;isManuallyOverridden&quot;:false,&quot;citeprocText&quot;:&quot;[21]&quot;,&quot;manualOverrideText&quot;:&quot;&quot;},&quot;citationTag&quot;:&quot;MENDELEY_CITATION_v3_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&quot;,&quot;citationItems&quot;:[{&quot;id&quot;:&quot;4706f37f-66a5-3d27-a50b-d3f6c14a0549&quot;,&quot;itemData&quot;:{&quot;type&quot;:&quot;article-journal&quot;,&quot;id&quot;:&quot;4706f37f-66a5-3d27-a50b-d3f6c14a0549&quot;,&quot;title&quot;:&quot;On Large-Batch Training for Deep Learning: Generalization Gap and Sharp Minima&quot;,&quot;author&quot;:[{&quot;family&quot;:&quot;Keskar&quot;,&quot;given&quot;:&quot;Nitish Shirish&quot;,&quot;parse-names&quot;:false,&quot;dropping-particle&quot;:&quot;&quot;,&quot;non-dropping-particle&quot;:&quot;&quot;},{&quot;family&quot;:&quot;Mudigere&quot;,&quot;given&quot;:&quot;Dheevatsa&quot;,&quot;parse-names&quot;:false,&quot;dropping-particle&quot;:&quot;&quot;,&quot;non-dropping-particle&quot;:&quot;&quot;},{&quot;family&quot;:&quot;Nocedal&quot;,&quot;given&quot;:&quot;Jorge&quot;,&quot;parse-names&quot;:false,&quot;dropping-particle&quot;:&quot;&quot;,&quot;non-dropping-particle&quot;:&quot;&quot;},{&quot;family&quot;:&quot;Smelyanskiy&quot;,&quot;given&quot;:&quot;Mikhail&quot;,&quot;parse-names&quot;:false,&quot;dropping-particle&quot;:&quot;&quot;,&quot;non-dropping-particle&quot;:&quot;&quot;},{&quot;family&quot;:&quot;Tang&quot;,&quot;given&quot;:&quot;Ping Tak Peter&quot;,&quot;parse-names&quot;:false,&quot;dropping-particle&quot;:&quot;&quot;,&quot;non-dropping-particle&quot;:&quot;&quot;}],&quot;container-title&quot;:&quot;ArXiv&quot;,&quot;URL&quot;:&quot;https://api.semanticscholar.org/CorpusID:5834589&quot;,&quot;issued&quot;:{&quot;date-parts&quot;:[[2016]]},&quot;volume&quot;:&quot;abs/1609.04836&quot;,&quot;container-title-short&quot;:&quot;ArXiv&quot;},&quot;isTemporary&quot;:false}]},{&quot;citationID&quot;:&quot;MENDELEY_CITATION_983539a7-adc7-42fd-83b2-3ac25b495a30&quot;,&quot;properties&quot;:{&quot;noteIndex&quot;:0},&quot;isEdited&quot;:false,&quot;manualOverride&quot;:{&quot;isManuallyOverridden&quot;:false,&quot;citeprocText&quot;:&quot;[22]&quot;,&quot;manualOverrideText&quot;:&quot;&quot;},&quot;citationTag&quot;:&quot;MENDELEY_CITATION_v3_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&quot;,&quot;citationItems&quot;:[{&quot;id&quot;:&quot;7fc7ea6b-1629-3058-829b-cae1a8149255&quot;,&quot;itemData&quot;:{&quot;type&quot;:&quot;article-journal&quot;,&quot;id&quot;:&quot;7fc7ea6b-1629-3058-829b-cae1a8149255&quot;,&quot;title&quot;:&quot;Mixed Precision Training&quot;,&quot;author&quot;:[{&quot;family&quot;:&quot;Micikevicius&quot;,&quot;given&quot;:&quot;Paulius&quot;,&quot;parse-names&quot;:false,&quot;dropping-particle&quot;:&quot;&quot;,&quot;non-dropping-particle&quot;:&quot;&quot;},{&quot;family&quot;:&quot;Narang&quot;,&quot;given&quot;:&quot;Sharan&quot;,&quot;parse-names&quot;:false,&quot;dropping-particle&quot;:&quot;&quot;,&quot;non-dropping-particle&quot;:&quot;&quot;},{&quot;family&quot;:&quot;Alben&quot;,&quot;given&quot;:&quot;Jonah&quot;,&quot;parse-names&quot;:false,&quot;dropping-particle&quot;:&quot;&quot;,&quot;non-dropping-particle&quot;:&quot;&quot;},{&quot;family&quot;:&quot;Diamos&quot;,&quot;given&quot;:&quot;Gregory Frederick&quot;,&quot;parse-names&quot;:false,&quot;dropping-particle&quot;:&quot;&quot;,&quot;non-dropping-particle&quot;:&quot;&quot;},{&quot;family&quot;:&quot;Elsen&quot;,&quot;given&quot;:&quot;Erich&quot;,&quot;parse-names&quot;:false,&quot;dropping-particle&quot;:&quot;&quot;,&quot;non-dropping-particle&quot;:&quot;&quot;},{&quot;family&quot;:&quot;García&quot;,&quot;given&quot;:&quot;David&quot;,&quot;parse-names&quot;:false,&quot;dropping-particle&quot;:&quot;&quot;,&quot;non-dropping-particle&quot;:&quot;&quot;},{&quot;family&quot;:&quot;Ginsburg&quot;,&quot;given&quot;:&quot;Boris&quot;,&quot;parse-names&quot;:false,&quot;dropping-particle&quot;:&quot;&quot;,&quot;non-dropping-particle&quot;:&quot;&quot;},{&quot;family&quot;:&quot;Houston&quot;,&quot;given&quot;:&quot;Michael&quot;,&quot;parse-names&quot;:false,&quot;dropping-particle&quot;:&quot;&quot;,&quot;non-dropping-particle&quot;:&quot;&quot;},{&quot;family&quot;:&quot;Kuchaiev&quot;,&quot;given&quot;:&quot;Oleksii&quot;,&quot;parse-names&quot;:false,&quot;dropping-particle&quot;:&quot;&quot;,&quot;non-dropping-particle&quot;:&quot;&quot;},{&quot;family&quot;:&quot;Venkatesh&quot;,&quot;given&quot;:&quot;Ganesh&quot;,&quot;parse-names&quot;:false,&quot;dropping-particle&quot;:&quot;&quot;,&quot;non-dropping-particle&quot;:&quot;&quot;},{&quot;family&quot;:&quot;Wu&quot;,&quot;given&quot;:&quot;Hao&quot;,&quot;parse-names&quot;:false,&quot;dropping-particle&quot;:&quot;&quot;,&quot;non-dropping-particle&quot;:&quot;&quot;}],&quot;container-title&quot;:&quot;ArXiv&quot;,&quot;URL&quot;:&quot;https://api.semanticscholar.org/CorpusID:3297437&quot;,&quot;issued&quot;:{&quot;date-parts&quot;:[[2017]]},&quot;volume&quot;:&quot;abs/1710.03740&quot;,&quot;container-title-short&quot;:&quot;ArXiv&quot;},&quot;isTemporary&quot;:false}]},{&quot;citationID&quot;:&quot;MENDELEY_CITATION_571e5984-89ec-4b7f-8f14-7d599bc23c52&quot;,&quot;properties&quot;:{&quot;noteIndex&quot;:0},&quot;isEdited&quot;:false,&quot;manualOverride&quot;:{&quot;isManuallyOverridden&quot;:false,&quot;citeprocText&quot;:&quot;[23]&quot;,&quot;manualOverrideText&quot;:&quot;&quot;},&quot;citationTag&quot;:&quot;MENDELEY_CITATION_v3_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&quot;,&quot;citationItems&quot;:[{&quot;id&quot;:&quot;52279965-ed25-312e-9de0-e0ceb0b0ce99&quot;,&quot;itemData&quot;:{&quot;type&quot;:&quot;article-journal&quot;,&quot;id&quot;:&quot;52279965-ed25-312e-9de0-e0ceb0b0ce99&quot;,&quot;title&quot;:&quot;The advantages of the Matthews correlation coefficient (MCC) over F1 score and accuracy in binary classification evaluation&quot;,&quot;author&quot;:[{&quot;family&quot;:&quot;Chicco&quot;,&quot;given&quot;:&quot;Davide&quot;,&quot;parse-names&quot;:false,&quot;dropping-particle&quot;:&quot;&quot;,&quot;non-dropping-particle&quot;:&quot;&quot;},{&quot;family&quot;:&quot;Jurman&quot;,&quot;given&quot;:&quot;Giuseppe&quot;,&quot;parse-names&quot;:false,&quot;dropping-particle&quot;:&quot;&quot;,&quot;non-dropping-particle&quot;:&quot;&quot;}],&quot;container-title&quot;:&quot;BMC Genomics&quot;,&quot;container-title-short&quot;:&quot;BMC Genomics&quot;,&quot;DOI&quot;:&quot;10.1186/s12864-019-6413-7&quot;,&quot;ISSN&quot;:&quot;1471-2164&quot;,&quot;issued&quot;:{&quot;date-parts&quot;:[[2020,12,2]]},&quot;page&quot;:&quot;6&quot;,&quot;issue&quot;:&quot;1&quot;,&quot;volume&quot;:&quot;21&quot;},&quot;isTemporary&quot;:false}]},{&quot;citationID&quot;:&quot;MENDELEY_CITATION_9ad31536-b6df-4362-bd86-540c662cde14&quot;,&quot;properties&quot;:{&quot;noteIndex&quot;:0},&quot;isEdited&quot;:false,&quot;manualOverride&quot;:{&quot;isManuallyOverridden&quot;:false,&quot;citeprocText&quot;:&quot;[24]&quot;,&quot;manualOverrideText&quot;:&quot;&quot;},&quot;citationTag&quot;:&quot;MENDELEY_CITATION_v3_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&quot;,&quot;citationItems&quot;:[{&quot;id&quot;:&quot;6a87cd3f-cf9b-3905-a8fb-4cb899311d1e&quot;,&quot;itemData&quot;:{&quot;type&quot;:&quot;article-journal&quot;,&quot;id&quot;:&quot;6a87cd3f-cf9b-3905-a8fb-4cb899311d1e&quot;,&quot;title&quot;:&quot;Multi-label classification: do hamming loss and subset accuracy really conflict with each other?&quot;,&quot;author&quot;:[{&quot;family&quot;:&quot;Wu&quot;,&quot;given&quot;:&quot;Guoqiang&quot;,&quot;parse-names&quot;:false,&quot;dropping-particle&quot;:&quot;&quot;,&quot;non-dropping-particle&quot;:&quot;&quot;},{&quot;family&quot;:&quot;Zhu&quot;,&quot;given&quot;:&quot;Jun&quot;,&quot;parse-names&quot;:false,&quot;dropping-particle&quot;:&quot;&quot;,&quot;non-dropping-particle&quot;:&quot;&quot;}],&quot;container-title&quot;:&quot;Advances in Neural Information Processing Systems&quot;,&quot;container-title-short&quot;:&quot;Adv. Neural Inf. Process. Syst.&quot;,&quot;issued&quot;:{&quot;date-parts&quot;:[[2020]]},&quot;page&quot;:&quot;3130-3140&quot;,&quot;volume&quot;:&quot;33&quot;},&quot;isTemporary&quot;:false}]},{&quot;citationID&quot;:&quot;MENDELEY_CITATION_8dfa40a6-a289-45fd-9b21-d69412ff3133&quot;,&quot;properties&quot;:{&quot;noteIndex&quot;:0},&quot;isEdited&quot;:false,&quot;manualOverride&quot;:{&quot;isManuallyOverridden&quot;:false,&quot;citeprocText&quot;:&quot;[25]&quot;,&quot;manualOverrideText&quot;:&quot;&quot;},&quot;citationTag&quot;:&quot;MENDELEY_CITATION_v3_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&quot;,&quot;citationItems&quot;:[{&quot;id&quot;:&quot;e3596f90-1edb-3ff4-924b-ac9e46a7c8d5&quot;,&quot;itemData&quot;:{&quot;type&quot;:&quot;webpage&quot;,&quot;id&quot;:&quot;e3596f90-1edb-3ff4-924b-ac9e46a7c8d5&quot;,&quot;title&quot;:&quot;Drug Design with Small Molecule SMILES&quot;,&quot;author&quot;:[{&quot;family&quot;:&quot;Sgt. Peppers&quot;,&quot;given&quot;:&quot;&quot;,&quot;parse-names&quot;:false,&quot;dropping-particle&quot;:&quot;&quot;,&quot;non-dropping-particle&quot;:&quot;&quot;}],&quot;container-title&quot;:&quot;https://www.kaggle.com/datasets/art3mis/chembl22&quot;,&quot;issued&quot;:{&quot;date-parts&quot;:[[2025]]},&quot;container-title-short&quot;:&quot;&quot;},&quot;isTemporary&quot;:false}]},{&quot;citationID&quot;:&quot;MENDELEY_CITATION_c25554b6-155e-4912-80c0-3bf7fbbf1da3&quot;,&quot;properties&quot;:{&quot;noteIndex&quot;:0},&quot;isEdited&quot;:false,&quot;manualOverride&quot;:{&quot;isManuallyOverridden&quot;:false,&quot;citeprocText&quot;:&quot;[26]&quot;,&quot;manualOverrideText&quot;:&quot;&quot;},&quot;citationTag&quot;:&quot;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&quot;,&quot;citationItems&quot;:[{&quot;id&quot;:&quot;05dc4768-a214-33fc-85e4-fc8c5d25d6d2&quot;,&quot;itemData&quot;:{&quot;type&quot;:&quot;article-journal&quot;,&quot;id&quot;:&quot;05dc4768-a214-33fc-85e4-fc8c5d25d6d2&quot;,&quot;title&quot;:&quot;DrugBank 6.0: the DrugBank Knowledgebase for 2024&quot;,&quot;author&quot;:[{&quot;family&quot;:&quot;Knox&quot;,&quot;given&quot;:&quot;Craig&quot;,&quot;parse-names&quot;:false,&quot;dropping-particle&quot;:&quot;&quot;,&quot;non-dropping-particle&quot;:&quot;&quot;},{&quot;family&quot;:&quot;Wilson&quot;,&quot;given&quot;:&quot;Mike&quot;,&quot;parse-names&quot;:false,&quot;dropping-particle&quot;:&quot;&quot;,&quot;non-dropping-particle&quot;:&quot;&quot;},{&quot;family&quot;:&quot;Klinger&quot;,&quot;given&quot;:&quot;Christen M&quot;,&quot;parse-names&quot;:false,&quot;dropping-particle&quot;:&quot;&quot;,&quot;non-dropping-particle&quot;:&quot;&quot;},{&quot;family&quot;:&quot;Franklin&quot;,&quot;given&quot;:&quot;Mark&quot;,&quot;parse-names&quot;:false,&quot;dropping-particle&quot;:&quot;&quot;,&quot;non-dropping-particle&quot;:&quot;&quot;},{&quot;family&quot;:&quot;Oler&quot;,&quot;given&quot;:&quot;Eponine&quot;,&quot;parse-names&quot;:false,&quot;dropping-particle&quot;:&quot;&quot;,&quot;non-dropping-particle&quot;:&quot;&quot;},{&quot;family&quot;:&quot;Wilson&quot;,&quot;given&quot;:&quot;Alex&quot;,&quot;parse-names&quot;:false,&quot;dropping-particle&quot;:&quot;&quot;,&quot;non-dropping-particle&quot;:&quot;&quot;},{&quot;family&quot;:&quot;Pon&quot;,&quot;given&quot;:&quot;Allison&quot;,&quot;parse-names&quot;:false,&quot;dropping-particle&quot;:&quot;&quot;,&quot;non-dropping-particle&quot;:&quot;&quot;},{&quot;family&quot;:&quot;Cox&quot;,&quot;given&quot;:&quot;Jordan&quot;,&quot;parse-names&quot;:false,&quot;dropping-particle&quot;:&quot;&quot;,&quot;non-dropping-particle&quot;:&quot;&quot;},{&quot;family&quot;:&quot;Chin&quot;,&quot;given&quot;:&quot;Na Eun (Lucy)&quot;,&quot;parse-names&quot;:false,&quot;dropping-particle&quot;:&quot;&quot;,&quot;non-dropping-particle&quot;:&quot;&quot;},{&quot;family&quot;:&quot;Strawbridge&quot;,&quot;given&quot;:&quot;Seth A&quot;,&quot;parse-names&quot;:false,&quot;dropping-particle&quot;:&quot;&quot;,&quot;non-dropping-particle&quot;:&quot;&quot;},{&quot;family&quot;:&quot;Garcia-Patino&quot;,&quot;given&quot;:&quot;Marysol&quot;,&quot;parse-names&quot;:false,&quot;dropping-particle&quot;:&quot;&quot;,&quot;non-dropping-particle&quot;:&quot;&quot;},{&quot;family&quot;:&quot;Kruger&quot;,&quot;given&quot;:&quot;Ray&quot;,&quot;parse-names&quot;:false,&quot;dropping-particle&quot;:&quot;&quot;,&quot;non-dropping-particle&quot;:&quot;&quot;},{&quot;family&quot;:&quot;Sivakumaran&quot;,&quot;given&quot;:&quot;Aadhavya&quot;,&quot;parse-names&quot;:false,&quot;dropping-particle&quot;:&quot;&quot;,&quot;non-dropping-particle&quot;:&quot;&quot;},{&quot;family&quot;:&quot;Sanford&quot;,&quot;given&quot;:&quot;Selena&quot;,&quot;parse-names&quot;:false,&quot;dropping-particle&quot;:&quot;&quot;,&quot;non-dropping-particle&quot;:&quot;&quot;},{&quot;family&quot;:&quot;Doshi&quot;,&quot;given&quot;:&quot;Rahil&quot;,&quot;parse-names&quot;:false,&quot;dropping-particle&quot;:&quot;&quot;,&quot;non-dropping-particle&quot;:&quot;&quot;},{&quot;family&quot;:&quot;Khetarpal&quot;,&quot;given&quot;:&quot;Nitya&quot;,&quot;parse-names&quot;:false,&quot;dropping-particle&quot;:&quot;&quot;,&quot;non-dropping-particle&quot;:&quot;&quot;},{&quot;family&quot;:&quot;Fatokun&quot;,&quot;given&quot;:&quot;Omolola&quot;,&quot;parse-names&quot;:false,&quot;dropping-particle&quot;:&quot;&quot;,&quot;non-dropping-particle&quot;:&quot;&quot;},{&quot;family&quot;:&quot;Doucet&quot;,&quot;given&quot;:&quot;Daphnee&quot;,&quot;parse-names&quot;:false,&quot;dropping-particle&quot;:&quot;&quot;,&quot;non-dropping-particle&quot;:&quot;&quot;},{&quot;family&quot;:&quot;Zubkowski&quot;,&quot;given&quot;:&quot;Ashley&quot;,&quot;parse-names&quot;:false,&quot;dropping-particle&quot;:&quot;&quot;,&quot;non-dropping-particle&quot;:&quot;&quot;},{&quot;family&quot;:&quot;Rayat&quot;,&quot;given&quot;:&quot;Dorsa Yahya&quot;,&quot;parse-names&quot;:false,&quot;dropping-particle&quot;:&quot;&quot;,&quot;non-dropping-particle&quot;:&quot;&quot;},{&quot;family&quot;:&quot;Jackson&quot;,&quot;given&quot;:&quot;Hayley&quot;,&quot;parse-names&quot;:false,&quot;dropping-particle&quot;:&quot;&quot;,&quot;non-dropping-particle&quot;:&quot;&quot;},{&quot;family&quot;:&quot;Harford&quot;,&quot;given&quot;:&quot;Karxena&quot;,&quot;parse-names&quot;:false,&quot;dropping-particle&quot;:&quot;&quot;,&quot;non-dropping-particle&quot;:&quot;&quot;},{&quot;family&quot;:&quot;Anjum&quot;,&quot;given&quot;:&quot;Afia&quot;,&quot;parse-names&quot;:false,&quot;dropping-particle&quot;:&quot;&quot;,&quot;non-dropping-particle&quot;:&quot;&quot;},{&quot;family&quot;:&quot;Zakir&quot;,&quot;given&quot;:&quot;Mahi&quot;,&quot;parse-names&quot;:false,&quot;dropping-particle&quot;:&quot;&quot;,&quot;non-dropping-particle&quot;:&quot;&quot;},{&quot;family&quot;:&quot;Wang&quot;,&quot;given&quot;:&quot;Fei&quot;,&quot;parse-names&quot;:false,&quot;dropping-particle&quot;:&quot;&quot;,&quot;non-dropping-particle&quot;:&quot;&quot;},{&quot;family&quot;:&quot;Tian&quot;,&quot;given&quot;:&quot;Siyang&quot;,&quot;parse-names&quot;:false,&quot;dropping-particle&quot;:&quot;&quot;,&quot;non-dropping-particle&quot;:&quot;&quot;},{&quot;family&quot;:&quot;Lee&quot;,&quot;given&quot;:&quot;Brian&quot;,&quot;parse-names&quot;:false,&quot;dropping-particle&quot;:&quot;&quot;,&quot;non-dropping-particle&quot;:&quot;&quot;},{&quot;family&quot;:&quot;Liigand&quot;,&quot;given&quot;:&quot;Jaanus&quot;,&quot;parse-names&quot;:false,&quot;dropping-particle&quot;:&quot;&quot;,&quot;non-dropping-particle&quot;:&quot;&quot;},{&quot;family&quot;:&quot;Peters&quot;,&quot;given&quot;:&quot;Harrison&quot;,&quot;parse-names&quot;:false,&quot;dropping-particle&quot;:&quot;&quot;,&quot;non-dropping-particle&quot;:&quot;&quot;},{&quot;family&quot;:&quot;Wang&quot;,&quot;given&quot;:&quot;Ruo Qi (Rachel)&quot;,&quot;parse-names&quot;:false,&quot;dropping-particle&quot;:&quot;&quot;,&quot;non-dropping-particle&quot;:&quot;&quot;},{&quot;family&quot;:&quot;Nguyen&quot;,&quot;given&quot;:&quot;Tue&quot;,&quot;parse-names&quot;:false,&quot;dropping-particle&quot;:&quot;&quot;,&quot;non-dropping-particle&quot;:&quot;&quot;},{&quot;family&quot;:&quot;So&quot;,&quot;given&quot;:&quot;Denise&quot;,&quot;parse-names&quot;:false,&quot;dropping-particle&quot;:&quot;&quot;,&quot;non-dropping-particle&quot;:&quot;&quot;},{&quot;family&quot;:&quot;Sharp&quot;,&quot;given&quot;:&quot;Matthew&quot;,&quot;parse-names&quot;:false,&quot;dropping-particle&quot;:&quot;&quot;,&quot;non-dropping-particle&quot;:&quot;&quot;},{&quot;family&quot;:&quot;da Silva&quot;,&quot;given&quot;:&quot;Rodolfo&quot;,&quot;parse-names&quot;:false,&quot;dropping-particle&quot;:&quot;&quot;,&quot;non-dropping-particle&quot;:&quot;&quot;},{&quot;family&quot;:&quot;Gabriel&quot;,&quot;given&quot;:&quot;Cyrella&quot;,&quot;parse-names&quot;:false,&quot;dropping-particle&quot;:&quot;&quot;,&quot;non-dropping-particle&quot;:&quot;&quot;},{&quot;family&quot;:&quot;Scantlebury&quot;,&quot;given&quot;:&quot;Joshua&quot;,&quot;parse-names&quot;:false,&quot;dropping-particle&quot;:&quot;&quot;,&quot;non-dropping-particle&quot;:&quot;&quot;},{&quot;family&quot;:&quot;Jasinski&quot;,&quot;given&quot;:&quot;Marissa&quot;,&quot;parse-names&quot;:false,&quot;dropping-particle&quot;:&quot;&quot;,&quot;non-dropping-particle&quot;:&quot;&quot;},{&quot;family&quot;:&quot;Ackerman&quot;,&quot;given&quot;:&quot;David&quot;,&quot;parse-names&quot;:false,&quot;dropping-particle&quot;:&quot;&quot;,&quot;non-dropping-particle&quot;:&quot;&quot;},{&quot;family&quot;:&quot;Jewison&quot;,&quot;given&quot;:&quot;Timothy&quot;,&quot;parse-names&quot;:false,&quot;dropping-particle&quot;:&quot;&quot;,&quot;non-dropping-particle&quot;:&quot;&quot;},{&quot;family&quot;:&quot;Sajed&quot;,&quot;given&quot;:&quot;Tanvir&quot;,&quot;parse-names&quot;:false,&quot;dropping-particle&quot;:&quot;&quot;,&quot;non-dropping-particle&quot;:&quot;&quot;},{&quot;family&quot;:&quot;Gautam&quot;,&quot;given&quot;:&quot;Vasuk&quot;,&quot;parse-names&quot;:false,&quot;dropping-particle&quot;:&quot;&quot;,&quot;non-dropping-particle&quot;:&quot;&quot;},{&quot;family&quot;:&quot;Wishart&quot;,&quot;given&quot;:&quot;David S&quot;,&quot;parse-names&quot;:false,&quot;dropping-particle&quot;:&quot;&quot;,&quot;non-dropping-particle&quot;:&quot;&quot;}],&quot;container-title&quot;:&quot;Nucleic Acids Research&quot;,&quot;DOI&quot;:&quot;10.1093/nar/gkad976&quot;,&quot;ISSN&quot;:&quot;0305-1048&quot;,&quot;issued&quot;:{&quot;date-parts&quot;:[[2024,1,5]]},&quot;page&quot;:&quot;D1265-D1275&quot;,&quot;abstract&quot;:&quot;&lt;p&gt;First released in 2006, DrugBank (https://go.drugbank.com) has grown to become the ‘gold standard’ knowledge resource for drug, drug–target and related pharmaceutical information. DrugBank is widely used across many diverse biomedical research and clinical applications, and averages more than 30 million views/year. Since its last update in 2018, we have been actively enhancing the quantity and quality of the drug data in this knowledgebase. In this latest release (DrugBank 6.0), the number of FDA approved drugs has grown from 2646 to 4563 (a 72% increase), the number of investigational drugs has grown from 3394 to 6231 (a 38% increase), the number of drug–drug interactions increased from 365 984 to 1 413 413 (a 300% increase), and the number of drug–food interactions expanded from 1195 to 2475 (a 200% increase). In addition to this notable expansion in database size, we have added thousands of new, colorful, richly annotated pathways depicting drug mechanisms and drug metabolism. Likewise, existing datasets have been significantly improved and expanded, by adding more information on drug indications, drug–drug interactions, drug–food interactions and many other relevant data types for 11 891 drugs. We have also added experimental and predicted MS/MS spectra, 1D/2D-NMR spectra, CCS (collision cross section), RT (retention time) and RI (retention index) data for 9464 of DrugBank's 11 710 small molecule drugs. These and other improvements should make DrugBank 6.0 even more useful to a much wider research audience ranging from medicinal chemists to metabolomics specialists to pharmacologists.&lt;/p&gt;&quot;,&quot;issue&quot;:&quot;D1&quot;,&quot;volume&quot;:&quot;52&quot;,&quot;container-title-short&quot;:&quot;Nucleic Acids Res.&quot;},&quot;isTemporary&quot;:false}]},{&quot;citationID&quot;:&quot;MENDELEY_CITATION_842c6097-cdb7-4d69-9e19-e0a99dfba80a&quot;,&quot;properties&quot;:{&quot;noteIndex&quot;:0},&quot;isEdited&quot;:false,&quot;manualOverride&quot;:{&quot;isManuallyOverridden&quot;:false,&quot;citeprocText&quot;:&quot;[27]&quot;,&quot;manualOverrideText&quot;:&quot;&quot;},&quot;citationTag&quot;:&quot;MENDELEY_CITATION_v3_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&quot;,&quot;citationItems&quot;:[{&quot;id&quot;:&quot;2360cf28-52dd-3e44-85a2-08be789b8022&quot;,&quot;itemData&quot;:{&quot;type&quot;:&quot;article-journal&quot;,&quot;id&quot;:&quot;2360cf28-52dd-3e44-85a2-08be789b8022&quot;,&quot;title&quot;:&quot;The ChEMBL database in 2017&quot;,&quot;author&quot;:[{&quot;family&quot;:&quot;Gaulton&quot;,&quot;given&quot;:&quot;Anna&quot;,&quot;parse-names&quot;:false,&quot;dropping-particle&quot;:&quot;&quot;,&quot;non-dropping-particle&quot;:&quot;&quot;},{&quot;family&quot;:&quot;Hersey&quot;,&quot;given&quot;:&quot;Anne&quot;,&quot;parse-names&quot;:false,&quot;dropping-particle&quot;:&quot;&quot;,&quot;non-dropping-particle&quot;:&quot;&quot;},{&quot;family&quot;:&quot;Nowotka&quot;,&quot;given&quot;:&quot;Michał&quot;,&quot;parse-names&quot;:false,&quot;dropping-particle&quot;:&quot;&quot;,&quot;non-dropping-particle&quot;:&quot;&quot;},{&quot;family&quot;:&quot;Bento&quot;,&quot;given&quot;:&quot;A. Patrícia&quot;,&quot;parse-names&quot;:false,&quot;dropping-particle&quot;:&quot;&quot;,&quot;non-dropping-particle&quot;:&quot;&quot;},{&quot;family&quot;:&quot;Chambers&quot;,&quot;given&quot;:&quot;Jon&quot;,&quot;parse-names&quot;:false,&quot;dropping-particle&quot;:&quot;&quot;,&quot;non-dropping-particle&quot;:&quot;&quot;},{&quot;family&quot;:&quot;Mendez&quot;,&quot;given&quot;:&quot;David&quot;,&quot;parse-names&quot;:false,&quot;dropping-particle&quot;:&quot;&quot;,&quot;non-dropping-particle&quot;:&quot;&quot;},{&quot;family&quot;:&quot;Mutowo&quot;,&quot;given&quot;:&quot;Prudence&quot;,&quot;parse-names&quot;:false,&quot;dropping-particle&quot;:&quot;&quot;,&quot;non-dropping-particle&quot;:&quot;&quot;},{&quot;family&quot;:&quot;Atkinson&quot;,&quot;given&quot;:&quot;Francis&quot;,&quot;parse-names&quot;:false,&quot;dropping-particle&quot;:&quot;&quot;,&quot;non-dropping-particle&quot;:&quot;&quot;},{&quot;family&quot;:&quot;Bellis&quot;,&quot;given&quot;:&quot;Louisa J.&quot;,&quot;parse-names&quot;:false,&quot;dropping-particle&quot;:&quot;&quot;,&quot;non-dropping-particle&quot;:&quot;&quot;},{&quot;family&quot;:&quot;Cibrián-Uhalte&quot;,&quot;given&quot;:&quot;Elena&quot;,&quot;parse-names&quot;:false,&quot;dropping-particle&quot;:&quot;&quot;,&quot;non-dropping-particle&quot;:&quot;&quot;},{&quot;family&quot;:&quot;Davies&quot;,&quot;given&quot;:&quot;Mark&quot;,&quot;parse-names&quot;:false,&quot;dropping-particle&quot;:&quot;&quot;,&quot;non-dropping-particle&quot;:&quot;&quot;},{&quot;family&quot;:&quot;Dedman&quot;,&quot;given&quot;:&quot;Nathan&quot;,&quot;parse-names&quot;:false,&quot;dropping-particle&quot;:&quot;&quot;,&quot;non-dropping-particle&quot;:&quot;&quot;},{&quot;family&quot;:&quot;Karlsson&quot;,&quot;given&quot;:&quot;Anneli&quot;,&quot;parse-names&quot;:false,&quot;dropping-particle&quot;:&quot;&quot;,&quot;non-dropping-particle&quot;:&quot;&quot;},{&quot;family&quot;:&quot;Magariños&quot;,&quot;given&quot;:&quot;María Paula&quot;,&quot;parse-names&quot;:false,&quot;dropping-particle&quot;:&quot;&quot;,&quot;non-dropping-particle&quot;:&quot;&quot;},{&quot;family&quot;:&quot;Overington&quot;,&quot;given&quot;:&quot;John P.&quot;,&quot;parse-names&quot;:false,&quot;dropping-particle&quot;:&quot;&quot;,&quot;non-dropping-particle&quot;:&quot;&quot;},{&quot;family&quot;:&quot;Papadatos&quot;,&quot;given&quot;:&quot;George&quot;,&quot;parse-names&quot;:false,&quot;dropping-particle&quot;:&quot;&quot;,&quot;non-dropping-particle&quot;:&quot;&quot;},{&quot;family&quot;:&quot;Smit&quot;,&quot;given&quot;:&quot;Ines&quot;,&quot;parse-names&quot;:false,&quot;dropping-particle&quot;:&quot;&quot;,&quot;non-dropping-particle&quot;:&quot;&quot;},{&quot;family&quot;:&quot;Leach&quot;,&quot;given&quot;:&quot;Andrew R.&quot;,&quot;parse-names&quot;:false,&quot;dropping-particle&quot;:&quot;&quot;,&quot;non-dropping-particle&quot;:&quot;&quot;}],&quot;container-title&quot;:&quot;Nucleic Acids Research&quot;,&quot;DOI&quot;:&quot;10.1093/nar/gkw1074&quot;,&quot;ISSN&quot;:&quot;0305-1048&quot;,&quot;issued&quot;:{&quot;date-parts&quot;:[[2017,1,4]]},&quot;page&quot;:&quot;D945-D954&quot;,&quot;issue&quot;:&quot;D1&quot;,&quot;volume&quot;:&quot;45&quot;,&quot;container-title-short&quot;:&quot;Nucleic Acids Res.&quot;},&quot;isTemporary&quot;:false}]},{&quot;citationID&quot;:&quot;MENDELEY_CITATION_f7c666f5-11ce-4466-a5b6-1fb7e14e1fb6&quot;,&quot;properties&quot;:{&quot;noteIndex&quot;:0},&quot;isEdited&quot;:false,&quot;manualOverride&quot;:{&quot;isManuallyOverridden&quot;:false,&quot;citeprocText&quot;:&quot;[28]&quot;,&quot;manualOverrideText&quot;:&quot;&quot;},&quot;citationTag&quot;:&quot;MENDELEY_CITATION_v3_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&quot;,&quot;citationItems&quot;:[{&quot;id&quot;:&quot;894bf710-3c9a-38d7-a687-6a8f8d072ef0&quot;,&quot;itemData&quot;:{&quot;type&quot;:&quot;article-journal&quot;,&quot;id&quot;:&quot;894bf710-3c9a-38d7-a687-6a8f8d072ef0&quot;,&quot;title&quot;:&quot;Pre-trained molecular representations enable antimicrobial discovery&quot;,&quot;author&quot;:[{&quot;family&quot;:&quot;Olayo-Alarcon&quot;,&quot;given&quot;:&quot;Roberto&quot;,&quot;parse-names&quot;:false,&quot;dropping-particle&quot;:&quot;&quot;,&quot;non-dropping-particle&quot;:&quot;&quot;},{&quot;family&quot;:&quot;Amstalden&quot;,&quot;given&quot;:&quot;Martin K.&quot;,&quot;parse-names&quot;:false,&quot;dropping-particle&quot;:&quot;&quot;,&quot;non-dropping-particle&quot;:&quot;&quot;},{&quot;family&quot;:&quot;Zannoni&quot;,&quot;given&quot;:&quot;Annamaria&quot;,&quot;parse-names&quot;:false,&quot;dropping-particle&quot;:&quot;&quot;,&quot;non-dropping-particle&quot;:&quot;&quot;},{&quot;family&quot;:&quot;Bajramovic&quot;,&quot;given&quot;:&quot;Medina&quot;,&quot;parse-names&quot;:false,&quot;dropping-particle&quot;:&quot;&quot;,&quot;non-dropping-particle&quot;:&quot;&quot;},{&quot;family&quot;:&quot;Sharma&quot;,&quot;given&quot;:&quot;Cynthia M.&quot;,&quot;parse-names&quot;:false,&quot;dropping-particle&quot;:&quot;&quot;,&quot;non-dropping-particle&quot;:&quot;&quot;},{&quot;family&quot;:&quot;Brochado&quot;,&quot;given&quot;:&quot;Ana Rita&quot;,&quot;parse-names&quot;:false,&quot;dropping-particle&quot;:&quot;&quot;,&quot;non-dropping-particle&quot;:&quot;&quot;},{&quot;family&quot;:&quot;Rezaei&quot;,&quot;given&quot;:&quot;Mina&quot;,&quot;parse-names&quot;:false,&quot;dropping-particle&quot;:&quot;&quot;,&quot;non-dropping-particle&quot;:&quot;&quot;},{&quot;family&quot;:&quot;Müller&quot;,&quot;given&quot;:&quot;Christian L.&quot;,&quot;parse-names&quot;:false,&quot;dropping-particle&quot;:&quot;&quot;,&quot;non-dropping-particle&quot;:&quot;&quot;}],&quot;container-title&quot;:&quot;Nature Communications&quot;,&quot;DOI&quot;:&quot;10.1038/s41467-025-58804-4&quot;,&quot;ISSN&quot;:&quot;2041-1723&quot;,&quot;issued&quot;:{&quot;date-parts&quot;:[[2025,4,10]]},&quot;page&quot;:&quot;3420&quot;,&quot;abstract&quot;:&quot;&lt;p&gt; The rise in antimicrobial resistance poses a worldwide threat, reducing the efficacy of common antibiotics. Determining the antimicrobial activity of new chemical compounds through experimental methods remains time-consuming and costly. While compound-centric deep learning models promise to accelerate this search and prioritization process, current strategies require large amounts of custom training data. Here, we introduce a lightweight computational strategy for antimicrobial discovery that builds on MolE (Molecular representation through redundancy reduced Embedding), a self-supervised deep learning framework that leverages unlabeled chemical structures to learn task-independent molecular representations. By combining MolE representation learning with available, experimentally validated compound-bacteria activity data, we design a general predictive model that enables assessing compounds with respect to their antimicrobial potential. Our model correctly identifies recent growth-inhibitory compounds that are structurally distinct from current antibiotics. Using this approach, we discover de novo, and experimentally confirm, three human-targeted drugs as growth inhibitors of &lt;italic&gt;Staphylococcus aureus&lt;/italic&gt; . This framework offers a viable, cost-effective strategy to accelerate antibiotic discovery. &lt;/p&gt;&quot;,&quot;issue&quot;:&quot;1&quot;,&quot;volume&quot;:&quot;16&quot;,&quot;container-title-short&quot;:&quot;Nat. Commun.&quot;},&quot;isTemporary&quot;:false}]}]"/>
     <we:property name="MENDELEY_CITATIONS_STYLE" value="{&quot;id&quot;:&quot;https://www.zotero.org/styles/ieee&quot;,&quot;title&quot;:&quot;IEEE Reference Guide version 11.29.2023&quot;,&quot;format&quot;:&quot;numeric&quot;,&quot;defaultLocale&quot;:null,&quot;isLocaleCodeValid&quot;:true}"/>
   </we:properties>
   <we:bindings/>

</xml_diff>

<commit_message>
Feat: Models trained and valuated with all representations. Model improved with scale_pos_weight and per-CYP threshold optimisation.
</commit_message>
<xml_diff>
--- a/Memorias/TFM Drug Metabolism - Gonzalo Robles.docx
+++ b/Memorias/TFM Drug Metabolism - Gonzalo Robles.docx
@@ -4666,7 +4666,7 @@
         </w:rPr>
         <w:fldChar w:fldCharType="separate"/>
       </w:r>
-      <w:hyperlink w:anchor="_Toc228905435" w:history="1">
+      <w:hyperlink w:anchor="_Toc229425752" w:history="1">
         <w:r>
           <w:rPr>
             <w:rStyle w:val="Hyperlink"/>
@@ -4702,7 +4702,7 @@
             <w:noProof/>
             <w:webHidden/>
           </w:rPr>
-          <w:instrText xml:space="preserve"> PAGEREF _Toc228905435 \h </w:instrText>
+          <w:instrText xml:space="preserve"> PAGEREF _Toc229425752 \h </w:instrText>
         </w:r>
         <w:r>
           <w:rPr>
@@ -4748,14 +4748,14 @@
           <w14:ligatures w14:val="standardContextual"/>
         </w:rPr>
       </w:pPr>
-      <w:hyperlink w:anchor="_Toc228905436" w:history="1">
+      <w:hyperlink w:anchor="_Toc229425753" w:history="1">
         <w:r>
           <w:rPr>
             <w:rStyle w:val="Hyperlink"/>
             <w:noProof/>
             <w:lang w:val="en-GB"/>
           </w:rPr>
-          <w:t>Figure 2. Simplified schematic of molecular representation pipelines.</w:t>
+          <w:t>Figure 2. Schema of molecular representation pipelines.</w:t>
         </w:r>
         <w:r>
           <w:rPr>
@@ -4784,7 +4784,7 @@
             <w:noProof/>
             <w:webHidden/>
           </w:rPr>
-          <w:instrText xml:space="preserve"> PAGEREF _Toc228905436 \h </w:instrText>
+          <w:instrText xml:space="preserve"> PAGEREF _Toc229425753 \h </w:instrText>
         </w:r>
         <w:r>
           <w:rPr>
@@ -4830,7 +4830,7 @@
           <w14:ligatures w14:val="standardContextual"/>
         </w:rPr>
       </w:pPr>
-      <w:hyperlink w:anchor="_Toc228905437" w:history="1">
+      <w:hyperlink w:anchor="_Toc229425754" w:history="1">
         <w:r>
           <w:rPr>
             <w:rStyle w:val="Hyperlink"/>
@@ -4858,7 +4858,7 @@
             <w:noProof/>
             <w:webHidden/>
           </w:rPr>
-          <w:instrText xml:space="preserve"> PAGEREF _Toc228905437 \h </w:instrText>
+          <w:instrText xml:space="preserve"> PAGEREF _Toc229425754 \h </w:instrText>
         </w:r>
         <w:r>
           <w:rPr>
@@ -4904,14 +4904,14 @@
           <w14:ligatures w14:val="standardContextual"/>
         </w:rPr>
       </w:pPr>
-      <w:hyperlink w:anchor="_Toc228905438" w:history="1">
+      <w:hyperlink w:anchor="_Toc229425755" w:history="1">
         <w:r>
           <w:rPr>
             <w:rStyle w:val="Hyperlink"/>
             <w:noProof/>
             <w:lang w:val="en-GB"/>
           </w:rPr>
-          <w:t>Figure 4. CYP450 ‘dict’ descriptors for full db (A) and curated db with threshold = 10 (B).  Dict( CYP name : Nº of appearances )</w:t>
+          <w:t>Figure 4. CYP450 ‘dict’ descriptors for full db (A) and curated db with threshold = 50 (B).  Dict( CYP name : Nº of appearances )</w:t>
         </w:r>
         <w:r>
           <w:rPr>
@@ -4932,7 +4932,7 @@
             <w:noProof/>
             <w:webHidden/>
           </w:rPr>
-          <w:instrText xml:space="preserve"> PAGEREF _Toc228905438 \h </w:instrText>
+          <w:instrText xml:space="preserve"> PAGEREF _Toc229425755 \h </w:instrText>
         </w:r>
         <w:r>
           <w:rPr>
@@ -4978,7 +4978,7 @@
           <w14:ligatures w14:val="standardContextual"/>
         </w:rPr>
       </w:pPr>
-      <w:hyperlink w:anchor="_Toc228905439" w:history="1">
+      <w:hyperlink w:anchor="_Toc229425756" w:history="1">
         <w:r>
           <w:rPr>
             <w:rStyle w:val="Hyperlink"/>
@@ -5006,7 +5006,7 @@
             <w:noProof/>
             <w:webHidden/>
           </w:rPr>
-          <w:instrText xml:space="preserve"> PAGEREF _Toc228905439 \h </w:instrText>
+          <w:instrText xml:space="preserve"> PAGEREF _Toc229425756 \h </w:instrText>
         </w:r>
         <w:r>
           <w:rPr>
@@ -5052,7 +5052,7 @@
           <w14:ligatures w14:val="standardContextual"/>
         </w:rPr>
       </w:pPr>
-      <w:hyperlink w:anchor="_Toc228905440" w:history="1">
+      <w:hyperlink w:anchor="_Toc229425757" w:history="1">
         <w:r>
           <w:rPr>
             <w:rStyle w:val="Hyperlink"/>
@@ -5080,7 +5080,7 @@
             <w:noProof/>
             <w:webHidden/>
           </w:rPr>
-          <w:instrText xml:space="preserve"> PAGEREF _Toc228905440 \h </w:instrText>
+          <w:instrText xml:space="preserve"> PAGEREF _Toc229425757 \h </w:instrText>
         </w:r>
         <w:r>
           <w:rPr>
@@ -5126,7 +5126,7 @@
           <w14:ligatures w14:val="standardContextual"/>
         </w:rPr>
       </w:pPr>
-      <w:hyperlink w:anchor="_Toc228905441" w:history="1">
+      <w:hyperlink w:anchor="_Toc229425758" w:history="1">
         <w:r>
           <w:rPr>
             <w:rStyle w:val="Hyperlink"/>
@@ -5154,7 +5154,7 @@
             <w:noProof/>
             <w:webHidden/>
           </w:rPr>
-          <w:instrText xml:space="preserve"> PAGEREF _Toc228905441 \h </w:instrText>
+          <w:instrText xml:space="preserve"> PAGEREF _Toc229425758 \h </w:instrText>
         </w:r>
         <w:r>
           <w:rPr>
@@ -5200,7 +5200,7 @@
           <w14:ligatures w14:val="standardContextual"/>
         </w:rPr>
       </w:pPr>
-      <w:hyperlink w:anchor="_Toc228905442" w:history="1">
+      <w:hyperlink w:anchor="_Toc229425759" w:history="1">
         <w:r>
           <w:rPr>
             <w:rStyle w:val="Hyperlink"/>
@@ -5228,7 +5228,7 @@
             <w:noProof/>
             <w:webHidden/>
           </w:rPr>
-          <w:instrText xml:space="preserve"> PAGEREF _Toc228905442 \h </w:instrText>
+          <w:instrText xml:space="preserve"> PAGEREF _Toc229425759 \h </w:instrText>
         </w:r>
         <w:r>
           <w:rPr>
@@ -5274,7 +5274,7 @@
           <w14:ligatures w14:val="standardContextual"/>
         </w:rPr>
       </w:pPr>
-      <w:hyperlink w:anchor="_Toc228905443" w:history="1">
+      <w:hyperlink w:anchor="_Toc229425760" w:history="1">
         <w:r>
           <w:rPr>
             <w:rStyle w:val="Hyperlink"/>
@@ -5302,7 +5302,7 @@
             <w:noProof/>
             <w:webHidden/>
           </w:rPr>
-          <w:instrText xml:space="preserve"> PAGEREF _Toc228905443 \h </w:instrText>
+          <w:instrText xml:space="preserve"> PAGEREF _Toc229425760 \h </w:instrText>
         </w:r>
         <w:r>
           <w:rPr>
@@ -5348,7 +5348,7 @@
           <w14:ligatures w14:val="standardContextual"/>
         </w:rPr>
       </w:pPr>
-      <w:hyperlink w:anchor="_Toc228905444" w:history="1">
+      <w:hyperlink w:anchor="_Toc229425761" w:history="1">
         <w:r>
           <w:rPr>
             <w:rStyle w:val="Hyperlink"/>
@@ -5410,7 +5410,7 @@
             <w:noProof/>
             <w:webHidden/>
           </w:rPr>
-          <w:instrText xml:space="preserve"> PAGEREF _Toc228905444 \h </w:instrText>
+          <w:instrText xml:space="preserve"> PAGEREF _Toc229425761 \h </w:instrText>
         </w:r>
         <w:r>
           <w:rPr>
@@ -6782,7 +6782,7 @@
           <w:lang w:val="en-GB"/>
         </w:rPr>
       </w:pPr>
-      <w:bookmarkStart w:id="8" w:name="_Toc228905435"/>
+      <w:bookmarkStart w:id="8" w:name="_Toc229425752"/>
       <w:r>
         <w:rPr>
           <w:lang w:val="en-GB"/>
@@ -9681,7 +9681,7 @@
           <w:lang w:val="en-GB"/>
         </w:rPr>
       </w:pPr>
-      <w:bookmarkStart w:id="16" w:name="_Toc228905436"/>
+      <w:bookmarkStart w:id="16" w:name="_Toc229425753"/>
       <w:r>
         <w:rPr>
           <w:lang w:val="en-GB"/>
@@ -12360,14 +12360,19 @@
         <w:rPr>
           <w:lang w:val="en-GB"/>
         </w:rPr>
-        <w:t xml:space="preserve"> MCC treats each CYP enzyme equally regardless of how many molecules are substrates of that enzyme. This ensures that excellent performance on a highly frequent isoform such as CYP3A4 does not mask poor performance on a rarer isoform such as </w:t>
-      </w:r>
-      <w:r>
-        <w:rPr>
-          <w:color w:val="EE0000"/>
-          <w:lang w:val="en-GB"/>
-        </w:rPr>
-        <w:t>CYP2B6</w:t>
+        <w:t xml:space="preserve"> MCC treats each CYP enzyme equally regardless of how many molecules are substrates of that enzyme. This ensures that excellent performance on a highly frequent isoform such as CYP3A4 does not mask poor performance on a rarer isoform such as</w:t>
+      </w:r>
+      <w:r>
+        <w:rPr>
+          <w:lang w:val="en-GB"/>
+        </w:rPr>
+        <w:t xml:space="preserve"> </w:t>
+      </w:r>
+      <w:r>
+        <w:rPr>
+          <w:lang w:val="en-GB"/>
+        </w:rPr>
+        <w:t>CYP2A6</w:t>
       </w:r>
       <w:r>
         <w:rPr>
@@ -13910,7 +13915,7 @@
         <mc:AlternateContent>
           <mc:Choice Requires="wps">
             <w:drawing>
-              <wp:anchor distT="0" distB="0" distL="114300" distR="114300" simplePos="0" relativeHeight="251664383" behindDoc="1" locked="0" layoutInCell="1" allowOverlap="1" wp14:anchorId="34D39857" wp14:editId="5EEE7395">
+              <wp:anchor distT="0" distB="0" distL="114300" distR="114300" simplePos="0" relativeHeight="251662335" behindDoc="1" locked="0" layoutInCell="1" allowOverlap="1" wp14:anchorId="34D39857" wp14:editId="28BE68E3">
                 <wp:simplePos x="0" y="0"/>
                 <wp:positionH relativeFrom="column">
                   <wp:posOffset>-15240</wp:posOffset>
@@ -13974,7 +13979,7 @@
           </mc:Choice>
           <mc:Fallback>
             <w:pict>
-              <v:rect w14:anchorId="446117B2" id="Rectangle 3" o:spid="_x0000_s1026" style="position:absolute;margin-left:-1.2pt;margin-top:0;width:449.1pt;height:169.75pt;z-index:-251652097;visibility:visible;mso-wrap-style:square;mso-width-percent:0;mso-wrap-distance-left:9pt;mso-wrap-distance-top:0;mso-wrap-distance-right:9pt;mso-wrap-distance-bottom:0;mso-position-horizontal:absolute;mso-position-horizontal-relative:text;mso-position-vertical:absolute;mso-position-vertical-relative:text;mso-width-percent:0;mso-width-relative:margin;v-text-anchor:middle" o:gfxdata="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" fillcolor="#161616 [334]" strokecolor="#091723 [484]" strokeweight="1pt"/>
+              <v:rect w14:anchorId="54A082AD" id="Rectangle 3" o:spid="_x0000_s1026" style="position:absolute;margin-left:-1.2pt;margin-top:0;width:449.1pt;height:169.75pt;z-index:-251654145;visibility:visible;mso-wrap-style:square;mso-width-percent:0;mso-wrap-distance-left:9pt;mso-wrap-distance-top:0;mso-wrap-distance-right:9pt;mso-wrap-distance-bottom:0;mso-position-horizontal:absolute;mso-position-horizontal-relative:text;mso-position-vertical:absolute;mso-position-vertical-relative:text;mso-width-percent:0;mso-width-relative:margin;v-text-anchor:middle" o:gfxdata="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" fillcolor="#161616 [334]" strokecolor="#091723 [484]" strokeweight="1pt"/>
             </w:pict>
           </mc:Fallback>
         </mc:AlternateContent>
@@ -14030,7 +14035,7 @@
         </w:rPr>
       </w:pPr>
       <w:bookmarkStart w:id="29" w:name="_Ref225621380"/>
-      <w:bookmarkStart w:id="30" w:name="_Toc228905437"/>
+      <w:bookmarkStart w:id="30" w:name="_Toc229425754"/>
       <w:r>
         <w:rPr>
           <w:lang w:val="en-GB"/>
@@ -14323,18 +14328,18 @@
         <mc:AlternateContent>
           <mc:Choice Requires="wpg">
             <w:drawing>
-              <wp:anchor distT="0" distB="0" distL="114300" distR="114300" simplePos="0" relativeHeight="251665408" behindDoc="0" locked="0" layoutInCell="1" allowOverlap="1" wp14:anchorId="2AC83DF5" wp14:editId="580DE83C">
+              <wp:anchor distT="0" distB="0" distL="114300" distR="114300" simplePos="0" relativeHeight="251669504" behindDoc="0" locked="0" layoutInCell="1" allowOverlap="1" wp14:anchorId="0F5A1FDD" wp14:editId="096D4223">
                 <wp:simplePos x="0" y="0"/>
                 <wp:positionH relativeFrom="column">
-                  <wp:posOffset>3029585</wp:posOffset>
+                  <wp:posOffset>3085465</wp:posOffset>
                 </wp:positionH>
                 <wp:positionV relativeFrom="paragraph">
                   <wp:posOffset>0</wp:posOffset>
                 </wp:positionV>
-                <wp:extent cx="2690495" cy="1783715"/>
-                <wp:effectExtent l="0" t="0" r="0" b="6985"/>
+                <wp:extent cx="2710815" cy="2307590"/>
+                <wp:effectExtent l="0" t="0" r="0" b="0"/>
                 <wp:wrapSquare wrapText="bothSides"/>
-                <wp:docPr id="1956415796" name="Group 3"/>
+                <wp:docPr id="1674246105" name="Group 4"/>
                 <wp:cNvGraphicFramePr/>
                 <a:graphic xmlns:a="http://schemas.openxmlformats.org/drawingml/2006/main">
                   <a:graphicData uri="http://schemas.microsoft.com/office/word/2010/wordprocessingGroup">
@@ -14343,18 +14348,18 @@
                       <wpg:grpSpPr>
                         <a:xfrm>
                           <a:off x="0" y="0"/>
-                          <a:ext cx="2690495" cy="1783715"/>
-                          <a:chOff x="0" y="-90560"/>
-                          <a:chExt cx="2691129" cy="1784350"/>
+                          <a:ext cx="2710815" cy="2307590"/>
+                          <a:chOff x="55029" y="0"/>
+                          <a:chExt cx="2711242" cy="2308005"/>
                         </a:xfrm>
                       </wpg:grpSpPr>
                       <wps:wsp>
-                        <wps:cNvPr id="1384898485" name="Text Box 1"/>
+                        <wps:cNvPr id="1006016567" name="Text Box 1"/>
                         <wps:cNvSpPr txBox="1"/>
                         <wps:spPr>
                           <a:xfrm>
-                            <a:off x="1079500" y="-90560"/>
-                            <a:ext cx="1335405" cy="400051"/>
+                            <a:off x="1075266" y="0"/>
+                            <a:ext cx="1335054" cy="399909"/>
                           </a:xfrm>
                           <a:prstGeom prst="rect">
                             <a:avLst/>
@@ -14486,14 +14491,172 @@
                           <a:noAutofit/>
                         </wps:bodyPr>
                       </wps:wsp>
+                      <wps:wsp>
+                        <wps:cNvPr id="157567265" name="Text Box 1"/>
+                        <wps:cNvSpPr txBox="1"/>
+                        <wps:spPr>
+                          <a:xfrm>
+                            <a:off x="55029" y="1879601"/>
+                            <a:ext cx="2690495" cy="428404"/>
+                          </a:xfrm>
+                          <a:prstGeom prst="rect">
+                            <a:avLst/>
+                          </a:prstGeom>
+                          <a:solidFill>
+                            <a:prstClr val="white"/>
+                          </a:solidFill>
+                          <a:ln>
+                            <a:noFill/>
+                          </a:ln>
+                        </wps:spPr>
+                        <wps:txbx>
+                          <w:txbxContent>
+                            <w:p>
+                              <w:pPr>
+                                <w:pStyle w:val="Caption"/>
+                                <w:rPr>
+                                  <w:noProof/>
+                                  <w:sz w:val="22"/>
+                                  <w:szCs w:val="22"/>
+                                  <w:lang w:val="en-GB"/>
+                                </w:rPr>
+                              </w:pPr>
+                              <w:bookmarkStart w:id="32" w:name="_Ref223455572"/>
+                              <w:bookmarkStart w:id="33" w:name="_Ref223455489"/>
+                              <w:bookmarkStart w:id="34" w:name="_Toc229425755"/>
+                              <w:r>
+                                <w:rPr>
+                                  <w:lang w:val="en-GB"/>
+                                </w:rPr>
+                                <w:t xml:space="preserve">Figure </w:t>
+                              </w:r>
+                              <w:r>
+                                <w:fldChar w:fldCharType="begin"/>
+                              </w:r>
+                              <w:r>
+                                <w:rPr>
+                                  <w:lang w:val="en-GB"/>
+                                </w:rPr>
+                                <w:instrText xml:space="preserve"> SEQ Figure \* ARABIC </w:instrText>
+                              </w:r>
+                              <w:r>
+                                <w:fldChar w:fldCharType="separate"/>
+                              </w:r>
+                              <w:r>
+                                <w:rPr>
+                                  <w:noProof/>
+                                  <w:lang w:val="en-GB"/>
+                                </w:rPr>
+                                <w:t>4</w:t>
+                              </w:r>
+                              <w:r>
+                                <w:fldChar w:fldCharType="end"/>
+                              </w:r>
+                              <w:bookmarkEnd w:id="32"/>
+                              <w:r>
+                                <w:rPr>
+                                  <w:lang w:val="en-GB"/>
+                                </w:rPr>
+                                <w:t>.</w:t>
+                              </w:r>
+                              <w:r>
+                                <w:rPr>
+                                  <w:lang w:val="en-GB"/>
+                                </w:rPr>
+                                <w:t xml:space="preserve"> </w:t>
+                              </w:r>
+                              <w:r>
+                                <w:rPr>
+                                  <w:lang w:val="en-GB"/>
+                                </w:rPr>
+                                <w:t xml:space="preserve">CYP450 </w:t>
+                              </w:r>
+                              <w:r>
+                                <w:rPr>
+                                  <w:lang w:val="en-GB"/>
+                                </w:rPr>
+                                <w:t>‘</w:t>
+                              </w:r>
+                              <w:r>
+                                <w:rPr>
+                                  <w:lang w:val="en-GB"/>
+                                </w:rPr>
+                                <w:t>dict</w:t>
+                              </w:r>
+                              <w:r>
+                                <w:rPr>
+                                  <w:lang w:val="en-GB"/>
+                                </w:rPr>
+                                <w:t>’</w:t>
+                              </w:r>
+                              <w:r>
+                                <w:rPr>
+                                  <w:lang w:val="en-GB"/>
+                                </w:rPr>
+                                <w:t xml:space="preserve"> descriptors</w:t>
+                              </w:r>
+                              <w:r>
+                                <w:rPr>
+                                  <w:lang w:val="en-GB"/>
+                                </w:rPr>
+                                <w:t xml:space="preserve"> for full db (A) and curated db with threshold = </w:t>
+                              </w:r>
+                              <w:r>
+                                <w:rPr>
+                                  <w:lang w:val="en-GB"/>
+                                </w:rPr>
+                                <w:t>50</w:t>
+                              </w:r>
+                              <w:r>
+                                <w:rPr>
+                                  <w:lang w:val="en-GB"/>
+                                </w:rPr>
+                                <w:t xml:space="preserve"> (B)</w:t>
+                              </w:r>
+                              <w:r>
+                                <w:rPr>
+                                  <w:lang w:val="en-GB"/>
+                                </w:rPr>
+                                <w:t>.</w:t>
+                              </w:r>
+                              <w:r>
+                                <w:rPr>
+                                  <w:lang w:val="en-GB"/>
+                                </w:rPr>
+                                <w:t xml:space="preserve">  </w:t>
+                              </w:r>
+                              <w:r>
+                                <w:rPr>
+                                  <w:lang w:val="en-GB"/>
+                                </w:rPr>
+                                <w:t>Dic</w:t>
+                              </w:r>
+                              <w:r>
+                                <w:rPr>
+                                  <w:lang w:val="en-GB"/>
+                                </w:rPr>
+                                <w:t>t( CYP name : Nº of appearances )</w:t>
+                              </w:r>
+                              <w:bookmarkEnd w:id="33"/>
+                              <w:bookmarkEnd w:id="34"/>
+                            </w:p>
+                          </w:txbxContent>
+                        </wps:txbx>
+                        <wps:bodyPr rot="0" spcFirstLastPara="0" vertOverflow="overflow" horzOverflow="overflow" vert="horz" wrap="square" lIns="0" tIns="0" rIns="0" bIns="0" numCol="1" spcCol="0" rtlCol="0" fromWordArt="0" anchor="t" anchorCtr="0" forceAA="0" compatLnSpc="1">
+                          <a:prstTxWarp prst="textNoShape">
+                            <a:avLst/>
+                          </a:prstTxWarp>
+                          <a:noAutofit/>
+                        </wps:bodyPr>
+                      </wps:wsp>
                       <pic:pic xmlns:pic="http://schemas.openxmlformats.org/drawingml/2006/picture">
                         <pic:nvPicPr>
-                          <pic:cNvPr id="1732573499" name="Picture 1" descr="A screenshot of a computer screen&#10;&#10;AI-generated content may be incorrect."/>
+                          <pic:cNvPr id="1406792922" name="Picture 1"/>
                           <pic:cNvPicPr>
                             <a:picLocks noChangeAspect="1"/>
                           </pic:cNvPicPr>
                         </pic:nvPicPr>
-                        <pic:blipFill rotWithShape="1">
+                        <pic:blipFill>
                           <a:blip r:embed="rId21">
                             <a:extLst>
                               <a:ext uri="{28A0092B-C50C-407E-A947-70E740481C1C}">
@@ -14501,37 +14664,28 @@
                               </a:ext>
                             </a:extLst>
                           </a:blip>
-                          <a:srcRect t="-1" r="6125" b="3308"/>
                           <a:stretch>
                             <a:fillRect/>
                           </a:stretch>
                         </pic:blipFill>
-                        <pic:spPr bwMode="auto">
+                        <pic:spPr>
                           <a:xfrm>
-                            <a:off x="0" y="245990"/>
-                            <a:ext cx="1644650" cy="1447800"/>
+                            <a:off x="1697566" y="338667"/>
+                            <a:ext cx="1068705" cy="1443355"/>
                           </a:xfrm>
                           <a:prstGeom prst="rect">
                             <a:avLst/>
                           </a:prstGeom>
-                          <a:ln>
-                            <a:noFill/>
-                          </a:ln>
-                          <a:extLst>
-                            <a:ext uri="{53640926-AAD7-44D8-BBD7-CCE9431645EC}">
-                              <a14:shadowObscured xmlns:a14="http://schemas.microsoft.com/office/drawing/2010/main"/>
-                            </a:ext>
-                          </a:extLst>
                         </pic:spPr>
                       </pic:pic>
                       <pic:pic xmlns:pic="http://schemas.openxmlformats.org/drawingml/2006/picture">
                         <pic:nvPicPr>
-                          <pic:cNvPr id="201898540" name="Picture 1" descr="A screen shot of a number&#10;&#10;AI-generated content may be incorrect."/>
+                          <pic:cNvPr id="1747965913" name="Picture 1"/>
                           <pic:cNvPicPr>
                             <a:picLocks noChangeAspect="1"/>
                           </pic:cNvPicPr>
                         </pic:nvPicPr>
-                        <pic:blipFill rotWithShape="1">
+                        <pic:blipFill>
                           <a:blip r:embed="rId22">
                             <a:extLst>
                               <a:ext uri="{28A0092B-C50C-407E-A947-70E740481C1C}">
@@ -14539,32 +14693,26 @@
                               </a:ext>
                             </a:extLst>
                           </a:blip>
-                          <a:srcRect l="44444"/>
                           <a:stretch>
                             <a:fillRect/>
                           </a:stretch>
                         </pic:blipFill>
-                        <pic:spPr bwMode="auto">
+                        <pic:spPr>
                           <a:xfrm>
-                            <a:off x="1789784" y="245990"/>
-                            <a:ext cx="901345" cy="1447800"/>
+                            <a:off x="55033" y="338667"/>
+                            <a:ext cx="1643380" cy="1443355"/>
                           </a:xfrm>
                           <a:prstGeom prst="rect">
                             <a:avLst/>
                           </a:prstGeom>
-                          <a:ln>
-                            <a:noFill/>
-                          </a:ln>
-                          <a:extLst>
-                            <a:ext uri="{53640926-AAD7-44D8-BBD7-CCE9431645EC}">
-                              <a14:shadowObscured xmlns:a14="http://schemas.microsoft.com/office/drawing/2010/main"/>
-                            </a:ext>
-                          </a:extLst>
                         </pic:spPr>
                       </pic:pic>
                     </wpg:wgp>
                   </a:graphicData>
                 </a:graphic>
+                <wp14:sizeRelH relativeFrom="margin">
+                  <wp14:pctWidth>0</wp14:pctWidth>
+                </wp14:sizeRelH>
                 <wp14:sizeRelV relativeFrom="margin">
                   <wp14:pctHeight>0</wp14:pctHeight>
                 </wp14:sizeRelV>
@@ -14573,12 +14721,12 @@
           </mc:Choice>
           <mc:Fallback>
             <w:pict>
-              <v:group w14:anchorId="2AC83DF5" id="Group 3" o:spid="_x0000_s1026" style="position:absolute;left:0;text-align:left;margin-left:238.55pt;margin-top:0;width:211.85pt;height:140.45pt;z-index:251665408;mso-height-relative:margin" coordorigin=",-905" coordsize="26911,17843" o:gfxdata="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">
+              <v:group w14:anchorId="0F5A1FDD" id="Group 4" o:spid="_x0000_s1026" style="position:absolute;left:0;text-align:left;margin-left:242.95pt;margin-top:0;width:213.45pt;height:181.7pt;z-index:251669504;mso-width-relative:margin;mso-height-relative:margin" coordorigin="550" coordsize="27112,23080" o:gfxdata="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">
                 <v:shapetype id="_x0000_t202" coordsize="21600,21600" o:spt="202" path="m,l,21600r21600,l21600,xe">
                   <v:stroke joinstyle="miter"/>
                   <v:path gradientshapeok="t" o:connecttype="rect"/>
                 </v:shapetype>
-                <v:shape id="_x0000_s1027" type="#_x0000_t202" style="position:absolute;left:10795;top:-905;width:13354;height:3999;visibility:visible;mso-wrap-style:none;v-text-anchor:top" o:gfxdata="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" filled="f" stroked="f">
+                <v:shape id="Text Box 1" o:spid="_x0000_s1027" type="#_x0000_t202" style="position:absolute;left:10752;width:13351;height:3999;visibility:visible;mso-wrap-style:none;v-text-anchor:top" o:gfxdata="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" filled="f" stroked="f">
                   <v:textbox>
                     <w:txbxContent>
                       <w:p>
@@ -14695,11 +14843,146 @@
                     </w:txbxContent>
                   </v:textbox>
                 </v:shape>
-                <v:shape id="Picture 1" o:spid="_x0000_s1028" type="#_x0000_t75" alt="A screenshot of a computer screen&#10;&#10;AI-generated content may be incorrect." style="position:absolute;top:2459;width:16446;height:14478;visibility:visible;mso-wrap-style:square" o:gfxdata="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">
-                  <v:imagedata r:id="rId23" o:title="A screenshot of a computer screen&#10;&#10;AI-generated content may be incorrect" croptop="-1f" cropbottom="2168f" cropright="4014f"/>
+                <v:shape id="Text Box 1" o:spid="_x0000_s1028" type="#_x0000_t202" style="position:absolute;left:550;top:18796;width:26905;height:4284;visibility:visible;mso-wrap-style:square;v-text-anchor:top" o:gfxdata="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" stroked="f">
+                  <v:textbox inset="0,0,0,0">
+                    <w:txbxContent>
+                      <w:p>
+                        <w:pPr>
+                          <w:pStyle w:val="Caption"/>
+                          <w:rPr>
+                            <w:noProof/>
+                            <w:sz w:val="22"/>
+                            <w:szCs w:val="22"/>
+                            <w:lang w:val="en-GB"/>
+                          </w:rPr>
+                        </w:pPr>
+                        <w:bookmarkStart w:id="35" w:name="_Ref223455572"/>
+                        <w:bookmarkStart w:id="36" w:name="_Ref223455489"/>
+                        <w:bookmarkStart w:id="37" w:name="_Toc229425755"/>
+                        <w:r>
+                          <w:rPr>
+                            <w:lang w:val="en-GB"/>
+                          </w:rPr>
+                          <w:t xml:space="preserve">Figure </w:t>
+                        </w:r>
+                        <w:r>
+                          <w:fldChar w:fldCharType="begin"/>
+                        </w:r>
+                        <w:r>
+                          <w:rPr>
+                            <w:lang w:val="en-GB"/>
+                          </w:rPr>
+                          <w:instrText xml:space="preserve"> SEQ Figure \* ARABIC </w:instrText>
+                        </w:r>
+                        <w:r>
+                          <w:fldChar w:fldCharType="separate"/>
+                        </w:r>
+                        <w:r>
+                          <w:rPr>
+                            <w:noProof/>
+                            <w:lang w:val="en-GB"/>
+                          </w:rPr>
+                          <w:t>4</w:t>
+                        </w:r>
+                        <w:r>
+                          <w:fldChar w:fldCharType="end"/>
+                        </w:r>
+                        <w:bookmarkEnd w:id="35"/>
+                        <w:r>
+                          <w:rPr>
+                            <w:lang w:val="en-GB"/>
+                          </w:rPr>
+                          <w:t>.</w:t>
+                        </w:r>
+                        <w:r>
+                          <w:rPr>
+                            <w:lang w:val="en-GB"/>
+                          </w:rPr>
+                          <w:t xml:space="preserve"> </w:t>
+                        </w:r>
+                        <w:r>
+                          <w:rPr>
+                            <w:lang w:val="en-GB"/>
+                          </w:rPr>
+                          <w:t xml:space="preserve">CYP450 </w:t>
+                        </w:r>
+                        <w:r>
+                          <w:rPr>
+                            <w:lang w:val="en-GB"/>
+                          </w:rPr>
+                          <w:t>‘</w:t>
+                        </w:r>
+                        <w:r>
+                          <w:rPr>
+                            <w:lang w:val="en-GB"/>
+                          </w:rPr>
+                          <w:t>dict</w:t>
+                        </w:r>
+                        <w:r>
+                          <w:rPr>
+                            <w:lang w:val="en-GB"/>
+                          </w:rPr>
+                          <w:t>’</w:t>
+                        </w:r>
+                        <w:r>
+                          <w:rPr>
+                            <w:lang w:val="en-GB"/>
+                          </w:rPr>
+                          <w:t xml:space="preserve"> descriptors</w:t>
+                        </w:r>
+                        <w:r>
+                          <w:rPr>
+                            <w:lang w:val="en-GB"/>
+                          </w:rPr>
+                          <w:t xml:space="preserve"> for full db (A) and curated db with threshold = </w:t>
+                        </w:r>
+                        <w:r>
+                          <w:rPr>
+                            <w:lang w:val="en-GB"/>
+                          </w:rPr>
+                          <w:t>50</w:t>
+                        </w:r>
+                        <w:r>
+                          <w:rPr>
+                            <w:lang w:val="en-GB"/>
+                          </w:rPr>
+                          <w:t xml:space="preserve"> (B)</w:t>
+                        </w:r>
+                        <w:r>
+                          <w:rPr>
+                            <w:lang w:val="en-GB"/>
+                          </w:rPr>
+                          <w:t>.</w:t>
+                        </w:r>
+                        <w:r>
+                          <w:rPr>
+                            <w:lang w:val="en-GB"/>
+                          </w:rPr>
+                          <w:t xml:space="preserve">  </w:t>
+                        </w:r>
+                        <w:r>
+                          <w:rPr>
+                            <w:lang w:val="en-GB"/>
+                          </w:rPr>
+                          <w:t>Dic</w:t>
+                        </w:r>
+                        <w:r>
+                          <w:rPr>
+                            <w:lang w:val="en-GB"/>
+                          </w:rPr>
+                          <w:t>t( CYP name : Nº of appearances )</w:t>
+                        </w:r>
+                        <w:bookmarkEnd w:id="36"/>
+                        <w:bookmarkEnd w:id="37"/>
+                      </w:p>
+                    </w:txbxContent>
+                  </v:textbox>
                 </v:shape>
-                <v:shape id="Picture 1" o:spid="_x0000_s1029" type="#_x0000_t75" alt="A screen shot of a number&#10;&#10;AI-generated content may be incorrect." style="position:absolute;left:17897;top:2459;width:9014;height:14478;visibility:visible;mso-wrap-style:square" o:gfxdata="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">
-                  <v:imagedata r:id="rId24" o:title="A screen shot of a number&#10;&#10;AI-generated content may be incorrect" cropleft="29127f"/>
+                <v:shape id="Picture 1" o:spid="_x0000_s1029" type="#_x0000_t75" style="position:absolute;left:16975;top:3386;width:10687;height:14434;visibility:visible;mso-wrap-style:square" o:gfxdata="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">
+                  <v:imagedata r:id="rId23" o:title=""/>
+                </v:shape>
+                <v:shape id="Picture 1" o:spid="_x0000_s1030" type="#_x0000_t75" style="position:absolute;left:550;top:3386;width:16434;height:14434;visibility:visible;mso-wrap-style:square" o:gfxdata="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">
+                  <v:imagedata r:id="rId24" o:title=""/>
                 </v:shape>
                 <w10:wrap type="square"/>
               </v:group>
@@ -14709,314 +14992,29 @@
       </w:r>
       <w:r>
         <w:rPr>
-          <w:noProof/>
-        </w:rPr>
-        <mc:AlternateContent>
-          <mc:Choice Requires="wps">
-            <w:drawing>
-              <wp:anchor distT="0" distB="0" distL="114300" distR="114300" simplePos="0" relativeHeight="251667456" behindDoc="0" locked="0" layoutInCell="1" allowOverlap="1" wp14:anchorId="7F3512B5" wp14:editId="48C32299">
-                <wp:simplePos x="0" y="0"/>
-                <wp:positionH relativeFrom="column">
-                  <wp:posOffset>3028315</wp:posOffset>
-                </wp:positionH>
-                <wp:positionV relativeFrom="paragraph">
-                  <wp:posOffset>1933575</wp:posOffset>
-                </wp:positionV>
-                <wp:extent cx="2690495" cy="635"/>
-                <wp:effectExtent l="0" t="0" r="0" b="0"/>
-                <wp:wrapSquare wrapText="bothSides"/>
-                <wp:docPr id="906153808" name="Text Box 1"/>
-                <wp:cNvGraphicFramePr/>
-                <a:graphic xmlns:a="http://schemas.openxmlformats.org/drawingml/2006/main">
-                  <a:graphicData uri="http://schemas.microsoft.com/office/word/2010/wordprocessingShape">
-                    <wps:wsp>
-                      <wps:cNvSpPr txBox="1"/>
-                      <wps:spPr>
-                        <a:xfrm>
-                          <a:off x="0" y="0"/>
-                          <a:ext cx="2690495" cy="635"/>
-                        </a:xfrm>
-                        <a:prstGeom prst="rect">
-                          <a:avLst/>
-                        </a:prstGeom>
-                        <a:solidFill>
-                          <a:prstClr val="white"/>
-                        </a:solidFill>
-                        <a:ln>
-                          <a:noFill/>
-                        </a:ln>
-                      </wps:spPr>
-                      <wps:txbx>
-                        <w:txbxContent>
-                          <w:p>
-                            <w:pPr>
-                              <w:pStyle w:val="Caption"/>
-                              <w:rPr>
-                                <w:noProof/>
-                                <w:sz w:val="22"/>
-                                <w:szCs w:val="22"/>
-                                <w:lang w:val="en-GB"/>
-                              </w:rPr>
-                            </w:pPr>
-                            <w:bookmarkStart w:id="32" w:name="_Ref223455572"/>
-                            <w:bookmarkStart w:id="33" w:name="_Ref223455489"/>
-                            <w:bookmarkStart w:id="34" w:name="_Toc228905438"/>
-                            <w:r>
-                              <w:rPr>
-                                <w:lang w:val="en-GB"/>
-                              </w:rPr>
-                              <w:t xml:space="preserve">Figure </w:t>
-                            </w:r>
-                            <w:r>
-                              <w:fldChar w:fldCharType="begin"/>
-                            </w:r>
-                            <w:r>
-                              <w:rPr>
-                                <w:lang w:val="en-GB"/>
-                              </w:rPr>
-                              <w:instrText xml:space="preserve"> SEQ Figure \* ARABIC </w:instrText>
-                            </w:r>
-                            <w:r>
-                              <w:fldChar w:fldCharType="separate"/>
-                            </w:r>
-                            <w:r>
-                              <w:rPr>
-                                <w:noProof/>
-                                <w:lang w:val="en-GB"/>
-                              </w:rPr>
-                              <w:t>4</w:t>
-                            </w:r>
-                            <w:r>
-                              <w:fldChar w:fldCharType="end"/>
-                            </w:r>
-                            <w:bookmarkEnd w:id="32"/>
-                            <w:r>
-                              <w:rPr>
-                                <w:lang w:val="en-GB"/>
-                              </w:rPr>
-                              <w:t>.</w:t>
-                            </w:r>
-                            <w:r>
-                              <w:rPr>
-                                <w:lang w:val="en-GB"/>
-                              </w:rPr>
-                              <w:t xml:space="preserve"> </w:t>
-                            </w:r>
-                            <w:r>
-                              <w:rPr>
-                                <w:lang w:val="en-GB"/>
-                              </w:rPr>
-                              <w:t xml:space="preserve">CYP450 </w:t>
-                            </w:r>
-                            <w:r>
-                              <w:rPr>
-                                <w:lang w:val="en-GB"/>
-                              </w:rPr>
-                              <w:t>‘</w:t>
-                            </w:r>
-                            <w:r>
-                              <w:rPr>
-                                <w:lang w:val="en-GB"/>
-                              </w:rPr>
-                              <w:t>dict</w:t>
-                            </w:r>
-                            <w:r>
-                              <w:rPr>
-                                <w:lang w:val="en-GB"/>
-                              </w:rPr>
-                              <w:t>’</w:t>
-                            </w:r>
-                            <w:r>
-                              <w:rPr>
-                                <w:lang w:val="en-GB"/>
-                              </w:rPr>
-                              <w:t xml:space="preserve"> descriptors</w:t>
-                            </w:r>
-                            <w:r>
-                              <w:rPr>
-                                <w:lang w:val="en-GB"/>
-                              </w:rPr>
-                              <w:t xml:space="preserve"> for full db (A) and curated db with threshold = 10 (B)</w:t>
-                            </w:r>
-                            <w:r>
-                              <w:rPr>
-                                <w:lang w:val="en-GB"/>
-                              </w:rPr>
-                              <w:t>.</w:t>
-                            </w:r>
-                            <w:r>
-                              <w:rPr>
-                                <w:lang w:val="en-GB"/>
-                              </w:rPr>
-                              <w:t xml:space="preserve">  </w:t>
-                            </w:r>
-                            <w:r>
-                              <w:rPr>
-                                <w:lang w:val="en-GB"/>
-                              </w:rPr>
-                              <w:t>Dic</w:t>
-                            </w:r>
-                            <w:r>
-                              <w:rPr>
-                                <w:lang w:val="en-GB"/>
-                              </w:rPr>
-                              <w:t>t( CYP name : Nº of appearances )</w:t>
-                            </w:r>
-                            <w:bookmarkEnd w:id="33"/>
-                            <w:bookmarkEnd w:id="34"/>
-                          </w:p>
-                        </w:txbxContent>
-                      </wps:txbx>
-                      <wps:bodyPr rot="0" spcFirstLastPara="0" vertOverflow="overflow" horzOverflow="overflow" vert="horz" wrap="square" lIns="0" tIns="0" rIns="0" bIns="0" numCol="1" spcCol="0" rtlCol="0" fromWordArt="0" anchor="t" anchorCtr="0" forceAA="0" compatLnSpc="1">
-                        <a:prstTxWarp prst="textNoShape">
-                          <a:avLst/>
-                        </a:prstTxWarp>
-                        <a:spAutoFit/>
-                      </wps:bodyPr>
-                    </wps:wsp>
-                  </a:graphicData>
-                </a:graphic>
-                <wp14:sizeRelH relativeFrom="margin">
-                  <wp14:pctWidth>0</wp14:pctWidth>
-                </wp14:sizeRelH>
-              </wp:anchor>
-            </w:drawing>
-          </mc:Choice>
-          <mc:Fallback>
-            <w:pict>
-              <v:shape w14:anchorId="7F3512B5" id="Text Box 1" o:spid="_x0000_s1030" type="#_x0000_t202" style="position:absolute;left:0;text-align:left;margin-left:238.45pt;margin-top:152.25pt;width:211.85pt;height:.05pt;z-index:251667456;visibility:visible;mso-wrap-style:square;mso-width-percent:0;mso-wrap-distance-left:9pt;mso-wrap-distance-top:0;mso-wrap-distance-right:9pt;mso-wrap-distance-bottom:0;mso-position-horizontal:absolute;mso-position-horizontal-relative:text;mso-position-vertical:absolute;mso-position-vertical-relative:text;mso-width-percent:0;mso-width-relative:margin;v-text-anchor:top" o:gfxdata="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" stroked="f">
-                <v:textbox style="mso-fit-shape-to-text:t" inset="0,0,0,0">
-                  <w:txbxContent>
-                    <w:p>
-                      <w:pPr>
-                        <w:pStyle w:val="Caption"/>
-                        <w:rPr>
-                          <w:noProof/>
-                          <w:sz w:val="22"/>
-                          <w:szCs w:val="22"/>
-                          <w:lang w:val="en-GB"/>
-                        </w:rPr>
-                      </w:pPr>
-                      <w:bookmarkStart w:id="35" w:name="_Ref223455572"/>
-                      <w:bookmarkStart w:id="36" w:name="_Ref223455489"/>
-                      <w:bookmarkStart w:id="37" w:name="_Toc228905438"/>
-                      <w:r>
-                        <w:rPr>
-                          <w:lang w:val="en-GB"/>
-                        </w:rPr>
-                        <w:t xml:space="preserve">Figure </w:t>
-                      </w:r>
-                      <w:r>
-                        <w:fldChar w:fldCharType="begin"/>
-                      </w:r>
-                      <w:r>
-                        <w:rPr>
-                          <w:lang w:val="en-GB"/>
-                        </w:rPr>
-                        <w:instrText xml:space="preserve"> SEQ Figure \* ARABIC </w:instrText>
-                      </w:r>
-                      <w:r>
-                        <w:fldChar w:fldCharType="separate"/>
-                      </w:r>
-                      <w:r>
-                        <w:rPr>
-                          <w:noProof/>
-                          <w:lang w:val="en-GB"/>
-                        </w:rPr>
-                        <w:t>4</w:t>
-                      </w:r>
-                      <w:r>
-                        <w:fldChar w:fldCharType="end"/>
-                      </w:r>
-                      <w:bookmarkEnd w:id="35"/>
-                      <w:r>
-                        <w:rPr>
-                          <w:lang w:val="en-GB"/>
-                        </w:rPr>
-                        <w:t>.</w:t>
-                      </w:r>
-                      <w:r>
-                        <w:rPr>
-                          <w:lang w:val="en-GB"/>
-                        </w:rPr>
-                        <w:t xml:space="preserve"> </w:t>
-                      </w:r>
-                      <w:r>
-                        <w:rPr>
-                          <w:lang w:val="en-GB"/>
-                        </w:rPr>
-                        <w:t xml:space="preserve">CYP450 </w:t>
-                      </w:r>
-                      <w:r>
-                        <w:rPr>
-                          <w:lang w:val="en-GB"/>
-                        </w:rPr>
-                        <w:t>‘</w:t>
-                      </w:r>
-                      <w:r>
-                        <w:rPr>
-                          <w:lang w:val="en-GB"/>
-                        </w:rPr>
-                        <w:t>dict</w:t>
-                      </w:r>
-                      <w:r>
-                        <w:rPr>
-                          <w:lang w:val="en-GB"/>
-                        </w:rPr>
-                        <w:t>’</w:t>
-                      </w:r>
-                      <w:r>
-                        <w:rPr>
-                          <w:lang w:val="en-GB"/>
-                        </w:rPr>
-                        <w:t xml:space="preserve"> descriptors</w:t>
-                      </w:r>
-                      <w:r>
-                        <w:rPr>
-                          <w:lang w:val="en-GB"/>
-                        </w:rPr>
-                        <w:t xml:space="preserve"> for full db (A) and curated db with threshold = 10 (B)</w:t>
-                      </w:r>
-                      <w:r>
-                        <w:rPr>
-                          <w:lang w:val="en-GB"/>
-                        </w:rPr>
-                        <w:t>.</w:t>
-                      </w:r>
-                      <w:r>
-                        <w:rPr>
-                          <w:lang w:val="en-GB"/>
-                        </w:rPr>
-                        <w:t xml:space="preserve">  </w:t>
-                      </w:r>
-                      <w:r>
-                        <w:rPr>
-                          <w:lang w:val="en-GB"/>
-                        </w:rPr>
-                        <w:t>Dic</w:t>
-                      </w:r>
-                      <w:r>
-                        <w:rPr>
-                          <w:lang w:val="en-GB"/>
-                        </w:rPr>
-                        <w:t>t( CYP name : Nº of appearances )</w:t>
-                      </w:r>
-                      <w:bookmarkEnd w:id="36"/>
-                      <w:bookmarkEnd w:id="37"/>
-                    </w:p>
-                  </w:txbxContent>
-                </v:textbox>
-                <w10:wrap type="square"/>
-              </v:shape>
-            </w:pict>
-          </mc:Fallback>
-        </mc:AlternateContent>
-      </w:r>
-      <w:r>
-        <w:rPr>
-          <w:lang w:val="en-GB" w:eastAsia="en-GB"/>
-        </w:rPr>
-        <w:t>By using ChemSpiPy API</w:t>
+          <w:lang w:val="en-GB" w:eastAsia="en-GB"/>
+        </w:rPr>
+        <w:t xml:space="preserve">By using </w:t>
+      </w:r>
+      <w:r>
+        <w:rPr>
+          <w:lang w:val="en-GB" w:eastAsia="en-GB"/>
+        </w:rPr>
+        <w:t xml:space="preserve">the </w:t>
+      </w:r>
+      <w:proofErr w:type="spellStart"/>
+      <w:r>
+        <w:rPr>
+          <w:lang w:val="en-GB" w:eastAsia="en-GB"/>
+        </w:rPr>
+        <w:t>ChemSpiPy</w:t>
+      </w:r>
+      <w:proofErr w:type="spellEnd"/>
+      <w:r>
+        <w:rPr>
+          <w:lang w:val="en-GB" w:eastAsia="en-GB"/>
+        </w:rPr>
+        <w:t xml:space="preserve"> API</w:t>
       </w:r>
       <w:r>
         <w:rPr>
@@ -15090,72 +15088,191 @@
           <w:bCs/>
           <w:lang w:val="en-GB" w:eastAsia="en-GB"/>
         </w:rPr>
-        <w:t>33 different CYP450s</w:t>
-      </w:r>
-      <w:r>
-        <w:rPr>
-          <w:lang w:val="en-GB" w:eastAsia="en-GB"/>
-        </w:rPr>
-        <w:t xml:space="preserve"> were present with a mean appearance in 127 different compounds, with CYP3A4 appearing the most in 1051 compounds and 13 CYP450s appearing in </w:t>
-      </w:r>
-      <w:r>
-        <w:rPr>
-          <w:color w:val="EE0000"/>
-          <w:lang w:val="en-GB" w:eastAsia="en-GB"/>
-        </w:rPr>
-        <w:t xml:space="preserve">less than 10 </w:t>
-      </w:r>
-      <w:r>
-        <w:rPr>
-          <w:color w:val="EE0000"/>
-          <w:lang w:val="en-GB" w:eastAsia="en-GB"/>
-        </w:rPr>
-        <w:t>compounds</w:t>
-      </w:r>
-      <w:r>
-        <w:rPr>
-          <w:color w:val="EE0000"/>
+        <w:t>33 different CYP450</w:t>
+      </w:r>
+      <w:r>
+        <w:rPr>
+          <w:b/>
+          <w:bCs/>
           <w:lang w:val="en-GB" w:eastAsia="en-GB"/>
         </w:rPr>
         <w:t xml:space="preserve"> </w:t>
       </w:r>
       <w:r>
         <w:rPr>
-          <w:color w:val="EE0000"/>
+          <w:lang w:val="en-GB" w:eastAsia="en-GB"/>
+        </w:rPr>
+        <w:t>isoenzymes</w:t>
+      </w:r>
+      <w:r>
+        <w:rPr>
+          <w:lang w:val="en-GB" w:eastAsia="en-GB"/>
+        </w:rPr>
+        <w:t xml:space="preserve"> were present with a mean appearance </w:t>
+      </w:r>
+      <w:r>
+        <w:rPr>
+          <w:lang w:val="en-GB" w:eastAsia="en-GB"/>
+        </w:rPr>
+        <w:t>frequency of</w:t>
+      </w:r>
+      <w:r>
+        <w:rPr>
+          <w:lang w:val="en-GB" w:eastAsia="en-GB"/>
+        </w:rPr>
+        <w:t xml:space="preserve"> 127 </w:t>
+      </w:r>
+      <w:r>
+        <w:rPr>
+          <w:lang w:val="en-GB" w:eastAsia="en-GB"/>
+        </w:rPr>
+        <w:t>compounds per CYP. The most common isoform,</w:t>
+      </w:r>
+      <w:r>
+        <w:rPr>
+          <w:lang w:val="en-GB" w:eastAsia="en-GB"/>
+        </w:rPr>
+        <w:t xml:space="preserve"> CYP3A4</w:t>
+      </w:r>
+      <w:r>
+        <w:rPr>
+          <w:lang w:val="en-GB" w:eastAsia="en-GB"/>
+        </w:rPr>
+        <w:t>,</w:t>
+      </w:r>
+      <w:r>
+        <w:rPr>
+          <w:lang w:val="en-GB" w:eastAsia="en-GB"/>
+        </w:rPr>
+        <w:t xml:space="preserve"> appear</w:t>
+      </w:r>
+      <w:r>
+        <w:rPr>
+          <w:lang w:val="en-GB" w:eastAsia="en-GB"/>
+        </w:rPr>
+        <w:t>s</w:t>
+      </w:r>
+      <w:r>
+        <w:rPr>
+          <w:lang w:val="en-GB" w:eastAsia="en-GB"/>
+        </w:rPr>
+        <w:t xml:space="preserve"> in 1051 compounds </w:t>
+      </w:r>
+      <w:r>
+        <w:rPr>
+          <w:lang w:val="en-GB" w:eastAsia="en-GB"/>
+        </w:rPr>
+        <w:t>while</w:t>
+      </w:r>
+      <w:r>
+        <w:rPr>
+          <w:lang w:val="en-GB" w:eastAsia="en-GB"/>
+        </w:rPr>
+        <w:t xml:space="preserve"> </w:t>
+      </w:r>
+      <w:r>
+        <w:rPr>
+          <w:lang w:val="en-GB" w:eastAsia="en-GB"/>
+        </w:rPr>
+        <w:t>20</w:t>
+      </w:r>
+      <w:r>
+        <w:rPr>
+          <w:lang w:val="en-GB" w:eastAsia="en-GB"/>
+        </w:rPr>
+        <w:t xml:space="preserve"> </w:t>
+      </w:r>
+      <w:r>
+        <w:rPr>
+          <w:lang w:val="en-GB" w:eastAsia="en-GB"/>
+        </w:rPr>
+        <w:t>isoforms</w:t>
+      </w:r>
+      <w:r>
+        <w:rPr>
+          <w:lang w:val="en-GB" w:eastAsia="en-GB"/>
+        </w:rPr>
+        <w:t xml:space="preserve"> </w:t>
+      </w:r>
+      <w:r>
+        <w:rPr>
+          <w:lang w:val="en-GB" w:eastAsia="en-GB"/>
+        </w:rPr>
+        <w:t>appear</w:t>
+      </w:r>
+      <w:r>
+        <w:rPr>
+          <w:lang w:val="en-GB" w:eastAsia="en-GB"/>
+        </w:rPr>
+        <w:t xml:space="preserve"> </w:t>
+      </w:r>
+      <w:r>
+        <w:rPr>
+          <w:lang w:val="en-GB" w:eastAsia="en-GB"/>
+        </w:rPr>
+        <w:t xml:space="preserve">in </w:t>
+      </w:r>
+      <w:r>
+        <w:rPr>
+          <w:lang w:val="en-GB" w:eastAsia="en-GB"/>
+        </w:rPr>
+        <w:t>fewer</w:t>
+      </w:r>
+      <w:r>
+        <w:rPr>
+          <w:lang w:val="en-GB" w:eastAsia="en-GB"/>
+        </w:rPr>
+        <w:t xml:space="preserve"> than </w:t>
+      </w:r>
+      <w:r>
+        <w:rPr>
+          <w:lang w:val="en-GB" w:eastAsia="en-GB"/>
+        </w:rPr>
+        <w:t>5</w:t>
+      </w:r>
+      <w:r>
+        <w:rPr>
+          <w:lang w:val="en-GB" w:eastAsia="en-GB"/>
+        </w:rPr>
+        <w:t>0 compounds</w:t>
+      </w:r>
+      <w:r>
+        <w:rPr>
+          <w:lang w:val="en-GB" w:eastAsia="en-GB"/>
+        </w:rPr>
+        <w:t xml:space="preserve"> </w:t>
+      </w:r>
+      <w:r>
+        <w:rPr>
           <w:lang w:val="en-GB"/>
         </w:rPr>
         <w:t>(</w:t>
       </w:r>
       <w:r>
         <w:rPr>
-          <w:color w:val="EE0000"/>
           <w:lang w:val="en-GB"/>
         </w:rPr>
         <w:fldChar w:fldCharType="begin"/>
       </w:r>
       <w:r>
         <w:rPr>
-          <w:color w:val="EE0000"/>
           <w:lang w:val="en-GB"/>
         </w:rPr>
         <w:instrText xml:space="preserve"> REF _Ref223455572 \h </w:instrText>
       </w:r>
       <w:r>
         <w:rPr>
-          <w:color w:val="EE0000"/>
-          <w:lang w:val="en-GB"/>
-        </w:rPr>
-      </w:r>
-      <w:r>
-        <w:rPr>
-          <w:color w:val="EE0000"/>
+          <w:lang w:val="en-GB"/>
+        </w:rPr>
+      </w:r>
+      <w:r>
+        <w:rPr>
           <w:lang w:val="en-GB"/>
         </w:rPr>
         <w:fldChar w:fldCharType="separate"/>
       </w:r>
       <w:r>
         <w:rPr>
-          <w:color w:val="EE0000"/>
           <w:lang w:val="en-GB"/>
         </w:rPr>
         <w:t xml:space="preserve">Figure </w:t>
@@ -15163,111 +15280,221 @@
       <w:r>
         <w:rPr>
           <w:noProof/>
-          <w:color w:val="EE0000"/>
           <w:lang w:val="en-GB"/>
         </w:rPr>
         <w:t>4</w:t>
       </w:r>
       <w:r>
         <w:rPr>
-          <w:color w:val="EE0000"/>
           <w:lang w:val="en-GB"/>
         </w:rPr>
         <w:fldChar w:fldCharType="end"/>
       </w:r>
       <w:r>
         <w:rPr>
-          <w:color w:val="EE0000"/>
           <w:lang w:val="en-GB"/>
         </w:rPr>
         <w:t>A</w:t>
       </w:r>
       <w:r>
         <w:rPr>
-          <w:color w:val="EE0000"/>
           <w:lang w:val="en-GB"/>
         </w:rPr>
         <w:t>)</w:t>
       </w:r>
       <w:r>
         <w:rPr>
-          <w:color w:val="EE0000"/>
           <w:lang w:val="en-GB"/>
         </w:rPr>
         <w:t xml:space="preserve">. </w:t>
       </w:r>
       <w:r>
         <w:rPr>
-          <w:color w:val="EE0000"/>
-          <w:lang w:val="en-GB" w:eastAsia="en-GB"/>
-        </w:rPr>
-        <w:t>These low frequency CYP450s were removed from the db as they would not have enough true positives to train a robust model</w:t>
-      </w:r>
-      <w:r>
-        <w:rPr>
-          <w:color w:val="EE0000"/>
-          <w:lang w:val="en-GB" w:eastAsia="en-GB"/>
-        </w:rPr>
-        <w:t xml:space="preserve">, leaving 20 unique </w:t>
-      </w:r>
-      <w:r>
-        <w:rPr>
-          <w:color w:val="EE0000"/>
-          <w:lang w:val="en-GB" w:eastAsia="en-GB"/>
-        </w:rPr>
-        <w:t xml:space="preserve">high-medium frequency </w:t>
-      </w:r>
-      <w:r>
-        <w:rPr>
-          <w:color w:val="EE0000"/>
+          <w:lang w:val="en-GB" w:eastAsia="en-GB"/>
+        </w:rPr>
+        <w:t>These low frequency CYP450s were removed from the db as they would not have enough true positives to train</w:t>
+      </w:r>
+      <w:r>
+        <w:rPr>
+          <w:lang w:val="en-GB" w:eastAsia="en-GB"/>
+        </w:rPr>
+        <w:t xml:space="preserve"> and test</w:t>
+      </w:r>
+      <w:r>
+        <w:rPr>
+          <w:lang w:val="en-GB" w:eastAsia="en-GB"/>
+        </w:rPr>
+        <w:t xml:space="preserve"> a model</w:t>
+      </w:r>
+      <w:r>
+        <w:rPr>
+          <w:lang w:val="en-GB" w:eastAsia="en-GB"/>
+        </w:rPr>
+        <w:t xml:space="preserve"> in a reliable and robust manner</w:t>
+      </w:r>
+      <w:r>
+        <w:rPr>
+          <w:lang w:val="en-GB" w:eastAsia="en-GB"/>
+        </w:rPr>
+        <w:t xml:space="preserve"> given the projected 80/20 data split used </w:t>
+      </w:r>
+      <w:r>
+        <w:rPr>
+          <w:lang w:val="en-GB" w:eastAsia="en-GB"/>
+        </w:rPr>
+        <w:t>for</w:t>
+      </w:r>
+      <w:r>
+        <w:rPr>
+          <w:lang w:val="en-GB" w:eastAsia="en-GB"/>
+        </w:rPr>
+        <w:t xml:space="preserve"> train</w:t>
+      </w:r>
+      <w:r>
+        <w:rPr>
+          <w:lang w:val="en-GB" w:eastAsia="en-GB"/>
+        </w:rPr>
+        <w:t>ing</w:t>
+      </w:r>
+      <w:r>
+        <w:rPr>
+          <w:lang w:val="en-GB" w:eastAsia="en-GB"/>
+        </w:rPr>
+        <w:t>/test</w:t>
+      </w:r>
+      <w:r>
+        <w:rPr>
+          <w:lang w:val="en-GB" w:eastAsia="en-GB"/>
+        </w:rPr>
+        <w:t xml:space="preserve">ing of </w:t>
+      </w:r>
+      <w:r>
+        <w:rPr>
+          <w:lang w:val="en-GB" w:eastAsia="en-GB"/>
+        </w:rPr>
+        <w:t xml:space="preserve">the models. This threshold of 50 was chosen to produce a test split with at least 10 positive compounds, allowing for a better evaluation of the </w:t>
+      </w:r>
+      <w:r>
+        <w:rPr>
+          <w:lang w:val="en-GB" w:eastAsia="en-GB"/>
+        </w:rPr>
+        <w:t>model’s</w:t>
+      </w:r>
+      <w:r>
+        <w:rPr>
+          <w:lang w:val="en-GB" w:eastAsia="en-GB"/>
+        </w:rPr>
+        <w:t xml:space="preserve"> performance using the selected metrics, ensuring more stable </w:t>
+      </w:r>
+      <w:r>
+        <w:rPr>
+          <w:lang w:val="en-GB" w:eastAsia="en-GB"/>
+        </w:rPr>
+        <w:t>metric readings. This left</w:t>
+      </w:r>
+      <w:r>
+        <w:rPr>
+          <w:lang w:val="en-GB" w:eastAsia="en-GB"/>
+        </w:rPr>
+        <w:t xml:space="preserve"> </w:t>
+      </w:r>
+      <w:r>
+        <w:rPr>
+          <w:lang w:val="en-GB" w:eastAsia="en-GB"/>
+        </w:rPr>
+        <w:t>13</w:t>
+      </w:r>
+      <w:r>
+        <w:rPr>
+          <w:lang w:val="en-GB" w:eastAsia="en-GB"/>
+        </w:rPr>
+        <w:t xml:space="preserve"> unique </w:t>
+      </w:r>
+      <w:r>
+        <w:rPr>
+          <w:lang w:val="en-GB" w:eastAsia="en-GB"/>
+        </w:rPr>
+        <w:t>high-</w:t>
+      </w:r>
+      <w:r>
+        <w:rPr>
+          <w:lang w:val="en-GB" w:eastAsia="en-GB"/>
+        </w:rPr>
+        <w:t xml:space="preserve"> to </w:t>
+      </w:r>
+      <w:r>
+        <w:rPr>
+          <w:lang w:val="en-GB" w:eastAsia="en-GB"/>
+        </w:rPr>
+        <w:t>medium</w:t>
+      </w:r>
+      <w:r>
+        <w:rPr>
+          <w:lang w:val="en-GB" w:eastAsia="en-GB"/>
+        </w:rPr>
+        <w:t>-</w:t>
+      </w:r>
+      <w:r>
+        <w:rPr>
+          <w:lang w:val="en-GB" w:eastAsia="en-GB"/>
+        </w:rPr>
+        <w:t xml:space="preserve">frequency </w:t>
+      </w:r>
+      <w:r>
+        <w:rPr>
           <w:lang w:val="en-GB" w:eastAsia="en-GB"/>
         </w:rPr>
         <w:t>CYP450</w:t>
       </w:r>
       <w:r>
         <w:rPr>
-          <w:color w:val="EE0000"/>
-          <w:lang w:val="en-GB" w:eastAsia="en-GB"/>
-        </w:rPr>
-        <w:t xml:space="preserve"> with an improved mean of 208 compound’ appearances </w:t>
-      </w:r>
-      <w:r>
-        <w:rPr>
-          <w:color w:val="EE0000"/>
+          <w:lang w:val="en-GB" w:eastAsia="en-GB"/>
+        </w:rPr>
+        <w:t xml:space="preserve"> with an improved mean of </w:t>
+      </w:r>
+      <w:r>
+        <w:rPr>
+          <w:lang w:val="en-GB" w:eastAsia="en-GB"/>
+        </w:rPr>
+        <w:t>308</w:t>
+      </w:r>
+      <w:r>
+        <w:rPr>
+          <w:lang w:val="en-GB" w:eastAsia="en-GB"/>
+        </w:rPr>
+        <w:t xml:space="preserve"> compound appearances </w:t>
+      </w:r>
+      <w:r>
+        <w:rPr>
           <w:lang w:val="en-GB" w:eastAsia="en-GB"/>
         </w:rPr>
         <w:t>(</w:t>
       </w:r>
       <w:r>
         <w:rPr>
-          <w:color w:val="EE0000"/>
           <w:lang w:val="en-GB" w:eastAsia="en-GB"/>
         </w:rPr>
         <w:fldChar w:fldCharType="begin"/>
       </w:r>
       <w:r>
         <w:rPr>
-          <w:color w:val="EE0000"/>
           <w:lang w:val="en-GB" w:eastAsia="en-GB"/>
         </w:rPr>
         <w:instrText xml:space="preserve"> REF _Ref223455572 \h </w:instrText>
       </w:r>
       <w:r>
         <w:rPr>
-          <w:color w:val="EE0000"/>
-          <w:lang w:val="en-GB" w:eastAsia="en-GB"/>
-        </w:rPr>
-      </w:r>
-      <w:r>
-        <w:rPr>
-          <w:color w:val="EE0000"/>
+          <w:lang w:val="en-GB" w:eastAsia="en-GB"/>
+        </w:rPr>
+      </w:r>
+      <w:r>
+        <w:rPr>
           <w:lang w:val="en-GB" w:eastAsia="en-GB"/>
         </w:rPr>
         <w:fldChar w:fldCharType="separate"/>
       </w:r>
       <w:r>
         <w:rPr>
-          <w:color w:val="EE0000"/>
           <w:lang w:val="en-GB"/>
         </w:rPr>
         <w:t xml:space="preserve">Figure </w:t>
@@ -15275,28 +15502,24 @@
       <w:r>
         <w:rPr>
           <w:noProof/>
-          <w:color w:val="EE0000"/>
           <w:lang w:val="en-GB"/>
         </w:rPr>
         <w:t>4</w:t>
       </w:r>
       <w:r>
         <w:rPr>
-          <w:color w:val="EE0000"/>
           <w:lang w:val="en-GB" w:eastAsia="en-GB"/>
         </w:rPr>
         <w:fldChar w:fldCharType="end"/>
       </w:r>
       <w:r>
         <w:rPr>
-          <w:color w:val="EE0000"/>
           <w:lang w:val="en-GB" w:eastAsia="en-GB"/>
         </w:rPr>
         <w:t>B</w:t>
       </w:r>
       <w:r>
         <w:rPr>
-          <w:color w:val="EE0000"/>
           <w:lang w:val="en-GB" w:eastAsia="en-GB"/>
         </w:rPr>
         <w:t>).</w:t>
@@ -15433,6 +15656,12 @@
         </w:rPr>
         <w:t>as well as details on related proteins, sequences, structures, and biological pathways.</w:t>
       </w:r>
+      <w:r>
+        <w:rPr>
+          <w:lang w:val="en-GB" w:eastAsia="en-GB"/>
+        </w:rPr>
+        <w:t xml:space="preserve"> Db downloaded on 28/08/2025.</w:t>
+      </w:r>
     </w:p>
     <w:p>
       <w:pPr>
@@ -15477,6 +15706,12 @@
           <w:lang w:val="en-GB" w:eastAsia="en-GB"/>
         </w:rPr>
         <w:t>In this work, Kaggle served as the access point for acquiring a pre-processed dataset of drug-like compounds.</w:t>
+      </w:r>
+      <w:r>
+        <w:rPr>
+          <w:lang w:val="en-GB" w:eastAsia="en-GB"/>
+        </w:rPr>
+        <w:t xml:space="preserve"> Db downloaded on 18/02/2026.</w:t>
       </w:r>
     </w:p>
     <w:p>
@@ -15550,7 +15785,14 @@
         <w:rPr>
           <w:lang w:val="en-GB" w:eastAsia="en-GB"/>
         </w:rPr>
-        <w:t xml:space="preserve"> It is a manually curated, freely accessible database that provides comprehensive bioactivity data for drug-like compounds. It integrates chemical, biological, and pharmacological information, covering from compound structures to bioactivity measurements against biological targets. The data is primarily extracted from the primary medicinal chemistry literature.</w:t>
+        <w:t xml:space="preserve"> It is a manually curated, freely accessible database that provides comprehensive bioactivity data for drug-like compounds. It integrates chemical, biological, and pharmacological information, covering from compound structures to bioactivity </w:t>
+      </w:r>
+      <w:r>
+        <w:rPr>
+          <w:lang w:val="en-GB" w:eastAsia="en-GB"/>
+        </w:rPr>
+        <w:lastRenderedPageBreak/>
+        <w:t>measurements against biological targets. The data is primarily extracted from the primary medicinal chemistry literature.</w:t>
       </w:r>
       <w:r>
         <w:rPr>
@@ -15580,7 +15822,6 @@
           <w:color w:val="auto"/>
           <w:lang w:val="en-GB" w:eastAsia="en-GB"/>
         </w:rPr>
-        <w:lastRenderedPageBreak/>
         <w:t>Exploratory data analysis (EDA)</w:t>
       </w:r>
       <w:bookmarkEnd w:id="39"/>
@@ -16043,7 +16284,7 @@
         </w:rPr>
       </w:pPr>
       <w:bookmarkStart w:id="41" w:name="_Ref228294871"/>
-      <w:bookmarkStart w:id="42" w:name="_Toc228905439"/>
+      <w:bookmarkStart w:id="42" w:name="_Toc229425756"/>
       <w:r>
         <w:rPr>
           <w:lang w:val="en-GB"/>
@@ -16225,7 +16466,7 @@
         </w:rPr>
       </w:pPr>
       <w:bookmarkStart w:id="43" w:name="_Ref228294830"/>
-      <w:bookmarkStart w:id="44" w:name="_Toc228905440"/>
+      <w:bookmarkStart w:id="44" w:name="_Toc229425757"/>
       <w:r>
         <w:rPr>
           <w:lang w:val="en-GB"/>
@@ -16763,7 +17004,7 @@
           <w:lang w:val="en-GB" w:eastAsia="en-GB"/>
         </w:rPr>
       </w:pPr>
-      <w:bookmarkStart w:id="48" w:name="_Toc228905441"/>
+      <w:bookmarkStart w:id="48" w:name="_Toc229425758"/>
       <w:r>
         <w:rPr>
           <w:lang w:val="en-GB"/>
@@ -17239,7 +17480,7 @@
           <w:lang w:val="en-GB"/>
         </w:rPr>
       </w:pPr>
-      <w:bookmarkStart w:id="50" w:name="_Toc228905442"/>
+      <w:bookmarkStart w:id="50" w:name="_Toc229425759"/>
       <w:r>
         <w:rPr>
           <w:lang w:val="en-GB"/>
@@ -17555,7 +17796,7 @@
           <w:lang w:val="en-GB"/>
         </w:rPr>
       </w:pPr>
-      <w:bookmarkStart w:id="52" w:name="_Toc228905443"/>
+      <w:bookmarkStart w:id="52" w:name="_Toc229425760"/>
       <w:r>
         <w:rPr>
           <w:lang w:val="en-GB"/>
@@ -18321,7 +18562,7 @@
           <w:lang w:val="en-GB" w:eastAsia="en-GB"/>
         </w:rPr>
       </w:pPr>
-      <w:bookmarkStart w:id="54" w:name="_Toc228905444"/>
+      <w:bookmarkStart w:id="54" w:name="_Toc229425761"/>
       <w:r>
         <w:rPr>
           <w:lang w:val="en-GB"/>
@@ -18578,7 +18819,7 @@
             <w:autoSpaceDE w:val="0"/>
             <w:autoSpaceDN w:val="0"/>
             <w:ind w:hanging="640"/>
-            <w:divId w:val="1876186442"/>
+            <w:divId w:val="347297386"/>
             <w:rPr>
               <w:rFonts w:ascii="Calibri" w:eastAsia="Times New Roman" w:hAnsi="Calibri" w:cs="Calibri"/>
               <w:color w:val="000000"/>
@@ -18601,7 +18842,25 @@
               <w:lang w:val="en-GB"/>
             </w:rPr>
             <w:tab/>
-            <w:t>N. ul Amin Mohsin, M. Farrukh, S. Shahzadi, and M. Irfan, “Drug Metabolism: Phase I and Phase II Metabolic Pathways,” 2024. doi: 10.5772/intechopen.112854.</w:t>
+            <w:t xml:space="preserve">N. ul Amin Mohsin, M. Farrukh, S. Shahzadi, and M. Irfan, “Drug Metabolism: Phase I and Phase II Metabolic Pathways,” 2024. </w:t>
+          </w:r>
+          <w:proofErr w:type="spellStart"/>
+          <w:r>
+            <w:rPr>
+              <w:rFonts w:ascii="Calibri" w:eastAsia="Times New Roman" w:hAnsi="Calibri" w:cs="Calibri"/>
+              <w:color w:val="000000"/>
+              <w:lang w:val="en-GB"/>
+            </w:rPr>
+            <w:t>doi</w:t>
+          </w:r>
+          <w:proofErr w:type="spellEnd"/>
+          <w:r>
+            <w:rPr>
+              <w:rFonts w:ascii="Calibri" w:eastAsia="Times New Roman" w:hAnsi="Calibri" w:cs="Calibri"/>
+              <w:color w:val="000000"/>
+              <w:lang w:val="en-GB"/>
+            </w:rPr>
+            <w:t>: 10.5772/intechopen.112854.</w:t>
           </w:r>
         </w:p>
         <w:p>
@@ -18609,7 +18868,7 @@
             <w:autoSpaceDE w:val="0"/>
             <w:autoSpaceDN w:val="0"/>
             <w:ind w:hanging="640"/>
-            <w:divId w:val="2060780326"/>
+            <w:divId w:val="810752221"/>
             <w:rPr>
               <w:rFonts w:ascii="Calibri" w:eastAsia="Times New Roman" w:hAnsi="Calibri" w:cs="Calibri"/>
               <w:color w:val="000000"/>
@@ -18631,7 +18890,25 @@
               <w:lang w:val="en-GB"/>
             </w:rPr>
             <w:tab/>
-            <w:t xml:space="preserve">S. Alqahtani, “In silico ADME-Tox modeling: progress and prospects,” </w:t>
+            <w:t xml:space="preserve">I. J. </w:t>
+          </w:r>
+          <w:proofErr w:type="spellStart"/>
+          <w:r>
+            <w:rPr>
+              <w:rFonts w:ascii="Calibri" w:eastAsia="Times New Roman" w:hAnsi="Calibri" w:cs="Calibri"/>
+              <w:color w:val="000000"/>
+              <w:lang w:val="en-GB"/>
+            </w:rPr>
+            <w:t>Onakpoya</w:t>
+          </w:r>
+          <w:proofErr w:type="spellEnd"/>
+          <w:r>
+            <w:rPr>
+              <w:rFonts w:ascii="Calibri" w:eastAsia="Times New Roman" w:hAnsi="Calibri" w:cs="Calibri"/>
+              <w:color w:val="000000"/>
+              <w:lang w:val="en-GB"/>
+            </w:rPr>
+            <w:t xml:space="preserve">, C. J. Heneghan, and J. K. Aronson, “Post-marketing withdrawal of 462 medicinal products because of adverse drug reactions: a systematic review of the world literature,” </w:t>
           </w:r>
           <w:r>
             <w:rPr>
@@ -18641,15 +18918,33 @@
               <w:color w:val="000000"/>
               <w:lang w:val="en-GB"/>
             </w:rPr>
-            <w:t>Expert Opin. Drug Metab. Toxicol.</w:t>
-          </w:r>
-          <w:r>
-            <w:rPr>
-              <w:rFonts w:ascii="Calibri" w:eastAsia="Times New Roman" w:hAnsi="Calibri" w:cs="Calibri"/>
-              <w:color w:val="000000"/>
-              <w:lang w:val="en-GB"/>
-            </w:rPr>
-            <w:t>, vol. 13, no. 11, pp. 1147–1158, Nov. 2017, doi: 10.1080/17425255.2017.1389897.</w:t>
+            <w:t>BMC Med.</w:t>
+          </w:r>
+          <w:r>
+            <w:rPr>
+              <w:rFonts w:ascii="Calibri" w:eastAsia="Times New Roman" w:hAnsi="Calibri" w:cs="Calibri"/>
+              <w:color w:val="000000"/>
+              <w:lang w:val="en-GB"/>
+            </w:rPr>
+            <w:t xml:space="preserve">, vol. 14, no. 1, p. 10, Dec. 2016, </w:t>
+          </w:r>
+          <w:proofErr w:type="spellStart"/>
+          <w:r>
+            <w:rPr>
+              <w:rFonts w:ascii="Calibri" w:eastAsia="Times New Roman" w:hAnsi="Calibri" w:cs="Calibri"/>
+              <w:color w:val="000000"/>
+              <w:lang w:val="en-GB"/>
+            </w:rPr>
+            <w:t>doi</w:t>
+          </w:r>
+          <w:proofErr w:type="spellEnd"/>
+          <w:r>
+            <w:rPr>
+              <w:rFonts w:ascii="Calibri" w:eastAsia="Times New Roman" w:hAnsi="Calibri" w:cs="Calibri"/>
+              <w:color w:val="000000"/>
+              <w:lang w:val="en-GB"/>
+            </w:rPr>
+            <w:t>: 10.1186/s12916-016-0553-2.</w:t>
           </w:r>
         </w:p>
         <w:p>
@@ -18657,7 +18952,7 @@
             <w:autoSpaceDE w:val="0"/>
             <w:autoSpaceDN w:val="0"/>
             <w:ind w:hanging="640"/>
-            <w:divId w:val="466556613"/>
+            <w:divId w:val="43410290"/>
             <w:rPr>
               <w:rFonts w:ascii="Calibri" w:eastAsia="Times New Roman" w:hAnsi="Calibri" w:cs="Calibri"/>
               <w:color w:val="000000"/>
@@ -18679,7 +18974,25 @@
               <w:lang w:val="en-GB"/>
             </w:rPr>
             <w:tab/>
-            <w:t xml:space="preserve">M. Öeren, P. A. Hunt, C. E. Wharrick, H. Tabatabaei Ghomi, and M. D. Segall, “Predicting routes of phase I and II metabolism based on quantum mechanics and machine learning,” </w:t>
+            <w:t xml:space="preserve">S. Alqahtani, “In silico ADME-Tox </w:t>
+          </w:r>
+          <w:proofErr w:type="spellStart"/>
+          <w:r>
+            <w:rPr>
+              <w:rFonts w:ascii="Calibri" w:eastAsia="Times New Roman" w:hAnsi="Calibri" w:cs="Calibri"/>
+              <w:color w:val="000000"/>
+              <w:lang w:val="en-GB"/>
+            </w:rPr>
+            <w:t>modeling</w:t>
+          </w:r>
+          <w:proofErr w:type="spellEnd"/>
+          <w:r>
+            <w:rPr>
+              <w:rFonts w:ascii="Calibri" w:eastAsia="Times New Roman" w:hAnsi="Calibri" w:cs="Calibri"/>
+              <w:color w:val="000000"/>
+              <w:lang w:val="en-GB"/>
+            </w:rPr>
+            <w:t xml:space="preserve">: progress and prospects,” </w:t>
           </w:r>
           <w:r>
             <w:rPr>
@@ -18689,15 +19002,99 @@
               <w:color w:val="000000"/>
               <w:lang w:val="en-GB"/>
             </w:rPr>
-            <w:t>Xenobiotica</w:t>
-          </w:r>
-          <w:r>
-            <w:rPr>
-              <w:rFonts w:ascii="Calibri" w:eastAsia="Times New Roman" w:hAnsi="Calibri" w:cs="Calibri"/>
-              <w:color w:val="000000"/>
-              <w:lang w:val="en-GB"/>
-            </w:rPr>
-            <w:t>, vol. 54, no. 7, pp. 379–393, Aug. 2024, doi: 10.1080/00498254.2023.2284251.</w:t>
+            <w:t xml:space="preserve">Expert </w:t>
+          </w:r>
+          <w:proofErr w:type="spellStart"/>
+          <w:r>
+            <w:rPr>
+              <w:rFonts w:ascii="Calibri" w:eastAsia="Times New Roman" w:hAnsi="Calibri" w:cs="Calibri"/>
+              <w:i/>
+              <w:iCs/>
+              <w:color w:val="000000"/>
+              <w:lang w:val="en-GB"/>
+            </w:rPr>
+            <w:t>Opin</w:t>
+          </w:r>
+          <w:proofErr w:type="spellEnd"/>
+          <w:r>
+            <w:rPr>
+              <w:rFonts w:ascii="Calibri" w:eastAsia="Times New Roman" w:hAnsi="Calibri" w:cs="Calibri"/>
+              <w:i/>
+              <w:iCs/>
+              <w:color w:val="000000"/>
+              <w:lang w:val="en-GB"/>
+            </w:rPr>
+            <w:t xml:space="preserve">. Drug </w:t>
+          </w:r>
+          <w:proofErr w:type="spellStart"/>
+          <w:r>
+            <w:rPr>
+              <w:rFonts w:ascii="Calibri" w:eastAsia="Times New Roman" w:hAnsi="Calibri" w:cs="Calibri"/>
+              <w:i/>
+              <w:iCs/>
+              <w:color w:val="000000"/>
+              <w:lang w:val="en-GB"/>
+            </w:rPr>
+            <w:t>Metab</w:t>
+          </w:r>
+          <w:proofErr w:type="spellEnd"/>
+          <w:r>
+            <w:rPr>
+              <w:rFonts w:ascii="Calibri" w:eastAsia="Times New Roman" w:hAnsi="Calibri" w:cs="Calibri"/>
+              <w:i/>
+              <w:iCs/>
+              <w:color w:val="000000"/>
+              <w:lang w:val="en-GB"/>
+            </w:rPr>
+            <w:t xml:space="preserve">. </w:t>
+          </w:r>
+          <w:proofErr w:type="spellStart"/>
+          <w:r>
+            <w:rPr>
+              <w:rFonts w:ascii="Calibri" w:eastAsia="Times New Roman" w:hAnsi="Calibri" w:cs="Calibri"/>
+              <w:i/>
+              <w:iCs/>
+              <w:color w:val="000000"/>
+              <w:lang w:val="en-GB"/>
+            </w:rPr>
+            <w:t>Toxicol</w:t>
+          </w:r>
+          <w:proofErr w:type="spellEnd"/>
+          <w:r>
+            <w:rPr>
+              <w:rFonts w:ascii="Calibri" w:eastAsia="Times New Roman" w:hAnsi="Calibri" w:cs="Calibri"/>
+              <w:i/>
+              <w:iCs/>
+              <w:color w:val="000000"/>
+              <w:lang w:val="en-GB"/>
+            </w:rPr>
+            <w:t>.</w:t>
+          </w:r>
+          <w:r>
+            <w:rPr>
+              <w:rFonts w:ascii="Calibri" w:eastAsia="Times New Roman" w:hAnsi="Calibri" w:cs="Calibri"/>
+              <w:color w:val="000000"/>
+              <w:lang w:val="en-GB"/>
+            </w:rPr>
+            <w:t xml:space="preserve">, vol. 13, no. 11, pp. 1147–1158, Nov. 2017, </w:t>
+          </w:r>
+          <w:proofErr w:type="spellStart"/>
+          <w:r>
+            <w:rPr>
+              <w:rFonts w:ascii="Calibri" w:eastAsia="Times New Roman" w:hAnsi="Calibri" w:cs="Calibri"/>
+              <w:color w:val="000000"/>
+              <w:lang w:val="en-GB"/>
+            </w:rPr>
+            <w:t>doi</w:t>
+          </w:r>
+          <w:proofErr w:type="spellEnd"/>
+          <w:r>
+            <w:rPr>
+              <w:rFonts w:ascii="Calibri" w:eastAsia="Times New Roman" w:hAnsi="Calibri" w:cs="Calibri"/>
+              <w:color w:val="000000"/>
+              <w:lang w:val="en-GB"/>
+            </w:rPr>
+            <w:t>: 10.1080/17425255.2017.1389897.</w:t>
           </w:r>
         </w:p>
         <w:p>
@@ -18705,7 +19102,7 @@
             <w:autoSpaceDE w:val="0"/>
             <w:autoSpaceDN w:val="0"/>
             <w:ind w:hanging="640"/>
-            <w:divId w:val="690254471"/>
+            <w:divId w:val="350645715"/>
             <w:rPr>
               <w:rFonts w:ascii="Calibri" w:eastAsia="Times New Roman" w:hAnsi="Calibri" w:cs="Calibri"/>
               <w:color w:val="000000"/>
@@ -18727,8 +19124,45 @@
               <w:lang w:val="en-GB"/>
             </w:rPr>
             <w:tab/>
-            <w:t xml:space="preserve">G. Cruciani </w:t>
-          </w:r>
+            <w:t xml:space="preserve">M. </w:t>
+          </w:r>
+          <w:proofErr w:type="spellStart"/>
+          <w:r>
+            <w:rPr>
+              <w:rFonts w:ascii="Calibri" w:eastAsia="Times New Roman" w:hAnsi="Calibri" w:cs="Calibri"/>
+              <w:color w:val="000000"/>
+              <w:lang w:val="en-GB"/>
+            </w:rPr>
+            <w:t>Öeren</w:t>
+          </w:r>
+          <w:proofErr w:type="spellEnd"/>
+          <w:r>
+            <w:rPr>
+              <w:rFonts w:ascii="Calibri" w:eastAsia="Times New Roman" w:hAnsi="Calibri" w:cs="Calibri"/>
+              <w:color w:val="000000"/>
+              <w:lang w:val="en-GB"/>
+            </w:rPr>
+            <w:t xml:space="preserve">, P. A. Hunt, C. E. </w:t>
+          </w:r>
+          <w:proofErr w:type="spellStart"/>
+          <w:r>
+            <w:rPr>
+              <w:rFonts w:ascii="Calibri" w:eastAsia="Times New Roman" w:hAnsi="Calibri" w:cs="Calibri"/>
+              <w:color w:val="000000"/>
+              <w:lang w:val="en-GB"/>
+            </w:rPr>
+            <w:t>Wharrick</w:t>
+          </w:r>
+          <w:proofErr w:type="spellEnd"/>
+          <w:r>
+            <w:rPr>
+              <w:rFonts w:ascii="Calibri" w:eastAsia="Times New Roman" w:hAnsi="Calibri" w:cs="Calibri"/>
+              <w:color w:val="000000"/>
+              <w:lang w:val="en-GB"/>
+            </w:rPr>
+            <w:t xml:space="preserve">, H. Tabatabaei Ghomi, and M. D. Segall, “Predicting routes of phase I and II metabolism based on quantum mechanics and machine learning,” </w:t>
+          </w:r>
+          <w:proofErr w:type="spellStart"/>
           <w:r>
             <w:rPr>
               <w:rFonts w:ascii="Calibri" w:eastAsia="Times New Roman" w:hAnsi="Calibri" w:cs="Calibri"/>
@@ -18737,15 +19171,34 @@
               <w:color w:val="000000"/>
               <w:lang w:val="en-GB"/>
             </w:rPr>
-            <w:t>et al.</w:t>
-          </w:r>
-          <w:r>
-            <w:rPr>
-              <w:rFonts w:ascii="Calibri" w:eastAsia="Times New Roman" w:hAnsi="Calibri" w:cs="Calibri"/>
-              <w:color w:val="000000"/>
-              <w:lang w:val="en-GB"/>
-            </w:rPr>
-            <w:t>, “Decoding phase I &amp; II human drug metabolism using the prediction tool MetaSite for chemists, medicinal chemists, and metID experts.”</w:t>
+            <w:t>Xenobiotica</w:t>
+          </w:r>
+          <w:proofErr w:type="spellEnd"/>
+          <w:r>
+            <w:rPr>
+              <w:rFonts w:ascii="Calibri" w:eastAsia="Times New Roman" w:hAnsi="Calibri" w:cs="Calibri"/>
+              <w:color w:val="000000"/>
+              <w:lang w:val="en-GB"/>
+            </w:rPr>
+            <w:t xml:space="preserve">, vol. 54, no. 7, pp. 379–393, Aug. 2024, </w:t>
+          </w:r>
+          <w:proofErr w:type="spellStart"/>
+          <w:r>
+            <w:rPr>
+              <w:rFonts w:ascii="Calibri" w:eastAsia="Times New Roman" w:hAnsi="Calibri" w:cs="Calibri"/>
+              <w:color w:val="000000"/>
+              <w:lang w:val="en-GB"/>
+            </w:rPr>
+            <w:t>doi</w:t>
+          </w:r>
+          <w:proofErr w:type="spellEnd"/>
+          <w:r>
+            <w:rPr>
+              <w:rFonts w:ascii="Calibri" w:eastAsia="Times New Roman" w:hAnsi="Calibri" w:cs="Calibri"/>
+              <w:color w:val="000000"/>
+              <w:lang w:val="en-GB"/>
+            </w:rPr>
+            <w:t>: 10.1080/00498254.2023.2284251.</w:t>
           </w:r>
         </w:p>
         <w:p>
@@ -18753,7 +19206,7 @@
             <w:autoSpaceDE w:val="0"/>
             <w:autoSpaceDN w:val="0"/>
             <w:ind w:hanging="640"/>
-            <w:divId w:val="2121753550"/>
+            <w:divId w:val="81873697"/>
             <w:rPr>
               <w:rFonts w:ascii="Calibri" w:eastAsia="Times New Roman" w:hAnsi="Calibri" w:cs="Calibri"/>
               <w:color w:val="000000"/>
@@ -18775,7 +19228,7 @@
               <w:lang w:val="en-GB"/>
             </w:rPr>
             <w:tab/>
-            <w:t xml:space="preserve">M. Holmer, C. de Bruyn Kops, C. Stork, and J. Kirchmair, “CYPstrate: A Set of Machine Learning Models for the Accurate Classification of Cytochrome P450 Enzyme Substrates and Non-Substrates,” </w:t>
+            <w:t xml:space="preserve">G. Cruciani </w:t>
           </w:r>
           <w:r>
             <w:rPr>
@@ -18785,15 +19238,51 @@
               <w:color w:val="000000"/>
               <w:lang w:val="en-GB"/>
             </w:rPr>
-            <w:t>Molecules</w:t>
-          </w:r>
-          <w:r>
-            <w:rPr>
-              <w:rFonts w:ascii="Calibri" w:eastAsia="Times New Roman" w:hAnsi="Calibri" w:cs="Calibri"/>
-              <w:color w:val="000000"/>
-              <w:lang w:val="en-GB"/>
-            </w:rPr>
-            <w:t>, vol. 26, no. 15, p. 4678, Aug. 2021, doi: 10.3390/molecules26154678.</w:t>
+            <w:t>et al.</w:t>
+          </w:r>
+          <w:r>
+            <w:rPr>
+              <w:rFonts w:ascii="Calibri" w:eastAsia="Times New Roman" w:hAnsi="Calibri" w:cs="Calibri"/>
+              <w:color w:val="000000"/>
+              <w:lang w:val="en-GB"/>
+            </w:rPr>
+            <w:t xml:space="preserve">, “Decoding phase I &amp; II human drug metabolism using the prediction tool </w:t>
+          </w:r>
+          <w:proofErr w:type="spellStart"/>
+          <w:r>
+            <w:rPr>
+              <w:rFonts w:ascii="Calibri" w:eastAsia="Times New Roman" w:hAnsi="Calibri" w:cs="Calibri"/>
+              <w:color w:val="000000"/>
+              <w:lang w:val="en-GB"/>
+            </w:rPr>
+            <w:t>MetaSite</w:t>
+          </w:r>
+          <w:proofErr w:type="spellEnd"/>
+          <w:r>
+            <w:rPr>
+              <w:rFonts w:ascii="Calibri" w:eastAsia="Times New Roman" w:hAnsi="Calibri" w:cs="Calibri"/>
+              <w:color w:val="000000"/>
+              <w:lang w:val="en-GB"/>
+            </w:rPr>
+            <w:t xml:space="preserve"> for chemists, medicinal chemists, and </w:t>
+          </w:r>
+          <w:proofErr w:type="spellStart"/>
+          <w:r>
+            <w:rPr>
+              <w:rFonts w:ascii="Calibri" w:eastAsia="Times New Roman" w:hAnsi="Calibri" w:cs="Calibri"/>
+              <w:color w:val="000000"/>
+              <w:lang w:val="en-GB"/>
+            </w:rPr>
+            <w:t>metID</w:t>
+          </w:r>
+          <w:proofErr w:type="spellEnd"/>
+          <w:r>
+            <w:rPr>
+              <w:rFonts w:ascii="Calibri" w:eastAsia="Times New Roman" w:hAnsi="Calibri" w:cs="Calibri"/>
+              <w:color w:val="000000"/>
+              <w:lang w:val="en-GB"/>
+            </w:rPr>
+            <w:t xml:space="preserve"> experts.”</w:t>
           </w:r>
         </w:p>
         <w:p>
@@ -18801,7 +19290,7 @@
             <w:autoSpaceDE w:val="0"/>
             <w:autoSpaceDN w:val="0"/>
             <w:ind w:hanging="640"/>
-            <w:divId w:val="1325356565"/>
+            <w:divId w:val="420420394"/>
             <w:rPr>
               <w:rFonts w:ascii="Calibri" w:eastAsia="Times New Roman" w:hAnsi="Calibri" w:cs="Calibri"/>
               <w:color w:val="000000"/>
@@ -18823,7 +19312,43 @@
               <w:lang w:val="en-GB"/>
             </w:rPr>
             <w:tab/>
-            <w:t xml:space="preserve">S. Tian, Y. Djoumbou-Feunang, R. Greiner, and D. S. Wishart, “CypReact: A Software Tool for in Silico Reactant Prediction for Human Cytochrome P450 Enzymes,” </w:t>
+            <w:t xml:space="preserve">M. Holmer, C. de Bruyn Kops, C. Stork, and J. </w:t>
+          </w:r>
+          <w:proofErr w:type="spellStart"/>
+          <w:r>
+            <w:rPr>
+              <w:rFonts w:ascii="Calibri" w:eastAsia="Times New Roman" w:hAnsi="Calibri" w:cs="Calibri"/>
+              <w:color w:val="000000"/>
+              <w:lang w:val="en-GB"/>
+            </w:rPr>
+            <w:t>Kirchmair</w:t>
+          </w:r>
+          <w:proofErr w:type="spellEnd"/>
+          <w:r>
+            <w:rPr>
+              <w:rFonts w:ascii="Calibri" w:eastAsia="Times New Roman" w:hAnsi="Calibri" w:cs="Calibri"/>
+              <w:color w:val="000000"/>
+              <w:lang w:val="en-GB"/>
+            </w:rPr>
+            <w:t>, “</w:t>
+          </w:r>
+          <w:proofErr w:type="spellStart"/>
+          <w:r>
+            <w:rPr>
+              <w:rFonts w:ascii="Calibri" w:eastAsia="Times New Roman" w:hAnsi="Calibri" w:cs="Calibri"/>
+              <w:color w:val="000000"/>
+              <w:lang w:val="en-GB"/>
+            </w:rPr>
+            <w:t>CYPstrate</w:t>
+          </w:r>
+          <w:proofErr w:type="spellEnd"/>
+          <w:r>
+            <w:rPr>
+              <w:rFonts w:ascii="Calibri" w:eastAsia="Times New Roman" w:hAnsi="Calibri" w:cs="Calibri"/>
+              <w:color w:val="000000"/>
+              <w:lang w:val="en-GB"/>
+            </w:rPr>
+            <w:t xml:space="preserve">: A Set of Machine Learning Models for the Accurate Classification of Cytochrome P450 Enzyme Substrates and Non-Substrates,” </w:t>
           </w:r>
           <w:r>
             <w:rPr>
@@ -18833,15 +19358,33 @@
               <w:color w:val="000000"/>
               <w:lang w:val="en-GB"/>
             </w:rPr>
-            <w:t>J. Chem. Inf. Model.</w:t>
-          </w:r>
-          <w:r>
-            <w:rPr>
-              <w:rFonts w:ascii="Calibri" w:eastAsia="Times New Roman" w:hAnsi="Calibri" w:cs="Calibri"/>
-              <w:color w:val="000000"/>
-              <w:lang w:val="en-GB"/>
-            </w:rPr>
-            <w:t>, vol. 58, no. 6, pp. 1282–1291, 2018, doi: 10.1021/acs.jcim.8b00035.</w:t>
+            <w:t>Molecules</w:t>
+          </w:r>
+          <w:r>
+            <w:rPr>
+              <w:rFonts w:ascii="Calibri" w:eastAsia="Times New Roman" w:hAnsi="Calibri" w:cs="Calibri"/>
+              <w:color w:val="000000"/>
+              <w:lang w:val="en-GB"/>
+            </w:rPr>
+            <w:t xml:space="preserve">, vol. 26, no. 15, p. 4678, Aug. 2021, </w:t>
+          </w:r>
+          <w:proofErr w:type="spellStart"/>
+          <w:r>
+            <w:rPr>
+              <w:rFonts w:ascii="Calibri" w:eastAsia="Times New Roman" w:hAnsi="Calibri" w:cs="Calibri"/>
+              <w:color w:val="000000"/>
+              <w:lang w:val="en-GB"/>
+            </w:rPr>
+            <w:t>doi</w:t>
+          </w:r>
+          <w:proofErr w:type="spellEnd"/>
+          <w:r>
+            <w:rPr>
+              <w:rFonts w:ascii="Calibri" w:eastAsia="Times New Roman" w:hAnsi="Calibri" w:cs="Calibri"/>
+              <w:color w:val="000000"/>
+              <w:lang w:val="en-GB"/>
+            </w:rPr>
+            <w:t>: 10.3390/molecules26154678.</w:t>
           </w:r>
         </w:p>
         <w:p>
@@ -18849,7 +19392,7 @@
             <w:autoSpaceDE w:val="0"/>
             <w:autoSpaceDN w:val="0"/>
             <w:ind w:hanging="640"/>
-            <w:divId w:val="13043106"/>
+            <w:divId w:val="1044521620"/>
             <w:rPr>
               <w:rFonts w:ascii="Calibri" w:eastAsia="Times New Roman" w:hAnsi="Calibri" w:cs="Calibri"/>
               <w:color w:val="000000"/>
@@ -18871,7 +19414,43 @@
               <w:lang w:val="en-GB"/>
             </w:rPr>
             <w:tab/>
-            <w:t xml:space="preserve">J. Chang, X. Fan, and B. Tian, “DeepP450: Predicting Human P450 Activities of Small Molecules by Integrating Pretrained Protein Language Model and Molecular Representation,” </w:t>
+            <w:t xml:space="preserve">S. Tian, Y. </w:t>
+          </w:r>
+          <w:proofErr w:type="spellStart"/>
+          <w:r>
+            <w:rPr>
+              <w:rFonts w:ascii="Calibri" w:eastAsia="Times New Roman" w:hAnsi="Calibri" w:cs="Calibri"/>
+              <w:color w:val="000000"/>
+              <w:lang w:val="en-GB"/>
+            </w:rPr>
+            <w:t>Djoumbou-Feunang</w:t>
+          </w:r>
+          <w:proofErr w:type="spellEnd"/>
+          <w:r>
+            <w:rPr>
+              <w:rFonts w:ascii="Calibri" w:eastAsia="Times New Roman" w:hAnsi="Calibri" w:cs="Calibri"/>
+              <w:color w:val="000000"/>
+              <w:lang w:val="en-GB"/>
+            </w:rPr>
+            <w:t>, R. Greiner, and D. S. Wishart, “</w:t>
+          </w:r>
+          <w:proofErr w:type="spellStart"/>
+          <w:r>
+            <w:rPr>
+              <w:rFonts w:ascii="Calibri" w:eastAsia="Times New Roman" w:hAnsi="Calibri" w:cs="Calibri"/>
+              <w:color w:val="000000"/>
+              <w:lang w:val="en-GB"/>
+            </w:rPr>
+            <w:t>CypReact</w:t>
+          </w:r>
+          <w:proofErr w:type="spellEnd"/>
+          <w:r>
+            <w:rPr>
+              <w:rFonts w:ascii="Calibri" w:eastAsia="Times New Roman" w:hAnsi="Calibri" w:cs="Calibri"/>
+              <w:color w:val="000000"/>
+              <w:lang w:val="en-GB"/>
+            </w:rPr>
+            <w:t xml:space="preserve">: A Software Tool for in Silico Reactant Prediction for Human Cytochrome P450 Enzymes,” </w:t>
           </w:r>
           <w:r>
             <w:rPr>
@@ -18889,7 +19468,25 @@
               <w:color w:val="000000"/>
               <w:lang w:val="en-GB"/>
             </w:rPr>
-            <w:t>, vol. 64, no. 8, pp. 3149–3160, 2024, doi: 10.1021/acs.jcim.4c00115.</w:t>
+            <w:t xml:space="preserve">, vol. 58, no. 6, pp. 1282–1291, 2018, </w:t>
+          </w:r>
+          <w:proofErr w:type="spellStart"/>
+          <w:r>
+            <w:rPr>
+              <w:rFonts w:ascii="Calibri" w:eastAsia="Times New Roman" w:hAnsi="Calibri" w:cs="Calibri"/>
+              <w:color w:val="000000"/>
+              <w:lang w:val="en-GB"/>
+            </w:rPr>
+            <w:t>doi</w:t>
+          </w:r>
+          <w:proofErr w:type="spellEnd"/>
+          <w:r>
+            <w:rPr>
+              <w:rFonts w:ascii="Calibri" w:eastAsia="Times New Roman" w:hAnsi="Calibri" w:cs="Calibri"/>
+              <w:color w:val="000000"/>
+              <w:lang w:val="en-GB"/>
+            </w:rPr>
+            <w:t>: 10.1021/acs.jcim.8b00035.</w:t>
           </w:r>
         </w:p>
         <w:p>
@@ -18897,11 +19494,10 @@
             <w:autoSpaceDE w:val="0"/>
             <w:autoSpaceDN w:val="0"/>
             <w:ind w:hanging="640"/>
-            <w:divId w:val="1553038870"/>
-            <w:rPr>
-              <w:rFonts w:ascii="Calibri" w:eastAsia="Times New Roman" w:hAnsi="Calibri" w:cs="Calibri"/>
-              <w:color w:val="000000"/>
-              <w:lang w:val="en-GB"/>
+            <w:divId w:val="477693254"/>
+            <w:rPr>
+              <w:rFonts w:ascii="Calibri" w:eastAsia="Times New Roman" w:hAnsi="Calibri" w:cs="Calibri"/>
+              <w:color w:val="000000"/>
             </w:rPr>
           </w:pPr>
           <w:r>
@@ -18919,7 +19515,7 @@
               <w:lang w:val="en-GB"/>
             </w:rPr>
             <w:tab/>
-            <w:t xml:space="preserve">L. Fu </w:t>
+            <w:t xml:space="preserve">J. Chang, X. Fan, and B. Tian, “DeepP450: Predicting Human P450 Activities of Small Molecules by Integrating Pretrained Protein Language Model and Molecular Representation,” </w:t>
           </w:r>
           <w:r>
             <w:rPr>
@@ -18929,15 +19525,7 @@
               <w:color w:val="000000"/>
               <w:lang w:val="en-GB"/>
             </w:rPr>
-            <w:t>et al.</w:t>
-          </w:r>
-          <w:r>
-            <w:rPr>
-              <w:rFonts w:ascii="Calibri" w:eastAsia="Times New Roman" w:hAnsi="Calibri" w:cs="Calibri"/>
-              <w:color w:val="000000"/>
-              <w:lang w:val="en-GB"/>
-            </w:rPr>
-            <w:t xml:space="preserve">, “ADMETlab 3.0: an updated comprehensive online ADMET prediction platform enhanced with broader coverage, improved performance, API functionality and decision support,” </w:t>
+            <w:t xml:space="preserve">J. Chem. Inf. </w:t>
           </w:r>
           <w:r>
             <w:rPr>
@@ -18945,17 +19533,31 @@
               <w:i/>
               <w:iCs/>
               <w:color w:val="000000"/>
-              <w:lang w:val="en-GB"/>
-            </w:rPr>
-            <w:t>Nucleic Acids Res.</w:t>
-          </w:r>
-          <w:r>
-            <w:rPr>
-              <w:rFonts w:ascii="Calibri" w:eastAsia="Times New Roman" w:hAnsi="Calibri" w:cs="Calibri"/>
-              <w:color w:val="000000"/>
-              <w:lang w:val="en-GB"/>
-            </w:rPr>
-            <w:t>, vol. 52, no. W1, pp. W422–W431, Jul. 2024, doi: 10.1093/nar/gkae236.</w:t>
+            </w:rPr>
+            <w:t>Model.</w:t>
+          </w:r>
+          <w:r>
+            <w:rPr>
+              <w:rFonts w:ascii="Calibri" w:eastAsia="Times New Roman" w:hAnsi="Calibri" w:cs="Calibri"/>
+              <w:color w:val="000000"/>
+            </w:rPr>
+            <w:t xml:space="preserve">, vol. 64, no. 8, pp. 3149–3160, 2024, </w:t>
+          </w:r>
+          <w:proofErr w:type="spellStart"/>
+          <w:r>
+            <w:rPr>
+              <w:rFonts w:ascii="Calibri" w:eastAsia="Times New Roman" w:hAnsi="Calibri" w:cs="Calibri"/>
+              <w:color w:val="000000"/>
+            </w:rPr>
+            <w:t>doi</w:t>
+          </w:r>
+          <w:proofErr w:type="spellEnd"/>
+          <w:r>
+            <w:rPr>
+              <w:rFonts w:ascii="Calibri" w:eastAsia="Times New Roman" w:hAnsi="Calibri" w:cs="Calibri"/>
+              <w:color w:val="000000"/>
+            </w:rPr>
+            <w:t>: 10.1021/acs.jcim.4c00115.</w:t>
           </w:r>
         </w:p>
         <w:p>
@@ -18963,7 +19565,7 @@
             <w:autoSpaceDE w:val="0"/>
             <w:autoSpaceDN w:val="0"/>
             <w:ind w:hanging="640"/>
-            <w:divId w:val="1744138710"/>
+            <w:divId w:val="1475871208"/>
             <w:rPr>
               <w:rFonts w:ascii="Calibri" w:eastAsia="Times New Roman" w:hAnsi="Calibri" w:cs="Calibri"/>
               <w:color w:val="000000"/>
@@ -18986,7 +19588,7 @@
               <w:lang w:val="en-GB"/>
             </w:rPr>
             <w:tab/>
-            <w:t xml:space="preserve">H. L. Morgan, “The Generation of a Unique Machine Description for Chemical Structures-A Technique Developed at Chemical Abstracts Service.,” </w:t>
+            <w:t xml:space="preserve">L. Fu </w:t>
           </w:r>
           <w:r>
             <w:rPr>
@@ -18996,15 +19598,87 @@
               <w:color w:val="000000"/>
               <w:lang w:val="en-GB"/>
             </w:rPr>
-            <w:t>J. Chem. Doc.</w:t>
-          </w:r>
-          <w:r>
-            <w:rPr>
-              <w:rFonts w:ascii="Calibri" w:eastAsia="Times New Roman" w:hAnsi="Calibri" w:cs="Calibri"/>
-              <w:color w:val="000000"/>
-              <w:lang w:val="en-GB"/>
-            </w:rPr>
-            <w:t>, vol. 5, no. 2, pp. 107–113, May 1965, doi: 10.1021/c160017a018.</w:t>
+            <w:t>et al.</w:t>
+          </w:r>
+          <w:r>
+            <w:rPr>
+              <w:rFonts w:ascii="Calibri" w:eastAsia="Times New Roman" w:hAnsi="Calibri" w:cs="Calibri"/>
+              <w:color w:val="000000"/>
+              <w:lang w:val="en-GB"/>
+            </w:rPr>
+            <w:t>, “</w:t>
+          </w:r>
+          <w:proofErr w:type="spellStart"/>
+          <w:r>
+            <w:rPr>
+              <w:rFonts w:ascii="Calibri" w:eastAsia="Times New Roman" w:hAnsi="Calibri" w:cs="Calibri"/>
+              <w:color w:val="000000"/>
+              <w:lang w:val="en-GB"/>
+            </w:rPr>
+            <w:t>ADMETlab</w:t>
+          </w:r>
+          <w:proofErr w:type="spellEnd"/>
+          <w:r>
+            <w:rPr>
+              <w:rFonts w:ascii="Calibri" w:eastAsia="Times New Roman" w:hAnsi="Calibri" w:cs="Calibri"/>
+              <w:color w:val="000000"/>
+              <w:lang w:val="en-GB"/>
+            </w:rPr>
+            <w:t xml:space="preserve"> 3.0: an updated comprehensive online ADMET prediction platform enhanced with broader coverage, improved performance, API functionality and decision support,” </w:t>
+          </w:r>
+          <w:r>
+            <w:rPr>
+              <w:rFonts w:ascii="Calibri" w:eastAsia="Times New Roman" w:hAnsi="Calibri" w:cs="Calibri"/>
+              <w:i/>
+              <w:iCs/>
+              <w:color w:val="000000"/>
+              <w:lang w:val="en-GB"/>
+            </w:rPr>
+            <w:t>Nucleic Acids Res.</w:t>
+          </w:r>
+          <w:r>
+            <w:rPr>
+              <w:rFonts w:ascii="Calibri" w:eastAsia="Times New Roman" w:hAnsi="Calibri" w:cs="Calibri"/>
+              <w:color w:val="000000"/>
+              <w:lang w:val="en-GB"/>
+            </w:rPr>
+            <w:t xml:space="preserve">, vol. 52, no. W1, pp. W422–W431, Jul. 2024, </w:t>
+          </w:r>
+          <w:proofErr w:type="spellStart"/>
+          <w:r>
+            <w:rPr>
+              <w:rFonts w:ascii="Calibri" w:eastAsia="Times New Roman" w:hAnsi="Calibri" w:cs="Calibri"/>
+              <w:color w:val="000000"/>
+              <w:lang w:val="en-GB"/>
+            </w:rPr>
+            <w:t>doi</w:t>
+          </w:r>
+          <w:proofErr w:type="spellEnd"/>
+          <w:r>
+            <w:rPr>
+              <w:rFonts w:ascii="Calibri" w:eastAsia="Times New Roman" w:hAnsi="Calibri" w:cs="Calibri"/>
+              <w:color w:val="000000"/>
+              <w:lang w:val="en-GB"/>
+            </w:rPr>
+            <w:t>: 10.1093/</w:t>
+          </w:r>
+          <w:proofErr w:type="spellStart"/>
+          <w:r>
+            <w:rPr>
+              <w:rFonts w:ascii="Calibri" w:eastAsia="Times New Roman" w:hAnsi="Calibri" w:cs="Calibri"/>
+              <w:color w:val="000000"/>
+              <w:lang w:val="en-GB"/>
+            </w:rPr>
+            <w:t>nar</w:t>
+          </w:r>
+          <w:proofErr w:type="spellEnd"/>
+          <w:r>
+            <w:rPr>
+              <w:rFonts w:ascii="Calibri" w:eastAsia="Times New Roman" w:hAnsi="Calibri" w:cs="Calibri"/>
+              <w:color w:val="000000"/>
+              <w:lang w:val="en-GB"/>
+            </w:rPr>
+            <w:t>/gkae236.</w:t>
           </w:r>
         </w:p>
         <w:p>
@@ -19012,7 +19686,7 @@
             <w:autoSpaceDE w:val="0"/>
             <w:autoSpaceDN w:val="0"/>
             <w:ind w:hanging="640"/>
-            <w:divId w:val="1500001717"/>
+            <w:divId w:val="633802656"/>
             <w:rPr>
               <w:rFonts w:ascii="Calibri" w:eastAsia="Times New Roman" w:hAnsi="Calibri" w:cs="Calibri"/>
               <w:color w:val="000000"/>
@@ -19034,7 +19708,7 @@
               <w:lang w:val="en-GB"/>
             </w:rPr>
             <w:tab/>
-            <w:t xml:space="preserve">S. Jaeger, S. Fulle, and S. Turk, “Mol2vec: Unsupervised Machine Learning Approach with Chemical Intuition,” </w:t>
+            <w:t xml:space="preserve">H. L. Morgan, “The Generation of a Unique Machine Description for Chemical Structures-A Technique Developed at Chemical Abstracts Service.,” </w:t>
           </w:r>
           <w:r>
             <w:rPr>
@@ -19044,15 +19718,33 @@
               <w:color w:val="000000"/>
               <w:lang w:val="en-GB"/>
             </w:rPr>
-            <w:t>J. Chem. Inf. Model.</w:t>
-          </w:r>
-          <w:r>
-            <w:rPr>
-              <w:rFonts w:ascii="Calibri" w:eastAsia="Times New Roman" w:hAnsi="Calibri" w:cs="Calibri"/>
-              <w:color w:val="000000"/>
-              <w:lang w:val="en-GB"/>
-            </w:rPr>
-            <w:t>, vol. 58, no. 1, pp. 27–35, Jan. 2018, doi: 10.1021/acs.jcim.7b00616.</w:t>
+            <w:t>J. Chem. Doc.</w:t>
+          </w:r>
+          <w:r>
+            <w:rPr>
+              <w:rFonts w:ascii="Calibri" w:eastAsia="Times New Roman" w:hAnsi="Calibri" w:cs="Calibri"/>
+              <w:color w:val="000000"/>
+              <w:lang w:val="en-GB"/>
+            </w:rPr>
+            <w:t xml:space="preserve">, vol. 5, no. 2, pp. 107–113, May 1965, </w:t>
+          </w:r>
+          <w:proofErr w:type="spellStart"/>
+          <w:r>
+            <w:rPr>
+              <w:rFonts w:ascii="Calibri" w:eastAsia="Times New Roman" w:hAnsi="Calibri" w:cs="Calibri"/>
+              <w:color w:val="000000"/>
+              <w:lang w:val="en-GB"/>
+            </w:rPr>
+            <w:t>doi</w:t>
+          </w:r>
+          <w:proofErr w:type="spellEnd"/>
+          <w:r>
+            <w:rPr>
+              <w:rFonts w:ascii="Calibri" w:eastAsia="Times New Roman" w:hAnsi="Calibri" w:cs="Calibri"/>
+              <w:color w:val="000000"/>
+              <w:lang w:val="en-GB"/>
+            </w:rPr>
+            <w:t>: 10.1021/c160017a018.</w:t>
           </w:r>
         </w:p>
         <w:p>
@@ -19060,7 +19752,7 @@
             <w:autoSpaceDE w:val="0"/>
             <w:autoSpaceDN w:val="0"/>
             <w:ind w:hanging="640"/>
-            <w:divId w:val="675957327"/>
+            <w:divId w:val="367951235"/>
             <w:rPr>
               <w:rFonts w:ascii="Calibri" w:eastAsia="Times New Roman" w:hAnsi="Calibri" w:cs="Calibri"/>
               <w:color w:val="000000"/>
@@ -19082,7 +19774,7 @@
               <w:lang w:val="en-GB"/>
             </w:rPr>
             <w:tab/>
-            <w:t xml:space="preserve">S. Chithrananda, G. Grand, and B. Ramsundar, “ChemBERTa: Large-Scale Self-Supervised Pretraining for Molecular Property Prediction,” </w:t>
+            <w:t xml:space="preserve">S. Jaeger, S. Fulle, and S. Turk, “Mol2vec: Unsupervised Machine Learning Approach with Chemical Intuition,” </w:t>
           </w:r>
           <w:r>
             <w:rPr>
@@ -19092,15 +19784,33 @@
               <w:color w:val="000000"/>
               <w:lang w:val="en-GB"/>
             </w:rPr>
-            <w:t>arXiv e-prints</w:t>
-          </w:r>
-          <w:r>
-            <w:rPr>
-              <w:rFonts w:ascii="Calibri" w:eastAsia="Times New Roman" w:hAnsi="Calibri" w:cs="Calibri"/>
-              <w:color w:val="000000"/>
-              <w:lang w:val="en-GB"/>
-            </w:rPr>
-            <w:t>, p. arXiv:2010.09885, Oct. 2020, doi: 10.48550/arXiv.2010.09885.</w:t>
+            <w:t>J. Chem. Inf. Model.</w:t>
+          </w:r>
+          <w:r>
+            <w:rPr>
+              <w:rFonts w:ascii="Calibri" w:eastAsia="Times New Roman" w:hAnsi="Calibri" w:cs="Calibri"/>
+              <w:color w:val="000000"/>
+              <w:lang w:val="en-GB"/>
+            </w:rPr>
+            <w:t xml:space="preserve">, vol. 58, no. 1, pp. 27–35, Jan. 2018, </w:t>
+          </w:r>
+          <w:proofErr w:type="spellStart"/>
+          <w:r>
+            <w:rPr>
+              <w:rFonts w:ascii="Calibri" w:eastAsia="Times New Roman" w:hAnsi="Calibri" w:cs="Calibri"/>
+              <w:color w:val="000000"/>
+              <w:lang w:val="en-GB"/>
+            </w:rPr>
+            <w:t>doi</w:t>
+          </w:r>
+          <w:proofErr w:type="spellEnd"/>
+          <w:r>
+            <w:rPr>
+              <w:rFonts w:ascii="Calibri" w:eastAsia="Times New Roman" w:hAnsi="Calibri" w:cs="Calibri"/>
+              <w:color w:val="000000"/>
+              <w:lang w:val="en-GB"/>
+            </w:rPr>
+            <w:t>: 10.1021/acs.jcim.7b00616.</w:t>
           </w:r>
         </w:p>
         <w:p>
@@ -19108,7 +19818,7 @@
             <w:autoSpaceDE w:val="0"/>
             <w:autoSpaceDN w:val="0"/>
             <w:ind w:hanging="640"/>
-            <w:divId w:val="544411845"/>
+            <w:divId w:val="999043125"/>
             <w:rPr>
               <w:rFonts w:ascii="Calibri" w:eastAsia="Times New Roman" w:hAnsi="Calibri" w:cs="Calibri"/>
               <w:color w:val="000000"/>
@@ -19130,8 +19840,45 @@
               <w:lang w:val="en-GB"/>
             </w:rPr>
             <w:tab/>
-            <w:t xml:space="preserve">T. Li and Y. Pei, “MOLE: Modular Learning FramEwork via Mutual Information Maximization,” </w:t>
-          </w:r>
+            <w:t xml:space="preserve">S. </w:t>
+          </w:r>
+          <w:proofErr w:type="spellStart"/>
+          <w:r>
+            <w:rPr>
+              <w:rFonts w:ascii="Calibri" w:eastAsia="Times New Roman" w:hAnsi="Calibri" w:cs="Calibri"/>
+              <w:color w:val="000000"/>
+              <w:lang w:val="en-GB"/>
+            </w:rPr>
+            <w:t>Chithrananda</w:t>
+          </w:r>
+          <w:proofErr w:type="spellEnd"/>
+          <w:r>
+            <w:rPr>
+              <w:rFonts w:ascii="Calibri" w:eastAsia="Times New Roman" w:hAnsi="Calibri" w:cs="Calibri"/>
+              <w:color w:val="000000"/>
+              <w:lang w:val="en-GB"/>
+            </w:rPr>
+            <w:t>, G. Grand, and B. Ramsundar, “</w:t>
+          </w:r>
+          <w:proofErr w:type="spellStart"/>
+          <w:r>
+            <w:rPr>
+              <w:rFonts w:ascii="Calibri" w:eastAsia="Times New Roman" w:hAnsi="Calibri" w:cs="Calibri"/>
+              <w:color w:val="000000"/>
+              <w:lang w:val="en-GB"/>
+            </w:rPr>
+            <w:t>ChemBERTa</w:t>
+          </w:r>
+          <w:proofErr w:type="spellEnd"/>
+          <w:r>
+            <w:rPr>
+              <w:rFonts w:ascii="Calibri" w:eastAsia="Times New Roman" w:hAnsi="Calibri" w:cs="Calibri"/>
+              <w:color w:val="000000"/>
+              <w:lang w:val="en-GB"/>
+            </w:rPr>
+            <w:t xml:space="preserve">: Large-Scale Self-Supervised Pretraining for Molecular Property Prediction,” </w:t>
+          </w:r>
+          <w:proofErr w:type="spellStart"/>
           <w:r>
             <w:rPr>
               <w:rFonts w:ascii="Calibri" w:eastAsia="Times New Roman" w:hAnsi="Calibri" w:cs="Calibri"/>
@@ -19140,15 +19887,44 @@
               <w:color w:val="000000"/>
               <w:lang w:val="en-GB"/>
             </w:rPr>
-            <w:t>ArXiv</w:t>
-          </w:r>
-          <w:r>
-            <w:rPr>
-              <w:rFonts w:ascii="Calibri" w:eastAsia="Times New Roman" w:hAnsi="Calibri" w:cs="Calibri"/>
-              <w:color w:val="000000"/>
-              <w:lang w:val="en-GB"/>
-            </w:rPr>
-            <w:t>, vol. abs/2308.07772, 2023, [Online]. Available: https://api.semanticscholar.org/CorpusID:260899882</w:t>
+            <w:t>arXiv</w:t>
+          </w:r>
+          <w:proofErr w:type="spellEnd"/>
+          <w:r>
+            <w:rPr>
+              <w:rFonts w:ascii="Calibri" w:eastAsia="Times New Roman" w:hAnsi="Calibri" w:cs="Calibri"/>
+              <w:i/>
+              <w:iCs/>
+              <w:color w:val="000000"/>
+              <w:lang w:val="en-GB"/>
+            </w:rPr>
+            <w:t xml:space="preserve"> e-prints</w:t>
+          </w:r>
+          <w:r>
+            <w:rPr>
+              <w:rFonts w:ascii="Calibri" w:eastAsia="Times New Roman" w:hAnsi="Calibri" w:cs="Calibri"/>
+              <w:color w:val="000000"/>
+              <w:lang w:val="en-GB"/>
+            </w:rPr>
+            <w:t xml:space="preserve">, p. arXiv:2010.09885, Oct. 2020, </w:t>
+          </w:r>
+          <w:proofErr w:type="spellStart"/>
+          <w:r>
+            <w:rPr>
+              <w:rFonts w:ascii="Calibri" w:eastAsia="Times New Roman" w:hAnsi="Calibri" w:cs="Calibri"/>
+              <w:color w:val="000000"/>
+              <w:lang w:val="en-GB"/>
+            </w:rPr>
+            <w:t>doi</w:t>
+          </w:r>
+          <w:proofErr w:type="spellEnd"/>
+          <w:r>
+            <w:rPr>
+              <w:rFonts w:ascii="Calibri" w:eastAsia="Times New Roman" w:hAnsi="Calibri" w:cs="Calibri"/>
+              <w:color w:val="000000"/>
+              <w:lang w:val="en-GB"/>
+            </w:rPr>
+            <w:t>: 10.48550/arXiv.2010.09885.</w:t>
           </w:r>
         </w:p>
         <w:p>
@@ -19156,7 +19932,7 @@
             <w:autoSpaceDE w:val="0"/>
             <w:autoSpaceDN w:val="0"/>
             <w:ind w:hanging="640"/>
-            <w:divId w:val="1907180514"/>
+            <w:divId w:val="559093257"/>
             <w:rPr>
               <w:rFonts w:ascii="Calibri" w:eastAsia="Times New Roman" w:hAnsi="Calibri" w:cs="Calibri"/>
               <w:color w:val="000000"/>
@@ -19178,7 +19954,45 @@
               <w:lang w:val="en-GB"/>
             </w:rPr>
             <w:tab/>
-            <w:t>“RDKit: Open-source cheminformatics.,” https://www.rdkit.org.</w:t>
+            <w:t xml:space="preserve">T. Li and Y. Pei, “MOLE: Modular Learning </w:t>
+          </w:r>
+          <w:proofErr w:type="spellStart"/>
+          <w:r>
+            <w:rPr>
+              <w:rFonts w:ascii="Calibri" w:eastAsia="Times New Roman" w:hAnsi="Calibri" w:cs="Calibri"/>
+              <w:color w:val="000000"/>
+              <w:lang w:val="en-GB"/>
+            </w:rPr>
+            <w:t>FramEwork</w:t>
+          </w:r>
+          <w:proofErr w:type="spellEnd"/>
+          <w:r>
+            <w:rPr>
+              <w:rFonts w:ascii="Calibri" w:eastAsia="Times New Roman" w:hAnsi="Calibri" w:cs="Calibri"/>
+              <w:color w:val="000000"/>
+              <w:lang w:val="en-GB"/>
+            </w:rPr>
+            <w:t xml:space="preserve"> via Mutual Information Maximization,” </w:t>
+          </w:r>
+          <w:proofErr w:type="spellStart"/>
+          <w:r>
+            <w:rPr>
+              <w:rFonts w:ascii="Calibri" w:eastAsia="Times New Roman" w:hAnsi="Calibri" w:cs="Calibri"/>
+              <w:i/>
+              <w:iCs/>
+              <w:color w:val="000000"/>
+              <w:lang w:val="en-GB"/>
+            </w:rPr>
+            <w:t>ArXiv</w:t>
+          </w:r>
+          <w:proofErr w:type="spellEnd"/>
+          <w:r>
+            <w:rPr>
+              <w:rFonts w:ascii="Calibri" w:eastAsia="Times New Roman" w:hAnsi="Calibri" w:cs="Calibri"/>
+              <w:color w:val="000000"/>
+              <w:lang w:val="en-GB"/>
+            </w:rPr>
+            <w:t>, vol. abs/2308.07772, 2023, [Online]. Available: https://api.semanticscholar.org/CorpusID:260899882</w:t>
           </w:r>
         </w:p>
         <w:p>
@@ -19186,7 +20000,7 @@
             <w:autoSpaceDE w:val="0"/>
             <w:autoSpaceDN w:val="0"/>
             <w:ind w:hanging="640"/>
-            <w:divId w:val="974799217"/>
+            <w:divId w:val="1190294592"/>
             <w:rPr>
               <w:rFonts w:ascii="Calibri" w:eastAsia="Times New Roman" w:hAnsi="Calibri" w:cs="Calibri"/>
               <w:color w:val="000000"/>
@@ -19208,25 +20022,25 @@
               <w:lang w:val="en-GB"/>
             </w:rPr>
             <w:tab/>
-            <w:t xml:space="preserve">D. Rogers and M. Hahn, “Extended-Connectivity Fingerprints,” </w:t>
-          </w:r>
-          <w:r>
-            <w:rPr>
-              <w:rFonts w:ascii="Calibri" w:eastAsia="Times New Roman" w:hAnsi="Calibri" w:cs="Calibri"/>
-              <w:i/>
-              <w:iCs/>
-              <w:color w:val="000000"/>
-              <w:lang w:val="en-GB"/>
-            </w:rPr>
-            <w:t>J. Chem. Inf. Model.</w:t>
-          </w:r>
-          <w:r>
-            <w:rPr>
-              <w:rFonts w:ascii="Calibri" w:eastAsia="Times New Roman" w:hAnsi="Calibri" w:cs="Calibri"/>
-              <w:color w:val="000000"/>
-              <w:lang w:val="en-GB"/>
-            </w:rPr>
-            <w:t>, vol. 50, no. 5, pp. 742–754, 2010, doi: 10.1021/ci100050t.</w:t>
+            <w:t>“</w:t>
+          </w:r>
+          <w:proofErr w:type="spellStart"/>
+          <w:r>
+            <w:rPr>
+              <w:rFonts w:ascii="Calibri" w:eastAsia="Times New Roman" w:hAnsi="Calibri" w:cs="Calibri"/>
+              <w:color w:val="000000"/>
+              <w:lang w:val="en-GB"/>
+            </w:rPr>
+            <w:t>RDKit</w:t>
+          </w:r>
+          <w:proofErr w:type="spellEnd"/>
+          <w:r>
+            <w:rPr>
+              <w:rFonts w:ascii="Calibri" w:eastAsia="Times New Roman" w:hAnsi="Calibri" w:cs="Calibri"/>
+              <w:color w:val="000000"/>
+              <w:lang w:val="en-GB"/>
+            </w:rPr>
+            <w:t>: Open-source cheminformatics.,” https://www.rdkit.org.</w:t>
           </w:r>
         </w:p>
         <w:p>
@@ -19234,7 +20048,7 @@
             <w:autoSpaceDE w:val="0"/>
             <w:autoSpaceDN w:val="0"/>
             <w:ind w:hanging="640"/>
-            <w:divId w:val="1867062766"/>
+            <w:divId w:val="526524793"/>
             <w:rPr>
               <w:rFonts w:ascii="Calibri" w:eastAsia="Times New Roman" w:hAnsi="Calibri" w:cs="Calibri"/>
               <w:color w:val="000000"/>
@@ -19256,7 +20070,7 @@
               <w:lang w:val="en-GB"/>
             </w:rPr>
             <w:tab/>
-            <w:t xml:space="preserve">O. K. Alhmoudi, M. Thameem, A. Elkamel, and A. A. AlHammadi, “Low-Compute repurposing of an English transformer into a molecular encoder: A two-stage SELFIES adaptation of RoBERTa,” </w:t>
+            <w:t xml:space="preserve">D. Rogers and M. Hahn, “Extended-Connectivity Fingerprints,” </w:t>
           </w:r>
           <w:r>
             <w:rPr>
@@ -19266,15 +20080,33 @@
               <w:color w:val="000000"/>
               <w:lang w:val="en-GB"/>
             </w:rPr>
-            <w:t>Results in Engineering</w:t>
-          </w:r>
-          <w:r>
-            <w:rPr>
-              <w:rFonts w:ascii="Calibri" w:eastAsia="Times New Roman" w:hAnsi="Calibri" w:cs="Calibri"/>
-              <w:color w:val="000000"/>
-              <w:lang w:val="en-GB"/>
-            </w:rPr>
-            <w:t>, vol. 28, p. 108390, Dec. 2025, doi: 10.1016/j.rineng.2025.108390.</w:t>
+            <w:t>J. Chem. Inf. Model.</w:t>
+          </w:r>
+          <w:r>
+            <w:rPr>
+              <w:rFonts w:ascii="Calibri" w:eastAsia="Times New Roman" w:hAnsi="Calibri" w:cs="Calibri"/>
+              <w:color w:val="000000"/>
+              <w:lang w:val="en-GB"/>
+            </w:rPr>
+            <w:t xml:space="preserve">, vol. 50, no. 5, pp. 742–754, 2010, </w:t>
+          </w:r>
+          <w:proofErr w:type="spellStart"/>
+          <w:r>
+            <w:rPr>
+              <w:rFonts w:ascii="Calibri" w:eastAsia="Times New Roman" w:hAnsi="Calibri" w:cs="Calibri"/>
+              <w:color w:val="000000"/>
+              <w:lang w:val="en-GB"/>
+            </w:rPr>
+            <w:t>doi</w:t>
+          </w:r>
+          <w:proofErr w:type="spellEnd"/>
+          <w:r>
+            <w:rPr>
+              <w:rFonts w:ascii="Calibri" w:eastAsia="Times New Roman" w:hAnsi="Calibri" w:cs="Calibri"/>
+              <w:color w:val="000000"/>
+              <w:lang w:val="en-GB"/>
+            </w:rPr>
+            <w:t>: 10.1021/ci100050t.</w:t>
           </w:r>
         </w:p>
         <w:p>
@@ -19282,7 +20114,7 @@
             <w:autoSpaceDE w:val="0"/>
             <w:autoSpaceDN w:val="0"/>
             <w:ind w:hanging="640"/>
-            <w:divId w:val="1589193078"/>
+            <w:divId w:val="1248731559"/>
             <w:rPr>
               <w:rFonts w:ascii="Calibri" w:eastAsia="Times New Roman" w:hAnsi="Calibri" w:cs="Calibri"/>
               <w:color w:val="000000"/>
@@ -19304,7 +20136,79 @@
               <w:lang w:val="en-GB"/>
             </w:rPr>
             <w:tab/>
-            <w:t xml:space="preserve">J. Devlin, M.-W. Chang, K. Lee, and K. Toutanova, “BERT: Pre-training of Deep Bidirectional Transformers for Language Understanding,” in </w:t>
+            <w:t xml:space="preserve">O. K. </w:t>
+          </w:r>
+          <w:proofErr w:type="spellStart"/>
+          <w:r>
+            <w:rPr>
+              <w:rFonts w:ascii="Calibri" w:eastAsia="Times New Roman" w:hAnsi="Calibri" w:cs="Calibri"/>
+              <w:color w:val="000000"/>
+              <w:lang w:val="en-GB"/>
+            </w:rPr>
+            <w:t>Alhmoudi</w:t>
+          </w:r>
+          <w:proofErr w:type="spellEnd"/>
+          <w:r>
+            <w:rPr>
+              <w:rFonts w:ascii="Calibri" w:eastAsia="Times New Roman" w:hAnsi="Calibri" w:cs="Calibri"/>
+              <w:color w:val="000000"/>
+              <w:lang w:val="en-GB"/>
+            </w:rPr>
+            <w:t xml:space="preserve">, M. Thameem, A. </w:t>
+          </w:r>
+          <w:proofErr w:type="spellStart"/>
+          <w:r>
+            <w:rPr>
+              <w:rFonts w:ascii="Calibri" w:eastAsia="Times New Roman" w:hAnsi="Calibri" w:cs="Calibri"/>
+              <w:color w:val="000000"/>
+              <w:lang w:val="en-GB"/>
+            </w:rPr>
+            <w:t>Elkamel</w:t>
+          </w:r>
+          <w:proofErr w:type="spellEnd"/>
+          <w:r>
+            <w:rPr>
+              <w:rFonts w:ascii="Calibri" w:eastAsia="Times New Roman" w:hAnsi="Calibri" w:cs="Calibri"/>
+              <w:color w:val="000000"/>
+              <w:lang w:val="en-GB"/>
+            </w:rPr>
+            <w:t xml:space="preserve">, and A. A. </w:t>
+          </w:r>
+          <w:proofErr w:type="spellStart"/>
+          <w:r>
+            <w:rPr>
+              <w:rFonts w:ascii="Calibri" w:eastAsia="Times New Roman" w:hAnsi="Calibri" w:cs="Calibri"/>
+              <w:color w:val="000000"/>
+              <w:lang w:val="en-GB"/>
+            </w:rPr>
+            <w:t>AlHammadi</w:t>
+          </w:r>
+          <w:proofErr w:type="spellEnd"/>
+          <w:r>
+            <w:rPr>
+              <w:rFonts w:ascii="Calibri" w:eastAsia="Times New Roman" w:hAnsi="Calibri" w:cs="Calibri"/>
+              <w:color w:val="000000"/>
+              <w:lang w:val="en-GB"/>
+            </w:rPr>
+            <w:t xml:space="preserve">, “Low-Compute repurposing of an English transformer into a molecular encoder: A two-stage SELFIES adaptation of </w:t>
+          </w:r>
+          <w:proofErr w:type="spellStart"/>
+          <w:r>
+            <w:rPr>
+              <w:rFonts w:ascii="Calibri" w:eastAsia="Times New Roman" w:hAnsi="Calibri" w:cs="Calibri"/>
+              <w:color w:val="000000"/>
+              <w:lang w:val="en-GB"/>
+            </w:rPr>
+            <w:t>RoBERTa</w:t>
+          </w:r>
+          <w:proofErr w:type="spellEnd"/>
+          <w:r>
+            <w:rPr>
+              <w:rFonts w:ascii="Calibri" w:eastAsia="Times New Roman" w:hAnsi="Calibri" w:cs="Calibri"/>
+              <w:color w:val="000000"/>
+              <w:lang w:val="en-GB"/>
+            </w:rPr>
+            <w:t xml:space="preserve">,” </w:t>
           </w:r>
           <w:r>
             <w:rPr>
@@ -19314,15 +20218,33 @@
               <w:color w:val="000000"/>
               <w:lang w:val="en-GB"/>
             </w:rPr>
-            <w:t>North American Chapter of the Association for Computational Linguistics</w:t>
-          </w:r>
-          <w:r>
-            <w:rPr>
-              <w:rFonts w:ascii="Calibri" w:eastAsia="Times New Roman" w:hAnsi="Calibri" w:cs="Calibri"/>
-              <w:color w:val="000000"/>
-              <w:lang w:val="en-GB"/>
-            </w:rPr>
-            <w:t>, 2019. [Online]. Available: https://api.semanticscholar.org/CorpusID:52967399</w:t>
+            <w:t>Results in Engineering</w:t>
+          </w:r>
+          <w:r>
+            <w:rPr>
+              <w:rFonts w:ascii="Calibri" w:eastAsia="Times New Roman" w:hAnsi="Calibri" w:cs="Calibri"/>
+              <w:color w:val="000000"/>
+              <w:lang w:val="en-GB"/>
+            </w:rPr>
+            <w:t xml:space="preserve">, vol. 28, p. 108390, Dec. 2025, </w:t>
+          </w:r>
+          <w:proofErr w:type="spellStart"/>
+          <w:r>
+            <w:rPr>
+              <w:rFonts w:ascii="Calibri" w:eastAsia="Times New Roman" w:hAnsi="Calibri" w:cs="Calibri"/>
+              <w:color w:val="000000"/>
+              <w:lang w:val="en-GB"/>
+            </w:rPr>
+            <w:t>doi</w:t>
+          </w:r>
+          <w:proofErr w:type="spellEnd"/>
+          <w:r>
+            <w:rPr>
+              <w:rFonts w:ascii="Calibri" w:eastAsia="Times New Roman" w:hAnsi="Calibri" w:cs="Calibri"/>
+              <w:color w:val="000000"/>
+              <w:lang w:val="en-GB"/>
+            </w:rPr>
+            <w:t>: 10.1016/j.rineng.2025.108390.</w:t>
           </w:r>
         </w:p>
         <w:p>
@@ -19330,7 +20252,7 @@
             <w:autoSpaceDE w:val="0"/>
             <w:autoSpaceDN w:val="0"/>
             <w:ind w:hanging="640"/>
-            <w:divId w:val="588002812"/>
+            <w:divId w:val="888735039"/>
             <w:rPr>
               <w:rFonts w:ascii="Calibri" w:eastAsia="Times New Roman" w:hAnsi="Calibri" w:cs="Calibri"/>
               <w:color w:val="000000"/>
@@ -19352,7 +20274,7 @@
               <w:lang w:val="en-GB"/>
             </w:rPr>
             <w:tab/>
-            <w:t xml:space="preserve">Y. Liu </w:t>
+            <w:t xml:space="preserve">J. Devlin, M.-W. Chang, K. Lee, and K. Toutanova, “BERT: Pre-training of Deep Bidirectional Transformers for Language Understanding,” in </w:t>
           </w:r>
           <w:r>
             <w:rPr>
@@ -19362,33 +20284,15 @@
               <w:color w:val="000000"/>
               <w:lang w:val="en-GB"/>
             </w:rPr>
-            <w:t>et al.</w:t>
-          </w:r>
-          <w:r>
-            <w:rPr>
-              <w:rFonts w:ascii="Calibri" w:eastAsia="Times New Roman" w:hAnsi="Calibri" w:cs="Calibri"/>
-              <w:color w:val="000000"/>
-              <w:lang w:val="en-GB"/>
-            </w:rPr>
-            <w:t xml:space="preserve">, “RoBERTa: A Robustly Optimized BERT Pretraining Approach,” </w:t>
-          </w:r>
-          <w:r>
-            <w:rPr>
-              <w:rFonts w:ascii="Calibri" w:eastAsia="Times New Roman" w:hAnsi="Calibri" w:cs="Calibri"/>
-              <w:i/>
-              <w:iCs/>
-              <w:color w:val="000000"/>
-              <w:lang w:val="en-GB"/>
-            </w:rPr>
-            <w:t>ArXiv</w:t>
-          </w:r>
-          <w:r>
-            <w:rPr>
-              <w:rFonts w:ascii="Calibri" w:eastAsia="Times New Roman" w:hAnsi="Calibri" w:cs="Calibri"/>
-              <w:color w:val="000000"/>
-              <w:lang w:val="en-GB"/>
-            </w:rPr>
-            <w:t>, vol. abs/1907.11692, 2019, [Online]. Available: https://api.semanticscholar.org/CorpusID:198953378</w:t>
+            <w:t>North American Chapter of the Association for Computational Linguistics</w:t>
+          </w:r>
+          <w:r>
+            <w:rPr>
+              <w:rFonts w:ascii="Calibri" w:eastAsia="Times New Roman" w:hAnsi="Calibri" w:cs="Calibri"/>
+              <w:color w:val="000000"/>
+              <w:lang w:val="en-GB"/>
+            </w:rPr>
+            <w:t>, 2019. [Online]. Available: https://api.semanticscholar.org/CorpusID:52967399</w:t>
           </w:r>
         </w:p>
         <w:p>
@@ -19396,7 +20300,7 @@
             <w:autoSpaceDE w:val="0"/>
             <w:autoSpaceDN w:val="0"/>
             <w:ind w:hanging="640"/>
-            <w:divId w:val="1462923793"/>
+            <w:divId w:val="979916477"/>
             <w:rPr>
               <w:rFonts w:ascii="Calibri" w:eastAsia="Times New Roman" w:hAnsi="Calibri" w:cs="Calibri"/>
               <w:color w:val="000000"/>
@@ -19418,7 +20322,7 @@
               <w:lang w:val="en-GB"/>
             </w:rPr>
             <w:tab/>
-            <w:t xml:space="preserve">R. Sennrich, B. Haddow, and A. Birch, “Neural Machine Translation of Rare Words with Subword Units,” </w:t>
+            <w:t xml:space="preserve">Y. Liu </w:t>
           </w:r>
           <w:r>
             <w:rPr>
@@ -19428,15 +20332,53 @@
               <w:color w:val="000000"/>
               <w:lang w:val="en-GB"/>
             </w:rPr>
+            <w:t>et al.</w:t>
+          </w:r>
+          <w:r>
+            <w:rPr>
+              <w:rFonts w:ascii="Calibri" w:eastAsia="Times New Roman" w:hAnsi="Calibri" w:cs="Calibri"/>
+              <w:color w:val="000000"/>
+              <w:lang w:val="en-GB"/>
+            </w:rPr>
+            <w:t>, “</w:t>
+          </w:r>
+          <w:proofErr w:type="spellStart"/>
+          <w:r>
+            <w:rPr>
+              <w:rFonts w:ascii="Calibri" w:eastAsia="Times New Roman" w:hAnsi="Calibri" w:cs="Calibri"/>
+              <w:color w:val="000000"/>
+              <w:lang w:val="en-GB"/>
+            </w:rPr>
+            <w:t>RoBERTa</w:t>
+          </w:r>
+          <w:proofErr w:type="spellEnd"/>
+          <w:r>
+            <w:rPr>
+              <w:rFonts w:ascii="Calibri" w:eastAsia="Times New Roman" w:hAnsi="Calibri" w:cs="Calibri"/>
+              <w:color w:val="000000"/>
+              <w:lang w:val="en-GB"/>
+            </w:rPr>
+            <w:t xml:space="preserve">: A Robustly Optimized BERT Pretraining Approach,” </w:t>
+          </w:r>
+          <w:proofErr w:type="spellStart"/>
+          <w:r>
+            <w:rPr>
+              <w:rFonts w:ascii="Calibri" w:eastAsia="Times New Roman" w:hAnsi="Calibri" w:cs="Calibri"/>
+              <w:i/>
+              <w:iCs/>
+              <w:color w:val="000000"/>
+              <w:lang w:val="en-GB"/>
+            </w:rPr>
             <w:t>ArXiv</w:t>
           </w:r>
-          <w:r>
-            <w:rPr>
-              <w:rFonts w:ascii="Calibri" w:eastAsia="Times New Roman" w:hAnsi="Calibri" w:cs="Calibri"/>
-              <w:color w:val="000000"/>
-              <w:lang w:val="en-GB"/>
-            </w:rPr>
-            <w:t>, vol. abs/1508.07909, 2015, [Online]. Available: https://api.semanticscholar.org/CorpusID:1114678</w:t>
+          <w:proofErr w:type="spellEnd"/>
+          <w:r>
+            <w:rPr>
+              <w:rFonts w:ascii="Calibri" w:eastAsia="Times New Roman" w:hAnsi="Calibri" w:cs="Calibri"/>
+              <w:color w:val="000000"/>
+              <w:lang w:val="en-GB"/>
+            </w:rPr>
+            <w:t>, vol. abs/1907.11692, 2019, [Online]. Available: https://api.semanticscholar.org/CorpusID:198953378</w:t>
           </w:r>
         </w:p>
         <w:p>
@@ -19444,7 +20386,7 @@
             <w:autoSpaceDE w:val="0"/>
             <w:autoSpaceDN w:val="0"/>
             <w:ind w:hanging="640"/>
-            <w:divId w:val="1807235915"/>
+            <w:divId w:val="517818093"/>
             <w:rPr>
               <w:rFonts w:ascii="Calibri" w:eastAsia="Times New Roman" w:hAnsi="Calibri" w:cs="Calibri"/>
               <w:color w:val="000000"/>
@@ -19466,8 +20408,27 @@
               <w:lang w:val="en-GB"/>
             </w:rPr>
             <w:tab/>
-            <w:t xml:space="preserve">S. R. Heller, A. McNaught, I. Pletnev, S. Stein, and D. Tchekhovskoi, “InChI, the IUPAC International Chemical Identifier,” </w:t>
-          </w:r>
+            <w:t xml:space="preserve">R. Sennrich, B. Haddow, and A. Birch, “Neural Machine Translation of Rare Words with </w:t>
+          </w:r>
+          <w:proofErr w:type="spellStart"/>
+          <w:r>
+            <w:rPr>
+              <w:rFonts w:ascii="Calibri" w:eastAsia="Times New Roman" w:hAnsi="Calibri" w:cs="Calibri"/>
+              <w:color w:val="000000"/>
+              <w:lang w:val="en-GB"/>
+            </w:rPr>
+            <w:t>Subword</w:t>
+          </w:r>
+          <w:proofErr w:type="spellEnd"/>
+          <w:r>
+            <w:rPr>
+              <w:rFonts w:ascii="Calibri" w:eastAsia="Times New Roman" w:hAnsi="Calibri" w:cs="Calibri"/>
+              <w:color w:val="000000"/>
+              <w:lang w:val="en-GB"/>
+            </w:rPr>
+            <w:t xml:space="preserve"> Units,” </w:t>
+          </w:r>
+          <w:proofErr w:type="spellStart"/>
           <w:r>
             <w:rPr>
               <w:rFonts w:ascii="Calibri" w:eastAsia="Times New Roman" w:hAnsi="Calibri" w:cs="Calibri"/>
@@ -19476,15 +20437,16 @@
               <w:color w:val="000000"/>
               <w:lang w:val="en-GB"/>
             </w:rPr>
-            <w:t>J. Cheminform.</w:t>
-          </w:r>
-          <w:r>
-            <w:rPr>
-              <w:rFonts w:ascii="Calibri" w:eastAsia="Times New Roman" w:hAnsi="Calibri" w:cs="Calibri"/>
-              <w:color w:val="000000"/>
-              <w:lang w:val="en-GB"/>
-            </w:rPr>
-            <w:t>, vol. 7, no. 1, p. 23, Dec. 2015, doi: 10.1186/s13321-015-0068-4.</w:t>
+            <w:t>ArXiv</w:t>
+          </w:r>
+          <w:proofErr w:type="spellEnd"/>
+          <w:r>
+            <w:rPr>
+              <w:rFonts w:ascii="Calibri" w:eastAsia="Times New Roman" w:hAnsi="Calibri" w:cs="Calibri"/>
+              <w:color w:val="000000"/>
+              <w:lang w:val="en-GB"/>
+            </w:rPr>
+            <w:t>, vol. abs/1508.07909, 2015, [Online]. Available: https://api.semanticscholar.org/CorpusID:1114678</w:t>
           </w:r>
         </w:p>
         <w:p>
@@ -19492,7 +20454,7 @@
             <w:autoSpaceDE w:val="0"/>
             <w:autoSpaceDN w:val="0"/>
             <w:ind w:hanging="640"/>
-            <w:divId w:val="1771506114"/>
+            <w:divId w:val="165482635"/>
             <w:rPr>
               <w:rFonts w:ascii="Calibri" w:eastAsia="Times New Roman" w:hAnsi="Calibri" w:cs="Calibri"/>
               <w:color w:val="000000"/>
@@ -19514,7 +20476,25 @@
               <w:lang w:val="en-GB"/>
             </w:rPr>
             <w:tab/>
-            <w:t xml:space="preserve">I. Loshchilov and F. Hutter, “SGDR: Stochastic Gradient Descent with Warm Restarts,” </w:t>
+            <w:t xml:space="preserve">S. R. Heller, A. McNaught, I. Pletnev, S. Stein, and D. </w:t>
+          </w:r>
+          <w:proofErr w:type="spellStart"/>
+          <w:r>
+            <w:rPr>
+              <w:rFonts w:ascii="Calibri" w:eastAsia="Times New Roman" w:hAnsi="Calibri" w:cs="Calibri"/>
+              <w:color w:val="000000"/>
+              <w:lang w:val="en-GB"/>
+            </w:rPr>
+            <w:t>Tchekhovskoi</w:t>
+          </w:r>
+          <w:proofErr w:type="spellEnd"/>
+          <w:r>
+            <w:rPr>
+              <w:rFonts w:ascii="Calibri" w:eastAsia="Times New Roman" w:hAnsi="Calibri" w:cs="Calibri"/>
+              <w:color w:val="000000"/>
+              <w:lang w:val="en-GB"/>
+            </w:rPr>
+            <w:t xml:space="preserve">, “InChI, the IUPAC International Chemical Identifier,” </w:t>
           </w:r>
           <w:r>
             <w:rPr>
@@ -19524,15 +20504,55 @@
               <w:color w:val="000000"/>
               <w:lang w:val="en-GB"/>
             </w:rPr>
-            <w:t>arXiv: Learning</w:t>
-          </w:r>
-          <w:r>
-            <w:rPr>
-              <w:rFonts w:ascii="Calibri" w:eastAsia="Times New Roman" w:hAnsi="Calibri" w:cs="Calibri"/>
-              <w:color w:val="000000"/>
-              <w:lang w:val="en-GB"/>
-            </w:rPr>
-            <w:t>, 2016, [Online]. Available: https://api.semanticscholar.org/CorpusID:14337532</w:t>
+            <w:t xml:space="preserve">J. </w:t>
+          </w:r>
+          <w:proofErr w:type="spellStart"/>
+          <w:r>
+            <w:rPr>
+              <w:rFonts w:ascii="Calibri" w:eastAsia="Times New Roman" w:hAnsi="Calibri" w:cs="Calibri"/>
+              <w:i/>
+              <w:iCs/>
+              <w:color w:val="000000"/>
+              <w:lang w:val="en-GB"/>
+            </w:rPr>
+            <w:t>Cheminform</w:t>
+          </w:r>
+          <w:proofErr w:type="spellEnd"/>
+          <w:r>
+            <w:rPr>
+              <w:rFonts w:ascii="Calibri" w:eastAsia="Times New Roman" w:hAnsi="Calibri" w:cs="Calibri"/>
+              <w:i/>
+              <w:iCs/>
+              <w:color w:val="000000"/>
+              <w:lang w:val="en-GB"/>
+            </w:rPr>
+            <w:t>.</w:t>
+          </w:r>
+          <w:r>
+            <w:rPr>
+              <w:rFonts w:ascii="Calibri" w:eastAsia="Times New Roman" w:hAnsi="Calibri" w:cs="Calibri"/>
+              <w:color w:val="000000"/>
+              <w:lang w:val="en-GB"/>
+            </w:rPr>
+            <w:t xml:space="preserve">, vol. 7, no. 1, p. 23, Dec. 2015, </w:t>
+          </w:r>
+          <w:proofErr w:type="spellStart"/>
+          <w:r>
+            <w:rPr>
+              <w:rFonts w:ascii="Calibri" w:eastAsia="Times New Roman" w:hAnsi="Calibri" w:cs="Calibri"/>
+              <w:color w:val="000000"/>
+              <w:lang w:val="en-GB"/>
+            </w:rPr>
+            <w:t>doi</w:t>
+          </w:r>
+          <w:proofErr w:type="spellEnd"/>
+          <w:r>
+            <w:rPr>
+              <w:rFonts w:ascii="Calibri" w:eastAsia="Times New Roman" w:hAnsi="Calibri" w:cs="Calibri"/>
+              <w:color w:val="000000"/>
+              <w:lang w:val="en-GB"/>
+            </w:rPr>
+            <w:t>: 10.1186/s13321-015-0068-4.</w:t>
           </w:r>
         </w:p>
         <w:p>
@@ -19540,7 +20560,7 @@
             <w:autoSpaceDE w:val="0"/>
             <w:autoSpaceDN w:val="0"/>
             <w:ind w:hanging="640"/>
-            <w:divId w:val="484592694"/>
+            <w:divId w:val="16741566"/>
             <w:rPr>
               <w:rFonts w:ascii="Calibri" w:eastAsia="Times New Roman" w:hAnsi="Calibri" w:cs="Calibri"/>
               <w:color w:val="000000"/>
@@ -19562,8 +20582,9 @@
               <w:lang w:val="en-GB"/>
             </w:rPr>
             <w:tab/>
-            <w:t xml:space="preserve">N. S. Keskar, D. Mudigere, J. Nocedal, M. Smelyanskiy, and P. T. P. Tang, “On Large-Batch Training for Deep Learning: Generalization Gap and Sharp Minima,” </w:t>
-          </w:r>
+            <w:t xml:space="preserve">I. Loshchilov and F. Hutter, “SGDR: Stochastic Gradient Descent with Warm Restarts,” </w:t>
+          </w:r>
+          <w:proofErr w:type="spellStart"/>
           <w:r>
             <w:rPr>
               <w:rFonts w:ascii="Calibri" w:eastAsia="Times New Roman" w:hAnsi="Calibri" w:cs="Calibri"/>
@@ -19572,15 +20593,26 @@
               <w:color w:val="000000"/>
               <w:lang w:val="en-GB"/>
             </w:rPr>
-            <w:t>ArXiv</w:t>
-          </w:r>
-          <w:r>
-            <w:rPr>
-              <w:rFonts w:ascii="Calibri" w:eastAsia="Times New Roman" w:hAnsi="Calibri" w:cs="Calibri"/>
-              <w:color w:val="000000"/>
-              <w:lang w:val="en-GB"/>
-            </w:rPr>
-            <w:t>, vol. abs/1609.04836, 2016, [Online]. Available: https://api.semanticscholar.org/CorpusID:5834589</w:t>
+            <w:t>arXiv</w:t>
+          </w:r>
+          <w:proofErr w:type="spellEnd"/>
+          <w:r>
+            <w:rPr>
+              <w:rFonts w:ascii="Calibri" w:eastAsia="Times New Roman" w:hAnsi="Calibri" w:cs="Calibri"/>
+              <w:i/>
+              <w:iCs/>
+              <w:color w:val="000000"/>
+              <w:lang w:val="en-GB"/>
+            </w:rPr>
+            <w:t>: Learning</w:t>
+          </w:r>
+          <w:r>
+            <w:rPr>
+              <w:rFonts w:ascii="Calibri" w:eastAsia="Times New Roman" w:hAnsi="Calibri" w:cs="Calibri"/>
+              <w:color w:val="000000"/>
+              <w:lang w:val="en-GB"/>
+            </w:rPr>
+            <w:t>, 2016, [Online]. Available: https://api.semanticscholar.org/CorpusID:14337532</w:t>
           </w:r>
         </w:p>
         <w:p>
@@ -19588,7 +20620,7 @@
             <w:autoSpaceDE w:val="0"/>
             <w:autoSpaceDN w:val="0"/>
             <w:ind w:hanging="640"/>
-            <w:divId w:val="1639264419"/>
+            <w:divId w:val="1066101054"/>
             <w:rPr>
               <w:rFonts w:ascii="Calibri" w:eastAsia="Times New Roman" w:hAnsi="Calibri" w:cs="Calibri"/>
               <w:color w:val="000000"/>
@@ -19611,8 +20643,63 @@
               <w:lang w:val="en-GB"/>
             </w:rPr>
             <w:tab/>
-            <w:t xml:space="preserve">P. Micikevicius </w:t>
-          </w:r>
+            <w:t xml:space="preserve">N. S. Keskar, D. </w:t>
+          </w:r>
+          <w:proofErr w:type="spellStart"/>
+          <w:r>
+            <w:rPr>
+              <w:rFonts w:ascii="Calibri" w:eastAsia="Times New Roman" w:hAnsi="Calibri" w:cs="Calibri"/>
+              <w:color w:val="000000"/>
+              <w:lang w:val="en-GB"/>
+            </w:rPr>
+            <w:t>Mudigere</w:t>
+          </w:r>
+          <w:proofErr w:type="spellEnd"/>
+          <w:r>
+            <w:rPr>
+              <w:rFonts w:ascii="Calibri" w:eastAsia="Times New Roman" w:hAnsi="Calibri" w:cs="Calibri"/>
+              <w:color w:val="000000"/>
+              <w:lang w:val="en-GB"/>
+            </w:rPr>
+            <w:t xml:space="preserve">, J. </w:t>
+          </w:r>
+          <w:proofErr w:type="spellStart"/>
+          <w:r>
+            <w:rPr>
+              <w:rFonts w:ascii="Calibri" w:eastAsia="Times New Roman" w:hAnsi="Calibri" w:cs="Calibri"/>
+              <w:color w:val="000000"/>
+              <w:lang w:val="en-GB"/>
+            </w:rPr>
+            <w:t>Nocedal</w:t>
+          </w:r>
+          <w:proofErr w:type="spellEnd"/>
+          <w:r>
+            <w:rPr>
+              <w:rFonts w:ascii="Calibri" w:eastAsia="Times New Roman" w:hAnsi="Calibri" w:cs="Calibri"/>
+              <w:color w:val="000000"/>
+              <w:lang w:val="en-GB"/>
+            </w:rPr>
+            <w:t xml:space="preserve">, M. </w:t>
+          </w:r>
+          <w:proofErr w:type="spellStart"/>
+          <w:r>
+            <w:rPr>
+              <w:rFonts w:ascii="Calibri" w:eastAsia="Times New Roman" w:hAnsi="Calibri" w:cs="Calibri"/>
+              <w:color w:val="000000"/>
+              <w:lang w:val="en-GB"/>
+            </w:rPr>
+            <w:t>Smelyanskiy</w:t>
+          </w:r>
+          <w:proofErr w:type="spellEnd"/>
+          <w:r>
+            <w:rPr>
+              <w:rFonts w:ascii="Calibri" w:eastAsia="Times New Roman" w:hAnsi="Calibri" w:cs="Calibri"/>
+              <w:color w:val="000000"/>
+              <w:lang w:val="en-GB"/>
+            </w:rPr>
+            <w:t xml:space="preserve">, and P. T. P. Tang, “On Large-Batch Training for Deep Learning: Generalization Gap and Sharp Minima,” </w:t>
+          </w:r>
+          <w:proofErr w:type="spellStart"/>
           <w:r>
             <w:rPr>
               <w:rFonts w:ascii="Calibri" w:eastAsia="Times New Roman" w:hAnsi="Calibri" w:cs="Calibri"/>
@@ -19621,33 +20708,16 @@
               <w:color w:val="000000"/>
               <w:lang w:val="en-GB"/>
             </w:rPr>
-            <w:t>et al.</w:t>
-          </w:r>
-          <w:r>
-            <w:rPr>
-              <w:rFonts w:ascii="Calibri" w:eastAsia="Times New Roman" w:hAnsi="Calibri" w:cs="Calibri"/>
-              <w:color w:val="000000"/>
-              <w:lang w:val="en-GB"/>
-            </w:rPr>
-            <w:t xml:space="preserve">, “Mixed Precision Training,” </w:t>
-          </w:r>
-          <w:r>
-            <w:rPr>
-              <w:rFonts w:ascii="Calibri" w:eastAsia="Times New Roman" w:hAnsi="Calibri" w:cs="Calibri"/>
-              <w:i/>
-              <w:iCs/>
-              <w:color w:val="000000"/>
-              <w:lang w:val="en-GB"/>
-            </w:rPr>
             <w:t>ArXiv</w:t>
           </w:r>
-          <w:r>
-            <w:rPr>
-              <w:rFonts w:ascii="Calibri" w:eastAsia="Times New Roman" w:hAnsi="Calibri" w:cs="Calibri"/>
-              <w:color w:val="000000"/>
-              <w:lang w:val="en-GB"/>
-            </w:rPr>
-            <w:t>, vol. abs/1710.03740, 2017, [Online]. Available: https://api.semanticscholar.org/CorpusID:3297437</w:t>
+          <w:proofErr w:type="spellEnd"/>
+          <w:r>
+            <w:rPr>
+              <w:rFonts w:ascii="Calibri" w:eastAsia="Times New Roman" w:hAnsi="Calibri" w:cs="Calibri"/>
+              <w:color w:val="000000"/>
+              <w:lang w:val="en-GB"/>
+            </w:rPr>
+            <w:t>, vol. abs/1609.04836, 2016, [Online]. Available: https://api.semanticscholar.org/CorpusID:5834589</w:t>
           </w:r>
         </w:p>
         <w:p>
@@ -19655,7 +20725,7 @@
             <w:autoSpaceDE w:val="0"/>
             <w:autoSpaceDN w:val="0"/>
             <w:ind w:hanging="640"/>
-            <w:divId w:val="2094006965"/>
+            <w:divId w:val="91901181"/>
             <w:rPr>
               <w:rFonts w:ascii="Calibri" w:eastAsia="Times New Roman" w:hAnsi="Calibri" w:cs="Calibri"/>
               <w:color w:val="000000"/>
@@ -19677,7 +20747,63 @@
               <w:lang w:val="en-GB"/>
             </w:rPr>
             <w:tab/>
-            <w:t>Sgt. Peppers, “Drug Design with Small Molecule SMILES,” https://www.kaggle.com/datasets/art3mis/chembl22.</w:t>
+            <w:t xml:space="preserve">P. </w:t>
+          </w:r>
+          <w:proofErr w:type="spellStart"/>
+          <w:r>
+            <w:rPr>
+              <w:rFonts w:ascii="Calibri" w:eastAsia="Times New Roman" w:hAnsi="Calibri" w:cs="Calibri"/>
+              <w:color w:val="000000"/>
+              <w:lang w:val="en-GB"/>
+            </w:rPr>
+            <w:t>Micikevicius</w:t>
+          </w:r>
+          <w:proofErr w:type="spellEnd"/>
+          <w:r>
+            <w:rPr>
+              <w:rFonts w:ascii="Calibri" w:eastAsia="Times New Roman" w:hAnsi="Calibri" w:cs="Calibri"/>
+              <w:color w:val="000000"/>
+              <w:lang w:val="en-GB"/>
+            </w:rPr>
+            <w:t xml:space="preserve"> </w:t>
+          </w:r>
+          <w:r>
+            <w:rPr>
+              <w:rFonts w:ascii="Calibri" w:eastAsia="Times New Roman" w:hAnsi="Calibri" w:cs="Calibri"/>
+              <w:i/>
+              <w:iCs/>
+              <w:color w:val="000000"/>
+              <w:lang w:val="en-GB"/>
+            </w:rPr>
+            <w:t>et al.</w:t>
+          </w:r>
+          <w:r>
+            <w:rPr>
+              <w:rFonts w:ascii="Calibri" w:eastAsia="Times New Roman" w:hAnsi="Calibri" w:cs="Calibri"/>
+              <w:color w:val="000000"/>
+              <w:lang w:val="en-GB"/>
+            </w:rPr>
+            <w:t xml:space="preserve">, “Mixed Precision Training,” </w:t>
+          </w:r>
+          <w:proofErr w:type="spellStart"/>
+          <w:r>
+            <w:rPr>
+              <w:rFonts w:ascii="Calibri" w:eastAsia="Times New Roman" w:hAnsi="Calibri" w:cs="Calibri"/>
+              <w:i/>
+              <w:iCs/>
+              <w:color w:val="000000"/>
+              <w:lang w:val="en-GB"/>
+            </w:rPr>
+            <w:t>ArXiv</w:t>
+          </w:r>
+          <w:proofErr w:type="spellEnd"/>
+          <w:r>
+            <w:rPr>
+              <w:rFonts w:ascii="Calibri" w:eastAsia="Times New Roman" w:hAnsi="Calibri" w:cs="Calibri"/>
+              <w:color w:val="000000"/>
+              <w:lang w:val="en-GB"/>
+            </w:rPr>
+            <w:t>, vol. abs/1710.03740, 2017, [Online]. Available: https://api.semanticscholar.org/CorpusID:3297437</w:t>
           </w:r>
         </w:p>
         <w:p>
@@ -19685,7 +20811,7 @@
             <w:autoSpaceDE w:val="0"/>
             <w:autoSpaceDN w:val="0"/>
             <w:ind w:hanging="640"/>
-            <w:divId w:val="48194014"/>
+            <w:divId w:val="931626775"/>
             <w:rPr>
               <w:rFonts w:ascii="Calibri" w:eastAsia="Times New Roman" w:hAnsi="Calibri" w:cs="Calibri"/>
               <w:color w:val="000000"/>
@@ -19707,7 +20833,7 @@
               <w:lang w:val="en-GB"/>
             </w:rPr>
             <w:tab/>
-            <w:t xml:space="preserve">C. Knox </w:t>
+            <w:t xml:space="preserve">M.-L. Zhang and Z.-H. Zhou, “A Review on Multi-Label Learning Algorithms,” </w:t>
           </w:r>
           <w:r>
             <w:rPr>
@@ -19717,16 +20843,9 @@
               <w:color w:val="000000"/>
               <w:lang w:val="en-GB"/>
             </w:rPr>
-            <w:t>et al.</w:t>
-          </w:r>
-          <w:r>
-            <w:rPr>
-              <w:rFonts w:ascii="Calibri" w:eastAsia="Times New Roman" w:hAnsi="Calibri" w:cs="Calibri"/>
-              <w:color w:val="000000"/>
-              <w:lang w:val="en-GB"/>
-            </w:rPr>
-            <w:t xml:space="preserve">, “DrugBank 6.0: the DrugBank Knowledgebase for 2024,” </w:t>
-          </w:r>
+            <w:t xml:space="preserve">IEEE Trans. </w:t>
+          </w:r>
+          <w:proofErr w:type="spellStart"/>
           <w:r>
             <w:rPr>
               <w:rFonts w:ascii="Calibri" w:eastAsia="Times New Roman" w:hAnsi="Calibri" w:cs="Calibri"/>
@@ -19735,15 +20854,44 @@
               <w:color w:val="000000"/>
               <w:lang w:val="en-GB"/>
             </w:rPr>
-            <w:t>Nucleic Acids Res.</w:t>
-          </w:r>
-          <w:r>
-            <w:rPr>
-              <w:rFonts w:ascii="Calibri" w:eastAsia="Times New Roman" w:hAnsi="Calibri" w:cs="Calibri"/>
-              <w:color w:val="000000"/>
-              <w:lang w:val="en-GB"/>
-            </w:rPr>
-            <w:t>, vol. 52, no. D1, pp. D1265–D1275, Jan. 2024, doi: 10.1093/nar/gkad976.</w:t>
+            <w:t>Knowl</w:t>
+          </w:r>
+          <w:proofErr w:type="spellEnd"/>
+          <w:r>
+            <w:rPr>
+              <w:rFonts w:ascii="Calibri" w:eastAsia="Times New Roman" w:hAnsi="Calibri" w:cs="Calibri"/>
+              <w:i/>
+              <w:iCs/>
+              <w:color w:val="000000"/>
+              <w:lang w:val="en-GB"/>
+            </w:rPr>
+            <w:t>. Data Eng.</w:t>
+          </w:r>
+          <w:r>
+            <w:rPr>
+              <w:rFonts w:ascii="Calibri" w:eastAsia="Times New Roman" w:hAnsi="Calibri" w:cs="Calibri"/>
+              <w:color w:val="000000"/>
+              <w:lang w:val="en-GB"/>
+            </w:rPr>
+            <w:t xml:space="preserve">, vol. 26, no. 8, pp. 1819–1837, 2014, </w:t>
+          </w:r>
+          <w:proofErr w:type="spellStart"/>
+          <w:r>
+            <w:rPr>
+              <w:rFonts w:ascii="Calibri" w:eastAsia="Times New Roman" w:hAnsi="Calibri" w:cs="Calibri"/>
+              <w:color w:val="000000"/>
+              <w:lang w:val="en-GB"/>
+            </w:rPr>
+            <w:t>doi</w:t>
+          </w:r>
+          <w:proofErr w:type="spellEnd"/>
+          <w:r>
+            <w:rPr>
+              <w:rFonts w:ascii="Calibri" w:eastAsia="Times New Roman" w:hAnsi="Calibri" w:cs="Calibri"/>
+              <w:color w:val="000000"/>
+              <w:lang w:val="en-GB"/>
+            </w:rPr>
+            <w:t>: 10.1109/TKDE.2013.39.</w:t>
           </w:r>
         </w:p>
         <w:p>
@@ -19751,7 +20899,7 @@
             <w:autoSpaceDE w:val="0"/>
             <w:autoSpaceDN w:val="0"/>
             <w:ind w:hanging="640"/>
-            <w:divId w:val="1966697421"/>
+            <w:divId w:val="869027144"/>
             <w:rPr>
               <w:rFonts w:ascii="Calibri" w:eastAsia="Times New Roman" w:hAnsi="Calibri" w:cs="Calibri"/>
               <w:color w:val="000000"/>
@@ -19773,7 +20921,25 @@
               <w:lang w:val="en-GB"/>
             </w:rPr>
             <w:tab/>
-            <w:t xml:space="preserve">A. Gaulton </w:t>
+            <w:t xml:space="preserve">G. </w:t>
+          </w:r>
+          <w:proofErr w:type="spellStart"/>
+          <w:r>
+            <w:rPr>
+              <w:rFonts w:ascii="Calibri" w:eastAsia="Times New Roman" w:hAnsi="Calibri" w:cs="Calibri"/>
+              <w:color w:val="000000"/>
+              <w:lang w:val="en-GB"/>
+            </w:rPr>
+            <w:t>Tsoumakas</w:t>
+          </w:r>
+          <w:proofErr w:type="spellEnd"/>
+          <w:r>
+            <w:rPr>
+              <w:rFonts w:ascii="Calibri" w:eastAsia="Times New Roman" w:hAnsi="Calibri" w:cs="Calibri"/>
+              <w:color w:val="000000"/>
+              <w:lang w:val="en-GB"/>
+            </w:rPr>
+            <w:t xml:space="preserve"> and I. Katakis, “Multi-Label Classification,” </w:t>
           </w:r>
           <w:r>
             <w:rPr>
@@ -19783,33 +20949,33 @@
               <w:color w:val="000000"/>
               <w:lang w:val="en-GB"/>
             </w:rPr>
-            <w:t>et al.</w:t>
-          </w:r>
-          <w:r>
-            <w:rPr>
-              <w:rFonts w:ascii="Calibri" w:eastAsia="Times New Roman" w:hAnsi="Calibri" w:cs="Calibri"/>
-              <w:color w:val="000000"/>
-              <w:lang w:val="en-GB"/>
-            </w:rPr>
-            <w:t xml:space="preserve">, “The ChEMBL database in 2017,” </w:t>
-          </w:r>
-          <w:r>
-            <w:rPr>
-              <w:rFonts w:ascii="Calibri" w:eastAsia="Times New Roman" w:hAnsi="Calibri" w:cs="Calibri"/>
-              <w:i/>
-              <w:iCs/>
-              <w:color w:val="000000"/>
-              <w:lang w:val="en-GB"/>
-            </w:rPr>
-            <w:t>Nucleic Acids Res.</w:t>
-          </w:r>
-          <w:r>
-            <w:rPr>
-              <w:rFonts w:ascii="Calibri" w:eastAsia="Times New Roman" w:hAnsi="Calibri" w:cs="Calibri"/>
-              <w:color w:val="000000"/>
-              <w:lang w:val="en-GB"/>
-            </w:rPr>
-            <w:t>, vol. 45, no. D1, pp. D945–D954, Jan. 2017, doi: 10.1093/nar/gkw1074.</w:t>
+            <w:t>International Journal of Data Warehousing and Mining</w:t>
+          </w:r>
+          <w:r>
+            <w:rPr>
+              <w:rFonts w:ascii="Calibri" w:eastAsia="Times New Roman" w:hAnsi="Calibri" w:cs="Calibri"/>
+              <w:color w:val="000000"/>
+              <w:lang w:val="en-GB"/>
+            </w:rPr>
+            <w:t xml:space="preserve">, vol. 3, no. 3, pp. 1–13, Jul. 2007, </w:t>
+          </w:r>
+          <w:proofErr w:type="spellStart"/>
+          <w:r>
+            <w:rPr>
+              <w:rFonts w:ascii="Calibri" w:eastAsia="Times New Roman" w:hAnsi="Calibri" w:cs="Calibri"/>
+              <w:color w:val="000000"/>
+              <w:lang w:val="en-GB"/>
+            </w:rPr>
+            <w:t>doi</w:t>
+          </w:r>
+          <w:proofErr w:type="spellEnd"/>
+          <w:r>
+            <w:rPr>
+              <w:rFonts w:ascii="Calibri" w:eastAsia="Times New Roman" w:hAnsi="Calibri" w:cs="Calibri"/>
+              <w:color w:val="000000"/>
+              <w:lang w:val="en-GB"/>
+            </w:rPr>
+            <w:t>: 10.4018/jdwm.2007070101.</w:t>
           </w:r>
         </w:p>
         <w:p>
@@ -19817,10 +20983,11 @@
             <w:autoSpaceDE w:val="0"/>
             <w:autoSpaceDN w:val="0"/>
             <w:ind w:hanging="640"/>
-            <w:divId w:val="1345547100"/>
-            <w:rPr>
-              <w:rFonts w:ascii="Calibri" w:eastAsia="Times New Roman" w:hAnsi="Calibri" w:cs="Calibri"/>
-              <w:color w:val="000000"/>
+            <w:divId w:val="1553419631"/>
+            <w:rPr>
+              <w:rFonts w:ascii="Calibri" w:eastAsia="Times New Roman" w:hAnsi="Calibri" w:cs="Calibri"/>
+              <w:color w:val="000000"/>
+              <w:lang w:val="en-GB"/>
             </w:rPr>
           </w:pPr>
           <w:r>
@@ -19830,6 +20997,720 @@
               <w:lang w:val="en-GB"/>
             </w:rPr>
             <w:t>[26]</w:t>
+          </w:r>
+          <w:r>
+            <w:rPr>
+              <w:rFonts w:ascii="Calibri" w:eastAsia="Times New Roman" w:hAnsi="Calibri" w:cs="Calibri"/>
+              <w:color w:val="000000"/>
+              <w:lang w:val="en-GB"/>
+            </w:rPr>
+            <w:tab/>
+            <w:t xml:space="preserve">C. Emoto, N. Murayama, A. Rostami-Hodjegan, and H. Yamazaki, “Methodologies for Investigating Drug Metabolism at the Early Drug Discovery Stage: Prediction of Hepatic Drug Clearance and P450 Contribution,” </w:t>
+          </w:r>
+          <w:r>
+            <w:rPr>
+              <w:rFonts w:ascii="Calibri" w:eastAsia="Times New Roman" w:hAnsi="Calibri" w:cs="Calibri"/>
+              <w:i/>
+              <w:iCs/>
+              <w:color w:val="000000"/>
+              <w:lang w:val="en-GB"/>
+            </w:rPr>
+            <w:t xml:space="preserve">Curr. Drug </w:t>
+          </w:r>
+          <w:proofErr w:type="spellStart"/>
+          <w:r>
+            <w:rPr>
+              <w:rFonts w:ascii="Calibri" w:eastAsia="Times New Roman" w:hAnsi="Calibri" w:cs="Calibri"/>
+              <w:i/>
+              <w:iCs/>
+              <w:color w:val="000000"/>
+              <w:lang w:val="en-GB"/>
+            </w:rPr>
+            <w:t>Metab</w:t>
+          </w:r>
+          <w:proofErr w:type="spellEnd"/>
+          <w:r>
+            <w:rPr>
+              <w:rFonts w:ascii="Calibri" w:eastAsia="Times New Roman" w:hAnsi="Calibri" w:cs="Calibri"/>
+              <w:i/>
+              <w:iCs/>
+              <w:color w:val="000000"/>
+              <w:lang w:val="en-GB"/>
+            </w:rPr>
+            <w:t>.</w:t>
+          </w:r>
+          <w:r>
+            <w:rPr>
+              <w:rFonts w:ascii="Calibri" w:eastAsia="Times New Roman" w:hAnsi="Calibri" w:cs="Calibri"/>
+              <w:color w:val="000000"/>
+              <w:lang w:val="en-GB"/>
+            </w:rPr>
+            <w:t xml:space="preserve">, vol. 11, no. 8, pp. 678–685, Oct. 2010, </w:t>
+          </w:r>
+          <w:proofErr w:type="spellStart"/>
+          <w:r>
+            <w:rPr>
+              <w:rFonts w:ascii="Calibri" w:eastAsia="Times New Roman" w:hAnsi="Calibri" w:cs="Calibri"/>
+              <w:color w:val="000000"/>
+              <w:lang w:val="en-GB"/>
+            </w:rPr>
+            <w:t>doi</w:t>
+          </w:r>
+          <w:proofErr w:type="spellEnd"/>
+          <w:r>
+            <w:rPr>
+              <w:rFonts w:ascii="Calibri" w:eastAsia="Times New Roman" w:hAnsi="Calibri" w:cs="Calibri"/>
+              <w:color w:val="000000"/>
+              <w:lang w:val="en-GB"/>
+            </w:rPr>
+            <w:t>: 10.2174/138920010794233503.</w:t>
+          </w:r>
+        </w:p>
+        <w:p>
+          <w:pPr>
+            <w:autoSpaceDE w:val="0"/>
+            <w:autoSpaceDN w:val="0"/>
+            <w:ind w:hanging="640"/>
+            <w:divId w:val="364406243"/>
+            <w:rPr>
+              <w:rFonts w:ascii="Calibri" w:eastAsia="Times New Roman" w:hAnsi="Calibri" w:cs="Calibri"/>
+              <w:color w:val="000000"/>
+              <w:lang w:val="en-GB"/>
+            </w:rPr>
+          </w:pPr>
+          <w:r>
+            <w:rPr>
+              <w:rFonts w:ascii="Calibri" w:eastAsia="Times New Roman" w:hAnsi="Calibri" w:cs="Calibri"/>
+              <w:color w:val="000000"/>
+              <w:lang w:val="en-GB"/>
+            </w:rPr>
+            <w:t>[27]</w:t>
+          </w:r>
+          <w:r>
+            <w:rPr>
+              <w:rFonts w:ascii="Calibri" w:eastAsia="Times New Roman" w:hAnsi="Calibri" w:cs="Calibri"/>
+              <w:color w:val="000000"/>
+              <w:lang w:val="en-GB"/>
+            </w:rPr>
+            <w:tab/>
+            <w:t xml:space="preserve">D. Chicco and G. Jurman, “The advantages of the Matthews correlation coefficient (MCC) over F1 score and accuracy in binary classification evaluation,” </w:t>
+          </w:r>
+          <w:r>
+            <w:rPr>
+              <w:rFonts w:ascii="Calibri" w:eastAsia="Times New Roman" w:hAnsi="Calibri" w:cs="Calibri"/>
+              <w:i/>
+              <w:iCs/>
+              <w:color w:val="000000"/>
+              <w:lang w:val="en-GB"/>
+            </w:rPr>
+            <w:t>BMC Genomics</w:t>
+          </w:r>
+          <w:r>
+            <w:rPr>
+              <w:rFonts w:ascii="Calibri" w:eastAsia="Times New Roman" w:hAnsi="Calibri" w:cs="Calibri"/>
+              <w:color w:val="000000"/>
+              <w:lang w:val="en-GB"/>
+            </w:rPr>
+            <w:t xml:space="preserve">, vol. 21, no. 1, p. 6, Dec. 2020, </w:t>
+          </w:r>
+          <w:proofErr w:type="spellStart"/>
+          <w:r>
+            <w:rPr>
+              <w:rFonts w:ascii="Calibri" w:eastAsia="Times New Roman" w:hAnsi="Calibri" w:cs="Calibri"/>
+              <w:color w:val="000000"/>
+              <w:lang w:val="en-GB"/>
+            </w:rPr>
+            <w:t>doi</w:t>
+          </w:r>
+          <w:proofErr w:type="spellEnd"/>
+          <w:r>
+            <w:rPr>
+              <w:rFonts w:ascii="Calibri" w:eastAsia="Times New Roman" w:hAnsi="Calibri" w:cs="Calibri"/>
+              <w:color w:val="000000"/>
+              <w:lang w:val="en-GB"/>
+            </w:rPr>
+            <w:t>: 10.1186/s12864-019-6413-7.</w:t>
+          </w:r>
+        </w:p>
+        <w:p>
+          <w:pPr>
+            <w:autoSpaceDE w:val="0"/>
+            <w:autoSpaceDN w:val="0"/>
+            <w:ind w:hanging="640"/>
+            <w:divId w:val="897326142"/>
+            <w:rPr>
+              <w:rFonts w:ascii="Calibri" w:eastAsia="Times New Roman" w:hAnsi="Calibri" w:cs="Calibri"/>
+              <w:color w:val="000000"/>
+              <w:lang w:val="en-GB"/>
+            </w:rPr>
+          </w:pPr>
+          <w:r>
+            <w:rPr>
+              <w:rFonts w:ascii="Calibri" w:eastAsia="Times New Roman" w:hAnsi="Calibri" w:cs="Calibri"/>
+              <w:color w:val="000000"/>
+              <w:lang w:val="en-GB"/>
+            </w:rPr>
+            <w:t>[28]</w:t>
+          </w:r>
+          <w:r>
+            <w:rPr>
+              <w:rFonts w:ascii="Calibri" w:eastAsia="Times New Roman" w:hAnsi="Calibri" w:cs="Calibri"/>
+              <w:color w:val="000000"/>
+              <w:lang w:val="en-GB"/>
+            </w:rPr>
+            <w:tab/>
+            <w:t xml:space="preserve">S. Adhikari, S.-L. Normand, J. Bloom, D. </w:t>
+          </w:r>
+          <w:proofErr w:type="spellStart"/>
+          <w:r>
+            <w:rPr>
+              <w:rFonts w:ascii="Calibri" w:eastAsia="Times New Roman" w:hAnsi="Calibri" w:cs="Calibri"/>
+              <w:color w:val="000000"/>
+              <w:lang w:val="en-GB"/>
+            </w:rPr>
+            <w:t>Shahian</w:t>
+          </w:r>
+          <w:proofErr w:type="spellEnd"/>
+          <w:r>
+            <w:rPr>
+              <w:rFonts w:ascii="Calibri" w:eastAsia="Times New Roman" w:hAnsi="Calibri" w:cs="Calibri"/>
+              <w:color w:val="000000"/>
+              <w:lang w:val="en-GB"/>
+            </w:rPr>
+            <w:t xml:space="preserve">, and S. Rose, “Revisiting performance metrics for prediction with rare outcomes,” </w:t>
+          </w:r>
+          <w:r>
+            <w:rPr>
+              <w:rFonts w:ascii="Calibri" w:eastAsia="Times New Roman" w:hAnsi="Calibri" w:cs="Calibri"/>
+              <w:i/>
+              <w:iCs/>
+              <w:color w:val="000000"/>
+              <w:lang w:val="en-GB"/>
+            </w:rPr>
+            <w:t>Stat. Methods Med. Res.</w:t>
+          </w:r>
+          <w:r>
+            <w:rPr>
+              <w:rFonts w:ascii="Calibri" w:eastAsia="Times New Roman" w:hAnsi="Calibri" w:cs="Calibri"/>
+              <w:color w:val="000000"/>
+              <w:lang w:val="en-GB"/>
+            </w:rPr>
+            <w:t xml:space="preserve">, vol. 30, no. 10, pp. 2352–2366, Oct. 2021, </w:t>
+          </w:r>
+          <w:proofErr w:type="spellStart"/>
+          <w:r>
+            <w:rPr>
+              <w:rFonts w:ascii="Calibri" w:eastAsia="Times New Roman" w:hAnsi="Calibri" w:cs="Calibri"/>
+              <w:color w:val="000000"/>
+              <w:lang w:val="en-GB"/>
+            </w:rPr>
+            <w:t>doi</w:t>
+          </w:r>
+          <w:proofErr w:type="spellEnd"/>
+          <w:r>
+            <w:rPr>
+              <w:rFonts w:ascii="Calibri" w:eastAsia="Times New Roman" w:hAnsi="Calibri" w:cs="Calibri"/>
+              <w:color w:val="000000"/>
+              <w:lang w:val="en-GB"/>
+            </w:rPr>
+            <w:t>: 10.1177/09622802211038754.</w:t>
+          </w:r>
+        </w:p>
+        <w:p>
+          <w:pPr>
+            <w:autoSpaceDE w:val="0"/>
+            <w:autoSpaceDN w:val="0"/>
+            <w:ind w:hanging="640"/>
+            <w:divId w:val="1798181252"/>
+            <w:rPr>
+              <w:rFonts w:ascii="Calibri" w:eastAsia="Times New Roman" w:hAnsi="Calibri" w:cs="Calibri"/>
+              <w:color w:val="000000"/>
+              <w:lang w:val="en-GB"/>
+            </w:rPr>
+          </w:pPr>
+          <w:r>
+            <w:rPr>
+              <w:rFonts w:ascii="Calibri" w:eastAsia="Times New Roman" w:hAnsi="Calibri" w:cs="Calibri"/>
+              <w:color w:val="000000"/>
+              <w:lang w:val="en-GB"/>
+            </w:rPr>
+            <w:t>[29]</w:t>
+          </w:r>
+          <w:r>
+            <w:rPr>
+              <w:rFonts w:ascii="Calibri" w:eastAsia="Times New Roman" w:hAnsi="Calibri" w:cs="Calibri"/>
+              <w:color w:val="000000"/>
+              <w:lang w:val="en-GB"/>
+            </w:rPr>
+            <w:tab/>
+            <w:t xml:space="preserve">G. Wu and J. Zhu, “Multi-label classification: do hamming loss and subset accuracy really conflict with each </w:t>
+          </w:r>
+          <w:proofErr w:type="gramStart"/>
+          <w:r>
+            <w:rPr>
+              <w:rFonts w:ascii="Calibri" w:eastAsia="Times New Roman" w:hAnsi="Calibri" w:cs="Calibri"/>
+              <w:color w:val="000000"/>
+              <w:lang w:val="en-GB"/>
+            </w:rPr>
+            <w:t>other?,</w:t>
+          </w:r>
+          <w:proofErr w:type="gramEnd"/>
+          <w:r>
+            <w:rPr>
+              <w:rFonts w:ascii="Calibri" w:eastAsia="Times New Roman" w:hAnsi="Calibri" w:cs="Calibri"/>
+              <w:color w:val="000000"/>
+              <w:lang w:val="en-GB"/>
+            </w:rPr>
+            <w:t xml:space="preserve">” </w:t>
+          </w:r>
+          <w:r>
+            <w:rPr>
+              <w:rFonts w:ascii="Calibri" w:eastAsia="Times New Roman" w:hAnsi="Calibri" w:cs="Calibri"/>
+              <w:i/>
+              <w:iCs/>
+              <w:color w:val="000000"/>
+              <w:lang w:val="en-GB"/>
+            </w:rPr>
+            <w:t>Adv. Neural Inf. Process. Syst.</w:t>
+          </w:r>
+          <w:r>
+            <w:rPr>
+              <w:rFonts w:ascii="Calibri" w:eastAsia="Times New Roman" w:hAnsi="Calibri" w:cs="Calibri"/>
+              <w:color w:val="000000"/>
+              <w:lang w:val="en-GB"/>
+            </w:rPr>
+            <w:t>, vol. 33, pp. 3130–3140, 2020.</w:t>
+          </w:r>
+        </w:p>
+        <w:p>
+          <w:pPr>
+            <w:autoSpaceDE w:val="0"/>
+            <w:autoSpaceDN w:val="0"/>
+            <w:ind w:hanging="640"/>
+            <w:divId w:val="1376589053"/>
+            <w:rPr>
+              <w:rFonts w:ascii="Calibri" w:eastAsia="Times New Roman" w:hAnsi="Calibri" w:cs="Calibri"/>
+              <w:color w:val="000000"/>
+              <w:lang w:val="en-GB"/>
+            </w:rPr>
+          </w:pPr>
+          <w:r>
+            <w:rPr>
+              <w:rFonts w:ascii="Calibri" w:eastAsia="Times New Roman" w:hAnsi="Calibri" w:cs="Calibri"/>
+              <w:color w:val="000000"/>
+              <w:lang w:val="en-GB"/>
+            </w:rPr>
+            <w:t>[30]</w:t>
+          </w:r>
+          <w:r>
+            <w:rPr>
+              <w:rFonts w:ascii="Calibri" w:eastAsia="Times New Roman" w:hAnsi="Calibri" w:cs="Calibri"/>
+              <w:color w:val="000000"/>
+              <w:lang w:val="en-GB"/>
+            </w:rPr>
+            <w:tab/>
+            <w:t xml:space="preserve">A. Luque, A. Carrasco, A. Martín, and A. de las Heras, “The impact of class imbalance in classification performance metrics based on the binary confusion matrix,” </w:t>
+          </w:r>
+          <w:r>
+            <w:rPr>
+              <w:rFonts w:ascii="Calibri" w:eastAsia="Times New Roman" w:hAnsi="Calibri" w:cs="Calibri"/>
+              <w:i/>
+              <w:iCs/>
+              <w:color w:val="000000"/>
+              <w:lang w:val="en-GB"/>
+            </w:rPr>
+            <w:t xml:space="preserve">Pattern </w:t>
+          </w:r>
+          <w:proofErr w:type="spellStart"/>
+          <w:r>
+            <w:rPr>
+              <w:rFonts w:ascii="Calibri" w:eastAsia="Times New Roman" w:hAnsi="Calibri" w:cs="Calibri"/>
+              <w:i/>
+              <w:iCs/>
+              <w:color w:val="000000"/>
+              <w:lang w:val="en-GB"/>
+            </w:rPr>
+            <w:t>Recognit</w:t>
+          </w:r>
+          <w:proofErr w:type="spellEnd"/>
+          <w:r>
+            <w:rPr>
+              <w:rFonts w:ascii="Calibri" w:eastAsia="Times New Roman" w:hAnsi="Calibri" w:cs="Calibri"/>
+              <w:i/>
+              <w:iCs/>
+              <w:color w:val="000000"/>
+              <w:lang w:val="en-GB"/>
+            </w:rPr>
+            <w:t>.</w:t>
+          </w:r>
+          <w:r>
+            <w:rPr>
+              <w:rFonts w:ascii="Calibri" w:eastAsia="Times New Roman" w:hAnsi="Calibri" w:cs="Calibri"/>
+              <w:color w:val="000000"/>
+              <w:lang w:val="en-GB"/>
+            </w:rPr>
+            <w:t xml:space="preserve">, vol. 91, pp. 216–231, Jul. 2019, </w:t>
+          </w:r>
+          <w:proofErr w:type="spellStart"/>
+          <w:r>
+            <w:rPr>
+              <w:rFonts w:ascii="Calibri" w:eastAsia="Times New Roman" w:hAnsi="Calibri" w:cs="Calibri"/>
+              <w:color w:val="000000"/>
+              <w:lang w:val="en-GB"/>
+            </w:rPr>
+            <w:t>doi</w:t>
+          </w:r>
+          <w:proofErr w:type="spellEnd"/>
+          <w:r>
+            <w:rPr>
+              <w:rFonts w:ascii="Calibri" w:eastAsia="Times New Roman" w:hAnsi="Calibri" w:cs="Calibri"/>
+              <w:color w:val="000000"/>
+              <w:lang w:val="en-GB"/>
+            </w:rPr>
+            <w:t>: 10.1016/j.patcog.2019.02.023.</w:t>
+          </w:r>
+        </w:p>
+        <w:p>
+          <w:pPr>
+            <w:autoSpaceDE w:val="0"/>
+            <w:autoSpaceDN w:val="0"/>
+            <w:ind w:hanging="640"/>
+            <w:divId w:val="235094435"/>
+            <w:rPr>
+              <w:rFonts w:ascii="Calibri" w:eastAsia="Times New Roman" w:hAnsi="Calibri" w:cs="Calibri"/>
+              <w:color w:val="000000"/>
+              <w:lang w:val="en-GB"/>
+            </w:rPr>
+          </w:pPr>
+          <w:r>
+            <w:rPr>
+              <w:rFonts w:ascii="Calibri" w:eastAsia="Times New Roman" w:hAnsi="Calibri" w:cs="Calibri"/>
+              <w:color w:val="000000"/>
+              <w:lang w:val="en-GB"/>
+            </w:rPr>
+            <w:t>[31]</w:t>
+          </w:r>
+          <w:r>
+            <w:rPr>
+              <w:rFonts w:ascii="Calibri" w:eastAsia="Times New Roman" w:hAnsi="Calibri" w:cs="Calibri"/>
+              <w:color w:val="000000"/>
+              <w:lang w:val="en-GB"/>
+            </w:rPr>
+            <w:tab/>
+          </w:r>
+          <w:proofErr w:type="spellStart"/>
+          <w:r>
+            <w:rPr>
+              <w:rFonts w:ascii="Calibri" w:eastAsia="Times New Roman" w:hAnsi="Calibri" w:cs="Calibri"/>
+              <w:color w:val="000000"/>
+              <w:lang w:val="en-GB"/>
+            </w:rPr>
+            <w:t>Sgt.</w:t>
+          </w:r>
+          <w:proofErr w:type="spellEnd"/>
+          <w:r>
+            <w:rPr>
+              <w:rFonts w:ascii="Calibri" w:eastAsia="Times New Roman" w:hAnsi="Calibri" w:cs="Calibri"/>
+              <w:color w:val="000000"/>
+              <w:lang w:val="en-GB"/>
+            </w:rPr>
+            <w:t xml:space="preserve"> Peppers, “Drug Design with Small Molecule SMILES,” https://www.kaggle.com/datasets/art3mis/chembl22.</w:t>
+          </w:r>
+        </w:p>
+        <w:p>
+          <w:pPr>
+            <w:autoSpaceDE w:val="0"/>
+            <w:autoSpaceDN w:val="0"/>
+            <w:ind w:hanging="640"/>
+            <w:divId w:val="312292261"/>
+            <w:rPr>
+              <w:rFonts w:ascii="Calibri" w:eastAsia="Times New Roman" w:hAnsi="Calibri" w:cs="Calibri"/>
+              <w:color w:val="000000"/>
+              <w:lang w:val="en-GB"/>
+            </w:rPr>
+          </w:pPr>
+          <w:r>
+            <w:rPr>
+              <w:rFonts w:ascii="Calibri" w:eastAsia="Times New Roman" w:hAnsi="Calibri" w:cs="Calibri"/>
+              <w:color w:val="000000"/>
+              <w:lang w:val="en-GB"/>
+            </w:rPr>
+            <w:t>[32]</w:t>
+          </w:r>
+          <w:r>
+            <w:rPr>
+              <w:rFonts w:ascii="Calibri" w:eastAsia="Times New Roman" w:hAnsi="Calibri" w:cs="Calibri"/>
+              <w:color w:val="000000"/>
+              <w:lang w:val="en-GB"/>
+            </w:rPr>
+            <w:tab/>
+            <w:t xml:space="preserve">C. Knox </w:t>
+          </w:r>
+          <w:r>
+            <w:rPr>
+              <w:rFonts w:ascii="Calibri" w:eastAsia="Times New Roman" w:hAnsi="Calibri" w:cs="Calibri"/>
+              <w:i/>
+              <w:iCs/>
+              <w:color w:val="000000"/>
+              <w:lang w:val="en-GB"/>
+            </w:rPr>
+            <w:t>et al.</w:t>
+          </w:r>
+          <w:r>
+            <w:rPr>
+              <w:rFonts w:ascii="Calibri" w:eastAsia="Times New Roman" w:hAnsi="Calibri" w:cs="Calibri"/>
+              <w:color w:val="000000"/>
+              <w:lang w:val="en-GB"/>
+            </w:rPr>
+            <w:t>, “</w:t>
+          </w:r>
+          <w:proofErr w:type="spellStart"/>
+          <w:r>
+            <w:rPr>
+              <w:rFonts w:ascii="Calibri" w:eastAsia="Times New Roman" w:hAnsi="Calibri" w:cs="Calibri"/>
+              <w:color w:val="000000"/>
+              <w:lang w:val="en-GB"/>
+            </w:rPr>
+            <w:t>DrugBank</w:t>
+          </w:r>
+          <w:proofErr w:type="spellEnd"/>
+          <w:r>
+            <w:rPr>
+              <w:rFonts w:ascii="Calibri" w:eastAsia="Times New Roman" w:hAnsi="Calibri" w:cs="Calibri"/>
+              <w:color w:val="000000"/>
+              <w:lang w:val="en-GB"/>
+            </w:rPr>
+            <w:t xml:space="preserve"> 6.0: the </w:t>
+          </w:r>
+          <w:proofErr w:type="spellStart"/>
+          <w:r>
+            <w:rPr>
+              <w:rFonts w:ascii="Calibri" w:eastAsia="Times New Roman" w:hAnsi="Calibri" w:cs="Calibri"/>
+              <w:color w:val="000000"/>
+              <w:lang w:val="en-GB"/>
+            </w:rPr>
+            <w:t>DrugBank</w:t>
+          </w:r>
+          <w:proofErr w:type="spellEnd"/>
+          <w:r>
+            <w:rPr>
+              <w:rFonts w:ascii="Calibri" w:eastAsia="Times New Roman" w:hAnsi="Calibri" w:cs="Calibri"/>
+              <w:color w:val="000000"/>
+              <w:lang w:val="en-GB"/>
+            </w:rPr>
+            <w:t xml:space="preserve"> Knowledgebase for 2024,” </w:t>
+          </w:r>
+          <w:r>
+            <w:rPr>
+              <w:rFonts w:ascii="Calibri" w:eastAsia="Times New Roman" w:hAnsi="Calibri" w:cs="Calibri"/>
+              <w:i/>
+              <w:iCs/>
+              <w:color w:val="000000"/>
+              <w:lang w:val="en-GB"/>
+            </w:rPr>
+            <w:t>Nucleic Acids Res.</w:t>
+          </w:r>
+          <w:r>
+            <w:rPr>
+              <w:rFonts w:ascii="Calibri" w:eastAsia="Times New Roman" w:hAnsi="Calibri" w:cs="Calibri"/>
+              <w:color w:val="000000"/>
+              <w:lang w:val="en-GB"/>
+            </w:rPr>
+            <w:t xml:space="preserve">, vol. 52, no. D1, pp. D1265–D1275, Jan. 2024, </w:t>
+          </w:r>
+          <w:proofErr w:type="spellStart"/>
+          <w:r>
+            <w:rPr>
+              <w:rFonts w:ascii="Calibri" w:eastAsia="Times New Roman" w:hAnsi="Calibri" w:cs="Calibri"/>
+              <w:color w:val="000000"/>
+              <w:lang w:val="en-GB"/>
+            </w:rPr>
+            <w:t>doi</w:t>
+          </w:r>
+          <w:proofErr w:type="spellEnd"/>
+          <w:r>
+            <w:rPr>
+              <w:rFonts w:ascii="Calibri" w:eastAsia="Times New Roman" w:hAnsi="Calibri" w:cs="Calibri"/>
+              <w:color w:val="000000"/>
+              <w:lang w:val="en-GB"/>
+            </w:rPr>
+            <w:t>: 10.1093/</w:t>
+          </w:r>
+          <w:proofErr w:type="spellStart"/>
+          <w:r>
+            <w:rPr>
+              <w:rFonts w:ascii="Calibri" w:eastAsia="Times New Roman" w:hAnsi="Calibri" w:cs="Calibri"/>
+              <w:color w:val="000000"/>
+              <w:lang w:val="en-GB"/>
+            </w:rPr>
+            <w:t>nar</w:t>
+          </w:r>
+          <w:proofErr w:type="spellEnd"/>
+          <w:r>
+            <w:rPr>
+              <w:rFonts w:ascii="Calibri" w:eastAsia="Times New Roman" w:hAnsi="Calibri" w:cs="Calibri"/>
+              <w:color w:val="000000"/>
+              <w:lang w:val="en-GB"/>
+            </w:rPr>
+            <w:t>/gkad976.</w:t>
+          </w:r>
+        </w:p>
+        <w:p>
+          <w:pPr>
+            <w:autoSpaceDE w:val="0"/>
+            <w:autoSpaceDN w:val="0"/>
+            <w:ind w:hanging="640"/>
+            <w:divId w:val="1036543995"/>
+            <w:rPr>
+              <w:rFonts w:ascii="Calibri" w:eastAsia="Times New Roman" w:hAnsi="Calibri" w:cs="Calibri"/>
+              <w:color w:val="000000"/>
+              <w:lang w:val="en-GB"/>
+            </w:rPr>
+          </w:pPr>
+          <w:r>
+            <w:rPr>
+              <w:rFonts w:ascii="Calibri" w:eastAsia="Times New Roman" w:hAnsi="Calibri" w:cs="Calibri"/>
+              <w:color w:val="000000"/>
+              <w:lang w:val="en-GB"/>
+            </w:rPr>
+            <w:t>[33]</w:t>
+          </w:r>
+          <w:r>
+            <w:rPr>
+              <w:rFonts w:ascii="Calibri" w:eastAsia="Times New Roman" w:hAnsi="Calibri" w:cs="Calibri"/>
+              <w:color w:val="000000"/>
+              <w:lang w:val="en-GB"/>
+            </w:rPr>
+            <w:tab/>
+            <w:t xml:space="preserve">A. </w:t>
+          </w:r>
+          <w:proofErr w:type="spellStart"/>
+          <w:r>
+            <w:rPr>
+              <w:rFonts w:ascii="Calibri" w:eastAsia="Times New Roman" w:hAnsi="Calibri" w:cs="Calibri"/>
+              <w:color w:val="000000"/>
+              <w:lang w:val="en-GB"/>
+            </w:rPr>
+            <w:t>Gaulton</w:t>
+          </w:r>
+          <w:proofErr w:type="spellEnd"/>
+          <w:r>
+            <w:rPr>
+              <w:rFonts w:ascii="Calibri" w:eastAsia="Times New Roman" w:hAnsi="Calibri" w:cs="Calibri"/>
+              <w:color w:val="000000"/>
+              <w:lang w:val="en-GB"/>
+            </w:rPr>
+            <w:t xml:space="preserve"> </w:t>
+          </w:r>
+          <w:r>
+            <w:rPr>
+              <w:rFonts w:ascii="Calibri" w:eastAsia="Times New Roman" w:hAnsi="Calibri" w:cs="Calibri"/>
+              <w:i/>
+              <w:iCs/>
+              <w:color w:val="000000"/>
+              <w:lang w:val="en-GB"/>
+            </w:rPr>
+            <w:t>et al.</w:t>
+          </w:r>
+          <w:r>
+            <w:rPr>
+              <w:rFonts w:ascii="Calibri" w:eastAsia="Times New Roman" w:hAnsi="Calibri" w:cs="Calibri"/>
+              <w:color w:val="000000"/>
+              <w:lang w:val="en-GB"/>
+            </w:rPr>
+            <w:t xml:space="preserve">, “The </w:t>
+          </w:r>
+          <w:proofErr w:type="spellStart"/>
+          <w:r>
+            <w:rPr>
+              <w:rFonts w:ascii="Calibri" w:eastAsia="Times New Roman" w:hAnsi="Calibri" w:cs="Calibri"/>
+              <w:color w:val="000000"/>
+              <w:lang w:val="en-GB"/>
+            </w:rPr>
+            <w:t>ChEMBL</w:t>
+          </w:r>
+          <w:proofErr w:type="spellEnd"/>
+          <w:r>
+            <w:rPr>
+              <w:rFonts w:ascii="Calibri" w:eastAsia="Times New Roman" w:hAnsi="Calibri" w:cs="Calibri"/>
+              <w:color w:val="000000"/>
+              <w:lang w:val="en-GB"/>
+            </w:rPr>
+            <w:t xml:space="preserve"> database in 2017,” </w:t>
+          </w:r>
+          <w:r>
+            <w:rPr>
+              <w:rFonts w:ascii="Calibri" w:eastAsia="Times New Roman" w:hAnsi="Calibri" w:cs="Calibri"/>
+              <w:i/>
+              <w:iCs/>
+              <w:color w:val="000000"/>
+              <w:lang w:val="en-GB"/>
+            </w:rPr>
+            <w:t>Nucleic Acids Res.</w:t>
+          </w:r>
+          <w:r>
+            <w:rPr>
+              <w:rFonts w:ascii="Calibri" w:eastAsia="Times New Roman" w:hAnsi="Calibri" w:cs="Calibri"/>
+              <w:color w:val="000000"/>
+              <w:lang w:val="en-GB"/>
+            </w:rPr>
+            <w:t xml:space="preserve">, vol. 45, no. D1, pp. D945–D954, Jan. 2017, </w:t>
+          </w:r>
+          <w:proofErr w:type="spellStart"/>
+          <w:r>
+            <w:rPr>
+              <w:rFonts w:ascii="Calibri" w:eastAsia="Times New Roman" w:hAnsi="Calibri" w:cs="Calibri"/>
+              <w:color w:val="000000"/>
+              <w:lang w:val="en-GB"/>
+            </w:rPr>
+            <w:t>doi</w:t>
+          </w:r>
+          <w:proofErr w:type="spellEnd"/>
+          <w:r>
+            <w:rPr>
+              <w:rFonts w:ascii="Calibri" w:eastAsia="Times New Roman" w:hAnsi="Calibri" w:cs="Calibri"/>
+              <w:color w:val="000000"/>
+              <w:lang w:val="en-GB"/>
+            </w:rPr>
+            <w:t>: 10.1093/</w:t>
+          </w:r>
+          <w:proofErr w:type="spellStart"/>
+          <w:r>
+            <w:rPr>
+              <w:rFonts w:ascii="Calibri" w:eastAsia="Times New Roman" w:hAnsi="Calibri" w:cs="Calibri"/>
+              <w:color w:val="000000"/>
+              <w:lang w:val="en-GB"/>
+            </w:rPr>
+            <w:t>nar</w:t>
+          </w:r>
+          <w:proofErr w:type="spellEnd"/>
+          <w:r>
+            <w:rPr>
+              <w:rFonts w:ascii="Calibri" w:eastAsia="Times New Roman" w:hAnsi="Calibri" w:cs="Calibri"/>
+              <w:color w:val="000000"/>
+              <w:lang w:val="en-GB"/>
+            </w:rPr>
+            <w:t>/gkw1074.</w:t>
+          </w:r>
+        </w:p>
+        <w:p>
+          <w:pPr>
+            <w:autoSpaceDE w:val="0"/>
+            <w:autoSpaceDN w:val="0"/>
+            <w:ind w:hanging="640"/>
+            <w:divId w:val="758067194"/>
+            <w:rPr>
+              <w:rFonts w:ascii="Calibri" w:eastAsia="Times New Roman" w:hAnsi="Calibri" w:cs="Calibri"/>
+              <w:color w:val="000000"/>
+            </w:rPr>
+          </w:pPr>
+          <w:r>
+            <w:rPr>
+              <w:rFonts w:ascii="Calibri" w:eastAsia="Times New Roman" w:hAnsi="Calibri" w:cs="Calibri"/>
+              <w:color w:val="000000"/>
+              <w:lang w:val="en-GB"/>
+            </w:rPr>
+            <w:t>[34]</w:t>
           </w:r>
           <w:r>
             <w:rPr>
@@ -19868,6 +21749,7 @@
             </w:rPr>
             <w:t xml:space="preserve">Nat. </w:t>
           </w:r>
+          <w:proofErr w:type="spellStart"/>
           <w:r>
             <w:rPr>
               <w:rFonts w:ascii="Calibri" w:eastAsia="Times New Roman" w:hAnsi="Calibri" w:cs="Calibri"/>
@@ -19875,14 +21757,56 @@
               <w:iCs/>
               <w:color w:val="000000"/>
             </w:rPr>
-            <w:t>Commun.</w:t>
-          </w:r>
-          <w:r>
-            <w:rPr>
-              <w:rFonts w:ascii="Calibri" w:eastAsia="Times New Roman" w:hAnsi="Calibri" w:cs="Calibri"/>
-              <w:color w:val="000000"/>
-            </w:rPr>
-            <w:t>, vol. 16, no. 1, p. 3420, Apr. 2025, doi: 10.1038/s41467-025-58804-4.</w:t>
+            <w:t>Commun</w:t>
+          </w:r>
+          <w:proofErr w:type="spellEnd"/>
+          <w:r>
+            <w:rPr>
+              <w:rFonts w:ascii="Calibri" w:eastAsia="Times New Roman" w:hAnsi="Calibri" w:cs="Calibri"/>
+              <w:i/>
+              <w:iCs/>
+              <w:color w:val="000000"/>
+            </w:rPr>
+            <w:t>.</w:t>
+          </w:r>
+          <w:r>
+            <w:rPr>
+              <w:rFonts w:ascii="Calibri" w:eastAsia="Times New Roman" w:hAnsi="Calibri" w:cs="Calibri"/>
+              <w:color w:val="000000"/>
+            </w:rPr>
+            <w:t xml:space="preserve">, vol. 16, no. 1, p. 3420, </w:t>
+          </w:r>
+          <w:proofErr w:type="spellStart"/>
+          <w:r>
+            <w:rPr>
+              <w:rFonts w:ascii="Calibri" w:eastAsia="Times New Roman" w:hAnsi="Calibri" w:cs="Calibri"/>
+              <w:color w:val="000000"/>
+            </w:rPr>
+            <w:t>Apr</w:t>
+          </w:r>
+          <w:proofErr w:type="spellEnd"/>
+          <w:r>
+            <w:rPr>
+              <w:rFonts w:ascii="Calibri" w:eastAsia="Times New Roman" w:hAnsi="Calibri" w:cs="Calibri"/>
+              <w:color w:val="000000"/>
+            </w:rPr>
+            <w:t xml:space="preserve">. 2025, </w:t>
+          </w:r>
+          <w:proofErr w:type="spellStart"/>
+          <w:r>
+            <w:rPr>
+              <w:rFonts w:ascii="Calibri" w:eastAsia="Times New Roman" w:hAnsi="Calibri" w:cs="Calibri"/>
+              <w:color w:val="000000"/>
+            </w:rPr>
+            <w:t>doi</w:t>
+          </w:r>
+          <w:proofErr w:type="spellEnd"/>
+          <w:r>
+            <w:rPr>
+              <w:rFonts w:ascii="Calibri" w:eastAsia="Times New Roman" w:hAnsi="Calibri" w:cs="Calibri"/>
+              <w:color w:val="000000"/>
+            </w:rPr>
+            <w:t>: 10.1038/s41467-025-58804-4.</w:t>
           </w:r>
         </w:p>
         <w:p>
@@ -19916,6 +21840,7 @@
         <w:rPr>
           <w:lang w:val="en-GB"/>
         </w:rPr>
+        <w:lastRenderedPageBreak/>
         <w:t>Anexos</w:t>
       </w:r>
       <w:bookmarkEnd w:id="62"/>
@@ -19935,7 +21860,33 @@
         <w:rPr>
           <w:lang w:val="en-GB"/>
         </w:rPr>
-        <w:t>“inchi_output.txt” – 1,575,727 InChI strings derived from ChembL used for MLM training</w:t>
+        <w:t xml:space="preserve">“inchi_output.txt” – 1,575,727 InChI strings derived from </w:t>
+      </w:r>
+      <w:proofErr w:type="spellStart"/>
+      <w:r>
+        <w:rPr>
+          <w:lang w:val="en-GB"/>
+        </w:rPr>
+        <w:t>Ch</w:t>
+      </w:r>
+      <w:r>
+        <w:rPr>
+          <w:lang w:val="en-GB"/>
+        </w:rPr>
+        <w:t>EMB</w:t>
+      </w:r>
+      <w:r>
+        <w:rPr>
+          <w:lang w:val="en-GB"/>
+        </w:rPr>
+        <w:t>L</w:t>
+      </w:r>
+      <w:proofErr w:type="spellEnd"/>
+      <w:r>
+        <w:rPr>
+          <w:lang w:val="en-GB"/>
+        </w:rPr>
+        <w:t xml:space="preserve"> used for MLM training</w:t>
       </w:r>
       <w:r>
         <w:rPr>
@@ -20325,7 +22276,7 @@
         <v:path o:extrusionok="f" gradientshapeok="t" o:connecttype="rect"/>
         <o:lock v:ext="edit" aspectratio="t"/>
       </v:shapetype>
-      <v:shape id="_x0000_i1025" type="#_x0000_t75" style="width:168.75pt;height:168.75pt;visibility:visible" o:bullet="t">
+      <v:shape id="_x0000_i1025" type="#_x0000_t75" style="width:168.35pt;height:168.35pt;visibility:visible" o:bullet="t">
         <v:imagedata r:id="rId1" o:title=""/>
       </v:shape>
     </w:pict>
@@ -24735,9 +26686,11 @@
     <w:rsid w:val="00203B50"/>
     <w:rsid w:val="00222139"/>
     <w:rsid w:val="00253AC9"/>
+    <w:rsid w:val="0029472C"/>
     <w:rsid w:val="002F3C94"/>
     <w:rsid w:val="003012D3"/>
     <w:rsid w:val="00334480"/>
+    <w:rsid w:val="00377CC5"/>
     <w:rsid w:val="003D7E12"/>
     <w:rsid w:val="004026C8"/>
     <w:rsid w:val="004206C1"/>
@@ -24747,9 +26700,12 @@
     <w:rsid w:val="004D7667"/>
     <w:rsid w:val="004F35EA"/>
     <w:rsid w:val="00501E40"/>
+    <w:rsid w:val="00540188"/>
     <w:rsid w:val="005523F1"/>
     <w:rsid w:val="00627190"/>
+    <w:rsid w:val="00640100"/>
     <w:rsid w:val="00696189"/>
+    <w:rsid w:val="006B03AA"/>
     <w:rsid w:val="006C0ACC"/>
     <w:rsid w:val="006D1C56"/>
     <w:rsid w:val="00787247"/>
@@ -24777,6 +26733,7 @@
     <w:rsid w:val="00EE0F88"/>
     <w:rsid w:val="00F02213"/>
     <w:rsid w:val="00FB4BB7"/>
+    <w:rsid w:val="00FD4788"/>
     <w:rsid w:val="00FF0BFB"/>
   </w:rsids>
   <m:mathPr>
@@ -25511,7 +27468,7 @@
 
 <file path=word/webextensions/taskpanes.xml><?xml version="1.0" encoding="utf-8"?>
 <wetp:taskpanes xmlns:wetp="http://schemas.microsoft.com/office/webextensions/taskpanes/2010/11">
-  <wetp:taskpane dockstate="right" visibility="0" width="525" row="2">
+  <wetp:taskpane dockstate="right" visibility="0" width="525" row="1">
     <wetp:webextensionref xmlns:r="http://schemas.openxmlformats.org/officeDocument/2006/relationships" r:id="rId1"/>
   </wetp:taskpane>
 </wetp:taskpanes>
@@ -25525,8 +27482,8 @@
   </we:alternateReferences>
   <we:properties>
     <we:property name="MENDELEY_BIBLIOGRAPHY_IS_DIRTY" value="true"/>
-    <we:property name="MENDELEY_BIBLIOGRAPHY_LAST_MODIFIED" value="1776289339762"/>
-    <we:property name="MENDELEY_CITATIONS" value="[{&quot;citationID&quot;:&quot;MENDELEY_CITATION_917e5d1d-8132-466d-b0a6-a0da3177f8a4&quot;,&quot;properties&quot;:{&quot;noteIndex&quot;:0},&quot;isEdited&quot;:false,&quot;manualOverride&quot;:{&quot;isManuallyOverridden&quot;:false,&quot;citeprocText&quot;:&quot;[1], [2]&quot;,&quot;manualOverrideText&quot;:&quot;&quot;},&quot;citationTag&quot;:&quot;MENDELEY_CITATION_v3_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&quot;,&quot;citationItems&quot;:[{&quot;id&quot;:&quot;bf4b9b8e-8cd4-3267-8fea-3e05e74bdeb9&quot;,&quot;itemData&quot;:{&quot;type&quot;:&quot;chapter&quot;,&quot;id&quot;:&quot;bf4b9b8e-8cd4-3267-8fea-3e05e74bdeb9&quot;,&quot;title&quot;:&quot;Drug Metabolism: Phase I and Phase II Metabolic Pathways&quot;,&quot;author&quot;:[{&quot;family&quot;:&quot;ul Amin Mohsin&quot;,&quot;given&quot;:&quot;Noor&quot;,&quot;parse-names&quot;:false,&quot;dropping-particle&quot;:&quot;&quot;,&quot;non-dropping-particle&quot;:&quot;&quot;},{&quot;family&quot;:&quot;Farrukh&quot;,&quot;given&quot;:&quot;Maryam&quot;,&quot;parse-names&quot;:false,&quot;dropping-particle&quot;:&quot;&quot;,&quot;non-dropping-particle&quot;:&quot;&quot;},{&quot;family&quot;:&quot;Shahzadi&quot;,&quot;given&quot;:&quot;Saba&quot;,&quot;parse-names&quot;:false,&quot;dropping-particle&quot;:&quot;&quot;,&quot;non-dropping-particle&quot;:&quot;&quot;},{&quot;family&quot;:&quot;Irfan&quot;,&quot;given&quot;:&quot;Muhammad&quot;,&quot;parse-names&quot;:false,&quot;dropping-particle&quot;:&quot;&quot;,&quot;non-dropping-particle&quot;:&quot;&quot;}],&quot;DOI&quot;:&quot;10.5772/intechopen.112854&quot;,&quot;issued&quot;:{&quot;date-parts&quot;:[[2024,2,14]]},&quot;container-title-short&quot;:&quot;&quot;},&quot;isTemporary&quot;:false},{&quot;id&quot;:&quot;38c736ba-04f7-31e6-a646-9680ae3c3eda&quot;,&quot;itemData&quot;:{&quot;type&quot;:&quot;article-journal&quot;,&quot;id&quot;:&quot;38c736ba-04f7-31e6-a646-9680ae3c3eda&quot;,&quot;title&quot;:&quot;Post-marketing withdrawal of 462 medicinal products because of adverse drug reactions: a systematic review of the world literature&quot;,&quot;author&quot;:[{&quot;family&quot;:&quot;Onakpoya&quot;,&quot;given&quot;:&quot;Igho J.&quot;,&quot;parse-names&quot;:false,&quot;dropping-particle&quot;:&quot;&quot;,&quot;non-dropping-particle&quot;:&quot;&quot;},{&quot;family&quot;:&quot;Heneghan&quot;,&quot;given&quot;:&quot;Carl J.&quot;,&quot;parse-names&quot;:false,&quot;dropping-particle&quot;:&quot;&quot;,&quot;non-dropping-particle&quot;:&quot;&quot;},{&quot;family&quot;:&quot;Aronson&quot;,&quot;given&quot;:&quot;Jeffrey K.&quot;,&quot;parse-names&quot;:false,&quot;dropping-particle&quot;:&quot;&quot;,&quot;non-dropping-particle&quot;:&quot;&quot;}],&quot;container-title&quot;:&quot;BMC Medicine&quot;,&quot;container-title-short&quot;:&quot;BMC Med.&quot;,&quot;DOI&quot;:&quot;10.1186/s12916-016-0553-2&quot;,&quot;ISSN&quot;:&quot;1741-7015&quot;,&quot;issued&quot;:{&quot;date-parts&quot;:[[2016,12,4]]},&quot;page&quot;:&quot;10&quot;,&quot;issue&quot;:&quot;1&quot;,&quot;volume&quot;:&quot;14&quot;},&quot;isTemporary&quot;:false}]},{&quot;citationID&quot;:&quot;MENDELEY_CITATION_4c61a503-9278-499d-9d99-f0a543c311cd&quot;,&quot;properties&quot;:{&quot;noteIndex&quot;:0},&quot;isEdited&quot;:false,&quot;manualOverride&quot;:{&quot;isManuallyOverridden&quot;:false,&quot;citeprocText&quot;:&quot;[3]&quot;,&quot;manualOverrideText&quot;:&quot;&quot;},&quot;citationTag&quot;:&quot;MENDELEY_CITATION_v3_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&quot;,&quot;citationItems&quot;:[{&quot;id&quot;:&quot;a7499272-8f2c-3731-b644-7b0aae951850&quot;,&quot;itemData&quot;:{&quot;type&quot;:&quot;article-journal&quot;,&quot;id&quot;:&quot;a7499272-8f2c-3731-b644-7b0aae951850&quot;,&quot;title&quot;:&quot;In silico ADME-Tox modeling: progress and prospects&quot;,&quot;author&quot;:[{&quot;family&quot;:&quot;Alqahtani&quot;,&quot;given&quot;:&quot;Saeed&quot;,&quot;parse-names&quot;:false,&quot;dropping-particle&quot;:&quot;&quot;,&quot;non-dropping-particle&quot;:&quot;&quot;}],&quot;container-title&quot;:&quot;Expert Opinion on Drug Metabolism &amp; Toxicology&quot;,&quot;DOI&quot;:&quot;10.1080/17425255.2017.1389897&quot;,&quot;ISSN&quot;:&quot;1742-5255&quot;,&quot;issued&quot;:{&quot;date-parts&quot;:[[2017,11,2]]},&quot;page&quot;:&quot;1147-1158&quot;,&quot;issue&quot;:&quot;11&quot;,&quot;volume&quot;:&quot;13&quot;,&quot;container-title-short&quot;:&quot;Expert Opin. Drug Metab. Toxicol.&quot;},&quot;isTemporary&quot;:false}]},{&quot;citationID&quot;:&quot;MENDELEY_CITATION_f9163c9d-db05-495c-82ad-845f41c010e3&quot;,&quot;properties&quot;:{&quot;noteIndex&quot;:0},&quot;isEdited&quot;:false,&quot;manualOverride&quot;:{&quot;isManuallyOverridden&quot;:false,&quot;citeprocText&quot;:&quot;[4]&quot;,&quot;manualOverrideText&quot;:&quot;&quot;},&quot;citationTag&quot;:&quot;MENDELEY_CITATION_v3_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&quot;,&quot;citationItems&quot;:[{&quot;id&quot;:&quot;41dab8de-eca9-3196-8661-835a96a3207d&quot;,&quot;itemData&quot;:{&quot;type&quot;:&quot;article-journal&quot;,&quot;id&quot;:&quot;41dab8de-eca9-3196-8661-835a96a3207d&quot;,&quot;title&quot;:&quot;Predicting routes of phase I and II metabolism based on quantum mechanics and machine learning&quot;,&quot;author&quot;:[{&quot;family&quot;:&quot;Öeren&quot;,&quot;given&quot;:&quot;Mario&quot;,&quot;parse-names&quot;:false,&quot;dropping-particle&quot;:&quot;&quot;,&quot;non-dropping-particle&quot;:&quot;&quot;},{&quot;family&quot;:&quot;Hunt&quot;,&quot;given&quot;:&quot;Peter A.&quot;,&quot;parse-names&quot;:false,&quot;dropping-particle&quot;:&quot;&quot;,&quot;non-dropping-particle&quot;:&quot;&quot;},{&quot;family&quot;:&quot;Wharrick&quot;,&quot;given&quot;:&quot;Charlotte E.&quot;,&quot;parse-names&quot;:false,&quot;dropping-particle&quot;:&quot;&quot;,&quot;non-dropping-particle&quot;:&quot;&quot;},{&quot;family&quot;:&quot;Tabatabaei Ghomi&quot;,&quot;given&quot;:&quot;Hamed&quot;,&quot;parse-names&quot;:false,&quot;dropping-particle&quot;:&quot;&quot;,&quot;non-dropping-particle&quot;:&quot;&quot;},{&quot;family&quot;:&quot;Segall&quot;,&quot;given&quot;:&quot;Matthew D.&quot;,&quot;parse-names&quot;:false,&quot;dropping-particle&quot;:&quot;&quot;,&quot;non-dropping-particle&quot;:&quot;&quot;}],&quot;container-title&quot;:&quot;Xenobiotica&quot;,&quot;DOI&quot;:&quot;10.1080/00498254.2023.2284251&quot;,&quot;ISSN&quot;:&quot;0049-8254&quot;,&quot;issued&quot;:{&quot;date-parts&quot;:[[2024,8,8]]},&quot;page&quot;:&quot;379-393&quot;,&quot;issue&quot;:&quot;7&quot;,&quot;volume&quot;:&quot;54&quot;,&quot;container-title-short&quot;:&quot;&quot;},&quot;isTemporary&quot;:false}]},{&quot;citationID&quot;:&quot;MENDELEY_CITATION_b3a78241-26d9-4c0f-a776-f58d6393a7c1&quot;,&quot;properties&quot;:{&quot;noteIndex&quot;:0},&quot;isEdited&quot;:false,&quot;manualOverride&quot;:{&quot;isManuallyOverridden&quot;:false,&quot;citeprocText&quot;:&quot;[5]&quot;,&quot;manualOverrideText&quot;:&quot;&quot;},&quot;citationTag&quot;:&quot;MENDELEY_CITATION_v3_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&quot;,&quot;citationItems&quot;:[{&quot;id&quot;:&quot;13bc8314-57b6-3cd6-845d-b642b9f122d5&quot;,&quot;itemData&quot;:{&quot;type&quot;:&quot;webpage&quot;,&quot;id&quot;:&quot;13bc8314-57b6-3cd6-845d-b642b9f122d5&quot;,&quot;title&quot;:&quot;Decoding phase I &amp; II human drug metabolism using the prediction tool MetaSite for chemists, medicinal chemists, and metID experts.&quot;,&quot;author&quot;:[{&quot;family&quot;:&quot;Cruciani&quot;,&quot;given&quot;:&quot;Gabriele&quot;,&quot;parse-names&quot;:false,&quot;dropping-particle&quot;:&quot;&quot;,&quot;non-dropping-particle&quot;:&quot;&quot;},{&quot;family&quot;:&quot;Desantis&quot;,&quot;given&quot;:&quot;Jenny&quot;,&quot;parse-names&quot;:false,&quot;dropping-particle&quot;:&quot;&quot;,&quot;non-dropping-particle&quot;:&quot;&quot;},{&quot;family&quot;:&quot;Palomba&quot;,&quot;given&quot;:&quot;Tommaso&quot;,&quot;parse-names&quot;:false,&quot;dropping-particle&quot;:&quot;&quot;,&quot;non-dropping-particle&quot;:&quot;&quot;},{&quot;family&quot;:&quot;Baroni&quot;,&quot;given&quot;:&quot;Massimo&quot;,&quot;parse-names&quot;:false,&quot;dropping-particle&quot;:&quot;&quot;,&quot;non-dropping-particle&quot;:&quot;&quot;},{&quot;family&quot;:&quot;Valeri&quot;,&quot;given&quot;:&quot;Aurora&quot;,&quot;parse-names&quot;:false,&quot;dropping-particle&quot;:&quot;&quot;,&quot;non-dropping-particle&quot;:&quot;&quot;},{&quot;family&quot;:&quot;Siragusa&quot;,&quot;given&quot;:&quot;Lydia&quot;,&quot;parse-names&quot;:false,&quot;dropping-particle&quot;:&quot;&quot;,&quot;non-dropping-particle&quot;:&quot;&quot;},{&quot;family&quot;:&quot;Venturi&quot;,&quot;given&quot;:&quot;Ludovico&quot;,&quot;parse-names&quot;:false,&quot;dropping-particle&quot;:&quot;&quot;,&quot;non-dropping-particle&quot;:&quot;&quot;},{&quot;family&quot;:&quot;Zamora&quot;,&quot;given&quot;:&quot;Ismael&quot;,&quot;parse-names&quot;:false,&quot;dropping-particle&quot;:&quot;&quot;,&quot;non-dropping-particle&quot;:&quot;&quot;},{&quot;family&quot;:&quot;Meyer&quot;,&quot;given&quot;:&quot;Christophe&quot;,&quot;parse-names&quot;:false,&quot;dropping-particle&quot;:&quot;&quot;,&quot;non-dropping-particle&quot;:&quot;&quot;},{&quot;family&quot;:&quot;Laboureur&quot;,&quot;given&quot;:&quot;Laurent&quot;,&quot;parse-names&quot;:false,&quot;dropping-particle&quot;:&quot;&quot;,&quot;non-dropping-particle&quot;:&quot;&quot;},{&quot;family&quot;:&quot;Emre&quot;,&quot;given&quot;:&quot;Isin&quot;,&quot;parse-names&quot;:false,&quot;dropping-particle&quot;:&quot;&quot;,&quot;non-dropping-particle&quot;:&quot;&quot;},{&quot;family&quot;:&quot;Goracci&quot;,&quot;given&quot;:&quot;Laura&quot;,&quot;parse-names&quot;:false,&quot;dropping-particle&quot;:&quot;&quot;,&quot;non-dropping-particle&quot;:&quot;&quot;}],&quot;issued&quot;:{&quot;date-parts&quot;:[[2024]]},&quot;container-title-short&quot;:&quot;&quot;},&quot;isTemporary&quot;:false}]},{&quot;citationID&quot;:&quot;MENDELEY_CITATION_a090304e-5ae5-4071-9395-15b690c02537&quot;,&quot;properties&quot;:{&quot;noteIndex&quot;:0},&quot;isEdited&quot;:false,&quot;manualOverride&quot;:{&quot;isManuallyOverridden&quot;:false,&quot;citeprocText&quot;:&quot;[6]&quot;,&quot;manualOverrideText&quot;:&quot;&quot;},&quot;citationTag&quot;:&quot;MENDELEY_CITATION_v3_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&quot;,&quot;citationItems&quot;:[{&quot;id&quot;:&quot;30167f7e-6772-397c-8d9b-7e31dc75bdc6&quot;,&quot;itemData&quot;:{&quot;type&quot;:&quot;article-journal&quot;,&quot;id&quot;:&quot;30167f7e-6772-397c-8d9b-7e31dc75bdc6&quot;,&quot;title&quot;:&quot;CYPstrate: A Set of Machine Learning Models for the Accurate Classification of Cytochrome P450 Enzyme Substrates and Non-Substrates&quot;,&quot;author&quot;:[{&quot;family&quot;:&quot;Holmer&quot;,&quot;given&quot;:&quot;Malte&quot;,&quot;parse-names&quot;:false,&quot;dropping-particle&quot;:&quot;&quot;,&quot;non-dropping-particle&quot;:&quot;&quot;},{&quot;family&quot;:&quot;Bruyn Kops&quot;,&quot;given&quot;:&quot;Christina&quot;,&quot;parse-names&quot;:false,&quot;dropping-particle&quot;:&quot;&quot;,&quot;non-dropping-particle&quot;:&quot;de&quot;},{&quot;family&quot;:&quot;Stork&quot;,&quot;given&quot;:&quot;Conrad&quot;,&quot;parse-names&quot;:false,&quot;dropping-particle&quot;:&quot;&quot;,&quot;non-dropping-particle&quot;:&quot;&quot;},{&quot;family&quot;:&quot;Kirchmair&quot;,&quot;given&quot;:&quot;Johannes&quot;,&quot;parse-names&quot;:false,&quot;dropping-particle&quot;:&quot;&quot;,&quot;non-dropping-particle&quot;:&quot;&quot;}],&quot;container-title&quot;:&quot;Molecules&quot;,&quot;DOI&quot;:&quot;10.3390/molecules26154678&quot;,&quot;ISSN&quot;:&quot;1420-3049&quot;,&quot;issued&quot;:{&quot;date-parts&quot;:[[2021,8,2]]},&quot;page&quot;:&quot;4678&quot;,&quot;abstract&quot;:&quot;&lt;p&gt;The interaction of small organic molecules such as drugs, agrochemicals, and cosmetics with cytochrome P450 enzymes (CYPs) can lead to substantial changes in the bioavailability of active substances and hence consequences with respect to pharmacological efficacy and toxicity. Therefore, efficient means of predicting the interactions of small organic molecules with CYPs are of high importance to a host of different industries. In this work, we present a new set of machine learning models for the classification of xenobiotics into substrates and non-substrates of nine human CYP isozymes: CYPs 1A2, 2A6, 2B6, 2C8, 2C9, 2C19, 2D6, 2E1, and 3A4. The models are trained on an extended, high-quality collection of known substrates and non-substrates and have been subjected to thorough validation. Our results show that the models yield competitive performance and are favorable for the detection of CYP substrates. In particular, a new consensus model reached high performance, with Matthews correlation coefficients (MCCs) between 0.45 (CYP2C8) and 0.85 (CYP3A4), although at the cost of coverage. The best models presented in this work are accessible free of charge via the “CYPstrate” module of the New E-Resource for Drug Discovery (NERDD).&lt;/p&gt;&quot;,&quot;issue&quot;:&quot;15&quot;,&quot;volume&quot;:&quot;26&quot;,&quot;container-title-short&quot;:&quot;&quot;},&quot;isTemporary&quot;:false}]},{&quot;citationID&quot;:&quot;MENDELEY_CITATION_b88c5398-356c-4dd6-910a-1154fc2a2abe&quot;,&quot;properties&quot;:{&quot;noteIndex&quot;:0},&quot;isEdited&quot;:false,&quot;manualOverride&quot;:{&quot;isManuallyOverridden&quot;:false,&quot;citeprocText&quot;:&quot;[7]&quot;,&quot;manualOverrideText&quot;:&quot;&quot;},&quot;citationTag&quot;:&quot;MENDELEY_CITATION_v3_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&quot;,&quot;citationItems&quot;:[{&quot;id&quot;:&quot;fa11ca6b-cdbb-3046-b0fc-8f028817e99c&quot;,&quot;itemData&quot;:{&quot;type&quot;:&quot;article-journal&quot;,&quot;id&quot;:&quot;fa11ca6b-cdbb-3046-b0fc-8f028817e99c&quot;,&quot;title&quot;:&quot;CypReact: A Software Tool for in Silico Reactant Prediction for Human Cytochrome P450 Enzymes&quot;,&quot;author&quot;:[{&quot;family&quot;:&quot;Tian&quot;,&quot;given&quot;:&quot;Siyang&quot;,&quot;parse-names&quot;:false,&quot;dropping-particle&quot;:&quot;&quot;,&quot;non-dropping-particle&quot;:&quot;&quot;},{&quot;family&quot;:&quot;Djoumbou-Feunang&quot;,&quot;given&quot;:&quot;Yannick&quot;,&quot;parse-names&quot;:false,&quot;dropping-particle&quot;:&quot;&quot;,&quot;non-dropping-particle&quot;:&quot;&quot;},{&quot;family&quot;:&quot;Greiner&quot;,&quot;given&quot;:&quot;Russell&quot;,&quot;parse-names&quot;:false,&quot;dropping-particle&quot;:&quot;&quot;,&quot;non-dropping-particle&quot;:&quot;&quot;},{&quot;family&quot;:&quot;Wishart&quot;,&quot;given&quot;:&quot;David S&quot;,&quot;parse-names&quot;:false,&quot;dropping-particle&quot;:&quot;&quot;,&quot;non-dropping-particle&quot;:&quot;&quot;}],&quot;container-title&quot;:&quot;Journal of Chemical Information and Modeling&quot;,&quot;DOI&quot;:&quot;10.1021/acs.jcim.8b00035&quot;,&quot;URL&quot;:&quot;https://doi.org/10.1021/acs.jcim.8b00035&quot;,&quot;issued&quot;:{&quot;date-parts&quot;:[[2018]]},&quot;page&quot;:&quot;1282-1291&quot;,&quot;issue&quot;:&quot;6&quot;,&quot;volume&quot;:&quot;58&quot;,&quot;container-title-short&quot;:&quot;J. Chem. Inf. Model.&quot;},&quot;isTemporary&quot;:false}]},{&quot;citationID&quot;:&quot;MENDELEY_CITATION_9e00beb5-b823-441f-bd21-5c0245227aff&quot;,&quot;properties&quot;:{&quot;noteIndex&quot;:0},&quot;isEdited&quot;:false,&quot;manualOverride&quot;:{&quot;isManuallyOverridden&quot;:false,&quot;citeprocText&quot;:&quot;[8]&quot;,&quot;manualOverrideText&quot;:&quot;&quot;},&quot;citationTag&quot;:&quot;MENDELEY_CITATION_v3_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&quot;,&quot;citationItems&quot;:[{&quot;id&quot;:&quot;5396d9c6-cb3b-363a-9678-0b3b627a7437&quot;,&quot;itemData&quot;:{&quot;type&quot;:&quot;article-journal&quot;,&quot;id&quot;:&quot;5396d9c6-cb3b-363a-9678-0b3b627a7437&quot;,&quot;title&quot;:&quot;DeepP450: Predicting Human P450 Activities of Small Molecules by Integrating Pretrained Protein Language Model and Molecular Representation&quot;,&quot;author&quot;:[{&quot;family&quot;:&quot;Chang&quot;,&quot;given&quot;:&quot;Jiamin&quot;,&quot;parse-names&quot;:false,&quot;dropping-particle&quot;:&quot;&quot;,&quot;non-dropping-particle&quot;:&quot;&quot;},{&quot;family&quot;:&quot;Fan&quot;,&quot;given&quot;:&quot;Xiaoyu&quot;,&quot;parse-names&quot;:false,&quot;dropping-particle&quot;:&quot;&quot;,&quot;non-dropping-particle&quot;:&quot;&quot;},{&quot;family&quot;:&quot;Tian&quot;,&quot;given&quot;:&quot;Boxue&quot;,&quot;parse-names&quot;:false,&quot;dropping-particle&quot;:&quot;&quot;,&quot;non-dropping-particle&quot;:&quot;&quot;}],&quot;container-title&quot;:&quot;Journal of Chemical Information and Modeling&quot;,&quot;DOI&quot;:&quot;10.1021/acs.jcim.4c00115&quot;,&quot;URL&quot;:&quot;https://doi.org/10.1021/acs.jcim.4c00115&quot;,&quot;issued&quot;:{&quot;date-parts&quot;:[[2024]]},&quot;page&quot;:&quot;3149-3160&quot;,&quot;issue&quot;:&quot;8&quot;,&quot;volume&quot;:&quot;64&quot;,&quot;container-title-short&quot;:&quot;J. Chem. Inf. Model.&quot;},&quot;isTemporary&quot;:false}]},{&quot;citationID&quot;:&quot;MENDELEY_CITATION_5dca3d77-b598-4d67-9225-e52ba676341f&quot;,&quot;properties&quot;:{&quot;noteIndex&quot;:0},&quot;isEdited&quot;:false,&quot;manualOverride&quot;:{&quot;isManuallyOverridden&quot;:false,&quot;citeprocText&quot;:&quot;[9]&quot;,&quot;manualOverrideText&quot;:&quot;&quot;},&quot;citationTag&quot;:&quot;MENDELEY_CITATION_v3_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&quot;,&quot;citationItems&quot;:[{&quot;id&quot;:&quot;43b0d024-e9b9-3059-b9bc-07339751aa6d&quot;,&quot;itemData&quot;:{&quot;type&quot;:&quot;article-journal&quot;,&quot;id&quot;:&quot;43b0d024-e9b9-3059-b9bc-07339751aa6d&quot;,&quot;title&quot;:&quot;ADMETlab 3.0: an updated comprehensive online ADMET prediction platform enhanced with broader coverage, improved performance, API functionality and decision support&quot;,&quot;author&quot;:[{&quot;family&quot;:&quot;Fu&quot;,&quot;given&quot;:&quot;Li&quot;,&quot;parse-names&quot;:false,&quot;dropping-particle&quot;:&quot;&quot;,&quot;non-dropping-particle&quot;:&quot;&quot;},{&quot;family&quot;:&quot;Shi&quot;,&quot;given&quot;:&quot;Shaohua&quot;,&quot;parse-names&quot;:false,&quot;dropping-particle&quot;:&quot;&quot;,&quot;non-dropping-particle&quot;:&quot;&quot;},{&quot;family&quot;:&quot;Yi&quot;,&quot;given&quot;:&quot;Jiacai&quot;,&quot;parse-names&quot;:false,&quot;dropping-particle&quot;:&quot;&quot;,&quot;non-dropping-particle&quot;:&quot;&quot;},{&quot;family&quot;:&quot;Wang&quot;,&quot;given&quot;:&quot;Ningning&quot;,&quot;parse-names&quot;:false,&quot;dropping-particle&quot;:&quot;&quot;,&quot;non-dropping-particle&quot;:&quot;&quot;},{&quot;family&quot;:&quot;He&quot;,&quot;given&quot;:&quot;Yuanhang&quot;,&quot;parse-names&quot;:false,&quot;dropping-particle&quot;:&quot;&quot;,&quot;non-dropping-particle&quot;:&quot;&quot;},{&quot;family&quot;:&quot;Wu&quot;,&quot;given&quot;:&quot;Zhenxing&quot;,&quot;parse-names&quot;:false,&quot;dropping-particle&quot;:&quot;&quot;,&quot;non-dropping-particle&quot;:&quot;&quot;},{&quot;family&quot;:&quot;Peng&quot;,&quot;given&quot;:&quot;Jinfu&quot;,&quot;parse-names&quot;:false,&quot;dropping-particle&quot;:&quot;&quot;,&quot;non-dropping-particle&quot;:&quot;&quot;},{&quot;family&quot;:&quot;Deng&quot;,&quot;given&quot;:&quot;Youchao&quot;,&quot;parse-names&quot;:false,&quot;dropping-particle&quot;:&quot;&quot;,&quot;non-dropping-particle&quot;:&quot;&quot;},{&quot;family&quot;:&quot;Wang&quot;,&quot;given&quot;:&quot;Wenxuan&quot;,&quot;parse-names&quot;:false,&quot;dropping-particle&quot;:&quot;&quot;,&quot;non-dropping-particle&quot;:&quot;&quot;},{&quot;family&quot;:&quot;Wu&quot;,&quot;given&quot;:&quot;Chengkun&quot;,&quot;parse-names&quot;:false,&quot;dropping-particle&quot;:&quot;&quot;,&quot;non-dropping-particle&quot;:&quot;&quot;},{&quot;family&quot;:&quot;Lyu&quot;,&quot;given&quot;:&quot;Aiping&quot;,&quot;parse-names&quot;:false,&quot;dropping-particle&quot;:&quot;&quot;,&quot;non-dropping-particle&quot;:&quot;&quot;},{&quot;family&quot;:&quot;Zeng&quot;,&quot;given&quot;:&quot;Xiangxiang&quot;,&quot;parse-names&quot;:false,&quot;dropping-particle&quot;:&quot;&quot;,&quot;non-dropping-particle&quot;:&quot;&quot;},{&quot;family&quot;:&quot;Zhao&quot;,&quot;given&quot;:&quot;Wentao&quot;,&quot;parse-names&quot;:false,&quot;dropping-particle&quot;:&quot;&quot;,&quot;non-dropping-particle&quot;:&quot;&quot;},{&quot;family&quot;:&quot;Hou&quot;,&quot;given&quot;:&quot;Tingjun&quot;,&quot;parse-names&quot;:false,&quot;dropping-particle&quot;:&quot;&quot;,&quot;non-dropping-particle&quot;:&quot;&quot;},{&quot;family&quot;:&quot;Cao&quot;,&quot;given&quot;:&quot;Dongsheng&quot;,&quot;parse-names&quot;:false,&quot;dropping-particle&quot;:&quot;&quot;,&quot;non-dropping-particle&quot;:&quot;&quot;}],&quot;container-title&quot;:&quot;Nucleic Acids Research&quot;,&quot;DOI&quot;:&quot;10.1093/nar/gkae236&quot;,&quot;ISSN&quot;:&quot;0305-1048&quot;,&quot;issued&quot;:{&quot;date-parts&quot;:[[2024,7,5]]},&quot;page&quot;:&quot;W422-W431&quot;,&quot;abstract&quot;:&quot;&lt;p&gt;ADMETlab 3.0 is the second updated version of the web server that provides a comprehensive and efficient platform for evaluating ADMET-related parameters as well as physicochemical properties and medicinal chemistry characteristics involved in the drug discovery process. This new release addresses the limitations of the previous version and offers broader coverage, improved performance, API functionality, and decision support. For supporting data and endpoints, this version includes 119 features, an increase of 31 compared to the previous version. The updated number of entries is 1.5 times larger than the previous version with over 400 000 entries. ADMETlab 3.0 incorporates a multi-task DMPNN architecture coupled with molecular descriptors, a method that not only guaranteed calculation speed for each endpoint simultaneously, but also achieved a superior performance in terms of accuracy and robustness. In addition, an API has been introduced to meet the growing demand for programmatic access to large amounts of data in ADMETlab 3.0. Moreover, this version includes uncertainty estimates in the prediction results, aiding in the confident selection of candidate compounds for further studies and experiments. ADMETlab 3.0 is publicly for access without the need for registration at: https://admetlab3.scbdd.com.&lt;/p&gt;&quot;,&quot;issue&quot;:&quot;W1&quot;,&quot;volume&quot;:&quot;52&quot;,&quot;container-title-short&quot;:&quot;Nucleic Acids Res.&quot;},&quot;isTemporary&quot;:false}]},{&quot;citationID&quot;:&quot;MENDELEY_CITATION_0e2af13d-1186-46c8-b802-9fb14303c0dc&quot;,&quot;properties&quot;:{&quot;noteIndex&quot;:0},&quot;isEdited&quot;:false,&quot;manualOverride&quot;:{&quot;isManuallyOverridden&quot;:false,&quot;citeprocText&quot;:&quot;[10]&quot;,&quot;manualOverrideText&quot;:&quot;&quot;},&quot;citationTag&quot;:&quot;MENDELEY_CITATION_v3_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&quot;,&quot;citationItems&quot;:[{&quot;id&quot;:&quot;23927d7f-21a8-33f9-bc4d-62bd50964d5d&quot;,&quot;itemData&quot;:{&quot;type&quot;:&quot;article-journal&quot;,&quot;id&quot;:&quot;23927d7f-21a8-33f9-bc4d-62bd50964d5d&quot;,&quot;title&quot;:&quot;The Generation of a Unique Machine Description for Chemical Structures-A Technique Developed at Chemical Abstracts Service.&quot;,&quot;author&quot;:[{&quot;family&quot;:&quot;Morgan&quot;,&quot;given&quot;:&quot;H. L.&quot;,&quot;parse-names&quot;:false,&quot;dropping-particle&quot;:&quot;&quot;,&quot;non-dropping-particle&quot;:&quot;&quot;}],&quot;container-title&quot;:&quot;Journal of Chemical Documentation&quot;,&quot;DOI&quot;:&quot;10.1021/c160017a018&quot;,&quot;ISSN&quot;:&quot;0021-9576&quot;,&quot;issued&quot;:{&quot;date-parts&quot;:[[1965,5,1]]},&quot;page&quot;:&quot;107-113&quot;,&quot;issue&quot;:&quot;2&quot;,&quot;volume&quot;:&quot;5&quot;,&quot;container-title-short&quot;:&quot;J. Chem. Doc.&quot;},&quot;isTemporary&quot;:false}]},{&quot;citationID&quot;:&quot;MENDELEY_CITATION_7594bf8b-015d-49aa-b108-510a5eae62b9&quot;,&quot;properties&quot;:{&quot;noteIndex&quot;:0},&quot;isEdited&quot;:false,&quot;manualOverride&quot;:{&quot;isManuallyOverridden&quot;:false,&quot;citeprocText&quot;:&quot;[11]&quot;,&quot;manualOverrideText&quot;:&quot;&quot;},&quot;citationTag&quot;:&quot;MENDELEY_CITATION_v3_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&quot;,&quot;citationItems&quot;:[{&quot;id&quot;:&quot;80c5781c-7e86-33cf-b75b-5ab47acd2884&quot;,&quot;itemData&quot;:{&quot;type&quot;:&quot;article-journal&quot;,&quot;id&quot;:&quot;80c5781c-7e86-33cf-b75b-5ab47acd2884&quot;,&quot;title&quot;:&quot;Mol2vec: Unsupervised Machine Learning Approach with Chemical Intuition&quot;,&quot;author&quot;:[{&quot;family&quot;:&quot;Jaeger&quot;,&quot;given&quot;:&quot;Sabrina&quot;,&quot;parse-names&quot;:false,&quot;dropping-particle&quot;:&quot;&quot;,&quot;non-dropping-particle&quot;:&quot;&quot;},{&quot;family&quot;:&quot;Fulle&quot;,&quot;given&quot;:&quot;Simone&quot;,&quot;parse-names&quot;:false,&quot;dropping-particle&quot;:&quot;&quot;,&quot;non-dropping-particle&quot;:&quot;&quot;},{&quot;family&quot;:&quot;Turk&quot;,&quot;given&quot;:&quot;Samo&quot;,&quot;parse-names&quot;:false,&quot;dropping-particle&quot;:&quot;&quot;,&quot;non-dropping-particle&quot;:&quot;&quot;}],&quot;container-title&quot;:&quot;Journal of Chemical Information and Modeling&quot;,&quot;DOI&quot;:&quot;10.1021/acs.jcim.7b00616&quot;,&quot;ISSN&quot;:&quot;1549-9596&quot;,&quot;issued&quot;:{&quot;date-parts&quot;:[[2018,1,22]]},&quot;page&quot;:&quot;27-35&quot;,&quot;issue&quot;:&quot;1&quot;,&quot;volume&quot;:&quot;58&quot;,&quot;container-title-short&quot;:&quot;J. Chem. Inf. Model.&quot;},&quot;isTemporary&quot;:false}]},{&quot;citationID&quot;:&quot;MENDELEY_CITATION_70668c7c-96e7-42e2-8067-7b3fa3e95455&quot;,&quot;properties&quot;:{&quot;noteIndex&quot;:0},&quot;isEdited&quot;:false,&quot;manualOverride&quot;:{&quot;isManuallyOverridden&quot;:false,&quot;citeprocText&quot;:&quot;[12]&quot;,&quot;manualOverrideText&quot;:&quot;&quot;},&quot;citationTag&quot;:&quot;MENDELEY_CITATION_v3_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&quot;,&quot;citationItems&quot;:[{&quot;id&quot;:&quot;27f87688-13d2-35cf-b3cc-69d56bb2def3&quot;,&quot;itemData&quot;:{&quot;type&quot;:&quot;article-journal&quot;,&quot;id&quot;:&quot;27f87688-13d2-35cf-b3cc-69d56bb2def3&quot;,&quot;title&quot;:&quot;ChemBERTa: Large-Scale Self-Supervised Pretraining for Molecular Property Prediction&quot;,&quot;author&quot;:[{&quot;family&quot;:&quot;Chithrananda&quot;,&quot;given&quot;:&quot;Seyone&quot;,&quot;parse-names&quot;:false,&quot;dropping-particle&quot;:&quot;&quot;,&quot;non-dropping-particle&quot;:&quot;&quot;},{&quot;family&quot;:&quot;Grand&quot;,&quot;given&quot;:&quot;Gabriel&quot;,&quot;parse-names&quot;:false,&quot;dropping-particle&quot;:&quot;&quot;,&quot;non-dropping-particle&quot;:&quot;&quot;},{&quot;family&quot;:&quot;Ramsundar&quot;,&quot;given&quot;:&quot;Bharath&quot;,&quot;parse-names&quot;:false,&quot;dropping-particle&quot;:&quot;&quot;,&quot;non-dropping-particle&quot;:&quot;&quot;}],&quot;container-title&quot;:&quot;arXiv e-prints&quot;,&quot;DOI&quot;:&quot;10.48550/arXiv.2010.09885&quot;,&quot;issued&quot;:{&quot;date-parts&quot;:[[2020,10]]},&quot;page&quot;:&quot;arXiv:2010.09885&quot;,&quot;container-title-short&quot;:&quot;&quot;},&quot;isTemporary&quot;:false}]},{&quot;citationID&quot;:&quot;MENDELEY_CITATION_eed2f2c2-9fb7-481f-9847-505a31c7df76&quot;,&quot;properties&quot;:{&quot;noteIndex&quot;:0},&quot;isEdited&quot;:false,&quot;manualOverride&quot;:{&quot;isManuallyOverridden&quot;:false,&quot;citeprocText&quot;:&quot;[13]&quot;,&quot;manualOverrideText&quot;:&quot;&quot;},&quot;citationTag&quot;:&quot;MENDELEY_CITATION_v3_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&quot;,&quot;citationItems&quot;:[{&quot;id&quot;:&quot;6b3c2795-b358-3d30-b69e-b2ad6a5195ff&quot;,&quot;itemData&quot;:{&quot;type&quot;:&quot;article-journal&quot;,&quot;id&quot;:&quot;6b3c2795-b358-3d30-b69e-b2ad6a5195ff&quot;,&quot;title&quot;:&quot;MOLE: Modular Learning FramEwork via Mutual Information Maximization&quot;,&quot;author&quot;:[{&quot;family&quot;:&quot;Li&quot;,&quot;given&quot;:&quot;Tianchao&quot;,&quot;parse-names&quot;:false,&quot;dropping-particle&quot;:&quot;&quot;,&quot;non-dropping-particle&quot;:&quot;&quot;},{&quot;family&quot;:&quot;Pei&quot;,&quot;given&quot;:&quot;Yulong&quot;,&quot;parse-names&quot;:false,&quot;dropping-particle&quot;:&quot;&quot;,&quot;non-dropping-particle&quot;:&quot;&quot;}],&quot;container-title&quot;:&quot;ArXiv&quot;,&quot;URL&quot;:&quot;https://api.semanticscholar.org/CorpusID:260899882&quot;,&quot;issued&quot;:{&quot;date-parts&quot;:[[2023]]},&quot;volume&quot;:&quot;abs/2308.07772&quot;,&quot;container-title-short&quot;:&quot;ArXiv&quot;},&quot;isTemporary&quot;:false}]},{&quot;citationID&quot;:&quot;MENDELEY_CITATION_6911c6cb-3ce9-4960-b0ab-f73003ee0ccc&quot;,&quot;properties&quot;:{&quot;noteIndex&quot;:0},&quot;isEdited&quot;:false,&quot;manualOverride&quot;:{&quot;isManuallyOverridden&quot;:false,&quot;citeprocText&quot;:&quot;[14]&quot;,&quot;manualOverrideText&quot;:&quot;&quot;},&quot;citationTag&quot;:&quot;MENDELEY_CITATION_v3_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&quot;,&quot;citationItems&quot;:[{&quot;id&quot;:&quot;91bc1232-bb46-3423-9b4f-a14d74fb3264&quot;,&quot;itemData&quot;:{&quot;type&quot;:&quot;webpage&quot;,&quot;id&quot;:&quot;91bc1232-bb46-3423-9b4f-a14d74fb3264&quot;,&quot;title&quot;:&quot;RDKit: Open-source cheminformatics.&quot;,&quot;container-title&quot;:&quot;https://www.rdkit.org&quot;,&quot;container-title-short&quot;:&quot;&quot;},&quot;isTemporary&quot;:false}]},{&quot;citationID&quot;:&quot;MENDELEY_CITATION_091adfc3-c72b-452f-a882-3f98e173bfcc&quot;,&quot;properties&quot;:{&quot;noteIndex&quot;:0},&quot;isEdited&quot;:false,&quot;manualOverride&quot;:{&quot;isManuallyOverridden&quot;:false,&quot;citeprocText&quot;:&quot;[15]&quot;,&quot;manualOverrideText&quot;:&quot;&quot;},&quot;citationTag&quot;:&quot;MENDELEY_CITATION_v3_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&quot;,&quot;citationItems&quot;:[{&quot;id&quot;:&quot;1fdf973c-15b9-3df1-916b-2aad974dea3b&quot;,&quot;itemData&quot;:{&quot;type&quot;:&quot;article-journal&quot;,&quot;id&quot;:&quot;1fdf973c-15b9-3df1-916b-2aad974dea3b&quot;,&quot;title&quot;:&quot;Extended-Connectivity Fingerprints&quot;,&quot;author&quot;:[{&quot;family&quot;:&quot;Rogers&quot;,&quot;given&quot;:&quot;David&quot;,&quot;parse-names&quot;:false,&quot;dropping-particle&quot;:&quot;&quot;,&quot;non-dropping-particle&quot;:&quot;&quot;},{&quot;family&quot;:&quot;Hahn&quot;,&quot;given&quot;:&quot;Mathew&quot;,&quot;parse-names&quot;:false,&quot;dropping-particle&quot;:&quot;&quot;,&quot;non-dropping-particle&quot;:&quot;&quot;}],&quot;container-title&quot;:&quot;Journal of Chemical Information and Modeling&quot;,&quot;DOI&quot;:&quot;10.1021/ci100050t&quot;,&quot;URL&quot;:&quot;https://doi.org/10.1021/ci100050t&quot;,&quot;issued&quot;:{&quot;date-parts&quot;:[[2010]]},&quot;page&quot;:&quot;742-754&quot;,&quot;issue&quot;:&quot;5&quot;,&quot;volume&quot;:&quot;50&quot;,&quot;container-title-short&quot;:&quot;J. Chem. Inf. Model.&quot;},&quot;isTemporary&quot;:false}]},{&quot;citationID&quot;:&quot;MENDELEY_CITATION_05c57d48-f1ba-49fd-a3fb-d7b08348c075&quot;,&quot;properties&quot;:{&quot;noteIndex&quot;:0},&quot;isEdited&quot;:false,&quot;manualOverride&quot;:{&quot;isManuallyOverridden&quot;:false,&quot;citeprocText&quot;:&quot;[16]&quot;,&quot;manualOverrideText&quot;:&quot;&quot;},&quot;citationTag&quot;:&quot;MENDELEY_CITATION_v3_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&quot;,&quot;citationItems&quot;:[{&quot;id&quot;:&quot;16657982-092a-3db6-97ef-8ee47347c62e&quot;,&quot;itemData&quot;:{&quot;type&quot;:&quot;article-journal&quot;,&quot;id&quot;:&quot;16657982-092a-3db6-97ef-8ee47347c62e&quot;,&quot;title&quot;:&quot;Low-Compute repurposing of an English transformer into a molecular encoder: A two-stage SELFIES adaptation of RoBERTa&quot;,&quot;author&quot;:[{&quot;family&quot;:&quot;Alhmoudi&quot;,&quot;given&quot;:&quot;Obaid Khaleifah&quot;,&quot;parse-names&quot;:false,&quot;dropping-particle&quot;:&quot;&quot;,&quot;non-dropping-particle&quot;:&quot;&quot;},{&quot;family&quot;:&quot;Thameem&quot;,&quot;given&quot;:&quot;Muhammed&quot;,&quot;parse-names&quot;:false,&quot;dropping-particle&quot;:&quot;&quot;,&quot;non-dropping-particle&quot;:&quot;&quot;},{&quot;family&quot;:&quot;Elkamel&quot;,&quot;given&quot;:&quot;Ali&quot;,&quot;parse-names&quot;:false,&quot;dropping-particle&quot;:&quot;&quot;,&quot;non-dropping-particle&quot;:&quot;&quot;},{&quot;family&quot;:&quot;AlHammadi&quot;,&quot;given&quot;:&quot;Ali A.&quot;,&quot;parse-names&quot;:false,&quot;dropping-particle&quot;:&quot;&quot;,&quot;non-dropping-particle&quot;:&quot;&quot;}],&quot;container-title&quot;:&quot;Results in Engineering&quot;,&quot;DOI&quot;:&quot;10.1016/j.rineng.2025.108390&quot;,&quot;ISSN&quot;:&quot;25901230&quot;,&quot;issued&quot;:{&quot;date-parts&quot;:[[2025,12]]},&quot;page&quot;:&quot;108390&quot;,&quot;volume&quot;:&quot;28&quot;,&quot;container-title-short&quot;:&quot;&quot;},&quot;isTemporary&quot;:false}]},{&quot;citationID&quot;:&quot;MENDELEY_CITATION_61882ab6-be78-4074-86b7-8a58822453b0&quot;,&quot;properties&quot;:{&quot;noteIndex&quot;:0},&quot;isEdited&quot;:false,&quot;manualOverride&quot;:{&quot;isManuallyOverridden&quot;:false,&quot;citeprocText&quot;:&quot;[17], [18]&quot;,&quot;manualOverrideText&quot;:&quot;&quot;},&quot;citationTag&quot;:&quot;MENDELEY_CITATION_v3_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&quot;,&quot;citationItems&quot;:[{&quot;id&quot;:&quot;4b7e155f-c785-39de-bd3f-62287a2822db&quot;,&quot;itemData&quot;:{&quot;type&quot;:&quot;paper-conference&quot;,&quot;id&quot;:&quot;4b7e155f-c785-39de-bd3f-62287a2822db&quot;,&quot;title&quot;:&quot;BERT: Pre-training of Deep Bidirectional Transformers for Language Understanding&quot;,&quot;author&quot;:[{&quot;family&quot;:&quot;Devlin&quot;,&quot;given&quot;:&quot;Jacob&quot;,&quot;parse-names&quot;:false,&quot;dropping-particle&quot;:&quot;&quot;,&quot;non-dropping-particle&quot;:&quot;&quot;},{&quot;family&quot;:&quot;Chang&quot;,&quot;given&quot;:&quot;Ming-Wei&quot;,&quot;parse-names&quot;:false,&quot;dropping-particle&quot;:&quot;&quot;,&quot;non-dropping-particle&quot;:&quot;&quot;},{&quot;family&quot;:&quot;Lee&quot;,&quot;given&quot;:&quot;Kenton&quot;,&quot;parse-names&quot;:false,&quot;dropping-particle&quot;:&quot;&quot;,&quot;non-dropping-particle&quot;:&quot;&quot;},{&quot;family&quot;:&quot;Toutanova&quot;,&quot;given&quot;:&quot;Kristina&quot;,&quot;parse-names&quot;:false,&quot;dropping-particle&quot;:&quot;&quot;,&quot;non-dropping-particle&quot;:&quot;&quot;}],&quot;container-title&quot;:&quot;North American Chapter of the Association for Computational Linguistics&quot;,&quot;URL&quot;:&quot;https://api.semanticscholar.org/CorpusID:52967399&quot;,&quot;issued&quot;:{&quot;date-parts&quot;:[[2019]]},&quot;container-title-short&quot;:&quot;&quot;},&quot;isTemporary&quot;:false},{&quot;id&quot;:&quot;d6b0ebc7-a9eb-3e05-9f44-6d798a458d6c&quot;,&quot;itemData&quot;:{&quot;type&quot;:&quot;article-journal&quot;,&quot;id&quot;:&quot;d6b0ebc7-a9eb-3e05-9f44-6d798a458d6c&quot;,&quot;title&quot;:&quot;RoBERTa: A Robustly Optimized BERT Pretraining Approach&quot;,&quot;author&quot;:[{&quot;family&quot;:&quot;Liu&quot;,&quot;given&quot;:&quot;Yinhan&quot;,&quot;parse-names&quot;:false,&quot;dropping-particle&quot;:&quot;&quot;,&quot;non-dropping-particle&quot;:&quot;&quot;},{&quot;family&quot;:&quot;Ott&quot;,&quot;given&quot;:&quot;Myle&quot;,&quot;parse-names&quot;:false,&quot;dropping-particle&quot;:&quot;&quot;,&quot;non-dropping-particle&quot;:&quot;&quot;},{&quot;family&quot;:&quot;Goyal&quot;,&quot;given&quot;:&quot;Naman&quot;,&quot;parse-names&quot;:false,&quot;dropping-particle&quot;:&quot;&quot;,&quot;non-dropping-particle&quot;:&quot;&quot;},{&quot;family&quot;:&quot;Du&quot;,&quot;given&quot;:&quot;Jingfei&quot;,&quot;parse-names&quot;:false,&quot;dropping-particle&quot;:&quot;&quot;,&quot;non-dropping-particle&quot;:&quot;&quot;},{&quot;family&quot;:&quot;Joshi&quot;,&quot;given&quot;:&quot;Mandar&quot;,&quot;parse-names&quot;:false,&quot;dropping-particle&quot;:&quot;&quot;,&quot;non-dropping-particle&quot;:&quot;&quot;},{&quot;family&quot;:&quot;Chen&quot;,&quot;given&quot;:&quot;Danqi&quot;,&quot;parse-names&quot;:false,&quot;dropping-particle&quot;:&quot;&quot;,&quot;non-dropping-particle&quot;:&quot;&quot;},{&quot;family&quot;:&quot;Levy&quot;,&quot;given&quot;:&quot;Omer&quot;,&quot;parse-names&quot;:false,&quot;dropping-particle&quot;:&quot;&quot;,&quot;non-dropping-particle&quot;:&quot;&quot;},{&quot;family&quot;:&quot;Lewis&quot;,&quot;given&quot;:&quot;Mike&quot;,&quot;parse-names&quot;:false,&quot;dropping-particle&quot;:&quot;&quot;,&quot;non-dropping-particle&quot;:&quot;&quot;},{&quot;family&quot;:&quot;Zettlemoyer&quot;,&quot;given&quot;:&quot;Luke&quot;,&quot;parse-names&quot;:false,&quot;dropping-particle&quot;:&quot;&quot;,&quot;non-dropping-particle&quot;:&quot;&quot;},{&quot;family&quot;:&quot;Stoyanov&quot;,&quot;given&quot;:&quot;Veselin&quot;,&quot;parse-names&quot;:false,&quot;dropping-particle&quot;:&quot;&quot;,&quot;non-dropping-particle&quot;:&quot;&quot;}],&quot;container-title&quot;:&quot;ArXiv&quot;,&quot;URL&quot;:&quot;https://api.semanticscholar.org/CorpusID:198953378&quot;,&quot;issued&quot;:{&quot;date-parts&quot;:[[2019]]},&quot;volume&quot;:&quot;abs/1907.11692&quot;,&quot;container-title-short&quot;:&quot;ArXiv&quot;},&quot;isTemporary&quot;:false}]},{&quot;citationID&quot;:&quot;MENDELEY_CITATION_7f594b16-8ad5-4013-aee5-cc9efd81053f&quot;,&quot;properties&quot;:{&quot;noteIndex&quot;:0},&quot;isEdited&quot;:false,&quot;manualOverride&quot;:{&quot;isManuallyOverridden&quot;:false,&quot;citeprocText&quot;:&quot;[19]&quot;,&quot;manualOverrideText&quot;:&quot;&quot;},&quot;citationTag&quot;:&quot;MENDELEY_CITATION_v3_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&quot;,&quot;citationItems&quot;:[{&quot;id&quot;:&quot;528eede6-a120-383e-9473-16c5f897d2c4&quot;,&quot;itemData&quot;:{&quot;type&quot;:&quot;article-journal&quot;,&quot;id&quot;:&quot;528eede6-a120-383e-9473-16c5f897d2c4&quot;,&quot;title&quot;:&quot;Neural Machine Translation of Rare Words with Subword Units&quot;,&quot;author&quot;:[{&quot;family&quot;:&quot;Sennrich&quot;,&quot;given&quot;:&quot;Rico&quot;,&quot;parse-names&quot;:false,&quot;dropping-particle&quot;:&quot;&quot;,&quot;non-dropping-particle&quot;:&quot;&quot;},{&quot;family&quot;:&quot;Haddow&quot;,&quot;given&quot;:&quot;Barry&quot;,&quot;parse-names&quot;:false,&quot;dropping-particle&quot;:&quot;&quot;,&quot;non-dropping-particle&quot;:&quot;&quot;},{&quot;family&quot;:&quot;Birch&quot;,&quot;given&quot;:&quot;Alexandra&quot;,&quot;parse-names&quot;:false,&quot;dropping-particle&quot;:&quot;&quot;,&quot;non-dropping-particle&quot;:&quot;&quot;}],&quot;container-title&quot;:&quot;ArXiv&quot;,&quot;URL&quot;:&quot;https://api.semanticscholar.org/CorpusID:1114678&quot;,&quot;issued&quot;:{&quot;date-parts&quot;:[[2015]]},&quot;volume&quot;:&quot;abs/1508.07909&quot;,&quot;container-title-short&quot;:&quot;ArXiv&quot;},&quot;isTemporary&quot;:false}]},{&quot;citationID&quot;:&quot;MENDELEY_CITATION_800b8284-81e8-409a-a9d8-f65b34f75303&quot;,&quot;properties&quot;:{&quot;noteIndex&quot;:0},&quot;isEdited&quot;:false,&quot;manualOverride&quot;:{&quot;isManuallyOverridden&quot;:false,&quot;citeprocText&quot;:&quot;[20]&quot;,&quot;manualOverrideText&quot;:&quot;&quot;},&quot;citationTag&quot;:&quot;MENDELEY_CITATION_v3_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&quot;,&quot;citationItems&quot;:[{&quot;id&quot;:&quot;038f20e1-2011-366e-8442-37bf6e4fda69&quot;,&quot;itemData&quot;:{&quot;type&quot;:&quot;article-journal&quot;,&quot;id&quot;:&quot;038f20e1-2011-366e-8442-37bf6e4fda69&quot;,&quot;title&quot;:&quot;InChI, the IUPAC International Chemical Identifier&quot;,&quot;author&quot;:[{&quot;family&quot;:&quot;Heller&quot;,&quot;given&quot;:&quot;Stephen R&quot;,&quot;parse-names&quot;:false,&quot;dropping-particle&quot;:&quot;&quot;,&quot;non-dropping-particle&quot;:&quot;&quot;},{&quot;family&quot;:&quot;McNaught&quot;,&quot;given&quot;:&quot;Alan&quot;,&quot;parse-names&quot;:false,&quot;dropping-particle&quot;:&quot;&quot;,&quot;non-dropping-particle&quot;:&quot;&quot;},{&quot;family&quot;:&quot;Pletnev&quot;,&quot;given&quot;:&quot;Igor&quot;,&quot;parse-names&quot;:false,&quot;dropping-particle&quot;:&quot;&quot;,&quot;non-dropping-particle&quot;:&quot;&quot;},{&quot;family&quot;:&quot;Stein&quot;,&quot;given&quot;:&quot;Stephen&quot;,&quot;parse-names&quot;:false,&quot;dropping-particle&quot;:&quot;&quot;,&quot;non-dropping-particle&quot;:&quot;&quot;},{&quot;family&quot;:&quot;Tchekhovskoi&quot;,&quot;given&quot;:&quot;Dmitrii&quot;,&quot;parse-names&quot;:false,&quot;dropping-particle&quot;:&quot;&quot;,&quot;non-dropping-particle&quot;:&quot;&quot;}],&quot;container-title&quot;:&quot;Journal of Cheminformatics&quot;,&quot;DOI&quot;:&quot;10.1186/s13321-015-0068-4&quot;,&quot;ISSN&quot;:&quot;1758-2946&quot;,&quot;issued&quot;:{&quot;date-parts&quot;:[[2015,12,30]]},&quot;page&quot;:&quot;23&quot;,&quot;issue&quot;:&quot;1&quot;,&quot;volume&quot;:&quot;7&quot;,&quot;container-title-short&quot;:&quot;J. Cheminform.&quot;},&quot;isTemporary&quot;:false}]},{&quot;citationID&quot;:&quot;MENDELEY_CITATION_df1d1646-57ca-4a3f-825a-d5645cb9ad91&quot;,&quot;properties&quot;:{&quot;noteIndex&quot;:0},&quot;isEdited&quot;:false,&quot;manualOverride&quot;:{&quot;isManuallyOverridden&quot;:false,&quot;citeprocText&quot;:&quot;[17]&quot;,&quot;manualOverrideText&quot;:&quot;&quot;},&quot;citationTag&quot;:&quot;MENDELEY_CITATION_v3_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&quot;,&quot;citationItems&quot;:[{&quot;id&quot;:&quot;4b7e155f-c785-39de-bd3f-62287a2822db&quot;,&quot;itemData&quot;:{&quot;type&quot;:&quot;paper-conference&quot;,&quot;id&quot;:&quot;4b7e155f-c785-39de-bd3f-62287a2822db&quot;,&quot;title&quot;:&quot;BERT: Pre-training of Deep Bidirectional Transformers for Language Understanding&quot;,&quot;author&quot;:[{&quot;family&quot;:&quot;Devlin&quot;,&quot;given&quot;:&quot;Jacob&quot;,&quot;parse-names&quot;:false,&quot;dropping-particle&quot;:&quot;&quot;,&quot;non-dropping-particle&quot;:&quot;&quot;},{&quot;family&quot;:&quot;Chang&quot;,&quot;given&quot;:&quot;Ming-Wei&quot;,&quot;parse-names&quot;:false,&quot;dropping-particle&quot;:&quot;&quot;,&quot;non-dropping-particle&quot;:&quot;&quot;},{&quot;family&quot;:&quot;Lee&quot;,&quot;given&quot;:&quot;Kenton&quot;,&quot;parse-names&quot;:false,&quot;dropping-particle&quot;:&quot;&quot;,&quot;non-dropping-particle&quot;:&quot;&quot;},{&quot;family&quot;:&quot;Toutanova&quot;,&quot;given&quot;:&quot;Kristina&quot;,&quot;parse-names&quot;:false,&quot;dropping-particle&quot;:&quot;&quot;,&quot;non-dropping-particle&quot;:&quot;&quot;}],&quot;container-title&quot;:&quot;North American Chapter of the Association for Computational Linguistics&quot;,&quot;URL&quot;:&quot;https://api.semanticscholar.org/CorpusID:52967399&quot;,&quot;issued&quot;:{&quot;date-parts&quot;:[[2019]]},&quot;container-title-short&quot;:&quot;&quot;},&quot;isTemporary&quot;:false}]},{&quot;citationID&quot;:&quot;MENDELEY_CITATION_0856a272-5a9c-4c62-8ea9-15c71a2f59c4&quot;,&quot;properties&quot;:{&quot;noteIndex&quot;:0},&quot;isEdited&quot;:false,&quot;manualOverride&quot;:{&quot;isManuallyOverridden&quot;:false,&quot;citeprocText&quot;:&quot;[21]&quot;,&quot;manualOverrideText&quot;:&quot;&quot;},&quot;citationTag&quot;:&quot;MENDELEY_CITATION_v3_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&quot;,&quot;citationItems&quot;:[{&quot;id&quot;:&quot;e9063351-84e5-35cf-9e83-b8bba0913bac&quot;,&quot;itemData&quot;:{&quot;type&quot;:&quot;article-journal&quot;,&quot;id&quot;:&quot;e9063351-84e5-35cf-9e83-b8bba0913bac&quot;,&quot;title&quot;:&quot;SGDR: Stochastic Gradient Descent with Warm Restarts&quot;,&quot;author&quot;:[{&quot;family&quot;:&quot;Loshchilov&quot;,&quot;given&quot;:&quot;Ilya&quot;,&quot;parse-names&quot;:false,&quot;dropping-particle&quot;:&quot;&quot;,&quot;non-dropping-particle&quot;:&quot;&quot;},{&quot;family&quot;:&quot;Hutter&quot;,&quot;given&quot;:&quot;Frank&quot;,&quot;parse-names&quot;:false,&quot;dropping-particle&quot;:&quot;&quot;,&quot;non-dropping-particle&quot;:&quot;&quot;}],&quot;container-title&quot;:&quot;arXiv: Learning&quot;,&quot;URL&quot;:&quot;https://api.semanticscholar.org/CorpusID:14337532&quot;,&quot;issued&quot;:{&quot;date-parts&quot;:[[2016]]},&quot;container-title-short&quot;:&quot;&quot;},&quot;isTemporary&quot;:false}]},{&quot;citationID&quot;:&quot;MENDELEY_CITATION_111eba3f-785c-4b4c-b6e6-fc4bf548cbdf&quot;,&quot;properties&quot;:{&quot;noteIndex&quot;:0},&quot;isEdited&quot;:false,&quot;manualOverride&quot;:{&quot;isManuallyOverridden&quot;:false,&quot;citeprocText&quot;:&quot;[12]&quot;,&quot;manualOverrideText&quot;:&quot;&quot;},&quot;citationTag&quot;:&quot;MENDELEY_CITATION_v3_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&quot;,&quot;citationItems&quot;:[{&quot;id&quot;:&quot;27f87688-13d2-35cf-b3cc-69d56bb2def3&quot;,&quot;itemData&quot;:{&quot;type&quot;:&quot;article-journal&quot;,&quot;id&quot;:&quot;27f87688-13d2-35cf-b3cc-69d56bb2def3&quot;,&quot;title&quot;:&quot;ChemBERTa: Large-Scale Self-Supervised Pretraining for Molecular Property Prediction&quot;,&quot;author&quot;:[{&quot;family&quot;:&quot;Chithrananda&quot;,&quot;given&quot;:&quot;Seyone&quot;,&quot;parse-names&quot;:false,&quot;dropping-particle&quot;:&quot;&quot;,&quot;non-dropping-particle&quot;:&quot;&quot;},{&quot;family&quot;:&quot;Grand&quot;,&quot;given&quot;:&quot;Gabriel&quot;,&quot;parse-names&quot;:false,&quot;dropping-particle&quot;:&quot;&quot;,&quot;non-dropping-particle&quot;:&quot;&quot;},{&quot;family&quot;:&quot;Ramsundar&quot;,&quot;given&quot;:&quot;Bharath&quot;,&quot;parse-names&quot;:false,&quot;dropping-particle&quot;:&quot;&quot;,&quot;non-dropping-particle&quot;:&quot;&quot;}],&quot;container-title&quot;:&quot;arXiv e-prints&quot;,&quot;DOI&quot;:&quot;10.48550/arXiv.2010.09885&quot;,&quot;issued&quot;:{&quot;date-parts&quot;:[[2020,10]]},&quot;page&quot;:&quot;arXiv:2010.09885&quot;,&quot;container-title-short&quot;:&quot;&quot;},&quot;isTemporary&quot;:false}]},{&quot;citationID&quot;:&quot;MENDELEY_CITATION_b0839fb6-ce26-4a25-ba91-51b39a67b272&quot;,&quot;properties&quot;:{&quot;noteIndex&quot;:0},&quot;isEdited&quot;:false,&quot;manualOverride&quot;:{&quot;isManuallyOverridden&quot;:false,&quot;citeprocText&quot;:&quot;[22]&quot;,&quot;manualOverrideText&quot;:&quot;&quot;},&quot;citationTag&quot;:&quot;MENDELEY_CITATION_v3_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&quot;,&quot;citationItems&quot;:[{&quot;id&quot;:&quot;4706f37f-66a5-3d27-a50b-d3f6c14a0549&quot;,&quot;itemData&quot;:{&quot;type&quot;:&quot;article-journal&quot;,&quot;id&quot;:&quot;4706f37f-66a5-3d27-a50b-d3f6c14a0549&quot;,&quot;title&quot;:&quot;On Large-Batch Training for Deep Learning: Generalization Gap and Sharp Minima&quot;,&quot;author&quot;:[{&quot;family&quot;:&quot;Keskar&quot;,&quot;given&quot;:&quot;Nitish Shirish&quot;,&quot;parse-names&quot;:false,&quot;dropping-particle&quot;:&quot;&quot;,&quot;non-dropping-particle&quot;:&quot;&quot;},{&quot;family&quot;:&quot;Mudigere&quot;,&quot;given&quot;:&quot;Dheevatsa&quot;,&quot;parse-names&quot;:false,&quot;dropping-particle&quot;:&quot;&quot;,&quot;non-dropping-particle&quot;:&quot;&quot;},{&quot;family&quot;:&quot;Nocedal&quot;,&quot;given&quot;:&quot;Jorge&quot;,&quot;parse-names&quot;:false,&quot;dropping-particle&quot;:&quot;&quot;,&quot;non-dropping-particle&quot;:&quot;&quot;},{&quot;family&quot;:&quot;Smelyanskiy&quot;,&quot;given&quot;:&quot;Mikhail&quot;,&quot;parse-names&quot;:false,&quot;dropping-particle&quot;:&quot;&quot;,&quot;non-dropping-particle&quot;:&quot;&quot;},{&quot;family&quot;:&quot;Tang&quot;,&quot;given&quot;:&quot;Ping Tak Peter&quot;,&quot;parse-names&quot;:false,&quot;dropping-particle&quot;:&quot;&quot;,&quot;non-dropping-particle&quot;:&quot;&quot;}],&quot;container-title&quot;:&quot;ArXiv&quot;,&quot;URL&quot;:&quot;https://api.semanticscholar.org/CorpusID:5834589&quot;,&quot;issued&quot;:{&quot;date-parts&quot;:[[2016]]},&quot;volume&quot;:&quot;abs/1609.04836&quot;,&quot;container-title-short&quot;:&quot;ArXiv&quot;},&quot;isTemporary&quot;:false}]},{&quot;citationID&quot;:&quot;MENDELEY_CITATION_983539a7-adc7-42fd-83b2-3ac25b495a30&quot;,&quot;properties&quot;:{&quot;noteIndex&quot;:0},&quot;isEdited&quot;:false,&quot;manualOverride&quot;:{&quot;isManuallyOverridden&quot;:false,&quot;citeprocText&quot;:&quot;[23]&quot;,&quot;manualOverrideText&quot;:&quot;&quot;},&quot;citationTag&quot;:&quot;MENDELEY_CITATION_v3_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&quot;,&quot;citationItems&quot;:[{&quot;id&quot;:&quot;7fc7ea6b-1629-3058-829b-cae1a8149255&quot;,&quot;itemData&quot;:{&quot;type&quot;:&quot;article-journal&quot;,&quot;id&quot;:&quot;7fc7ea6b-1629-3058-829b-cae1a8149255&quot;,&quot;title&quot;:&quot;Mixed Precision Training&quot;,&quot;author&quot;:[{&quot;family&quot;:&quot;Micikevicius&quot;,&quot;given&quot;:&quot;Paulius&quot;,&quot;parse-names&quot;:false,&quot;dropping-particle&quot;:&quot;&quot;,&quot;non-dropping-particle&quot;:&quot;&quot;},{&quot;family&quot;:&quot;Narang&quot;,&quot;given&quot;:&quot;Sharan&quot;,&quot;parse-names&quot;:false,&quot;dropping-particle&quot;:&quot;&quot;,&quot;non-dropping-particle&quot;:&quot;&quot;},{&quot;family&quot;:&quot;Alben&quot;,&quot;given&quot;:&quot;Jonah&quot;,&quot;parse-names&quot;:false,&quot;dropping-particle&quot;:&quot;&quot;,&quot;non-dropping-particle&quot;:&quot;&quot;},{&quot;family&quot;:&quot;Diamos&quot;,&quot;given&quot;:&quot;Gregory Frederick&quot;,&quot;parse-names&quot;:false,&quot;dropping-particle&quot;:&quot;&quot;,&quot;non-dropping-particle&quot;:&quot;&quot;},{&quot;family&quot;:&quot;Elsen&quot;,&quot;given&quot;:&quot;Erich&quot;,&quot;parse-names&quot;:false,&quot;dropping-particle&quot;:&quot;&quot;,&quot;non-dropping-particle&quot;:&quot;&quot;},{&quot;family&quot;:&quot;García&quot;,&quot;given&quot;:&quot;David&quot;,&quot;parse-names&quot;:false,&quot;dropping-particle&quot;:&quot;&quot;,&quot;non-dropping-particle&quot;:&quot;&quot;},{&quot;family&quot;:&quot;Ginsburg&quot;,&quot;given&quot;:&quot;Boris&quot;,&quot;parse-names&quot;:false,&quot;dropping-particle&quot;:&quot;&quot;,&quot;non-dropping-particle&quot;:&quot;&quot;},{&quot;family&quot;:&quot;Houston&quot;,&quot;given&quot;:&quot;Michael&quot;,&quot;parse-names&quot;:false,&quot;dropping-particle&quot;:&quot;&quot;,&quot;non-dropping-particle&quot;:&quot;&quot;},{&quot;family&quot;:&quot;Kuchaiev&quot;,&quot;given&quot;:&quot;Oleksii&quot;,&quot;parse-names&quot;:false,&quot;dropping-particle&quot;:&quot;&quot;,&quot;non-dropping-particle&quot;:&quot;&quot;},{&quot;family&quot;:&quot;Venkatesh&quot;,&quot;given&quot;:&quot;Ganesh&quot;,&quot;parse-names&quot;:false,&quot;dropping-particle&quot;:&quot;&quot;,&quot;non-dropping-particle&quot;:&quot;&quot;},{&quot;family&quot;:&quot;Wu&quot;,&quot;given&quot;:&quot;Hao&quot;,&quot;parse-names&quot;:false,&quot;dropping-particle&quot;:&quot;&quot;,&quot;non-dropping-particle&quot;:&quot;&quot;}],&quot;container-title&quot;:&quot;ArXiv&quot;,&quot;URL&quot;:&quot;https://api.semanticscholar.org/CorpusID:3297437&quot;,&quot;issued&quot;:{&quot;date-parts&quot;:[[2017]]},&quot;volume&quot;:&quot;abs/1710.03740&quot;,&quot;container-title-short&quot;:&quot;ArXiv&quot;},&quot;isTemporary&quot;:false}]},{&quot;citationID&quot;:&quot;MENDELEY_CITATION_a28312d0-aa21-4564-9d86-8c5378063f6d&quot;,&quot;properties&quot;:{&quot;noteIndex&quot;:0},&quot;isEdited&quot;:false,&quot;manualOverride&quot;:{&quot;isManuallyOverridden&quot;:false,&quot;citeprocText&quot;:&quot;[24]&quot;,&quot;manualOverrideText&quot;:&quot;&quot;},&quot;citationTag&quot;:&quot;MENDELEY_CITATION_v3_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&quot;,&quot;citationItems&quot;:[{&quot;id&quot;:&quot;e1bbbe98-ea46-39b0-950b-79a4326f3b21&quot;,&quot;itemData&quot;:{&quot;type&quot;:&quot;article-journal&quot;,&quot;id&quot;:&quot;e1bbbe98-ea46-39b0-950b-79a4326f3b21&quot;,&quot;title&quot;:&quot;A Review on Multi-Label Learning Algorithms&quot;,&quot;author&quot;:[{&quot;family&quot;:&quot;Zhang&quot;,&quot;given&quot;:&quot;M -L.&quot;,&quot;parse-names&quot;:false,&quot;dropping-particle&quot;:&quot;&quot;,&quot;non-dropping-particle&quot;:&quot;&quot;},{&quot;family&quot;:&quot;Zhou&quot;,&quot;given&quot;:&quot;Z -H.&quot;,&quot;parse-names&quot;:false,&quot;dropping-particle&quot;:&quot;&quot;,&quot;non-dropping-particle&quot;:&quot;&quot;}],&quot;container-title&quot;:&quot;IEEE Transactions on Knowledge and Data Engineering&quot;,&quot;container-title-short&quot;:&quot;IEEE Trans. Knowl. Data Eng.&quot;,&quot;DOI&quot;:&quot;10.1109/TKDE.2013.39&quot;,&quot;ISSN&quot;:&quot;1558-2191&quot;,&quot;issued&quot;:{&quot;date-parts&quot;:[[2014]]},&quot;page&quot;:&quot;1819-1837&quot;,&quot;issue&quot;:&quot;8&quot;,&quot;volume&quot;:&quot;26&quot;},&quot;isTemporary&quot;:false}]},{&quot;citationID&quot;:&quot;MENDELEY_CITATION_d1c86985-4c0c-4011-999a-640b0a0cdaf6&quot;,&quot;properties&quot;:{&quot;noteIndex&quot;:0},&quot;isEdited&quot;:false,&quot;manualOverride&quot;:{&quot;isManuallyOverridden&quot;:false,&quot;citeprocText&quot;:&quot;[25]&quot;,&quot;manualOverrideText&quot;:&quot;&quot;},&quot;citationTag&quot;:&quot;MENDELEY_CITATION_v3_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&quot;,&quot;citationItems&quot;:[{&quot;id&quot;:&quot;f8bb2610-1acc-30af-bff9-4489d564d536&quot;,&quot;itemData&quot;:{&quot;type&quot;:&quot;article-journal&quot;,&quot;id&quot;:&quot;f8bb2610-1acc-30af-bff9-4489d564d536&quot;,&quot;title&quot;:&quot;Multi-Label Classification&quot;,&quot;author&quot;:[{&quot;family&quot;:&quot;Tsoumakas&quot;,&quot;given&quot;:&quot;Grigorios&quot;,&quot;parse-names&quot;:false,&quot;dropping-particle&quot;:&quot;&quot;,&quot;non-dropping-particle&quot;:&quot;&quot;},{&quot;family&quot;:&quot;Katakis&quot;,&quot;given&quot;:&quot;Ioannis&quot;,&quot;parse-names&quot;:false,&quot;dropping-particle&quot;:&quot;&quot;,&quot;non-dropping-particle&quot;:&quot;&quot;}],&quot;container-title&quot;:&quot;International Journal of Data Warehousing and Mining&quot;,&quot;DOI&quot;:&quot;10.4018/jdwm.2007070101&quot;,&quot;ISSN&quot;:&quot;1548-3924&quot;,&quot;issued&quot;:{&quot;date-parts&quot;:[[2007,7,1]]},&quot;page&quot;:&quot;1-13&quot;,&quot;abstract&quot;:&quot;&lt;p&gt;Multi-label classification methods are increasingly required by modern applications, such as protein function classification, music categorization, and semantic scene classification. This article introduces the task of multi-label classification, organizes the sparse related literature into a structured presentation and performs comparative experimental results of certain multilabel classification methods. It also contributes the definition of concepts for the quantification of the multi-label nature of a data set.&lt;/p&gt;&quot;,&quot;issue&quot;:&quot;3&quot;,&quot;volume&quot;:&quot;3&quot;,&quot;container-title-short&quot;:&quot;&quot;},&quot;isTemporary&quot;:false}]},{&quot;citationID&quot;:&quot;MENDELEY_CITATION_8f0da353-a206-454e-9893-bc842c090a1f&quot;,&quot;properties&quot;:{&quot;noteIndex&quot;:0},&quot;isEdited&quot;:false,&quot;manualOverride&quot;:{&quot;isManuallyOverridden&quot;:false,&quot;citeprocText&quot;:&quot;[2]&quot;,&quot;manualOverrideText&quot;:&quot;&quot;},&quot;citationTag&quot;:&quot;MENDELEY_CITATION_v3_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&quot;,&quot;citationItems&quot;:[{&quot;id&quot;:&quot;38c736ba-04f7-31e6-a646-9680ae3c3eda&quot;,&quot;itemData&quot;:{&quot;type&quot;:&quot;article-journal&quot;,&quot;id&quot;:&quot;38c736ba-04f7-31e6-a646-9680ae3c3eda&quot;,&quot;title&quot;:&quot;Post-marketing withdrawal of 462 medicinal products because of adverse drug reactions: a systematic review of the world literature&quot;,&quot;author&quot;:[{&quot;family&quot;:&quot;Onakpoya&quot;,&quot;given&quot;:&quot;Igho J.&quot;,&quot;parse-names&quot;:false,&quot;dropping-particle&quot;:&quot;&quot;,&quot;non-dropping-particle&quot;:&quot;&quot;},{&quot;family&quot;:&quot;Heneghan&quot;,&quot;given&quot;:&quot;Carl J.&quot;,&quot;parse-names&quot;:false,&quot;dropping-particle&quot;:&quot;&quot;,&quot;non-dropping-particle&quot;:&quot;&quot;},{&quot;family&quot;:&quot;Aronson&quot;,&quot;given&quot;:&quot;Jeffrey K.&quot;,&quot;parse-names&quot;:false,&quot;dropping-particle&quot;:&quot;&quot;,&quot;non-dropping-particle&quot;:&quot;&quot;}],&quot;container-title&quot;:&quot;BMC Medicine&quot;,&quot;container-title-short&quot;:&quot;BMC Med.&quot;,&quot;DOI&quot;:&quot;10.1186/s12916-016-0553-2&quot;,&quot;ISSN&quot;:&quot;1741-7015&quot;,&quot;issued&quot;:{&quot;date-parts&quot;:[[2016,12,4]]},&quot;page&quot;:&quot;10&quot;,&quot;issue&quot;:&quot;1&quot;,&quot;volume&quot;:&quot;14&quot;},&quot;isTemporary&quot;:false}]},{&quot;citationID&quot;:&quot;MENDELEY_CITATION_015144f7-4ca6-4ea3-9c78-dad31754eb4c&quot;,&quot;properties&quot;:{&quot;noteIndex&quot;:0},&quot;isEdited&quot;:false,&quot;manualOverride&quot;:{&quot;isManuallyOverridden&quot;:false,&quot;citeprocText&quot;:&quot;[26]&quot;,&quot;manualOverrideText&quot;:&quot;&quot;},&quot;citationTag&quot;:&quot;MENDELEY_CITATION_v3_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&quot;,&quot;citationItems&quot;:[{&quot;id&quot;:&quot;82bdd3d8-cd2f-3909-9549-dba4106a3998&quot;,&quot;itemData&quot;:{&quot;type&quot;:&quot;article-journal&quot;,&quot;id&quot;:&quot;82bdd3d8-cd2f-3909-9549-dba4106a3998&quot;,&quot;title&quot;:&quot;Methodologies for Investigating Drug Metabolism at the Early Drug Discovery Stage: Prediction of Hepatic Drug Clearance and P450 Contribution&quot;,&quot;author&quot;:[{&quot;family&quot;:&quot;Emoto&quot;,&quot;given&quot;:&quot;Chie&quot;,&quot;parse-names&quot;:false,&quot;dropping-particle&quot;:&quot;&quot;,&quot;non-dropping-particle&quot;:&quot;&quot;},{&quot;family&quot;:&quot;Murayama&quot;,&quot;given&quot;:&quot;Norie&quot;,&quot;parse-names&quot;:false,&quot;dropping-particle&quot;:&quot;&quot;,&quot;non-dropping-particle&quot;:&quot;&quot;},{&quot;family&quot;:&quot;Rostami-Hodjegan&quot;,&quot;given&quot;:&quot;Amin&quot;,&quot;parse-names&quot;:false,&quot;dropping-particle&quot;:&quot;&quot;,&quot;non-dropping-particle&quot;:&quot;&quot;},{&quot;family&quot;:&quot;Yamazaki&quot;,&quot;given&quot;:&quot;Hiroshi&quot;,&quot;parse-names&quot;:false,&quot;dropping-particle&quot;:&quot;&quot;,&quot;non-dropping-particle&quot;:&quot;&quot;}],&quot;container-title&quot;:&quot;Current Drug Metabolism&quot;,&quot;container-title-short&quot;:&quot;Curr. Drug Metab.&quot;,&quot;DOI&quot;:&quot;10.2174/138920010794233503&quot;,&quot;ISSN&quot;:&quot;13892002&quot;,&quot;issued&quot;:{&quot;date-parts&quot;:[[2010,10,1]]},&quot;page&quot;:&quot;678-685&quot;,&quot;issue&quot;:&quot;8&quot;,&quot;volume&quot;:&quot;11&quot;},&quot;isTemporary&quot;:false}]},{&quot;citationID&quot;:&quot;MENDELEY_CITATION_571e5984-89ec-4b7f-8f14-7d599bc23c52&quot;,&quot;properties&quot;:{&quot;noteIndex&quot;:0},&quot;isEdited&quot;:false,&quot;manualOverride&quot;:{&quot;isManuallyOverridden&quot;:false,&quot;citeprocText&quot;:&quot;[27], [28]&quot;,&quot;manualOverrideText&quot;:&quot;&quot;},&quot;citationItems&quot;:[{&quot;id&quot;:&quot;52279965-ed25-312e-9de0-e0ceb0b0ce99&quot;,&quot;itemData&quot;:{&quot;type&quot;:&quot;article-journal&quot;,&quot;id&quot;:&quot;52279965-ed25-312e-9de0-e0ceb0b0ce99&quot;,&quot;title&quot;:&quot;The advantages of the Matthews correlation coefficient (MCC) over F1 score and accuracy in binary classification evaluation&quot;,&quot;author&quot;:[{&quot;family&quot;:&quot;Chicco&quot;,&quot;given&quot;:&quot;Davide&quot;,&quot;parse-names&quot;:false,&quot;dropping-particle&quot;:&quot;&quot;,&quot;non-dropping-particle&quot;:&quot;&quot;},{&quot;family&quot;:&quot;Jurman&quot;,&quot;given&quot;:&quot;Giuseppe&quot;,&quot;parse-names&quot;:false,&quot;dropping-particle&quot;:&quot;&quot;,&quot;non-dropping-particle&quot;:&quot;&quot;}],&quot;container-title&quot;:&quot;BMC Genomics&quot;,&quot;container-title-short&quot;:&quot;BMC Genomics&quot;,&quot;DOI&quot;:&quot;10.1186/s12864-019-6413-7&quot;,&quot;ISSN&quot;:&quot;1471-2164&quot;,&quot;issued&quot;:{&quot;date-parts&quot;:[[2020,12,2]]},&quot;page&quot;:&quot;6&quot;,&quot;issue&quot;:&quot;1&quot;,&quot;volume&quot;:&quot;21&quot;},&quot;isTemporary&quot;:false},{&quot;id&quot;:&quot;db024b82-b57a-3a94-a613-15565e9b465c&quot;,&quot;itemData&quot;:{&quot;type&quot;:&quot;article-journal&quot;,&quot;id&quot;:&quot;db024b82-b57a-3a94-a613-15565e9b465c&quot;,&quot;title&quot;:&quot;Revisiting performance metrics for prediction with rare outcomes&quot;,&quot;author&quot;:[{&quot;family&quot;:&quot;Adhikari&quot;,&quot;given&quot;:&quot;Samrachana&quot;,&quot;parse-names&quot;:false,&quot;dropping-particle&quot;:&quot;&quot;,&quot;non-dropping-particle&quot;:&quot;&quot;},{&quot;family&quot;:&quot;Normand&quot;,&quot;given&quot;:&quot;Sharon-Lise&quot;,&quot;parse-names&quot;:false,&quot;dropping-particle&quot;:&quot;&quot;,&quot;non-dropping-particle&quot;:&quot;&quot;},{&quot;family&quot;:&quot;Bloom&quot;,&quot;given&quot;:&quot;Jordan&quot;,&quot;parse-names&quot;:false,&quot;dropping-particle&quot;:&quot;&quot;,&quot;non-dropping-particle&quot;:&quot;&quot;},{&quot;family&quot;:&quot;Shahian&quot;,&quot;given&quot;:&quot;David&quot;,&quot;parse-names&quot;:false,&quot;dropping-particle&quot;:&quot;&quot;,&quot;non-dropping-particle&quot;:&quot;&quot;},{&quot;family&quot;:&quot;Rose&quot;,&quot;given&quot;:&quot;Sherri&quot;,&quot;parse-names&quot;:false,&quot;dropping-particle&quot;:&quot;&quot;,&quot;non-dropping-particle&quot;:&quot;&quot;}],&quot;container-title&quot;:&quot;Statistical Methods in Medical Research&quot;,&quot;container-title-short&quot;:&quot;Stat. Methods Med. Res.&quot;,&quot;DOI&quot;:&quot;10.1177/09622802211038754&quot;,&quot;ISSN&quot;:&quot;0962-2802&quot;,&quot;issued&quot;:{&quot;date-parts&quot;:[[2021,10,1]]},&quot;page&quot;:&quot;2352-2366&quot;,&quot;abstract&quot;:&quot;&lt;p&gt;Machine learning algorithms are increasingly used in the clinical literature, claiming advantages over logistic regression. However, they are generally designed to maximize the area under the receiver operating characteristic curve. While area under the receiver operating characteristic curve and other measures of accuracy are commonly reported for evaluating binary prediction problems, these metrics can be misleading. We aim to give clinical and machine learning researchers a realistic medical example of the dangers of relying on a single measure of discriminatory performance to evaluate binary prediction questions. Prediction of medical complications after surgery is a frequent but challenging task because many post-surgery outcomes are rare. We predicted post-surgery mortality among patients in a clinical registry who received at least one aortic valve replacement. Estimation incorporated multiple evaluation metrics and algorithms typically regarded as performing well with rare outcomes, as well as an ensemble and a new extension of the lasso for multiple unordered treatments. Results demonstrated high accuracy for all algorithms with moderate measures of cross-validated area under the receiver operating characteristic curve. False positive rates were [Formula: see text]1%, however, true positive rates were [Formula: see text]7%, even when paired with a 100% positive predictive value, and graphical representations of calibration were poor. Similar results were seen in simulations, with the addition of high area under the receiver operating characteristic curve ([Formula: see text]90%) accompanying low true positive rates. Clinical studies should not primarily report only area under the receiver operating characteristic curve or accuracy.&lt;/p&gt;&quot;,&quot;issue&quot;:&quot;10&quot;,&quot;volume&quot;:&quot;30&quot;},&quot;isTemporary&quot;:false}],&quot;citationTag&quot;:&quot;MENDELEY_CITATION_v3_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&quot;},{&quot;citationID&quot;:&quot;MENDELEY_CITATION_9ad31536-b6df-4362-bd86-540c662cde14&quot;,&quot;properties&quot;:{&quot;noteIndex&quot;:0},&quot;isEdited&quot;:false,&quot;manualOverride&quot;:{&quot;isManuallyOverridden&quot;:false,&quot;citeprocText&quot;:&quot;[29]&quot;,&quot;manualOverrideText&quot;:&quot;&quot;},&quot;citationTag&quot;:&quot;MENDELEY_CITATION_v3_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&quot;,&quot;citationItems&quot;:[{&quot;id&quot;:&quot;6a87cd3f-cf9b-3905-a8fb-4cb899311d1e&quot;,&quot;itemData&quot;:{&quot;type&quot;:&quot;article-journal&quot;,&quot;id&quot;:&quot;6a87cd3f-cf9b-3905-a8fb-4cb899311d1e&quot;,&quot;title&quot;:&quot;Multi-label classification: do hamming loss and subset accuracy really conflict with each other?&quot;,&quot;author&quot;:[{&quot;family&quot;:&quot;Wu&quot;,&quot;given&quot;:&quot;Guoqiang&quot;,&quot;parse-names&quot;:false,&quot;dropping-particle&quot;:&quot;&quot;,&quot;non-dropping-particle&quot;:&quot;&quot;},{&quot;family&quot;:&quot;Zhu&quot;,&quot;given&quot;:&quot;Jun&quot;,&quot;parse-names&quot;:false,&quot;dropping-particle&quot;:&quot;&quot;,&quot;non-dropping-particle&quot;:&quot;&quot;}],&quot;container-title&quot;:&quot;Advances in Neural Information Processing Systems&quot;,&quot;container-title-short&quot;:&quot;Adv. Neural Inf. Process. Syst.&quot;,&quot;issued&quot;:{&quot;date-parts&quot;:[[2020]]},&quot;page&quot;:&quot;3130-3140&quot;,&quot;volume&quot;:&quot;33&quot;},&quot;isTemporary&quot;:false}]},{&quot;citationID&quot;:&quot;MENDELEY_CITATION_6d6d0d49-412b-4d77-9b8d-ac8452c404a6&quot;,&quot;properties&quot;:{&quot;noteIndex&quot;:0},&quot;isEdited&quot;:false,&quot;manualOverride&quot;:{&quot;isManuallyOverridden&quot;:false,&quot;citeprocText&quot;:&quot;[30]&quot;,&quot;manualOverrideText&quot;:&quot;&quot;},&quot;citationTag&quot;:&quot;MENDELEY_CITATION_v3_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&quot;,&quot;citationItems&quot;:[{&quot;id&quot;:&quot;164d07b8-929c-37dd-9d06-c9dc5f81403e&quot;,&quot;itemData&quot;:{&quot;type&quot;:&quot;article-journal&quot;,&quot;id&quot;:&quot;164d07b8-929c-37dd-9d06-c9dc5f81403e&quot;,&quot;title&quot;:&quot;The impact of class imbalance in classification performance metrics based on the binary confusion matrix&quot;,&quot;author&quot;:[{&quot;family&quot;:&quot;Luque&quot;,&quot;given&quot;:&quot;Amalia&quot;,&quot;parse-names&quot;:false,&quot;dropping-particle&quot;:&quot;&quot;,&quot;non-dropping-particle&quot;:&quot;&quot;},{&quot;family&quot;:&quot;Carrasco&quot;,&quot;given&quot;:&quot;Alejandro&quot;,&quot;parse-names&quot;:false,&quot;dropping-particle&quot;:&quot;&quot;,&quot;non-dropping-particle&quot;:&quot;&quot;},{&quot;family&quot;:&quot;Martín&quot;,&quot;given&quot;:&quot;Alejandro&quot;,&quot;parse-names&quot;:false,&quot;dropping-particle&quot;:&quot;&quot;,&quot;non-dropping-particle&quot;:&quot;&quot;},{&quot;family&quot;:&quot;las Heras&quot;,&quot;given&quot;:&quot;Ana&quot;,&quot;parse-names&quot;:false,&quot;dropping-particle&quot;:&quot;&quot;,&quot;non-dropping-particle&quot;:&quot;de&quot;}],&quot;container-title&quot;:&quot;Pattern Recognition&quot;,&quot;container-title-short&quot;:&quot;Pattern Recognit.&quot;,&quot;DOI&quot;:&quot;10.1016/j.patcog.2019.02.023&quot;,&quot;ISSN&quot;:&quot;00313203&quot;,&quot;issued&quot;:{&quot;date-parts&quot;:[[2019,7]]},&quot;page&quot;:&quot;216-231&quot;,&quot;volume&quot;:&quot;91&quot;},&quot;isTemporary&quot;:false}]},{&quot;citationID&quot;:&quot;MENDELEY_CITATION_8dfa40a6-a289-45fd-9b21-d69412ff3133&quot;,&quot;properties&quot;:{&quot;noteIndex&quot;:0},&quot;isEdited&quot;:false,&quot;manualOverride&quot;:{&quot;isManuallyOverridden&quot;:false,&quot;citeprocText&quot;:&quot;[31]&quot;,&quot;manualOverrideText&quot;:&quot;&quot;},&quot;citationTag&quot;:&quot;MENDELEY_CITATION_v3_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&quot;,&quot;citationItems&quot;:[{&quot;id&quot;:&quot;e3596f90-1edb-3ff4-924b-ac9e46a7c8d5&quot;,&quot;itemData&quot;:{&quot;type&quot;:&quot;webpage&quot;,&quot;id&quot;:&quot;e3596f90-1edb-3ff4-924b-ac9e46a7c8d5&quot;,&quot;title&quot;:&quot;Drug Design with Small Molecule SMILES&quot;,&quot;author&quot;:[{&quot;family&quot;:&quot;Sgt. Peppers&quot;,&quot;given&quot;:&quot;&quot;,&quot;parse-names&quot;:false,&quot;dropping-particle&quot;:&quot;&quot;,&quot;non-dropping-particle&quot;:&quot;&quot;}],&quot;container-title&quot;:&quot;https://www.kaggle.com/datasets/art3mis/chembl22&quot;,&quot;issued&quot;:{&quot;date-parts&quot;:[[2025]]},&quot;container-title-short&quot;:&quot;&quot;},&quot;isTemporary&quot;:false}]},{&quot;citationID&quot;:&quot;MENDELEY_CITATION_c25554b6-155e-4912-80c0-3bf7fbbf1da3&quot;,&quot;properties&quot;:{&quot;noteIndex&quot;:0},&quot;isEdited&quot;:false,&quot;manualOverride&quot;:{&quot;isManuallyOverridden&quot;:false,&quot;citeprocText&quot;:&quot;[32]&quot;,&quot;manualOverrideText&quot;:&quot;&quot;},&quot;citationTag&quot;:&quot;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&quot;,&quot;citationItems&quot;:[{&quot;id&quot;:&quot;05dc4768-a214-33fc-85e4-fc8c5d25d6d2&quot;,&quot;itemData&quot;:{&quot;type&quot;:&quot;article-journal&quot;,&quot;id&quot;:&quot;05dc4768-a214-33fc-85e4-fc8c5d25d6d2&quot;,&quot;title&quot;:&quot;DrugBank 6.0: the DrugBank Knowledgebase for 2024&quot;,&quot;author&quot;:[{&quot;family&quot;:&quot;Knox&quot;,&quot;given&quot;:&quot;Craig&quot;,&quot;parse-names&quot;:false,&quot;dropping-particle&quot;:&quot;&quot;,&quot;non-dropping-particle&quot;:&quot;&quot;},{&quot;family&quot;:&quot;Wilson&quot;,&quot;given&quot;:&quot;Mike&quot;,&quot;parse-names&quot;:false,&quot;dropping-particle&quot;:&quot;&quot;,&quot;non-dropping-particle&quot;:&quot;&quot;},{&quot;family&quot;:&quot;Klinger&quot;,&quot;given&quot;:&quot;Christen M&quot;,&quot;parse-names&quot;:false,&quot;dropping-particle&quot;:&quot;&quot;,&quot;non-dropping-particle&quot;:&quot;&quot;},{&quot;family&quot;:&quot;Franklin&quot;,&quot;given&quot;:&quot;Mark&quot;,&quot;parse-names&quot;:false,&quot;dropping-particle&quot;:&quot;&quot;,&quot;non-dropping-particle&quot;:&quot;&quot;},{&quot;family&quot;:&quot;Oler&quot;,&quot;given&quot;:&quot;Eponine&quot;,&quot;parse-names&quot;:false,&quot;dropping-particle&quot;:&quot;&quot;,&quot;non-dropping-particle&quot;:&quot;&quot;},{&quot;family&quot;:&quot;Wilson&quot;,&quot;given&quot;:&quot;Alex&quot;,&quot;parse-names&quot;:false,&quot;dropping-particle&quot;:&quot;&quot;,&quot;non-dropping-particle&quot;:&quot;&quot;},{&quot;family&quot;:&quot;Pon&quot;,&quot;given&quot;:&quot;Allison&quot;,&quot;parse-names&quot;:false,&quot;dropping-particle&quot;:&quot;&quot;,&quot;non-dropping-particle&quot;:&quot;&quot;},{&quot;family&quot;:&quot;Cox&quot;,&quot;given&quot;:&quot;Jordan&quot;,&quot;parse-names&quot;:false,&quot;dropping-particle&quot;:&quot;&quot;,&quot;non-dropping-particle&quot;:&quot;&quot;},{&quot;family&quot;:&quot;Chin&quot;,&quot;given&quot;:&quot;Na Eun (Lucy)&quot;,&quot;parse-names&quot;:false,&quot;dropping-particle&quot;:&quot;&quot;,&quot;non-dropping-particle&quot;:&quot;&quot;},{&quot;family&quot;:&quot;Strawbridge&quot;,&quot;given&quot;:&quot;Seth A&quot;,&quot;parse-names&quot;:false,&quot;dropping-particle&quot;:&quot;&quot;,&quot;non-dropping-particle&quot;:&quot;&quot;},{&quot;family&quot;:&quot;Garcia-Patino&quot;,&quot;given&quot;:&quot;Marysol&quot;,&quot;parse-names&quot;:false,&quot;dropping-particle&quot;:&quot;&quot;,&quot;non-dropping-particle&quot;:&quot;&quot;},{&quot;family&quot;:&quot;Kruger&quot;,&quot;given&quot;:&quot;Ray&quot;,&quot;parse-names&quot;:false,&quot;dropping-particle&quot;:&quot;&quot;,&quot;non-dropping-particle&quot;:&quot;&quot;},{&quot;family&quot;:&quot;Sivakumaran&quot;,&quot;given&quot;:&quot;Aadhavya&quot;,&quot;parse-names&quot;:false,&quot;dropping-particle&quot;:&quot;&quot;,&quot;non-dropping-particle&quot;:&quot;&quot;},{&quot;family&quot;:&quot;Sanford&quot;,&quot;given&quot;:&quot;Selena&quot;,&quot;parse-names&quot;:false,&quot;dropping-particle&quot;:&quot;&quot;,&quot;non-dropping-particle&quot;:&quot;&quot;},{&quot;family&quot;:&quot;Doshi&quot;,&quot;given&quot;:&quot;Rahil&quot;,&quot;parse-names&quot;:false,&quot;dropping-particle&quot;:&quot;&quot;,&quot;non-dropping-particle&quot;:&quot;&quot;},{&quot;family&quot;:&quot;Khetarpal&quot;,&quot;given&quot;:&quot;Nitya&quot;,&quot;parse-names&quot;:false,&quot;dropping-particle&quot;:&quot;&quot;,&quot;non-dropping-particle&quot;:&quot;&quot;},{&quot;family&quot;:&quot;Fatokun&quot;,&quot;given&quot;:&quot;Omolola&quot;,&quot;parse-names&quot;:false,&quot;dropping-particle&quot;:&quot;&quot;,&quot;non-dropping-particle&quot;:&quot;&quot;},{&quot;family&quot;:&quot;Doucet&quot;,&quot;given&quot;:&quot;Daphnee&quot;,&quot;parse-names&quot;:false,&quot;dropping-particle&quot;:&quot;&quot;,&quot;non-dropping-particle&quot;:&quot;&quot;},{&quot;family&quot;:&quot;Zubkowski&quot;,&quot;given&quot;:&quot;Ashley&quot;,&quot;parse-names&quot;:false,&quot;dropping-particle&quot;:&quot;&quot;,&quot;non-dropping-particle&quot;:&quot;&quot;},{&quot;family&quot;:&quot;Rayat&quot;,&quot;given&quot;:&quot;Dorsa Yahya&quot;,&quot;parse-names&quot;:false,&quot;dropping-particle&quot;:&quot;&quot;,&quot;non-dropping-particle&quot;:&quot;&quot;},{&quot;family&quot;:&quot;Jackson&quot;,&quot;given&quot;:&quot;Hayley&quot;,&quot;parse-names&quot;:false,&quot;dropping-particle&quot;:&quot;&quot;,&quot;non-dropping-particle&quot;:&quot;&quot;},{&quot;family&quot;:&quot;Harford&quot;,&quot;given&quot;:&quot;Karxena&quot;,&quot;parse-names&quot;:false,&quot;dropping-particle&quot;:&quot;&quot;,&quot;non-dropping-particle&quot;:&quot;&quot;},{&quot;family&quot;:&quot;Anjum&quot;,&quot;given&quot;:&quot;Afia&quot;,&quot;parse-names&quot;:false,&quot;dropping-particle&quot;:&quot;&quot;,&quot;non-dropping-particle&quot;:&quot;&quot;},{&quot;family&quot;:&quot;Zakir&quot;,&quot;given&quot;:&quot;Mahi&quot;,&quot;parse-names&quot;:false,&quot;dropping-particle&quot;:&quot;&quot;,&quot;non-dropping-particle&quot;:&quot;&quot;},{&quot;family&quot;:&quot;Wang&quot;,&quot;given&quot;:&quot;Fei&quot;,&quot;parse-names&quot;:false,&quot;dropping-particle&quot;:&quot;&quot;,&quot;non-dropping-particle&quot;:&quot;&quot;},{&quot;family&quot;:&quot;Tian&quot;,&quot;given&quot;:&quot;Siyang&quot;,&quot;parse-names&quot;:false,&quot;dropping-particle&quot;:&quot;&quot;,&quot;non-dropping-particle&quot;:&quot;&quot;},{&quot;family&quot;:&quot;Lee&quot;,&quot;given&quot;:&quot;Brian&quot;,&quot;parse-names&quot;:false,&quot;dropping-particle&quot;:&quot;&quot;,&quot;non-dropping-particle&quot;:&quot;&quot;},{&quot;family&quot;:&quot;Liigand&quot;,&quot;given&quot;:&quot;Jaanus&quot;,&quot;parse-names&quot;:false,&quot;dropping-particle&quot;:&quot;&quot;,&quot;non-dropping-particle&quot;:&quot;&quot;},{&quot;family&quot;:&quot;Peters&quot;,&quot;given&quot;:&quot;Harrison&quot;,&quot;parse-names&quot;:false,&quot;dropping-particle&quot;:&quot;&quot;,&quot;non-dropping-particle&quot;:&quot;&quot;},{&quot;family&quot;:&quot;Wang&quot;,&quot;given&quot;:&quot;Ruo Qi (Rachel)&quot;,&quot;parse-names&quot;:false,&quot;dropping-particle&quot;:&quot;&quot;,&quot;non-dropping-particle&quot;:&quot;&quot;},{&quot;family&quot;:&quot;Nguyen&quot;,&quot;given&quot;:&quot;Tue&quot;,&quot;parse-names&quot;:false,&quot;dropping-particle&quot;:&quot;&quot;,&quot;non-dropping-particle&quot;:&quot;&quot;},{&quot;family&quot;:&quot;So&quot;,&quot;given&quot;:&quot;Denise&quot;,&quot;parse-names&quot;:false,&quot;dropping-particle&quot;:&quot;&quot;,&quot;non-dropping-particle&quot;:&quot;&quot;},{&quot;family&quot;:&quot;Sharp&quot;,&quot;given&quot;:&quot;Matthew&quot;,&quot;parse-names&quot;:false,&quot;dropping-particle&quot;:&quot;&quot;,&quot;non-dropping-particle&quot;:&quot;&quot;},{&quot;family&quot;:&quot;da Silva&quot;,&quot;given&quot;:&quot;Rodolfo&quot;,&quot;parse-names&quot;:false,&quot;dropping-particle&quot;:&quot;&quot;,&quot;non-dropping-particle&quot;:&quot;&quot;},{&quot;family&quot;:&quot;Gabriel&quot;,&quot;given&quot;:&quot;Cyrella&quot;,&quot;parse-names&quot;:false,&quot;dropping-particle&quot;:&quot;&quot;,&quot;non-dropping-particle&quot;:&quot;&quot;},{&quot;family&quot;:&quot;Scantlebury&quot;,&quot;given&quot;:&quot;Joshua&quot;,&quot;parse-names&quot;:false,&quot;dropping-particle&quot;:&quot;&quot;,&quot;non-dropping-particle&quot;:&quot;&quot;},{&quot;family&quot;:&quot;Jasinski&quot;,&quot;given&quot;:&quot;Marissa&quot;,&quot;parse-names&quot;:false,&quot;dropping-particle&quot;:&quot;&quot;,&quot;non-dropping-particle&quot;:&quot;&quot;},{&quot;family&quot;:&quot;Ackerman&quot;,&quot;given&quot;:&quot;David&quot;,&quot;parse-names&quot;:false,&quot;dropping-particle&quot;:&quot;&quot;,&quot;non-dropping-particle&quot;:&quot;&quot;},{&quot;family&quot;:&quot;Jewison&quot;,&quot;given&quot;:&quot;Timothy&quot;,&quot;parse-names&quot;:false,&quot;dropping-particle&quot;:&quot;&quot;,&quot;non-dropping-particle&quot;:&quot;&quot;},{&quot;family&quot;:&quot;Sajed&quot;,&quot;given&quot;:&quot;Tanvir&quot;,&quot;parse-names&quot;:false,&quot;dropping-particle&quot;:&quot;&quot;,&quot;non-dropping-particle&quot;:&quot;&quot;},{&quot;family&quot;:&quot;Gautam&quot;,&quot;given&quot;:&quot;Vasuk&quot;,&quot;parse-names&quot;:false,&quot;dropping-particle&quot;:&quot;&quot;,&quot;non-dropping-particle&quot;:&quot;&quot;},{&quot;family&quot;:&quot;Wishart&quot;,&quot;given&quot;:&quot;David S&quot;,&quot;parse-names&quot;:false,&quot;dropping-particle&quot;:&quot;&quot;,&quot;non-dropping-particle&quot;:&quot;&quot;}],&quot;container-title&quot;:&quot;Nucleic Acids Research&quot;,&quot;DOI&quot;:&quot;10.1093/nar/gkad976&quot;,&quot;ISSN&quot;:&quot;0305-1048&quot;,&quot;issued&quot;:{&quot;date-parts&quot;:[[2024,1,5]]},&quot;page&quot;:&quot;D1265-D1275&quot;,&quot;abstract&quot;:&quot;&lt;p&gt;First released in 2006, DrugBank (https://go.drugbank.com) has grown to become the ‘gold standard’ knowledge resource for drug, drug–target and related pharmaceutical information. DrugBank is widely used across many diverse biomedical research and clinical applications, and averages more than 30 million views/year. Since its last update in 2018, we have been actively enhancing the quantity and quality of the drug data in this knowledgebase. In this latest release (DrugBank 6.0), the number of FDA approved drugs has grown from 2646 to 4563 (a 72% increase), the number of investigational drugs has grown from 3394 to 6231 (a 38% increase), the number of drug–drug interactions increased from 365 984 to 1 413 413 (a 300% increase), and the number of drug–food interactions expanded from 1195 to 2475 (a 200% increase). In addition to this notable expansion in database size, we have added thousands of new, colorful, richly annotated pathways depicting drug mechanisms and drug metabolism. Likewise, existing datasets have been significantly improved and expanded, by adding more information on drug indications, drug–drug interactions, drug–food interactions and many other relevant data types for 11 891 drugs. We have also added experimental and predicted MS/MS spectra, 1D/2D-NMR spectra, CCS (collision cross section), RT (retention time) and RI (retention index) data for 9464 of DrugBank's 11 710 small molecule drugs. These and other improvements should make DrugBank 6.0 even more useful to a much wider research audience ranging from medicinal chemists to metabolomics specialists to pharmacologists.&lt;/p&gt;&quot;,&quot;issue&quot;:&quot;D1&quot;,&quot;volume&quot;:&quot;52&quot;,&quot;container-title-short&quot;:&quot;Nucleic Acids Res.&quot;},&quot;isTemporary&quot;:false}]},{&quot;citationID&quot;:&quot;MENDELEY_CITATION_842c6097-cdb7-4d69-9e19-e0a99dfba80a&quot;,&quot;properties&quot;:{&quot;noteIndex&quot;:0},&quot;isEdited&quot;:false,&quot;manualOverride&quot;:{&quot;isManuallyOverridden&quot;:false,&quot;citeprocText&quot;:&quot;[33]&quot;,&quot;manualOverrideText&quot;:&quot;&quot;},&quot;citationTag&quot;:&quot;MENDELEY_CITATION_v3_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&quot;,&quot;citationItems&quot;:[{&quot;id&quot;:&quot;2360cf28-52dd-3e44-85a2-08be789b8022&quot;,&quot;itemData&quot;:{&quot;type&quot;:&quot;article-journal&quot;,&quot;id&quot;:&quot;2360cf28-52dd-3e44-85a2-08be789b8022&quot;,&quot;title&quot;:&quot;The ChEMBL database in 2017&quot;,&quot;author&quot;:[{&quot;family&quot;:&quot;Gaulton&quot;,&quot;given&quot;:&quot;Anna&quot;,&quot;parse-names&quot;:false,&quot;dropping-particle&quot;:&quot;&quot;,&quot;non-dropping-particle&quot;:&quot;&quot;},{&quot;family&quot;:&quot;Hersey&quot;,&quot;given&quot;:&quot;Anne&quot;,&quot;parse-names&quot;:false,&quot;dropping-particle&quot;:&quot;&quot;,&quot;non-dropping-particle&quot;:&quot;&quot;},{&quot;family&quot;:&quot;Nowotka&quot;,&quot;given&quot;:&quot;Michał&quot;,&quot;parse-names&quot;:false,&quot;dropping-particle&quot;:&quot;&quot;,&quot;non-dropping-particle&quot;:&quot;&quot;},{&quot;family&quot;:&quot;Bento&quot;,&quot;given&quot;:&quot;A. Patrícia&quot;,&quot;parse-names&quot;:false,&quot;dropping-particle&quot;:&quot;&quot;,&quot;non-dropping-particle&quot;:&quot;&quot;},{&quot;family&quot;:&quot;Chambers&quot;,&quot;given&quot;:&quot;Jon&quot;,&quot;parse-names&quot;:false,&quot;dropping-particle&quot;:&quot;&quot;,&quot;non-dropping-particle&quot;:&quot;&quot;},{&quot;family&quot;:&quot;Mendez&quot;,&quot;given&quot;:&quot;David&quot;,&quot;parse-names&quot;:false,&quot;dropping-particle&quot;:&quot;&quot;,&quot;non-dropping-particle&quot;:&quot;&quot;},{&quot;family&quot;:&quot;Mutowo&quot;,&quot;given&quot;:&quot;Prudence&quot;,&quot;parse-names&quot;:false,&quot;dropping-particle&quot;:&quot;&quot;,&quot;non-dropping-particle&quot;:&quot;&quot;},{&quot;family&quot;:&quot;Atkinson&quot;,&quot;given&quot;:&quot;Francis&quot;,&quot;parse-names&quot;:false,&quot;dropping-particle&quot;:&quot;&quot;,&quot;non-dropping-particle&quot;:&quot;&quot;},{&quot;family&quot;:&quot;Bellis&quot;,&quot;given&quot;:&quot;Louisa J.&quot;,&quot;parse-names&quot;:false,&quot;dropping-particle&quot;:&quot;&quot;,&quot;non-dropping-particle&quot;:&quot;&quot;},{&quot;family&quot;:&quot;Cibrián-Uhalte&quot;,&quot;given&quot;:&quot;Elena&quot;,&quot;parse-names&quot;:false,&quot;dropping-particle&quot;:&quot;&quot;,&quot;non-dropping-particle&quot;:&quot;&quot;},{&quot;family&quot;:&quot;Davies&quot;,&quot;given&quot;:&quot;Mark&quot;,&quot;parse-names&quot;:false,&quot;dropping-particle&quot;:&quot;&quot;,&quot;non-dropping-particle&quot;:&quot;&quot;},{&quot;family&quot;:&quot;Dedman&quot;,&quot;given&quot;:&quot;Nathan&quot;,&quot;parse-names&quot;:false,&quot;dropping-particle&quot;:&quot;&quot;,&quot;non-dropping-particle&quot;:&quot;&quot;},{&quot;family&quot;:&quot;Karlsson&quot;,&quot;given&quot;:&quot;Anneli&quot;,&quot;parse-names&quot;:false,&quot;dropping-particle&quot;:&quot;&quot;,&quot;non-dropping-particle&quot;:&quot;&quot;},{&quot;family&quot;:&quot;Magariños&quot;,&quot;given&quot;:&quot;María Paula&quot;,&quot;parse-names&quot;:false,&quot;dropping-particle&quot;:&quot;&quot;,&quot;non-dropping-particle&quot;:&quot;&quot;},{&quot;family&quot;:&quot;Overington&quot;,&quot;given&quot;:&quot;John P.&quot;,&quot;parse-names&quot;:false,&quot;dropping-particle&quot;:&quot;&quot;,&quot;non-dropping-particle&quot;:&quot;&quot;},{&quot;family&quot;:&quot;Papadatos&quot;,&quot;given&quot;:&quot;George&quot;,&quot;parse-names&quot;:false,&quot;dropping-particle&quot;:&quot;&quot;,&quot;non-dropping-particle&quot;:&quot;&quot;},{&quot;family&quot;:&quot;Smit&quot;,&quot;given&quot;:&quot;Ines&quot;,&quot;parse-names&quot;:false,&quot;dropping-particle&quot;:&quot;&quot;,&quot;non-dropping-particle&quot;:&quot;&quot;},{&quot;family&quot;:&quot;Leach&quot;,&quot;given&quot;:&quot;Andrew R.&quot;,&quot;parse-names&quot;:false,&quot;dropping-particle&quot;:&quot;&quot;,&quot;non-dropping-particle&quot;:&quot;&quot;}],&quot;container-title&quot;:&quot;Nucleic Acids Research&quot;,&quot;DOI&quot;:&quot;10.1093/nar/gkw1074&quot;,&quot;ISSN&quot;:&quot;0305-1048&quot;,&quot;issued&quot;:{&quot;date-parts&quot;:[[2017,1,4]]},&quot;page&quot;:&quot;D945-D954&quot;,&quot;issue&quot;:&quot;D1&quot;,&quot;volume&quot;:&quot;45&quot;,&quot;container-title-short&quot;:&quot;Nucleic Acids Res.&quot;},&quot;isTemporary&quot;:false}]},{&quot;citationID&quot;:&quot;MENDELEY_CITATION_f7c666f5-11ce-4466-a5b6-1fb7e14e1fb6&quot;,&quot;properties&quot;:{&quot;noteIndex&quot;:0},&quot;isEdited&quot;:false,&quot;manualOverride&quot;:{&quot;isManuallyOverridden&quot;:false,&quot;citeprocText&quot;:&quot;[34]&quot;,&quot;manualOverrideText&quot;:&quot;&quot;},&quot;citationTag&quot;:&quot;MENDELEY_CITATION_v3_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&quot;,&quot;citationItems&quot;:[{&quot;id&quot;:&quot;894bf710-3c9a-38d7-a687-6a8f8d072ef0&quot;,&quot;itemData&quot;:{&quot;type&quot;:&quot;article-journal&quot;,&quot;id&quot;:&quot;894bf710-3c9a-38d7-a687-6a8f8d072ef0&quot;,&quot;title&quot;:&quot;Pre-trained molecular representations enable antimicrobial discovery&quot;,&quot;author&quot;:[{&quot;family&quot;:&quot;Olayo-Alarcon&quot;,&quot;given&quot;:&quot;Roberto&quot;,&quot;parse-names&quot;:false,&quot;dropping-particle&quot;:&quot;&quot;,&quot;non-dropping-particle&quot;:&quot;&quot;},{&quot;family&quot;:&quot;Amstalden&quot;,&quot;given&quot;:&quot;Martin K.&quot;,&quot;parse-names&quot;:false,&quot;dropping-particle&quot;:&quot;&quot;,&quot;non-dropping-particle&quot;:&quot;&quot;},{&quot;family&quot;:&quot;Zannoni&quot;,&quot;given&quot;:&quot;Annamaria&quot;,&quot;parse-names&quot;:false,&quot;dropping-particle&quot;:&quot;&quot;,&quot;non-dropping-particle&quot;:&quot;&quot;},{&quot;family&quot;:&quot;Bajramovic&quot;,&quot;given&quot;:&quot;Medina&quot;,&quot;parse-names&quot;:false,&quot;dropping-particle&quot;:&quot;&quot;,&quot;non-dropping-particle&quot;:&quot;&quot;},{&quot;family&quot;:&quot;Sharma&quot;,&quot;given&quot;:&quot;Cynthia M.&quot;,&quot;parse-names&quot;:false,&quot;dropping-particle&quot;:&quot;&quot;,&quot;non-dropping-particle&quot;:&quot;&quot;},{&quot;family&quot;:&quot;Brochado&quot;,&quot;given&quot;:&quot;Ana Rita&quot;,&quot;parse-names&quot;:false,&quot;dropping-particle&quot;:&quot;&quot;,&quot;non-dropping-particle&quot;:&quot;&quot;},{&quot;family&quot;:&quot;Rezaei&quot;,&quot;given&quot;:&quot;Mina&quot;,&quot;parse-names&quot;:false,&quot;dropping-particle&quot;:&quot;&quot;,&quot;non-dropping-particle&quot;:&quot;&quot;},{&quot;family&quot;:&quot;Müller&quot;,&quot;given&quot;:&quot;Christian L.&quot;,&quot;parse-names&quot;:false,&quot;dropping-particle&quot;:&quot;&quot;,&quot;non-dropping-particle&quot;:&quot;&quot;}],&quot;container-title&quot;:&quot;Nature Communications&quot;,&quot;DOI&quot;:&quot;10.1038/s41467-025-58804-4&quot;,&quot;ISSN&quot;:&quot;2041-1723&quot;,&quot;issued&quot;:{&quot;date-parts&quot;:[[2025,4,10]]},&quot;page&quot;:&quot;3420&quot;,&quot;abstract&quot;:&quot;&lt;p&gt; The rise in antimicrobial resistance poses a worldwide threat, reducing the efficacy of common antibiotics. Determining the antimicrobial activity of new chemical compounds through experimental methods remains time-consuming and costly. While compound-centric deep learning models promise to accelerate this search and prioritization process, current strategies require large amounts of custom training data. Here, we introduce a lightweight computational strategy for antimicrobial discovery that builds on MolE (Molecular representation through redundancy reduced Embedding), a self-supervised deep learning framework that leverages unlabeled chemical structures to learn task-independent molecular representations. By combining MolE representation learning with available, experimentally validated compound-bacteria activity data, we design a general predictive model that enables assessing compounds with respect to their antimicrobial potential. Our model correctly identifies recent growth-inhibitory compounds that are structurally distinct from current antibiotics. Using this approach, we discover de novo, and experimentally confirm, three human-targeted drugs as growth inhibitors of &lt;italic&gt;Staphylococcus aureus&lt;/italic&gt; . This framework offers a viable, cost-effective strategy to accelerate antibiotic discovery. &lt;/p&gt;&quot;,&quot;issue&quot;:&quot;1&quot;,&quot;volume&quot;:&quot;16&quot;,&quot;container-title-short&quot;:&quot;Nat. Commun.&quot;},&quot;isTemporary&quot;:false}]}]"/>
+    <we:property name="MENDELEY_BIBLIOGRAPHY_LAST_MODIFIED" value="1778526286045"/>
+    <we:property name="MENDELEY_CITATIONS" value="[{&quot;citationID&quot;:&quot;MENDELEY_CITATION_917e5d1d-8132-466d-b0a6-a0da3177f8a4&quot;,&quot;properties&quot;:{&quot;noteIndex&quot;:0},&quot;isEdited&quot;:false,&quot;manualOverride&quot;:{&quot;isManuallyOverridden&quot;:false,&quot;citeprocText&quot;:&quot;[1], [2]&quot;,&quot;manualOverrideText&quot;:&quot;&quot;},&quot;citationTag&quot;:&quot;MENDELEY_CITATION_v3_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&quot;,&quot;citationItems&quot;:[{&quot;id&quot;:&quot;bf4b9b8e-8cd4-3267-8fea-3e05e74bdeb9&quot;,&quot;itemData&quot;:{&quot;type&quot;:&quot;chapter&quot;,&quot;id&quot;:&quot;bf4b9b8e-8cd4-3267-8fea-3e05e74bdeb9&quot;,&quot;title&quot;:&quot;Drug Metabolism: Phase I and Phase II Metabolic Pathways&quot;,&quot;author&quot;:[{&quot;family&quot;:&quot;ul Amin Mohsin&quot;,&quot;given&quot;:&quot;Noor&quot;,&quot;parse-names&quot;:false,&quot;dropping-particle&quot;:&quot;&quot;,&quot;non-dropping-particle&quot;:&quot;&quot;},{&quot;family&quot;:&quot;Farrukh&quot;,&quot;given&quot;:&quot;Maryam&quot;,&quot;parse-names&quot;:false,&quot;dropping-particle&quot;:&quot;&quot;,&quot;non-dropping-particle&quot;:&quot;&quot;},{&quot;family&quot;:&quot;Shahzadi&quot;,&quot;given&quot;:&quot;Saba&quot;,&quot;parse-names&quot;:false,&quot;dropping-particle&quot;:&quot;&quot;,&quot;non-dropping-particle&quot;:&quot;&quot;},{&quot;family&quot;:&quot;Irfan&quot;,&quot;given&quot;:&quot;Muhammad&quot;,&quot;parse-names&quot;:false,&quot;dropping-particle&quot;:&quot;&quot;,&quot;non-dropping-particle&quot;:&quot;&quot;}],&quot;DOI&quot;:&quot;10.5772/intechopen.112854&quot;,&quot;issued&quot;:{&quot;date-parts&quot;:[[2024,2,14]]},&quot;container-title-short&quot;:&quot;&quot;},&quot;isTemporary&quot;:false},{&quot;id&quot;:&quot;38c736ba-04f7-31e6-a646-9680ae3c3eda&quot;,&quot;itemData&quot;:{&quot;type&quot;:&quot;article-journal&quot;,&quot;id&quot;:&quot;38c736ba-04f7-31e6-a646-9680ae3c3eda&quot;,&quot;title&quot;:&quot;Post-marketing withdrawal of 462 medicinal products because of adverse drug reactions: a systematic review of the world literature&quot;,&quot;author&quot;:[{&quot;family&quot;:&quot;Onakpoya&quot;,&quot;given&quot;:&quot;Igho J.&quot;,&quot;parse-names&quot;:false,&quot;dropping-particle&quot;:&quot;&quot;,&quot;non-dropping-particle&quot;:&quot;&quot;},{&quot;family&quot;:&quot;Heneghan&quot;,&quot;given&quot;:&quot;Carl J.&quot;,&quot;parse-names&quot;:false,&quot;dropping-particle&quot;:&quot;&quot;,&quot;non-dropping-particle&quot;:&quot;&quot;},{&quot;family&quot;:&quot;Aronson&quot;,&quot;given&quot;:&quot;Jeffrey K.&quot;,&quot;parse-names&quot;:false,&quot;dropping-particle&quot;:&quot;&quot;,&quot;non-dropping-particle&quot;:&quot;&quot;}],&quot;container-title&quot;:&quot;BMC Medicine&quot;,&quot;container-title-short&quot;:&quot;BMC Med.&quot;,&quot;DOI&quot;:&quot;10.1186/s12916-016-0553-2&quot;,&quot;ISSN&quot;:&quot;1741-7015&quot;,&quot;issued&quot;:{&quot;date-parts&quot;:[[2016,12,4]]},&quot;page&quot;:&quot;10&quot;,&quot;issue&quot;:&quot;1&quot;,&quot;volume&quot;:&quot;14&quot;},&quot;isTemporary&quot;:false}]},{&quot;citationID&quot;:&quot;MENDELEY_CITATION_4c61a503-9278-499d-9d99-f0a543c311cd&quot;,&quot;properties&quot;:{&quot;noteIndex&quot;:0},&quot;isEdited&quot;:false,&quot;manualOverride&quot;:{&quot;isManuallyOverridden&quot;:false,&quot;citeprocText&quot;:&quot;[3]&quot;,&quot;manualOverrideText&quot;:&quot;&quot;},&quot;citationTag&quot;:&quot;MENDELEY_CITATION_v3_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&quot;,&quot;citationItems&quot;:[{&quot;id&quot;:&quot;a7499272-8f2c-3731-b644-7b0aae951850&quot;,&quot;itemData&quot;:{&quot;type&quot;:&quot;article-journal&quot;,&quot;id&quot;:&quot;a7499272-8f2c-3731-b644-7b0aae951850&quot;,&quot;title&quot;:&quot;In silico ADME-Tox modeling: progress and prospects&quot;,&quot;author&quot;:[{&quot;family&quot;:&quot;Alqahtani&quot;,&quot;given&quot;:&quot;Saeed&quot;,&quot;parse-names&quot;:false,&quot;dropping-particle&quot;:&quot;&quot;,&quot;non-dropping-particle&quot;:&quot;&quot;}],&quot;container-title&quot;:&quot;Expert Opinion on Drug Metabolism &amp; Toxicology&quot;,&quot;DOI&quot;:&quot;10.1080/17425255.2017.1389897&quot;,&quot;ISSN&quot;:&quot;1742-5255&quot;,&quot;issued&quot;:{&quot;date-parts&quot;:[[2017,11,2]]},&quot;page&quot;:&quot;1147-1158&quot;,&quot;issue&quot;:&quot;11&quot;,&quot;volume&quot;:&quot;13&quot;,&quot;container-title-short&quot;:&quot;Expert Opin. Drug Metab. Toxicol.&quot;},&quot;isTemporary&quot;:false}]},{&quot;citationID&quot;:&quot;MENDELEY_CITATION_f9163c9d-db05-495c-82ad-845f41c010e3&quot;,&quot;properties&quot;:{&quot;noteIndex&quot;:0},&quot;isEdited&quot;:false,&quot;manualOverride&quot;:{&quot;isManuallyOverridden&quot;:false,&quot;citeprocText&quot;:&quot;[4]&quot;,&quot;manualOverrideText&quot;:&quot;&quot;},&quot;citationTag&quot;:&quot;MENDELEY_CITATION_v3_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&quot;,&quot;citationItems&quot;:[{&quot;id&quot;:&quot;41dab8de-eca9-3196-8661-835a96a3207d&quot;,&quot;itemData&quot;:{&quot;type&quot;:&quot;article-journal&quot;,&quot;id&quot;:&quot;41dab8de-eca9-3196-8661-835a96a3207d&quot;,&quot;title&quot;:&quot;Predicting routes of phase I and II metabolism based on quantum mechanics and machine learning&quot;,&quot;author&quot;:[{&quot;family&quot;:&quot;Öeren&quot;,&quot;given&quot;:&quot;Mario&quot;,&quot;parse-names&quot;:false,&quot;dropping-particle&quot;:&quot;&quot;,&quot;non-dropping-particle&quot;:&quot;&quot;},{&quot;family&quot;:&quot;Hunt&quot;,&quot;given&quot;:&quot;Peter A.&quot;,&quot;parse-names&quot;:false,&quot;dropping-particle&quot;:&quot;&quot;,&quot;non-dropping-particle&quot;:&quot;&quot;},{&quot;family&quot;:&quot;Wharrick&quot;,&quot;given&quot;:&quot;Charlotte E.&quot;,&quot;parse-names&quot;:false,&quot;dropping-particle&quot;:&quot;&quot;,&quot;non-dropping-particle&quot;:&quot;&quot;},{&quot;family&quot;:&quot;Tabatabaei Ghomi&quot;,&quot;given&quot;:&quot;Hamed&quot;,&quot;parse-names&quot;:false,&quot;dropping-particle&quot;:&quot;&quot;,&quot;non-dropping-particle&quot;:&quot;&quot;},{&quot;family&quot;:&quot;Segall&quot;,&quot;given&quot;:&quot;Matthew D.&quot;,&quot;parse-names&quot;:false,&quot;dropping-particle&quot;:&quot;&quot;,&quot;non-dropping-particle&quot;:&quot;&quot;}],&quot;container-title&quot;:&quot;Xenobiotica&quot;,&quot;DOI&quot;:&quot;10.1080/00498254.2023.2284251&quot;,&quot;ISSN&quot;:&quot;0049-8254&quot;,&quot;issued&quot;:{&quot;date-parts&quot;:[[2024,8,8]]},&quot;page&quot;:&quot;379-393&quot;,&quot;issue&quot;:&quot;7&quot;,&quot;volume&quot;:&quot;54&quot;,&quot;container-title-short&quot;:&quot;&quot;},&quot;isTemporary&quot;:false}]},{&quot;citationID&quot;:&quot;MENDELEY_CITATION_b3a78241-26d9-4c0f-a776-f58d6393a7c1&quot;,&quot;properties&quot;:{&quot;noteIndex&quot;:0},&quot;isEdited&quot;:false,&quot;manualOverride&quot;:{&quot;isManuallyOverridden&quot;:false,&quot;citeprocText&quot;:&quot;[5]&quot;,&quot;manualOverrideText&quot;:&quot;&quot;},&quot;citationTag&quot;:&quot;MENDELEY_CITATION_v3_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&quot;,&quot;citationItems&quot;:[{&quot;id&quot;:&quot;13bc8314-57b6-3cd6-845d-b642b9f122d5&quot;,&quot;itemData&quot;:{&quot;type&quot;:&quot;webpage&quot;,&quot;id&quot;:&quot;13bc8314-57b6-3cd6-845d-b642b9f122d5&quot;,&quot;title&quot;:&quot;Decoding phase I &amp; II human drug metabolism using the prediction tool MetaSite for chemists, medicinal chemists, and metID experts.&quot;,&quot;author&quot;:[{&quot;family&quot;:&quot;Cruciani&quot;,&quot;given&quot;:&quot;Gabriele&quot;,&quot;parse-names&quot;:false,&quot;dropping-particle&quot;:&quot;&quot;,&quot;non-dropping-particle&quot;:&quot;&quot;},{&quot;family&quot;:&quot;Desantis&quot;,&quot;given&quot;:&quot;Jenny&quot;,&quot;parse-names&quot;:false,&quot;dropping-particle&quot;:&quot;&quot;,&quot;non-dropping-particle&quot;:&quot;&quot;},{&quot;family&quot;:&quot;Palomba&quot;,&quot;given&quot;:&quot;Tommaso&quot;,&quot;parse-names&quot;:false,&quot;dropping-particle&quot;:&quot;&quot;,&quot;non-dropping-particle&quot;:&quot;&quot;},{&quot;family&quot;:&quot;Baroni&quot;,&quot;given&quot;:&quot;Massimo&quot;,&quot;parse-names&quot;:false,&quot;dropping-particle&quot;:&quot;&quot;,&quot;non-dropping-particle&quot;:&quot;&quot;},{&quot;family&quot;:&quot;Valeri&quot;,&quot;given&quot;:&quot;Aurora&quot;,&quot;parse-names&quot;:false,&quot;dropping-particle&quot;:&quot;&quot;,&quot;non-dropping-particle&quot;:&quot;&quot;},{&quot;family&quot;:&quot;Siragusa&quot;,&quot;given&quot;:&quot;Lydia&quot;,&quot;parse-names&quot;:false,&quot;dropping-particle&quot;:&quot;&quot;,&quot;non-dropping-particle&quot;:&quot;&quot;},{&quot;family&quot;:&quot;Venturi&quot;,&quot;given&quot;:&quot;Ludovico&quot;,&quot;parse-names&quot;:false,&quot;dropping-particle&quot;:&quot;&quot;,&quot;non-dropping-particle&quot;:&quot;&quot;},{&quot;family&quot;:&quot;Zamora&quot;,&quot;given&quot;:&quot;Ismael&quot;,&quot;parse-names&quot;:false,&quot;dropping-particle&quot;:&quot;&quot;,&quot;non-dropping-particle&quot;:&quot;&quot;},{&quot;family&quot;:&quot;Meyer&quot;,&quot;given&quot;:&quot;Christophe&quot;,&quot;parse-names&quot;:false,&quot;dropping-particle&quot;:&quot;&quot;,&quot;non-dropping-particle&quot;:&quot;&quot;},{&quot;family&quot;:&quot;Laboureur&quot;,&quot;given&quot;:&quot;Laurent&quot;,&quot;parse-names&quot;:false,&quot;dropping-particle&quot;:&quot;&quot;,&quot;non-dropping-particle&quot;:&quot;&quot;},{&quot;family&quot;:&quot;Emre&quot;,&quot;given&quot;:&quot;Isin&quot;,&quot;parse-names&quot;:false,&quot;dropping-particle&quot;:&quot;&quot;,&quot;non-dropping-particle&quot;:&quot;&quot;},{&quot;family&quot;:&quot;Goracci&quot;,&quot;given&quot;:&quot;Laura&quot;,&quot;parse-names&quot;:false,&quot;dropping-particle&quot;:&quot;&quot;,&quot;non-dropping-particle&quot;:&quot;&quot;}],&quot;issued&quot;:{&quot;date-parts&quot;:[[2024]]},&quot;container-title-short&quot;:&quot;&quot;},&quot;isTemporary&quot;:false}]},{&quot;citationID&quot;:&quot;MENDELEY_CITATION_a090304e-5ae5-4071-9395-15b690c02537&quot;,&quot;properties&quot;:{&quot;noteIndex&quot;:0},&quot;isEdited&quot;:false,&quot;manualOverride&quot;:{&quot;isManuallyOverridden&quot;:false,&quot;citeprocText&quot;:&quot;[6]&quot;,&quot;manualOverrideText&quot;:&quot;&quot;},&quot;citationTag&quot;:&quot;MENDELEY_CITATION_v3_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&quot;,&quot;citationItems&quot;:[{&quot;id&quot;:&quot;30167f7e-6772-397c-8d9b-7e31dc75bdc6&quot;,&quot;itemData&quot;:{&quot;type&quot;:&quot;article-journal&quot;,&quot;id&quot;:&quot;30167f7e-6772-397c-8d9b-7e31dc75bdc6&quot;,&quot;title&quot;:&quot;CYPstrate: A Set of Machine Learning Models for the Accurate Classification of Cytochrome P450 Enzyme Substrates and Non-Substrates&quot;,&quot;author&quot;:[{&quot;family&quot;:&quot;Holmer&quot;,&quot;given&quot;:&quot;Malte&quot;,&quot;parse-names&quot;:false,&quot;dropping-particle&quot;:&quot;&quot;,&quot;non-dropping-particle&quot;:&quot;&quot;},{&quot;family&quot;:&quot;Bruyn Kops&quot;,&quot;given&quot;:&quot;Christina&quot;,&quot;parse-names&quot;:false,&quot;dropping-particle&quot;:&quot;&quot;,&quot;non-dropping-particle&quot;:&quot;de&quot;},{&quot;family&quot;:&quot;Stork&quot;,&quot;given&quot;:&quot;Conrad&quot;,&quot;parse-names&quot;:false,&quot;dropping-particle&quot;:&quot;&quot;,&quot;non-dropping-particle&quot;:&quot;&quot;},{&quot;family&quot;:&quot;Kirchmair&quot;,&quot;given&quot;:&quot;Johannes&quot;,&quot;parse-names&quot;:false,&quot;dropping-particle&quot;:&quot;&quot;,&quot;non-dropping-particle&quot;:&quot;&quot;}],&quot;container-title&quot;:&quot;Molecules&quot;,&quot;DOI&quot;:&quot;10.3390/molecules26154678&quot;,&quot;ISSN&quot;:&quot;1420-3049&quot;,&quot;issued&quot;:{&quot;date-parts&quot;:[[2021,8,2]]},&quot;page&quot;:&quot;4678&quot;,&quot;abstract&quot;:&quot;&lt;p&gt;The interaction of small organic molecules such as drugs, agrochemicals, and cosmetics with cytochrome P450 enzymes (CYPs) can lead to substantial changes in the bioavailability of active substances and hence consequences with respect to pharmacological efficacy and toxicity. Therefore, efficient means of predicting the interactions of small organic molecules with CYPs are of high importance to a host of different industries. In this work, we present a new set of machine learning models for the classification of xenobiotics into substrates and non-substrates of nine human CYP isozymes: CYPs 1A2, 2A6, 2B6, 2C8, 2C9, 2C19, 2D6, 2E1, and 3A4. The models are trained on an extended, high-quality collection of known substrates and non-substrates and have been subjected to thorough validation. Our results show that the models yield competitive performance and are favorable for the detection of CYP substrates. In particular, a new consensus model reached high performance, with Matthews correlation coefficients (MCCs) between 0.45 (CYP2C8) and 0.85 (CYP3A4), although at the cost of coverage. The best models presented in this work are accessible free of charge via the “CYPstrate” module of the New E-Resource for Drug Discovery (NERDD).&lt;/p&gt;&quot;,&quot;issue&quot;:&quot;15&quot;,&quot;volume&quot;:&quot;26&quot;,&quot;container-title-short&quot;:&quot;&quot;},&quot;isTemporary&quot;:false}]},{&quot;citationID&quot;:&quot;MENDELEY_CITATION_b88c5398-356c-4dd6-910a-1154fc2a2abe&quot;,&quot;properties&quot;:{&quot;noteIndex&quot;:0},&quot;isEdited&quot;:false,&quot;manualOverride&quot;:{&quot;isManuallyOverridden&quot;:false,&quot;citeprocText&quot;:&quot;[7]&quot;,&quot;manualOverrideText&quot;:&quot;&quot;},&quot;citationTag&quot;:&quot;MENDELEY_CITATION_v3_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&quot;,&quot;citationItems&quot;:[{&quot;id&quot;:&quot;fa11ca6b-cdbb-3046-b0fc-8f028817e99c&quot;,&quot;itemData&quot;:{&quot;type&quot;:&quot;article-journal&quot;,&quot;id&quot;:&quot;fa11ca6b-cdbb-3046-b0fc-8f028817e99c&quot;,&quot;title&quot;:&quot;CypReact: A Software Tool for in Silico Reactant Prediction for Human Cytochrome P450 Enzymes&quot;,&quot;author&quot;:[{&quot;family&quot;:&quot;Tian&quot;,&quot;given&quot;:&quot;Siyang&quot;,&quot;parse-names&quot;:false,&quot;dropping-particle&quot;:&quot;&quot;,&quot;non-dropping-particle&quot;:&quot;&quot;},{&quot;family&quot;:&quot;Djoumbou-Feunang&quot;,&quot;given&quot;:&quot;Yannick&quot;,&quot;parse-names&quot;:false,&quot;dropping-particle&quot;:&quot;&quot;,&quot;non-dropping-particle&quot;:&quot;&quot;},{&quot;family&quot;:&quot;Greiner&quot;,&quot;given&quot;:&quot;Russell&quot;,&quot;parse-names&quot;:false,&quot;dropping-particle&quot;:&quot;&quot;,&quot;non-dropping-particle&quot;:&quot;&quot;},{&quot;family&quot;:&quot;Wishart&quot;,&quot;given&quot;:&quot;David S&quot;,&quot;parse-names&quot;:false,&quot;dropping-particle&quot;:&quot;&quot;,&quot;non-dropping-particle&quot;:&quot;&quot;}],&quot;container-title&quot;:&quot;Journal of Chemical Information and Modeling&quot;,&quot;DOI&quot;:&quot;10.1021/acs.jcim.8b00035&quot;,&quot;URL&quot;:&quot;https://doi.org/10.1021/acs.jcim.8b00035&quot;,&quot;issued&quot;:{&quot;date-parts&quot;:[[2018]]},&quot;page&quot;:&quot;1282-1291&quot;,&quot;issue&quot;:&quot;6&quot;,&quot;volume&quot;:&quot;58&quot;,&quot;container-title-short&quot;:&quot;J. Chem. Inf. Model.&quot;},&quot;isTemporary&quot;:false}]},{&quot;citationID&quot;:&quot;MENDELEY_CITATION_9e00beb5-b823-441f-bd21-5c0245227aff&quot;,&quot;properties&quot;:{&quot;noteIndex&quot;:0},&quot;isEdited&quot;:false,&quot;manualOverride&quot;:{&quot;isManuallyOverridden&quot;:false,&quot;citeprocText&quot;:&quot;[8]&quot;,&quot;manualOverrideText&quot;:&quot;&quot;},&quot;citationTag&quot;:&quot;MENDELEY_CITATION_v3_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&quot;,&quot;citationItems&quot;:[{&quot;id&quot;:&quot;5396d9c6-cb3b-363a-9678-0b3b627a7437&quot;,&quot;itemData&quot;:{&quot;type&quot;:&quot;article-journal&quot;,&quot;id&quot;:&quot;5396d9c6-cb3b-363a-9678-0b3b627a7437&quot;,&quot;title&quot;:&quot;DeepP450: Predicting Human P450 Activities of Small Molecules by Integrating Pretrained Protein Language Model and Molecular Representation&quot;,&quot;author&quot;:[{&quot;family&quot;:&quot;Chang&quot;,&quot;given&quot;:&quot;Jiamin&quot;,&quot;parse-names&quot;:false,&quot;dropping-particle&quot;:&quot;&quot;,&quot;non-dropping-particle&quot;:&quot;&quot;},{&quot;family&quot;:&quot;Fan&quot;,&quot;given&quot;:&quot;Xiaoyu&quot;,&quot;parse-names&quot;:false,&quot;dropping-particle&quot;:&quot;&quot;,&quot;non-dropping-particle&quot;:&quot;&quot;},{&quot;family&quot;:&quot;Tian&quot;,&quot;given&quot;:&quot;Boxue&quot;,&quot;parse-names&quot;:false,&quot;dropping-particle&quot;:&quot;&quot;,&quot;non-dropping-particle&quot;:&quot;&quot;}],&quot;container-title&quot;:&quot;Journal of Chemical Information and Modeling&quot;,&quot;DOI&quot;:&quot;10.1021/acs.jcim.4c00115&quot;,&quot;URL&quot;:&quot;https://doi.org/10.1021/acs.jcim.4c00115&quot;,&quot;issued&quot;:{&quot;date-parts&quot;:[[2024]]},&quot;page&quot;:&quot;3149-3160&quot;,&quot;issue&quot;:&quot;8&quot;,&quot;volume&quot;:&quot;64&quot;,&quot;container-title-short&quot;:&quot;J. Chem. Inf. Model.&quot;},&quot;isTemporary&quot;:false}]},{&quot;citationID&quot;:&quot;MENDELEY_CITATION_5dca3d77-b598-4d67-9225-e52ba676341f&quot;,&quot;properties&quot;:{&quot;noteIndex&quot;:0},&quot;isEdited&quot;:false,&quot;manualOverride&quot;:{&quot;isManuallyOverridden&quot;:false,&quot;citeprocText&quot;:&quot;[9]&quot;,&quot;manualOverrideText&quot;:&quot;&quot;},&quot;citationTag&quot;:&quot;MENDELEY_CITATION_v3_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&quot;,&quot;citationItems&quot;:[{&quot;id&quot;:&quot;43b0d024-e9b9-3059-b9bc-07339751aa6d&quot;,&quot;itemData&quot;:{&quot;type&quot;:&quot;article-journal&quot;,&quot;id&quot;:&quot;43b0d024-e9b9-3059-b9bc-07339751aa6d&quot;,&quot;title&quot;:&quot;ADMETlab 3.0: an updated comprehensive online ADMET prediction platform enhanced with broader coverage, improved performance, API functionality and decision support&quot;,&quot;author&quot;:[{&quot;family&quot;:&quot;Fu&quot;,&quot;given&quot;:&quot;Li&quot;,&quot;parse-names&quot;:false,&quot;dropping-particle&quot;:&quot;&quot;,&quot;non-dropping-particle&quot;:&quot;&quot;},{&quot;family&quot;:&quot;Shi&quot;,&quot;given&quot;:&quot;Shaohua&quot;,&quot;parse-names&quot;:false,&quot;dropping-particle&quot;:&quot;&quot;,&quot;non-dropping-particle&quot;:&quot;&quot;},{&quot;family&quot;:&quot;Yi&quot;,&quot;given&quot;:&quot;Jiacai&quot;,&quot;parse-names&quot;:false,&quot;dropping-particle&quot;:&quot;&quot;,&quot;non-dropping-particle&quot;:&quot;&quot;},{&quot;family&quot;:&quot;Wang&quot;,&quot;given&quot;:&quot;Ningning&quot;,&quot;parse-names&quot;:false,&quot;dropping-particle&quot;:&quot;&quot;,&quot;non-dropping-particle&quot;:&quot;&quot;},{&quot;family&quot;:&quot;He&quot;,&quot;given&quot;:&quot;Yuanhang&quot;,&quot;parse-names&quot;:false,&quot;dropping-particle&quot;:&quot;&quot;,&quot;non-dropping-particle&quot;:&quot;&quot;},{&quot;family&quot;:&quot;Wu&quot;,&quot;given&quot;:&quot;Zhenxing&quot;,&quot;parse-names&quot;:false,&quot;dropping-particle&quot;:&quot;&quot;,&quot;non-dropping-particle&quot;:&quot;&quot;},{&quot;family&quot;:&quot;Peng&quot;,&quot;given&quot;:&quot;Jinfu&quot;,&quot;parse-names&quot;:false,&quot;dropping-particle&quot;:&quot;&quot;,&quot;non-dropping-particle&quot;:&quot;&quot;},{&quot;family&quot;:&quot;Deng&quot;,&quot;given&quot;:&quot;Youchao&quot;,&quot;parse-names&quot;:false,&quot;dropping-particle&quot;:&quot;&quot;,&quot;non-dropping-particle&quot;:&quot;&quot;},{&quot;family&quot;:&quot;Wang&quot;,&quot;given&quot;:&quot;Wenxuan&quot;,&quot;parse-names&quot;:false,&quot;dropping-particle&quot;:&quot;&quot;,&quot;non-dropping-particle&quot;:&quot;&quot;},{&quot;family&quot;:&quot;Wu&quot;,&quot;given&quot;:&quot;Chengkun&quot;,&quot;parse-names&quot;:false,&quot;dropping-particle&quot;:&quot;&quot;,&quot;non-dropping-particle&quot;:&quot;&quot;},{&quot;family&quot;:&quot;Lyu&quot;,&quot;given&quot;:&quot;Aiping&quot;,&quot;parse-names&quot;:false,&quot;dropping-particle&quot;:&quot;&quot;,&quot;non-dropping-particle&quot;:&quot;&quot;},{&quot;family&quot;:&quot;Zeng&quot;,&quot;given&quot;:&quot;Xiangxiang&quot;,&quot;parse-names&quot;:false,&quot;dropping-particle&quot;:&quot;&quot;,&quot;non-dropping-particle&quot;:&quot;&quot;},{&quot;family&quot;:&quot;Zhao&quot;,&quot;given&quot;:&quot;Wentao&quot;,&quot;parse-names&quot;:false,&quot;dropping-particle&quot;:&quot;&quot;,&quot;non-dropping-particle&quot;:&quot;&quot;},{&quot;family&quot;:&quot;Hou&quot;,&quot;given&quot;:&quot;Tingjun&quot;,&quot;parse-names&quot;:false,&quot;dropping-particle&quot;:&quot;&quot;,&quot;non-dropping-particle&quot;:&quot;&quot;},{&quot;family&quot;:&quot;Cao&quot;,&quot;given&quot;:&quot;Dongsheng&quot;,&quot;parse-names&quot;:false,&quot;dropping-particle&quot;:&quot;&quot;,&quot;non-dropping-particle&quot;:&quot;&quot;}],&quot;container-title&quot;:&quot;Nucleic Acids Research&quot;,&quot;DOI&quot;:&quot;10.1093/nar/gkae236&quot;,&quot;ISSN&quot;:&quot;0305-1048&quot;,&quot;issued&quot;:{&quot;date-parts&quot;:[[2024,7,5]]},&quot;page&quot;:&quot;W422-W431&quot;,&quot;abstract&quot;:&quot;&lt;p&gt;ADMETlab 3.0 is the second updated version of the web server that provides a comprehensive and efficient platform for evaluating ADMET-related parameters as well as physicochemical properties and medicinal chemistry characteristics involved in the drug discovery process. This new release addresses the limitations of the previous version and offers broader coverage, improved performance, API functionality, and decision support. For supporting data and endpoints, this version includes 119 features, an increase of 31 compared to the previous version. The updated number of entries is 1.5 times larger than the previous version with over 400 000 entries. ADMETlab 3.0 incorporates a multi-task DMPNN architecture coupled with molecular descriptors, a method that not only guaranteed calculation speed for each endpoint simultaneously, but also achieved a superior performance in terms of accuracy and robustness. In addition, an API has been introduced to meet the growing demand for programmatic access to large amounts of data in ADMETlab 3.0. Moreover, this version includes uncertainty estimates in the prediction results, aiding in the confident selection of candidate compounds for further studies and experiments. ADMETlab 3.0 is publicly for access without the need for registration at: https://admetlab3.scbdd.com.&lt;/p&gt;&quot;,&quot;issue&quot;:&quot;W1&quot;,&quot;volume&quot;:&quot;52&quot;,&quot;container-title-short&quot;:&quot;Nucleic Acids Res.&quot;},&quot;isTemporary&quot;:false}]},{&quot;citationID&quot;:&quot;MENDELEY_CITATION_0e2af13d-1186-46c8-b802-9fb14303c0dc&quot;,&quot;properties&quot;:{&quot;noteIndex&quot;:0},&quot;isEdited&quot;:false,&quot;manualOverride&quot;:{&quot;isManuallyOverridden&quot;:false,&quot;citeprocText&quot;:&quot;[10]&quot;,&quot;manualOverrideText&quot;:&quot;&quot;},&quot;citationTag&quot;:&quot;MENDELEY_CITATION_v3_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&quot;,&quot;citationItems&quot;:[{&quot;id&quot;:&quot;23927d7f-21a8-33f9-bc4d-62bd50964d5d&quot;,&quot;itemData&quot;:{&quot;type&quot;:&quot;article-journal&quot;,&quot;id&quot;:&quot;23927d7f-21a8-33f9-bc4d-62bd50964d5d&quot;,&quot;title&quot;:&quot;The Generation of a Unique Machine Description for Chemical Structures-A Technique Developed at Chemical Abstracts Service.&quot;,&quot;author&quot;:[{&quot;family&quot;:&quot;Morgan&quot;,&quot;given&quot;:&quot;H. L.&quot;,&quot;parse-names&quot;:false,&quot;dropping-particle&quot;:&quot;&quot;,&quot;non-dropping-particle&quot;:&quot;&quot;}],&quot;container-title&quot;:&quot;Journal of Chemical Documentation&quot;,&quot;DOI&quot;:&quot;10.1021/c160017a018&quot;,&quot;ISSN&quot;:&quot;0021-9576&quot;,&quot;issued&quot;:{&quot;date-parts&quot;:[[1965,5,1]]},&quot;page&quot;:&quot;107-113&quot;,&quot;issue&quot;:&quot;2&quot;,&quot;volume&quot;:&quot;5&quot;,&quot;container-title-short&quot;:&quot;J. Chem. Doc.&quot;},&quot;isTemporary&quot;:false}]},{&quot;citationID&quot;:&quot;MENDELEY_CITATION_7594bf8b-015d-49aa-b108-510a5eae62b9&quot;,&quot;properties&quot;:{&quot;noteIndex&quot;:0},&quot;isEdited&quot;:false,&quot;manualOverride&quot;:{&quot;isManuallyOverridden&quot;:false,&quot;citeprocText&quot;:&quot;[11]&quot;,&quot;manualOverrideText&quot;:&quot;&quot;},&quot;citationTag&quot;:&quot;MENDELEY_CITATION_v3_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&quot;,&quot;citationItems&quot;:[{&quot;id&quot;:&quot;80c5781c-7e86-33cf-b75b-5ab47acd2884&quot;,&quot;itemData&quot;:{&quot;type&quot;:&quot;article-journal&quot;,&quot;id&quot;:&quot;80c5781c-7e86-33cf-b75b-5ab47acd2884&quot;,&quot;title&quot;:&quot;Mol2vec: Unsupervised Machine Learning Approach with Chemical Intuition&quot;,&quot;author&quot;:[{&quot;family&quot;:&quot;Jaeger&quot;,&quot;given&quot;:&quot;Sabrina&quot;,&quot;parse-names&quot;:false,&quot;dropping-particle&quot;:&quot;&quot;,&quot;non-dropping-particle&quot;:&quot;&quot;},{&quot;family&quot;:&quot;Fulle&quot;,&quot;given&quot;:&quot;Simone&quot;,&quot;parse-names&quot;:false,&quot;dropping-particle&quot;:&quot;&quot;,&quot;non-dropping-particle&quot;:&quot;&quot;},{&quot;family&quot;:&quot;Turk&quot;,&quot;given&quot;:&quot;Samo&quot;,&quot;parse-names&quot;:false,&quot;dropping-particle&quot;:&quot;&quot;,&quot;non-dropping-particle&quot;:&quot;&quot;}],&quot;container-title&quot;:&quot;Journal of Chemical Information and Modeling&quot;,&quot;DOI&quot;:&quot;10.1021/acs.jcim.7b00616&quot;,&quot;ISSN&quot;:&quot;1549-9596&quot;,&quot;issued&quot;:{&quot;date-parts&quot;:[[2018,1,22]]},&quot;page&quot;:&quot;27-35&quot;,&quot;issue&quot;:&quot;1&quot;,&quot;volume&quot;:&quot;58&quot;,&quot;container-title-short&quot;:&quot;J. Chem. Inf. Model.&quot;},&quot;isTemporary&quot;:false}]},{&quot;citationID&quot;:&quot;MENDELEY_CITATION_70668c7c-96e7-42e2-8067-7b3fa3e95455&quot;,&quot;properties&quot;:{&quot;noteIndex&quot;:0},&quot;isEdited&quot;:false,&quot;manualOverride&quot;:{&quot;isManuallyOverridden&quot;:false,&quot;citeprocText&quot;:&quot;[12]&quot;,&quot;manualOverrideText&quot;:&quot;&quot;},&quot;citationTag&quot;:&quot;MENDELEY_CITATION_v3_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&quot;,&quot;citationItems&quot;:[{&quot;id&quot;:&quot;27f87688-13d2-35cf-b3cc-69d56bb2def3&quot;,&quot;itemData&quot;:{&quot;type&quot;:&quot;article-journal&quot;,&quot;id&quot;:&quot;27f87688-13d2-35cf-b3cc-69d56bb2def3&quot;,&quot;title&quot;:&quot;ChemBERTa: Large-Scale Self-Supervised Pretraining for Molecular Property Prediction&quot;,&quot;author&quot;:[{&quot;family&quot;:&quot;Chithrananda&quot;,&quot;given&quot;:&quot;Seyone&quot;,&quot;parse-names&quot;:false,&quot;dropping-particle&quot;:&quot;&quot;,&quot;non-dropping-particle&quot;:&quot;&quot;},{&quot;family&quot;:&quot;Grand&quot;,&quot;given&quot;:&quot;Gabriel&quot;,&quot;parse-names&quot;:false,&quot;dropping-particle&quot;:&quot;&quot;,&quot;non-dropping-particle&quot;:&quot;&quot;},{&quot;family&quot;:&quot;Ramsundar&quot;,&quot;given&quot;:&quot;Bharath&quot;,&quot;parse-names&quot;:false,&quot;dropping-particle&quot;:&quot;&quot;,&quot;non-dropping-particle&quot;:&quot;&quot;}],&quot;container-title&quot;:&quot;arXiv e-prints&quot;,&quot;DOI&quot;:&quot;10.48550/arXiv.2010.09885&quot;,&quot;issued&quot;:{&quot;date-parts&quot;:[[2020,10]]},&quot;page&quot;:&quot;arXiv:2010.09885&quot;,&quot;container-title-short&quot;:&quot;&quot;},&quot;isTemporary&quot;:false}]},{&quot;citationID&quot;:&quot;MENDELEY_CITATION_eed2f2c2-9fb7-481f-9847-505a31c7df76&quot;,&quot;properties&quot;:{&quot;noteIndex&quot;:0},&quot;isEdited&quot;:false,&quot;manualOverride&quot;:{&quot;isManuallyOverridden&quot;:false,&quot;citeprocText&quot;:&quot;[13]&quot;,&quot;manualOverrideText&quot;:&quot;&quot;},&quot;citationTag&quot;:&quot;MENDELEY_CITATION_v3_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&quot;,&quot;citationItems&quot;:[{&quot;id&quot;:&quot;6b3c2795-b358-3d30-b69e-b2ad6a5195ff&quot;,&quot;itemData&quot;:{&quot;type&quot;:&quot;article-journal&quot;,&quot;id&quot;:&quot;6b3c2795-b358-3d30-b69e-b2ad6a5195ff&quot;,&quot;title&quot;:&quot;MOLE: Modular Learning FramEwork via Mutual Information Maximization&quot;,&quot;author&quot;:[{&quot;family&quot;:&quot;Li&quot;,&quot;given&quot;:&quot;Tianchao&quot;,&quot;parse-names&quot;:false,&quot;dropping-particle&quot;:&quot;&quot;,&quot;non-dropping-particle&quot;:&quot;&quot;},{&quot;family&quot;:&quot;Pei&quot;,&quot;given&quot;:&quot;Yulong&quot;,&quot;parse-names&quot;:false,&quot;dropping-particle&quot;:&quot;&quot;,&quot;non-dropping-particle&quot;:&quot;&quot;}],&quot;container-title&quot;:&quot;ArXiv&quot;,&quot;URL&quot;:&quot;https://api.semanticscholar.org/CorpusID:260899882&quot;,&quot;issued&quot;:{&quot;date-parts&quot;:[[2023]]},&quot;volume&quot;:&quot;abs/2308.07772&quot;,&quot;container-title-short&quot;:&quot;ArXiv&quot;},&quot;isTemporary&quot;:false}]},{&quot;citationID&quot;:&quot;MENDELEY_CITATION_6911c6cb-3ce9-4960-b0ab-f73003ee0ccc&quot;,&quot;properties&quot;:{&quot;noteIndex&quot;:0},&quot;isEdited&quot;:false,&quot;manualOverride&quot;:{&quot;isManuallyOverridden&quot;:false,&quot;citeprocText&quot;:&quot;[14]&quot;,&quot;manualOverrideText&quot;:&quot;&quot;},&quot;citationTag&quot;:&quot;MENDELEY_CITATION_v3_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&quot;,&quot;citationItems&quot;:[{&quot;id&quot;:&quot;91bc1232-bb46-3423-9b4f-a14d74fb3264&quot;,&quot;itemData&quot;:{&quot;type&quot;:&quot;webpage&quot;,&quot;id&quot;:&quot;91bc1232-bb46-3423-9b4f-a14d74fb3264&quot;,&quot;title&quot;:&quot;RDKit: Open-source cheminformatics.&quot;,&quot;container-title&quot;:&quot;https://www.rdkit.org&quot;,&quot;container-title-short&quot;:&quot;&quot;},&quot;isTemporary&quot;:false}]},{&quot;citationID&quot;:&quot;MENDELEY_CITATION_091adfc3-c72b-452f-a882-3f98e173bfcc&quot;,&quot;properties&quot;:{&quot;noteIndex&quot;:0},&quot;isEdited&quot;:false,&quot;manualOverride&quot;:{&quot;isManuallyOverridden&quot;:false,&quot;citeprocText&quot;:&quot;[15]&quot;,&quot;manualOverrideText&quot;:&quot;&quot;},&quot;citationTag&quot;:&quot;MENDELEY_CITATION_v3_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&quot;,&quot;citationItems&quot;:[{&quot;id&quot;:&quot;1fdf973c-15b9-3df1-916b-2aad974dea3b&quot;,&quot;itemData&quot;:{&quot;type&quot;:&quot;article-journal&quot;,&quot;id&quot;:&quot;1fdf973c-15b9-3df1-916b-2aad974dea3b&quot;,&quot;title&quot;:&quot;Extended-Connectivity Fingerprints&quot;,&quot;author&quot;:[{&quot;family&quot;:&quot;Rogers&quot;,&quot;given&quot;:&quot;David&quot;,&quot;parse-names&quot;:false,&quot;dropping-particle&quot;:&quot;&quot;,&quot;non-dropping-particle&quot;:&quot;&quot;},{&quot;family&quot;:&quot;Hahn&quot;,&quot;given&quot;:&quot;Mathew&quot;,&quot;parse-names&quot;:false,&quot;dropping-particle&quot;:&quot;&quot;,&quot;non-dropping-particle&quot;:&quot;&quot;}],&quot;container-title&quot;:&quot;Journal of Chemical Information and Modeling&quot;,&quot;DOI&quot;:&quot;10.1021/ci100050t&quot;,&quot;URL&quot;:&quot;https://doi.org/10.1021/ci100050t&quot;,&quot;issued&quot;:{&quot;date-parts&quot;:[[2010]]},&quot;page&quot;:&quot;742-754&quot;,&quot;issue&quot;:&quot;5&quot;,&quot;volume&quot;:&quot;50&quot;,&quot;container-title-short&quot;:&quot;J. Chem. Inf. Model.&quot;},&quot;isTemporary&quot;:false}]},{&quot;citationID&quot;:&quot;MENDELEY_CITATION_05c57d48-f1ba-49fd-a3fb-d7b08348c075&quot;,&quot;properties&quot;:{&quot;noteIndex&quot;:0},&quot;isEdited&quot;:false,&quot;manualOverride&quot;:{&quot;isManuallyOverridden&quot;:false,&quot;citeprocText&quot;:&quot;[16]&quot;,&quot;manualOverrideText&quot;:&quot;&quot;},&quot;citationTag&quot;:&quot;MENDELEY_CITATION_v3_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&quot;,&quot;citationItems&quot;:[{&quot;id&quot;:&quot;16657982-092a-3db6-97ef-8ee47347c62e&quot;,&quot;itemData&quot;:{&quot;type&quot;:&quot;article-journal&quot;,&quot;id&quot;:&quot;16657982-092a-3db6-97ef-8ee47347c62e&quot;,&quot;title&quot;:&quot;Low-Compute repurposing of an English transformer into a molecular encoder: A two-stage SELFIES adaptation of RoBERTa&quot;,&quot;author&quot;:[{&quot;family&quot;:&quot;Alhmoudi&quot;,&quot;given&quot;:&quot;Obaid Khaleifah&quot;,&quot;parse-names&quot;:false,&quot;dropping-particle&quot;:&quot;&quot;,&quot;non-dropping-particle&quot;:&quot;&quot;},{&quot;family&quot;:&quot;Thameem&quot;,&quot;given&quot;:&quot;Muhammed&quot;,&quot;parse-names&quot;:false,&quot;dropping-particle&quot;:&quot;&quot;,&quot;non-dropping-particle&quot;:&quot;&quot;},{&quot;family&quot;:&quot;Elkamel&quot;,&quot;given&quot;:&quot;Ali&quot;,&quot;parse-names&quot;:false,&quot;dropping-particle&quot;:&quot;&quot;,&quot;non-dropping-particle&quot;:&quot;&quot;},{&quot;family&quot;:&quot;AlHammadi&quot;,&quot;given&quot;:&quot;Ali A.&quot;,&quot;parse-names&quot;:false,&quot;dropping-particle&quot;:&quot;&quot;,&quot;non-dropping-particle&quot;:&quot;&quot;}],&quot;container-title&quot;:&quot;Results in Engineering&quot;,&quot;DOI&quot;:&quot;10.1016/j.rineng.2025.108390&quot;,&quot;ISSN&quot;:&quot;25901230&quot;,&quot;issued&quot;:{&quot;date-parts&quot;:[[2025,12]]},&quot;page&quot;:&quot;108390&quot;,&quot;volume&quot;:&quot;28&quot;,&quot;container-title-short&quot;:&quot;&quot;},&quot;isTemporary&quot;:false}]},{&quot;citationID&quot;:&quot;MENDELEY_CITATION_61882ab6-be78-4074-86b7-8a58822453b0&quot;,&quot;properties&quot;:{&quot;noteIndex&quot;:0},&quot;isEdited&quot;:false,&quot;manualOverride&quot;:{&quot;isManuallyOverridden&quot;:false,&quot;citeprocText&quot;:&quot;[17], [18]&quot;,&quot;manualOverrideText&quot;:&quot;&quot;},&quot;citationTag&quot;:&quot;MENDELEY_CITATION_v3_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&quot;,&quot;citationItems&quot;:[{&quot;id&quot;:&quot;4b7e155f-c785-39de-bd3f-62287a2822db&quot;,&quot;itemData&quot;:{&quot;type&quot;:&quot;paper-conference&quot;,&quot;id&quot;:&quot;4b7e155f-c785-39de-bd3f-62287a2822db&quot;,&quot;title&quot;:&quot;BERT: Pre-training of Deep Bidirectional Transformers for Language Understanding&quot;,&quot;author&quot;:[{&quot;family&quot;:&quot;Devlin&quot;,&quot;given&quot;:&quot;Jacob&quot;,&quot;parse-names&quot;:false,&quot;dropping-particle&quot;:&quot;&quot;,&quot;non-dropping-particle&quot;:&quot;&quot;},{&quot;family&quot;:&quot;Chang&quot;,&quot;given&quot;:&quot;Ming-Wei&quot;,&quot;parse-names&quot;:false,&quot;dropping-particle&quot;:&quot;&quot;,&quot;non-dropping-particle&quot;:&quot;&quot;},{&quot;family&quot;:&quot;Lee&quot;,&quot;given&quot;:&quot;Kenton&quot;,&quot;parse-names&quot;:false,&quot;dropping-particle&quot;:&quot;&quot;,&quot;non-dropping-particle&quot;:&quot;&quot;},{&quot;family&quot;:&quot;Toutanova&quot;,&quot;given&quot;:&quot;Kristina&quot;,&quot;parse-names&quot;:false,&quot;dropping-particle&quot;:&quot;&quot;,&quot;non-dropping-particle&quot;:&quot;&quot;}],&quot;container-title&quot;:&quot;North American Chapter of the Association for Computational Linguistics&quot;,&quot;URL&quot;:&quot;https://api.semanticscholar.org/CorpusID:52967399&quot;,&quot;issued&quot;:{&quot;date-parts&quot;:[[2019]]},&quot;container-title-short&quot;:&quot;&quot;},&quot;isTemporary&quot;:false},{&quot;id&quot;:&quot;d6b0ebc7-a9eb-3e05-9f44-6d798a458d6c&quot;,&quot;itemData&quot;:{&quot;type&quot;:&quot;article-journal&quot;,&quot;id&quot;:&quot;d6b0ebc7-a9eb-3e05-9f44-6d798a458d6c&quot;,&quot;title&quot;:&quot;RoBERTa: A Robustly Optimized BERT Pretraining Approach&quot;,&quot;author&quot;:[{&quot;family&quot;:&quot;Liu&quot;,&quot;given&quot;:&quot;Yinhan&quot;,&quot;parse-names&quot;:false,&quot;dropping-particle&quot;:&quot;&quot;,&quot;non-dropping-particle&quot;:&quot;&quot;},{&quot;family&quot;:&quot;Ott&quot;,&quot;given&quot;:&quot;Myle&quot;,&quot;parse-names&quot;:false,&quot;dropping-particle&quot;:&quot;&quot;,&quot;non-dropping-particle&quot;:&quot;&quot;},{&quot;family&quot;:&quot;Goyal&quot;,&quot;given&quot;:&quot;Naman&quot;,&quot;parse-names&quot;:false,&quot;dropping-particle&quot;:&quot;&quot;,&quot;non-dropping-particle&quot;:&quot;&quot;},{&quot;family&quot;:&quot;Du&quot;,&quot;given&quot;:&quot;Jingfei&quot;,&quot;parse-names&quot;:false,&quot;dropping-particle&quot;:&quot;&quot;,&quot;non-dropping-particle&quot;:&quot;&quot;},{&quot;family&quot;:&quot;Joshi&quot;,&quot;given&quot;:&quot;Mandar&quot;,&quot;parse-names&quot;:false,&quot;dropping-particle&quot;:&quot;&quot;,&quot;non-dropping-particle&quot;:&quot;&quot;},{&quot;family&quot;:&quot;Chen&quot;,&quot;given&quot;:&quot;Danqi&quot;,&quot;parse-names&quot;:false,&quot;dropping-particle&quot;:&quot;&quot;,&quot;non-dropping-particle&quot;:&quot;&quot;},{&quot;family&quot;:&quot;Levy&quot;,&quot;given&quot;:&quot;Omer&quot;,&quot;parse-names&quot;:false,&quot;dropping-particle&quot;:&quot;&quot;,&quot;non-dropping-particle&quot;:&quot;&quot;},{&quot;family&quot;:&quot;Lewis&quot;,&quot;given&quot;:&quot;Mike&quot;,&quot;parse-names&quot;:false,&quot;dropping-particle&quot;:&quot;&quot;,&quot;non-dropping-particle&quot;:&quot;&quot;},{&quot;family&quot;:&quot;Zettlemoyer&quot;,&quot;given&quot;:&quot;Luke&quot;,&quot;parse-names&quot;:false,&quot;dropping-particle&quot;:&quot;&quot;,&quot;non-dropping-particle&quot;:&quot;&quot;},{&quot;family&quot;:&quot;Stoyanov&quot;,&quot;given&quot;:&quot;Veselin&quot;,&quot;parse-names&quot;:false,&quot;dropping-particle&quot;:&quot;&quot;,&quot;non-dropping-particle&quot;:&quot;&quot;}],&quot;container-title&quot;:&quot;ArXiv&quot;,&quot;URL&quot;:&quot;https://api.semanticscholar.org/CorpusID:198953378&quot;,&quot;issued&quot;:{&quot;date-parts&quot;:[[2019]]},&quot;volume&quot;:&quot;abs/1907.11692&quot;,&quot;container-title-short&quot;:&quot;ArXiv&quot;},&quot;isTemporary&quot;:false}]},{&quot;citationID&quot;:&quot;MENDELEY_CITATION_7f594b16-8ad5-4013-aee5-cc9efd81053f&quot;,&quot;properties&quot;:{&quot;noteIndex&quot;:0},&quot;isEdited&quot;:false,&quot;manualOverride&quot;:{&quot;isManuallyOverridden&quot;:false,&quot;citeprocText&quot;:&quot;[19]&quot;,&quot;manualOverrideText&quot;:&quot;&quot;},&quot;citationTag&quot;:&quot;MENDELEY_CITATION_v3_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&quot;,&quot;citationItems&quot;:[{&quot;id&quot;:&quot;528eede6-a120-383e-9473-16c5f897d2c4&quot;,&quot;itemData&quot;:{&quot;type&quot;:&quot;article-journal&quot;,&quot;id&quot;:&quot;528eede6-a120-383e-9473-16c5f897d2c4&quot;,&quot;title&quot;:&quot;Neural Machine Translation of Rare Words with Subword Units&quot;,&quot;author&quot;:[{&quot;family&quot;:&quot;Sennrich&quot;,&quot;given&quot;:&quot;Rico&quot;,&quot;parse-names&quot;:false,&quot;dropping-particle&quot;:&quot;&quot;,&quot;non-dropping-particle&quot;:&quot;&quot;},{&quot;family&quot;:&quot;Haddow&quot;,&quot;given&quot;:&quot;Barry&quot;,&quot;parse-names&quot;:false,&quot;dropping-particle&quot;:&quot;&quot;,&quot;non-dropping-particle&quot;:&quot;&quot;},{&quot;family&quot;:&quot;Birch&quot;,&quot;given&quot;:&quot;Alexandra&quot;,&quot;parse-names&quot;:false,&quot;dropping-particle&quot;:&quot;&quot;,&quot;non-dropping-particle&quot;:&quot;&quot;}],&quot;container-title&quot;:&quot;ArXiv&quot;,&quot;URL&quot;:&quot;https://api.semanticscholar.org/CorpusID:1114678&quot;,&quot;issued&quot;:{&quot;date-parts&quot;:[[2015]]},&quot;volume&quot;:&quot;abs/1508.07909&quot;,&quot;container-title-short&quot;:&quot;ArXiv&quot;},&quot;isTemporary&quot;:false}]},{&quot;citationID&quot;:&quot;MENDELEY_CITATION_800b8284-81e8-409a-a9d8-f65b34f75303&quot;,&quot;properties&quot;:{&quot;noteIndex&quot;:0},&quot;isEdited&quot;:false,&quot;manualOverride&quot;:{&quot;isManuallyOverridden&quot;:false,&quot;citeprocText&quot;:&quot;[20]&quot;,&quot;manualOverrideText&quot;:&quot;&quot;},&quot;citationTag&quot;:&quot;MENDELEY_CITATION_v3_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&quot;,&quot;citationItems&quot;:[{&quot;id&quot;:&quot;038f20e1-2011-366e-8442-37bf6e4fda69&quot;,&quot;itemData&quot;:{&quot;type&quot;:&quot;article-journal&quot;,&quot;id&quot;:&quot;038f20e1-2011-366e-8442-37bf6e4fda69&quot;,&quot;title&quot;:&quot;InChI, the IUPAC International Chemical Identifier&quot;,&quot;author&quot;:[{&quot;family&quot;:&quot;Heller&quot;,&quot;given&quot;:&quot;Stephen R&quot;,&quot;parse-names&quot;:false,&quot;dropping-particle&quot;:&quot;&quot;,&quot;non-dropping-particle&quot;:&quot;&quot;},{&quot;family&quot;:&quot;McNaught&quot;,&quot;given&quot;:&quot;Alan&quot;,&quot;parse-names&quot;:false,&quot;dropping-particle&quot;:&quot;&quot;,&quot;non-dropping-particle&quot;:&quot;&quot;},{&quot;family&quot;:&quot;Pletnev&quot;,&quot;given&quot;:&quot;Igor&quot;,&quot;parse-names&quot;:false,&quot;dropping-particle&quot;:&quot;&quot;,&quot;non-dropping-particle&quot;:&quot;&quot;},{&quot;family&quot;:&quot;Stein&quot;,&quot;given&quot;:&quot;Stephen&quot;,&quot;parse-names&quot;:false,&quot;dropping-particle&quot;:&quot;&quot;,&quot;non-dropping-particle&quot;:&quot;&quot;},{&quot;family&quot;:&quot;Tchekhovskoi&quot;,&quot;given&quot;:&quot;Dmitrii&quot;,&quot;parse-names&quot;:false,&quot;dropping-particle&quot;:&quot;&quot;,&quot;non-dropping-particle&quot;:&quot;&quot;}],&quot;container-title&quot;:&quot;Journal of Cheminformatics&quot;,&quot;DOI&quot;:&quot;10.1186/s13321-015-0068-4&quot;,&quot;ISSN&quot;:&quot;1758-2946&quot;,&quot;issued&quot;:{&quot;date-parts&quot;:[[2015,12,30]]},&quot;page&quot;:&quot;23&quot;,&quot;issue&quot;:&quot;1&quot;,&quot;volume&quot;:&quot;7&quot;,&quot;container-title-short&quot;:&quot;J. Cheminform.&quot;},&quot;isTemporary&quot;:false}]},{&quot;citationID&quot;:&quot;MENDELEY_CITATION_df1d1646-57ca-4a3f-825a-d5645cb9ad91&quot;,&quot;properties&quot;:{&quot;noteIndex&quot;:0},&quot;isEdited&quot;:false,&quot;manualOverride&quot;:{&quot;isManuallyOverridden&quot;:false,&quot;citeprocText&quot;:&quot;[17]&quot;,&quot;manualOverrideText&quot;:&quot;&quot;},&quot;citationTag&quot;:&quot;MENDELEY_CITATION_v3_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&quot;,&quot;citationItems&quot;:[{&quot;id&quot;:&quot;4b7e155f-c785-39de-bd3f-62287a2822db&quot;,&quot;itemData&quot;:{&quot;type&quot;:&quot;paper-conference&quot;,&quot;id&quot;:&quot;4b7e155f-c785-39de-bd3f-62287a2822db&quot;,&quot;title&quot;:&quot;BERT: Pre-training of Deep Bidirectional Transformers for Language Understanding&quot;,&quot;author&quot;:[{&quot;family&quot;:&quot;Devlin&quot;,&quot;given&quot;:&quot;Jacob&quot;,&quot;parse-names&quot;:false,&quot;dropping-particle&quot;:&quot;&quot;,&quot;non-dropping-particle&quot;:&quot;&quot;},{&quot;family&quot;:&quot;Chang&quot;,&quot;given&quot;:&quot;Ming-Wei&quot;,&quot;parse-names&quot;:false,&quot;dropping-particle&quot;:&quot;&quot;,&quot;non-dropping-particle&quot;:&quot;&quot;},{&quot;family&quot;:&quot;Lee&quot;,&quot;given&quot;:&quot;Kenton&quot;,&quot;parse-names&quot;:false,&quot;dropping-particle&quot;:&quot;&quot;,&quot;non-dropping-particle&quot;:&quot;&quot;},{&quot;family&quot;:&quot;Toutanova&quot;,&quot;given&quot;:&quot;Kristina&quot;,&quot;parse-names&quot;:false,&quot;dropping-particle&quot;:&quot;&quot;,&quot;non-dropping-particle&quot;:&quot;&quot;}],&quot;container-title&quot;:&quot;North American Chapter of the Association for Computational Linguistics&quot;,&quot;URL&quot;:&quot;https://api.semanticscholar.org/CorpusID:52967399&quot;,&quot;issued&quot;:{&quot;date-parts&quot;:[[2019]]},&quot;container-title-short&quot;:&quot;&quot;},&quot;isTemporary&quot;:false}]},{&quot;citationID&quot;:&quot;MENDELEY_CITATION_0856a272-5a9c-4c62-8ea9-15c71a2f59c4&quot;,&quot;properties&quot;:{&quot;noteIndex&quot;:0},&quot;isEdited&quot;:false,&quot;manualOverride&quot;:{&quot;isManuallyOverridden&quot;:false,&quot;citeprocText&quot;:&quot;[21]&quot;,&quot;manualOverrideText&quot;:&quot;&quot;},&quot;citationTag&quot;:&quot;MENDELEY_CITATION_v3_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&quot;,&quot;citationItems&quot;:[{&quot;id&quot;:&quot;e9063351-84e5-35cf-9e83-b8bba0913bac&quot;,&quot;itemData&quot;:{&quot;type&quot;:&quot;article-journal&quot;,&quot;id&quot;:&quot;e9063351-84e5-35cf-9e83-b8bba0913bac&quot;,&quot;title&quot;:&quot;SGDR: Stochastic Gradient Descent with Warm Restarts&quot;,&quot;author&quot;:[{&quot;family&quot;:&quot;Loshchilov&quot;,&quot;given&quot;:&quot;Ilya&quot;,&quot;parse-names&quot;:false,&quot;dropping-particle&quot;:&quot;&quot;,&quot;non-dropping-particle&quot;:&quot;&quot;},{&quot;family&quot;:&quot;Hutter&quot;,&quot;given&quot;:&quot;Frank&quot;,&quot;parse-names&quot;:false,&quot;dropping-particle&quot;:&quot;&quot;,&quot;non-dropping-particle&quot;:&quot;&quot;}],&quot;container-title&quot;:&quot;arXiv: Learning&quot;,&quot;URL&quot;:&quot;https://api.semanticscholar.org/CorpusID:14337532&quot;,&quot;issued&quot;:{&quot;date-parts&quot;:[[2016]]},&quot;container-title-short&quot;:&quot;&quot;},&quot;isTemporary&quot;:false}]},{&quot;citationID&quot;:&quot;MENDELEY_CITATION_111eba3f-785c-4b4c-b6e6-fc4bf548cbdf&quot;,&quot;properties&quot;:{&quot;noteIndex&quot;:0},&quot;isEdited&quot;:false,&quot;manualOverride&quot;:{&quot;isManuallyOverridden&quot;:false,&quot;citeprocText&quot;:&quot;[12]&quot;,&quot;manualOverrideText&quot;:&quot;&quot;},&quot;citationTag&quot;:&quot;MENDELEY_CITATION_v3_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&quot;,&quot;citationItems&quot;:[{&quot;id&quot;:&quot;27f87688-13d2-35cf-b3cc-69d56bb2def3&quot;,&quot;itemData&quot;:{&quot;type&quot;:&quot;article-journal&quot;,&quot;id&quot;:&quot;27f87688-13d2-35cf-b3cc-69d56bb2def3&quot;,&quot;title&quot;:&quot;ChemBERTa: Large-Scale Self-Supervised Pretraining for Molecular Property Prediction&quot;,&quot;author&quot;:[{&quot;family&quot;:&quot;Chithrananda&quot;,&quot;given&quot;:&quot;Seyone&quot;,&quot;parse-names&quot;:false,&quot;dropping-particle&quot;:&quot;&quot;,&quot;non-dropping-particle&quot;:&quot;&quot;},{&quot;family&quot;:&quot;Grand&quot;,&quot;given&quot;:&quot;Gabriel&quot;,&quot;parse-names&quot;:false,&quot;dropping-particle&quot;:&quot;&quot;,&quot;non-dropping-particle&quot;:&quot;&quot;},{&quot;family&quot;:&quot;Ramsundar&quot;,&quot;given&quot;:&quot;Bharath&quot;,&quot;parse-names&quot;:false,&quot;dropping-particle&quot;:&quot;&quot;,&quot;non-dropping-particle&quot;:&quot;&quot;}],&quot;container-title&quot;:&quot;arXiv e-prints&quot;,&quot;DOI&quot;:&quot;10.48550/arXiv.2010.09885&quot;,&quot;issued&quot;:{&quot;date-parts&quot;:[[2020,10]]},&quot;page&quot;:&quot;arXiv:2010.09885&quot;,&quot;container-title-short&quot;:&quot;&quot;},&quot;isTemporary&quot;:false}]},{&quot;citationID&quot;:&quot;MENDELEY_CITATION_b0839fb6-ce26-4a25-ba91-51b39a67b272&quot;,&quot;properties&quot;:{&quot;noteIndex&quot;:0},&quot;isEdited&quot;:false,&quot;manualOverride&quot;:{&quot;isManuallyOverridden&quot;:false,&quot;citeprocText&quot;:&quot;[22]&quot;,&quot;manualOverrideText&quot;:&quot;&quot;},&quot;citationTag&quot;:&quot;MENDELEY_CITATION_v3_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&quot;,&quot;citationItems&quot;:[{&quot;id&quot;:&quot;4706f37f-66a5-3d27-a50b-d3f6c14a0549&quot;,&quot;itemData&quot;:{&quot;type&quot;:&quot;article-journal&quot;,&quot;id&quot;:&quot;4706f37f-66a5-3d27-a50b-d3f6c14a0549&quot;,&quot;title&quot;:&quot;On Large-Batch Training for Deep Learning: Generalization Gap and Sharp Minima&quot;,&quot;author&quot;:[{&quot;family&quot;:&quot;Keskar&quot;,&quot;given&quot;:&quot;Nitish Shirish&quot;,&quot;parse-names&quot;:false,&quot;dropping-particle&quot;:&quot;&quot;,&quot;non-dropping-particle&quot;:&quot;&quot;},{&quot;family&quot;:&quot;Mudigere&quot;,&quot;given&quot;:&quot;Dheevatsa&quot;,&quot;parse-names&quot;:false,&quot;dropping-particle&quot;:&quot;&quot;,&quot;non-dropping-particle&quot;:&quot;&quot;},{&quot;family&quot;:&quot;Nocedal&quot;,&quot;given&quot;:&quot;Jorge&quot;,&quot;parse-names&quot;:false,&quot;dropping-particle&quot;:&quot;&quot;,&quot;non-dropping-particle&quot;:&quot;&quot;},{&quot;family&quot;:&quot;Smelyanskiy&quot;,&quot;given&quot;:&quot;Mikhail&quot;,&quot;parse-names&quot;:false,&quot;dropping-particle&quot;:&quot;&quot;,&quot;non-dropping-particle&quot;:&quot;&quot;},{&quot;family&quot;:&quot;Tang&quot;,&quot;given&quot;:&quot;Ping Tak Peter&quot;,&quot;parse-names&quot;:false,&quot;dropping-particle&quot;:&quot;&quot;,&quot;non-dropping-particle&quot;:&quot;&quot;}],&quot;container-title&quot;:&quot;ArXiv&quot;,&quot;URL&quot;:&quot;https://api.semanticscholar.org/CorpusID:5834589&quot;,&quot;issued&quot;:{&quot;date-parts&quot;:[[2016]]},&quot;volume&quot;:&quot;abs/1609.04836&quot;,&quot;container-title-short&quot;:&quot;ArXiv&quot;},&quot;isTemporary&quot;:false}]},{&quot;citationID&quot;:&quot;MENDELEY_CITATION_983539a7-adc7-42fd-83b2-3ac25b495a30&quot;,&quot;properties&quot;:{&quot;noteIndex&quot;:0},&quot;isEdited&quot;:false,&quot;manualOverride&quot;:{&quot;isManuallyOverridden&quot;:false,&quot;citeprocText&quot;:&quot;[23]&quot;,&quot;manualOverrideText&quot;:&quot;&quot;},&quot;citationTag&quot;:&quot;MENDELEY_CITATION_v3_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&quot;,&quot;citationItems&quot;:[{&quot;id&quot;:&quot;7fc7ea6b-1629-3058-829b-cae1a8149255&quot;,&quot;itemData&quot;:{&quot;type&quot;:&quot;article-journal&quot;,&quot;id&quot;:&quot;7fc7ea6b-1629-3058-829b-cae1a8149255&quot;,&quot;title&quot;:&quot;Mixed Precision Training&quot;,&quot;author&quot;:[{&quot;family&quot;:&quot;Micikevicius&quot;,&quot;given&quot;:&quot;Paulius&quot;,&quot;parse-names&quot;:false,&quot;dropping-particle&quot;:&quot;&quot;,&quot;non-dropping-particle&quot;:&quot;&quot;},{&quot;family&quot;:&quot;Narang&quot;,&quot;given&quot;:&quot;Sharan&quot;,&quot;parse-names&quot;:false,&quot;dropping-particle&quot;:&quot;&quot;,&quot;non-dropping-particle&quot;:&quot;&quot;},{&quot;family&quot;:&quot;Alben&quot;,&quot;given&quot;:&quot;Jonah&quot;,&quot;parse-names&quot;:false,&quot;dropping-particle&quot;:&quot;&quot;,&quot;non-dropping-particle&quot;:&quot;&quot;},{&quot;family&quot;:&quot;Diamos&quot;,&quot;given&quot;:&quot;Gregory Frederick&quot;,&quot;parse-names&quot;:false,&quot;dropping-particle&quot;:&quot;&quot;,&quot;non-dropping-particle&quot;:&quot;&quot;},{&quot;family&quot;:&quot;Elsen&quot;,&quot;given&quot;:&quot;Erich&quot;,&quot;parse-names&quot;:false,&quot;dropping-particle&quot;:&quot;&quot;,&quot;non-dropping-particle&quot;:&quot;&quot;},{&quot;family&quot;:&quot;García&quot;,&quot;given&quot;:&quot;David&quot;,&quot;parse-names&quot;:false,&quot;dropping-particle&quot;:&quot;&quot;,&quot;non-dropping-particle&quot;:&quot;&quot;},{&quot;family&quot;:&quot;Ginsburg&quot;,&quot;given&quot;:&quot;Boris&quot;,&quot;parse-names&quot;:false,&quot;dropping-particle&quot;:&quot;&quot;,&quot;non-dropping-particle&quot;:&quot;&quot;},{&quot;family&quot;:&quot;Houston&quot;,&quot;given&quot;:&quot;Michael&quot;,&quot;parse-names&quot;:false,&quot;dropping-particle&quot;:&quot;&quot;,&quot;non-dropping-particle&quot;:&quot;&quot;},{&quot;family&quot;:&quot;Kuchaiev&quot;,&quot;given&quot;:&quot;Oleksii&quot;,&quot;parse-names&quot;:false,&quot;dropping-particle&quot;:&quot;&quot;,&quot;non-dropping-particle&quot;:&quot;&quot;},{&quot;family&quot;:&quot;Venkatesh&quot;,&quot;given&quot;:&quot;Ganesh&quot;,&quot;parse-names&quot;:false,&quot;dropping-particle&quot;:&quot;&quot;,&quot;non-dropping-particle&quot;:&quot;&quot;},{&quot;family&quot;:&quot;Wu&quot;,&quot;given&quot;:&quot;Hao&quot;,&quot;parse-names&quot;:false,&quot;dropping-particle&quot;:&quot;&quot;,&quot;non-dropping-particle&quot;:&quot;&quot;}],&quot;container-title&quot;:&quot;ArXiv&quot;,&quot;URL&quot;:&quot;https://api.semanticscholar.org/CorpusID:3297437&quot;,&quot;issued&quot;:{&quot;date-parts&quot;:[[2017]]},&quot;volume&quot;:&quot;abs/1710.03740&quot;,&quot;container-title-short&quot;:&quot;ArXiv&quot;},&quot;isTemporary&quot;:false}]},{&quot;citationID&quot;:&quot;MENDELEY_CITATION_a28312d0-aa21-4564-9d86-8c5378063f6d&quot;,&quot;properties&quot;:{&quot;noteIndex&quot;:0},&quot;isEdited&quot;:false,&quot;manualOverride&quot;:{&quot;isManuallyOverridden&quot;:false,&quot;citeprocText&quot;:&quot;[24]&quot;,&quot;manualOverrideText&quot;:&quot;&quot;},&quot;citationTag&quot;:&quot;MENDELEY_CITATION_v3_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&quot;,&quot;citationItems&quot;:[{&quot;id&quot;:&quot;e1bbbe98-ea46-39b0-950b-79a4326f3b21&quot;,&quot;itemData&quot;:{&quot;type&quot;:&quot;article-journal&quot;,&quot;id&quot;:&quot;e1bbbe98-ea46-39b0-950b-79a4326f3b21&quot;,&quot;title&quot;:&quot;A Review on Multi-Label Learning Algorithms&quot;,&quot;author&quot;:[{&quot;family&quot;:&quot;Zhang&quot;,&quot;given&quot;:&quot;M -L.&quot;,&quot;parse-names&quot;:false,&quot;dropping-particle&quot;:&quot;&quot;,&quot;non-dropping-particle&quot;:&quot;&quot;},{&quot;family&quot;:&quot;Zhou&quot;,&quot;given&quot;:&quot;Z -H.&quot;,&quot;parse-names&quot;:false,&quot;dropping-particle&quot;:&quot;&quot;,&quot;non-dropping-particle&quot;:&quot;&quot;}],&quot;container-title&quot;:&quot;IEEE Transactions on Knowledge and Data Engineering&quot;,&quot;container-title-short&quot;:&quot;IEEE Trans. Knowl. Data Eng.&quot;,&quot;DOI&quot;:&quot;10.1109/TKDE.2013.39&quot;,&quot;ISSN&quot;:&quot;1558-2191&quot;,&quot;issued&quot;:{&quot;date-parts&quot;:[[2014]]},&quot;page&quot;:&quot;1819-1837&quot;,&quot;issue&quot;:&quot;8&quot;,&quot;volume&quot;:&quot;26&quot;},&quot;isTemporary&quot;:false}]},{&quot;citationID&quot;:&quot;MENDELEY_CITATION_d1c86985-4c0c-4011-999a-640b0a0cdaf6&quot;,&quot;properties&quot;:{&quot;noteIndex&quot;:0},&quot;isEdited&quot;:false,&quot;manualOverride&quot;:{&quot;isManuallyOverridden&quot;:false,&quot;citeprocText&quot;:&quot;[25]&quot;,&quot;manualOverrideText&quot;:&quot;&quot;},&quot;citationTag&quot;:&quot;MENDELEY_CITATION_v3_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&quot;,&quot;citationItems&quot;:[{&quot;id&quot;:&quot;f8bb2610-1acc-30af-bff9-4489d564d536&quot;,&quot;itemData&quot;:{&quot;type&quot;:&quot;article-journal&quot;,&quot;id&quot;:&quot;f8bb2610-1acc-30af-bff9-4489d564d536&quot;,&quot;title&quot;:&quot;Multi-Label Classification&quot;,&quot;author&quot;:[{&quot;family&quot;:&quot;Tsoumakas&quot;,&quot;given&quot;:&quot;Grigorios&quot;,&quot;parse-names&quot;:false,&quot;dropping-particle&quot;:&quot;&quot;,&quot;non-dropping-particle&quot;:&quot;&quot;},{&quot;family&quot;:&quot;Katakis&quot;,&quot;given&quot;:&quot;Ioannis&quot;,&quot;parse-names&quot;:false,&quot;dropping-particle&quot;:&quot;&quot;,&quot;non-dropping-particle&quot;:&quot;&quot;}],&quot;container-title&quot;:&quot;International Journal of Data Warehousing and Mining&quot;,&quot;DOI&quot;:&quot;10.4018/jdwm.2007070101&quot;,&quot;ISSN&quot;:&quot;1548-3924&quot;,&quot;issued&quot;:{&quot;date-parts&quot;:[[2007,7,1]]},&quot;page&quot;:&quot;1-13&quot;,&quot;abstract&quot;:&quot;&lt;p&gt;Multi-label classification methods are increasingly required by modern applications, such as protein function classification, music categorization, and semantic scene classification. This article introduces the task of multi-label classification, organizes the sparse related literature into a structured presentation and performs comparative experimental results of certain multilabel classification methods. It also contributes the definition of concepts for the quantification of the multi-label nature of a data set.&lt;/p&gt;&quot;,&quot;issue&quot;:&quot;3&quot;,&quot;volume&quot;:&quot;3&quot;,&quot;container-title-short&quot;:&quot;&quot;},&quot;isTemporary&quot;:false}]},{&quot;citationID&quot;:&quot;MENDELEY_CITATION_8f0da353-a206-454e-9893-bc842c090a1f&quot;,&quot;properties&quot;:{&quot;noteIndex&quot;:0},&quot;isEdited&quot;:false,&quot;manualOverride&quot;:{&quot;isManuallyOverridden&quot;:false,&quot;citeprocText&quot;:&quot;[2]&quot;,&quot;manualOverrideText&quot;:&quot;&quot;},&quot;citationTag&quot;:&quot;MENDELEY_CITATION_v3_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&quot;,&quot;citationItems&quot;:[{&quot;id&quot;:&quot;38c736ba-04f7-31e6-a646-9680ae3c3eda&quot;,&quot;itemData&quot;:{&quot;type&quot;:&quot;article-journal&quot;,&quot;id&quot;:&quot;38c736ba-04f7-31e6-a646-9680ae3c3eda&quot;,&quot;title&quot;:&quot;Post-marketing withdrawal of 462 medicinal products because of adverse drug reactions: a systematic review of the world literature&quot;,&quot;author&quot;:[{&quot;family&quot;:&quot;Onakpoya&quot;,&quot;given&quot;:&quot;Igho J.&quot;,&quot;parse-names&quot;:false,&quot;dropping-particle&quot;:&quot;&quot;,&quot;non-dropping-particle&quot;:&quot;&quot;},{&quot;family&quot;:&quot;Heneghan&quot;,&quot;given&quot;:&quot;Carl J.&quot;,&quot;parse-names&quot;:false,&quot;dropping-particle&quot;:&quot;&quot;,&quot;non-dropping-particle&quot;:&quot;&quot;},{&quot;family&quot;:&quot;Aronson&quot;,&quot;given&quot;:&quot;Jeffrey K.&quot;,&quot;parse-names&quot;:false,&quot;dropping-particle&quot;:&quot;&quot;,&quot;non-dropping-particle&quot;:&quot;&quot;}],&quot;container-title&quot;:&quot;BMC Medicine&quot;,&quot;container-title-short&quot;:&quot;BMC Med.&quot;,&quot;DOI&quot;:&quot;10.1186/s12916-016-0553-2&quot;,&quot;ISSN&quot;:&quot;1741-7015&quot;,&quot;issued&quot;:{&quot;date-parts&quot;:[[2016,12,4]]},&quot;page&quot;:&quot;10&quot;,&quot;issue&quot;:&quot;1&quot;,&quot;volume&quot;:&quot;14&quot;},&quot;isTemporary&quot;:false}]},{&quot;citationID&quot;:&quot;MENDELEY_CITATION_015144f7-4ca6-4ea3-9c78-dad31754eb4c&quot;,&quot;properties&quot;:{&quot;noteIndex&quot;:0},&quot;isEdited&quot;:false,&quot;manualOverride&quot;:{&quot;isManuallyOverridden&quot;:false,&quot;citeprocText&quot;:&quot;[26]&quot;,&quot;manualOverrideText&quot;:&quot;&quot;},&quot;citationTag&quot;:&quot;MENDELEY_CITATION_v3_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&quot;,&quot;citationItems&quot;:[{&quot;id&quot;:&quot;82bdd3d8-cd2f-3909-9549-dba4106a3998&quot;,&quot;itemData&quot;:{&quot;type&quot;:&quot;article-journal&quot;,&quot;id&quot;:&quot;82bdd3d8-cd2f-3909-9549-dba4106a3998&quot;,&quot;title&quot;:&quot;Methodologies for Investigating Drug Metabolism at the Early Drug Discovery Stage: Prediction of Hepatic Drug Clearance and P450 Contribution&quot;,&quot;author&quot;:[{&quot;family&quot;:&quot;Emoto&quot;,&quot;given&quot;:&quot;Chie&quot;,&quot;parse-names&quot;:false,&quot;dropping-particle&quot;:&quot;&quot;,&quot;non-dropping-particle&quot;:&quot;&quot;},{&quot;family&quot;:&quot;Murayama&quot;,&quot;given&quot;:&quot;Norie&quot;,&quot;parse-names&quot;:false,&quot;dropping-particle&quot;:&quot;&quot;,&quot;non-dropping-particle&quot;:&quot;&quot;},{&quot;family&quot;:&quot;Rostami-Hodjegan&quot;,&quot;given&quot;:&quot;Amin&quot;,&quot;parse-names&quot;:false,&quot;dropping-particle&quot;:&quot;&quot;,&quot;non-dropping-particle&quot;:&quot;&quot;},{&quot;family&quot;:&quot;Yamazaki&quot;,&quot;given&quot;:&quot;Hiroshi&quot;,&quot;parse-names&quot;:false,&quot;dropping-particle&quot;:&quot;&quot;,&quot;non-dropping-particle&quot;:&quot;&quot;}],&quot;container-title&quot;:&quot;Current Drug Metabolism&quot;,&quot;container-title-short&quot;:&quot;Curr. Drug Metab.&quot;,&quot;DOI&quot;:&quot;10.2174/138920010794233503&quot;,&quot;ISSN&quot;:&quot;13892002&quot;,&quot;issued&quot;:{&quot;date-parts&quot;:[[2010,10,1]]},&quot;page&quot;:&quot;678-685&quot;,&quot;issue&quot;:&quot;8&quot;,&quot;volume&quot;:&quot;11&quot;},&quot;isTemporary&quot;:false}]},{&quot;citationID&quot;:&quot;MENDELEY_CITATION_571e5984-89ec-4b7f-8f14-7d599bc23c52&quot;,&quot;properties&quot;:{&quot;noteIndex&quot;:0},&quot;isEdited&quot;:false,&quot;manualOverride&quot;:{&quot;isManuallyOverridden&quot;:false,&quot;citeprocText&quot;:&quot;[27], [28]&quot;,&quot;manualOverrideText&quot;:&quot;&quot;},&quot;citationTag&quot;:&quot;MENDELEY_CITATION_v3_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&quot;,&quot;citationItems&quot;:[{&quot;id&quot;:&quot;52279965-ed25-312e-9de0-e0ceb0b0ce99&quot;,&quot;itemData&quot;:{&quot;type&quot;:&quot;article-journal&quot;,&quot;id&quot;:&quot;52279965-ed25-312e-9de0-e0ceb0b0ce99&quot;,&quot;title&quot;:&quot;The advantages of the Matthews correlation coefficient (MCC) over F1 score and accuracy in binary classification evaluation&quot;,&quot;author&quot;:[{&quot;family&quot;:&quot;Chicco&quot;,&quot;given&quot;:&quot;Davide&quot;,&quot;parse-names&quot;:false,&quot;dropping-particle&quot;:&quot;&quot;,&quot;non-dropping-particle&quot;:&quot;&quot;},{&quot;family&quot;:&quot;Jurman&quot;,&quot;given&quot;:&quot;Giuseppe&quot;,&quot;parse-names&quot;:false,&quot;dropping-particle&quot;:&quot;&quot;,&quot;non-dropping-particle&quot;:&quot;&quot;}],&quot;container-title&quot;:&quot;BMC Genomics&quot;,&quot;container-title-short&quot;:&quot;BMC Genomics&quot;,&quot;DOI&quot;:&quot;10.1186/s12864-019-6413-7&quot;,&quot;ISSN&quot;:&quot;1471-2164&quot;,&quot;issued&quot;:{&quot;date-parts&quot;:[[2020,12,2]]},&quot;page&quot;:&quot;6&quot;,&quot;issue&quot;:&quot;1&quot;,&quot;volume&quot;:&quot;21&quot;},&quot;isTemporary&quot;:false},{&quot;id&quot;:&quot;db024b82-b57a-3a94-a613-15565e9b465c&quot;,&quot;itemData&quot;:{&quot;type&quot;:&quot;article-journal&quot;,&quot;id&quot;:&quot;db024b82-b57a-3a94-a613-15565e9b465c&quot;,&quot;title&quot;:&quot;Revisiting performance metrics for prediction with rare outcomes&quot;,&quot;author&quot;:[{&quot;family&quot;:&quot;Adhikari&quot;,&quot;given&quot;:&quot;Samrachana&quot;,&quot;parse-names&quot;:false,&quot;dropping-particle&quot;:&quot;&quot;,&quot;non-dropping-particle&quot;:&quot;&quot;},{&quot;family&quot;:&quot;Normand&quot;,&quot;given&quot;:&quot;Sharon-Lise&quot;,&quot;parse-names&quot;:false,&quot;dropping-particle&quot;:&quot;&quot;,&quot;non-dropping-particle&quot;:&quot;&quot;},{&quot;family&quot;:&quot;Bloom&quot;,&quot;given&quot;:&quot;Jordan&quot;,&quot;parse-names&quot;:false,&quot;dropping-particle&quot;:&quot;&quot;,&quot;non-dropping-particle&quot;:&quot;&quot;},{&quot;family&quot;:&quot;Shahian&quot;,&quot;given&quot;:&quot;David&quot;,&quot;parse-names&quot;:false,&quot;dropping-particle&quot;:&quot;&quot;,&quot;non-dropping-particle&quot;:&quot;&quot;},{&quot;family&quot;:&quot;Rose&quot;,&quot;given&quot;:&quot;Sherri&quot;,&quot;parse-names&quot;:false,&quot;dropping-particle&quot;:&quot;&quot;,&quot;non-dropping-particle&quot;:&quot;&quot;}],&quot;container-title&quot;:&quot;Statistical Methods in Medical Research&quot;,&quot;container-title-short&quot;:&quot;Stat. Methods Med. Res.&quot;,&quot;DOI&quot;:&quot;10.1177/09622802211038754&quot;,&quot;ISSN&quot;:&quot;0962-2802&quot;,&quot;issued&quot;:{&quot;date-parts&quot;:[[2021,10,1]]},&quot;page&quot;:&quot;2352-2366&quot;,&quot;abstract&quot;:&quot;&lt;p&gt;Machine learning algorithms are increasingly used in the clinical literature, claiming advantages over logistic regression. However, they are generally designed to maximize the area under the receiver operating characteristic curve. While area under the receiver operating characteristic curve and other measures of accuracy are commonly reported for evaluating binary prediction problems, these metrics can be misleading. We aim to give clinical and machine learning researchers a realistic medical example of the dangers of relying on a single measure of discriminatory performance to evaluate binary prediction questions. Prediction of medical complications after surgery is a frequent but challenging task because many post-surgery outcomes are rare. We predicted post-surgery mortality among patients in a clinical registry who received at least one aortic valve replacement. Estimation incorporated multiple evaluation metrics and algorithms typically regarded as performing well with rare outcomes, as well as an ensemble and a new extension of the lasso for multiple unordered treatments. Results demonstrated high accuracy for all algorithms with moderate measures of cross-validated area under the receiver operating characteristic curve. False positive rates were [Formula: see text]1%, however, true positive rates were [Formula: see text]7%, even when paired with a 100% positive predictive value, and graphical representations of calibration were poor. Similar results were seen in simulations, with the addition of high area under the receiver operating characteristic curve ([Formula: see text]90%) accompanying low true positive rates. Clinical studies should not primarily report only area under the receiver operating characteristic curve or accuracy.&lt;/p&gt;&quot;,&quot;issue&quot;:&quot;10&quot;,&quot;volume&quot;:&quot;30&quot;},&quot;isTemporary&quot;:false}]},{&quot;citationID&quot;:&quot;MENDELEY_CITATION_9ad31536-b6df-4362-bd86-540c662cde14&quot;,&quot;properties&quot;:{&quot;noteIndex&quot;:0},&quot;isEdited&quot;:false,&quot;manualOverride&quot;:{&quot;isManuallyOverridden&quot;:false,&quot;citeprocText&quot;:&quot;[29]&quot;,&quot;manualOverrideText&quot;:&quot;&quot;},&quot;citationTag&quot;:&quot;MENDELEY_CITATION_v3_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&quot;,&quot;citationItems&quot;:[{&quot;id&quot;:&quot;6a87cd3f-cf9b-3905-a8fb-4cb899311d1e&quot;,&quot;itemData&quot;:{&quot;type&quot;:&quot;article-journal&quot;,&quot;id&quot;:&quot;6a87cd3f-cf9b-3905-a8fb-4cb899311d1e&quot;,&quot;title&quot;:&quot;Multi-label classification: do hamming loss and subset accuracy really conflict with each other?&quot;,&quot;author&quot;:[{&quot;family&quot;:&quot;Wu&quot;,&quot;given&quot;:&quot;Guoqiang&quot;,&quot;parse-names&quot;:false,&quot;dropping-particle&quot;:&quot;&quot;,&quot;non-dropping-particle&quot;:&quot;&quot;},{&quot;family&quot;:&quot;Zhu&quot;,&quot;given&quot;:&quot;Jun&quot;,&quot;parse-names&quot;:false,&quot;dropping-particle&quot;:&quot;&quot;,&quot;non-dropping-particle&quot;:&quot;&quot;}],&quot;container-title&quot;:&quot;Advances in Neural Information Processing Systems&quot;,&quot;container-title-short&quot;:&quot;Adv. Neural Inf. Process. Syst.&quot;,&quot;issued&quot;:{&quot;date-parts&quot;:[[2020]]},&quot;page&quot;:&quot;3130-3140&quot;,&quot;volume&quot;:&quot;33&quot;},&quot;isTemporary&quot;:false}]},{&quot;citationID&quot;:&quot;MENDELEY_CITATION_6d6d0d49-412b-4d77-9b8d-ac8452c404a6&quot;,&quot;properties&quot;:{&quot;noteIndex&quot;:0},&quot;isEdited&quot;:false,&quot;manualOverride&quot;:{&quot;isManuallyOverridden&quot;:false,&quot;citeprocText&quot;:&quot;[30]&quot;,&quot;manualOverrideText&quot;:&quot;&quot;},&quot;citationTag&quot;:&quot;MENDELEY_CITATION_v3_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&quot;,&quot;citationItems&quot;:[{&quot;id&quot;:&quot;164d07b8-929c-37dd-9d06-c9dc5f81403e&quot;,&quot;itemData&quot;:{&quot;type&quot;:&quot;article-journal&quot;,&quot;id&quot;:&quot;164d07b8-929c-37dd-9d06-c9dc5f81403e&quot;,&quot;title&quot;:&quot;The impact of class imbalance in classification performance metrics based on the binary confusion matrix&quot;,&quot;author&quot;:[{&quot;family&quot;:&quot;Luque&quot;,&quot;given&quot;:&quot;Amalia&quot;,&quot;parse-names&quot;:false,&quot;dropping-particle&quot;:&quot;&quot;,&quot;non-dropping-particle&quot;:&quot;&quot;},{&quot;family&quot;:&quot;Carrasco&quot;,&quot;given&quot;:&quot;Alejandro&quot;,&quot;parse-names&quot;:false,&quot;dropping-particle&quot;:&quot;&quot;,&quot;non-dropping-particle&quot;:&quot;&quot;},{&quot;family&quot;:&quot;Martín&quot;,&quot;given&quot;:&quot;Alejandro&quot;,&quot;parse-names&quot;:false,&quot;dropping-particle&quot;:&quot;&quot;,&quot;non-dropping-particle&quot;:&quot;&quot;},{&quot;family&quot;:&quot;las Heras&quot;,&quot;given&quot;:&quot;Ana&quot;,&quot;parse-names&quot;:false,&quot;dropping-particle&quot;:&quot;&quot;,&quot;non-dropping-particle&quot;:&quot;de&quot;}],&quot;container-title&quot;:&quot;Pattern Recognition&quot;,&quot;container-title-short&quot;:&quot;Pattern Recognit.&quot;,&quot;DOI&quot;:&quot;10.1016/j.patcog.2019.02.023&quot;,&quot;ISSN&quot;:&quot;00313203&quot;,&quot;issued&quot;:{&quot;date-parts&quot;:[[2019,7]]},&quot;page&quot;:&quot;216-231&quot;,&quot;volume&quot;:&quot;91&quot;},&quot;isTemporary&quot;:false}]},{&quot;citationID&quot;:&quot;MENDELEY_CITATION_8dfa40a6-a289-45fd-9b21-d69412ff3133&quot;,&quot;properties&quot;:{&quot;noteIndex&quot;:0},&quot;isEdited&quot;:false,&quot;manualOverride&quot;:{&quot;isManuallyOverridden&quot;:false,&quot;citeprocText&quot;:&quot;[31]&quot;,&quot;manualOverrideText&quot;:&quot;&quot;},&quot;citationTag&quot;:&quot;MENDELEY_CITATION_v3_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&quot;,&quot;citationItems&quot;:[{&quot;id&quot;:&quot;e3596f90-1edb-3ff4-924b-ac9e46a7c8d5&quot;,&quot;itemData&quot;:{&quot;type&quot;:&quot;webpage&quot;,&quot;id&quot;:&quot;e3596f90-1edb-3ff4-924b-ac9e46a7c8d5&quot;,&quot;title&quot;:&quot;Drug Design with Small Molecule SMILES&quot;,&quot;author&quot;:[{&quot;family&quot;:&quot;Sgt. Peppers&quot;,&quot;given&quot;:&quot;&quot;,&quot;parse-names&quot;:false,&quot;dropping-particle&quot;:&quot;&quot;,&quot;non-dropping-particle&quot;:&quot;&quot;}],&quot;container-title&quot;:&quot;https://www.kaggle.com/datasets/art3mis/chembl22&quot;,&quot;issued&quot;:{&quot;date-parts&quot;:[[2025]]},&quot;container-title-short&quot;:&quot;&quot;},&quot;isTemporary&quot;:false}]},{&quot;citationID&quot;:&quot;MENDELEY_CITATION_c25554b6-155e-4912-80c0-3bf7fbbf1da3&quot;,&quot;properties&quot;:{&quot;noteIndex&quot;:0},&quot;isEdited&quot;:false,&quot;manualOverride&quot;:{&quot;isManuallyOverridden&quot;:false,&quot;citeprocText&quot;:&quot;[32]&quot;,&quot;manualOverrideText&quot;:&quot;&quot;},&quot;citationTag&quot;:&quot;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&quot;,&quot;citationItems&quot;:[{&quot;id&quot;:&quot;05dc4768-a214-33fc-85e4-fc8c5d25d6d2&quot;,&quot;itemData&quot;:{&quot;type&quot;:&quot;article-journal&quot;,&quot;id&quot;:&quot;05dc4768-a214-33fc-85e4-fc8c5d25d6d2&quot;,&quot;title&quot;:&quot;DrugBank 6.0: the DrugBank Knowledgebase for 2024&quot;,&quot;author&quot;:[{&quot;family&quot;:&quot;Knox&quot;,&quot;given&quot;:&quot;Craig&quot;,&quot;parse-names&quot;:false,&quot;dropping-particle&quot;:&quot;&quot;,&quot;non-dropping-particle&quot;:&quot;&quot;},{&quot;family&quot;:&quot;Wilson&quot;,&quot;given&quot;:&quot;Mike&quot;,&quot;parse-names&quot;:false,&quot;dropping-particle&quot;:&quot;&quot;,&quot;non-dropping-particle&quot;:&quot;&quot;},{&quot;family&quot;:&quot;Klinger&quot;,&quot;given&quot;:&quot;Christen M&quot;,&quot;parse-names&quot;:false,&quot;dropping-particle&quot;:&quot;&quot;,&quot;non-dropping-particle&quot;:&quot;&quot;},{&quot;family&quot;:&quot;Franklin&quot;,&quot;given&quot;:&quot;Mark&quot;,&quot;parse-names&quot;:false,&quot;dropping-particle&quot;:&quot;&quot;,&quot;non-dropping-particle&quot;:&quot;&quot;},{&quot;family&quot;:&quot;Oler&quot;,&quot;given&quot;:&quot;Eponine&quot;,&quot;parse-names&quot;:false,&quot;dropping-particle&quot;:&quot;&quot;,&quot;non-dropping-particle&quot;:&quot;&quot;},{&quot;family&quot;:&quot;Wilson&quot;,&quot;given&quot;:&quot;Alex&quot;,&quot;parse-names&quot;:false,&quot;dropping-particle&quot;:&quot;&quot;,&quot;non-dropping-particle&quot;:&quot;&quot;},{&quot;family&quot;:&quot;Pon&quot;,&quot;given&quot;:&quot;Allison&quot;,&quot;parse-names&quot;:false,&quot;dropping-particle&quot;:&quot;&quot;,&quot;non-dropping-particle&quot;:&quot;&quot;},{&quot;family&quot;:&quot;Cox&quot;,&quot;given&quot;:&quot;Jordan&quot;,&quot;parse-names&quot;:false,&quot;dropping-particle&quot;:&quot;&quot;,&quot;non-dropping-particle&quot;:&quot;&quot;},{&quot;family&quot;:&quot;Chin&quot;,&quot;given&quot;:&quot;Na Eun (Lucy)&quot;,&quot;parse-names&quot;:false,&quot;dropping-particle&quot;:&quot;&quot;,&quot;non-dropping-particle&quot;:&quot;&quot;},{&quot;family&quot;:&quot;Strawbridge&quot;,&quot;given&quot;:&quot;Seth A&quot;,&quot;parse-names&quot;:false,&quot;dropping-particle&quot;:&quot;&quot;,&quot;non-dropping-particle&quot;:&quot;&quot;},{&quot;family&quot;:&quot;Garcia-Patino&quot;,&quot;given&quot;:&quot;Marysol&quot;,&quot;parse-names&quot;:false,&quot;dropping-particle&quot;:&quot;&quot;,&quot;non-dropping-particle&quot;:&quot;&quot;},{&quot;family&quot;:&quot;Kruger&quot;,&quot;given&quot;:&quot;Ray&quot;,&quot;parse-names&quot;:false,&quot;dropping-particle&quot;:&quot;&quot;,&quot;non-dropping-particle&quot;:&quot;&quot;},{&quot;family&quot;:&quot;Sivakumaran&quot;,&quot;given&quot;:&quot;Aadhavya&quot;,&quot;parse-names&quot;:false,&quot;dropping-particle&quot;:&quot;&quot;,&quot;non-dropping-particle&quot;:&quot;&quot;},{&quot;family&quot;:&quot;Sanford&quot;,&quot;given&quot;:&quot;Selena&quot;,&quot;parse-names&quot;:false,&quot;dropping-particle&quot;:&quot;&quot;,&quot;non-dropping-particle&quot;:&quot;&quot;},{&quot;family&quot;:&quot;Doshi&quot;,&quot;given&quot;:&quot;Rahil&quot;,&quot;parse-names&quot;:false,&quot;dropping-particle&quot;:&quot;&quot;,&quot;non-dropping-particle&quot;:&quot;&quot;},{&quot;family&quot;:&quot;Khetarpal&quot;,&quot;given&quot;:&quot;Nitya&quot;,&quot;parse-names&quot;:false,&quot;dropping-particle&quot;:&quot;&quot;,&quot;non-dropping-particle&quot;:&quot;&quot;},{&quot;family&quot;:&quot;Fatokun&quot;,&quot;given&quot;:&quot;Omolola&quot;,&quot;parse-names&quot;:false,&quot;dropping-particle&quot;:&quot;&quot;,&quot;non-dropping-particle&quot;:&quot;&quot;},{&quot;family&quot;:&quot;Doucet&quot;,&quot;given&quot;:&quot;Daphnee&quot;,&quot;parse-names&quot;:false,&quot;dropping-particle&quot;:&quot;&quot;,&quot;non-dropping-particle&quot;:&quot;&quot;},{&quot;family&quot;:&quot;Zubkowski&quot;,&quot;given&quot;:&quot;Ashley&quot;,&quot;parse-names&quot;:false,&quot;dropping-particle&quot;:&quot;&quot;,&quot;non-dropping-particle&quot;:&quot;&quot;},{&quot;family&quot;:&quot;Rayat&quot;,&quot;given&quot;:&quot;Dorsa Yahya&quot;,&quot;parse-names&quot;:false,&quot;dropping-particle&quot;:&quot;&quot;,&quot;non-dropping-particle&quot;:&quot;&quot;},{&quot;family&quot;:&quot;Jackson&quot;,&quot;given&quot;:&quot;Hayley&quot;,&quot;parse-names&quot;:false,&quot;dropping-particle&quot;:&quot;&quot;,&quot;non-dropping-particle&quot;:&quot;&quot;},{&quot;family&quot;:&quot;Harford&quot;,&quot;given&quot;:&quot;Karxena&quot;,&quot;parse-names&quot;:false,&quot;dropping-particle&quot;:&quot;&quot;,&quot;non-dropping-particle&quot;:&quot;&quot;},{&quot;family&quot;:&quot;Anjum&quot;,&quot;given&quot;:&quot;Afia&quot;,&quot;parse-names&quot;:false,&quot;dropping-particle&quot;:&quot;&quot;,&quot;non-dropping-particle&quot;:&quot;&quot;},{&quot;family&quot;:&quot;Zakir&quot;,&quot;given&quot;:&quot;Mahi&quot;,&quot;parse-names&quot;:false,&quot;dropping-particle&quot;:&quot;&quot;,&quot;non-dropping-particle&quot;:&quot;&quot;},{&quot;family&quot;:&quot;Wang&quot;,&quot;given&quot;:&quot;Fei&quot;,&quot;parse-names&quot;:false,&quot;dropping-particle&quot;:&quot;&quot;,&quot;non-dropping-particle&quot;:&quot;&quot;},{&quot;family&quot;:&quot;Tian&quot;,&quot;given&quot;:&quot;Siyang&quot;,&quot;parse-names&quot;:false,&quot;dropping-particle&quot;:&quot;&quot;,&quot;non-dropping-particle&quot;:&quot;&quot;},{&quot;family&quot;:&quot;Lee&quot;,&quot;given&quot;:&quot;Brian&quot;,&quot;parse-names&quot;:false,&quot;dropping-particle&quot;:&quot;&quot;,&quot;non-dropping-particle&quot;:&quot;&quot;},{&quot;family&quot;:&quot;Liigand&quot;,&quot;given&quot;:&quot;Jaanus&quot;,&quot;parse-names&quot;:false,&quot;dropping-particle&quot;:&quot;&quot;,&quot;non-dropping-particle&quot;:&quot;&quot;},{&quot;family&quot;:&quot;Peters&quot;,&quot;given&quot;:&quot;Harrison&quot;,&quot;parse-names&quot;:false,&quot;dropping-particle&quot;:&quot;&quot;,&quot;non-dropping-particle&quot;:&quot;&quot;},{&quot;family&quot;:&quot;Wang&quot;,&quot;given&quot;:&quot;Ruo Qi (Rachel)&quot;,&quot;parse-names&quot;:false,&quot;dropping-particle&quot;:&quot;&quot;,&quot;non-dropping-particle&quot;:&quot;&quot;},{&quot;family&quot;:&quot;Nguyen&quot;,&quot;given&quot;:&quot;Tue&quot;,&quot;parse-names&quot;:false,&quot;dropping-particle&quot;:&quot;&quot;,&quot;non-dropping-particle&quot;:&quot;&quot;},{&quot;family&quot;:&quot;So&quot;,&quot;given&quot;:&quot;Denise&quot;,&quot;parse-names&quot;:false,&quot;dropping-particle&quot;:&quot;&quot;,&quot;non-dropping-particle&quot;:&quot;&quot;},{&quot;family&quot;:&quot;Sharp&quot;,&quot;given&quot;:&quot;Matthew&quot;,&quot;parse-names&quot;:false,&quot;dropping-particle&quot;:&quot;&quot;,&quot;non-dropping-particle&quot;:&quot;&quot;},{&quot;family&quot;:&quot;da Silva&quot;,&quot;given&quot;:&quot;Rodolfo&quot;,&quot;parse-names&quot;:false,&quot;dropping-particle&quot;:&quot;&quot;,&quot;non-dropping-particle&quot;:&quot;&quot;},{&quot;family&quot;:&quot;Gabriel&quot;,&quot;given&quot;:&quot;Cyrella&quot;,&quot;parse-names&quot;:false,&quot;dropping-particle&quot;:&quot;&quot;,&quot;non-dropping-particle&quot;:&quot;&quot;},{&quot;family&quot;:&quot;Scantlebury&quot;,&quot;given&quot;:&quot;Joshua&quot;,&quot;parse-names&quot;:false,&quot;dropping-particle&quot;:&quot;&quot;,&quot;non-dropping-particle&quot;:&quot;&quot;},{&quot;family&quot;:&quot;Jasinski&quot;,&quot;given&quot;:&quot;Marissa&quot;,&quot;parse-names&quot;:false,&quot;dropping-particle&quot;:&quot;&quot;,&quot;non-dropping-particle&quot;:&quot;&quot;},{&quot;family&quot;:&quot;Ackerman&quot;,&quot;given&quot;:&quot;David&quot;,&quot;parse-names&quot;:false,&quot;dropping-particle&quot;:&quot;&quot;,&quot;non-dropping-particle&quot;:&quot;&quot;},{&quot;family&quot;:&quot;Jewison&quot;,&quot;given&quot;:&quot;Timothy&quot;,&quot;parse-names&quot;:false,&quot;dropping-particle&quot;:&quot;&quot;,&quot;non-dropping-particle&quot;:&quot;&quot;},{&quot;family&quot;:&quot;Sajed&quot;,&quot;given&quot;:&quot;Tanvir&quot;,&quot;parse-names&quot;:false,&quot;dropping-particle&quot;:&quot;&quot;,&quot;non-dropping-particle&quot;:&quot;&quot;},{&quot;family&quot;:&quot;Gautam&quot;,&quot;given&quot;:&quot;Vasuk&quot;,&quot;parse-names&quot;:false,&quot;dropping-particle&quot;:&quot;&quot;,&quot;non-dropping-particle&quot;:&quot;&quot;},{&quot;family&quot;:&quot;Wishart&quot;,&quot;given&quot;:&quot;David S&quot;,&quot;parse-names&quot;:false,&quot;dropping-particle&quot;:&quot;&quot;,&quot;non-dropping-particle&quot;:&quot;&quot;}],&quot;container-title&quot;:&quot;Nucleic Acids Research&quot;,&quot;DOI&quot;:&quot;10.1093/nar/gkad976&quot;,&quot;ISSN&quot;:&quot;0305-1048&quot;,&quot;issued&quot;:{&quot;date-parts&quot;:[[2024,1,5]]},&quot;page&quot;:&quot;D1265-D1275&quot;,&quot;abstract&quot;:&quot;&lt;p&gt;First released in 2006, DrugBank (https://go.drugbank.com) has grown to become the ‘gold standard’ knowledge resource for drug, drug–target and related pharmaceutical information. DrugBank is widely used across many diverse biomedical research and clinical applications, and averages more than 30 million views/year. Since its last update in 2018, we have been actively enhancing the quantity and quality of the drug data in this knowledgebase. In this latest release (DrugBank 6.0), the number of FDA approved drugs has grown from 2646 to 4563 (a 72% increase), the number of investigational drugs has grown from 3394 to 6231 (a 38% increase), the number of drug–drug interactions increased from 365 984 to 1 413 413 (a 300% increase), and the number of drug–food interactions expanded from 1195 to 2475 (a 200% increase). In addition to this notable expansion in database size, we have added thousands of new, colorful, richly annotated pathways depicting drug mechanisms and drug metabolism. Likewise, existing datasets have been significantly improved and expanded, by adding more information on drug indications, drug–drug interactions, drug–food interactions and many other relevant data types for 11 891 drugs. We have also added experimental and predicted MS/MS spectra, 1D/2D-NMR spectra, CCS (collision cross section), RT (retention time) and RI (retention index) data for 9464 of DrugBank's 11 710 small molecule drugs. These and other improvements should make DrugBank 6.0 even more useful to a much wider research audience ranging from medicinal chemists to metabolomics specialists to pharmacologists.&lt;/p&gt;&quot;,&quot;issue&quot;:&quot;D1&quot;,&quot;volume&quot;:&quot;52&quot;,&quot;container-title-short&quot;:&quot;Nucleic Acids Res.&quot;},&quot;isTemporary&quot;:false}]},{&quot;citationID&quot;:&quot;MENDELEY_CITATION_842c6097-cdb7-4d69-9e19-e0a99dfba80a&quot;,&quot;properties&quot;:{&quot;noteIndex&quot;:0},&quot;isEdited&quot;:false,&quot;manualOverride&quot;:{&quot;isManuallyOverridden&quot;:false,&quot;citeprocText&quot;:&quot;[33]&quot;,&quot;manualOverrideText&quot;:&quot;&quot;},&quot;citationTag&quot;:&quot;MENDELEY_CITATION_v3_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&quot;,&quot;citationItems&quot;:[{&quot;id&quot;:&quot;2360cf28-52dd-3e44-85a2-08be789b8022&quot;,&quot;itemData&quot;:{&quot;type&quot;:&quot;article-journal&quot;,&quot;id&quot;:&quot;2360cf28-52dd-3e44-85a2-08be789b8022&quot;,&quot;title&quot;:&quot;The ChEMBL database in 2017&quot;,&quot;author&quot;:[{&quot;family&quot;:&quot;Gaulton&quot;,&quot;given&quot;:&quot;Anna&quot;,&quot;parse-names&quot;:false,&quot;dropping-particle&quot;:&quot;&quot;,&quot;non-dropping-particle&quot;:&quot;&quot;},{&quot;family&quot;:&quot;Hersey&quot;,&quot;given&quot;:&quot;Anne&quot;,&quot;parse-names&quot;:false,&quot;dropping-particle&quot;:&quot;&quot;,&quot;non-dropping-particle&quot;:&quot;&quot;},{&quot;family&quot;:&quot;Nowotka&quot;,&quot;given&quot;:&quot;Michał&quot;,&quot;parse-names&quot;:false,&quot;dropping-particle&quot;:&quot;&quot;,&quot;non-dropping-particle&quot;:&quot;&quot;},{&quot;family&quot;:&quot;Bento&quot;,&quot;given&quot;:&quot;A. Patrícia&quot;,&quot;parse-names&quot;:false,&quot;dropping-particle&quot;:&quot;&quot;,&quot;non-dropping-particle&quot;:&quot;&quot;},{&quot;family&quot;:&quot;Chambers&quot;,&quot;given&quot;:&quot;Jon&quot;,&quot;parse-names&quot;:false,&quot;dropping-particle&quot;:&quot;&quot;,&quot;non-dropping-particle&quot;:&quot;&quot;},{&quot;family&quot;:&quot;Mendez&quot;,&quot;given&quot;:&quot;David&quot;,&quot;parse-names&quot;:false,&quot;dropping-particle&quot;:&quot;&quot;,&quot;non-dropping-particle&quot;:&quot;&quot;},{&quot;family&quot;:&quot;Mutowo&quot;,&quot;given&quot;:&quot;Prudence&quot;,&quot;parse-names&quot;:false,&quot;dropping-particle&quot;:&quot;&quot;,&quot;non-dropping-particle&quot;:&quot;&quot;},{&quot;family&quot;:&quot;Atkinson&quot;,&quot;given&quot;:&quot;Francis&quot;,&quot;parse-names&quot;:false,&quot;dropping-particle&quot;:&quot;&quot;,&quot;non-dropping-particle&quot;:&quot;&quot;},{&quot;family&quot;:&quot;Bellis&quot;,&quot;given&quot;:&quot;Louisa J.&quot;,&quot;parse-names&quot;:false,&quot;dropping-particle&quot;:&quot;&quot;,&quot;non-dropping-particle&quot;:&quot;&quot;},{&quot;family&quot;:&quot;Cibrián-Uhalte&quot;,&quot;given&quot;:&quot;Elena&quot;,&quot;parse-names&quot;:false,&quot;dropping-particle&quot;:&quot;&quot;,&quot;non-dropping-particle&quot;:&quot;&quot;},{&quot;family&quot;:&quot;Davies&quot;,&quot;given&quot;:&quot;Mark&quot;,&quot;parse-names&quot;:false,&quot;dropping-particle&quot;:&quot;&quot;,&quot;non-dropping-particle&quot;:&quot;&quot;},{&quot;family&quot;:&quot;Dedman&quot;,&quot;given&quot;:&quot;Nathan&quot;,&quot;parse-names&quot;:false,&quot;dropping-particle&quot;:&quot;&quot;,&quot;non-dropping-particle&quot;:&quot;&quot;},{&quot;family&quot;:&quot;Karlsson&quot;,&quot;given&quot;:&quot;Anneli&quot;,&quot;parse-names&quot;:false,&quot;dropping-particle&quot;:&quot;&quot;,&quot;non-dropping-particle&quot;:&quot;&quot;},{&quot;family&quot;:&quot;Magariños&quot;,&quot;given&quot;:&quot;María Paula&quot;,&quot;parse-names&quot;:false,&quot;dropping-particle&quot;:&quot;&quot;,&quot;non-dropping-particle&quot;:&quot;&quot;},{&quot;family&quot;:&quot;Overington&quot;,&quot;given&quot;:&quot;John P.&quot;,&quot;parse-names&quot;:false,&quot;dropping-particle&quot;:&quot;&quot;,&quot;non-dropping-particle&quot;:&quot;&quot;},{&quot;family&quot;:&quot;Papadatos&quot;,&quot;given&quot;:&quot;George&quot;,&quot;parse-names&quot;:false,&quot;dropping-particle&quot;:&quot;&quot;,&quot;non-dropping-particle&quot;:&quot;&quot;},{&quot;family&quot;:&quot;Smit&quot;,&quot;given&quot;:&quot;Ines&quot;,&quot;parse-names&quot;:false,&quot;dropping-particle&quot;:&quot;&quot;,&quot;non-dropping-particle&quot;:&quot;&quot;},{&quot;family&quot;:&quot;Leach&quot;,&quot;given&quot;:&quot;Andrew R.&quot;,&quot;parse-names&quot;:false,&quot;dropping-particle&quot;:&quot;&quot;,&quot;non-dropping-particle&quot;:&quot;&quot;}],&quot;container-title&quot;:&quot;Nucleic Acids Research&quot;,&quot;DOI&quot;:&quot;10.1093/nar/gkw1074&quot;,&quot;ISSN&quot;:&quot;0305-1048&quot;,&quot;issued&quot;:{&quot;date-parts&quot;:[[2017,1,4]]},&quot;page&quot;:&quot;D945-D954&quot;,&quot;issue&quot;:&quot;D1&quot;,&quot;volume&quot;:&quot;45&quot;,&quot;container-title-short&quot;:&quot;Nucleic Acids Res.&quot;},&quot;isTemporary&quot;:false}]},{&quot;citationID&quot;:&quot;MENDELEY_CITATION_f7c666f5-11ce-4466-a5b6-1fb7e14e1fb6&quot;,&quot;properties&quot;:{&quot;noteIndex&quot;:0},&quot;isEdited&quot;:false,&quot;manualOverride&quot;:{&quot;isManuallyOverridden&quot;:false,&quot;citeprocText&quot;:&quot;[34]&quot;,&quot;manualOverrideText&quot;:&quot;&quot;},&quot;citationTag&quot;:&quot;MENDELEY_CITATION_v3_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&quot;,&quot;citationItems&quot;:[{&quot;id&quot;:&quot;894bf710-3c9a-38d7-a687-6a8f8d072ef0&quot;,&quot;itemData&quot;:{&quot;type&quot;:&quot;article-journal&quot;,&quot;id&quot;:&quot;894bf710-3c9a-38d7-a687-6a8f8d072ef0&quot;,&quot;title&quot;:&quot;Pre-trained molecular representations enable antimicrobial discovery&quot;,&quot;author&quot;:[{&quot;family&quot;:&quot;Olayo-Alarcon&quot;,&quot;given&quot;:&quot;Roberto&quot;,&quot;parse-names&quot;:false,&quot;dropping-particle&quot;:&quot;&quot;,&quot;non-dropping-particle&quot;:&quot;&quot;},{&quot;family&quot;:&quot;Amstalden&quot;,&quot;given&quot;:&quot;Martin K.&quot;,&quot;parse-names&quot;:false,&quot;dropping-particle&quot;:&quot;&quot;,&quot;non-dropping-particle&quot;:&quot;&quot;},{&quot;family&quot;:&quot;Zannoni&quot;,&quot;given&quot;:&quot;Annamaria&quot;,&quot;parse-names&quot;:false,&quot;dropping-particle&quot;:&quot;&quot;,&quot;non-dropping-particle&quot;:&quot;&quot;},{&quot;family&quot;:&quot;Bajramovic&quot;,&quot;given&quot;:&quot;Medina&quot;,&quot;parse-names&quot;:false,&quot;dropping-particle&quot;:&quot;&quot;,&quot;non-dropping-particle&quot;:&quot;&quot;},{&quot;family&quot;:&quot;Sharma&quot;,&quot;given&quot;:&quot;Cynthia M.&quot;,&quot;parse-names&quot;:false,&quot;dropping-particle&quot;:&quot;&quot;,&quot;non-dropping-particle&quot;:&quot;&quot;},{&quot;family&quot;:&quot;Brochado&quot;,&quot;given&quot;:&quot;Ana Rita&quot;,&quot;parse-names&quot;:false,&quot;dropping-particle&quot;:&quot;&quot;,&quot;non-dropping-particle&quot;:&quot;&quot;},{&quot;family&quot;:&quot;Rezaei&quot;,&quot;given&quot;:&quot;Mina&quot;,&quot;parse-names&quot;:false,&quot;dropping-particle&quot;:&quot;&quot;,&quot;non-dropping-particle&quot;:&quot;&quot;},{&quot;family&quot;:&quot;Müller&quot;,&quot;given&quot;:&quot;Christian L.&quot;,&quot;parse-names&quot;:false,&quot;dropping-particle&quot;:&quot;&quot;,&quot;non-dropping-particle&quot;:&quot;&quot;}],&quot;container-title&quot;:&quot;Nature Communications&quot;,&quot;DOI&quot;:&quot;10.1038/s41467-025-58804-4&quot;,&quot;ISSN&quot;:&quot;2041-1723&quot;,&quot;issued&quot;:{&quot;date-parts&quot;:[[2025,4,10]]},&quot;page&quot;:&quot;3420&quot;,&quot;abstract&quot;:&quot;&lt;p&gt; The rise in antimicrobial resistance poses a worldwide threat, reducing the efficacy of common antibiotics. Determining the antimicrobial activity of new chemical compounds through experimental methods remains time-consuming and costly. While compound-centric deep learning models promise to accelerate this search and prioritization process, current strategies require large amounts of custom training data. Here, we introduce a lightweight computational strategy for antimicrobial discovery that builds on MolE (Molecular representation through redundancy reduced Embedding), a self-supervised deep learning framework that leverages unlabeled chemical structures to learn task-independent molecular representations. By combining MolE representation learning with available, experimentally validated compound-bacteria activity data, we design a general predictive model that enables assessing compounds with respect to their antimicrobial potential. Our model correctly identifies recent growth-inhibitory compounds that are structurally distinct from current antibiotics. Using this approach, we discover de novo, and experimentally confirm, three human-targeted drugs as growth inhibitors of &lt;italic&gt;Staphylococcus aureus&lt;/italic&gt; . This framework offers a viable, cost-effective strategy to accelerate antibiotic discovery. &lt;/p&gt;&quot;,&quot;issue&quot;:&quot;1&quot;,&quot;volume&quot;:&quot;16&quot;,&quot;container-title-short&quot;:&quot;Nat. Commun.&quot;},&quot;isTemporary&quot;:false}]}]"/>
     <we:property name="MENDELEY_CITATIONS_STYLE" value="{&quot;id&quot;:&quot;https://www.zotero.org/styles/ieee&quot;,&quot;title&quot;:&quot;IEEE Reference Guide version 11.29.2023&quot;,&quot;format&quot;:&quot;numeric&quot;,&quot;defaultLocale&quot;:null,&quot;isLocaleCodeValid&quot;:true}"/>
   </we:properties>
   <we:bindings/>
@@ -25535,6 +27492,15 @@
 </file>
 
 <file path=customXml/item1.xml><?xml version="1.0" encoding="utf-8"?>
+<?mso-contentType ?>
+<FormTemplates xmlns="http://schemas.microsoft.com/sharepoint/v3/contenttype/forms">
+  <Display>DocumentLibraryForm</Display>
+  <Edit>DocumentLibraryForm</Edit>
+  <New>DocumentLibraryForm</New>
+</FormTemplates>
+</file>
+
+<file path=customXml/item2.xml><?xml version="1.0" encoding="utf-8"?>
 <p:properties xmlns:p="http://schemas.microsoft.com/office/2006/metadata/properties" xmlns:xsi="http://www.w3.org/2001/XMLSchema-instance" xmlns:pc="http://schemas.microsoft.com/office/infopath/2007/PartnerControls">
   <documentManagement>
     <lcf76f155ced4ddcb4097134ff3c332f xmlns="9d7b9a5c-6b4f-4ca1-bb03-c38cacb734bc">
@@ -25545,16 +27511,11 @@
 </p:properties>
 </file>
 
-<file path=customXml/item2.xml><?xml version="1.0" encoding="utf-8"?>
-<?mso-contentType ?>
-<FormTemplates xmlns="http://schemas.microsoft.com/sharepoint/v3/contenttype/forms">
-  <Display>DocumentLibraryForm</Display>
-  <Edit>DocumentLibraryForm</Edit>
-  <New>DocumentLibraryForm</New>
-</FormTemplates>
+<file path=customXml/item3.xml><?xml version="1.0" encoding="utf-8"?>
+<b:Sources xmlns:b="http://schemas.openxmlformats.org/officeDocument/2006/bibliography" xmlns="http://schemas.openxmlformats.org/officeDocument/2006/bibliography" SelectedStyle="\APASixthEditionOfficeOnline.xsl" StyleName="APA" Version="6"/>
 </file>
 
-<file path=customXml/item3.xml><?xml version="1.0" encoding="utf-8"?>
+<file path=customXml/item4.xml><?xml version="1.0" encoding="utf-8"?>
 <ct:contentTypeSchema xmlns:ct="http://schemas.microsoft.com/office/2006/metadata/contentType" xmlns:ma="http://schemas.microsoft.com/office/2006/metadata/properties/metaAttributes" ct:_="" ma:_="" ma:contentTypeName="Documento" ma:contentTypeID="0x01010019FAAD7208B57F46B26AFFED99BCE0D3" ma:contentTypeVersion="16" ma:contentTypeDescription="Crear nuevo documento." ma:contentTypeScope="" ma:versionID="ad25a40a439e4eb6a750a8b6ae1789f7">
   <xsd:schema xmlns:xsd="http://www.w3.org/2001/XMLSchema" xmlns:xs="http://www.w3.org/2001/XMLSchema" xmlns:p="http://schemas.microsoft.com/office/2006/metadata/properties" xmlns:ns2="9d7b9a5c-6b4f-4ca1-bb03-c38cacb734bc" xmlns:ns3="7d80c08f-e909-465c-8aa4-0e649fbe85d0" xmlns:ns4="7302fe9c-5e91-4977-8271-167378b25bd2" targetNamespace="http://schemas.microsoft.com/office/2006/metadata/properties" ma:root="true" ma:fieldsID="113d448336e841d5d8efd4b9e74490d6" ns2:_="" ns3:_="" ns4:_="">
     <xsd:import namespace="9d7b9a5c-6b4f-4ca1-bb03-c38cacb734bc"/>
@@ -25802,11 +27763,15 @@
 </ct:contentTypeSchema>
 </file>
 
-<file path=customXml/item4.xml><?xml version="1.0" encoding="utf-8"?>
-<b:Sources xmlns:b="http://schemas.openxmlformats.org/officeDocument/2006/bibliography" xmlns="http://schemas.openxmlformats.org/officeDocument/2006/bibliography" SelectedStyle="\APASixthEditionOfficeOnline.xsl" StyleName="APA" Version="6"/>
+<file path=customXml/itemProps1.xml><?xml version="1.0" encoding="utf-8"?>
+<ds:datastoreItem xmlns:ds="http://schemas.openxmlformats.org/officeDocument/2006/customXml" ds:itemID="{E5FD6A2B-9479-4129-9D84-6C858DBE1A90}">
+  <ds:schemaRefs>
+    <ds:schemaRef ds:uri="http://schemas.microsoft.com/sharepoint/v3/contenttype/forms"/>
+  </ds:schemaRefs>
+</ds:datastoreItem>
 </file>
 
-<file path=customXml/itemProps1.xml><?xml version="1.0" encoding="utf-8"?>
+<file path=customXml/itemProps2.xml><?xml version="1.0" encoding="utf-8"?>
 <ds:datastoreItem xmlns:ds="http://schemas.openxmlformats.org/officeDocument/2006/customXml" ds:itemID="{261B0A37-6C6C-45CF-A5C4-83D994BC3980}">
   <ds:schemaRefs>
     <ds:schemaRef ds:uri="http://schemas.microsoft.com/office/2006/metadata/properties"/>
@@ -25817,15 +27782,15 @@
 </ds:datastoreItem>
 </file>
 
-<file path=customXml/itemProps2.xml><?xml version="1.0" encoding="utf-8"?>
-<ds:datastoreItem xmlns:ds="http://schemas.openxmlformats.org/officeDocument/2006/customXml" ds:itemID="{E5FD6A2B-9479-4129-9D84-6C858DBE1A90}">
+<file path=customXml/itemProps3.xml><?xml version="1.0" encoding="utf-8"?>
+<ds:datastoreItem xmlns:ds="http://schemas.openxmlformats.org/officeDocument/2006/customXml" ds:itemID="{5157238F-F555-4D04-860C-F98429B609BD}">
   <ds:schemaRefs>
-    <ds:schemaRef ds:uri="http://schemas.microsoft.com/sharepoint/v3/contenttype/forms"/>
+    <ds:schemaRef ds:uri="http://schemas.openxmlformats.org/officeDocument/2006/bibliography"/>
   </ds:schemaRefs>
 </ds:datastoreItem>
 </file>
 
-<file path=customXml/itemProps3.xml><?xml version="1.0" encoding="utf-8"?>
+<file path=customXml/itemProps4.xml><?xml version="1.0" encoding="utf-8"?>
 <ds:datastoreItem xmlns:ds="http://schemas.openxmlformats.org/officeDocument/2006/customXml" ds:itemID="{BC4311AC-D0D5-4AE9-8386-76BDCE1C82F3}">
   <ds:schemaRefs>
     <ds:schemaRef ds:uri="http://schemas.microsoft.com/office/2006/metadata/contentType"/>
@@ -25843,12 +27808,4 @@
     <ds:schemaRef ds:uri="http://schemas.microsoft.com/internal/obd"/>
   </ds:schemaRefs>
 </ds:datastoreItem>
-</file>
-
-<file path=customXml/itemProps4.xml><?xml version="1.0" encoding="utf-8"?>
-<ds:datastoreItem xmlns:ds="http://schemas.openxmlformats.org/officeDocument/2006/customXml" ds:itemID="{5157238F-F555-4D04-860C-F98429B609BD}">
-  <ds:schemaRefs>
-    <ds:schemaRef ds:uri="http://schemas.openxmlformats.org/officeDocument/2006/bibliography"/>
-  </ds:schemaRefs>
-</ds:datastoreItem>
 </file>
</xml_diff>

<commit_message>
New RF figure and eda_db advances.
</commit_message>
<xml_diff>
--- a/Memorias/TFM Drug Metabolism - Gonzalo Robles.docx
+++ b/Memorias/TFM Drug Metabolism - Gonzalo Robles.docx
@@ -348,6 +348,7 @@
           <w:lang w:val="es-ES_tradnl"/>
         </w:rPr>
       </w:pPr>
+      <w:proofErr w:type="spellStart"/>
       <w:r>
         <w:rPr>
           <w:rFonts w:ascii="Roboto Light" w:eastAsia="ヒラギノ角ゴ Pro W3" w:hAnsi="Roboto Light"/>
@@ -355,7 +356,17 @@
           <w:sz w:val="32"/>
           <w:lang w:val="es-ES_tradnl"/>
         </w:rPr>
-        <w:t>Thesis Supervisor:</w:t>
+        <w:t>Thesis</w:t>
+      </w:r>
+      <w:proofErr w:type="spellEnd"/>
+      <w:r>
+        <w:rPr>
+          <w:rFonts w:ascii="Roboto Light" w:eastAsia="ヒラギノ角ゴ Pro W3" w:hAnsi="Roboto Light"/>
+          <w:color w:val="404040" w:themeColor="text1" w:themeTint="BF"/>
+          <w:sz w:val="32"/>
+          <w:lang w:val="es-ES_tradnl"/>
+        </w:rPr>
+        <w:t xml:space="preserve"> Supervisor:</w:t>
       </w:r>
       <w:r>
         <w:rPr>
@@ -744,12 +755,14 @@
           <w:lang w:val="en-GB" w:eastAsia="en-GB"/>
         </w:rPr>
       </w:pPr>
+      <w:proofErr w:type="spellStart"/>
       <w:r>
         <w:rPr>
           <w:lang w:val="en-GB" w:eastAsia="en-GB"/>
         </w:rPr>
         <w:t>Xxx</w:t>
       </w:r>
+      <w:proofErr w:type="spellEnd"/>
     </w:p>
     <w:p>
       <w:pPr>
@@ -760,6 +773,7 @@
         </w:rPr>
       </w:pPr>
       <w:bookmarkStart w:id="2" w:name="_Toc228905446"/>
+      <w:proofErr w:type="spellStart"/>
       <w:r>
         <w:rPr>
           <w:lang w:val="en-GB" w:eastAsia="en-GB"/>
@@ -773,6 +787,7 @@
         <w:t>men</w:t>
       </w:r>
       <w:bookmarkEnd w:id="2"/>
+      <w:proofErr w:type="spellEnd"/>
     </w:p>
     <w:p>
       <w:pPr>
@@ -781,12 +796,28 @@
           <w:lang w:val="en-GB" w:eastAsia="en-GB"/>
         </w:rPr>
       </w:pPr>
-      <w:r>
-        <w:rPr>
-          <w:lang w:val="en-GB" w:eastAsia="en-GB"/>
-        </w:rPr>
-        <w:t>Xxx español</w:t>
-      </w:r>
+      <w:proofErr w:type="spellStart"/>
+      <w:r>
+        <w:rPr>
+          <w:lang w:val="en-GB" w:eastAsia="en-GB"/>
+        </w:rPr>
+        <w:t>Xxx</w:t>
+      </w:r>
+      <w:proofErr w:type="spellEnd"/>
+      <w:r>
+        <w:rPr>
+          <w:lang w:val="en-GB" w:eastAsia="en-GB"/>
+        </w:rPr>
+        <w:t xml:space="preserve"> </w:t>
+      </w:r>
+      <w:proofErr w:type="spellStart"/>
+      <w:r>
+        <w:rPr>
+          <w:lang w:val="en-GB" w:eastAsia="en-GB"/>
+        </w:rPr>
+        <w:t>español</w:t>
+      </w:r>
+      <w:proofErr w:type="spellEnd"/>
     </w:p>
     <w:sdt>
       <w:sdtPr>
@@ -5509,12 +5540,14 @@
                 <w:lang w:val="en-GB" w:eastAsia="en-GB"/>
               </w:rPr>
             </w:pPr>
+            <w:proofErr w:type="spellStart"/>
             <w:r>
               <w:rPr>
                 <w:lang w:val="en-GB" w:eastAsia="en-GB"/>
               </w:rPr>
               <w:t>df</w:t>
             </w:r>
+            <w:proofErr w:type="spellEnd"/>
           </w:p>
         </w:tc>
         <w:tc>
@@ -5528,12 +5561,14 @@
                 <w:lang w:val="en-GB" w:eastAsia="en-GB"/>
               </w:rPr>
             </w:pPr>
+            <w:proofErr w:type="spellStart"/>
             <w:r>
               <w:rPr>
                 <w:lang w:val="en-GB" w:eastAsia="en-GB"/>
               </w:rPr>
               <w:t>Dataframe</w:t>
             </w:r>
+            <w:proofErr w:type="spellEnd"/>
           </w:p>
         </w:tc>
       </w:tr>
@@ -5595,12 +5630,14 @@
                 <w:lang w:val="en-GB" w:eastAsia="en-GB"/>
               </w:rPr>
             </w:pPr>
+            <w:proofErr w:type="spellStart"/>
             <w:r>
               <w:rPr>
                 <w:lang w:val="en-GB" w:eastAsia="en-GB"/>
               </w:rPr>
-              <w:t>SMILES</w:t>
-            </w:r>
+              <w:t>db</w:t>
+            </w:r>
+            <w:proofErr w:type="spellEnd"/>
           </w:p>
         </w:tc>
         <w:tc>
@@ -5618,7 +5655,7 @@
               <w:rPr>
                 <w:lang w:val="en-GB" w:eastAsia="en-GB"/>
               </w:rPr>
-              <w:t>Simplified Molecular Input Line Entry System</w:t>
+              <w:t>Database(s)</w:t>
             </w:r>
           </w:p>
         </w:tc>
@@ -5642,7 +5679,7 @@
               <w:rPr>
                 <w:lang w:val="en-GB" w:eastAsia="en-GB"/>
               </w:rPr>
-              <w:t>InChI</w:t>
+              <w:t>ML</w:t>
             </w:r>
           </w:p>
         </w:tc>
@@ -5661,7 +5698,7 @@
               <w:rPr>
                 <w:lang w:val="en-GB" w:eastAsia="en-GB"/>
               </w:rPr>
-              <w:t>IUPAC International Chemical Identifier</w:t>
+              <w:t>Machine learning</w:t>
             </w:r>
           </w:p>
         </w:tc>
@@ -5685,8 +5722,104 @@
               <w:rPr>
                 <w:lang w:val="en-GB" w:eastAsia="en-GB"/>
               </w:rPr>
-              <w:t>.tsv</w:t>
-            </w:r>
+              <w:t>SMILES</w:t>
+            </w:r>
+          </w:p>
+        </w:tc>
+        <w:tc>
+          <w:tcPr>
+            <w:tcW w:w="4460" w:type="dxa"/>
+            <w:vAlign w:val="center"/>
+          </w:tcPr>
+          <w:p>
+            <w:pPr>
+              <w:rPr>
+                <w:lang w:val="en-GB" w:eastAsia="en-GB"/>
+              </w:rPr>
+            </w:pPr>
+            <w:r>
+              <w:rPr>
+                <w:lang w:val="en-GB" w:eastAsia="en-GB"/>
+              </w:rPr>
+              <w:t>Simplified Molecular Input Line Entry System</w:t>
+            </w:r>
+          </w:p>
+        </w:tc>
+      </w:tr>
+      <w:tr>
+        <w:trPr>
+          <w:trHeight w:val="454"/>
+        </w:trPr>
+        <w:tc>
+          <w:tcPr>
+            <w:tcW w:w="4459" w:type="dxa"/>
+            <w:vAlign w:val="center"/>
+          </w:tcPr>
+          <w:p>
+            <w:pPr>
+              <w:rPr>
+                <w:lang w:val="en-GB" w:eastAsia="en-GB"/>
+              </w:rPr>
+            </w:pPr>
+            <w:r>
+              <w:rPr>
+                <w:lang w:val="en-GB" w:eastAsia="en-GB"/>
+              </w:rPr>
+              <w:t>InChI</w:t>
+            </w:r>
+          </w:p>
+        </w:tc>
+        <w:tc>
+          <w:tcPr>
+            <w:tcW w:w="4460" w:type="dxa"/>
+            <w:vAlign w:val="center"/>
+          </w:tcPr>
+          <w:p>
+            <w:pPr>
+              <w:rPr>
+                <w:lang w:val="en-GB" w:eastAsia="en-GB"/>
+              </w:rPr>
+            </w:pPr>
+            <w:r>
+              <w:rPr>
+                <w:lang w:val="en-GB" w:eastAsia="en-GB"/>
+              </w:rPr>
+              <w:t>IUPAC International Chemical Identifier</w:t>
+            </w:r>
+          </w:p>
+        </w:tc>
+      </w:tr>
+      <w:tr>
+        <w:trPr>
+          <w:trHeight w:val="454"/>
+        </w:trPr>
+        <w:tc>
+          <w:tcPr>
+            <w:tcW w:w="4459" w:type="dxa"/>
+            <w:vAlign w:val="center"/>
+          </w:tcPr>
+          <w:p>
+            <w:pPr>
+              <w:rPr>
+                <w:lang w:val="en-GB" w:eastAsia="en-GB"/>
+              </w:rPr>
+            </w:pPr>
+            <w:proofErr w:type="gramStart"/>
+            <w:r>
+              <w:rPr>
+                <w:lang w:val="en-GB" w:eastAsia="en-GB"/>
+              </w:rPr>
+              <w:t>.</w:t>
+            </w:r>
+            <w:proofErr w:type="spellStart"/>
+            <w:r>
+              <w:rPr>
+                <w:lang w:val="en-GB" w:eastAsia="en-GB"/>
+              </w:rPr>
+              <w:t>tsv</w:t>
+            </w:r>
+            <w:proofErr w:type="spellEnd"/>
+            <w:proofErr w:type="gramEnd"/>
           </w:p>
         </w:tc>
         <w:tc>
@@ -6225,6 +6358,7 @@
               <w:rPr>
                 <w:lang w:val="en-GB" w:eastAsia="en-GB"/>
               </w:rPr>
+              <w:lastRenderedPageBreak/>
               <w:t>HL</w:t>
             </w:r>
           </w:p>
@@ -6443,7 +6577,21 @@
         <w:rPr>
           <w:lang w:val="en-GB" w:eastAsia="en-GB"/>
         </w:rPr>
-        <w:t xml:space="preserve">A key family of enzymes responsible for drug metabolism is the cytochrome P450 (CYP450) superfamily, which processes the majority of marketed drugs. Identifying which CYP450 isoenzymes (i.e., subtypes) are involved in the metabolism of a new molecule is critical, as it can reveal potential </w:t>
+        <w:t xml:space="preserve">A key family of enzymes responsible for drug metabolism is the cytochrome P450 (CYP450) superfamily, which processes </w:t>
+      </w:r>
+      <w:proofErr w:type="gramStart"/>
+      <w:r>
+        <w:rPr>
+          <w:lang w:val="en-GB" w:eastAsia="en-GB"/>
+        </w:rPr>
+        <w:t>the majority of</w:t>
+      </w:r>
+      <w:proofErr w:type="gramEnd"/>
+      <w:r>
+        <w:rPr>
+          <w:lang w:val="en-GB" w:eastAsia="en-GB"/>
+        </w:rPr>
+        <w:t xml:space="preserve"> marketed drugs. Identifying which CYP450 isoenzymes (i.e., subtypes) are involved in the metabolism of a new molecule is critical, as it can reveal potential </w:t>
       </w:r>
       <w:r>
         <w:rPr>
@@ -6687,7 +6835,19 @@
         <w:rPr>
           <w:lang w:val="en-GB" w:eastAsia="en-GB"/>
         </w:rPr>
-        <w:t xml:space="preserve"> compile extensive information on molecular structures and their known metabolic properties, providing a valuable foundation for predictive modelling. By leveraging this data, machine-learning algorithms can </w:t>
+        <w:t xml:space="preserve"> compile extensive information on molecular structures and their known metabolic properties, providing a valuable foundation for predictive modelling. By leveraging this data, machine-learning</w:t>
+      </w:r>
+      <w:r>
+        <w:rPr>
+          <w:lang w:val="en-GB" w:eastAsia="en-GB"/>
+        </w:rPr>
+        <w:t xml:space="preserve"> (ML)</w:t>
+      </w:r>
+      <w:r>
+        <w:rPr>
+          <w:lang w:val="en-GB" w:eastAsia="en-GB"/>
+        </w:rPr>
+        <w:t xml:space="preserve"> algorithms can </w:t>
       </w:r>
       <w:r>
         <w:rPr>
@@ -6713,7 +6873,19 @@
         <w:rPr>
           <w:lang w:val="en-GB" w:eastAsia="en-GB"/>
         </w:rPr>
-        <w:t xml:space="preserve">This project aims to apply data science and machine learning techniques to predict the metabolism of new drug-like molecules, </w:t>
+        <w:t xml:space="preserve">This project aims to apply data science and </w:t>
+      </w:r>
+      <w:r>
+        <w:rPr>
+          <w:lang w:val="en-GB" w:eastAsia="en-GB"/>
+        </w:rPr>
+        <w:t>ML</w:t>
+      </w:r>
+      <w:r>
+        <w:rPr>
+          <w:lang w:val="en-GB" w:eastAsia="en-GB"/>
+        </w:rPr>
+        <w:t xml:space="preserve"> techniques to predict the metabolism of new drug-like molecules, </w:t>
       </w:r>
       <w:r>
         <w:rPr>
@@ -6761,7 +6933,14 @@
         <w:rPr>
           <w:lang w:val="en-GB" w:eastAsia="en-GB"/>
         </w:rPr>
-        <w:t xml:space="preserve">, this work seeks to provide pharmaceutical chemists with a computational tool for evaluating </w:t>
+        <w:t xml:space="preserve">, this work seeks to </w:t>
+      </w:r>
+      <w:r>
+        <w:rPr>
+          <w:lang w:val="en-GB" w:eastAsia="en-GB"/>
+        </w:rPr>
+        <w:lastRenderedPageBreak/>
+        <w:t xml:space="preserve">provide pharmaceutical chemists with a computational tool for evaluating </w:t>
       </w:r>
       <w:r>
         <w:rPr>
@@ -6813,7 +6992,6 @@
         <w:rPr>
           <w:lang w:val="en-GB" w:eastAsia="en-GB"/>
         </w:rPr>
-        <w:lastRenderedPageBreak/>
         <w:t>STATE OF THE ART</w:t>
       </w:r>
       <w:bookmarkEnd w:id="6"/>
@@ -6894,7 +7072,35 @@
         <w:rPr>
           <w:lang w:val="en-GB" w:eastAsia="en-GB"/>
         </w:rPr>
-        <w:t xml:space="preserve"> for excretion. Together, these phases represent the natural sequence of biotransformations a compound undergoes, and hepatocytes are capable of capturing both, providing an overall view of the metabolic fate of a drug candidate.</w:t>
+        <w:t xml:space="preserve"> for excretion. Together, these phases represent the natural sequence of </w:t>
+      </w:r>
+      <w:proofErr w:type="spellStart"/>
+      <w:r>
+        <w:rPr>
+          <w:lang w:val="en-GB" w:eastAsia="en-GB"/>
+        </w:rPr>
+        <w:t>biotransformations</w:t>
+      </w:r>
+      <w:proofErr w:type="spellEnd"/>
+      <w:r>
+        <w:rPr>
+          <w:lang w:val="en-GB" w:eastAsia="en-GB"/>
+        </w:rPr>
+        <w:t xml:space="preserve"> a compound undergoes, and hepatocytes </w:t>
+      </w:r>
+      <w:proofErr w:type="gramStart"/>
+      <w:r>
+        <w:rPr>
+          <w:lang w:val="en-GB" w:eastAsia="en-GB"/>
+        </w:rPr>
+        <w:t>are capable of capturing</w:t>
+      </w:r>
+      <w:proofErr w:type="gramEnd"/>
+      <w:r>
+        <w:rPr>
+          <w:lang w:val="en-GB" w:eastAsia="en-GB"/>
+        </w:rPr>
+        <w:t xml:space="preserve"> both, providing an overall view of the metabolic fate of a drug candidate.</w:t>
       </w:r>
     </w:p>
     <w:p>
@@ -7046,14 +7252,14 @@
         <w:rPr>
           <w:lang w:val="en-GB" w:eastAsia="en-GB"/>
         </w:rPr>
-        <w:t xml:space="preserve">Because they reflect the full enzymatic and physiological context of the liver, primary hepatocytes are considered the gold standard for studying drug metabolism. They provide a near-complete representation of how a compound would behave in human systems, allowing for precise determination of metabolites, rates of clearance, and enzyme pathways involved. However, the value of hepatocytes comes with significant limitations: they are expensive, often costing hundreds of dollars per experiment, and they require specialized culture conditions and expertise. Their limited </w:t>
+        <w:t xml:space="preserve">Because they reflect the full enzymatic and physiological context of the liver, primary hepatocytes are considered the gold standard for studying drug metabolism. They provide a near-complete </w:t>
       </w:r>
       <w:r>
         <w:rPr>
           <w:lang w:val="en-GB" w:eastAsia="en-GB"/>
         </w:rPr>
         <w:lastRenderedPageBreak/>
-        <w:t>availability (due to donor dependence), relatively short lifespan, and low throughput make them unsuitable for screening large libraries of early-stage drug candidates. As a result, hepatocyte studies are typically reserved for promising molecules during late preclinical stages.</w:t>
+        <w:t>representation of how a compound would behave in human systems, allowing for precise determination of metabolites, rates of clearance, and enzyme pathways involved. However, the value of hepatocytes comes with significant limitations: they are expensive, often costing hundreds of dollars per experiment, and they require specialized culture conditions and expertise. Their limited availability (due to donor dependence), relatively short lifespan, and low throughput make them unsuitable for screening large libraries of early-stage drug candidates. As a result, hepatocyte studies are typically reserved for promising molecules during late preclinical stages.</w:t>
       </w:r>
     </w:p>
     <w:p>
@@ -7180,7 +7386,35 @@
         <w:rPr>
           <w:lang w:val="en-GB" w:eastAsia="en-GB"/>
         </w:rPr>
-        <w:t xml:space="preserve"> technologies designed to predict drug metabolism. Rule-based expert systems, such as MetaSite and StarDrop (with its WhichP450™ model), attempt to forecast how molecules are processed by specific enzymes, including CYP450 isoforms. These tools offer rapid predictions and can screen large compound libraries at a scale far beyond what any in vitro system could achieve. However, their proprietary nature and high licensing costs</w:t>
+        <w:t xml:space="preserve"> technologies designed to predict drug metabolism. Rule-based expert systems, such as </w:t>
+      </w:r>
+      <w:proofErr w:type="spellStart"/>
+      <w:r>
+        <w:rPr>
+          <w:lang w:val="en-GB" w:eastAsia="en-GB"/>
+        </w:rPr>
+        <w:t>MetaSite</w:t>
+      </w:r>
+      <w:proofErr w:type="spellEnd"/>
+      <w:r>
+        <w:rPr>
+          <w:lang w:val="en-GB" w:eastAsia="en-GB"/>
+        </w:rPr>
+        <w:t xml:space="preserve"> and </w:t>
+      </w:r>
+      <w:proofErr w:type="spellStart"/>
+      <w:r>
+        <w:rPr>
+          <w:lang w:val="en-GB" w:eastAsia="en-GB"/>
+        </w:rPr>
+        <w:t>StarDrop</w:t>
+      </w:r>
+      <w:proofErr w:type="spellEnd"/>
+      <w:r>
+        <w:rPr>
+          <w:lang w:val="en-GB" w:eastAsia="en-GB"/>
+        </w:rPr>
+        <w:t xml:space="preserve"> (with its WhichP450™ model), attempt to forecast how molecules are processed by specific enzymes, including CYP450 isoforms. These tools offer rapid predictions and can screen large compound libraries at a scale far beyond what any in vitro system could achieve. However, their proprietary nature and high licensing costs</w:t>
       </w:r>
       <w:r>
         <w:rPr>
@@ -7192,13 +7426,41 @@
         <w:rPr>
           <w:lang w:val="en-GB" w:eastAsia="en-GB"/>
         </w:rPr>
-        <w:t xml:space="preserve">ranging from several thousand euros per project for MetaSite to annual subscriptions exceeding tens of </w:t>
-      </w:r>
-      <w:r>
-        <w:rPr>
-          <w:lang w:val="en-GB" w:eastAsia="en-GB"/>
-        </w:rPr>
-        <w:t xml:space="preserve">thousands of euros for StarDrop, </w:t>
+        <w:t xml:space="preserve">ranging from several thousand euros per project for </w:t>
+      </w:r>
+      <w:proofErr w:type="spellStart"/>
+      <w:r>
+        <w:rPr>
+          <w:lang w:val="en-GB" w:eastAsia="en-GB"/>
+        </w:rPr>
+        <w:t>MetaSite</w:t>
+      </w:r>
+      <w:proofErr w:type="spellEnd"/>
+      <w:r>
+        <w:rPr>
+          <w:lang w:val="en-GB" w:eastAsia="en-GB"/>
+        </w:rPr>
+        <w:t xml:space="preserve"> to annual subscriptions exceeding tens of </w:t>
+      </w:r>
+      <w:r>
+        <w:rPr>
+          <w:lang w:val="en-GB" w:eastAsia="en-GB"/>
+        </w:rPr>
+        <w:t xml:space="preserve">thousands of euros for </w:t>
+      </w:r>
+      <w:proofErr w:type="spellStart"/>
+      <w:r>
+        <w:rPr>
+          <w:lang w:val="en-GB" w:eastAsia="en-GB"/>
+        </w:rPr>
+        <w:t>StarDrop</w:t>
+      </w:r>
+      <w:proofErr w:type="spellEnd"/>
+      <w:r>
+        <w:rPr>
+          <w:lang w:val="en-GB" w:eastAsia="en-GB"/>
+        </w:rPr>
+        <w:t xml:space="preserve">, </w:t>
       </w:r>
       <w:r>
         <w:rPr>
@@ -7230,19 +7492,53 @@
         <w:rPr>
           <w:lang w:val="en-GB" w:eastAsia="en-GB"/>
         </w:rPr>
-        <w:t xml:space="preserve"> and ma</w:t>
-      </w:r>
-      <w:r>
-        <w:rPr>
-          <w:lang w:val="en-GB" w:eastAsia="en-GB"/>
-        </w:rPr>
-        <w:t>chine learning to simulate drug-</w:t>
-      </w:r>
-      <w:r>
-        <w:rPr>
-          <w:lang w:val="en-GB" w:eastAsia="en-GB"/>
-        </w:rPr>
-        <w:t>enzyme interactions. StarDrop’s Semeta platform integrates enzyme-specific regioselectivity models, quantum mechanical simulations, and predictive heuristics to identify likely metabolic pathways across major Phase I and Phase II enzymes, including CYP450 isoforms</w:t>
+        <w:t xml:space="preserve"> and </w:t>
+      </w:r>
+      <w:r>
+        <w:rPr>
+          <w:lang w:val="en-GB" w:eastAsia="en-GB"/>
+        </w:rPr>
+        <w:t>ML</w:t>
+      </w:r>
+      <w:r>
+        <w:rPr>
+          <w:lang w:val="en-GB" w:eastAsia="en-GB"/>
+        </w:rPr>
+        <w:t xml:space="preserve"> to simulate drug-</w:t>
+      </w:r>
+      <w:r>
+        <w:rPr>
+          <w:lang w:val="en-GB" w:eastAsia="en-GB"/>
+        </w:rPr>
+        <w:t xml:space="preserve">enzyme interactions. </w:t>
+      </w:r>
+      <w:proofErr w:type="spellStart"/>
+      <w:r>
+        <w:rPr>
+          <w:lang w:val="en-GB" w:eastAsia="en-GB"/>
+        </w:rPr>
+        <w:t>StarDrop’s</w:t>
+      </w:r>
+      <w:proofErr w:type="spellEnd"/>
+      <w:r>
+        <w:rPr>
+          <w:lang w:val="en-GB" w:eastAsia="en-GB"/>
+        </w:rPr>
+        <w:t xml:space="preserve"> </w:t>
+      </w:r>
+      <w:proofErr w:type="spellStart"/>
+      <w:r>
+        <w:rPr>
+          <w:lang w:val="en-GB" w:eastAsia="en-GB"/>
+        </w:rPr>
+        <w:t>Semeta</w:t>
+      </w:r>
+      <w:proofErr w:type="spellEnd"/>
+      <w:r>
+        <w:rPr>
+          <w:lang w:val="en-GB" w:eastAsia="en-GB"/>
+        </w:rPr>
+        <w:t xml:space="preserve"> platform integrates enzyme-specific regioselectivity models, quantum mechanical simulations, and predictive heuristics to identify likely metabolic pathways across major Phase I and Phase II enzymes, including CYP450 isoforms</w:t>
       </w:r>
       <w:r>
         <w:rPr>
@@ -7278,8 +7574,16 @@
         <w:rPr>
           <w:lang w:val="en-GB" w:eastAsia="en-GB"/>
         </w:rPr>
-        <w:t>. MetaSite</w:t>
-      </w:r>
+        <w:t xml:space="preserve">. </w:t>
+      </w:r>
+      <w:proofErr w:type="spellStart"/>
+      <w:r>
+        <w:rPr>
+          <w:lang w:val="en-GB" w:eastAsia="en-GB"/>
+        </w:rPr>
+        <w:t>MetaSite</w:t>
+      </w:r>
+      <w:proofErr w:type="spellEnd"/>
       <w:r>
         <w:rPr>
           <w:lang w:val="en-GB" w:eastAsia="en-GB"/>
@@ -7334,7 +7638,14 @@
         <w:rPr>
           <w:lang w:val="en-GB" w:eastAsia="en-GB"/>
         </w:rPr>
-        <w:t>. While these approaches have proven accuracy and the advantage of incorporating detailed enzyme knowledge, they can also be computationally intensive, particularly when simulating multiple enzyme systems or large libraries of molecules</w:t>
+        <w:t xml:space="preserve">. While these approaches have proven accuracy and the advantage of incorporating detailed </w:t>
+      </w:r>
+      <w:r>
+        <w:rPr>
+          <w:lang w:val="en-GB" w:eastAsia="en-GB"/>
+        </w:rPr>
+        <w:lastRenderedPageBreak/>
+        <w:t>enzyme knowledge, they can also be computationally intensive, particularly when simulating multiple enzyme systems or large libraries of molecules</w:t>
       </w:r>
       <w:r>
         <w:rPr>
@@ -7379,14 +7690,35 @@
         <w:rPr>
           <w:lang w:val="en-GB" w:eastAsia="en-GB"/>
         </w:rPr>
-        <w:t xml:space="preserve"> models relies heavily on ensemble modelling, a technique where multiple predictive models are combined to </w:t>
-      </w:r>
-      <w:r>
-        <w:rPr>
-          <w:lang w:val="en-GB" w:eastAsia="en-GB"/>
-        </w:rPr>
-        <w:lastRenderedPageBreak/>
-        <w:t>produce a more accurate and reliable outcome than any single model could achieve on its own. In the case of Semeta, for example, separate models such as WhichP450 and WhichEnzyme are integrated alongside regioselectivity predictors to collectively determine the most likely metabolic routes. This combined approach helps balance out the limitations of individual models by bringing together the strengths of different algorithms, leading to more reliable and accurate predictions.</w:t>
+        <w:t xml:space="preserve"> models relies heavily on ensemble modelling, a technique where multiple predictive models are combined to produce a more accurate and reliable outcome than any single model could achieve on its own. In the case of </w:t>
+      </w:r>
+      <w:proofErr w:type="spellStart"/>
+      <w:r>
+        <w:rPr>
+          <w:lang w:val="en-GB" w:eastAsia="en-GB"/>
+        </w:rPr>
+        <w:t>Semeta</w:t>
+      </w:r>
+      <w:proofErr w:type="spellEnd"/>
+      <w:r>
+        <w:rPr>
+          <w:lang w:val="en-GB" w:eastAsia="en-GB"/>
+        </w:rPr>
+        <w:t xml:space="preserve">, for example, separate models such as WhichP450 and </w:t>
+      </w:r>
+      <w:proofErr w:type="spellStart"/>
+      <w:r>
+        <w:rPr>
+          <w:lang w:val="en-GB" w:eastAsia="en-GB"/>
+        </w:rPr>
+        <w:t>WhichEnzyme</w:t>
+      </w:r>
+      <w:proofErr w:type="spellEnd"/>
+      <w:r>
+        <w:rPr>
+          <w:lang w:val="en-GB" w:eastAsia="en-GB"/>
+        </w:rPr>
+        <w:t xml:space="preserve"> are integrated alongside regioselectivity predictors to collectively determine the most likely metabolic routes. This combined approach helps balance out the limitations of individual models by bringing together the strengths of different algorithms, leading to more reliable and accurate predictions.</w:t>
       </w:r>
     </w:p>
     <w:p>
@@ -7629,7 +7961,21 @@
         <w:rPr>
           <w:lang w:val="en-GB" w:eastAsia="en-GB"/>
         </w:rPr>
-        <w:t xml:space="preserve">Among the various chemical representations in computational chemistry, SMILES (Simplified Molecular Input Line Entry System) stands as the predominant format for encoding molecular structures. SMILES’ popularity stems from its computational efficiency and widespread support across cheminformatics tools, making it the standard input for most cheminformatics algorithms. However, SMILES is not without limitations. Its non-canonical nature means that multiple strings can represent the same molecule, complicating tasks that rely on unique identifiers. Challenges also arise when representing protonated species, compounds containing transition metals, or more complex molecular </w:t>
+        <w:t xml:space="preserve">Among the various chemical representations in computational chemistry, SMILES (Simplified Molecular Input Line Entry System) </w:t>
+      </w:r>
+      <w:proofErr w:type="gramStart"/>
+      <w:r>
+        <w:rPr>
+          <w:lang w:val="en-GB" w:eastAsia="en-GB"/>
+        </w:rPr>
+        <w:t>stands</w:t>
+      </w:r>
+      <w:proofErr w:type="gramEnd"/>
+      <w:r>
+        <w:rPr>
+          <w:lang w:val="en-GB" w:eastAsia="en-GB"/>
+        </w:rPr>
+        <w:t xml:space="preserve"> as the predominant format for encoding molecular structures. SMILES’ popularity stems from its computational efficiency and widespread support across cheminformatics tools, making it the standard input for most cheminformatics algorithms. However, SMILES is not without limitations. Its non-canonical nature means that multiple strings can represent the same molecule, complicating tasks that rely on unique identifiers. Challenges also arise when representing protonated species, compounds containing transition metals, or more complex molecular </w:t>
       </w:r>
       <w:r>
         <w:rPr>
@@ -7655,7 +8001,19 @@
         <w:rPr>
           <w:lang w:val="en-GB" w:eastAsia="en-GB"/>
         </w:rPr>
-        <w:t>To characterize molecular features for machine learning, chemical fingerprints are preferred over learned embeddings, particularly when datasets contain a relatively small number of compounds, usually in the thousands. Fingerprints such as MACCS keys, which provide a compact 166-bit vector, offer computational simplicity but often lack sufficient detail for predictive</w:t>
+        <w:t xml:space="preserve">To characterize molecular features for </w:t>
+      </w:r>
+      <w:r>
+        <w:rPr>
+          <w:lang w:val="en-GB" w:eastAsia="en-GB"/>
+        </w:rPr>
+        <w:t>ML</w:t>
+      </w:r>
+      <w:r>
+        <w:rPr>
+          <w:lang w:val="en-GB" w:eastAsia="en-GB"/>
+        </w:rPr>
+        <w:t>, chemical fingerprints are preferred over learned embeddings, particularly when datasets contain a relatively small number of compounds, usually in the thousands. Fingerprints such as MACCS keys, which provide a compact 166-bit vector, offer computational simplicity but often lack sufficient detail for predictive</w:t>
       </w:r>
       <w:r>
         <w:rPr>
@@ -7795,7 +8153,14 @@
         <w:rPr>
           <w:lang w:val="en-GB" w:eastAsia="en-GB"/>
         </w:rPr>
-        <w:t>, proposed in 2018, which adapts natural language processing techniques to chemistry by treating molecular substructures as “words” and learning continuous vector representations using a Word2Vec-style framework. Mol2Vec demonstrated that unsupervised embeddings derived from molecular fragments could capture chemical similarity and improve performance over traditional fingerprints in some predictive tasks. More recently, advances in deep learning have led to transformer-based language models for chemistry, such as ChemBERTa</w:t>
+        <w:t xml:space="preserve">, proposed in 2018, which adapts natural language processing techniques to chemistry by treating molecular substructures as “words” and learning continuous vector representations using a Word2Vec-style framework. Mol2Vec demonstrated that unsupervised embeddings derived from molecular fragments could capture chemical similarity and improve performance over traditional fingerprints in some predictive </w:t>
+      </w:r>
+      <w:r>
+        <w:rPr>
+          <w:lang w:val="en-GB" w:eastAsia="en-GB"/>
+        </w:rPr>
+        <w:lastRenderedPageBreak/>
+        <w:t>tasks. More recently, advances in deep learning have led to transformer-based language models for chemistry, such as ChemBERTa</w:t>
       </w:r>
       <w:r>
         <w:rPr>
@@ -7867,14 +8232,7 @@
         <w:rPr>
           <w:lang w:val="en-GB" w:eastAsia="en-GB"/>
         </w:rPr>
-        <w:t xml:space="preserve">, which leverage massive chemical corpora to generate general-purpose molecular embeddings. Together, </w:t>
-      </w:r>
-      <w:r>
-        <w:rPr>
-          <w:lang w:val="en-GB" w:eastAsia="en-GB"/>
-        </w:rPr>
-        <w:lastRenderedPageBreak/>
-        <w:t>these approaches represent the current state of the art in molecular representation learning, complementing classical fingerprints</w:t>
+        <w:t>, which leverage massive chemical corpora to generate general-purpose molecular embeddings. Together, these approaches represent the current state of the art in molecular representation learning, complementing classical fingerprints</w:t>
       </w:r>
       <w:r>
         <w:rPr>
@@ -7894,7 +8252,19 @@
         <w:rPr>
           <w:lang w:val="en-GB" w:eastAsia="en-GB"/>
         </w:rPr>
-        <w:t>Despite the methodological advances described above, virtually all modern molecular machine learning pipelines</w:t>
+        <w:t xml:space="preserve">Despite the methodological advances described above, virtually all modern molecular </w:t>
+      </w:r>
+      <w:r>
+        <w:rPr>
+          <w:lang w:val="en-GB" w:eastAsia="en-GB"/>
+        </w:rPr>
+        <w:t>ML</w:t>
+      </w:r>
+      <w:r>
+        <w:rPr>
+          <w:lang w:val="en-GB" w:eastAsia="en-GB"/>
+        </w:rPr>
+        <w:t xml:space="preserve"> pipelines</w:t>
       </w:r>
       <w:r>
         <w:rPr>
@@ -7990,7 +8360,19 @@
         <w:rPr>
           <w:lang w:val="en-GB" w:eastAsia="en-GB"/>
         </w:rPr>
-        <w:t>The limited adoption of InChI in machine learning is therefore not a settled conclusion but an open design choice. As a complementary line of inquiry, this thesis explores whether an InChI-native encoder can learn representations that complement or challenge those derived from SMILES.</w:t>
+        <w:t xml:space="preserve">The limited adoption of InChI in </w:t>
+      </w:r>
+      <w:r>
+        <w:rPr>
+          <w:lang w:val="en-GB" w:eastAsia="en-GB"/>
+        </w:rPr>
+        <w:t>ML</w:t>
+      </w:r>
+      <w:r>
+        <w:rPr>
+          <w:lang w:val="en-GB" w:eastAsia="en-GB"/>
+        </w:rPr>
+        <w:t xml:space="preserve"> is therefore not a settled conclusion but an open design choice. As a complementary line of inquiry, this thesis explores whether an InChI-native encoder can learn representations that complement or challenge those derived from SMILES.</w:t>
       </w:r>
     </w:p>
     <w:p>
@@ -8041,7 +8423,19 @@
         <w:rPr>
           <w:lang w:val="en-GB" w:eastAsia="en-GB"/>
         </w:rPr>
-        <w:t>To develop and evaluate machine learning models capable of predicting the metabolism of drug-like molecules by classifying them according to the CYP450 isoenzymes most likely to metabolize them, using publicly available molecular data and annotations.</w:t>
+        <w:t xml:space="preserve">To develop and evaluate </w:t>
+      </w:r>
+      <w:r>
+        <w:rPr>
+          <w:lang w:val="en-GB" w:eastAsia="en-GB"/>
+        </w:rPr>
+        <w:t xml:space="preserve">ML </w:t>
+      </w:r>
+      <w:r>
+        <w:rPr>
+          <w:lang w:val="en-GB" w:eastAsia="en-GB"/>
+        </w:rPr>
+        <w:t>models capable of predicting the metabolism of drug-like molecules by classifying them according to the CYP450 isoenzymes most likely to metabolize them, using publicly available molecular data and annotations.</w:t>
       </w:r>
     </w:p>
     <w:p>
@@ -8106,7 +8500,39 @@
           <w:color w:val="000000" w:themeColor="text1"/>
           <w:lang w:val="en-GB" w:eastAsia="en-GB"/>
         </w:rPr>
-        <w:t>, and preprocess molecular structure datasets and metabolic annotations from public sources such as ChEMBL and DrugBank.</w:t>
+        <w:t xml:space="preserve">, and preprocess molecular structure datasets and metabolic annotations from public sources such as </w:t>
+      </w:r>
+      <w:proofErr w:type="spellStart"/>
+      <w:r>
+        <w:rPr>
+          <w:color w:val="000000" w:themeColor="text1"/>
+          <w:lang w:val="en-GB" w:eastAsia="en-GB"/>
+        </w:rPr>
+        <w:t>ChEMBL</w:t>
+      </w:r>
+      <w:proofErr w:type="spellEnd"/>
+      <w:r>
+        <w:rPr>
+          <w:color w:val="000000" w:themeColor="text1"/>
+          <w:lang w:val="en-GB" w:eastAsia="en-GB"/>
+        </w:rPr>
+        <w:t xml:space="preserve"> and </w:t>
+      </w:r>
+      <w:proofErr w:type="spellStart"/>
+      <w:r>
+        <w:rPr>
+          <w:color w:val="000000" w:themeColor="text1"/>
+          <w:lang w:val="en-GB" w:eastAsia="en-GB"/>
+        </w:rPr>
+        <w:t>DrugBank</w:t>
+      </w:r>
+      <w:proofErr w:type="spellEnd"/>
+      <w:r>
+        <w:rPr>
+          <w:color w:val="000000" w:themeColor="text1"/>
+          <w:lang w:val="en-GB" w:eastAsia="en-GB"/>
+        </w:rPr>
+        <w:t>.</w:t>
       </w:r>
     </w:p>
     <w:p>
@@ -8221,6 +8647,7 @@
         <w:rPr>
           <w:lang w:val="en-GB" w:eastAsia="en-GB"/>
         </w:rPr>
+        <w:lastRenderedPageBreak/>
         <w:t>Assess model performance using appropriate multi-label metrics, validate predictions against known experimental data, and discuss how the findings may inform representation choices in early drug discovery pipelines.</w:t>
       </w:r>
     </w:p>
@@ -8236,7 +8663,6 @@
         <w:rPr>
           <w:lang w:val="en-GB" w:eastAsia="en-GB"/>
         </w:rPr>
-        <w:lastRenderedPageBreak/>
         <w:t>METHODOLOGY</w:t>
       </w:r>
       <w:bookmarkEnd w:id="12"/>
@@ -8250,10 +8676,20 @@
         </w:rPr>
       </w:pPr>
       <w:bookmarkStart w:id="13" w:name="_Toc228905456"/>
-      <w:r>
-        <w:t>Reproducibility &amp; tooling</w:t>
+      <w:proofErr w:type="spellStart"/>
+      <w:r>
+        <w:t>Reproducibility</w:t>
+      </w:r>
+      <w:proofErr w:type="spellEnd"/>
+      <w:r>
+        <w:t xml:space="preserve"> &amp; </w:t>
+      </w:r>
+      <w:proofErr w:type="spellStart"/>
+      <w:r>
+        <w:t>tooling</w:t>
       </w:r>
       <w:bookmarkEnd w:id="13"/>
+      <w:proofErr w:type="spellEnd"/>
     </w:p>
     <w:p>
       <w:pPr>
@@ -8495,7 +8931,28 @@
         <w:rPr>
           <w:lang w:val="en-GB"/>
         </w:rPr>
-        <w:t>, as the datasets involved are relatively small in size. This is particularly the case for drug-related data, where the number of compounds, especially those tested for metabolism, is limited and does not require large-scale or distributed d</w:t>
+        <w:t xml:space="preserve">, as the datasets involved are relatively </w:t>
+      </w:r>
+      <w:proofErr w:type="gramStart"/>
+      <w:r>
+        <w:rPr>
+          <w:lang w:val="en-GB"/>
+        </w:rPr>
+        <w:t>small in size</w:t>
+      </w:r>
+      <w:proofErr w:type="gramEnd"/>
+      <w:r>
+        <w:rPr>
+          <w:lang w:val="en-GB"/>
+        </w:rPr>
+        <w:t xml:space="preserve">. This is particularly the case for drug-related data, where the number of compounds, especially those tested for metabolism, is limited and does not require large-scale or distributed </w:t>
+      </w:r>
+      <w:proofErr w:type="spellStart"/>
+      <w:r>
+        <w:rPr>
+          <w:lang w:val="en-GB"/>
+        </w:rPr>
+        <w:t>d</w:t>
       </w:r>
       <w:r>
         <w:rPr>
@@ -8503,6 +8960,7 @@
         </w:rPr>
         <w:t>b</w:t>
       </w:r>
+      <w:proofErr w:type="spellEnd"/>
       <w:r>
         <w:rPr>
           <w:lang w:val="en-GB"/>
@@ -8533,7 +8991,21 @@
         <w:rPr>
           <w:lang w:val="en-GB"/>
         </w:rPr>
-        <w:t xml:space="preserve"> the original DrugBank compound dataset, </w:t>
+        <w:t xml:space="preserve"> the original </w:t>
+      </w:r>
+      <w:proofErr w:type="spellStart"/>
+      <w:r>
+        <w:rPr>
+          <w:lang w:val="en-GB"/>
+        </w:rPr>
+        <w:t>DrugBank</w:t>
+      </w:r>
+      <w:proofErr w:type="spellEnd"/>
+      <w:r>
+        <w:rPr>
+          <w:lang w:val="en-GB"/>
+        </w:rPr>
+        <w:t xml:space="preserve"> compound dataset, </w:t>
       </w:r>
       <w:r>
         <w:rPr>
@@ -8541,6 +9013,7 @@
         </w:rPr>
         <w:t xml:space="preserve">a </w:t>
       </w:r>
+      <w:proofErr w:type="spellStart"/>
       <w:r>
         <w:rPr>
           <w:b/>
@@ -8549,6 +9022,7 @@
         </w:rPr>
         <w:t>ChemSpiPy</w:t>
       </w:r>
+      <w:proofErr w:type="spellEnd"/>
       <w:r>
         <w:rPr>
           <w:lang w:val="en-GB"/>
@@ -8559,7 +9033,21 @@
         <w:rPr>
           <w:lang w:val="en-GB"/>
         </w:rPr>
-        <w:t xml:space="preserve">account was created in order to use its </w:t>
+        <w:t xml:space="preserve">account was created </w:t>
+      </w:r>
+      <w:proofErr w:type="gramStart"/>
+      <w:r>
+        <w:rPr>
+          <w:lang w:val="en-GB"/>
+        </w:rPr>
+        <w:t>in order to</w:t>
+      </w:r>
+      <w:proofErr w:type="gramEnd"/>
+      <w:r>
+        <w:rPr>
+          <w:lang w:val="en-GB"/>
+        </w:rPr>
+        <w:t xml:space="preserve"> use its </w:t>
       </w:r>
       <w:r>
         <w:rPr>
@@ -8632,9 +9120,22 @@
       </w:pPr>
       <w:bookmarkStart w:id="15" w:name="_Toc228905458"/>
       <w:r>
-        <w:t>Molecular Representation Strategy</w:t>
+        <w:t xml:space="preserve">Molecular </w:t>
+      </w:r>
+      <w:proofErr w:type="spellStart"/>
+      <w:r>
+        <w:t>Representation</w:t>
+      </w:r>
+      <w:proofErr w:type="spellEnd"/>
+      <w:r>
+        <w:t xml:space="preserve"> </w:t>
+      </w:r>
+      <w:proofErr w:type="spellStart"/>
+      <w:r>
+        <w:t>Strategy</w:t>
       </w:r>
       <w:bookmarkEnd w:id="15"/>
+      <w:proofErr w:type="spellEnd"/>
     </w:p>
     <w:p>
       <w:pPr>
@@ -8697,7 +9198,35 @@
         <w:rPr>
           <w:lang w:val="en-GB"/>
         </w:rPr>
-        <w:t xml:space="preserve"> was further utilized to generate molecular fingerprints. Specifically, the Morgan fingerprint algorithm was applied through RDKit’s FingerprintGenerator API with radius = 3 to convert SMILES-encoded structures into fixed-length numerical vectors. This type of fingerprint is commonly known as an Extended-Connectivity Fingerprint or ECFP6. The number '6' refers to the size of the molecular features it captures; a radius of 3 means it examines an area spanning 6 bonds across (2 x radius), hence the name ECFP6.</w:t>
+        <w:t xml:space="preserve"> was further utilized to generate molecular fingerprints. Specifically, the Morgan fingerprint algorithm was applied through </w:t>
+      </w:r>
+      <w:proofErr w:type="spellStart"/>
+      <w:r>
+        <w:rPr>
+          <w:lang w:val="en-GB"/>
+        </w:rPr>
+        <w:t>RDKit’s</w:t>
+      </w:r>
+      <w:proofErr w:type="spellEnd"/>
+      <w:r>
+        <w:rPr>
+          <w:lang w:val="en-GB"/>
+        </w:rPr>
+        <w:t xml:space="preserve"> </w:t>
+      </w:r>
+      <w:proofErr w:type="spellStart"/>
+      <w:r>
+        <w:rPr>
+          <w:lang w:val="en-GB"/>
+        </w:rPr>
+        <w:t>FingerprintGenerator</w:t>
+      </w:r>
+      <w:proofErr w:type="spellEnd"/>
+      <w:r>
+        <w:rPr>
+          <w:lang w:val="en-GB"/>
+        </w:rPr>
+        <w:t xml:space="preserve"> API with radius = 3 to convert SMILES-encoded structures into fixed-length numerical vectors. This type of fingerprint is commonly known as an Extended-Connectivity Fingerprint or ECFP6. The number '6' refers to the size of the molecular features it captures; a radius of 3 means it examines an area spanning 6 bonds across (2 x radius), hence the name ECFP6.</w:t>
       </w:r>
     </w:p>
     <w:p>
@@ -8755,6 +9284,7 @@
         <w:rPr>
           <w:lang w:val="en-GB"/>
         </w:rPr>
+        <w:lastRenderedPageBreak/>
         <w:t>Formally, the fingerprint transformation can be expressed as:</w:t>
       </w:r>
       <w:r>
@@ -8903,15 +9433,50 @@
         <w:rPr>
           <w:lang w:val="en-GB"/>
         </w:rPr>
-        <w:lastRenderedPageBreak/>
-        <w:t>Although ECFP6 fingerprints are commonly implemented in binary form, they can alternatively be represented in a count-based format, where each feature is encoded as the number of times the corresponding substructure appears in the molecule rather than as a simple presence/absence indicator. This formulation preserves information about substructure multiplicity and therefore provides a more expressive representation, introducing greater variability across molecular vectors. In the context of metabolic prediction, such quantitative information may be particularly relevant, as the frequency of specific functional groups or structural motifs could influence the likelihood of enzymatic interaction. For this reason, a count-based ECFP6 representation was adopted in this work using RDKit’s GetMorganGenerator(radius</w:t>
-      </w:r>
+        <w:t xml:space="preserve">Although ECFP6 fingerprints are commonly implemented in binary form, they can alternatively be represented in a count-based format, where each feature is encoded as the number of times the corresponding substructure appears in the molecule rather than as a simple presence/absence indicator. This formulation preserves information about substructure multiplicity and therefore provides a more expressive representation, introducing greater variability across molecular vectors. In the context of metabolic prediction, such quantitative information may be particularly relevant, as the frequency of specific functional groups or structural motifs could influence the likelihood of enzymatic interaction. For this reason, a count-based ECFP6 representation was adopted in this work using </w:t>
+      </w:r>
+      <w:proofErr w:type="spellStart"/>
+      <w:r>
+        <w:rPr>
+          <w:lang w:val="en-GB"/>
+        </w:rPr>
+        <w:t>RDKit’s</w:t>
+      </w:r>
+      <w:proofErr w:type="spellEnd"/>
       <w:r>
         <w:rPr>
           <w:lang w:val="en-GB"/>
         </w:rPr>
         <w:t xml:space="preserve"> </w:t>
       </w:r>
+      <w:proofErr w:type="spellStart"/>
+      <w:proofErr w:type="gramStart"/>
+      <w:r>
+        <w:rPr>
+          <w:lang w:val="en-GB"/>
+        </w:rPr>
+        <w:t>GetMorganGenerator</w:t>
+      </w:r>
+      <w:proofErr w:type="spellEnd"/>
+      <w:r>
+        <w:rPr>
+          <w:lang w:val="en-GB"/>
+        </w:rPr>
+        <w:t>(</w:t>
+      </w:r>
+      <w:proofErr w:type="gramEnd"/>
+      <w:r>
+        <w:rPr>
+          <w:lang w:val="en-GB"/>
+        </w:rPr>
+        <w:t>radius</w:t>
+      </w:r>
+      <w:r>
+        <w:rPr>
+          <w:lang w:val="en-GB"/>
+        </w:rPr>
+        <w:t xml:space="preserve"> </w:t>
+      </w:r>
       <w:r>
         <w:rPr>
           <w:lang w:val="en-GB"/>
@@ -8928,8 +9493,16 @@
         <w:rPr>
           <w:lang w:val="en-GB"/>
         </w:rPr>
-        <w:t>3, fpSize</w:t>
-      </w:r>
+        <w:t xml:space="preserve">3, </w:t>
+      </w:r>
+      <w:proofErr w:type="spellStart"/>
+      <w:r>
+        <w:rPr>
+          <w:lang w:val="en-GB"/>
+        </w:rPr>
+        <w:t>fpSize</w:t>
+      </w:r>
+      <w:proofErr w:type="spellEnd"/>
       <w:r>
         <w:rPr>
           <w:lang w:val="en-GB"/>
@@ -8952,7 +9525,21 @@
         <w:rPr>
           <w:lang w:val="en-GB"/>
         </w:rPr>
-        <w:t>2048).GetCountFingerprint() implementation.</w:t>
+        <w:t>2048</w:t>
+      </w:r>
+      <w:proofErr w:type="gramStart"/>
+      <w:r>
+        <w:rPr>
+          <w:lang w:val="en-GB"/>
+        </w:rPr>
+        <w:t>).GetCountFingerprint</w:t>
+      </w:r>
+      <w:proofErr w:type="gramEnd"/>
+      <w:r>
+        <w:rPr>
+          <w:lang w:val="en-GB"/>
+        </w:rPr>
+        <w:t>() implementation.</w:t>
       </w:r>
     </w:p>
     <w:p>
@@ -8966,7 +9553,19 @@
         <w:rPr>
           <w:lang w:val="en-GB"/>
         </w:rPr>
-        <w:t>Beyond traditional handcrafted fingerprints, recent advances in molecular machine learning have introduced embedding-based representations, in which molecules are mapped to continuous latent vectors learned from large chemical corpora.</w:t>
+        <w:t xml:space="preserve">Beyond traditional handcrafted fingerprints, recent advances in molecular </w:t>
+      </w:r>
+      <w:r>
+        <w:rPr>
+          <w:lang w:val="en-GB"/>
+        </w:rPr>
+        <w:t xml:space="preserve">ML </w:t>
+      </w:r>
+      <w:r>
+        <w:rPr>
+          <w:lang w:val="en-GB"/>
+        </w:rPr>
+        <w:t>have introduced embedding-based representations, in which molecules are mapped to continuous latent vectors learned from large chemical corpora.</w:t>
       </w:r>
       <w:r>
         <w:rPr>
@@ -9016,7 +9615,21 @@
         <w:rPr>
           <w:lang w:val="en-GB"/>
         </w:rPr>
-        <w:t xml:space="preserve">However, the effectiveness of these embeddings depends heavily on data scale. In small to medium-sized datasets, such as the DrugBank-derived corpus used </w:t>
+        <w:t xml:space="preserve">However, the effectiveness of these embeddings depends heavily on data scale. In small to medium-sized datasets, such as the </w:t>
+      </w:r>
+      <w:proofErr w:type="spellStart"/>
+      <w:r>
+        <w:rPr>
+          <w:lang w:val="en-GB"/>
+        </w:rPr>
+        <w:t>DrugBank</w:t>
+      </w:r>
+      <w:proofErr w:type="spellEnd"/>
+      <w:r>
+        <w:rPr>
+          <w:lang w:val="en-GB"/>
+        </w:rPr>
+        <w:t xml:space="preserve">-derived corpus used </w:t>
       </w:r>
       <w:r>
         <w:rPr>
@@ -9372,6 +9985,7 @@
         </w:rPr>
         <w:t xml:space="preserve">where </w:t>
       </w:r>
+      <w:proofErr w:type="spellStart"/>
       <w:r>
         <w:rPr>
           <w:rStyle w:val="katex-mathml"/>
@@ -9387,6 +10001,7 @@
         </w:rPr>
         <w:t>i</w:t>
       </w:r>
+      <w:proofErr w:type="spellEnd"/>
       <w:r>
         <w:rPr>
           <w:rStyle w:val="katex-mathml"/>
@@ -9400,6 +10015,7 @@
         </w:rPr>
         <w:t xml:space="preserve">are tokens in the SMILES and </w:t>
       </w:r>
+      <w:proofErr w:type="gramStart"/>
       <w:r>
         <w:rPr>
           <w:rStyle w:val="katex-mathml"/>
@@ -9407,6 +10023,7 @@
         </w:rPr>
         <w:t>e(</w:t>
       </w:r>
+      <w:proofErr w:type="gramEnd"/>
       <w:r>
         <w:rPr>
           <w:rStyle w:val="katex-mathml"/>
@@ -10726,7 +11343,21 @@
         <w:rPr>
           <w:lang w:val="en-GB"/>
         </w:rPr>
-        <w:t>. Given the relatively small size of the curated DrugBank dataset (~1.3k compounds), it is unlikely that a self-trained embedder would systematically outperform established fingerprints or large-scale pretrained models.</w:t>
+        <w:t xml:space="preserve">. Given the relatively small size of the curated </w:t>
+      </w:r>
+      <w:proofErr w:type="spellStart"/>
+      <w:r>
+        <w:rPr>
+          <w:lang w:val="en-GB"/>
+        </w:rPr>
+        <w:t>DrugBank</w:t>
+      </w:r>
+      <w:proofErr w:type="spellEnd"/>
+      <w:r>
+        <w:rPr>
+          <w:lang w:val="en-GB"/>
+        </w:rPr>
+        <w:t xml:space="preserve"> dataset (~1.3k compounds), it is unlikely that a self-trained embedder would systematically outperform established fingerprints or large-scale pretrained models.</w:t>
       </w:r>
       <w:r>
         <w:rPr>
@@ -11614,19 +12245,33 @@
         <w:rPr>
           <w:color w:val="EE0000"/>
         </w:rPr>
-        <w:t>Predictive Mode</w:t>
-      </w:r>
+        <w:t xml:space="preserve">Predictive </w:t>
+      </w:r>
+      <w:proofErr w:type="spellStart"/>
       <w:r>
         <w:rPr>
           <w:color w:val="EE0000"/>
         </w:rPr>
+        <w:t>Mode</w:t>
+      </w:r>
+      <w:r>
+        <w:rPr>
+          <w:color w:val="EE0000"/>
+        </w:rPr>
         <w:t>l</w:t>
       </w:r>
       <w:r>
         <w:rPr>
           <w:color w:val="EE0000"/>
         </w:rPr>
-        <w:t>ling Framework</w:t>
+        <w:t>ling</w:t>
+      </w:r>
+      <w:proofErr w:type="spellEnd"/>
+      <w:r>
+        <w:rPr>
+          <w:color w:val="EE0000"/>
+        </w:rPr>
+        <w:t xml:space="preserve"> Framework</w:t>
       </w:r>
       <w:bookmarkEnd w:id="22"/>
     </w:p>
@@ -11849,7 +12494,13 @@
         <w:rPr>
           <w:lang w:val="en-GB"/>
         </w:rPr>
-        <w:t xml:space="preserve">From a machine learning </w:t>
+        <w:t xml:space="preserve">From a </w:t>
+      </w:r>
+      <w:r>
+        <w:rPr>
+          <w:lang w:val="en-GB"/>
+        </w:rPr>
+        <w:t xml:space="preserve">ML </w:t>
       </w:r>
       <w:r>
         <w:rPr>
@@ -11861,7 +12512,21 @@
         <w:rPr>
           <w:lang w:val="en-GB"/>
         </w:rPr>
-        <w:t xml:space="preserve"> a key challenge arises: </w:t>
+        <w:t xml:space="preserve"> a key challenge </w:t>
+      </w:r>
+      <w:proofErr w:type="gramStart"/>
+      <w:r>
+        <w:rPr>
+          <w:lang w:val="en-GB"/>
+        </w:rPr>
+        <w:t>arises:</w:t>
+      </w:r>
+      <w:proofErr w:type="gramEnd"/>
+      <w:r>
+        <w:rPr>
+          <w:lang w:val="en-GB"/>
+        </w:rPr>
+        <w:t xml:space="preserve"> </w:t>
       </w:r>
       <w:r>
         <w:rPr>
@@ -12228,7 +12893,19 @@
         <w:rPr>
           <w:lang w:val="en-GB"/>
         </w:rPr>
-        <w:t>To evaluate the predictive value of the different molecular representations, several machine learning algorithms with progressively increasing modelling capacity were selected and assessed under the same validation framework. Rather than focusing on a single architecture, this benchmark was designed to compare how different classes of predictive models interact with fingerprint-based and embedding-based representations in the context of CYP450 metabolism prediction. The evaluated approaches range from a naïve majority baseline to linear and nonlinear ensemble methods, allowing both representation quality and model complexity to be analysed in a controlled and reproducible manner.</w:t>
+        <w:t xml:space="preserve">To evaluate the predictive value of the different molecular representations, several </w:t>
+      </w:r>
+      <w:r>
+        <w:rPr>
+          <w:lang w:val="en-GB"/>
+        </w:rPr>
+        <w:t>ML</w:t>
+      </w:r>
+      <w:r>
+        <w:rPr>
+          <w:lang w:val="en-GB"/>
+        </w:rPr>
+        <w:t xml:space="preserve"> algorithms with progressively increasing modelling capacity were selected and assessed under the same validation framework. Rather than focusing on a single architecture, this benchmark was designed to compare how different classes of predictive models interact with fingerprint-based and embedding-based representations in the context of CYP450 metabolism prediction. The evaluated approaches range from a naïve majority baseline to linear and nonlinear ensemble methods, allowing both representation quality and model complexity to be analysed in a controlled and reproducible manner.</w:t>
       </w:r>
     </w:p>
     <w:p>
@@ -13090,7 +13767,19 @@
         <w:rPr>
           <w:lang w:val="en-GB"/>
         </w:rPr>
-        <w:t xml:space="preserve">be more prone to overfitting than some alternative machine learning approaches, particularly when applied to high-dimensional molecular descriptors. </w:t>
+        <w:t xml:space="preserve">be more prone to overfitting than some alternative </w:t>
+      </w:r>
+      <w:r>
+        <w:rPr>
+          <w:lang w:val="en-GB"/>
+        </w:rPr>
+        <w:t xml:space="preserve">ML </w:t>
+      </w:r>
+      <w:r>
+        <w:rPr>
+          <w:lang w:val="en-GB"/>
+        </w:rPr>
+        <w:t xml:space="preserve">approaches, particularly when applied to high-dimensional molecular descriptors. </w:t>
       </w:r>
       <w:sdt>
         <w:sdtPr>
@@ -13171,12 +13860,21 @@
         </w:rPr>
         <w:t xml:space="preserve">To address class imbalance, all models used the parameter </w:t>
       </w:r>
+      <w:proofErr w:type="spellStart"/>
       <w:r>
         <w:rPr>
           <w:rFonts w:ascii="Courier New" w:hAnsi="Courier New" w:cs="Courier New"/>
           <w:lang w:val="en-GB"/>
         </w:rPr>
-        <w:t>class_weight="balanced",</w:t>
+        <w:t>class_weight</w:t>
+      </w:r>
+      <w:proofErr w:type="spellEnd"/>
+      <w:r>
+        <w:rPr>
+          <w:rFonts w:ascii="Courier New" w:hAnsi="Courier New" w:cs="Courier New"/>
+          <w:lang w:val="en-GB"/>
+        </w:rPr>
+        <w:t>="balanced",</w:t>
       </w:r>
       <w:r>
         <w:rPr>
@@ -14191,17 +14889,285 @@
     </w:p>
     <w:p>
       <w:pPr>
+        <w:keepNext/>
         <w:jc w:val="both"/>
-        <w:rPr>
-          <w:lang w:val="en-GB"/>
-        </w:rPr>
-      </w:pPr>
-      <w:r>
-        <w:rPr>
+      </w:pPr>
+      <w:r>
+        <w:rPr>
+          <w:noProof/>
           <w:color w:val="EE0000"/>
           <w:lang w:val="en-GB"/>
         </w:rPr>
-        <w:t>[Figure X: Schematic representation of a Random Forest classifier showing bootstrap sampling, construction of multiple decision trees, and aggregation of predictions into a final probability estimate.]</w:t>
+        <w:drawing>
+          <wp:inline distT="0" distB="0" distL="0" distR="0" wp14:anchorId="685FBEDB" wp14:editId="1BF662CE">
+            <wp:extent cx="5669915" cy="3291205"/>
+            <wp:effectExtent l="0" t="0" r="6985" b="4445"/>
+            <wp:docPr id="155898776" name="Picture 1"/>
+            <wp:cNvGraphicFramePr>
+              <a:graphicFrameLocks xmlns:a="http://schemas.openxmlformats.org/drawingml/2006/main" noChangeAspect="1"/>
+            </wp:cNvGraphicFramePr>
+            <a:graphic xmlns:a="http://schemas.openxmlformats.org/drawingml/2006/main">
+              <a:graphicData uri="http://schemas.openxmlformats.org/drawingml/2006/picture">
+                <pic:pic xmlns:pic="http://schemas.openxmlformats.org/drawingml/2006/picture">
+                  <pic:nvPicPr>
+                    <pic:cNvPr id="155898776" name=""/>
+                    <pic:cNvPicPr/>
+                  </pic:nvPicPr>
+                  <pic:blipFill>
+                    <a:blip r:embed="rId20"/>
+                    <a:stretch>
+                      <a:fillRect/>
+                    </a:stretch>
+                  </pic:blipFill>
+                  <pic:spPr>
+                    <a:xfrm>
+                      <a:off x="0" y="0"/>
+                      <a:ext cx="5669915" cy="3291205"/>
+                    </a:xfrm>
+                    <a:prstGeom prst="rect">
+                      <a:avLst/>
+                    </a:prstGeom>
+                  </pic:spPr>
+                </pic:pic>
+              </a:graphicData>
+            </a:graphic>
+          </wp:inline>
+        </w:drawing>
+      </w:r>
+    </w:p>
+    <w:p>
+      <w:pPr>
+        <w:pStyle w:val="Caption"/>
+        <w:jc w:val="both"/>
+        <w:rPr>
+          <w:lang w:val="en-GB"/>
+        </w:rPr>
+      </w:pPr>
+      <w:r>
+        <w:rPr>
+          <w:lang w:val="en-GB"/>
+        </w:rPr>
+        <w:t xml:space="preserve">Figure </w:t>
+      </w:r>
+      <w:r>
+        <w:fldChar w:fldCharType="begin"/>
+      </w:r>
+      <w:r>
+        <w:rPr>
+          <w:lang w:val="en-GB"/>
+        </w:rPr>
+        <w:instrText xml:space="preserve"> SEQ Figure \* ARABIC </w:instrText>
+      </w:r>
+      <w:r>
+        <w:fldChar w:fldCharType="separate"/>
+      </w:r>
+      <w:r>
+        <w:rPr>
+          <w:noProof/>
+          <w:lang w:val="en-GB"/>
+        </w:rPr>
+        <w:t>3</w:t>
+      </w:r>
+      <w:r>
+        <w:rPr>
+          <w:noProof/>
+        </w:rPr>
+        <w:fldChar w:fldCharType="end"/>
+      </w:r>
+      <w:r>
+        <w:rPr>
+          <w:lang w:val="en-GB"/>
+        </w:rPr>
+        <w:t xml:space="preserve"> </w:t>
+      </w:r>
+      <w:r>
+        <w:rPr>
+          <w:lang w:val="en-GB"/>
+        </w:rPr>
+        <w:t xml:space="preserve">Schematic representation of the </w:t>
+      </w:r>
+      <w:r>
+        <w:rPr>
+          <w:lang w:val="en-GB"/>
+        </w:rPr>
+        <w:t>RF</w:t>
+      </w:r>
+      <w:r>
+        <w:rPr>
+          <w:lang w:val="en-GB"/>
+        </w:rPr>
+        <w:t xml:space="preserve"> classification process.</w:t>
+      </w:r>
+      <w:r>
+        <w:rPr>
+          <w:lang w:val="en-GB"/>
+        </w:rPr>
+        <w:t xml:space="preserve"> *</w:t>
+      </w:r>
+      <w:r>
+        <w:rPr>
+          <w:lang w:val="en-GB"/>
+        </w:rPr>
+        <w:t>Threshold optimised during cross</w:t>
+      </w:r>
+      <w:r>
+        <w:rPr>
+          <w:rFonts w:ascii="Cambria Math" w:hAnsi="Cambria Math" w:cs="Cambria Math"/>
+          <w:lang w:val="en-GB"/>
+        </w:rPr>
+        <w:t>-</w:t>
+      </w:r>
+      <w:r>
+        <w:rPr>
+          <w:lang w:val="en-GB"/>
+        </w:rPr>
+        <w:t>validation per CYP</w:t>
+      </w:r>
+      <w:r>
+        <w:rPr>
+          <w:lang w:val="en-GB"/>
+        </w:rPr>
+        <w:t>.</w:t>
+      </w:r>
+    </w:p>
+    <w:p>
+      <w:pPr>
+        <w:pStyle w:val="Caption"/>
+        <w:jc w:val="both"/>
+        <w:rPr>
+          <w:lang w:val="en-GB"/>
+        </w:rPr>
+      </w:pPr>
+      <w:r>
+        <w:rPr>
+          <w:lang w:val="en-GB"/>
+        </w:rPr>
+        <w:t xml:space="preserve">(A) Starting from the training dataset composed of </w:t>
+      </w:r>
+      <w:r>
+        <w:rPr>
+          <w:rFonts w:ascii="Cambria Math" w:hAnsi="Cambria Math"/>
+          <w:lang w:val="en-GB"/>
+        </w:rPr>
+        <w:t>n</w:t>
+      </w:r>
+      <w:r>
+        <w:rPr>
+          <w:lang w:val="en-GB"/>
+        </w:rPr>
+        <w:t xml:space="preserve"> molecules and </w:t>
+      </w:r>
+      <w:r>
+        <w:rPr>
+          <w:rFonts w:ascii="Cambria Math" w:hAnsi="Cambria Math"/>
+          <w:lang w:val="en-GB"/>
+        </w:rPr>
+        <w:t>p</w:t>
+      </w:r>
+      <w:r>
+        <w:rPr>
+          <w:lang w:val="en-GB"/>
+        </w:rPr>
+        <w:t xml:space="preserve"> molecular features, bootstrap samples are generated by randomly selecting molecules with replacement. During tree construction, random subsets of features are considered at each split, increasing diversity among trees. </w:t>
+      </w:r>
+      <w:r>
+        <w:rPr>
+          <w:lang w:val="en-GB"/>
+        </w:rPr>
+        <w:t>Coloured</w:t>
+      </w:r>
+      <w:r>
+        <w:rPr>
+          <w:lang w:val="en-GB"/>
+        </w:rPr>
+        <w:t xml:space="preserve"> circles illustrate repeated sampling of molecules into different bootstrap datasets.</w:t>
+      </w:r>
+    </w:p>
+    <w:p>
+      <w:pPr>
+        <w:pStyle w:val="Caption"/>
+        <w:jc w:val="both"/>
+        <w:rPr>
+          <w:lang w:val="en-GB"/>
+        </w:rPr>
+      </w:pPr>
+      <w:r>
+        <w:rPr>
+          <w:lang w:val="en-GB"/>
+        </w:rPr>
+        <w:t>(B) Multiple</w:t>
+      </w:r>
+      <w:r>
+        <w:rPr>
+          <w:lang w:val="en-GB"/>
+        </w:rPr>
+        <w:t xml:space="preserve"> </w:t>
+      </w:r>
+      <w:r>
+        <w:rPr>
+          <w:lang w:val="en-GB"/>
+        </w:rPr>
+        <w:t>decision trees are grown independently from the bootstrapped datasets. Each tree partitions the molecular feature space through a series of decision nodes based on different subsets of molecular descriptors, producing individual predictions for the target CYP isoform. Only three representative trees are shown for clarity, although the final model consists of a larger ensemble (K trees).</w:t>
+      </w:r>
+    </w:p>
+    <w:p>
+      <w:pPr>
+        <w:pStyle w:val="Caption"/>
+        <w:jc w:val="both"/>
+        <w:rPr>
+          <w:lang w:val="en-GB"/>
+        </w:rPr>
+      </w:pPr>
+      <w:r>
+        <w:rPr>
+          <w:lang w:val="en-GB"/>
+        </w:rPr>
+        <w:t xml:space="preserve">(C) For an unseen molecule </w:t>
+      </w:r>
+      <w:proofErr w:type="spellStart"/>
+      <w:r>
+        <w:rPr>
+          <w:b/>
+          <w:bCs/>
+          <w:lang w:val="en-GB"/>
+        </w:rPr>
+        <w:t>X</w:t>
+      </w:r>
+      <w:r>
+        <w:rPr>
+          <w:b/>
+          <w:bCs/>
+          <w:vertAlign w:val="subscript"/>
+          <w:lang w:val="en-GB"/>
+        </w:rPr>
+        <w:t>new</w:t>
+      </w:r>
+      <w:proofErr w:type="spellEnd"/>
+      <w:r>
+        <w:rPr>
+          <w:lang w:val="en-GB"/>
+        </w:rPr>
+        <w:t xml:space="preserve">, predictions from all trees are aggregated to obtain a final class probability </w:t>
+      </w:r>
+      <w:r>
+        <w:rPr>
+          <w:rFonts w:ascii="Cambria Math" w:hAnsi="Cambria Math"/>
+          <w:lang w:val="en-GB"/>
+        </w:rPr>
+        <w:t>P</w:t>
+      </w:r>
+      <w:r>
+        <w:rPr>
+          <w:lang w:val="en-GB"/>
+        </w:rPr>
+        <w:t xml:space="preserve">. The probability corresponds to the proportion of trees predicting the positive class and is subsequently compared against a </w:t>
+      </w:r>
+      <w:r>
+        <w:rPr>
+          <w:lang w:val="en-GB"/>
+        </w:rPr>
+        <w:lastRenderedPageBreak/>
+        <w:t>predefined decision threshold to determine whether the molecule is predicted to be metabolized by the CYP isoform under consideration.</w:t>
       </w:r>
     </w:p>
     <w:p>
@@ -14339,12 +15305,21 @@
         </w:rPr>
         <w:t xml:space="preserve"> classifier was trained for each CYP isoform, allowing each enzyme to learn its own class distribution and decision boundaries independently. All models were trained and evaluated using the same fixed train/test partition and the same cross-validation folds employed throughout the benchmark. To account for class imbalance, the parameter </w:t>
       </w:r>
+      <w:proofErr w:type="spellStart"/>
       <w:r>
         <w:rPr>
           <w:rFonts w:ascii="Courier New" w:hAnsi="Courier New" w:cs="Courier New"/>
           <w:lang w:val="en-GB"/>
         </w:rPr>
-        <w:t>class_weight="balanced"</w:t>
+        <w:t>class_weight</w:t>
+      </w:r>
+      <w:proofErr w:type="spellEnd"/>
+      <w:r>
+        <w:rPr>
+          <w:rFonts w:ascii="Courier New" w:hAnsi="Courier New" w:cs="Courier New"/>
+          <w:lang w:val="en-GB"/>
+        </w:rPr>
+        <w:t>="balanced"</w:t>
       </w:r>
       <w:r>
         <w:rPr>
@@ -14569,7 +15544,6 @@
                 <w:sz w:val="22"/>
                 <w:lang w:val="en-GB"/>
               </w:rPr>
-              <w:lastRenderedPageBreak/>
               <w:t>Hyperparameter</w:t>
             </w:r>
           </w:p>
@@ -14653,6 +15627,7 @@
                 <w:lang w:val="en-GB"/>
               </w:rPr>
             </w:pPr>
+            <w:proofErr w:type="spellStart"/>
             <w:r>
               <w:rPr>
                 <w:rFonts w:asciiTheme="minorHAnsi" w:eastAsiaTheme="minorEastAsia" w:hAnsiTheme="minorHAnsi" w:cstheme="minorBidi"/>
@@ -14661,6 +15636,7 @@
               </w:rPr>
               <w:t>n_estimators</w:t>
             </w:r>
+            <w:proofErr w:type="spellEnd"/>
           </w:p>
         </w:tc>
         <w:tc>
@@ -14961,8 +15937,16 @@
         <w:rPr>
           <w:lang w:val="en-GB"/>
         </w:rPr>
-        <w:t xml:space="preserve">The selected search space was designed to balance model flexibility and computational cost while reducing the risk of excessive overfitting. The number of trees was limited to values commonly reported in molecular property prediction studies, where performance gains tend to plateau beyond a few hundred trees while computational requirements continue to increase. Tree depth was restricted to moderate values rather than allowing unrestricted growth, as very deep trees can memorize training observations and are particularly susceptible to overfitting in smaller datasets and less frequent CYP classes. Similarly, the </w:t>
-      </w:r>
+        <w:t xml:space="preserve">The selected search space was designed to balance model flexibility and computational cost while reducing the risk of excessive overfitting. The number of trees was limited to values commonly reported in molecular property prediction studies, where performance gains tend to plateau beyond a few hundred trees while computational requirements continue to increase. Tree depth was restricted to moderate values rather than allowing unrestricted growth, as very deep trees can memorize training observations and are particularly susceptible to overfitting in smaller datasets and </w:t>
+      </w:r>
+      <w:r>
+        <w:rPr>
+          <w:lang w:val="en-GB"/>
+        </w:rPr>
+        <w:lastRenderedPageBreak/>
+        <w:t xml:space="preserve">less frequent CYP classes. Similarly, the </w:t>
+      </w:r>
+      <w:proofErr w:type="spellStart"/>
       <w:r>
         <w:rPr>
           <w:i/>
@@ -14971,6 +15955,7 @@
         </w:rPr>
         <w:t>min_samples_split</w:t>
       </w:r>
+      <w:proofErr w:type="spellEnd"/>
       <w:r>
         <w:rPr>
           <w:lang w:val="en-GB"/>
@@ -14991,6 +15976,7 @@
         </w:rPr>
         <w:t xml:space="preserve">The </w:t>
       </w:r>
+      <w:proofErr w:type="spellStart"/>
       <w:r>
         <w:rPr>
           <w:i/>
@@ -14999,6 +15985,7 @@
         </w:rPr>
         <w:t>max_features</w:t>
       </w:r>
+      <w:proofErr w:type="spellEnd"/>
       <w:r>
         <w:rPr>
           <w:lang w:val="en-GB"/>
@@ -15044,7 +16031,19 @@
         <w:rPr>
           <w:lang w:val="en-GB"/>
         </w:rPr>
-        <w:t xml:space="preserve">XGBoost was selected as the primary machine learning algorithm for this benchmark due to its strong performance on structured data and its widespread adoption in cheminformatics and bioinformatics applications. </w:t>
+        <w:t xml:space="preserve">XGBoost was selected as the primary </w:t>
+      </w:r>
+      <w:r>
+        <w:rPr>
+          <w:lang w:val="en-GB"/>
+        </w:rPr>
+        <w:t xml:space="preserve">ML </w:t>
+      </w:r>
+      <w:r>
+        <w:rPr>
+          <w:lang w:val="en-GB"/>
+        </w:rPr>
+        <w:t xml:space="preserve">algorithm for this benchmark due to its strong performance on structured data and its widespread adoption in cheminformatics and bioinformatics applications. </w:t>
       </w:r>
       <w:sdt>
         <w:sdtPr>
@@ -15428,7 +16427,6 @@
         <w:rPr>
           <w:lang w:val="en-GB"/>
         </w:rPr>
-        <w:lastRenderedPageBreak/>
         <w:t xml:space="preserve">where </w:t>
       </w:r>
       <m:oMath>
@@ -15653,7 +16651,13 @@
         <w:rPr>
           <w:lang w:val="en-GB"/>
         </w:rPr>
-        <w:t xml:space="preserve">self-made </w:t>
+        <w:t>author</w:t>
+      </w:r>
+      <w:r>
+        <w:rPr>
+          <w:lang w:val="en-GB"/>
+        </w:rPr>
+        <w:t xml:space="preserve">-made </w:t>
       </w:r>
       <w:r>
         <w:rPr>
@@ -15771,6 +16775,7 @@
         <w:rPr>
           <w:lang w:val="en-GB"/>
         </w:rPr>
+        <w:lastRenderedPageBreak/>
         <w:t xml:space="preserve">To address class imbalance, the parameter </w:t>
       </w:r>
       <w:r>
@@ -15917,13 +16922,7 @@
         <w:rPr>
           <w:lang w:val="en-GB"/>
         </w:rPr>
-        <w:t>Model selection was performed through a grid search procedure comparable to those used for the other algorithms, over a restricted set of hyperparameters chosen to balance model flexibility and generalization. The explored search space is summarized in</w:t>
-      </w:r>
-      <w:r>
-        <w:rPr>
-          <w:lang w:val="en-GB"/>
-        </w:rPr>
-        <w:t xml:space="preserve"> </w:t>
+        <w:t xml:space="preserve">Model selection was performed through a grid search procedure comparable to those used for the other algorithms, over a restricted set of hyperparameters chosen to balance model flexibility and generalization. The explored search space is summarized in </w:t>
       </w:r>
       <w:r>
         <w:rPr>
@@ -16490,14 +17489,7 @@
         <w:rPr>
           <w:lang w:val="en-GB"/>
         </w:rPr>
-        <w:t xml:space="preserve">The selected ranges were intentionally conservative given the relatively limited size of the dataset. Very deep trees can memorize training examples and lead to unstable models, particularly for the less frequent CYP isoforms. For this reason, tree depth was restricted to a maximum of nine levels. Similarly, learning rates below 0.05 were not explored because they typically require substantially larger numbers of trees to achieve comparable performance, increasing both computational cost and </w:t>
-      </w:r>
-      <w:r>
-        <w:rPr>
-          <w:lang w:val="en-GB"/>
-        </w:rPr>
-        <w:lastRenderedPageBreak/>
-        <w:t>the risk of fitting noise in small datasets. The chosen search space therefore reflects a compromise between model expressiveness and robustness.</w:t>
+        <w:t>The selected ranges were intentionally conservative given the relatively limited size of the dataset. Very deep trees can memorize training examples and lead to unstable models, particularly for the less frequent CYP isoforms. For this reason, tree depth was restricted to a maximum of nine levels. Similarly, learning rates below 0.05 were not explored because they typically require substantially larger numbers of trees to achieve comparable performance, increasing both computational cost and the risk of fitting noise in small datasets. The chosen search space therefore reflects a compromise between model expressiveness and robustness.</w:t>
       </w:r>
     </w:p>
     <w:p>
@@ -16635,7 +17627,14 @@
         <w:rPr>
           <w:lang w:val="en-GB"/>
         </w:rPr>
-        <w:t>metabolism relationships that are not captured by individual trees alone. Nevertheless, boosting methods are also known to be more sensitive to hyperparameter selection and can overfit small datasets if model complexity is not appropriately constrained. The restricted search space and cross-validation strategy adopted in this work were therefore intended to balance predictive performance with generalization ability.</w:t>
+        <w:t xml:space="preserve">metabolism relationships that are not </w:t>
+      </w:r>
+      <w:r>
+        <w:rPr>
+          <w:lang w:val="en-GB"/>
+        </w:rPr>
+        <w:lastRenderedPageBreak/>
+        <w:t>captured by individual trees alone. Nevertheless, boosting methods are also known to be more sensitive to hyperparameter selection and can overfit small datasets if model complexity is not appropriately constrained. The restricted search space and cross-validation strategy adopted in this work were therefore intended to balance predictive performance with generalization ability.</w:t>
       </w:r>
     </w:p>
     <w:p>
@@ -16721,8 +17720,16 @@
         <w:rPr>
           <w:lang w:val="en-GB"/>
         </w:rPr>
-        <w:t>failing to predict that a compound interacts with a CYP enzyme when it actually does</w:t>
-      </w:r>
+        <w:t xml:space="preserve">failing to predict that a compound interacts with a CYP enzyme when it </w:t>
+      </w:r>
+      <w:proofErr w:type="gramStart"/>
+      <w:r>
+        <w:rPr>
+          <w:lang w:val="en-GB"/>
+        </w:rPr>
+        <w:t>actually does</w:t>
+      </w:r>
+      <w:proofErr w:type="gramEnd"/>
       <w:r>
         <w:rPr>
           <w:lang w:val="en-GB"/>
@@ -16825,14 +17832,7 @@
         <w:rPr>
           <w:lang w:val="en-GB"/>
         </w:rPr>
-        <w:t xml:space="preserve">Consequently, accuracy would be dangerously misleading in this domain. A predictor that always returns negative would achieve high accuracy on rare CYPs simply because positive cases are so few, yet such a predictor would be useless in practice. For these reasons, a suite of more complete and appropriate metrics </w:t>
-      </w:r>
-      <w:r>
-        <w:rPr>
-          <w:lang w:val="en-GB"/>
-        </w:rPr>
-        <w:lastRenderedPageBreak/>
-        <w:t>was selected to evaluate model performance and enable meaningful comparability across representations.</w:t>
+        <w:t>Consequently, accuracy would be dangerously misleading in this domain. A predictor that always returns negative would achieve high accuracy on rare CYPs simply because positive cases are so few, yet such a predictor would be useless in practice. For these reasons, a suite of more complete and appropriate metrics was selected to evaluate model performance and enable meaningful comparability across representations.</w:t>
       </w:r>
     </w:p>
     <w:p>
@@ -16885,7 +17885,21 @@
         <w:rPr>
           <w:lang w:val="en-GB"/>
         </w:rPr>
-        <w:t xml:space="preserve"> measures the quality of binary classifications by taking into account all four entries of the confusion matrix: true positives (TP), true negatives (TN), FP and FN. For a single CYP isoform, MCC is defined as</w:t>
+        <w:t xml:space="preserve"> measures the quality of binary classifications by </w:t>
+      </w:r>
+      <w:proofErr w:type="gramStart"/>
+      <w:r>
+        <w:rPr>
+          <w:lang w:val="en-GB"/>
+        </w:rPr>
+        <w:t>taking into account</w:t>
+      </w:r>
+      <w:proofErr w:type="gramEnd"/>
+      <w:r>
+        <w:rPr>
+          <w:lang w:val="en-GB"/>
+        </w:rPr>
+        <w:t xml:space="preserve"> all four entries of the confusion matrix: true positives (TP), true negatives (TN), FP and FN. For a single CYP isoform, MCC is defined as</w:t>
       </w:r>
     </w:p>
     <w:p>
@@ -17097,7 +18111,14 @@
         <w:rPr>
           <w:lang w:val="en-GB"/>
         </w:rPr>
-        <w:t xml:space="preserve"> MCC serves as the primary metric for two critical tasks: comparing molecular representations (ECFP6, MolE, ChemBERTa, and the exploratory InChI encoder) and selecting hyperparameters. During cross</w:t>
+        <w:t xml:space="preserve"> MCC serves as the primary metric for two critical tasks: </w:t>
+      </w:r>
+      <w:r>
+        <w:rPr>
+          <w:lang w:val="en-GB"/>
+        </w:rPr>
+        <w:lastRenderedPageBreak/>
+        <w:t>comparing molecular representations (ECFP6, MolE, ChemBERTa, and the exploratory InChI encoder) and selecting hyperparameters. During cross</w:t>
       </w:r>
       <w:r>
         <w:rPr>
@@ -17844,14 +18865,7 @@
         <w:rPr>
           <w:lang w:val="en-GB"/>
         </w:rPr>
-        <w:t xml:space="preserve"> ranges from 0 (perfect) to 1 (completely wrong) and is straightforward to interpret. It is included as </w:t>
-      </w:r>
-      <w:r>
-        <w:rPr>
-          <w:lang w:val="en-GB"/>
-        </w:rPr>
-        <w:lastRenderedPageBreak/>
-        <w:t>an informative metric only, providing a high</w:t>
+        <w:t xml:space="preserve"> ranges from 0 (perfect) to 1 (completely wrong) and is straightforward to interpret. It is included as an informative metric only, providing a high</w:t>
       </w:r>
       <w:r>
         <w:rPr>
@@ -17996,6 +19010,7 @@
         <w:rPr>
           <w:lang w:val="en-GB"/>
         </w:rPr>
+        <w:lastRenderedPageBreak/>
         <w:t>Behaviour Under Extreme Imbalance</w:t>
       </w:r>
     </w:p>
@@ -18220,14 +19235,7 @@
         <w:rPr>
           <w:lang w:val="en-GB"/>
         </w:rPr>
-        <w:t xml:space="preserve"> is performed using the same development set splits across all hyperparameter configurations to ensure comparability. The selected hyperparameters are then used to retrain a final model on the </w:t>
-      </w:r>
-      <w:r>
-        <w:rPr>
-          <w:lang w:val="en-GB"/>
-        </w:rPr>
-        <w:lastRenderedPageBreak/>
-        <w:t xml:space="preserve">full development set, from scratch and without any memory of the </w:t>
+        <w:t xml:space="preserve"> is performed using the same development set splits across all hyperparameter configurations to ensure comparability. The selected hyperparameters are then used to retrain a final model on the full development set, from scratch and without any memory of the </w:t>
       </w:r>
       <w:r>
         <w:rPr>
@@ -18265,7 +19273,21 @@
         <w:rPr>
           <w:lang w:val="en-GB"/>
         </w:rPr>
-        <w:t xml:space="preserve">This design offers several advantages given the limited size of the curated dataset. The 80/20 split reserves the majority of data for training and validation, which is particularly beneficial when the total number of labelled compounds is approximately 1,300. The use of </w:t>
+        <w:t xml:space="preserve">This design offers several advantages given the limited size of the curated dataset. The 80/20 split reserves </w:t>
+      </w:r>
+      <w:proofErr w:type="gramStart"/>
+      <w:r>
+        <w:rPr>
+          <w:lang w:val="en-GB"/>
+        </w:rPr>
+        <w:t>the majority of</w:t>
+      </w:r>
+      <w:proofErr w:type="gramEnd"/>
+      <w:r>
+        <w:rPr>
+          <w:lang w:val="en-GB"/>
+        </w:rPr>
+        <w:t xml:space="preserve"> data for training and validation, which is particularly beneficial when the total number of labelled compounds is approximately 1,300. The use of </w:t>
       </w:r>
       <w:r>
         <w:rPr>
@@ -18336,6 +19358,7 @@
         <w:rPr>
           <w:lang w:val="en-GB" w:eastAsia="en-GB"/>
         </w:rPr>
+        <w:lastRenderedPageBreak/>
         <w:t>RESULTS</w:t>
       </w:r>
       <w:bookmarkEnd w:id="29"/>
@@ -18452,7 +19475,35 @@
         <w:rPr>
           <w:lang w:val="en-GB" w:eastAsia="en-GB"/>
         </w:rPr>
-        <w:t>. The dataset contains approximately 1.5 million entries, each consisting of a SMILES string in the first column and a reference to the corresponding ChEMBL entry in the second.</w:t>
+        <w:t xml:space="preserve">. The dataset contains approximately 1.5 million entries, each consisting of a </w:t>
+      </w:r>
+      <w:proofErr w:type="gramStart"/>
+      <w:r>
+        <w:rPr>
+          <w:lang w:val="en-GB" w:eastAsia="en-GB"/>
+        </w:rPr>
+        <w:t>SMILES</w:t>
+      </w:r>
+      <w:proofErr w:type="gramEnd"/>
+      <w:r>
+        <w:rPr>
+          <w:lang w:val="en-GB" w:eastAsia="en-GB"/>
+        </w:rPr>
+        <w:t xml:space="preserve"> string in the first column and a reference to the corresponding </w:t>
+      </w:r>
+      <w:proofErr w:type="spellStart"/>
+      <w:r>
+        <w:rPr>
+          <w:lang w:val="en-GB" w:eastAsia="en-GB"/>
+        </w:rPr>
+        <w:t>ChEMBL</w:t>
+      </w:r>
+      <w:proofErr w:type="spellEnd"/>
+      <w:r>
+        <w:rPr>
+          <w:lang w:val="en-GB" w:eastAsia="en-GB"/>
+        </w:rPr>
+        <w:t xml:space="preserve"> entry in the second.</w:t>
       </w:r>
       <w:r>
         <w:rPr>
@@ -18484,7 +19535,21 @@
         <w:rPr>
           <w:lang w:val="en-GB" w:eastAsia="en-GB"/>
         </w:rPr>
-        <w:t xml:space="preserve"> converted to InChI using the RDKit library</w:t>
+        <w:t xml:space="preserve"> converted to InChI using the </w:t>
+      </w:r>
+      <w:proofErr w:type="spellStart"/>
+      <w:r>
+        <w:rPr>
+          <w:lang w:val="en-GB" w:eastAsia="en-GB"/>
+        </w:rPr>
+        <w:t>RDKit</w:t>
+      </w:r>
+      <w:proofErr w:type="spellEnd"/>
+      <w:r>
+        <w:rPr>
+          <w:lang w:val="en-GB" w:eastAsia="en-GB"/>
+        </w:rPr>
+        <w:t xml:space="preserve"> library</w:t>
       </w:r>
       <w:r>
         <w:rPr>
@@ -18662,7 +19727,7 @@
                     <pic:cNvPicPr/>
                   </pic:nvPicPr>
                   <pic:blipFill>
-                    <a:blip r:embed="rId20"/>
+                    <a:blip r:embed="rId21"/>
                     <a:stretch>
                       <a:fillRect/>
                     </a:stretch>
@@ -18716,7 +19781,7 @@
           <w:noProof/>
           <w:lang w:val="en-GB"/>
         </w:rPr>
-        <w:t>3</w:t>
+        <w:t>4</w:t>
       </w:r>
       <w:r>
         <w:fldChar w:fldCharType="end"/>
@@ -18777,6 +19842,7 @@
         </w:rPr>
         <w:t xml:space="preserve">an application was made to </w:t>
       </w:r>
+      <w:proofErr w:type="spellStart"/>
       <w:r>
         <w:rPr>
           <w:b/>
@@ -18785,18 +19851,19 @@
         </w:rPr>
         <w:t>DrugBank</w:t>
       </w:r>
-      <w:r>
-        <w:rPr>
-          <w:lang w:val="en-GB" w:eastAsia="en-GB"/>
-        </w:rPr>
-        <w:t xml:space="preserve">, an online repository of pharmacological data. After approval for </w:t>
-      </w:r>
-      <w:r>
-        <w:rPr>
-          <w:lang w:val="en-GB" w:eastAsia="en-GB"/>
-        </w:rPr>
-        <w:lastRenderedPageBreak/>
-        <w:t>academic use, all their d</w:t>
+      <w:proofErr w:type="spellEnd"/>
+      <w:r>
+        <w:rPr>
+          <w:lang w:val="en-GB" w:eastAsia="en-GB"/>
+        </w:rPr>
+        <w:t xml:space="preserve">, an online repository of pharmacological data. After approval for academic use, all their </w:t>
+      </w:r>
+      <w:proofErr w:type="spellStart"/>
+      <w:r>
+        <w:rPr>
+          <w:lang w:val="en-GB" w:eastAsia="en-GB"/>
+        </w:rPr>
+        <w:t>d</w:t>
       </w:r>
       <w:r>
         <w:rPr>
@@ -18804,6 +19871,7 @@
         </w:rPr>
         <w:t>b</w:t>
       </w:r>
+      <w:proofErr w:type="spellEnd"/>
       <w:r>
         <w:rPr>
           <w:lang w:val="en-GB" w:eastAsia="en-GB"/>
@@ -18840,14 +19908,44 @@
         <w:rPr>
           <w:lang w:val="en-GB" w:eastAsia="en-GB"/>
         </w:rPr>
-        <w:t xml:space="preserve"> (df) containing a primary key that will be the “DrugBank ID”, which is a unique identifier for each chemical compound. This </w:t>
-      </w:r>
+        <w:t xml:space="preserve"> (</w:t>
+      </w:r>
+      <w:proofErr w:type="spellStart"/>
       <w:r>
         <w:rPr>
           <w:lang w:val="en-GB" w:eastAsia="en-GB"/>
         </w:rPr>
         <w:t>df</w:t>
       </w:r>
+      <w:proofErr w:type="spellEnd"/>
+      <w:r>
+        <w:rPr>
+          <w:lang w:val="en-GB" w:eastAsia="en-GB"/>
+        </w:rPr>
+        <w:t>) containing a primary key that will be the “</w:t>
+      </w:r>
+      <w:proofErr w:type="spellStart"/>
+      <w:r>
+        <w:rPr>
+          <w:lang w:val="en-GB" w:eastAsia="en-GB"/>
+        </w:rPr>
+        <w:t>DrugBank</w:t>
+      </w:r>
+      <w:proofErr w:type="spellEnd"/>
+      <w:r>
+        <w:rPr>
+          <w:lang w:val="en-GB" w:eastAsia="en-GB"/>
+        </w:rPr>
+        <w:t xml:space="preserve"> ID”, which is a unique identifier for each chemical compound. This </w:t>
+      </w:r>
+      <w:proofErr w:type="spellStart"/>
+      <w:r>
+        <w:rPr>
+          <w:lang w:val="en-GB" w:eastAsia="en-GB"/>
+        </w:rPr>
+        <w:t>df</w:t>
+      </w:r>
+      <w:proofErr w:type="spellEnd"/>
       <w:r>
         <w:rPr>
           <w:lang w:val="en-GB" w:eastAsia="en-GB"/>
@@ -18923,13 +20021,62 @@
         <w:rPr>
           <w:lang w:val="en-GB" w:eastAsia="en-GB"/>
         </w:rPr>
-        <w:t xml:space="preserve">Only those drugs that were classified as “SmallMoleculeDrugs” were included in the final df, excluding those with the tag </w:t>
-      </w:r>
-      <w:r>
-        <w:rPr>
-          <w:lang w:val="en-GB" w:eastAsia="en-GB"/>
-        </w:rPr>
-        <w:t>“BiotechDrug” which mostly include proteins and peptides, which are well known to be metabolized as normal proteins, not cytochromes. Any of these drugs tagged with any CYP450 was most likely due to inhibitory interactions not linked to metabolism.</w:t>
+        <w:t>Only those drugs that were classified as “</w:t>
+      </w:r>
+      <w:proofErr w:type="spellStart"/>
+      <w:r>
+        <w:rPr>
+          <w:lang w:val="en-GB" w:eastAsia="en-GB"/>
+        </w:rPr>
+        <w:t>SmallMoleculeDrugs</w:t>
+      </w:r>
+      <w:proofErr w:type="spellEnd"/>
+      <w:r>
+        <w:rPr>
+          <w:lang w:val="en-GB" w:eastAsia="en-GB"/>
+        </w:rPr>
+        <w:t xml:space="preserve">” were included in the final </w:t>
+      </w:r>
+      <w:proofErr w:type="spellStart"/>
+      <w:r>
+        <w:rPr>
+          <w:lang w:val="en-GB" w:eastAsia="en-GB"/>
+        </w:rPr>
+        <w:t>df</w:t>
+      </w:r>
+      <w:proofErr w:type="spellEnd"/>
+      <w:r>
+        <w:rPr>
+          <w:lang w:val="en-GB" w:eastAsia="en-GB"/>
+        </w:rPr>
+        <w:t xml:space="preserve">, excluding those with the tag </w:t>
+      </w:r>
+      <w:r>
+        <w:rPr>
+          <w:lang w:val="en-GB" w:eastAsia="en-GB"/>
+        </w:rPr>
+        <w:t>“</w:t>
+      </w:r>
+      <w:proofErr w:type="spellStart"/>
+      <w:r>
+        <w:rPr>
+          <w:lang w:val="en-GB" w:eastAsia="en-GB"/>
+        </w:rPr>
+        <w:t>BiotechDrug</w:t>
+      </w:r>
+      <w:proofErr w:type="spellEnd"/>
+      <w:r>
+        <w:rPr>
+          <w:lang w:val="en-GB" w:eastAsia="en-GB"/>
+        </w:rPr>
+        <w:t xml:space="preserve">” which mostly include proteins and peptides, which are </w:t>
+      </w:r>
+      <w:r>
+        <w:rPr>
+          <w:lang w:val="en-GB" w:eastAsia="en-GB"/>
+        </w:rPr>
+        <w:lastRenderedPageBreak/>
+        <w:t>well known to be metabolized as normal proteins, not cytochromes. Any of these drugs tagged with any CYP450 was most likely due to inhibitory interactions not linked to metabolism.</w:t>
       </w:r>
     </w:p>
     <w:p>
@@ -18961,13 +20108,41 @@
         <w:rPr>
           <w:lang w:val="en-GB" w:eastAsia="en-GB"/>
         </w:rPr>
-        <w:t xml:space="preserve">”. In these cases, a fake unique “DrugBank ID” was given, and the new lines with the SMILES of each concrete chemical compound was added with the same CYPs as the parent compound. </w:t>
-      </w:r>
-      <w:r>
-        <w:rPr>
-          <w:lang w:val="en-GB"/>
-        </w:rPr>
-        <w:t>These SMILES representations were then converted into standardized InChI formats using RDKit, seamlessly enriching the dataset with essential molecular descriptors.</w:t>
+        <w:t>”. In these cases, a fake unique “</w:t>
+      </w:r>
+      <w:proofErr w:type="spellStart"/>
+      <w:r>
+        <w:rPr>
+          <w:lang w:val="en-GB" w:eastAsia="en-GB"/>
+        </w:rPr>
+        <w:t>DrugBank</w:t>
+      </w:r>
+      <w:proofErr w:type="spellEnd"/>
+      <w:r>
+        <w:rPr>
+          <w:lang w:val="en-GB" w:eastAsia="en-GB"/>
+        </w:rPr>
+        <w:t xml:space="preserve"> ID” was given, and the new lines with the SMILES of each concrete chemical compound was added with the same CYPs as the parent compound. </w:t>
+      </w:r>
+      <w:r>
+        <w:rPr>
+          <w:lang w:val="en-GB"/>
+        </w:rPr>
+        <w:t xml:space="preserve">These SMILES representations were then converted into standardized InChI formats using </w:t>
+      </w:r>
+      <w:proofErr w:type="spellStart"/>
+      <w:r>
+        <w:rPr>
+          <w:lang w:val="en-GB"/>
+        </w:rPr>
+        <w:t>RDKit</w:t>
+      </w:r>
+      <w:proofErr w:type="spellEnd"/>
+      <w:r>
+        <w:rPr>
+          <w:lang w:val="en-GB"/>
+        </w:rPr>
+        <w:t>, seamlessly enriching the dataset with essential molecular descriptors.</w:t>
       </w:r>
     </w:p>
     <w:p>
@@ -19204,7 +20379,7 @@
                                   <w:noProof/>
                                   <w:lang w:val="en-GB"/>
                                 </w:rPr>
-                                <w:t>4</w:t>
+                                <w:t>5</w:t>
                               </w:r>
                               <w:r>
                                 <w:fldChar w:fldCharType="end"/>
@@ -19314,7 +20489,7 @@
                           </pic:cNvPicPr>
                         </pic:nvPicPr>
                         <pic:blipFill>
-                          <a:blip r:embed="rId21">
+                          <a:blip r:embed="rId22">
                             <a:extLst>
                               <a:ext uri="{28A0092B-C50C-407E-A947-70E740481C1C}">
                                 <a14:useLocalDpi xmlns:a14="http://schemas.microsoft.com/office/drawing/2010/main" val="0"/>
@@ -19343,7 +20518,7 @@
                           </pic:cNvPicPr>
                         </pic:nvPicPr>
                         <pic:blipFill>
-                          <a:blip r:embed="rId22">
+                          <a:blip r:embed="rId23">
                             <a:extLst>
                               <a:ext uri="{28A0092B-C50C-407E-A947-70E740481C1C}">
                                 <a14:useLocalDpi xmlns:a14="http://schemas.microsoft.com/office/drawing/2010/main" val="0"/>
@@ -19539,7 +20714,7 @@
                             <w:noProof/>
                             <w:lang w:val="en-GB"/>
                           </w:rPr>
-                          <w:t>4</w:t>
+                          <w:t>5</w:t>
                         </w:r>
                         <w:r>
                           <w:fldChar w:fldCharType="end"/>
@@ -19636,10 +20811,10 @@
                   </v:textbox>
                 </v:shape>
                 <v:shape id="Picture 1" o:spid="_x0000_s1029" type="#_x0000_t75" style="position:absolute;left:16975;top:3386;width:10687;height:14434;visibility:visible;mso-wrap-style:square" o:gfxdata="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">
-                  <v:imagedata r:id="rId23" o:title=""/>
+                  <v:imagedata r:id="rId24" o:title=""/>
                 </v:shape>
                 <v:shape id="Picture 1" o:spid="_x0000_s1030" type="#_x0000_t75" style="position:absolute;left:550;top:3386;width:16434;height:14434;visibility:visible;mso-wrap-style:square" o:gfxdata="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">
-                  <v:imagedata r:id="rId24" o:title=""/>
+                  <v:imagedata r:id="rId25" o:title=""/>
                 </v:shape>
                 <w10:wrap type="square"/>
               </v:group>
@@ -19707,7 +20882,14 @@
         <w:rPr>
           <w:lang w:val="en-GB" w:eastAsia="en-GB"/>
         </w:rPr>
-        <w:t>) and removed. This gave a final d</w:t>
+        <w:t xml:space="preserve">) and removed. This gave a final </w:t>
+      </w:r>
+      <w:proofErr w:type="spellStart"/>
+      <w:r>
+        <w:rPr>
+          <w:lang w:val="en-GB" w:eastAsia="en-GB"/>
+        </w:rPr>
+        <w:t>d</w:t>
       </w:r>
       <w:r>
         <w:rPr>
@@ -19715,6 +20897,7 @@
         </w:rPr>
         <w:t>b</w:t>
       </w:r>
+      <w:proofErr w:type="spellEnd"/>
       <w:r>
         <w:rPr>
           <w:lang w:val="en-GB" w:eastAsia="en-GB"/>
@@ -19725,7 +20908,14 @@
         <w:rPr>
           <w:lang w:val="en-GB" w:eastAsia="en-GB"/>
         </w:rPr>
-        <w:t>In the whole d</w:t>
+        <w:t xml:space="preserve">In the whole </w:t>
+      </w:r>
+      <w:proofErr w:type="spellStart"/>
+      <w:r>
+        <w:rPr>
+          <w:lang w:val="en-GB" w:eastAsia="en-GB"/>
+        </w:rPr>
+        <w:t>d</w:t>
       </w:r>
       <w:r>
         <w:rPr>
@@ -19733,6 +20923,7 @@
         </w:rPr>
         <w:t>b</w:t>
       </w:r>
+      <w:proofErr w:type="spellEnd"/>
       <w:r>
         <w:rPr>
           <w:lang w:val="en-GB" w:eastAsia="en-GB"/>
@@ -19969,7 +21160,21 @@
         <w:rPr>
           <w:lang w:val="en-GB" w:eastAsia="en-GB"/>
         </w:rPr>
-        <w:t>These low frequency CYP450s were removed from the db as they would not have enough true positives to train</w:t>
+        <w:t xml:space="preserve">These low frequency CYP450s were removed from the </w:t>
+      </w:r>
+      <w:proofErr w:type="spellStart"/>
+      <w:r>
+        <w:rPr>
+          <w:lang w:val="en-GB" w:eastAsia="en-GB"/>
+        </w:rPr>
+        <w:t>db</w:t>
+      </w:r>
+      <w:proofErr w:type="spellEnd"/>
+      <w:r>
+        <w:rPr>
+          <w:lang w:val="en-GB" w:eastAsia="en-GB"/>
+        </w:rPr>
+        <w:t xml:space="preserve"> as they would not have enough true positives to train</w:t>
       </w:r>
       <w:r>
         <w:rPr>
@@ -20281,7 +21486,14 @@
         <w:rPr>
           <w:lang w:val="en-GB" w:eastAsia="en-GB"/>
         </w:rPr>
-        <w:t xml:space="preserve"> is a freely accessible online d</w:t>
+        <w:t xml:space="preserve"> is a freely accessible online </w:t>
+      </w:r>
+      <w:proofErr w:type="spellStart"/>
+      <w:r>
+        <w:rPr>
+          <w:lang w:val="en-GB" w:eastAsia="en-GB"/>
+        </w:rPr>
+        <w:t>d</w:t>
       </w:r>
       <w:r>
         <w:rPr>
@@ -20289,6 +21501,7 @@
         </w:rPr>
         <w:t>b</w:t>
       </w:r>
+      <w:proofErr w:type="spellEnd"/>
       <w:r>
         <w:rPr>
           <w:lang w:val="en-GB" w:eastAsia="en-GB"/>
@@ -20311,7 +21524,6 @@
         <w:rPr>
           <w:lang w:val="en-GB" w:eastAsia="en-GB"/>
         </w:rPr>
-        <w:lastRenderedPageBreak/>
         <w:t>as well as details on related proteins, sequences, structures, and biological pathways.</w:t>
       </w:r>
       <w:r>
@@ -20351,7 +21563,19 @@
         <w:rPr>
           <w:lang w:val="en-GB" w:eastAsia="en-GB"/>
         </w:rPr>
-        <w:t>It is an open online platform dedicated to data science and machine learning that hosts publicly accessible datasets, predictive modelling competitions, and collaborative notebooks. Kaggle aggregates datasets contributed by both institutions and individual researchers, covering a wide range of domains including chemistry and bioinformatics</w:t>
+        <w:t xml:space="preserve">It is an open online platform dedicated to data science and </w:t>
+      </w:r>
+      <w:r>
+        <w:rPr>
+          <w:lang w:val="en-GB" w:eastAsia="en-GB"/>
+        </w:rPr>
+        <w:t xml:space="preserve">ML </w:t>
+      </w:r>
+      <w:r>
+        <w:rPr>
+          <w:lang w:val="en-GB" w:eastAsia="en-GB"/>
+        </w:rPr>
+        <w:t>that hosts publicly accessible datasets, predictive modelling competitions, and collaborative notebooks. Kaggle aggregates datasets contributed by both institutions and individual researchers, covering a wide range of domains including chemistry and bioinformatics</w:t>
       </w:r>
       <w:r>
         <w:rPr>
@@ -20443,7 +21667,14 @@
         <w:rPr>
           <w:lang w:val="en-GB" w:eastAsia="en-GB"/>
         </w:rPr>
-        <w:t xml:space="preserve"> It is a manually curated, freely accessible database that provides comprehensive bioactivity data for drug-like compounds. It integrates chemical, biological, and pharmacological information, covering from compound structures to bioactivity measurements against biological targets. The data is primarily extracted from the primary medicinal chemistry literature.</w:t>
+        <w:t xml:space="preserve"> It is a manually curated, freely accessible database that provides comprehensive bioactivity data for drug-like compounds. It integrates chemical, biological, and pharmacological information, covering from compound structures to bioactivity </w:t>
+      </w:r>
+      <w:r>
+        <w:rPr>
+          <w:lang w:val="en-GB" w:eastAsia="en-GB"/>
+        </w:rPr>
+        <w:lastRenderedPageBreak/>
+        <w:t>measurements against biological targets. The data is primarily extracted from the primary medicinal chemistry literature.</w:t>
       </w:r>
       <w:r>
         <w:rPr>
@@ -20455,7 +21686,21 @@
         <w:rPr>
           <w:lang w:val="en-GB" w:eastAsia="en-GB"/>
         </w:rPr>
-        <w:t>For this project, ChEMBL served as the fundamental source for the SMILES strings used to train the proprietary InChI embedder, providing the large-scale, high-quality structural data necessary for developing robust chemical representations.</w:t>
+        <w:t xml:space="preserve">For this project, </w:t>
+      </w:r>
+      <w:proofErr w:type="spellStart"/>
+      <w:r>
+        <w:rPr>
+          <w:lang w:val="en-GB" w:eastAsia="en-GB"/>
+        </w:rPr>
+        <w:t>ChEMBL</w:t>
+      </w:r>
+      <w:proofErr w:type="spellEnd"/>
+      <w:r>
+        <w:rPr>
+          <w:lang w:val="en-GB" w:eastAsia="en-GB"/>
+        </w:rPr>
+        <w:t xml:space="preserve"> served as the fundamental source for the SMILES strings used to train the proprietary InChI embedder, providing the large-scale, high-quality structural data necessary for developing robust chemical representations.</w:t>
       </w:r>
     </w:p>
     <w:p>
@@ -20530,7 +21775,21 @@
         <w:rPr>
           <w:lang w:val="en-GB" w:eastAsia="en-GB"/>
         </w:rPr>
-        <w:t xml:space="preserve"> representation itself, and are discussed here in terms of their practical implications.</w:t>
+        <w:t xml:space="preserve"> representation </w:t>
+      </w:r>
+      <w:proofErr w:type="gramStart"/>
+      <w:r>
+        <w:rPr>
+          <w:lang w:val="en-GB" w:eastAsia="en-GB"/>
+        </w:rPr>
+        <w:t>itself, and</w:t>
+      </w:r>
+      <w:proofErr w:type="gramEnd"/>
+      <w:r>
+        <w:rPr>
+          <w:lang w:val="en-GB" w:eastAsia="en-GB"/>
+        </w:rPr>
+        <w:t xml:space="preserve"> are discussed here in terms of their practical implications.</w:t>
       </w:r>
     </w:p>
     <w:p>
@@ -20700,14 +21959,7 @@
         <w:rPr>
           <w:lang w:val="en-GB" w:eastAsia="en-GB"/>
         </w:rPr>
-        <w:t xml:space="preserve">. This indicates that redundancy is primarily inherited from the original database, with only a minor contribution from InChI canonicalization, where different but equivalent SMILES map to the same representation. Some of the most frequently repeated entries correspond to large, peptide-like </w:t>
-      </w:r>
-      <w:r>
-        <w:rPr>
-          <w:lang w:val="en-GB" w:eastAsia="en-GB"/>
-        </w:rPr>
-        <w:lastRenderedPageBreak/>
-        <w:t xml:space="preserve">structures, which likely arise from repeated records in the source data. </w:t>
+        <w:t xml:space="preserve">. This indicates that redundancy is primarily inherited from the original database, with only a minor contribution from InChI canonicalization, where different but equivalent SMILES map to the same representation. Some of the most frequently repeated entries correspond to large, peptide-like structures, which likely arise from repeated records in the source data. </w:t>
       </w:r>
       <w:r>
         <w:rPr>
@@ -20882,6 +22134,7 @@
           <w:noProof/>
           <w:lang w:val="en-GB" w:eastAsia="en-GB"/>
         </w:rPr>
+        <w:lastRenderedPageBreak/>
         <w:drawing>
           <wp:inline distT="0" distB="0" distL="0" distR="0" wp14:anchorId="6C13B289" wp14:editId="78A49606">
             <wp:extent cx="5669915" cy="3071495"/>
@@ -20898,7 +22151,7 @@
                     <pic:cNvPicPr/>
                   </pic:nvPicPr>
                   <pic:blipFill>
-                    <a:blip r:embed="rId25"/>
+                    <a:blip r:embed="rId26"/>
                     <a:stretch>
                       <a:fillRect/>
                     </a:stretch>
@@ -20951,7 +22204,7 @@
           <w:noProof/>
           <w:lang w:val="en-GB"/>
         </w:rPr>
-        <w:t>5</w:t>
+        <w:t>6</w:t>
       </w:r>
       <w:r>
         <w:fldChar w:fldCharType="end"/>
@@ -21077,7 +22330,7 @@
                     <pic:cNvPicPr/>
                   </pic:nvPicPr>
                   <pic:blipFill>
-                    <a:blip r:embed="rId26"/>
+                    <a:blip r:embed="rId27"/>
                     <a:stretch>
                       <a:fillRect/>
                     </a:stretch>
@@ -21133,7 +22386,7 @@
           <w:noProof/>
           <w:lang w:val="en-GB"/>
         </w:rPr>
-        <w:t>6</w:t>
+        <w:t>7</w:t>
       </w:r>
       <w:r>
         <w:fldChar w:fldCharType="end"/>
@@ -21175,7 +22428,21 @@
         <w:rPr>
           <w:lang w:val="en-GB" w:eastAsia="en-GB"/>
         </w:rPr>
-        <w:t>Based on the tokenized sequences, a maximum length of 512 tokens covers more than 99% of the dataset without truncation. The sequences exceeding this threshold correspond predominantly to very large, peptide-like molecules, which are less likely to be primarily metabolized by CYP450 enzymes and instead tend to undergo degradation via proteolytic pathways. As such, the truncation strategy represents a practical trade-off, preserving the vast majority of relevant small-molecule information while maintaining computational efficiency.</w:t>
+        <w:t xml:space="preserve">Based on the tokenized sequences, a maximum length of 512 tokens covers more than 99% of the dataset without truncation. The sequences exceeding this threshold correspond predominantly to very large, peptide-like molecules, which are less likely to be primarily metabolized by CYP450 enzymes and instead tend to undergo degradation via proteolytic pathways. As such, the truncation strategy represents a practical trade-off, preserving </w:t>
+      </w:r>
+      <w:proofErr w:type="gramStart"/>
+      <w:r>
+        <w:rPr>
+          <w:lang w:val="en-GB" w:eastAsia="en-GB"/>
+        </w:rPr>
+        <w:t>the vast majority of</w:t>
+      </w:r>
+      <w:proofErr w:type="gramEnd"/>
+      <w:r>
+        <w:rPr>
+          <w:lang w:val="en-GB" w:eastAsia="en-GB"/>
+        </w:rPr>
+        <w:t xml:space="preserve"> relevant small-molecule information while maintaining computational efficiency.</w:t>
       </w:r>
     </w:p>
     <w:p>
@@ -21188,7 +22455,19 @@
         <w:rPr>
           <w:lang w:val="en-GB" w:eastAsia="en-GB"/>
         </w:rPr>
-        <w:t>With respect to the tokenization process, it is important to note that the Byte-Pair Encoding (BPE) tokenizer learns statistical substructures rather than chemically meaningful units. As a result, individual tokens do not have a direct chemical interpretation. This is an inherent characteristic of data-driven representation learning approaches and is consistent with the broader use of such methods in machine learning, where predictive performance is typically prioritised over interpretability.</w:t>
+        <w:t xml:space="preserve">With respect to the tokenization process, it is important to note that the Byte-Pair Encoding (BPE) tokenizer learns statistical substructures rather than chemically meaningful units. As a result, individual tokens do not have a direct chemical interpretation. This is an inherent characteristic of data-driven representation learning approaches and is consistent with the broader use of such methods in </w:t>
+      </w:r>
+      <w:r>
+        <w:rPr>
+          <w:lang w:val="en-GB" w:eastAsia="en-GB"/>
+        </w:rPr>
+        <w:t>ML</w:t>
+      </w:r>
+      <w:r>
+        <w:rPr>
+          <w:lang w:val="en-GB" w:eastAsia="en-GB"/>
+        </w:rPr>
+        <w:t>, where predictive performance is typically prioritised over interpretability.</w:t>
       </w:r>
     </w:p>
     <w:p>
@@ -21226,7 +22505,19 @@
         <w:rPr>
           <w:lang w:val="en-GB" w:eastAsia="en-GB"/>
         </w:rPr>
-        <w:t>Overall, the InChI representation is structurally consistent and efficiently tokenized, enabling its use in a machine learning context. The most relevant limitation is the lack of stereochemical information, which may restrict the model’s ability to capture certain metabolic effects. The dataset also contains moderate duplication and exhibits a long-tail distribution of molecular complexity, both of which are characteristic of real-world chemical databases and are appropriately managed within the pipeline. These factors are well understood and provide a clear context for interpreting the results of the modelling stage.</w:t>
+        <w:t xml:space="preserve">Overall, the InChI representation is structurally consistent and efficiently tokenized, enabling its use in a </w:t>
+      </w:r>
+      <w:r>
+        <w:rPr>
+          <w:lang w:val="en-GB" w:eastAsia="en-GB"/>
+        </w:rPr>
+        <w:t>ML</w:t>
+      </w:r>
+      <w:r>
+        <w:rPr>
+          <w:lang w:val="en-GB" w:eastAsia="en-GB"/>
+        </w:rPr>
+        <w:t xml:space="preserve"> context. The most relevant limitation is the lack of stereochemical information, which may restrict the model’s ability to capture certain metabolic effects. The dataset also contains moderate duplication and exhibits a long-tail distribution of molecular complexity, both of which are characteristic of real-world chemical databases and are appropriately managed within the pipeline. These factors are well understood and provide a clear context for interpreting the results of the modelling stage.</w:t>
       </w:r>
     </w:p>
     <w:p>
@@ -21263,7 +22554,7 @@
         </w:rPr>
         <w:t xml:space="preserve">Benchmark predictor: </w:t>
       </w:r>
-      <w:hyperlink r:id="rId27" w:history="1">
+      <w:hyperlink r:id="rId28" w:history="1">
         <w:r>
           <w:rPr>
             <w:rStyle w:val="Hyperlink"/>
@@ -21312,7 +22603,33 @@
         <w:rPr>
           <w:lang w:val="en-GB" w:eastAsia="en-GB"/>
         </w:rPr>
-        <w:t xml:space="preserve"> describes the preprocessing of the curated DrugBank metabolism dataset (1,368 compounds), where molecular structures are encoded into numerical representations for machine learning. All feature matrices generated in the following subsections are derived from this same set of compounds.</w:t>
+        <w:t xml:space="preserve"> describes the preprocessing of the curated </w:t>
+      </w:r>
+      <w:proofErr w:type="spellStart"/>
+      <w:r>
+        <w:rPr>
+          <w:lang w:val="en-GB" w:eastAsia="en-GB"/>
+        </w:rPr>
+        <w:t>DrugBank</w:t>
+      </w:r>
+      <w:proofErr w:type="spellEnd"/>
+      <w:r>
+        <w:rPr>
+          <w:lang w:val="en-GB" w:eastAsia="en-GB"/>
+        </w:rPr>
+        <w:t xml:space="preserve"> metabolism dataset (1,368 compounds), where molecular structures are encoded into numerical representations for </w:t>
+      </w:r>
+      <w:r>
+        <w:rPr>
+          <w:lang w:val="en-GB" w:eastAsia="en-GB"/>
+        </w:rPr>
+        <w:t>ML</w:t>
+      </w:r>
+      <w:r>
+        <w:rPr>
+          <w:lang w:val="en-GB" w:eastAsia="en-GB"/>
+        </w:rPr>
+        <w:t>. All feature matrices generated in the following subsections are derived from this same set of compounds.</w:t>
       </w:r>
     </w:p>
     <w:p>
@@ -21360,7 +22677,21 @@
         <w:rPr>
           <w:lang w:val="en-GB" w:eastAsia="en-GB"/>
         </w:rPr>
-        <w:t xml:space="preserve"> computed using the cheminformatics toolkit RDKit.</w:t>
+        <w:t xml:space="preserve"> computed using the cheminformatics toolkit </w:t>
+      </w:r>
+      <w:proofErr w:type="spellStart"/>
+      <w:r>
+        <w:rPr>
+          <w:lang w:val="en-GB" w:eastAsia="en-GB"/>
+        </w:rPr>
+        <w:t>RDKit</w:t>
+      </w:r>
+      <w:proofErr w:type="spellEnd"/>
+      <w:r>
+        <w:rPr>
+          <w:lang w:val="en-GB" w:eastAsia="en-GB"/>
+        </w:rPr>
+        <w:t>.</w:t>
       </w:r>
     </w:p>
     <w:p>
@@ -21374,7 +22705,21 @@
         <w:rPr>
           <w:lang w:val="en-GB" w:eastAsia="en-GB"/>
         </w:rPr>
-        <w:t>Each SMILES string was first parsed into an internal molecular graph object. The Morgan algorithm then iteratively enumerates circular atom environments up to a predefined radius. In this implementation, a radius of 3 was selected, corresponding to ECFP6 (i.e., neighborhoods spanning up to 6 bonds)</w:t>
+        <w:t xml:space="preserve">Each SMILES string was first parsed into an internal molecular graph object. The Morgan algorithm then iteratively enumerates circular atom environments up to a predefined radius. In this implementation, a radius of 3 was selected, corresponding to ECFP6 (i.e., </w:t>
+      </w:r>
+      <w:proofErr w:type="spellStart"/>
+      <w:r>
+        <w:rPr>
+          <w:lang w:val="en-GB" w:eastAsia="en-GB"/>
+        </w:rPr>
+        <w:t>neighborhoods</w:t>
+      </w:r>
+      <w:proofErr w:type="spellEnd"/>
+      <w:r>
+        <w:rPr>
+          <w:lang w:val="en-GB" w:eastAsia="en-GB"/>
+        </w:rPr>
+        <w:t xml:space="preserve"> spanning up to 6 bonds)</w:t>
       </w:r>
       <w:r>
         <w:rPr>
@@ -21508,7 +22853,21 @@
         <w:rPr>
           <w:lang w:val="en-GB" w:eastAsia="en-GB"/>
         </w:rPr>
-        <w:t>In contrast to binary fingerprints, count-based fingerprints were intentionally selected in order to preserve the multiplicity of structural motifs. Since CYP450-mediated metabolism is often influenced by the frequency of specific functional groups or reactive moieties within a molecule, retaining substructure counts provides a richer representation than simple presence/absence encoding, while maintaining interpretability and computational efficiency.</w:t>
+        <w:t xml:space="preserve">In contrast to binary fingerprints, count-based fingerprints were intentionally selected </w:t>
+      </w:r>
+      <w:proofErr w:type="gramStart"/>
+      <w:r>
+        <w:rPr>
+          <w:lang w:val="en-GB" w:eastAsia="en-GB"/>
+        </w:rPr>
+        <w:t>in order to</w:t>
+      </w:r>
+      <w:proofErr w:type="gramEnd"/>
+      <w:r>
+        <w:rPr>
+          <w:lang w:val="en-GB" w:eastAsia="en-GB"/>
+        </w:rPr>
+        <w:t xml:space="preserve"> preserve the multiplicity of structural motifs. Since CYP450-mediated metabolism is often influenced by the frequency of specific functional groups or reactive moieties within a molecule, retaining substructure counts provides a richer representation than simple presence/absence encoding, while maintaining interpretability and computational efficiency.</w:t>
       </w:r>
     </w:p>
     <w:p>
@@ -21540,7 +22899,21 @@
         <w:rPr>
           <w:lang w:val="en-GB" w:eastAsia="en-GB"/>
         </w:rPr>
-        <w:t>(.tsv)</w:t>
+        <w:t>(.</w:t>
+      </w:r>
+      <w:proofErr w:type="spellStart"/>
+      <w:r>
+        <w:rPr>
+          <w:lang w:val="en-GB" w:eastAsia="en-GB"/>
+        </w:rPr>
+        <w:t>tsv</w:t>
+      </w:r>
+      <w:proofErr w:type="spellEnd"/>
+      <w:r>
+        <w:rPr>
+          <w:lang w:val="en-GB" w:eastAsia="en-GB"/>
+        </w:rPr>
+        <w:t>)</w:t>
       </w:r>
       <w:r>
         <w:rPr>
@@ -21558,7 +22931,21 @@
         <w:rPr>
           <w:lang w:val="en-GB" w:eastAsia="en-GB"/>
         </w:rPr>
-        <w:t xml:space="preserve"> × 2,048 numerical matrix. Each row was indexed by the corresponding DrugBank identifier, and columns were </w:t>
+        <w:t xml:space="preserve"> × 2,048 numerical matrix. Each row was indexed by the corresponding </w:t>
+      </w:r>
+      <w:proofErr w:type="spellStart"/>
+      <w:r>
+        <w:rPr>
+          <w:lang w:val="en-GB" w:eastAsia="en-GB"/>
+        </w:rPr>
+        <w:t>DrugBank</w:t>
+      </w:r>
+      <w:proofErr w:type="spellEnd"/>
+      <w:r>
+        <w:rPr>
+          <w:lang w:val="en-GB" w:eastAsia="en-GB"/>
+        </w:rPr>
+        <w:t xml:space="preserve"> identifier, and columns were </w:t>
       </w:r>
       <w:r>
         <w:rPr>
@@ -21602,7 +22989,7 @@
                     <pic:cNvPicPr/>
                   </pic:nvPicPr>
                   <pic:blipFill>
-                    <a:blip r:embed="rId28"/>
+                    <a:blip r:embed="rId29"/>
                     <a:stretch>
                       <a:fillRect/>
                     </a:stretch>
@@ -21657,7 +23044,7 @@
           <w:noProof/>
           <w:lang w:val="en-GB"/>
         </w:rPr>
-        <w:t>7</w:t>
+        <w:t>8</w:t>
       </w:r>
       <w:r>
         <w:fldChar w:fldCharType="end"/>
@@ -21690,7 +23077,21 @@
         <w:rPr>
           <w:lang w:val="en-GB"/>
         </w:rPr>
-        <w:t xml:space="preserve"> matrix (ECFP6, radius = 3) for the curated dataset. Rows correspond to DrugBank IDs</w:t>
+        <w:t xml:space="preserve"> matrix (ECFP6, radius = 3) for the curated dataset. Rows correspond to </w:t>
+      </w:r>
+      <w:proofErr w:type="spellStart"/>
+      <w:r>
+        <w:rPr>
+          <w:lang w:val="en-GB"/>
+        </w:rPr>
+        <w:t>DrugBank</w:t>
+      </w:r>
+      <w:proofErr w:type="spellEnd"/>
+      <w:r>
+        <w:rPr>
+          <w:lang w:val="en-GB"/>
+        </w:rPr>
+        <w:t xml:space="preserve"> IDs</w:t>
       </w:r>
       <w:r>
         <w:rPr>
@@ -21862,7 +23263,35 @@
         <w:rPr>
           <w:lang w:val="en-GB" w:eastAsia="en-GB"/>
         </w:rPr>
-        <w:t xml:space="preserve">a truncated copy of the DrugBank db containing columns ‘id’ and ‘SMILES’, </w:t>
+        <w:t xml:space="preserve">a truncated copy of the </w:t>
+      </w:r>
+      <w:proofErr w:type="spellStart"/>
+      <w:r>
+        <w:rPr>
+          <w:lang w:val="en-GB" w:eastAsia="en-GB"/>
+        </w:rPr>
+        <w:t>DrugBank</w:t>
+      </w:r>
+      <w:proofErr w:type="spellEnd"/>
+      <w:r>
+        <w:rPr>
+          <w:lang w:val="en-GB" w:eastAsia="en-GB"/>
+        </w:rPr>
+        <w:t xml:space="preserve"> </w:t>
+      </w:r>
+      <w:proofErr w:type="spellStart"/>
+      <w:r>
+        <w:rPr>
+          <w:lang w:val="en-GB" w:eastAsia="en-GB"/>
+        </w:rPr>
+        <w:t>db</w:t>
+      </w:r>
+      <w:proofErr w:type="spellEnd"/>
+      <w:r>
+        <w:rPr>
+          <w:lang w:val="en-GB" w:eastAsia="en-GB"/>
+        </w:rPr>
+        <w:t xml:space="preserve"> containing columns ‘id’ and ‘SMILES’, </w:t>
       </w:r>
       <w:r>
         <w:rPr>
@@ -21899,8 +23328,16 @@
         <w:rPr>
           <w:lang w:val="en-GB" w:eastAsia="en-GB"/>
         </w:rPr>
-        <w:t>.tsv</w:t>
-      </w:r>
+        <w:t>.</w:t>
+      </w:r>
+      <w:proofErr w:type="spellStart"/>
+      <w:r>
+        <w:rPr>
+          <w:lang w:val="en-GB" w:eastAsia="en-GB"/>
+        </w:rPr>
+        <w:t>tsv</w:t>
+      </w:r>
+      <w:proofErr w:type="spellEnd"/>
       <w:r>
         <w:rPr>
           <w:lang w:val="en-GB" w:eastAsia="en-GB"/>
@@ -22071,7 +23508,7 @@
                     <pic:cNvPicPr/>
                   </pic:nvPicPr>
                   <pic:blipFill>
-                    <a:blip r:embed="rId29"/>
+                    <a:blip r:embed="rId30"/>
                     <a:stretch>
                       <a:fillRect/>
                     </a:stretch>
@@ -22123,7 +23560,7 @@
           <w:noProof/>
           <w:lang w:val="en-GB"/>
         </w:rPr>
-        <w:t>8</w:t>
+        <w:t>9</w:t>
       </w:r>
       <w:r>
         <w:fldChar w:fldCharType="end"/>
@@ -22156,7 +23593,21 @@
         <w:rPr>
           <w:lang w:val="en-GB"/>
         </w:rPr>
-        <w:t>Rows correspond to DrugBank IDs; columns represent pretrained embedding dimensions from the MolE transformer. The resulting matrix has dimensions 1368 × 1000 and contains continuous-valued vectors</w:t>
+        <w:t xml:space="preserve">Rows correspond to </w:t>
+      </w:r>
+      <w:proofErr w:type="spellStart"/>
+      <w:r>
+        <w:rPr>
+          <w:lang w:val="en-GB"/>
+        </w:rPr>
+        <w:t>DrugBank</w:t>
+      </w:r>
+      <w:proofErr w:type="spellEnd"/>
+      <w:r>
+        <w:rPr>
+          <w:lang w:val="en-GB"/>
+        </w:rPr>
+        <w:t xml:space="preserve"> IDs; columns represent pretrained embedding dimensions from the MolE transformer. The resulting matrix has dimensions 1368 × 1000 and contains continuous-valued vectors</w:t>
       </w:r>
       <w:r>
         <w:rPr>
@@ -22224,7 +23675,35 @@
         <w:rPr>
           <w:lang w:val="en-GB"/>
         </w:rPr>
-        <w:t>The implementation was carried out using the HuggingFace transformers library. A pretrained ChemBERTa model and its associated tokenizer were loaded once at module initialization to ensure computational efficiency and deterministic inference. Each SMILES string was first tokenized into subword units compatible with the model’s vocabulary. To prevent truncation of unusually large molecules, the maximum token length was set to 1024, exceeding the default configuration and ensuring preservation of structural information for macrocyclic or highly complex compounds.</w:t>
+        <w:t xml:space="preserve">The implementation was carried out using the </w:t>
+      </w:r>
+      <w:proofErr w:type="spellStart"/>
+      <w:r>
+        <w:rPr>
+          <w:lang w:val="en-GB"/>
+        </w:rPr>
+        <w:t>HuggingFace</w:t>
+      </w:r>
+      <w:proofErr w:type="spellEnd"/>
+      <w:r>
+        <w:rPr>
+          <w:lang w:val="en-GB"/>
+        </w:rPr>
+        <w:t xml:space="preserve"> transformers library. A pretrained ChemBERTa model and its associated tokenizer were loaded once at module initialization to ensure computational efficiency and deterministic inference. Each SMILES string was first tokenized into </w:t>
+      </w:r>
+      <w:proofErr w:type="spellStart"/>
+      <w:r>
+        <w:rPr>
+          <w:lang w:val="en-GB"/>
+        </w:rPr>
+        <w:t>subword</w:t>
+      </w:r>
+      <w:proofErr w:type="spellEnd"/>
+      <w:r>
+        <w:rPr>
+          <w:lang w:val="en-GB"/>
+        </w:rPr>
+        <w:t xml:space="preserve"> units compatible with the model’s vocabulary. To prevent truncation of unusually large molecules, the maximum token length was set to 1024, exceeding the default configuration and ensuring preservation of structural information for macrocyclic or highly complex compounds.</w:t>
       </w:r>
     </w:p>
     <w:p>
@@ -22338,7 +23817,49 @@
         <w:rPr>
           <w:lang w:val="en-GB"/>
         </w:rPr>
-        <w:t>.tsv file structured analogously to previous representations: rows indexed by DrugBank ID and columns labeled from 0 to 767, ensuring compatibility with downstream supervised learning pipelines.</w:t>
+        <w:t>.</w:t>
+      </w:r>
+      <w:proofErr w:type="spellStart"/>
+      <w:r>
+        <w:rPr>
+          <w:lang w:val="en-GB"/>
+        </w:rPr>
+        <w:t>tsv</w:t>
+      </w:r>
+      <w:proofErr w:type="spellEnd"/>
+      <w:r>
+        <w:rPr>
+          <w:lang w:val="en-GB"/>
+        </w:rPr>
+        <w:t xml:space="preserve"> file structured analogously to previous representations: rows indexed by </w:t>
+      </w:r>
+      <w:proofErr w:type="spellStart"/>
+      <w:r>
+        <w:rPr>
+          <w:lang w:val="en-GB"/>
+        </w:rPr>
+        <w:t>DrugBank</w:t>
+      </w:r>
+      <w:proofErr w:type="spellEnd"/>
+      <w:r>
+        <w:rPr>
+          <w:lang w:val="en-GB"/>
+        </w:rPr>
+        <w:t xml:space="preserve"> ID and columns </w:t>
+      </w:r>
+      <w:proofErr w:type="spellStart"/>
+      <w:r>
+        <w:rPr>
+          <w:lang w:val="en-GB"/>
+        </w:rPr>
+        <w:t>labeled</w:t>
+      </w:r>
+      <w:proofErr w:type="spellEnd"/>
+      <w:r>
+        <w:rPr>
+          <w:lang w:val="en-GB"/>
+        </w:rPr>
+        <w:t xml:space="preserve"> from 0 to 767, ensuring compatibility with downstream supervised learning pipelines.</w:t>
       </w:r>
     </w:p>
     <w:p>
@@ -22378,7 +23899,7 @@
                     <pic:cNvPicPr/>
                   </pic:nvPicPr>
                   <pic:blipFill rotWithShape="1">
-                    <a:blip r:embed="rId30"/>
+                    <a:blip r:embed="rId31"/>
                     <a:srcRect l="353" t="1091"/>
                     <a:stretch>
                       <a:fillRect/>
@@ -22439,7 +23960,7 @@
           <w:noProof/>
           <w:lang w:val="en-GB"/>
         </w:rPr>
-        <w:t>9</w:t>
+        <w:t>10</w:t>
       </w:r>
       <w:r>
         <w:fldChar w:fldCharType="end"/>
@@ -22472,7 +23993,21 @@
         <w:rPr>
           <w:lang w:val="en-GB"/>
         </w:rPr>
-        <w:t>Rows correspond to DrugBank IDs; columns represent pretrained embedding dimensions from the ChemBERTa transformer. The resulting matrix has dimensions 1368 × 768 and contains continuous-valued vectors.</w:t>
+        <w:t xml:space="preserve">Rows correspond to </w:t>
+      </w:r>
+      <w:proofErr w:type="spellStart"/>
+      <w:r>
+        <w:rPr>
+          <w:lang w:val="en-GB"/>
+        </w:rPr>
+        <w:t>DrugBank</w:t>
+      </w:r>
+      <w:proofErr w:type="spellEnd"/>
+      <w:r>
+        <w:rPr>
+          <w:lang w:val="en-GB"/>
+        </w:rPr>
+        <w:t xml:space="preserve"> IDs; columns represent pretrained embedding dimensions from the ChemBERTa transformer. The resulting matrix has dimensions 1368 × 768 and contains continuous-valued vectors.</w:t>
       </w:r>
       <w:bookmarkEnd w:id="55"/>
     </w:p>
@@ -22667,7 +24202,21 @@
         <w:rPr>
           <w:lang w:val="en-GB" w:eastAsia="en-GB"/>
         </w:rPr>
-        <w:t xml:space="preserve"> from the DrugBank database</w:t>
+        <w:t xml:space="preserve"> from the </w:t>
+      </w:r>
+      <w:proofErr w:type="spellStart"/>
+      <w:r>
+        <w:rPr>
+          <w:lang w:val="en-GB" w:eastAsia="en-GB"/>
+        </w:rPr>
+        <w:t>DrugBank</w:t>
+      </w:r>
+      <w:proofErr w:type="spellEnd"/>
+      <w:r>
+        <w:rPr>
+          <w:lang w:val="en-GB" w:eastAsia="en-GB"/>
+        </w:rPr>
+        <w:t xml:space="preserve"> database</w:t>
       </w:r>
       <w:r>
         <w:rPr>
@@ -22689,8 +24238,13 @@
         </w:rPr>
         <w:t xml:space="preserve">The model produces a sequence of token-level embeddings of dimension 384 for each InChI string. To obtain a single representation per molecule, these token embeddings are averaged using mean pooling, considering only valid (non-padding) tokens. </w:t>
       </w:r>
-      <w:r>
-        <w:t>Formally:</w:t>
+      <w:proofErr w:type="spellStart"/>
+      <w:r>
+        <w:t>Formally</w:t>
+      </w:r>
+      <w:proofErr w:type="spellEnd"/>
+      <w:r>
+        <w:t>:</w:t>
       </w:r>
     </w:p>
     <w:p>
@@ -23116,7 +24670,61 @@
         <w:rPr>
           <w:lang w:val="en-GB"/>
         </w:rPr>
-        <w:t>As with the other embedding methods, the resulting vectors were stored in float64 format and exported as a tab-separated values (.tsv) file, with rows indexed by DrugBank ID and columns labeled from 0 to 383. This ensures full compatibility with downstream machine learning pipelines and enables direct comparison with alternative representations.</w:t>
+        <w:t>As with the other embedding methods, the resulting vectors were stored in float64 format and exported as a tab-separated values (.</w:t>
+      </w:r>
+      <w:proofErr w:type="spellStart"/>
+      <w:r>
+        <w:rPr>
+          <w:lang w:val="en-GB"/>
+        </w:rPr>
+        <w:t>tsv</w:t>
+      </w:r>
+      <w:proofErr w:type="spellEnd"/>
+      <w:r>
+        <w:rPr>
+          <w:lang w:val="en-GB"/>
+        </w:rPr>
+        <w:t xml:space="preserve">) file, with rows indexed by </w:t>
+      </w:r>
+      <w:proofErr w:type="spellStart"/>
+      <w:r>
+        <w:rPr>
+          <w:lang w:val="en-GB"/>
+        </w:rPr>
+        <w:t>DrugBank</w:t>
+      </w:r>
+      <w:proofErr w:type="spellEnd"/>
+      <w:r>
+        <w:rPr>
+          <w:lang w:val="en-GB"/>
+        </w:rPr>
+        <w:t xml:space="preserve"> ID and columns </w:t>
+      </w:r>
+      <w:proofErr w:type="spellStart"/>
+      <w:r>
+        <w:rPr>
+          <w:lang w:val="en-GB"/>
+        </w:rPr>
+        <w:t>labeled</w:t>
+      </w:r>
+      <w:proofErr w:type="spellEnd"/>
+      <w:r>
+        <w:rPr>
+          <w:lang w:val="en-GB"/>
+        </w:rPr>
+        <w:t xml:space="preserve"> from 0 to 383. This ensures full compatibility with downstream </w:t>
+      </w:r>
+      <w:r>
+        <w:rPr>
+          <w:lang w:val="en-GB"/>
+        </w:rPr>
+        <w:t>ML</w:t>
+      </w:r>
+      <w:r>
+        <w:rPr>
+          <w:lang w:val="en-GB"/>
+        </w:rPr>
+        <w:t xml:space="preserve"> pipelines and enables direct comparison with alternative representations.</w:t>
       </w:r>
     </w:p>
     <w:p>
@@ -23144,7 +24752,7 @@
                     <pic:cNvPicPr/>
                   </pic:nvPicPr>
                   <pic:blipFill rotWithShape="1">
-                    <a:blip r:embed="rId31"/>
+                    <a:blip r:embed="rId32"/>
                     <a:srcRect l="373" t="1988" r="1"/>
                     <a:stretch>
                       <a:fillRect/>
@@ -23205,7 +24813,7 @@
           <w:noProof/>
           <w:lang w:val="en-GB"/>
         </w:rPr>
-        <w:t>10</w:t>
+        <w:t>11</w:t>
       </w:r>
       <w:r>
         <w:rPr>
@@ -23312,6 +24920,306 @@
     </w:p>
     <w:p>
       <w:pPr>
+        <w:rPr>
+          <w:lang w:val="en-GB" w:eastAsia="en-GB"/>
+        </w:rPr>
+      </w:pPr>
+      <w:r>
+        <w:rPr>
+          <w:lang w:val="en-GB" w:eastAsia="en-GB"/>
+        </w:rPr>
+        <w:t>To ensure a fair and interpretable comparison between molecular representations, no explicit feature</w:t>
+      </w:r>
+      <w:r>
+        <w:rPr>
+          <w:lang w:val="en-GB" w:eastAsia="en-GB"/>
+        </w:rPr>
+        <w:t>-</w:t>
+      </w:r>
+      <w:r>
+        <w:rPr>
+          <w:lang w:val="en-GB" w:eastAsia="en-GB"/>
+        </w:rPr>
+        <w:t>selection procedure was applied prior to model training. All molecular descriptors generated during the representation stage were retained in their complete form and used directly as inputs to the predictive models. This decision was made to preserve the original information content of each representation and to ensure that performance differences could be attributed primarily to the representations themselves rather than to additional featur</w:t>
+      </w:r>
+      <w:r>
+        <w:rPr>
+          <w:lang w:val="en-GB" w:eastAsia="en-GB"/>
+        </w:rPr>
+        <w:t>e-</w:t>
+      </w:r>
+      <w:r>
+        <w:rPr>
+          <w:lang w:val="en-GB" w:eastAsia="en-GB"/>
+        </w:rPr>
+        <w:t>engineering choices.</w:t>
+      </w:r>
+    </w:p>
+    <w:p>
+      <w:pPr>
+        <w:rPr>
+          <w:lang w:val="en-GB" w:eastAsia="en-GB"/>
+        </w:rPr>
+      </w:pPr>
+      <w:r>
+        <w:rPr>
+          <w:lang w:val="en-GB" w:eastAsia="en-GB"/>
+        </w:rPr>
+        <w:t>Consequently, no filter</w:t>
+      </w:r>
+      <w:r>
+        <w:rPr>
+          <w:lang w:val="en-GB" w:eastAsia="en-GB"/>
+        </w:rPr>
+        <w:t>-</w:t>
+      </w:r>
+      <w:r>
+        <w:rPr>
+          <w:lang w:val="en-GB" w:eastAsia="en-GB"/>
+        </w:rPr>
+        <w:t>based methods (e.g., variance or correlation filtering</w:t>
+      </w:r>
+      <w:r>
+        <w:rPr>
+          <w:lang w:val="en-GB" w:eastAsia="en-GB"/>
+        </w:rPr>
+        <w:t xml:space="preserve"> </w:t>
+      </w:r>
+      <w:r>
+        <w:rPr>
+          <w:lang w:val="en-GB" w:eastAsia="en-GB"/>
+        </w:rPr>
+        <w:t>or dimensionality</w:t>
+      </w:r>
+      <w:r>
+        <w:rPr>
+          <w:lang w:val="en-GB" w:eastAsia="en-GB"/>
+        </w:rPr>
+        <w:t>-</w:t>
+      </w:r>
+      <w:r>
+        <w:rPr>
+          <w:lang w:val="en-GB" w:eastAsia="en-GB"/>
+        </w:rPr>
+        <w:t>reduction techniques such as Principal Component Analysis were employed. Likewise, no feature scaling or normalization was incorporated as part of the feature</w:t>
+      </w:r>
+      <w:r>
+        <w:rPr>
+          <w:lang w:val="en-GB" w:eastAsia="en-GB"/>
+        </w:rPr>
+        <w:t>-</w:t>
+      </w:r>
+      <w:r>
+        <w:rPr>
+          <w:lang w:val="en-GB" w:eastAsia="en-GB"/>
+        </w:rPr>
+        <w:t>selection stage. All representations were therefore evaluated using their native feature spaces.</w:t>
+      </w:r>
+    </w:p>
+    <w:p>
+      <w:pPr>
+        <w:rPr>
+          <w:lang w:val="en-GB" w:eastAsia="en-GB"/>
+        </w:rPr>
+      </w:pPr>
+    </w:p>
+    <w:p>
+      <w:pPr>
+        <w:rPr>
+          <w:lang w:val="en-GB" w:eastAsia="en-GB"/>
+        </w:rPr>
+      </w:pPr>
+      <w:r>
+        <w:rPr>
+          <w:lang w:val="en-GB" w:eastAsia="en-GB"/>
+        </w:rPr>
+        <w:t>For the Morgan fingerprint representation, all 2,048 count-based ECFP6 features were retained. These fingerprints constitute a sparse, high</w:t>
+      </w:r>
+      <w:r>
+        <w:rPr>
+          <w:lang w:val="en-GB" w:eastAsia="en-GB"/>
+        </w:rPr>
+        <w:t>-</w:t>
+      </w:r>
+      <w:r>
+        <w:rPr>
+          <w:lang w:val="en-GB" w:eastAsia="en-GB"/>
+        </w:rPr>
+        <w:t>dimensional representation in which each feature corresponds to the occurrence of a hashed molecular substructure. Such descriptor spaces are routinely used in cheminformatics and can be handled directly by both linear and tree</w:t>
+      </w:r>
+      <w:r>
+        <w:rPr>
+          <w:lang w:val="en-GB" w:eastAsia="en-GB"/>
+        </w:rPr>
+        <w:t>-</w:t>
+      </w:r>
+      <w:r>
+        <w:rPr>
+          <w:lang w:val="en-GB" w:eastAsia="en-GB"/>
+        </w:rPr>
+        <w:t xml:space="preserve">based </w:t>
+      </w:r>
+      <w:r>
+        <w:rPr>
+          <w:lang w:val="en-GB" w:eastAsia="en-GB"/>
+        </w:rPr>
+        <w:t>ML</w:t>
+      </w:r>
+      <w:r>
+        <w:rPr>
+          <w:lang w:val="en-GB" w:eastAsia="en-GB"/>
+        </w:rPr>
+        <w:t xml:space="preserve"> algorithms.</w:t>
+      </w:r>
+    </w:p>
+    <w:p>
+      <w:pPr>
+        <w:rPr>
+          <w:lang w:val="en-GB" w:eastAsia="en-GB"/>
+        </w:rPr>
+      </w:pPr>
+    </w:p>
+    <w:p>
+      <w:pPr>
+        <w:rPr>
+          <w:lang w:val="en-GB" w:eastAsia="en-GB"/>
+        </w:rPr>
+      </w:pPr>
+      <w:r>
+        <w:rPr>
+          <w:lang w:val="en-GB" w:eastAsia="en-GB"/>
+        </w:rPr>
+        <w:t>For the embedding-based representations, the complete latent vectors produced by each encoder were preserved without modification. This included the 1,000</w:t>
+      </w:r>
+      <w:r>
+        <w:rPr>
+          <w:lang w:val="en-GB" w:eastAsia="en-GB"/>
+        </w:rPr>
+        <w:t>-</w:t>
+      </w:r>
+      <w:r>
+        <w:rPr>
+          <w:lang w:val="en-GB" w:eastAsia="en-GB"/>
+        </w:rPr>
+        <w:t>dimensional MolE embeddings, the 768-dimensional ChemBERTa embeddings, and the 384</w:t>
+      </w:r>
+      <w:r>
+        <w:rPr>
+          <w:lang w:val="en-GB" w:eastAsia="en-GB"/>
+        </w:rPr>
+        <w:t>-</w:t>
+      </w:r>
+      <w:r>
+        <w:rPr>
+          <w:lang w:val="en-GB" w:eastAsia="en-GB"/>
+        </w:rPr>
+        <w:t>dimensional embeddings generated by the author-trained InChI language model. Unlike handcrafted fingerprints, these representations already constitute compressed feature spaces learned during pretraining. Applying additional dimensionality reduction could therefore remove information already encoded by the embedding models and potentially hinder a fair assessment of their representational capacity.</w:t>
+      </w:r>
+    </w:p>
+    <w:p>
+      <w:pPr>
+        <w:rPr>
+          <w:lang w:val="en-GB" w:eastAsia="en-GB"/>
+        </w:rPr>
+      </w:pPr>
+    </w:p>
+    <w:p>
+      <w:pPr>
+        <w:rPr>
+          <w:lang w:val="en-GB" w:eastAsia="en-GB"/>
+        </w:rPr>
+      </w:pPr>
+      <w:r>
+        <w:rPr>
+          <w:lang w:val="en-GB" w:eastAsia="en-GB"/>
+        </w:rPr>
+        <w:t xml:space="preserve">It is important to note that some of the evaluated algorithms incorporate mechanisms that can implicitly reduce the influence of less informative variables during training. </w:t>
+      </w:r>
+      <w:proofErr w:type="gramStart"/>
+      <w:r>
+        <w:rPr>
+          <w:lang w:val="en-GB" w:eastAsia="en-GB"/>
+        </w:rPr>
+        <w:t xml:space="preserve">In particular, </w:t>
+      </w:r>
+      <w:r>
+        <w:rPr>
+          <w:lang w:val="en-GB" w:eastAsia="en-GB"/>
+        </w:rPr>
+        <w:t>LR</w:t>
+      </w:r>
+      <w:proofErr w:type="gramEnd"/>
+      <w:r>
+        <w:rPr>
+          <w:lang w:val="en-GB" w:eastAsia="en-GB"/>
+        </w:rPr>
+        <w:t xml:space="preserve"> </w:t>
+      </w:r>
+      <w:r>
+        <w:rPr>
+          <w:lang w:val="en-GB" w:eastAsia="en-GB"/>
+        </w:rPr>
+        <w:t xml:space="preserve">may perform coefficient shrinkage through regularization, while </w:t>
+      </w:r>
+      <w:r>
+        <w:rPr>
+          <w:lang w:val="en-GB" w:eastAsia="en-GB"/>
+        </w:rPr>
+        <w:t>RF</w:t>
+      </w:r>
+      <w:r>
+        <w:rPr>
+          <w:lang w:val="en-GB" w:eastAsia="en-GB"/>
+        </w:rPr>
+        <w:t xml:space="preserve"> and XGBoost naturally prioritize informative features when constructing decision trees. However, these processes occur as part of model fitting and were not considered a separate feature</w:t>
+      </w:r>
+      <w:r>
+        <w:rPr>
+          <w:lang w:val="en-GB" w:eastAsia="en-GB"/>
+        </w:rPr>
+        <w:t>-</w:t>
+      </w:r>
+      <w:r>
+        <w:rPr>
+          <w:lang w:val="en-GB" w:eastAsia="en-GB"/>
+        </w:rPr>
+        <w:t>selection stage within the benchmark.</w:t>
+      </w:r>
+    </w:p>
+    <w:p>
+      <w:pPr>
+        <w:rPr>
+          <w:lang w:val="en-GB" w:eastAsia="en-GB"/>
+        </w:rPr>
+      </w:pPr>
+    </w:p>
+    <w:p>
+      <w:pPr>
+        <w:rPr>
+          <w:lang w:val="en-GB" w:eastAsia="en-GB"/>
+        </w:rPr>
+      </w:pPr>
+      <w:r>
+        <w:rPr>
+          <w:lang w:val="en-GB" w:eastAsia="en-GB"/>
+        </w:rPr>
+        <w:t>Overall, all representation</w:t>
+      </w:r>
+      <w:r>
+        <w:rPr>
+          <w:lang w:val="en-GB" w:eastAsia="en-GB"/>
+        </w:rPr>
+        <w:t>-</w:t>
+      </w:r>
+      <w:r>
+        <w:rPr>
+          <w:lang w:val="en-GB" w:eastAsia="en-GB"/>
+        </w:rPr>
+        <w:t>model combinations were trained using the complete feature spaces generated during preprocessing. This approach ensured methodological consistency across the benchmark and allowed the comparison to focus on the predictive value of the molecular representations rather than on representation-specific feature-engineering procedures.</w:t>
+      </w:r>
+    </w:p>
+    <w:p>
+      <w:pPr>
         <w:pStyle w:val="Heading2"/>
         <w:rPr>
           <w:lang w:val="en-GB" w:eastAsia="en-GB"/>
@@ -23322,6 +25230,7 @@
         <w:rPr>
           <w:lang w:val="en-GB" w:eastAsia="en-GB"/>
         </w:rPr>
+        <w:lastRenderedPageBreak/>
         <w:t>Data</w:t>
       </w:r>
       <w:r>
@@ -24192,7 +26101,6 @@
               <w:color w:val="000000"/>
               <w:lang w:val="en-GB"/>
             </w:rPr>
-            <w:lastRenderedPageBreak/>
             <w:t>[9]</w:t>
           </w:r>
           <w:r>
@@ -24238,7 +26146,16 @@
               <w:color w:val="000000"/>
               <w:lang w:val="en-GB"/>
             </w:rPr>
-            <w:t xml:space="preserve"> 3.0: an updated comprehensive online ADMET prediction platform enhanced with broader coverage, improved performance, API functionality and decision support,” </w:t>
+            <w:t xml:space="preserve"> 3.0: an updated comprehensive online ADMET prediction platform enhanced with broader coverage, improved performance, API functionality and decision </w:t>
+          </w:r>
+          <w:r>
+            <w:rPr>
+              <w:rFonts w:ascii="Calibri" w:eastAsia="Times New Roman" w:hAnsi="Calibri" w:cs="Calibri"/>
+              <w:color w:val="000000"/>
+              <w:lang w:val="en-GB"/>
+            </w:rPr>
+            <w:lastRenderedPageBreak/>
+            <w:t xml:space="preserve">support,” </w:t>
           </w:r>
           <w:r>
             <w:rPr>
@@ -25229,7 +27146,6 @@
               <w:color w:val="000000"/>
               <w:lang w:val="en-GB"/>
             </w:rPr>
-            <w:lastRenderedPageBreak/>
             <w:t>[22]</w:t>
           </w:r>
           <w:r>
@@ -25313,7 +27229,16 @@
               <w:color w:val="000000"/>
               <w:lang w:val="en-GB"/>
             </w:rPr>
-            <w:t>, vol. abs/1609.04836, 2016, [Online]. Available: https://api.semanticscholar.org/CorpusID:5834589</w:t>
+            <w:t xml:space="preserve">, vol. </w:t>
+          </w:r>
+          <w:r>
+            <w:rPr>
+              <w:rFonts w:ascii="Calibri" w:eastAsia="Times New Roman" w:hAnsi="Calibri" w:cs="Calibri"/>
+              <w:color w:val="000000"/>
+              <w:lang w:val="en-GB"/>
+            </w:rPr>
+            <w:lastRenderedPageBreak/>
+            <w:t>abs/1609.04836, 2016, [Online]. Available: https://api.semanticscholar.org/CorpusID:5834589</w:t>
           </w:r>
         </w:p>
         <w:p>
@@ -26438,7 +28363,6 @@
               <w:color w:val="000000"/>
               <w:lang w:val="en-GB"/>
             </w:rPr>
-            <w:lastRenderedPageBreak/>
             <w:t>[36]</w:t>
           </w:r>
           <w:r>
@@ -26448,7 +28372,25 @@
               <w:lang w:val="en-GB"/>
             </w:rPr>
             <w:tab/>
-            <w:t xml:space="preserve">G. Wu and J. Zhu, “Multi-label classification: do hamming loss and subset accuracy really conflict with each other?,” </w:t>
+            <w:t xml:space="preserve">G. Wu and J. Zhu, “Multi-label classification: do hamming loss and subset accuracy really conflict with each </w:t>
+          </w:r>
+          <w:proofErr w:type="gramStart"/>
+          <w:r>
+            <w:rPr>
+              <w:rFonts w:ascii="Calibri" w:eastAsia="Times New Roman" w:hAnsi="Calibri" w:cs="Calibri"/>
+              <w:color w:val="000000"/>
+              <w:lang w:val="en-GB"/>
+            </w:rPr>
+            <w:t>other?,</w:t>
+          </w:r>
+          <w:proofErr w:type="gramEnd"/>
+          <w:r>
+            <w:rPr>
+              <w:rFonts w:ascii="Calibri" w:eastAsia="Times New Roman" w:hAnsi="Calibri" w:cs="Calibri"/>
+              <w:color w:val="000000"/>
+              <w:lang w:val="en-GB"/>
+            </w:rPr>
+            <w:t xml:space="preserve">” </w:t>
           </w:r>
           <w:r>
             <w:rPr>
@@ -26487,6 +28429,7 @@
               <w:color w:val="000000"/>
               <w:lang w:val="en-GB"/>
             </w:rPr>
+            <w:lastRenderedPageBreak/>
             <w:t>[37]</w:t>
           </w:r>
           <w:r>
@@ -27122,6 +29065,7 @@
         </w:rPr>
         <w:t>“</w:t>
       </w:r>
+      <w:proofErr w:type="spellStart"/>
       <w:r>
         <w:rPr>
           <w:lang w:val="en-GB"/>
@@ -27132,7 +29076,14 @@
         <w:rPr>
           <w:lang w:val="en-GB"/>
         </w:rPr>
-        <w:t>.tsv”</w:t>
+        <w:t>.tsv</w:t>
+      </w:r>
+      <w:proofErr w:type="spellEnd"/>
+      <w:r>
+        <w:rPr>
+          <w:lang w:val="en-GB"/>
+        </w:rPr>
+        <w:t>”</w:t>
       </w:r>
     </w:p>
     <w:p>
@@ -27150,7 +29101,14 @@
         <w:rPr>
           <w:lang w:val="en-GB"/>
         </w:rPr>
-        <w:t>“MolE</w:t>
+        <w:t>“</w:t>
+      </w:r>
+      <w:proofErr w:type="spellStart"/>
+      <w:r>
+        <w:rPr>
+          <w:lang w:val="en-GB"/>
+        </w:rPr>
+        <w:t>MolE</w:t>
       </w:r>
       <w:r>
         <w:rPr>
@@ -27162,7 +29120,14 @@
         <w:rPr>
           <w:lang w:val="en-GB"/>
         </w:rPr>
-        <w:t>.tsv”</w:t>
+        <w:t>.tsv</w:t>
+      </w:r>
+      <w:proofErr w:type="spellEnd"/>
+      <w:r>
+        <w:rPr>
+          <w:lang w:val="en-GB"/>
+        </w:rPr>
+        <w:t>”</w:t>
       </w:r>
     </w:p>
     <w:p>
@@ -27258,6 +29223,7 @@
         </w:rPr>
         <w:t>“</w:t>
       </w:r>
+      <w:proofErr w:type="spellStart"/>
       <w:r>
         <w:rPr>
           <w:lang w:val="en-GB"/>
@@ -27268,12 +29234,19 @@
         <w:rPr>
           <w:lang w:val="en-GB"/>
         </w:rPr>
-        <w:t>.tsv”</w:t>
+        <w:t>.tsv</w:t>
+      </w:r>
+      <w:proofErr w:type="spellEnd"/>
+      <w:r>
+        <w:rPr>
+          <w:lang w:val="en-GB"/>
+        </w:rPr>
+        <w:t>”</w:t>
       </w:r>
     </w:p>
     <w:sectPr>
-      <w:footerReference w:type="default" r:id="rId32"/>
-      <w:footerReference w:type="first" r:id="rId33"/>
+      <w:footerReference w:type="default" r:id="rId33"/>
+      <w:footerReference w:type="first" r:id="rId34"/>
       <w:pgSz w:w="11906" w:h="16838" w:code="9"/>
       <w:pgMar w:top="-1985" w:right="1276" w:bottom="993" w:left="1701" w:header="709" w:footer="439" w:gutter="0"/>
       <w:pgNumType w:start="3"/>
@@ -27532,7 +29505,7 @@
         <v:path o:extrusionok="f" gradientshapeok="t" o:connecttype="rect"/>
         <o:lock v:ext="edit" aspectratio="t"/>
       </v:shapetype>
-      <v:shape id="_x0000_i1025" type="#_x0000_t75" style="width:170.05pt;height:170.05pt;visibility:visible" o:bullet="t">
+      <v:shape id="_x0000_i1025" type="#_x0000_t75" style="width:170pt;height:170pt;visibility:visible" o:bullet="t">
         <v:imagedata r:id="rId1" o:title=""/>
       </v:shape>
     </w:pict>
@@ -32063,6 +34036,7 @@
     <w:rsid w:val="00203B50"/>
     <w:rsid w:val="00222139"/>
     <w:rsid w:val="00253AC9"/>
+    <w:rsid w:val="002548A9"/>
     <w:rsid w:val="0029472C"/>
     <w:rsid w:val="002F3C94"/>
     <w:rsid w:val="003012D3"/>
@@ -32072,6 +34046,7 @@
     <w:rsid w:val="004026C8"/>
     <w:rsid w:val="0041339E"/>
     <w:rsid w:val="004206C1"/>
+    <w:rsid w:val="00431196"/>
     <w:rsid w:val="0048101E"/>
     <w:rsid w:val="0049572F"/>
     <w:rsid w:val="004B78DD"/>
@@ -32081,6 +34056,7 @@
     <w:rsid w:val="00540188"/>
     <w:rsid w:val="005523F1"/>
     <w:rsid w:val="005B0E3B"/>
+    <w:rsid w:val="005B2D6B"/>
     <w:rsid w:val="00627190"/>
     <w:rsid w:val="00640100"/>
     <w:rsid w:val="00696189"/>
@@ -32104,7 +34080,9 @@
     <w:rsid w:val="00A3335C"/>
     <w:rsid w:val="00A608F3"/>
     <w:rsid w:val="00A72DA5"/>
+    <w:rsid w:val="00A967C2"/>
     <w:rsid w:val="00AE4F19"/>
+    <w:rsid w:val="00BB3B99"/>
     <w:rsid w:val="00BD2AF9"/>
     <w:rsid w:val="00BE65ED"/>
     <w:rsid w:val="00C74BBF"/>
@@ -32112,14 +34090,15 @@
     <w:rsid w:val="00CD7C1A"/>
     <w:rsid w:val="00CE0FDD"/>
     <w:rsid w:val="00CE7C62"/>
-    <w:rsid w:val="00D81260"/>
     <w:rsid w:val="00DA32C3"/>
+    <w:rsid w:val="00DB7059"/>
     <w:rsid w:val="00E01D79"/>
     <w:rsid w:val="00E54388"/>
     <w:rsid w:val="00E94EA6"/>
     <w:rsid w:val="00EE0F88"/>
     <w:rsid w:val="00F02213"/>
     <w:rsid w:val="00F05D7A"/>
+    <w:rsid w:val="00F454D2"/>
     <w:rsid w:val="00FB4BB7"/>
     <w:rsid w:val="00FD4788"/>
     <w:rsid w:val="00FF0BFB"/>
@@ -32880,6 +34859,15 @@
 </file>
 
 <file path=customXml/item1.xml><?xml version="1.0" encoding="utf-8"?>
+<?mso-contentType ?>
+<FormTemplates xmlns="http://schemas.microsoft.com/sharepoint/v3/contenttype/forms">
+  <Display>DocumentLibraryForm</Display>
+  <Edit>DocumentLibraryForm</Edit>
+  <New>DocumentLibraryForm</New>
+</FormTemplates>
+</file>
+
+<file path=customXml/item2.xml><?xml version="1.0" encoding="utf-8"?>
 <p:properties xmlns:p="http://schemas.microsoft.com/office/2006/metadata/properties" xmlns:xsi="http://www.w3.org/2001/XMLSchema-instance" xmlns:pc="http://schemas.microsoft.com/office/infopath/2007/PartnerControls">
   <documentManagement>
     <lcf76f155ced4ddcb4097134ff3c332f xmlns="9d7b9a5c-6b4f-4ca1-bb03-c38cacb734bc">
@@ -32890,16 +34878,11 @@
 </p:properties>
 </file>
 
-<file path=customXml/item2.xml><?xml version="1.0" encoding="utf-8"?>
-<?mso-contentType ?>
-<FormTemplates xmlns="http://schemas.microsoft.com/sharepoint/v3/contenttype/forms">
-  <Display>DocumentLibraryForm</Display>
-  <Edit>DocumentLibraryForm</Edit>
-  <New>DocumentLibraryForm</New>
-</FormTemplates>
+<file path=customXml/item3.xml><?xml version="1.0" encoding="utf-8"?>
+<b:Sources xmlns:b="http://schemas.openxmlformats.org/officeDocument/2006/bibliography" xmlns="http://schemas.openxmlformats.org/officeDocument/2006/bibliography" SelectedStyle="\APASixthEditionOfficeOnline.xsl" StyleName="APA" Version="6"/>
 </file>
 
-<file path=customXml/item3.xml><?xml version="1.0" encoding="utf-8"?>
+<file path=customXml/item4.xml><?xml version="1.0" encoding="utf-8"?>
 <ct:contentTypeSchema xmlns:ct="http://schemas.microsoft.com/office/2006/metadata/contentType" xmlns:ma="http://schemas.microsoft.com/office/2006/metadata/properties/metaAttributes" ct:_="" ma:_="" ma:contentTypeName="Documento" ma:contentTypeID="0x01010019FAAD7208B57F46B26AFFED99BCE0D3" ma:contentTypeVersion="16" ma:contentTypeDescription="Crear nuevo documento." ma:contentTypeScope="" ma:versionID="ad25a40a439e4eb6a750a8b6ae1789f7">
   <xsd:schema xmlns:xsd="http://www.w3.org/2001/XMLSchema" xmlns:xs="http://www.w3.org/2001/XMLSchema" xmlns:p="http://schemas.microsoft.com/office/2006/metadata/properties" xmlns:ns2="9d7b9a5c-6b4f-4ca1-bb03-c38cacb734bc" xmlns:ns3="7d80c08f-e909-465c-8aa4-0e649fbe85d0" xmlns:ns4="7302fe9c-5e91-4977-8271-167378b25bd2" targetNamespace="http://schemas.microsoft.com/office/2006/metadata/properties" ma:root="true" ma:fieldsID="113d448336e841d5d8efd4b9e74490d6" ns2:_="" ns3:_="" ns4:_="">
     <xsd:import namespace="9d7b9a5c-6b4f-4ca1-bb03-c38cacb734bc"/>
@@ -33147,11 +35130,15 @@
 </ct:contentTypeSchema>
 </file>
 
-<file path=customXml/item4.xml><?xml version="1.0" encoding="utf-8"?>
-<b:Sources xmlns:b="http://schemas.openxmlformats.org/officeDocument/2006/bibliography" xmlns="http://schemas.openxmlformats.org/officeDocument/2006/bibliography" SelectedStyle="\APASixthEditionOfficeOnline.xsl" StyleName="APA" Version="6"/>
+<file path=customXml/itemProps1.xml><?xml version="1.0" encoding="utf-8"?>
+<ds:datastoreItem xmlns:ds="http://schemas.openxmlformats.org/officeDocument/2006/customXml" ds:itemID="{E5FD6A2B-9479-4129-9D84-6C858DBE1A90}">
+  <ds:schemaRefs>
+    <ds:schemaRef ds:uri="http://schemas.microsoft.com/sharepoint/v3/contenttype/forms"/>
+  </ds:schemaRefs>
+</ds:datastoreItem>
 </file>
 
-<file path=customXml/itemProps1.xml><?xml version="1.0" encoding="utf-8"?>
+<file path=customXml/itemProps2.xml><?xml version="1.0" encoding="utf-8"?>
 <ds:datastoreItem xmlns:ds="http://schemas.openxmlformats.org/officeDocument/2006/customXml" ds:itemID="{261B0A37-6C6C-45CF-A5C4-83D994BC3980}">
   <ds:schemaRefs>
     <ds:schemaRef ds:uri="http://schemas.microsoft.com/office/2006/metadata/properties"/>
@@ -33162,15 +35149,15 @@
 </ds:datastoreItem>
 </file>
 
-<file path=customXml/itemProps2.xml><?xml version="1.0" encoding="utf-8"?>
-<ds:datastoreItem xmlns:ds="http://schemas.openxmlformats.org/officeDocument/2006/customXml" ds:itemID="{E5FD6A2B-9479-4129-9D84-6C858DBE1A90}">
+<file path=customXml/itemProps3.xml><?xml version="1.0" encoding="utf-8"?>
+<ds:datastoreItem xmlns:ds="http://schemas.openxmlformats.org/officeDocument/2006/customXml" ds:itemID="{5157238F-F555-4D04-860C-F98429B609BD}">
   <ds:schemaRefs>
-    <ds:schemaRef ds:uri="http://schemas.microsoft.com/sharepoint/v3/contenttype/forms"/>
+    <ds:schemaRef ds:uri="http://schemas.openxmlformats.org/officeDocument/2006/bibliography"/>
   </ds:schemaRefs>
 </ds:datastoreItem>
 </file>
 
-<file path=customXml/itemProps3.xml><?xml version="1.0" encoding="utf-8"?>
+<file path=customXml/itemProps4.xml><?xml version="1.0" encoding="utf-8"?>
 <ds:datastoreItem xmlns:ds="http://schemas.openxmlformats.org/officeDocument/2006/customXml" ds:itemID="{BC4311AC-D0D5-4AE9-8386-76BDCE1C82F3}">
   <ds:schemaRefs>
     <ds:schemaRef ds:uri="http://schemas.microsoft.com/office/2006/metadata/contentType"/>
@@ -33188,12 +35175,4 @@
     <ds:schemaRef ds:uri="http://schemas.microsoft.com/internal/obd"/>
   </ds:schemaRefs>
 </ds:datastoreItem>
-</file>
-
-<file path=customXml/itemProps4.xml><?xml version="1.0" encoding="utf-8"?>
-<ds:datastoreItem xmlns:ds="http://schemas.openxmlformats.org/officeDocument/2006/customXml" ds:itemID="{5157238F-F555-4D04-860C-F98429B609BD}">
-  <ds:schemaRefs>
-    <ds:schemaRef ds:uri="http://schemas.openxmlformats.org/officeDocument/2006/bibliography"/>
-  </ds:schemaRefs>
-</ds:datastoreItem>
 </file>
</xml_diff>

<commit_message>
Refactor and enhance drug metabolism prediction pipeline
- Updated documentation in the TFM Drug Metabolism report to include detailed analysis of the curated metabolism database, highlighting the distribution of CYP450 annotations and the implications for model training.
- Added iteration count logging to the logistic regression predictor for better tracking of training progress.
- Removed deprecated XGBoost model training script, consolidating functionality into the main pipeline for improved maintainability and clarity.
</commit_message>
<xml_diff>
--- a/Memorias/TFM Drug Metabolism - Gonzalo Robles.docx
+++ b/Memorias/TFM Drug Metabolism - Gonzalo Robles.docx
@@ -14766,6 +14766,7 @@
                 <w:lang w:val="en-GB"/>
               </w:rPr>
             </w:pPr>
+            <w:proofErr w:type="spellStart"/>
             <w:r>
               <w:rPr>
                 <w:rFonts w:asciiTheme="minorHAnsi" w:eastAsiaTheme="minorEastAsia" w:hAnsiTheme="minorHAnsi" w:cstheme="minorBidi"/>
@@ -14774,6 +14775,7 @@
               </w:rPr>
               <w:t>max_iter</w:t>
             </w:r>
+            <w:proofErr w:type="spellEnd"/>
           </w:p>
         </w:tc>
         <w:tc>
@@ -16192,6 +16194,7 @@
                 <w:lang w:val="en-GB"/>
               </w:rPr>
             </w:pPr>
+            <w:proofErr w:type="spellStart"/>
             <w:r>
               <w:rPr>
                 <w:rFonts w:asciiTheme="minorHAnsi" w:eastAsiaTheme="minorEastAsia" w:hAnsiTheme="minorHAnsi" w:cstheme="minorBidi"/>
@@ -16200,6 +16203,7 @@
               </w:rPr>
               <w:t>max_depth</w:t>
             </w:r>
+            <w:proofErr w:type="spellEnd"/>
           </w:p>
         </w:tc>
         <w:tc>
@@ -16267,6 +16271,7 @@
                 <w:lang w:val="en-GB"/>
               </w:rPr>
             </w:pPr>
+            <w:proofErr w:type="spellStart"/>
             <w:r>
               <w:rPr>
                 <w:rFonts w:asciiTheme="minorHAnsi" w:eastAsiaTheme="minorEastAsia" w:hAnsiTheme="minorHAnsi" w:cstheme="minorBidi"/>
@@ -16283,6 +16288,7 @@
               </w:rPr>
               <w:t>in_samples_split</w:t>
             </w:r>
+            <w:proofErr w:type="spellEnd"/>
           </w:p>
         </w:tc>
         <w:tc>
@@ -16347,6 +16353,7 @@
                 <w:lang w:val="en-GB"/>
               </w:rPr>
             </w:pPr>
+            <w:proofErr w:type="spellStart"/>
             <w:r>
               <w:rPr>
                 <w:rFonts w:asciiTheme="minorHAnsi" w:eastAsiaTheme="minorEastAsia" w:hAnsiTheme="minorHAnsi" w:cstheme="minorBidi"/>
@@ -16355,6 +16362,7 @@
               </w:rPr>
               <w:t>max_features</w:t>
             </w:r>
+            <w:proofErr w:type="spellEnd"/>
           </w:p>
         </w:tc>
         <w:tc>
@@ -17756,6 +17764,7 @@
                 <w:lang w:val="en-GB" w:eastAsia="en-GB"/>
               </w:rPr>
             </w:pPr>
+            <w:proofErr w:type="spellStart"/>
             <w:r>
               <w:rPr>
                 <w:rFonts w:asciiTheme="minorHAnsi" w:eastAsia="Times New Roman" w:hAnsiTheme="minorHAnsi" w:cstheme="minorHAnsi"/>
@@ -17764,6 +17773,7 @@
               </w:rPr>
               <w:t>max_depth</w:t>
             </w:r>
+            <w:proofErr w:type="spellEnd"/>
           </w:p>
         </w:tc>
         <w:tc>
@@ -17832,6 +17842,7 @@
                 <w:lang w:val="en-GB" w:eastAsia="en-GB"/>
               </w:rPr>
             </w:pPr>
+            <w:proofErr w:type="spellStart"/>
             <w:r>
               <w:rPr>
                 <w:rFonts w:asciiTheme="minorHAnsi" w:eastAsia="Times New Roman" w:hAnsiTheme="minorHAnsi" w:cstheme="minorHAnsi"/>
@@ -17840,6 +17851,7 @@
               </w:rPr>
               <w:t>n_estimators</w:t>
             </w:r>
+            <w:proofErr w:type="spellEnd"/>
           </w:p>
         </w:tc>
         <w:tc>
@@ -20668,7 +20680,6 @@
                                 </w:rPr>
                                 <w:tab/>
                               </w:r>
-                              <w:proofErr w:type="gramStart"/>
                               <w:r>
                                 <w:rPr>
                                   <w:color w:val="000000" w:themeColor="text1"/>
@@ -20723,7 +20734,6 @@
                                 </w:rPr>
                                 <w:t>B</w:t>
                               </w:r>
-                              <w:proofErr w:type="gramEnd"/>
                             </w:p>
                           </w:txbxContent>
                         </wps:txbx>
@@ -20820,14 +20830,12 @@
                                 </w:rPr>
                                 <w:t>‘</w:t>
                               </w:r>
-                              <w:proofErr w:type="spellStart"/>
                               <w:r>
                                 <w:rPr>
                                   <w:lang w:val="en-GB"/>
                                 </w:rPr>
                                 <w:t>dict</w:t>
                               </w:r>
-                              <w:proofErr w:type="spellEnd"/>
                               <w:r>
                                 <w:rPr>
                                   <w:lang w:val="en-GB"/>
@@ -20844,35 +20852,7 @@
                                 <w:rPr>
                                   <w:lang w:val="en-GB"/>
                                 </w:rPr>
-                                <w:t xml:space="preserve"> for full </w:t>
-                              </w:r>
-                              <w:proofErr w:type="spellStart"/>
-                              <w:r>
-                                <w:rPr>
-                                  <w:lang w:val="en-GB"/>
-                                </w:rPr>
-                                <w:t>db</w:t>
-                              </w:r>
-                              <w:proofErr w:type="spellEnd"/>
-                              <w:r>
-                                <w:rPr>
-                                  <w:lang w:val="en-GB"/>
-                                </w:rPr>
-                                <w:t xml:space="preserve"> (A) and curated </w:t>
-                              </w:r>
-                              <w:proofErr w:type="spellStart"/>
-                              <w:r>
-                                <w:rPr>
-                                  <w:lang w:val="en-GB"/>
-                                </w:rPr>
-                                <w:t>db</w:t>
-                              </w:r>
-                              <w:proofErr w:type="spellEnd"/>
-                              <w:r>
-                                <w:rPr>
-                                  <w:lang w:val="en-GB"/>
-                                </w:rPr>
-                                <w:t xml:space="preserve"> with threshold = </w:t>
+                                <w:t xml:space="preserve"> for full db (A) and curated db with threshold = </w:t>
                               </w:r>
                               <w:r>
                                 <w:rPr>
@@ -20898,8 +20878,6 @@
                                 </w:rPr>
                                 <w:t xml:space="preserve">  </w:t>
                               </w:r>
-                              <w:proofErr w:type="spellStart"/>
-                              <w:proofErr w:type="gramStart"/>
                               <w:r>
                                 <w:rPr>
                                   <w:lang w:val="en-GB"/>
@@ -20910,46 +20888,10 @@
                                 <w:rPr>
                                   <w:lang w:val="en-GB"/>
                                 </w:rPr>
-                                <w:t>t</w:t>
-                              </w:r>
-                              <w:proofErr w:type="spellEnd"/>
-                              <w:r>
-                                <w:rPr>
-                                  <w:lang w:val="en-GB"/>
-                                </w:rPr>
-                                <w:t>( CYP</w:t>
-                              </w:r>
-                              <w:proofErr w:type="gramEnd"/>
-                              <w:r>
-                                <w:rPr>
-                                  <w:lang w:val="en-GB"/>
-                                </w:rPr>
-                                <w:t xml:space="preserve"> </w:t>
-                              </w:r>
-                              <w:proofErr w:type="gramStart"/>
-                              <w:r>
-                                <w:rPr>
-                                  <w:lang w:val="en-GB"/>
-                                </w:rPr>
-                                <w:t>name :</w:t>
-                              </w:r>
-                              <w:proofErr w:type="gramEnd"/>
-                              <w:r>
-                                <w:rPr>
-                                  <w:lang w:val="en-GB"/>
-                                </w:rPr>
-                                <w:t xml:space="preserve"> Nº of </w:t>
-                              </w:r>
-                              <w:proofErr w:type="gramStart"/>
-                              <w:r>
-                                <w:rPr>
-                                  <w:lang w:val="en-GB"/>
-                                </w:rPr>
-                                <w:t>appearances )</w:t>
+                                <w:t>t( CYP name : Nº of appearances )</w:t>
                               </w:r>
                               <w:bookmarkEnd w:id="42"/>
                               <w:bookmarkEnd w:id="43"/>
-                              <w:proofErr w:type="gramEnd"/>
                             </w:p>
                           </w:txbxContent>
                         </wps:txbx>
@@ -21096,7 +21038,6 @@
                           </w:rPr>
                           <w:tab/>
                         </w:r>
-                        <w:proofErr w:type="gramStart"/>
                         <w:r>
                           <w:rPr>
                             <w:color w:val="000000" w:themeColor="text1"/>
@@ -21151,7 +21092,6 @@
                           </w:rPr>
                           <w:t>B</w:t>
                         </w:r>
-                        <w:proofErr w:type="gramEnd"/>
                       </w:p>
                     </w:txbxContent>
                   </v:textbox>
@@ -21225,14 +21165,12 @@
                           </w:rPr>
                           <w:t>‘</w:t>
                         </w:r>
-                        <w:proofErr w:type="spellStart"/>
                         <w:r>
                           <w:rPr>
                             <w:lang w:val="en-GB"/>
                           </w:rPr>
                           <w:t>dict</w:t>
                         </w:r>
-                        <w:proofErr w:type="spellEnd"/>
                         <w:r>
                           <w:rPr>
                             <w:lang w:val="en-GB"/>
@@ -21249,35 +21187,7 @@
                           <w:rPr>
                             <w:lang w:val="en-GB"/>
                           </w:rPr>
-                          <w:t xml:space="preserve"> for full </w:t>
-                        </w:r>
-                        <w:proofErr w:type="spellStart"/>
-                        <w:r>
-                          <w:rPr>
-                            <w:lang w:val="en-GB"/>
-                          </w:rPr>
-                          <w:t>db</w:t>
-                        </w:r>
-                        <w:proofErr w:type="spellEnd"/>
-                        <w:r>
-                          <w:rPr>
-                            <w:lang w:val="en-GB"/>
-                          </w:rPr>
-                          <w:t xml:space="preserve"> (A) and curated </w:t>
-                        </w:r>
-                        <w:proofErr w:type="spellStart"/>
-                        <w:r>
-                          <w:rPr>
-                            <w:lang w:val="en-GB"/>
-                          </w:rPr>
-                          <w:t>db</w:t>
-                        </w:r>
-                        <w:proofErr w:type="spellEnd"/>
-                        <w:r>
-                          <w:rPr>
-                            <w:lang w:val="en-GB"/>
-                          </w:rPr>
-                          <w:t xml:space="preserve"> with threshold = </w:t>
+                          <w:t xml:space="preserve"> for full db (A) and curated db with threshold = </w:t>
                         </w:r>
                         <w:r>
                           <w:rPr>
@@ -21303,8 +21213,6 @@
                           </w:rPr>
                           <w:t xml:space="preserve">  </w:t>
                         </w:r>
-                        <w:proofErr w:type="spellStart"/>
-                        <w:proofErr w:type="gramStart"/>
                         <w:r>
                           <w:rPr>
                             <w:lang w:val="en-GB"/>
@@ -21315,46 +21223,10 @@
                           <w:rPr>
                             <w:lang w:val="en-GB"/>
                           </w:rPr>
-                          <w:t>t</w:t>
-                        </w:r>
-                        <w:proofErr w:type="spellEnd"/>
-                        <w:r>
-                          <w:rPr>
-                            <w:lang w:val="en-GB"/>
-                          </w:rPr>
-                          <w:t>( CYP</w:t>
-                        </w:r>
-                        <w:proofErr w:type="gramEnd"/>
-                        <w:r>
-                          <w:rPr>
-                            <w:lang w:val="en-GB"/>
-                          </w:rPr>
-                          <w:t xml:space="preserve"> </w:t>
-                        </w:r>
-                        <w:proofErr w:type="gramStart"/>
-                        <w:r>
-                          <w:rPr>
-                            <w:lang w:val="en-GB"/>
-                          </w:rPr>
-                          <w:t>name :</w:t>
-                        </w:r>
-                        <w:proofErr w:type="gramEnd"/>
-                        <w:r>
-                          <w:rPr>
-                            <w:lang w:val="en-GB"/>
-                          </w:rPr>
-                          <w:t xml:space="preserve"> Nº of </w:t>
-                        </w:r>
-                        <w:proofErr w:type="gramStart"/>
-                        <w:r>
-                          <w:rPr>
-                            <w:lang w:val="en-GB"/>
-                          </w:rPr>
-                          <w:t>appearances )</w:t>
+                          <w:t>t( CYP name : Nº of appearances )</w:t>
                         </w:r>
                         <w:bookmarkEnd w:id="45"/>
                         <w:bookmarkEnd w:id="46"/>
-                        <w:proofErr w:type="gramEnd"/>
                       </w:p>
                     </w:txbxContent>
                   </v:textbox>
@@ -23012,48 +22884,564 @@
     <w:p>
       <w:pPr>
         <w:pStyle w:val="Heading3"/>
-        <w:jc w:val="both"/>
-        <w:rPr>
-          <w:color w:val="EE0000"/>
-          <w:lang w:val="en-GB" w:eastAsia="en-GB"/>
-        </w:rPr>
       </w:pPr>
       <w:bookmarkStart w:id="54" w:name="_Toc233313857"/>
-      <w:r>
-        <w:rPr>
-          <w:color w:val="EE0000"/>
-          <w:lang w:val="en-GB" w:eastAsia="en-GB"/>
-        </w:rPr>
+      <w:proofErr w:type="spellStart"/>
+      <w:r>
         <w:lastRenderedPageBreak/>
-        <w:t>Metabolism-related Database EDA</w:t>
+        <w:t>Metabolism-related</w:t>
+      </w:r>
+      <w:proofErr w:type="spellEnd"/>
+      <w:r>
+        <w:t xml:space="preserve"> </w:t>
+      </w:r>
+      <w:proofErr w:type="spellStart"/>
+      <w:r>
+        <w:t>Database</w:t>
+      </w:r>
+      <w:proofErr w:type="spellEnd"/>
+      <w:r>
+        <w:t xml:space="preserve"> EDA</w:t>
       </w:r>
       <w:bookmarkEnd w:id="54"/>
     </w:p>
     <w:p>
       <w:pPr>
-        <w:jc w:val="both"/>
-        <w:rPr>
-          <w:color w:val="EE0000"/>
-          <w:lang w:val="en-GB" w:eastAsia="en-GB"/>
-        </w:rPr>
-      </w:pPr>
-      <w:r>
-        <w:rPr>
-          <w:color w:val="EE0000"/>
-          <w:lang w:val="en-GB" w:eastAsia="en-GB"/>
-        </w:rPr>
-        <w:t xml:space="preserve">Benchmark predictor: </w:t>
-      </w:r>
-      <w:hyperlink r:id="rId29" w:history="1">
+        <w:rPr>
+          <w:lang w:val="en-GB" w:eastAsia="en-GB"/>
+        </w:rPr>
+      </w:pPr>
+      <w:r>
+        <w:rPr>
+          <w:lang w:val="en-GB" w:eastAsia="en-GB"/>
+        </w:rPr>
+        <w:t xml:space="preserve">The curated metabolism </w:t>
+      </w:r>
+      <w:proofErr w:type="spellStart"/>
+      <w:r>
+        <w:rPr>
+          <w:lang w:val="en-GB" w:eastAsia="en-GB"/>
+        </w:rPr>
+        <w:t>d</w:t>
+      </w:r>
+      <w:r>
+        <w:rPr>
+          <w:lang w:val="en-GB" w:eastAsia="en-GB"/>
+        </w:rPr>
+        <w:t>b</w:t>
+      </w:r>
+      <w:proofErr w:type="spellEnd"/>
+      <w:r>
+        <w:rPr>
+          <w:lang w:val="en-GB" w:eastAsia="en-GB"/>
+        </w:rPr>
+        <w:t xml:space="preserve"> constitutes the benchmark dataset used for training and evaluating all predictive models developed in this work. Consequently, beyond verifying its integrity after the curation process, it is essential to </w:t>
+      </w:r>
+      <w:r>
+        <w:rPr>
+          <w:lang w:val="en-GB" w:eastAsia="en-GB"/>
+        </w:rPr>
+        <w:t xml:space="preserve">appropriately </w:t>
+      </w:r>
+      <w:r>
+        <w:rPr>
+          <w:lang w:val="en-GB" w:eastAsia="en-GB"/>
+        </w:rPr>
+        <w:t xml:space="preserve">characterize </w:t>
+      </w:r>
+      <w:r>
+        <w:rPr>
+          <w:lang w:val="en-GB" w:eastAsia="en-GB"/>
+        </w:rPr>
+        <w:t>the data comprising it, define its biases and limitations and explain what this implies for the model construction</w:t>
+      </w:r>
+      <w:r>
+        <w:rPr>
+          <w:lang w:val="en-GB" w:eastAsia="en-GB"/>
+        </w:rPr>
+        <w:t>.</w:t>
+      </w:r>
+      <w:r>
+        <w:rPr>
+          <w:lang w:val="en-GB" w:eastAsia="en-GB"/>
+        </w:rPr>
+        <w:t xml:space="preserve"> </w:t>
+      </w:r>
+    </w:p>
+    <w:p>
+      <w:pPr>
+        <w:rPr>
+          <w:lang w:val="en-GB" w:eastAsia="en-GB"/>
+        </w:rPr>
+      </w:pPr>
+      <w:r>
+        <w:rPr>
+          <w:lang w:val="en-GB" w:eastAsia="en-GB"/>
+        </w:rPr>
+        <w:t>The final curated dataset comprises 1,368 unique drug molecules annotated with their corresponding metabolizing CYP450 isoenzymes.</w:t>
+      </w:r>
+      <w:r>
+        <w:rPr>
+          <w:lang w:val="en-GB" w:eastAsia="en-GB"/>
+        </w:rPr>
+        <w:t xml:space="preserve"> </w:t>
+      </w:r>
+      <w:r>
+        <w:rPr>
+          <w:lang w:val="en-GB" w:eastAsia="en-GB"/>
+        </w:rPr>
+        <w:t>The distribution of CYP annotations across the dataset is highly imbalanced, with a small number of isoenzymes accounting for most metabolic annotations while many others are represented by only a limited number of compounds. This behaviour is characteristic of biological datasets and results in a pronounced long-tail distribution.</w:t>
+      </w:r>
+    </w:p>
+    <w:p>
+      <w:pPr>
+        <w:keepNext/>
+      </w:pPr>
+      <w:r>
+        <w:rPr>
+          <w:lang w:val="en-GB" w:eastAsia="en-GB"/>
+        </w:rPr>
+        <w:drawing>
+          <wp:inline distT="0" distB="0" distL="0" distR="0" wp14:anchorId="01157CBF" wp14:editId="601C6D29">
+            <wp:extent cx="5669915" cy="2331720"/>
+            <wp:effectExtent l="0" t="0" r="6985" b="0"/>
+            <wp:docPr id="595418121" name="Picture 1"/>
+            <wp:cNvGraphicFramePr>
+              <a:graphicFrameLocks xmlns:a="http://schemas.openxmlformats.org/drawingml/2006/main" noChangeAspect="1"/>
+            </wp:cNvGraphicFramePr>
+            <a:graphic xmlns:a="http://schemas.openxmlformats.org/drawingml/2006/main">
+              <a:graphicData uri="http://schemas.openxmlformats.org/drawingml/2006/picture">
+                <pic:pic xmlns:pic="http://schemas.openxmlformats.org/drawingml/2006/picture">
+                  <pic:nvPicPr>
+                    <pic:cNvPr id="595418121" name=""/>
+                    <pic:cNvPicPr/>
+                  </pic:nvPicPr>
+                  <pic:blipFill>
+                    <a:blip r:embed="rId29"/>
+                    <a:stretch>
+                      <a:fillRect/>
+                    </a:stretch>
+                  </pic:blipFill>
+                  <pic:spPr>
+                    <a:xfrm>
+                      <a:off x="0" y="0"/>
+                      <a:ext cx="5669915" cy="2331720"/>
+                    </a:xfrm>
+                    <a:prstGeom prst="rect">
+                      <a:avLst/>
+                    </a:prstGeom>
+                  </pic:spPr>
+                </pic:pic>
+              </a:graphicData>
+            </a:graphic>
+          </wp:inline>
+        </w:drawing>
+      </w:r>
+    </w:p>
+    <w:p>
+      <w:pPr>
+        <w:pStyle w:val="Caption"/>
+        <w:rPr>
+          <w:lang w:val="en-GB" w:eastAsia="en-GB"/>
+        </w:rPr>
+      </w:pPr>
+      <w:r>
+        <w:t xml:space="preserve">Figure </w:t>
+      </w:r>
+      <w:fldSimple w:instr=" SEQ Figure \* ARABIC ">
         <w:r>
           <w:rPr>
-            <w:rStyle w:val="Hyperlink"/>
-            <w:color w:val="EE0000"/>
-            <w:lang w:val="en-GB" w:eastAsia="en-GB"/>
+            <w:noProof/>
           </w:rPr>
-          <w:t>https://insilico-cyp.charite.de/SuperCYPsPred/index.php?site=Statistics</w:t>
+          <w:t>9</w:t>
         </w:r>
-      </w:hyperlink>
+      </w:fldSimple>
+    </w:p>
+    <w:p>
+      <w:pPr>
+        <w:rPr>
+          <w:lang w:val="en-GB" w:eastAsia="en-GB"/>
+        </w:rPr>
+      </w:pPr>
+      <w:r>
+        <w:rPr>
+          <w:lang w:val="en-GB" w:eastAsia="en-GB"/>
+        </w:rPr>
+        <w:t>Among the 33 identified CYP isoforms, CYP3A4 is by far the most frequently annotated enzyme, being associated with 1,051 molecules (76.8%). It is followed by CYP2D6 and CYP2C9, both present in approximately 30% of the dataset, while the remaining enzymes show progressively lower frequencies. At the opposite end of the distribution, numerous CYP isoforms are represented by only a small number of compounds, providing insufficient observations for meaningful model evaluation.</w:t>
+      </w:r>
+    </w:p>
+    <w:p>
+      <w:pPr>
+        <w:rPr>
+          <w:lang w:val="en-GB" w:eastAsia="en-GB"/>
+        </w:rPr>
+      </w:pPr>
+      <w:r>
+        <w:rPr>
+          <w:lang w:val="en-GB" w:eastAsia="en-GB"/>
+        </w:rPr>
+        <w:t xml:space="preserve">To obtain a statistically robust benchmark, a minimum frequency threshold of 50 annotated molecules was applied, retaining only CYP isoforms with sufficient representation for reliable performance assessment. After filtering, the label space was reduced from 33 to 13 CYP isoforms, while 1,354 of the 1,368 molecules (98.98%) were preserved. Only 14 compounds (1.02%) were excluded because </w:t>
+      </w:r>
+      <w:proofErr w:type="gramStart"/>
+      <w:r>
+        <w:rPr>
+          <w:lang w:val="en-GB" w:eastAsia="en-GB"/>
+        </w:rPr>
+        <w:t>all of</w:t>
+      </w:r>
+      <w:proofErr w:type="gramEnd"/>
+      <w:r>
+        <w:rPr>
+          <w:lang w:val="en-GB" w:eastAsia="en-GB"/>
+        </w:rPr>
+        <w:t xml:space="preserve"> their metabolic annotations corresponded exclusively to CYPs below the selected threshold. </w:t>
+      </w:r>
+    </w:p>
+    <w:p>
+      <w:pPr>
+        <w:rPr>
+          <w:lang w:val="en-GB" w:eastAsia="en-GB"/>
+        </w:rPr>
+      </w:pPr>
+    </w:p>
+    <w:p>
+      <w:pPr>
+        <w:rPr>
+          <w:lang w:val="en-GB" w:eastAsia="en-GB"/>
+        </w:rPr>
+      </w:pPr>
+      <w:r>
+        <w:rPr>
+          <w:lang w:val="en-GB" w:eastAsia="en-GB"/>
+        </w:rPr>
+        <w:t>Drug metabolism is inherently a multi-label problem, as individual compounds are frequently metabolized by several CYP450 isoenzymes simultaneously. Characterizing the number of annotations associated with each molecule is therefore essential to understand the complexity of the prediction task.</w:t>
+      </w:r>
+    </w:p>
+    <w:p>
+      <w:pPr>
+        <w:rPr>
+          <w:lang w:val="en-GB" w:eastAsia="en-GB"/>
+        </w:rPr>
+      </w:pPr>
+    </w:p>
+    <w:p>
+      <w:pPr>
+        <w:rPr>
+          <w:lang w:val="en-GB" w:eastAsia="en-GB"/>
+        </w:rPr>
+      </w:pPr>
+      <w:r>
+        <w:rPr>
+          <w:lang w:val="en-GB" w:eastAsia="en-GB"/>
+        </w:rPr>
+        <w:lastRenderedPageBreak/>
+        <w:drawing>
+          <wp:inline distT="0" distB="0" distL="0" distR="0" wp14:anchorId="38D406A0" wp14:editId="244019BE">
+            <wp:extent cx="5669915" cy="2799080"/>
+            <wp:effectExtent l="0" t="0" r="6985" b="1270"/>
+            <wp:docPr id="293975368" name="Picture 1"/>
+            <wp:cNvGraphicFramePr>
+              <a:graphicFrameLocks xmlns:a="http://schemas.openxmlformats.org/drawingml/2006/main" noChangeAspect="1"/>
+            </wp:cNvGraphicFramePr>
+            <a:graphic xmlns:a="http://schemas.openxmlformats.org/drawingml/2006/main">
+              <a:graphicData uri="http://schemas.openxmlformats.org/drawingml/2006/picture">
+                <pic:pic xmlns:pic="http://schemas.openxmlformats.org/drawingml/2006/picture">
+                  <pic:nvPicPr>
+                    <pic:cNvPr id="293975368" name=""/>
+                    <pic:cNvPicPr/>
+                  </pic:nvPicPr>
+                  <pic:blipFill>
+                    <a:blip r:embed="rId30"/>
+                    <a:stretch>
+                      <a:fillRect/>
+                    </a:stretch>
+                  </pic:blipFill>
+                  <pic:spPr>
+                    <a:xfrm>
+                      <a:off x="0" y="0"/>
+                      <a:ext cx="5669915" cy="2799080"/>
+                    </a:xfrm>
+                    <a:prstGeom prst="rect">
+                      <a:avLst/>
+                    </a:prstGeom>
+                  </pic:spPr>
+                </pic:pic>
+              </a:graphicData>
+            </a:graphic>
+          </wp:inline>
+        </w:drawing>
+      </w:r>
+    </w:p>
+    <w:p>
+      <w:pPr>
+        <w:rPr>
+          <w:lang w:val="en-GB" w:eastAsia="en-GB"/>
+        </w:rPr>
+      </w:pPr>
+      <w:r>
+        <w:rPr>
+          <w:lang w:val="en-GB" w:eastAsia="en-GB"/>
+        </w:rPr>
+        <w:t>[Figure X. Distribution of the number of CYP annotations per molecule]</w:t>
+      </w:r>
+    </w:p>
+    <w:p>
+      <w:pPr>
+        <w:rPr>
+          <w:lang w:val="en-GB" w:eastAsia="en-GB"/>
+        </w:rPr>
+      </w:pPr>
+    </w:p>
+    <w:p>
+      <w:pPr>
+        <w:rPr>
+          <w:lang w:val="en-GB" w:eastAsia="en-GB"/>
+        </w:rPr>
+      </w:pPr>
+      <w:r>
+        <w:rPr>
+          <w:lang w:val="en-GB" w:eastAsia="en-GB"/>
+        </w:rPr>
+        <w:t xml:space="preserve">Following frequency filtering, the curated benchmark contains an average of 2.97 CYP annotations per compound, with individual molecules ranging from one to fifteen metabolizing enzymes. While 529 molecules (39.1%) are associated with a single CYP isoenzyme, </w:t>
+      </w:r>
+      <w:proofErr w:type="gramStart"/>
+      <w:r>
+        <w:rPr>
+          <w:lang w:val="en-GB" w:eastAsia="en-GB"/>
+        </w:rPr>
+        <w:t>the majority of</w:t>
+      </w:r>
+      <w:proofErr w:type="gramEnd"/>
+      <w:r>
+        <w:rPr>
+          <w:lang w:val="en-GB" w:eastAsia="en-GB"/>
+        </w:rPr>
+        <w:t xml:space="preserve"> the dataset (825 molecules, 60.9%) presents two or more metabolic annotations. The compound with the largest number of associated CYPs is </w:t>
+      </w:r>
+      <w:proofErr w:type="spellStart"/>
+      <w:r>
+        <w:rPr>
+          <w:lang w:val="en-GB" w:eastAsia="en-GB"/>
+        </w:rPr>
+        <w:t>Midostaurin</w:t>
+      </w:r>
+      <w:proofErr w:type="spellEnd"/>
+      <w:r>
+        <w:rPr>
+          <w:lang w:val="en-GB" w:eastAsia="en-GB"/>
+        </w:rPr>
+        <w:t>, which is annotated with 15 metabolizing isoenzymes. Overall, these results confirm that the benchmark represents a genuine multi-label classification problem rather than a predominantly single-label dataset.</w:t>
+      </w:r>
+    </w:p>
+    <w:p>
+      <w:pPr>
+        <w:rPr>
+          <w:lang w:val="en-GB" w:eastAsia="en-GB"/>
+        </w:rPr>
+      </w:pPr>
+    </w:p>
+    <w:p>
+      <w:pPr>
+        <w:rPr>
+          <w:lang w:val="en-GB" w:eastAsia="en-GB"/>
+        </w:rPr>
+      </w:pPr>
+      <w:r>
+        <w:rPr>
+          <w:lang w:val="en-GB" w:eastAsia="en-GB"/>
+        </w:rPr>
+        <w:t>While the previous analysis describes the frequency of individual CYP isoenzymes, it does not capture how metabolic annotations are combined within the same molecule. To explore these relationships, a co-occurrence matrix was generated by counting the number of compounds simultaneously associated with each pair of CYP isoforms.</w:t>
+      </w:r>
+    </w:p>
+    <w:p>
+      <w:pPr>
+        <w:rPr>
+          <w:lang w:val="en-GB" w:eastAsia="en-GB"/>
+        </w:rPr>
+      </w:pPr>
+      <w:r>
+        <w:rPr>
+          <w:lang w:val="en-GB" w:eastAsia="en-GB"/>
+        </w:rPr>
+        <w:lastRenderedPageBreak/>
+        <w:drawing>
+          <wp:inline distT="0" distB="0" distL="0" distR="0" wp14:anchorId="511B1078" wp14:editId="491124F8">
+            <wp:extent cx="5669915" cy="4842510"/>
+            <wp:effectExtent l="0" t="0" r="6985" b="0"/>
+            <wp:docPr id="487819355" name="Picture 1"/>
+            <wp:cNvGraphicFramePr>
+              <a:graphicFrameLocks xmlns:a="http://schemas.openxmlformats.org/drawingml/2006/main" noChangeAspect="1"/>
+            </wp:cNvGraphicFramePr>
+            <a:graphic xmlns:a="http://schemas.openxmlformats.org/drawingml/2006/main">
+              <a:graphicData uri="http://schemas.openxmlformats.org/drawingml/2006/picture">
+                <pic:pic xmlns:pic="http://schemas.openxmlformats.org/drawingml/2006/picture">
+                  <pic:nvPicPr>
+                    <pic:cNvPr id="487819355" name=""/>
+                    <pic:cNvPicPr/>
+                  </pic:nvPicPr>
+                  <pic:blipFill>
+                    <a:blip r:embed="rId31"/>
+                    <a:stretch>
+                      <a:fillRect/>
+                    </a:stretch>
+                  </pic:blipFill>
+                  <pic:spPr>
+                    <a:xfrm>
+                      <a:off x="0" y="0"/>
+                      <a:ext cx="5669915" cy="4842510"/>
+                    </a:xfrm>
+                    <a:prstGeom prst="rect">
+                      <a:avLst/>
+                    </a:prstGeom>
+                  </pic:spPr>
+                </pic:pic>
+              </a:graphicData>
+            </a:graphic>
+          </wp:inline>
+        </w:drawing>
+      </w:r>
+    </w:p>
+    <w:p>
+      <w:pPr>
+        <w:rPr>
+          <w:lang w:val="en-GB" w:eastAsia="en-GB"/>
+        </w:rPr>
+      </w:pPr>
+      <w:r>
+        <w:rPr>
+          <w:lang w:val="en-GB" w:eastAsia="en-GB"/>
+        </w:rPr>
+        <w:t>[Figure X. CYP co-occurrence heatmap]</w:t>
+      </w:r>
+    </w:p>
+    <w:p>
+      <w:pPr>
+        <w:rPr>
+          <w:lang w:val="en-GB" w:eastAsia="en-GB"/>
+        </w:rPr>
+      </w:pPr>
+    </w:p>
+    <w:p>
+      <w:pPr>
+        <w:rPr>
+          <w:lang w:val="en-GB" w:eastAsia="en-GB"/>
+        </w:rPr>
+      </w:pPr>
+      <w:r>
+        <w:rPr>
+          <w:lang w:val="en-GB" w:eastAsia="en-GB"/>
+        </w:rPr>
+        <w:t>The resulting heatmap shows that most CYP pairs exhibit relatively modest levels of co-occurrence, suggesting that the metabolic annotation space remains reasonably heterogeneous despite the dominance of a few highly represented enzymes. The most noticeable associations are observed among members of the CYP2C subfamily, particularly CYP2C8, CYP2C9 and CYP2C19, as well as between CYP3A5 and CYP3A7. These patterns are biologically plausible, as enzymes belonging to the same CYP subfamily share a high degree of structural similarity and frequently exhibit overlapping substrate specificity, often catalysing related oxidative metabolic reactions. Nevertheless, the observed co-occurrences should be interpreted as descriptive characteristics of the dataset rather than evidence of causal biological relationships.</w:t>
+      </w:r>
+    </w:p>
+    <w:p>
+      <w:pPr>
+        <w:rPr>
+          <w:lang w:val="en-GB" w:eastAsia="en-GB"/>
+        </w:rPr>
+      </w:pPr>
+    </w:p>
+    <w:p>
+      <w:pPr>
+        <w:rPr>
+          <w:lang w:val="en-GB" w:eastAsia="en-GB"/>
+        </w:rPr>
+      </w:pPr>
+      <w:r>
+        <w:rPr>
+          <w:lang w:val="en-GB" w:eastAsia="en-GB"/>
+        </w:rPr>
+        <w:t>In addition to the distribution of metabolic annotations, the structural characteristics of the molecules themselves are relevant when comparing different molecular representations. One property of particular interest is the presence of explicit stereochemical information within the molecular structures.</w:t>
+      </w:r>
+    </w:p>
+    <w:p>
+      <w:pPr>
+        <w:rPr>
+          <w:lang w:val="en-GB" w:eastAsia="en-GB"/>
+        </w:rPr>
+      </w:pPr>
+    </w:p>
+    <w:p>
+      <w:pPr>
+        <w:rPr>
+          <w:lang w:val="en-GB" w:eastAsia="en-GB"/>
+        </w:rPr>
+      </w:pPr>
+      <w:r>
+        <w:rPr>
+          <w:lang w:val="en-GB" w:eastAsia="en-GB"/>
+        </w:rPr>
+        <w:lastRenderedPageBreak/>
+        <w:t xml:space="preserve">Of the 1,368 molecules included in the benchmark, 689 (50.37%) contain explicit stereochemical descriptors within their SMILES representation, while 679 molecules (49.63%) do not. This nearly balanced distribution indicates that the benchmark comprises a comparable proportion of </w:t>
+      </w:r>
+      <w:proofErr w:type="spellStart"/>
+      <w:r>
+        <w:rPr>
+          <w:lang w:val="en-GB" w:eastAsia="en-GB"/>
+        </w:rPr>
+        <w:t>stereochemically</w:t>
+      </w:r>
+      <w:proofErr w:type="spellEnd"/>
+      <w:r>
+        <w:rPr>
+          <w:lang w:val="en-GB" w:eastAsia="en-GB"/>
+        </w:rPr>
+        <w:t xml:space="preserve"> defined and non-stereochemical compounds, providing a structurally diverse dataset for evaluating molecular representations.</w:t>
+      </w:r>
+    </w:p>
+    <w:p>
+      <w:pPr>
+        <w:rPr>
+          <w:lang w:val="en-GB" w:eastAsia="en-GB"/>
+        </w:rPr>
+      </w:pPr>
+    </w:p>
+    <w:p>
+      <w:pPr>
+        <w:rPr>
+          <w:lang w:val="en-GB" w:eastAsia="en-GB"/>
+        </w:rPr>
+      </w:pPr>
+      <w:r>
+        <w:rPr>
+          <w:lang w:val="en-GB" w:eastAsia="en-GB"/>
+        </w:rPr>
+        <w:t>This observation is also relevant when interpreting the results obtained with the author-trained InChI embedder. As discussed in the previous section, the database used to train this representation contained comparatively limited stereochemical information. Consequently, although the embedder may still capture general structural features, its ability to exploit stereochemical information present in approximately half of the benchmark molecules may be more limited than that of representations pretrained on datasets with richer stereochemical diversity. Whether this difference influences predictive performance is assessed experimentally in the benchmarking chapter.</w:t>
+      </w:r>
+    </w:p>
+    <w:p>
+      <w:pPr>
+        <w:rPr>
+          <w:lang w:val="en-GB" w:eastAsia="en-GB"/>
+        </w:rPr>
+      </w:pPr>
+    </w:p>
+    <w:p>
+      <w:pPr>
+        <w:rPr>
+          <w:lang w:val="en-GB" w:eastAsia="en-GB"/>
+        </w:rPr>
+      </w:pPr>
+      <w:r>
+        <w:rPr>
+          <w:lang w:val="en-GB" w:eastAsia="en-GB"/>
+        </w:rPr>
+        <w:t xml:space="preserve">The exploratory analysis demonstrates that the curated metabolism database exhibits a pronounced long-tail distribution of CYP annotations while preserving </w:t>
+      </w:r>
+      <w:proofErr w:type="gramStart"/>
+      <w:r>
+        <w:rPr>
+          <w:lang w:val="en-GB" w:eastAsia="en-GB"/>
+        </w:rPr>
+        <w:t>a large number of</w:t>
+      </w:r>
+      <w:proofErr w:type="gramEnd"/>
+      <w:r>
+        <w:rPr>
+          <w:lang w:val="en-GB" w:eastAsia="en-GB"/>
+        </w:rPr>
+        <w:t xml:space="preserve"> compounds after frequency filtering. More than 60% of the molecules are associated with multiple metabolizing enzymes, confirming the inherently multi-label nature of the prediction task, and the co-occurrence analysis reveals biologically plausible relationships between several CYP subfamilies without indicating excessive redundancy within the annotation space. Finally, the nearly balanced distribution of molecules with and without explicit stereochemical information highlights the structural diversity of the benchmark and provides useful context for interpreting the comparative performance of the molecular representations evaluated in the following chapters.</w:t>
+      </w:r>
     </w:p>
     <w:p>
       <w:pPr>
@@ -23290,6 +23678,7 @@
         <w:rPr>
           <w:lang w:val="en-GB" w:eastAsia="en-GB"/>
         </w:rPr>
+        <w:lastRenderedPageBreak/>
         <w:t>where 1,367 corresponds to the number of compounds in the final dataset and each of the 2,048 columns represents the count of a particular hashed substructure identified within a molecule.</w:t>
       </w:r>
     </w:p>
@@ -23381,7 +23770,6 @@
           <w:noProof/>
           <w:lang w:eastAsia="en-GB"/>
         </w:rPr>
-        <w:lastRenderedPageBreak/>
         <w:drawing>
           <wp:inline distT="0" distB="0" distL="0" distR="0" wp14:anchorId="4FABEC5C" wp14:editId="032BD9BD">
             <wp:extent cx="5669915" cy="1516380"/>
@@ -23398,7 +23786,7 @@
                     <pic:cNvPicPr/>
                   </pic:nvPicPr>
                   <pic:blipFill>
-                    <a:blip r:embed="rId30"/>
+                    <a:blip r:embed="rId32"/>
                     <a:stretch>
                       <a:fillRect/>
                     </a:stretch>
@@ -23453,7 +23841,7 @@
           <w:noProof/>
           <w:lang w:val="en-GB"/>
         </w:rPr>
-        <w:t>9</w:t>
+        <w:t>10</w:t>
       </w:r>
       <w:r>
         <w:fldChar w:fldCharType="end"/>
@@ -23857,6 +24245,7 @@
           <w:noProof/>
           <w:lang w:eastAsia="en-GB"/>
         </w:rPr>
+        <w:lastRenderedPageBreak/>
         <w:drawing>
           <wp:inline distT="0" distB="0" distL="0" distR="0" wp14:anchorId="7CB8F22A" wp14:editId="1F14305A">
             <wp:extent cx="5669915" cy="1491615"/>
@@ -23873,7 +24262,7 @@
                     <pic:cNvPicPr/>
                   </pic:nvPicPr>
                   <pic:blipFill>
-                    <a:blip r:embed="rId31"/>
+                    <a:blip r:embed="rId33"/>
                     <a:stretch>
                       <a:fillRect/>
                     </a:stretch>
@@ -23926,7 +24315,7 @@
           <w:noProof/>
           <w:lang w:val="en-GB"/>
         </w:rPr>
-        <w:t>10</w:t>
+        <w:t>11</w:t>
       </w:r>
       <w:r>
         <w:fldChar w:fldCharType="end"/>
@@ -24009,14 +24398,7 @@
         <w:rPr>
           <w:lang w:val="en-GB"/>
         </w:rPr>
-        <w:t xml:space="preserve"> embeddings were generated using ChemBERTa, a transformer-based language model pretrained on large corpora of SMILES strings. Unlike static fragment-based </w:t>
-      </w:r>
-      <w:r>
-        <w:rPr>
-          <w:lang w:val="en-GB"/>
-        </w:rPr>
-        <w:lastRenderedPageBreak/>
-        <w:t>embeddings, ChemBERTa produces contextualized token representations, allowing the model to capture sequence-dependent chemical information.</w:t>
+        <w:t xml:space="preserve"> embeddings were generated using ChemBERTa, a transformer-based language model pretrained on large corpora of SMILES strings. Unlike static fragment-based embeddings, ChemBERTa produces contextualized token representations, allowing the model to capture sequence-dependent chemical information.</w:t>
       </w:r>
     </w:p>
     <w:p>
@@ -24174,6 +24556,7 @@
         <w:rPr>
           <w:noProof/>
         </w:rPr>
+        <w:lastRenderedPageBreak/>
         <w:drawing>
           <wp:inline distT="0" distB="0" distL="0" distR="0" wp14:anchorId="4DECB097" wp14:editId="443CDEE0">
             <wp:extent cx="5649891" cy="1512394"/>
@@ -24190,7 +24573,7 @@
                     <pic:cNvPicPr/>
                   </pic:nvPicPr>
                   <pic:blipFill rotWithShape="1">
-                    <a:blip r:embed="rId32"/>
+                    <a:blip r:embed="rId34"/>
                     <a:srcRect l="353" t="1091"/>
                     <a:stretch>
                       <a:fillRect/>
@@ -24252,7 +24635,7 @@
           <w:noProof/>
           <w:lang w:val="en-GB"/>
         </w:rPr>
-        <w:t>11</w:t>
+        <w:t>12</w:t>
       </w:r>
       <w:r>
         <w:fldChar w:fldCharType="end"/>
@@ -24420,14 +24803,7 @@
         <w:rPr>
           <w:lang w:val="en-GB" w:eastAsia="en-GB"/>
         </w:rPr>
-        <w:t xml:space="preserve">local GPU with 4GB of VRAM, which imposed strict constraints on batch size, sequence length, and overall architectural scale. Techniques </w:t>
-      </w:r>
-      <w:r>
-        <w:rPr>
-          <w:lang w:val="en-GB" w:eastAsia="en-GB"/>
-        </w:rPr>
-        <w:lastRenderedPageBreak/>
-        <w:t>such as mixed-precision training and gradient accumulation were necessary to make the process feasible, effectively trading off training speed for memory efficiency. Despite these optimizations, training remained time-consuming, requiring several hours per epoch and careful monitoring to avoid memory overflows.</w:t>
+        <w:t>local GPU with 4GB of VRAM, which imposed strict constraints on batch size, sequence length, and overall architectural scale. Techniques such as mixed-precision training and gradient accumulation were necessary to make the process feasible, effectively trading off training speed for memory efficiency. Despite these optimizations, training remained time-consuming, requiring several hours per epoch and careful monitoring to avoid memory overflows.</w:t>
       </w:r>
     </w:p>
     <w:p>
@@ -24721,6 +25097,7 @@
         <w:rPr>
           <w:lang w:val="en-GB"/>
         </w:rPr>
+        <w:lastRenderedPageBreak/>
         <w:t xml:space="preserve">where </w:t>
       </w:r>
       <m:oMath>
@@ -24987,7 +25364,7 @@
                     <pic:cNvPicPr/>
                   </pic:nvPicPr>
                   <pic:blipFill rotWithShape="1">
-                    <a:blip r:embed="rId33"/>
+                    <a:blip r:embed="rId35"/>
                     <a:srcRect l="373" t="1988" r="1"/>
                     <a:stretch>
                       <a:fillRect/>
@@ -25049,7 +25426,7 @@
           <w:noProof/>
           <w:lang w:val="en-GB"/>
         </w:rPr>
-        <w:t>12</w:t>
+        <w:t>13</w:t>
       </w:r>
       <w:r>
         <w:rPr>
@@ -25144,7 +25521,6 @@
         <w:rPr>
           <w:lang w:val="en-GB" w:eastAsia="en-GB"/>
         </w:rPr>
-        <w:lastRenderedPageBreak/>
         <w:t>Feature</w:t>
       </w:r>
       <w:r>
@@ -25478,6 +25854,7 @@
         <w:rPr>
           <w:lang w:val="en-GB" w:eastAsia="en-GB"/>
         </w:rPr>
+        <w:lastRenderedPageBreak/>
         <w:t>Overall, all representation</w:t>
       </w:r>
       <w:r>
@@ -25603,7 +25980,6 @@
         <w:rPr>
           <w:lang w:val="en-GB" w:eastAsia="en-GB"/>
         </w:rPr>
-        <w:lastRenderedPageBreak/>
         <w:t>CV</w:t>
       </w:r>
       <w:r>
@@ -25835,6 +26211,7 @@
         <w:rPr>
           <w:lang w:val="en-GB" w:eastAsia="en-GB"/>
         </w:rPr>
+        <w:lastRenderedPageBreak/>
         <w:t>Model Training</w:t>
       </w:r>
       <w:bookmarkEnd w:id="68"/>
@@ -25880,18 +26257,12 @@
         <w:rPr>
           <w:lang w:val="en-GB" w:eastAsia="en-GB"/>
         </w:rPr>
-        <w:instrText xml:space="preserve"> REF _Ref233312616 \r \h </w:instrText>
-      </w:r>
-      <w:r>
-        <w:rPr>
-          <w:lang w:val="en-GB" w:eastAsia="en-GB"/>
-        </w:rPr>
-      </w:r>
-      <w:r>
-        <w:rPr>
-          <w:lang w:val="en-GB" w:eastAsia="en-GB"/>
-        </w:rPr>
-        <w:instrText xml:space="preserve"> \* MERGEFORMAT </w:instrText>
+        <w:instrText xml:space="preserve"> REF _Ref233312616 \r \h  \* MERGEFORMAT </w:instrText>
+      </w:r>
+      <w:r>
+        <w:rPr>
+          <w:lang w:val="en-GB" w:eastAsia="en-GB"/>
+        </w:rPr>
       </w:r>
       <w:r>
         <w:rPr>
@@ -26033,14 +26404,7 @@
         <w:rPr>
           <w:lang w:val="en-GB" w:eastAsia="en-GB"/>
         </w:rPr>
-        <w:t xml:space="preserve">set results were obtained using the best configuration identified during model </w:t>
-      </w:r>
-      <w:r>
-        <w:rPr>
-          <w:lang w:val="en-GB" w:eastAsia="en-GB"/>
-        </w:rPr>
-        <w:lastRenderedPageBreak/>
-        <w:t xml:space="preserve">selection. The resulting files are included in the supplementary materials </w:t>
+        <w:t xml:space="preserve">set results were obtained using the best configuration identified during model selection. The resulting files are included in the supplementary materials </w:t>
       </w:r>
       <w:r>
         <w:rPr>
@@ -26341,6 +26705,7 @@
               <w:color w:val="000000"/>
               <w:lang w:val="en-GB"/>
             </w:rPr>
+            <w:lastRenderedPageBreak/>
             <w:t>[5]</w:t>
           </w:r>
           <w:r>
@@ -26533,7 +26898,6 @@
               <w:color w:val="000000"/>
               <w:lang w:val="en-GB"/>
             </w:rPr>
-            <w:lastRenderedPageBreak/>
             <w:t>[9]</w:t>
           </w:r>
           <w:r>
@@ -26966,6 +27330,7 @@
               <w:color w:val="000000"/>
               <w:lang w:val="en-GB"/>
             </w:rPr>
+            <w:lastRenderedPageBreak/>
             <w:t>[18]</w:t>
           </w:r>
           <w:r>
@@ -27176,7 +27541,6 @@
               <w:color w:val="000000"/>
               <w:lang w:val="en-GB"/>
             </w:rPr>
-            <w:lastRenderedPageBreak/>
             <w:t>[22]</w:t>
           </w:r>
           <w:r>
@@ -27738,7 +28102,16 @@
               <w:color w:val="000000"/>
               <w:lang w:val="en-GB"/>
             </w:rPr>
-            <w:t>, in KDD ’16. New York, NY, USA: Association for Computing Machinery, 2016, pp. 785–794. doi: 10.1145/2939672.2939785.</w:t>
+            <w:t xml:space="preserve">, in </w:t>
+          </w:r>
+          <w:r>
+            <w:rPr>
+              <w:rFonts w:ascii="Calibri" w:eastAsia="Times New Roman" w:hAnsi="Calibri" w:cs="Calibri"/>
+              <w:color w:val="000000"/>
+              <w:lang w:val="en-GB"/>
+            </w:rPr>
+            <w:lastRenderedPageBreak/>
+            <w:t>KDD ’16. New York, NY, USA: Association for Computing Machinery, 2016, pp. 785–794. doi: 10.1145/2939672.2939785.</w:t>
           </w:r>
         </w:p>
         <w:p>
@@ -27903,7 +28276,6 @@
               <w:color w:val="000000"/>
               <w:lang w:val="en-GB"/>
             </w:rPr>
-            <w:lastRenderedPageBreak/>
             <w:t>[36]</w:t>
           </w:r>
           <w:r>
@@ -28499,8 +28871,8 @@
       </w:r>
     </w:p>
     <w:sectPr>
-      <w:footerReference w:type="default" r:id="rId34"/>
-      <w:footerReference w:type="first" r:id="rId35"/>
+      <w:footerReference w:type="default" r:id="rId36"/>
+      <w:footerReference w:type="first" r:id="rId37"/>
       <w:pgSz w:w="11906" w:h="16838" w:code="9"/>
       <w:pgMar w:top="-1985" w:right="1276" w:bottom="993" w:left="1701" w:header="709" w:footer="439" w:gutter="0"/>
       <w:pgNumType w:start="3"/>
@@ -33316,6 +33688,7 @@
     <w:rsid w:val="006B03AA"/>
     <w:rsid w:val="006C0ACC"/>
     <w:rsid w:val="006D1C56"/>
+    <w:rsid w:val="007245B6"/>
     <w:rsid w:val="00787247"/>
     <w:rsid w:val="00790467"/>
     <w:rsid w:val="007C3DC9"/>
@@ -33355,6 +33728,7 @@
     <w:rsid w:val="00EE0F88"/>
     <w:rsid w:val="00F02213"/>
     <w:rsid w:val="00F05D7A"/>
+    <w:rsid w:val="00F06005"/>
     <w:rsid w:val="00F454D2"/>
     <w:rsid w:val="00FB4BB7"/>
     <w:rsid w:val="00FD4788"/>
@@ -34117,15 +34491,6 @@
 </file>
 
 <file path=customXml/item1.xml><?xml version="1.0" encoding="utf-8"?>
-<?mso-contentType ?>
-<FormTemplates xmlns="http://schemas.microsoft.com/sharepoint/v3/contenttype/forms">
-  <Display>DocumentLibraryForm</Display>
-  <Edit>DocumentLibraryForm</Edit>
-  <New>DocumentLibraryForm</New>
-</FormTemplates>
-</file>
-
-<file path=customXml/item2.xml><?xml version="1.0" encoding="utf-8"?>
 <p:properties xmlns:p="http://schemas.microsoft.com/office/2006/metadata/properties" xmlns:xsi="http://www.w3.org/2001/XMLSchema-instance" xmlns:pc="http://schemas.microsoft.com/office/infopath/2007/PartnerControls">
   <documentManagement>
     <lcf76f155ced4ddcb4097134ff3c332f xmlns="9d7b9a5c-6b4f-4ca1-bb03-c38cacb734bc">
@@ -34136,11 +34501,16 @@
 </p:properties>
 </file>
 
-<file path=customXml/item3.xml><?xml version="1.0" encoding="utf-8"?>
-<b:Sources xmlns:b="http://schemas.openxmlformats.org/officeDocument/2006/bibliography" xmlns="http://schemas.openxmlformats.org/officeDocument/2006/bibliography" SelectedStyle="\APASixthEditionOfficeOnline.xsl" StyleName="APA" Version="6"/>
+<file path=customXml/item2.xml><?xml version="1.0" encoding="utf-8"?>
+<?mso-contentType ?>
+<FormTemplates xmlns="http://schemas.microsoft.com/sharepoint/v3/contenttype/forms">
+  <Display>DocumentLibraryForm</Display>
+  <Edit>DocumentLibraryForm</Edit>
+  <New>DocumentLibraryForm</New>
+</FormTemplates>
 </file>
 
-<file path=customXml/item4.xml><?xml version="1.0" encoding="utf-8"?>
+<file path=customXml/item3.xml><?xml version="1.0" encoding="utf-8"?>
 <ct:contentTypeSchema xmlns:ct="http://schemas.microsoft.com/office/2006/metadata/contentType" xmlns:ma="http://schemas.microsoft.com/office/2006/metadata/properties/metaAttributes" ct:_="" ma:_="" ma:contentTypeName="Documento" ma:contentTypeID="0x01010019FAAD7208B57F46B26AFFED99BCE0D3" ma:contentTypeVersion="16" ma:contentTypeDescription="Crear nuevo documento." ma:contentTypeScope="" ma:versionID="ad25a40a439e4eb6a750a8b6ae1789f7">
   <xsd:schema xmlns:xsd="http://www.w3.org/2001/XMLSchema" xmlns:xs="http://www.w3.org/2001/XMLSchema" xmlns:p="http://schemas.microsoft.com/office/2006/metadata/properties" xmlns:ns2="9d7b9a5c-6b4f-4ca1-bb03-c38cacb734bc" xmlns:ns3="7d80c08f-e909-465c-8aa4-0e649fbe85d0" xmlns:ns4="7302fe9c-5e91-4977-8271-167378b25bd2" targetNamespace="http://schemas.microsoft.com/office/2006/metadata/properties" ma:root="true" ma:fieldsID="113d448336e841d5d8efd4b9e74490d6" ns2:_="" ns3:_="" ns4:_="">
     <xsd:import namespace="9d7b9a5c-6b4f-4ca1-bb03-c38cacb734bc"/>
@@ -34388,15 +34758,11 @@
 </ct:contentTypeSchema>
 </file>
 
-<file path=customXml/itemProps1.xml><?xml version="1.0" encoding="utf-8"?>
-<ds:datastoreItem xmlns:ds="http://schemas.openxmlformats.org/officeDocument/2006/customXml" ds:itemID="{E5FD6A2B-9479-4129-9D84-6C858DBE1A90}">
-  <ds:schemaRefs>
-    <ds:schemaRef ds:uri="http://schemas.microsoft.com/sharepoint/v3/contenttype/forms"/>
-  </ds:schemaRefs>
-</ds:datastoreItem>
+<file path=customXml/item4.xml><?xml version="1.0" encoding="utf-8"?>
+<b:Sources xmlns:b="http://schemas.openxmlformats.org/officeDocument/2006/bibliography" xmlns="http://schemas.openxmlformats.org/officeDocument/2006/bibliography" SelectedStyle="\APASixthEditionOfficeOnline.xsl" StyleName="APA" Version="6"/>
 </file>
 
-<file path=customXml/itemProps2.xml><?xml version="1.0" encoding="utf-8"?>
+<file path=customXml/itemProps1.xml><?xml version="1.0" encoding="utf-8"?>
 <ds:datastoreItem xmlns:ds="http://schemas.openxmlformats.org/officeDocument/2006/customXml" ds:itemID="{261B0A37-6C6C-45CF-A5C4-83D994BC3980}">
   <ds:schemaRefs>
     <ds:schemaRef ds:uri="http://schemas.microsoft.com/office/2006/metadata/properties"/>
@@ -34407,15 +34773,15 @@
 </ds:datastoreItem>
 </file>
 
-<file path=customXml/itemProps3.xml><?xml version="1.0" encoding="utf-8"?>
-<ds:datastoreItem xmlns:ds="http://schemas.openxmlformats.org/officeDocument/2006/customXml" ds:itemID="{5157238F-F555-4D04-860C-F98429B609BD}">
+<file path=customXml/itemProps2.xml><?xml version="1.0" encoding="utf-8"?>
+<ds:datastoreItem xmlns:ds="http://schemas.openxmlformats.org/officeDocument/2006/customXml" ds:itemID="{E5FD6A2B-9479-4129-9D84-6C858DBE1A90}">
   <ds:schemaRefs>
-    <ds:schemaRef ds:uri="http://schemas.openxmlformats.org/officeDocument/2006/bibliography"/>
+    <ds:schemaRef ds:uri="http://schemas.microsoft.com/sharepoint/v3/contenttype/forms"/>
   </ds:schemaRefs>
 </ds:datastoreItem>
 </file>
 
-<file path=customXml/itemProps4.xml><?xml version="1.0" encoding="utf-8"?>
+<file path=customXml/itemProps3.xml><?xml version="1.0" encoding="utf-8"?>
 <ds:datastoreItem xmlns:ds="http://schemas.openxmlformats.org/officeDocument/2006/customXml" ds:itemID="{BC4311AC-D0D5-4AE9-8386-76BDCE1C82F3}">
   <ds:schemaRefs>
     <ds:schemaRef ds:uri="http://schemas.microsoft.com/office/2006/metadata/contentType"/>
@@ -34433,4 +34799,12 @@
     <ds:schemaRef ds:uri="http://schemas.microsoft.com/internal/obd"/>
   </ds:schemaRefs>
 </ds:datastoreItem>
+</file>
+
+<file path=customXml/itemProps4.xml><?xml version="1.0" encoding="utf-8"?>
+<ds:datastoreItem xmlns:ds="http://schemas.openxmlformats.org/officeDocument/2006/customXml" ds:itemID="{5157238F-F555-4D04-860C-F98429B609BD}">
+  <ds:schemaRefs>
+    <ds:schemaRef ds:uri="http://schemas.openxmlformats.org/officeDocument/2006/bibliography"/>
+  </ds:schemaRefs>
+</ds:datastoreItem>
 </file>
</xml_diff>